<commit_message>
fix(er): distribute relationship anchors across facing perimeter
Allocate ER relationship endpoints using a facing-perimeter slot model (with even distribution) and use layout-provided edge points in the renderer. This improves fan-in/fan-out stability for Word output.

Made-with: Cursor
</commit_message>
<xml_diff>
--- a/test.docx
+++ b/test.docx
@@ -236,7 +236,7 @@
       <w:r>
         <w:t xml:space="preserve">, and </w:t>
       </w:r>
-      <w:hyperlink xmlns:r="http://schemas.openxmlformats.org/officeDocument/2006/relationships" w:history="true" r:id="R73b9b10f6d8a43a9">
+      <w:hyperlink xmlns:r="http://schemas.openxmlformats.org/officeDocument/2006/relationships" w:history="true" r:id="Rdbdc0ea4901a429d">
         <w:r>
           <w:rPr>
             <w:rStyle w:val="Hyperlink"/>
@@ -475,7 +475,7 @@
       <w:r>
         <w:t xml:space="preserve">Direct link: </w:t>
       </w:r>
-      <w:hyperlink xmlns:r="http://schemas.openxmlformats.org/officeDocument/2006/relationships" w:history="true" r:id="R35a8355ae3f443e2">
+      <w:hyperlink xmlns:r="http://schemas.openxmlformats.org/officeDocument/2006/relationships" w:history="true" r:id="Rbcb4ee0c906244ab">
         <w:r>
           <w:rPr>
             <w:rStyle w:val="Hyperlink"/>
@@ -496,7 +496,7 @@
       <w:r>
         <w:t xml:space="preserve">Direct link with title: </w:t>
       </w:r>
-      <w:hyperlink xmlns:r="http://schemas.openxmlformats.org/officeDocument/2006/relationships" w:history="true" r:id="Rf06fa0ed5dcc48f1">
+      <w:hyperlink xmlns:r="http://schemas.openxmlformats.org/officeDocument/2006/relationships" w:history="true" r:id="Rd238aef66b2248f9">
         <w:r>
           <w:rPr>
             <w:rStyle w:val="Hyperlink"/>
@@ -517,7 +517,7 @@
       <w:r>
         <w:t xml:space="preserve">Reference-style link: </w:t>
       </w:r>
-      <w:hyperlink xmlns:r="http://schemas.openxmlformats.org/officeDocument/2006/relationships" w:history="true" r:id="R9350b76d51d04b38">
+      <w:hyperlink xmlns:r="http://schemas.openxmlformats.org/officeDocument/2006/relationships" w:history="true" r:id="R85b1be27e09146da">
         <w:r>
           <w:rPr>
             <w:rStyle w:val="Hyperlink"/>
@@ -538,7 +538,7 @@
       <w:r>
         <w:t xml:space="preserve">Collapsed reference link: </w:t>
       </w:r>
-      <w:hyperlink xmlns:r="http://schemas.openxmlformats.org/officeDocument/2006/relationships" w:history="true" r:id="R10e8bec5a3f14caa">
+      <w:hyperlink xmlns:r="http://schemas.openxmlformats.org/officeDocument/2006/relationships" w:history="true" r:id="Re2ddbffae0ac4654">
         <w:r>
           <w:rPr>
             <w:rStyle w:val="Hyperlink"/>
@@ -559,7 +559,7 @@
       <w:r>
         <w:t xml:space="preserve">Repeated reference link: </w:t>
       </w:r>
-      <w:hyperlink xmlns:r="http://schemas.openxmlformats.org/officeDocument/2006/relationships" w:history="true" r:id="Rb4094e30866d4854">
+      <w:hyperlink xmlns:r="http://schemas.openxmlformats.org/officeDocument/2006/relationships" w:history="true" r:id="R645a7bc393684f14">
         <w:r>
           <w:rPr>
             <w:rStyle w:val="Hyperlink"/>
@@ -580,7 +580,7 @@
       <w:r>
         <w:t xml:space="preserve">Autolink URL: </w:t>
       </w:r>
-      <w:hyperlink xmlns:r="http://schemas.openxmlformats.org/officeDocument/2006/relationships" w:history="true" r:id="Rc169046064dc438d">
+      <w:hyperlink xmlns:r="http://schemas.openxmlformats.org/officeDocument/2006/relationships" w:history="true" r:id="R9697b057bf1f4180">
         <w:r>
           <w:rPr>
             <w:rStyle w:val="Hyperlink"/>
@@ -601,7 +601,7 @@
       <w:r>
         <w:t xml:space="preserve">Autolink email: </w:t>
       </w:r>
-      <w:hyperlink xmlns:r="http://schemas.openxmlformats.org/officeDocument/2006/relationships" w:history="true" r:id="R6f0991d4adf44d96">
+      <w:hyperlink xmlns:r="http://schemas.openxmlformats.org/officeDocument/2006/relationships" w:history="true" r:id="R159f09747a46447a">
         <w:r>
           <w:rPr>
             <w:rStyle w:val="Hyperlink"/>
@@ -700,7 +700,7 @@
       <w:r>
         <w:t xml:space="preserve">, and </w:t>
       </w:r>
-      <w:hyperlink xmlns:r="http://schemas.openxmlformats.org/officeDocument/2006/relationships" w:history="true" r:id="R391c5ce48254414b">
+      <w:hyperlink xmlns:r="http://schemas.openxmlformats.org/officeDocument/2006/relationships" w:history="true" r:id="R9e2a0f8abddc447c">
         <w:r>
           <w:rPr>
             <w:rStyle w:val="Hyperlink"/>
@@ -1093,7 +1093,7 @@
       <w:r>
         <w:t xml:space="preserve">Continuation paragraph with </w:t>
       </w:r>
-      <w:hyperlink xmlns:r="http://schemas.openxmlformats.org/officeDocument/2006/relationships" w:history="true" r:id="Rd06aae3f49874e5e">
+      <w:hyperlink xmlns:r="http://schemas.openxmlformats.org/officeDocument/2006/relationships" w:history="true" r:id="Rab87a32dbbcd490b">
         <w:r>
           <w:rPr>
             <w:rStyle w:val="Hyperlink"/>
@@ -1591,7 +1591,7 @@
       <w:r>
         <w:t xml:space="preserve">, and </w:t>
       </w:r>
-      <w:hyperlink xmlns:r="http://schemas.openxmlformats.org/officeDocument/2006/relationships" w:history="true" r:id="R992f2c2c01504db4">
+      <w:hyperlink xmlns:r="http://schemas.openxmlformats.org/officeDocument/2006/relationships" w:history="true" r:id="Redc3caf5102e4216">
         <w:r>
           <w:rPr>
             <w:rStyle w:val="Hyperlink"/>
@@ -1979,7 +1979,7 @@
                     <pic:cNvPicPr/>
                   </pic:nvPicPr>
                   <pic:blipFill>
-                    <a:blip xmlns:r="http://schemas.openxmlformats.org/officeDocument/2006/relationships" r:embed="R1452e0764c544203"/>
+                    <a:blip xmlns:r="http://schemas.openxmlformats.org/officeDocument/2006/relationships" r:embed="Ref3030b16ce3443b"/>
                     <a:stretch>
                       <a:fillRect/>
                     </a:stretch>
@@ -2039,7 +2039,7 @@
                     <pic:cNvPicPr/>
                   </pic:nvPicPr>
                   <pic:blipFill>
-                    <a:blip xmlns:r="http://schemas.openxmlformats.org/officeDocument/2006/relationships" r:embed="R86994dd393a84e49"/>
+                    <a:blip xmlns:r="http://schemas.openxmlformats.org/officeDocument/2006/relationships" r:embed="Rb8e6fa4baf364ad2"/>
                     <a:stretch>
                       <a:fillRect/>
                     </a:stretch>
@@ -2099,7 +2099,7 @@
                     <pic:cNvPicPr/>
                   </pic:nvPicPr>
                   <pic:blipFill>
-                    <a:blip xmlns:r="http://schemas.openxmlformats.org/officeDocument/2006/relationships" r:embed="R189ee5b1e69843af"/>
+                    <a:blip xmlns:r="http://schemas.openxmlformats.org/officeDocument/2006/relationships" r:embed="R9d5514d74f674123"/>
                     <a:stretch>
                       <a:fillRect/>
                     </a:stretch>
@@ -2150,7 +2150,7 @@
                     <pic:cNvPicPr/>
                   </pic:nvPicPr>
                   <pic:blipFill>
-                    <a:blip xmlns:r="http://schemas.openxmlformats.org/officeDocument/2006/relationships" r:embed="R156abb6849fb472f"/>
+                    <a:blip xmlns:r="http://schemas.openxmlformats.org/officeDocument/2006/relationships" r:embed="Rdf85241bdc1e4796"/>
                     <a:stretch>
                       <a:fillRect/>
                     </a:stretch>
@@ -2201,7 +2201,7 @@
                     <pic:cNvPicPr/>
                   </pic:nvPicPr>
                   <pic:blipFill>
-                    <a:blip xmlns:r="http://schemas.openxmlformats.org/officeDocument/2006/relationships" r:embed="R77c95221bb524abc"/>
+                    <a:blip xmlns:r="http://schemas.openxmlformats.org/officeDocument/2006/relationships" r:embed="Rbd10c3b5fa05471a"/>
                     <a:stretch>
                       <a:fillRect/>
                     </a:stretch>
@@ -2252,7 +2252,7 @@
                     <pic:cNvPicPr/>
                   </pic:nvPicPr>
                   <pic:blipFill>
-                    <a:blip xmlns:r="http://schemas.openxmlformats.org/officeDocument/2006/relationships" r:embed="Raa6c9a4728d745a4"/>
+                    <a:blip xmlns:r="http://schemas.openxmlformats.org/officeDocument/2006/relationships" r:embed="R84efca3189334fb3"/>
                     <a:stretch>
                       <a:fillRect/>
                     </a:stretch>
@@ -2303,7 +2303,7 @@
                     <pic:cNvPicPr/>
                   </pic:nvPicPr>
                   <pic:blipFill>
-                    <a:blip xmlns:r="http://schemas.openxmlformats.org/officeDocument/2006/relationships" r:embed="R1831bff1fece4584"/>
+                    <a:blip xmlns:r="http://schemas.openxmlformats.org/officeDocument/2006/relationships" r:embed="R94cbc170f8a649dd"/>
                     <a:stretch>
                       <a:fillRect/>
                     </a:stretch>
@@ -2354,7 +2354,7 @@
                     <pic:cNvPicPr/>
                   </pic:nvPicPr>
                   <pic:blipFill>
-                    <a:blip xmlns:r="http://schemas.openxmlformats.org/officeDocument/2006/relationships" r:embed="Rca8c737f51a24c44"/>
+                    <a:blip xmlns:r="http://schemas.openxmlformats.org/officeDocument/2006/relationships" r:embed="R6121bb55176d4cb6"/>
                     <a:stretch>
                       <a:fillRect/>
                     </a:stretch>
@@ -2430,7 +2430,7 @@
                     <pic:cNvPicPr/>
                   </pic:nvPicPr>
                   <pic:blipFill>
-                    <a:blip xmlns:r="http://schemas.openxmlformats.org/officeDocument/2006/relationships" r:embed="Rbc6d4384cd674830"/>
+                    <a:blip xmlns:r="http://schemas.openxmlformats.org/officeDocument/2006/relationships" r:embed="R416d4418a0d04fc7"/>
                     <a:stretch>
                       <a:fillRect/>
                     </a:stretch>
@@ -2481,7 +2481,7 @@
                     <pic:cNvPicPr/>
                   </pic:nvPicPr>
                   <pic:blipFill>
-                    <a:blip xmlns:r="http://schemas.openxmlformats.org/officeDocument/2006/relationships" r:embed="R04cd8f1fc2b542f8"/>
+                    <a:blip xmlns:r="http://schemas.openxmlformats.org/officeDocument/2006/relationships" r:embed="R33b849b882214d21"/>
                     <a:stretch>
                       <a:fillRect/>
                     </a:stretch>
@@ -2532,7 +2532,7 @@
                     <pic:cNvPicPr/>
                   </pic:nvPicPr>
                   <pic:blipFill>
-                    <a:blip xmlns:r="http://schemas.openxmlformats.org/officeDocument/2006/relationships" r:embed="R3f1faab9bce6490a"/>
+                    <a:blip xmlns:r="http://schemas.openxmlformats.org/officeDocument/2006/relationships" r:embed="Rc9346e1e0b924952"/>
                     <a:stretch>
                       <a:fillRect/>
                     </a:stretch>
@@ -2583,7 +2583,7 @@
                     <pic:cNvPicPr/>
                   </pic:nvPicPr>
                   <pic:blipFill>
-                    <a:blip xmlns:r="http://schemas.openxmlformats.org/officeDocument/2006/relationships" r:embed="R1bfa87316ad94e25"/>
+                    <a:blip xmlns:r="http://schemas.openxmlformats.org/officeDocument/2006/relationships" r:embed="R10917327bc784508"/>
                     <a:stretch>
                       <a:fillRect/>
                     </a:stretch>
@@ -2659,7 +2659,7 @@
                     <pic:cNvPicPr/>
                   </pic:nvPicPr>
                   <pic:blipFill>
-                    <a:blip xmlns:r="http://schemas.openxmlformats.org/officeDocument/2006/relationships" r:embed="R84430faf10894213"/>
+                    <a:blip xmlns:r="http://schemas.openxmlformats.org/officeDocument/2006/relationships" r:embed="R042c1b881f2a4bf3"/>
                     <a:stretch>
                       <a:fillRect/>
                     </a:stretch>
@@ -2710,7 +2710,7 @@
                     <pic:cNvPicPr/>
                   </pic:nvPicPr>
                   <pic:blipFill>
-                    <a:blip xmlns:r="http://schemas.openxmlformats.org/officeDocument/2006/relationships" r:embed="R5fa26ee2e10146e0"/>
+                    <a:blip xmlns:r="http://schemas.openxmlformats.org/officeDocument/2006/relationships" r:embed="Re9448e4aad2d42e8"/>
                     <a:stretch>
                       <a:fillRect/>
                     </a:stretch>
@@ -2761,7 +2761,7 @@
                     <pic:cNvPicPr/>
                   </pic:nvPicPr>
                   <pic:blipFill>
-                    <a:blip xmlns:r="http://schemas.openxmlformats.org/officeDocument/2006/relationships" r:embed="R320685494147443f"/>
+                    <a:blip xmlns:r="http://schemas.openxmlformats.org/officeDocument/2006/relationships" r:embed="Rf8ff2b21ca534825"/>
                     <a:stretch>
                       <a:fillRect/>
                     </a:stretch>
@@ -2812,7 +2812,7 @@
                     <pic:cNvPicPr/>
                   </pic:nvPicPr>
                   <pic:blipFill>
-                    <a:blip xmlns:r="http://schemas.openxmlformats.org/officeDocument/2006/relationships" r:embed="Rd329c923e1874e84"/>
+                    <a:blip xmlns:r="http://schemas.openxmlformats.org/officeDocument/2006/relationships" r:embed="Ra89f240eb8444ab5"/>
                     <a:stretch>
                       <a:fillRect/>
                     </a:stretch>
@@ -2863,7 +2863,7 @@
                     <pic:cNvPicPr/>
                   </pic:nvPicPr>
                   <pic:blipFill>
-                    <a:blip xmlns:r="http://schemas.openxmlformats.org/officeDocument/2006/relationships" r:embed="R49a5443e06e54df7"/>
+                    <a:blip xmlns:r="http://schemas.openxmlformats.org/officeDocument/2006/relationships" r:embed="R3bed9c6299d44304"/>
                     <a:stretch>
                       <a:fillRect/>
                     </a:stretch>
@@ -2914,7 +2914,7 @@
                     <pic:cNvPicPr/>
                   </pic:nvPicPr>
                   <pic:blipFill>
-                    <a:blip xmlns:r="http://schemas.openxmlformats.org/officeDocument/2006/relationships" r:embed="Rc87045c929c849c1"/>
+                    <a:blip xmlns:r="http://schemas.openxmlformats.org/officeDocument/2006/relationships" r:embed="R8950f36ba09e424c"/>
                     <a:stretch>
                       <a:fillRect/>
                     </a:stretch>
@@ -2965,7 +2965,7 @@
                     <pic:cNvPicPr/>
                   </pic:nvPicPr>
                   <pic:blipFill>
-                    <a:blip xmlns:r="http://schemas.openxmlformats.org/officeDocument/2006/relationships" r:embed="R8aa702bea46a4897"/>
+                    <a:blip xmlns:r="http://schemas.openxmlformats.org/officeDocument/2006/relationships" r:embed="R6e1ca7bd27864b59"/>
                     <a:stretch>
                       <a:fillRect/>
                     </a:stretch>
@@ -3016,7 +3016,7 @@
                     <pic:cNvPicPr/>
                   </pic:nvPicPr>
                   <pic:blipFill>
-                    <a:blip xmlns:r="http://schemas.openxmlformats.org/officeDocument/2006/relationships" r:embed="Rd0f51c457a4d44a4"/>
+                    <a:blip xmlns:r="http://schemas.openxmlformats.org/officeDocument/2006/relationships" r:embed="R30e3539cb21948b0"/>
                     <a:stretch>
                       <a:fillRect/>
                     </a:stretch>
@@ -3067,7 +3067,7 @@
                     <pic:cNvPicPr/>
                   </pic:nvPicPr>
                   <pic:blipFill>
-                    <a:blip xmlns:r="http://schemas.openxmlformats.org/officeDocument/2006/relationships" r:embed="R951cd3f5a5d44ad5"/>
+                    <a:blip xmlns:r="http://schemas.openxmlformats.org/officeDocument/2006/relationships" r:embed="R0cc89cb9d65447f2"/>
                     <a:stretch>
                       <a:fillRect/>
                     </a:stretch>
@@ -3118,7 +3118,7 @@
                     <pic:cNvPicPr/>
                   </pic:nvPicPr>
                   <pic:blipFill>
-                    <a:blip xmlns:r="http://schemas.openxmlformats.org/officeDocument/2006/relationships" r:embed="Rf1f2115f73224bf3"/>
+                    <a:blip xmlns:r="http://schemas.openxmlformats.org/officeDocument/2006/relationships" r:embed="Reee7b751c722486c"/>
                     <a:stretch>
                       <a:fillRect/>
                     </a:stretch>
@@ -3169,7 +3169,7 @@
                     <pic:cNvPicPr/>
                   </pic:nvPicPr>
                   <pic:blipFill>
-                    <a:blip xmlns:r="http://schemas.openxmlformats.org/officeDocument/2006/relationships" r:embed="Rda2999ed911b48f8"/>
+                    <a:blip xmlns:r="http://schemas.openxmlformats.org/officeDocument/2006/relationships" r:embed="R3632a1ade9794cc8"/>
                     <a:stretch>
                       <a:fillRect/>
                     </a:stretch>
@@ -3220,7 +3220,7 @@
                     <pic:cNvPicPr/>
                   </pic:nvPicPr>
                   <pic:blipFill>
-                    <a:blip xmlns:r="http://schemas.openxmlformats.org/officeDocument/2006/relationships" r:embed="R9c452fca6a7f43f7"/>
+                    <a:blip xmlns:r="http://schemas.openxmlformats.org/officeDocument/2006/relationships" r:embed="R0d5cd02265d14c42"/>
                     <a:stretch>
                       <a:fillRect/>
                     </a:stretch>
@@ -3271,7 +3271,7 @@
                     <pic:cNvPicPr/>
                   </pic:nvPicPr>
                   <pic:blipFill>
-                    <a:blip xmlns:r="http://schemas.openxmlformats.org/officeDocument/2006/relationships" r:embed="Rbda3baa8f41b44cd"/>
+                    <a:blip xmlns:r="http://schemas.openxmlformats.org/officeDocument/2006/relationships" r:embed="R38322a64c59f498f"/>
                     <a:stretch>
                       <a:fillRect/>
                     </a:stretch>
@@ -3322,7 +3322,7 @@
                     <pic:cNvPicPr/>
                   </pic:nvPicPr>
                   <pic:blipFill>
-                    <a:blip xmlns:r="http://schemas.openxmlformats.org/officeDocument/2006/relationships" r:embed="Rb3e9fdf040c946b2"/>
+                    <a:blip xmlns:r="http://schemas.openxmlformats.org/officeDocument/2006/relationships" r:embed="R0895594542844fe7"/>
                     <a:stretch>
                       <a:fillRect/>
                     </a:stretch>
@@ -3419,7 +3419,7 @@
                     <pic:cNvPicPr/>
                   </pic:nvPicPr>
                   <pic:blipFill>
-                    <a:blip xmlns:r="http://schemas.openxmlformats.org/officeDocument/2006/relationships" r:embed="Rbe10a71c9fe44fa9"/>
+                    <a:blip xmlns:r="http://schemas.openxmlformats.org/officeDocument/2006/relationships" r:embed="R8f307c5cfec24a68"/>
                     <a:stretch>
                       <a:fillRect/>
                     </a:stretch>
@@ -3462,7 +3462,7 @@
                     <pic:cNvPicPr/>
                   </pic:nvPicPr>
                   <pic:blipFill>
-                    <a:blip xmlns:r="http://schemas.openxmlformats.org/officeDocument/2006/relationships" r:embed="R3c85d40d31e546dc"/>
+                    <a:blip xmlns:r="http://schemas.openxmlformats.org/officeDocument/2006/relationships" r:embed="Ra6138869a1974038"/>
                     <a:stretch>
                       <a:fillRect/>
                     </a:stretch>
@@ -3505,7 +3505,7 @@
                     <pic:cNvPicPr/>
                   </pic:nvPicPr>
                   <pic:blipFill>
-                    <a:blip xmlns:r="http://schemas.openxmlformats.org/officeDocument/2006/relationships" r:embed="R07eb7b674a8f4d6a"/>
+                    <a:blip xmlns:r="http://schemas.openxmlformats.org/officeDocument/2006/relationships" r:embed="R75d748d2c99c4681"/>
                     <a:stretch>
                       <a:fillRect/>
                     </a:stretch>
@@ -3548,7 +3548,7 @@
                     <pic:cNvPicPr/>
                   </pic:nvPicPr>
                   <pic:blipFill>
-                    <a:blip xmlns:r="http://schemas.openxmlformats.org/officeDocument/2006/relationships" r:embed="R691885cfcec84f6d"/>
+                    <a:blip xmlns:r="http://schemas.openxmlformats.org/officeDocument/2006/relationships" r:embed="Re4932a7de0c54c1a"/>
                     <a:stretch>
                       <a:fillRect/>
                     </a:stretch>
@@ -3933,7 +3933,7 @@
                     <pic:cNvPicPr/>
                   </pic:nvPicPr>
                   <pic:blipFill>
-                    <a:blip xmlns:r="http://schemas.openxmlformats.org/officeDocument/2006/relationships" r:embed="Re930b750077b4b4a"/>
+                    <a:blip xmlns:r="http://schemas.openxmlformats.org/officeDocument/2006/relationships" r:embed="Rf4ae565d773b4a40"/>
                     <a:stretch>
                       <a:fillRect/>
                     </a:stretch>
@@ -4125,7 +4125,7 @@
                     <pic:cNvPicPr/>
                   </pic:nvPicPr>
                   <pic:blipFill>
-                    <a:blip xmlns:r="http://schemas.openxmlformats.org/officeDocument/2006/relationships" r:embed="Ra6d42ec511394d1f"/>
+                    <a:blip xmlns:r="http://schemas.openxmlformats.org/officeDocument/2006/relationships" r:embed="R85ecc50868b1490f"/>
                     <a:stretch>
                       <a:fillRect/>
                     </a:stretch>
@@ -4176,7 +4176,7 @@
                     <pic:cNvPicPr/>
                   </pic:nvPicPr>
                   <pic:blipFill>
-                    <a:blip xmlns:r="http://schemas.openxmlformats.org/officeDocument/2006/relationships" r:embed="R54cb9c85e6124cdf"/>
+                    <a:blip xmlns:r="http://schemas.openxmlformats.org/officeDocument/2006/relationships" r:embed="R957acc9e308149ec"/>
                     <a:stretch>
                       <a:fillRect/>
                     </a:stretch>
@@ -4227,7 +4227,7 @@
                     <pic:cNvPicPr/>
                   </pic:nvPicPr>
                   <pic:blipFill>
-                    <a:blip xmlns:r="http://schemas.openxmlformats.org/officeDocument/2006/relationships" r:embed="Rc962fc7e9c4b44fc"/>
+                    <a:blip xmlns:r="http://schemas.openxmlformats.org/officeDocument/2006/relationships" r:embed="R4ff3fe8ecb924892"/>
                     <a:stretch>
                       <a:fillRect/>
                     </a:stretch>
@@ -4278,7 +4278,7 @@
                     <pic:cNvPicPr/>
                   </pic:nvPicPr>
                   <pic:blipFill>
-                    <a:blip xmlns:r="http://schemas.openxmlformats.org/officeDocument/2006/relationships" r:embed="R5ec2912276fa4bf2"/>
+                    <a:blip xmlns:r="http://schemas.openxmlformats.org/officeDocument/2006/relationships" r:embed="R1169d4159ff949b1"/>
                     <a:stretch>
                       <a:fillRect/>
                     </a:stretch>
@@ -4657,7 +4657,7 @@
                     <pic:cNvPicPr/>
                   </pic:nvPicPr>
                   <pic:blipFill>
-                    <a:blip xmlns:r="http://schemas.openxmlformats.org/officeDocument/2006/relationships" r:embed="R930315fb9f3e4e92"/>
+                    <a:blip xmlns:r="http://schemas.openxmlformats.org/officeDocument/2006/relationships" r:embed="R7034ead243124c90"/>
                     <a:stretch>
                       <a:fillRect/>
                     </a:stretch>
@@ -5338,7 +5338,7 @@
             <w:r>
               <w:t xml:space="preserve">Cell with </w:t>
             </w:r>
-            <w:hyperlink xmlns:r="http://schemas.openxmlformats.org/officeDocument/2006/relationships" w:history="true" r:id="R17906a11fd6a42be">
+            <w:hyperlink xmlns:r="http://schemas.openxmlformats.org/officeDocument/2006/relationships" w:history="true" r:id="R001d392637a14d8e">
               <w:r>
                 <w:rPr>
                   <w:rStyle w:val="Hyperlink"/>
@@ -5624,7 +5624,7 @@
                           <pic:cNvPicPr/>
                         </pic:nvPicPr>
                         <pic:blipFill>
-                          <a:blip xmlns:r="http://schemas.openxmlformats.org/officeDocument/2006/relationships" r:embed="R1db4edf47f9e4e95"/>
+                          <a:blip xmlns:r="http://schemas.openxmlformats.org/officeDocument/2006/relationships" r:embed="Racd73ee5020a4791"/>
                           <a:stretch>
                             <a:fillRect/>
                           </a:stretch>
@@ -5724,7 +5724,7 @@
                     <pic:cNvPicPr/>
                   </pic:nvPicPr>
                   <pic:blipFill>
-                    <a:blip xmlns:r="http://schemas.openxmlformats.org/officeDocument/2006/relationships" r:embed="Rb939979a8ed742a2"/>
+                    <a:blip xmlns:r="http://schemas.openxmlformats.org/officeDocument/2006/relationships" r:embed="R4d01bae2df144df2"/>
                     <a:stretch>
                       <a:fillRect/>
                     </a:stretch>
@@ -5774,7 +5774,7 @@
                     <pic:cNvPicPr/>
                   </pic:nvPicPr>
                   <pic:blipFill>
-                    <a:blip xmlns:r="http://schemas.openxmlformats.org/officeDocument/2006/relationships" r:embed="Re0a24c8844c4415f"/>
+                    <a:blip xmlns:r="http://schemas.openxmlformats.org/officeDocument/2006/relationships" r:embed="Rf4548a72769a4d46"/>
                     <a:stretch>
                       <a:fillRect/>
                     </a:stretch>
@@ -5824,7 +5824,7 @@
                     <pic:cNvPicPr/>
                   </pic:nvPicPr>
                   <pic:blipFill>
-                    <a:blip xmlns:r="http://schemas.openxmlformats.org/officeDocument/2006/relationships" r:embed="R23f178b08c824d2c"/>
+                    <a:blip xmlns:r="http://schemas.openxmlformats.org/officeDocument/2006/relationships" r:embed="Re9b223d82dfe4b1f"/>
                     <a:stretch>
                       <a:fillRect/>
                     </a:stretch>

</xml_diff>

<commit_message>
fix(er): balance anchors for small fan-in/out groups
For ER facing-perimeter allocation, force canonical balanced slot selection for N=1/2/3 to match the source-of-truth examples (centre for 1, left/right for 2, left/centre/right for 3).

Made-with: Cursor
</commit_message>
<xml_diff>
--- a/test.docx
+++ b/test.docx
@@ -236,7 +236,7 @@
       <w:r>
         <w:t xml:space="preserve">, and </w:t>
       </w:r>
-      <w:hyperlink xmlns:r="http://schemas.openxmlformats.org/officeDocument/2006/relationships" w:history="true" r:id="Rdbdc0ea4901a429d">
+      <w:hyperlink xmlns:r="http://schemas.openxmlformats.org/officeDocument/2006/relationships" w:history="true" r:id="R0ab71043759d4caa">
         <w:r>
           <w:rPr>
             <w:rStyle w:val="Hyperlink"/>
@@ -475,7 +475,7 @@
       <w:r>
         <w:t xml:space="preserve">Direct link: </w:t>
       </w:r>
-      <w:hyperlink xmlns:r="http://schemas.openxmlformats.org/officeDocument/2006/relationships" w:history="true" r:id="Rbcb4ee0c906244ab">
+      <w:hyperlink xmlns:r="http://schemas.openxmlformats.org/officeDocument/2006/relationships" w:history="true" r:id="R780ad77db731465f">
         <w:r>
           <w:rPr>
             <w:rStyle w:val="Hyperlink"/>
@@ -496,7 +496,7 @@
       <w:r>
         <w:t xml:space="preserve">Direct link with title: </w:t>
       </w:r>
-      <w:hyperlink xmlns:r="http://schemas.openxmlformats.org/officeDocument/2006/relationships" w:history="true" r:id="Rd238aef66b2248f9">
+      <w:hyperlink xmlns:r="http://schemas.openxmlformats.org/officeDocument/2006/relationships" w:history="true" r:id="Rd5ab52eeaf614130">
         <w:r>
           <w:rPr>
             <w:rStyle w:val="Hyperlink"/>
@@ -517,7 +517,7 @@
       <w:r>
         <w:t xml:space="preserve">Reference-style link: </w:t>
       </w:r>
-      <w:hyperlink xmlns:r="http://schemas.openxmlformats.org/officeDocument/2006/relationships" w:history="true" r:id="R85b1be27e09146da">
+      <w:hyperlink xmlns:r="http://schemas.openxmlformats.org/officeDocument/2006/relationships" w:history="true" r:id="R65d894039d224c14">
         <w:r>
           <w:rPr>
             <w:rStyle w:val="Hyperlink"/>
@@ -538,7 +538,7 @@
       <w:r>
         <w:t xml:space="preserve">Collapsed reference link: </w:t>
       </w:r>
-      <w:hyperlink xmlns:r="http://schemas.openxmlformats.org/officeDocument/2006/relationships" w:history="true" r:id="Re2ddbffae0ac4654">
+      <w:hyperlink xmlns:r="http://schemas.openxmlformats.org/officeDocument/2006/relationships" w:history="true" r:id="R2adb6da5793f4f5d">
         <w:r>
           <w:rPr>
             <w:rStyle w:val="Hyperlink"/>
@@ -559,7 +559,7 @@
       <w:r>
         <w:t xml:space="preserve">Repeated reference link: </w:t>
       </w:r>
-      <w:hyperlink xmlns:r="http://schemas.openxmlformats.org/officeDocument/2006/relationships" w:history="true" r:id="R645a7bc393684f14">
+      <w:hyperlink xmlns:r="http://schemas.openxmlformats.org/officeDocument/2006/relationships" w:history="true" r:id="R5b77a67ee449414d">
         <w:r>
           <w:rPr>
             <w:rStyle w:val="Hyperlink"/>
@@ -580,7 +580,7 @@
       <w:r>
         <w:t xml:space="preserve">Autolink URL: </w:t>
       </w:r>
-      <w:hyperlink xmlns:r="http://schemas.openxmlformats.org/officeDocument/2006/relationships" w:history="true" r:id="R9697b057bf1f4180">
+      <w:hyperlink xmlns:r="http://schemas.openxmlformats.org/officeDocument/2006/relationships" w:history="true" r:id="R9bb4c9a03b074265">
         <w:r>
           <w:rPr>
             <w:rStyle w:val="Hyperlink"/>
@@ -601,7 +601,7 @@
       <w:r>
         <w:t xml:space="preserve">Autolink email: </w:t>
       </w:r>
-      <w:hyperlink xmlns:r="http://schemas.openxmlformats.org/officeDocument/2006/relationships" w:history="true" r:id="R159f09747a46447a">
+      <w:hyperlink xmlns:r="http://schemas.openxmlformats.org/officeDocument/2006/relationships" w:history="true" r:id="R12033b96785c4968">
         <w:r>
           <w:rPr>
             <w:rStyle w:val="Hyperlink"/>
@@ -700,7 +700,7 @@
       <w:r>
         <w:t xml:space="preserve">, and </w:t>
       </w:r>
-      <w:hyperlink xmlns:r="http://schemas.openxmlformats.org/officeDocument/2006/relationships" w:history="true" r:id="R9e2a0f8abddc447c">
+      <w:hyperlink xmlns:r="http://schemas.openxmlformats.org/officeDocument/2006/relationships" w:history="true" r:id="Rdc22442573e94f93">
         <w:r>
           <w:rPr>
             <w:rStyle w:val="Hyperlink"/>
@@ -1093,7 +1093,7 @@
       <w:r>
         <w:t xml:space="preserve">Continuation paragraph with </w:t>
       </w:r>
-      <w:hyperlink xmlns:r="http://schemas.openxmlformats.org/officeDocument/2006/relationships" w:history="true" r:id="Rab87a32dbbcd490b">
+      <w:hyperlink xmlns:r="http://schemas.openxmlformats.org/officeDocument/2006/relationships" w:history="true" r:id="R433f1a1a7f4b4a7b">
         <w:r>
           <w:rPr>
             <w:rStyle w:val="Hyperlink"/>
@@ -1591,7 +1591,7 @@
       <w:r>
         <w:t xml:space="preserve">, and </w:t>
       </w:r>
-      <w:hyperlink xmlns:r="http://schemas.openxmlformats.org/officeDocument/2006/relationships" w:history="true" r:id="Redc3caf5102e4216">
+      <w:hyperlink xmlns:r="http://schemas.openxmlformats.org/officeDocument/2006/relationships" w:history="true" r:id="R171cced954bb4747">
         <w:r>
           <w:rPr>
             <w:rStyle w:val="Hyperlink"/>
@@ -1979,7 +1979,7 @@
                     <pic:cNvPicPr/>
                   </pic:nvPicPr>
                   <pic:blipFill>
-                    <a:blip xmlns:r="http://schemas.openxmlformats.org/officeDocument/2006/relationships" r:embed="Ref3030b16ce3443b"/>
+                    <a:blip xmlns:r="http://schemas.openxmlformats.org/officeDocument/2006/relationships" r:embed="R2600baa09e9e4ed7"/>
                     <a:stretch>
                       <a:fillRect/>
                     </a:stretch>
@@ -2039,7 +2039,7 @@
                     <pic:cNvPicPr/>
                   </pic:nvPicPr>
                   <pic:blipFill>
-                    <a:blip xmlns:r="http://schemas.openxmlformats.org/officeDocument/2006/relationships" r:embed="Rb8e6fa4baf364ad2"/>
+                    <a:blip xmlns:r="http://schemas.openxmlformats.org/officeDocument/2006/relationships" r:embed="R6eb01070d7324d65"/>
                     <a:stretch>
                       <a:fillRect/>
                     </a:stretch>
@@ -2099,7 +2099,7 @@
                     <pic:cNvPicPr/>
                   </pic:nvPicPr>
                   <pic:blipFill>
-                    <a:blip xmlns:r="http://schemas.openxmlformats.org/officeDocument/2006/relationships" r:embed="R9d5514d74f674123"/>
+                    <a:blip xmlns:r="http://schemas.openxmlformats.org/officeDocument/2006/relationships" r:embed="R6d2c7afa158c496a"/>
                     <a:stretch>
                       <a:fillRect/>
                     </a:stretch>
@@ -2150,7 +2150,7 @@
                     <pic:cNvPicPr/>
                   </pic:nvPicPr>
                   <pic:blipFill>
-                    <a:blip xmlns:r="http://schemas.openxmlformats.org/officeDocument/2006/relationships" r:embed="Rdf85241bdc1e4796"/>
+                    <a:blip xmlns:r="http://schemas.openxmlformats.org/officeDocument/2006/relationships" r:embed="Re7ba26a6bd6049e6"/>
                     <a:stretch>
                       <a:fillRect/>
                     </a:stretch>
@@ -2201,7 +2201,7 @@
                     <pic:cNvPicPr/>
                   </pic:nvPicPr>
                   <pic:blipFill>
-                    <a:blip xmlns:r="http://schemas.openxmlformats.org/officeDocument/2006/relationships" r:embed="Rbd10c3b5fa05471a"/>
+                    <a:blip xmlns:r="http://schemas.openxmlformats.org/officeDocument/2006/relationships" r:embed="R28dcfeaf76594d28"/>
                     <a:stretch>
                       <a:fillRect/>
                     </a:stretch>
@@ -2252,7 +2252,7 @@
                     <pic:cNvPicPr/>
                   </pic:nvPicPr>
                   <pic:blipFill>
-                    <a:blip xmlns:r="http://schemas.openxmlformats.org/officeDocument/2006/relationships" r:embed="R84efca3189334fb3"/>
+                    <a:blip xmlns:r="http://schemas.openxmlformats.org/officeDocument/2006/relationships" r:embed="Rc11cb5ab572a404f"/>
                     <a:stretch>
                       <a:fillRect/>
                     </a:stretch>
@@ -2303,7 +2303,7 @@
                     <pic:cNvPicPr/>
                   </pic:nvPicPr>
                   <pic:blipFill>
-                    <a:blip xmlns:r="http://schemas.openxmlformats.org/officeDocument/2006/relationships" r:embed="R94cbc170f8a649dd"/>
+                    <a:blip xmlns:r="http://schemas.openxmlformats.org/officeDocument/2006/relationships" r:embed="R41982d6512f84297"/>
                     <a:stretch>
                       <a:fillRect/>
                     </a:stretch>
@@ -2354,7 +2354,7 @@
                     <pic:cNvPicPr/>
                   </pic:nvPicPr>
                   <pic:blipFill>
-                    <a:blip xmlns:r="http://schemas.openxmlformats.org/officeDocument/2006/relationships" r:embed="R6121bb55176d4cb6"/>
+                    <a:blip xmlns:r="http://schemas.openxmlformats.org/officeDocument/2006/relationships" r:embed="R7882837a29d543e8"/>
                     <a:stretch>
                       <a:fillRect/>
                     </a:stretch>
@@ -2430,7 +2430,7 @@
                     <pic:cNvPicPr/>
                   </pic:nvPicPr>
                   <pic:blipFill>
-                    <a:blip xmlns:r="http://schemas.openxmlformats.org/officeDocument/2006/relationships" r:embed="R416d4418a0d04fc7"/>
+                    <a:blip xmlns:r="http://schemas.openxmlformats.org/officeDocument/2006/relationships" r:embed="R0b0856e2b896474d"/>
                     <a:stretch>
                       <a:fillRect/>
                     </a:stretch>
@@ -2481,7 +2481,7 @@
                     <pic:cNvPicPr/>
                   </pic:nvPicPr>
                   <pic:blipFill>
-                    <a:blip xmlns:r="http://schemas.openxmlformats.org/officeDocument/2006/relationships" r:embed="R33b849b882214d21"/>
+                    <a:blip xmlns:r="http://schemas.openxmlformats.org/officeDocument/2006/relationships" r:embed="Re6a8a72c17f74125"/>
                     <a:stretch>
                       <a:fillRect/>
                     </a:stretch>
@@ -2532,7 +2532,7 @@
                     <pic:cNvPicPr/>
                   </pic:nvPicPr>
                   <pic:blipFill>
-                    <a:blip xmlns:r="http://schemas.openxmlformats.org/officeDocument/2006/relationships" r:embed="Rc9346e1e0b924952"/>
+                    <a:blip xmlns:r="http://schemas.openxmlformats.org/officeDocument/2006/relationships" r:embed="R88d0c041632a47bc"/>
                     <a:stretch>
                       <a:fillRect/>
                     </a:stretch>
@@ -2583,7 +2583,7 @@
                     <pic:cNvPicPr/>
                   </pic:nvPicPr>
                   <pic:blipFill>
-                    <a:blip xmlns:r="http://schemas.openxmlformats.org/officeDocument/2006/relationships" r:embed="R10917327bc784508"/>
+                    <a:blip xmlns:r="http://schemas.openxmlformats.org/officeDocument/2006/relationships" r:embed="Re17748e4eb984646"/>
                     <a:stretch>
                       <a:fillRect/>
                     </a:stretch>
@@ -2659,7 +2659,7 @@
                     <pic:cNvPicPr/>
                   </pic:nvPicPr>
                   <pic:blipFill>
-                    <a:blip xmlns:r="http://schemas.openxmlformats.org/officeDocument/2006/relationships" r:embed="R042c1b881f2a4bf3"/>
+                    <a:blip xmlns:r="http://schemas.openxmlformats.org/officeDocument/2006/relationships" r:embed="R4e6da712a3a04b6c"/>
                     <a:stretch>
                       <a:fillRect/>
                     </a:stretch>
@@ -2710,7 +2710,7 @@
                     <pic:cNvPicPr/>
                   </pic:nvPicPr>
                   <pic:blipFill>
-                    <a:blip xmlns:r="http://schemas.openxmlformats.org/officeDocument/2006/relationships" r:embed="Re9448e4aad2d42e8"/>
+                    <a:blip xmlns:r="http://schemas.openxmlformats.org/officeDocument/2006/relationships" r:embed="Rfa6b5b9b2b0340f1"/>
                     <a:stretch>
                       <a:fillRect/>
                     </a:stretch>
@@ -2761,7 +2761,7 @@
                     <pic:cNvPicPr/>
                   </pic:nvPicPr>
                   <pic:blipFill>
-                    <a:blip xmlns:r="http://schemas.openxmlformats.org/officeDocument/2006/relationships" r:embed="Rf8ff2b21ca534825"/>
+                    <a:blip xmlns:r="http://schemas.openxmlformats.org/officeDocument/2006/relationships" r:embed="Ree76fdf16a154ce4"/>
                     <a:stretch>
                       <a:fillRect/>
                     </a:stretch>
@@ -2812,7 +2812,7 @@
                     <pic:cNvPicPr/>
                   </pic:nvPicPr>
                   <pic:blipFill>
-                    <a:blip xmlns:r="http://schemas.openxmlformats.org/officeDocument/2006/relationships" r:embed="Ra89f240eb8444ab5"/>
+                    <a:blip xmlns:r="http://schemas.openxmlformats.org/officeDocument/2006/relationships" r:embed="Rc45b93829ae5404c"/>
                     <a:stretch>
                       <a:fillRect/>
                     </a:stretch>
@@ -2863,7 +2863,7 @@
                     <pic:cNvPicPr/>
                   </pic:nvPicPr>
                   <pic:blipFill>
-                    <a:blip xmlns:r="http://schemas.openxmlformats.org/officeDocument/2006/relationships" r:embed="R3bed9c6299d44304"/>
+                    <a:blip xmlns:r="http://schemas.openxmlformats.org/officeDocument/2006/relationships" r:embed="R41fa1c8da6144e2f"/>
                     <a:stretch>
                       <a:fillRect/>
                     </a:stretch>
@@ -2914,7 +2914,7 @@
                     <pic:cNvPicPr/>
                   </pic:nvPicPr>
                   <pic:blipFill>
-                    <a:blip xmlns:r="http://schemas.openxmlformats.org/officeDocument/2006/relationships" r:embed="R8950f36ba09e424c"/>
+                    <a:blip xmlns:r="http://schemas.openxmlformats.org/officeDocument/2006/relationships" r:embed="Rd934db153d9349dd"/>
                     <a:stretch>
                       <a:fillRect/>
                     </a:stretch>
@@ -2965,7 +2965,7 @@
                     <pic:cNvPicPr/>
                   </pic:nvPicPr>
                   <pic:blipFill>
-                    <a:blip xmlns:r="http://schemas.openxmlformats.org/officeDocument/2006/relationships" r:embed="R6e1ca7bd27864b59"/>
+                    <a:blip xmlns:r="http://schemas.openxmlformats.org/officeDocument/2006/relationships" r:embed="R9426097bbd194d6b"/>
                     <a:stretch>
                       <a:fillRect/>
                     </a:stretch>
@@ -3016,7 +3016,7 @@
                     <pic:cNvPicPr/>
                   </pic:nvPicPr>
                   <pic:blipFill>
-                    <a:blip xmlns:r="http://schemas.openxmlformats.org/officeDocument/2006/relationships" r:embed="R30e3539cb21948b0"/>
+                    <a:blip xmlns:r="http://schemas.openxmlformats.org/officeDocument/2006/relationships" r:embed="Rc3398025407849fd"/>
                     <a:stretch>
                       <a:fillRect/>
                     </a:stretch>
@@ -3067,7 +3067,7 @@
                     <pic:cNvPicPr/>
                   </pic:nvPicPr>
                   <pic:blipFill>
-                    <a:blip xmlns:r="http://schemas.openxmlformats.org/officeDocument/2006/relationships" r:embed="R0cc89cb9d65447f2"/>
+                    <a:blip xmlns:r="http://schemas.openxmlformats.org/officeDocument/2006/relationships" r:embed="R51ef48f1e33343ad"/>
                     <a:stretch>
                       <a:fillRect/>
                     </a:stretch>
@@ -3118,7 +3118,7 @@
                     <pic:cNvPicPr/>
                   </pic:nvPicPr>
                   <pic:blipFill>
-                    <a:blip xmlns:r="http://schemas.openxmlformats.org/officeDocument/2006/relationships" r:embed="Reee7b751c722486c"/>
+                    <a:blip xmlns:r="http://schemas.openxmlformats.org/officeDocument/2006/relationships" r:embed="Reb0a1b7612ed4c55"/>
                     <a:stretch>
                       <a:fillRect/>
                     </a:stretch>
@@ -3169,7 +3169,7 @@
                     <pic:cNvPicPr/>
                   </pic:nvPicPr>
                   <pic:blipFill>
-                    <a:blip xmlns:r="http://schemas.openxmlformats.org/officeDocument/2006/relationships" r:embed="R3632a1ade9794cc8"/>
+                    <a:blip xmlns:r="http://schemas.openxmlformats.org/officeDocument/2006/relationships" r:embed="Rc333989b5dff40fb"/>
                     <a:stretch>
                       <a:fillRect/>
                     </a:stretch>
@@ -3220,7 +3220,7 @@
                     <pic:cNvPicPr/>
                   </pic:nvPicPr>
                   <pic:blipFill>
-                    <a:blip xmlns:r="http://schemas.openxmlformats.org/officeDocument/2006/relationships" r:embed="R0d5cd02265d14c42"/>
+                    <a:blip xmlns:r="http://schemas.openxmlformats.org/officeDocument/2006/relationships" r:embed="R4735bb43df7945e6"/>
                     <a:stretch>
                       <a:fillRect/>
                     </a:stretch>
@@ -3271,7 +3271,7 @@
                     <pic:cNvPicPr/>
                   </pic:nvPicPr>
                   <pic:blipFill>
-                    <a:blip xmlns:r="http://schemas.openxmlformats.org/officeDocument/2006/relationships" r:embed="R38322a64c59f498f"/>
+                    <a:blip xmlns:r="http://schemas.openxmlformats.org/officeDocument/2006/relationships" r:embed="R6f280bfa52b74e6a"/>
                     <a:stretch>
                       <a:fillRect/>
                     </a:stretch>
@@ -3322,7 +3322,7 @@
                     <pic:cNvPicPr/>
                   </pic:nvPicPr>
                   <pic:blipFill>
-                    <a:blip xmlns:r="http://schemas.openxmlformats.org/officeDocument/2006/relationships" r:embed="R0895594542844fe7"/>
+                    <a:blip xmlns:r="http://schemas.openxmlformats.org/officeDocument/2006/relationships" r:embed="R6230c97030d948ff"/>
                     <a:stretch>
                       <a:fillRect/>
                     </a:stretch>
@@ -3419,7 +3419,7 @@
                     <pic:cNvPicPr/>
                   </pic:nvPicPr>
                   <pic:blipFill>
-                    <a:blip xmlns:r="http://schemas.openxmlformats.org/officeDocument/2006/relationships" r:embed="R8f307c5cfec24a68"/>
+                    <a:blip xmlns:r="http://schemas.openxmlformats.org/officeDocument/2006/relationships" r:embed="R43b9eb25a66b4218"/>
                     <a:stretch>
                       <a:fillRect/>
                     </a:stretch>
@@ -3462,7 +3462,7 @@
                     <pic:cNvPicPr/>
                   </pic:nvPicPr>
                   <pic:blipFill>
-                    <a:blip xmlns:r="http://schemas.openxmlformats.org/officeDocument/2006/relationships" r:embed="Ra6138869a1974038"/>
+                    <a:blip xmlns:r="http://schemas.openxmlformats.org/officeDocument/2006/relationships" r:embed="R440c11a05ed34e54"/>
                     <a:stretch>
                       <a:fillRect/>
                     </a:stretch>
@@ -3505,7 +3505,7 @@
                     <pic:cNvPicPr/>
                   </pic:nvPicPr>
                   <pic:blipFill>
-                    <a:blip xmlns:r="http://schemas.openxmlformats.org/officeDocument/2006/relationships" r:embed="R75d748d2c99c4681"/>
+                    <a:blip xmlns:r="http://schemas.openxmlformats.org/officeDocument/2006/relationships" r:embed="R35c66cfcb96a49c9"/>
                     <a:stretch>
                       <a:fillRect/>
                     </a:stretch>
@@ -3548,7 +3548,7 @@
                     <pic:cNvPicPr/>
                   </pic:nvPicPr>
                   <pic:blipFill>
-                    <a:blip xmlns:r="http://schemas.openxmlformats.org/officeDocument/2006/relationships" r:embed="Re4932a7de0c54c1a"/>
+                    <a:blip xmlns:r="http://schemas.openxmlformats.org/officeDocument/2006/relationships" r:embed="R4c303d078faa4372"/>
                     <a:stretch>
                       <a:fillRect/>
                     </a:stretch>
@@ -3933,7 +3933,7 @@
                     <pic:cNvPicPr/>
                   </pic:nvPicPr>
                   <pic:blipFill>
-                    <a:blip xmlns:r="http://schemas.openxmlformats.org/officeDocument/2006/relationships" r:embed="Rf4ae565d773b4a40"/>
+                    <a:blip xmlns:r="http://schemas.openxmlformats.org/officeDocument/2006/relationships" r:embed="R4c2cba28760047cb"/>
                     <a:stretch>
                       <a:fillRect/>
                     </a:stretch>
@@ -4125,7 +4125,7 @@
                     <pic:cNvPicPr/>
                   </pic:nvPicPr>
                   <pic:blipFill>
-                    <a:blip xmlns:r="http://schemas.openxmlformats.org/officeDocument/2006/relationships" r:embed="R85ecc50868b1490f"/>
+                    <a:blip xmlns:r="http://schemas.openxmlformats.org/officeDocument/2006/relationships" r:embed="R86ce8f528e0647fd"/>
                     <a:stretch>
                       <a:fillRect/>
                     </a:stretch>
@@ -4176,7 +4176,7 @@
                     <pic:cNvPicPr/>
                   </pic:nvPicPr>
                   <pic:blipFill>
-                    <a:blip xmlns:r="http://schemas.openxmlformats.org/officeDocument/2006/relationships" r:embed="R957acc9e308149ec"/>
+                    <a:blip xmlns:r="http://schemas.openxmlformats.org/officeDocument/2006/relationships" r:embed="R3631abad596a40a2"/>
                     <a:stretch>
                       <a:fillRect/>
                     </a:stretch>
@@ -4227,7 +4227,7 @@
                     <pic:cNvPicPr/>
                   </pic:nvPicPr>
                   <pic:blipFill>
-                    <a:blip xmlns:r="http://schemas.openxmlformats.org/officeDocument/2006/relationships" r:embed="R4ff3fe8ecb924892"/>
+                    <a:blip xmlns:r="http://schemas.openxmlformats.org/officeDocument/2006/relationships" r:embed="R7ae44f1f46b04f7d"/>
                     <a:stretch>
                       <a:fillRect/>
                     </a:stretch>
@@ -4278,7 +4278,7 @@
                     <pic:cNvPicPr/>
                   </pic:nvPicPr>
                   <pic:blipFill>
-                    <a:blip xmlns:r="http://schemas.openxmlformats.org/officeDocument/2006/relationships" r:embed="R1169d4159ff949b1"/>
+                    <a:blip xmlns:r="http://schemas.openxmlformats.org/officeDocument/2006/relationships" r:embed="R31ea818bd46d486e"/>
                     <a:stretch>
                       <a:fillRect/>
                     </a:stretch>
@@ -4657,7 +4657,7 @@
                     <pic:cNvPicPr/>
                   </pic:nvPicPr>
                   <pic:blipFill>
-                    <a:blip xmlns:r="http://schemas.openxmlformats.org/officeDocument/2006/relationships" r:embed="R7034ead243124c90"/>
+                    <a:blip xmlns:r="http://schemas.openxmlformats.org/officeDocument/2006/relationships" r:embed="Re9a7e0921df84e35"/>
                     <a:stretch>
                       <a:fillRect/>
                     </a:stretch>
@@ -5338,7 +5338,7 @@
             <w:r>
               <w:t xml:space="preserve">Cell with </w:t>
             </w:r>
-            <w:hyperlink xmlns:r="http://schemas.openxmlformats.org/officeDocument/2006/relationships" w:history="true" r:id="R001d392637a14d8e">
+            <w:hyperlink xmlns:r="http://schemas.openxmlformats.org/officeDocument/2006/relationships" w:history="true" r:id="R727a20c2618d4464">
               <w:r>
                 <w:rPr>
                   <w:rStyle w:val="Hyperlink"/>
@@ -5624,7 +5624,7 @@
                           <pic:cNvPicPr/>
                         </pic:nvPicPr>
                         <pic:blipFill>
-                          <a:blip xmlns:r="http://schemas.openxmlformats.org/officeDocument/2006/relationships" r:embed="Racd73ee5020a4791"/>
+                          <a:blip xmlns:r="http://schemas.openxmlformats.org/officeDocument/2006/relationships" r:embed="Rb5f357ef1dc2432e"/>
                           <a:stretch>
                             <a:fillRect/>
                           </a:stretch>
@@ -5724,7 +5724,7 @@
                     <pic:cNvPicPr/>
                   </pic:nvPicPr>
                   <pic:blipFill>
-                    <a:blip xmlns:r="http://schemas.openxmlformats.org/officeDocument/2006/relationships" r:embed="R4d01bae2df144df2"/>
+                    <a:blip xmlns:r="http://schemas.openxmlformats.org/officeDocument/2006/relationships" r:embed="Rcea86363f00c474a"/>
                     <a:stretch>
                       <a:fillRect/>
                     </a:stretch>
@@ -5774,7 +5774,7 @@
                     <pic:cNvPicPr/>
                   </pic:nvPicPr>
                   <pic:blipFill>
-                    <a:blip xmlns:r="http://schemas.openxmlformats.org/officeDocument/2006/relationships" r:embed="Rf4548a72769a4d46"/>
+                    <a:blip xmlns:r="http://schemas.openxmlformats.org/officeDocument/2006/relationships" r:embed="Rf72c2ed11892463d"/>
                     <a:stretch>
                       <a:fillRect/>
                     </a:stretch>
@@ -5824,7 +5824,7 @@
                     <pic:cNvPicPr/>
                   </pic:nvPicPr>
                   <pic:blipFill>
-                    <a:blip xmlns:r="http://schemas.openxmlformats.org/officeDocument/2006/relationships" r:embed="Re9b223d82dfe4b1f"/>
+                    <a:blip xmlns:r="http://schemas.openxmlformats.org/officeDocument/2006/relationships" r:embed="Re0662ff13d2f4d0b"/>
                     <a:stretch>
                       <a:fillRect/>
                     </a:stretch>

</xml_diff>

<commit_message>
fix(er): use corner-adjacent anchors for two-parent targets
Adjust Up-facing small-group anchor selection so two relationships entering the same target from above land on corner-adjacent upper-perimeter anchors (T1/T4), matching the updated ER geometry source-of-truth (LINE_ITEM two-parent case).

Made-with: Cursor
</commit_message>
<xml_diff>
--- a/test.docx
+++ b/test.docx
@@ -236,7 +236,7 @@
       <w:r>
         <w:t xml:space="preserve">, and </w:t>
       </w:r>
-      <w:hyperlink xmlns:r="http://schemas.openxmlformats.org/officeDocument/2006/relationships" w:history="true" r:id="R0ab71043759d4caa">
+      <w:hyperlink xmlns:r="http://schemas.openxmlformats.org/officeDocument/2006/relationships" w:history="true" r:id="R1c45673c235c4b87">
         <w:r>
           <w:rPr>
             <w:rStyle w:val="Hyperlink"/>
@@ -475,7 +475,7 @@
       <w:r>
         <w:t xml:space="preserve">Direct link: </w:t>
       </w:r>
-      <w:hyperlink xmlns:r="http://schemas.openxmlformats.org/officeDocument/2006/relationships" w:history="true" r:id="R780ad77db731465f">
+      <w:hyperlink xmlns:r="http://schemas.openxmlformats.org/officeDocument/2006/relationships" w:history="true" r:id="Rd34144bca7c545e8">
         <w:r>
           <w:rPr>
             <w:rStyle w:val="Hyperlink"/>
@@ -496,7 +496,7 @@
       <w:r>
         <w:t xml:space="preserve">Direct link with title: </w:t>
       </w:r>
-      <w:hyperlink xmlns:r="http://schemas.openxmlformats.org/officeDocument/2006/relationships" w:history="true" r:id="Rd5ab52eeaf614130">
+      <w:hyperlink xmlns:r="http://schemas.openxmlformats.org/officeDocument/2006/relationships" w:history="true" r:id="R787aa615d15a44ab">
         <w:r>
           <w:rPr>
             <w:rStyle w:val="Hyperlink"/>
@@ -517,7 +517,7 @@
       <w:r>
         <w:t xml:space="preserve">Reference-style link: </w:t>
       </w:r>
-      <w:hyperlink xmlns:r="http://schemas.openxmlformats.org/officeDocument/2006/relationships" w:history="true" r:id="R65d894039d224c14">
+      <w:hyperlink xmlns:r="http://schemas.openxmlformats.org/officeDocument/2006/relationships" w:history="true" r:id="Ree2711ae0c7a41e3">
         <w:r>
           <w:rPr>
             <w:rStyle w:val="Hyperlink"/>
@@ -538,7 +538,7 @@
       <w:r>
         <w:t xml:space="preserve">Collapsed reference link: </w:t>
       </w:r>
-      <w:hyperlink xmlns:r="http://schemas.openxmlformats.org/officeDocument/2006/relationships" w:history="true" r:id="R2adb6da5793f4f5d">
+      <w:hyperlink xmlns:r="http://schemas.openxmlformats.org/officeDocument/2006/relationships" w:history="true" r:id="Rcf7dc1c66af94348">
         <w:r>
           <w:rPr>
             <w:rStyle w:val="Hyperlink"/>
@@ -559,7 +559,7 @@
       <w:r>
         <w:t xml:space="preserve">Repeated reference link: </w:t>
       </w:r>
-      <w:hyperlink xmlns:r="http://schemas.openxmlformats.org/officeDocument/2006/relationships" w:history="true" r:id="R5b77a67ee449414d">
+      <w:hyperlink xmlns:r="http://schemas.openxmlformats.org/officeDocument/2006/relationships" w:history="true" r:id="R723d4490a7834f50">
         <w:r>
           <w:rPr>
             <w:rStyle w:val="Hyperlink"/>
@@ -580,7 +580,7 @@
       <w:r>
         <w:t xml:space="preserve">Autolink URL: </w:t>
       </w:r>
-      <w:hyperlink xmlns:r="http://schemas.openxmlformats.org/officeDocument/2006/relationships" w:history="true" r:id="R9bb4c9a03b074265">
+      <w:hyperlink xmlns:r="http://schemas.openxmlformats.org/officeDocument/2006/relationships" w:history="true" r:id="R6a6d1a7eec514c36">
         <w:r>
           <w:rPr>
             <w:rStyle w:val="Hyperlink"/>
@@ -601,7 +601,7 @@
       <w:r>
         <w:t xml:space="preserve">Autolink email: </w:t>
       </w:r>
-      <w:hyperlink xmlns:r="http://schemas.openxmlformats.org/officeDocument/2006/relationships" w:history="true" r:id="R12033b96785c4968">
+      <w:hyperlink xmlns:r="http://schemas.openxmlformats.org/officeDocument/2006/relationships" w:history="true" r:id="R55fbab9077d247a6">
         <w:r>
           <w:rPr>
             <w:rStyle w:val="Hyperlink"/>
@@ -700,7 +700,7 @@
       <w:r>
         <w:t xml:space="preserve">, and </w:t>
       </w:r>
-      <w:hyperlink xmlns:r="http://schemas.openxmlformats.org/officeDocument/2006/relationships" w:history="true" r:id="Rdc22442573e94f93">
+      <w:hyperlink xmlns:r="http://schemas.openxmlformats.org/officeDocument/2006/relationships" w:history="true" r:id="Rb3d2253a7ec54853">
         <w:r>
           <w:rPr>
             <w:rStyle w:val="Hyperlink"/>
@@ -1093,7 +1093,7 @@
       <w:r>
         <w:t xml:space="preserve">Continuation paragraph with </w:t>
       </w:r>
-      <w:hyperlink xmlns:r="http://schemas.openxmlformats.org/officeDocument/2006/relationships" w:history="true" r:id="R433f1a1a7f4b4a7b">
+      <w:hyperlink xmlns:r="http://schemas.openxmlformats.org/officeDocument/2006/relationships" w:history="true" r:id="R074f599a91df4c51">
         <w:r>
           <w:rPr>
             <w:rStyle w:val="Hyperlink"/>
@@ -1591,7 +1591,7 @@
       <w:r>
         <w:t xml:space="preserve">, and </w:t>
       </w:r>
-      <w:hyperlink xmlns:r="http://schemas.openxmlformats.org/officeDocument/2006/relationships" w:history="true" r:id="R171cced954bb4747">
+      <w:hyperlink xmlns:r="http://schemas.openxmlformats.org/officeDocument/2006/relationships" w:history="true" r:id="R60a1bf4daa754c60">
         <w:r>
           <w:rPr>
             <w:rStyle w:val="Hyperlink"/>
@@ -1979,7 +1979,7 @@
                     <pic:cNvPicPr/>
                   </pic:nvPicPr>
                   <pic:blipFill>
-                    <a:blip xmlns:r="http://schemas.openxmlformats.org/officeDocument/2006/relationships" r:embed="R2600baa09e9e4ed7"/>
+                    <a:blip xmlns:r="http://schemas.openxmlformats.org/officeDocument/2006/relationships" r:embed="Rf3f854b6ed1441a5"/>
                     <a:stretch>
                       <a:fillRect/>
                     </a:stretch>
@@ -2039,7 +2039,7 @@
                     <pic:cNvPicPr/>
                   </pic:nvPicPr>
                   <pic:blipFill>
-                    <a:blip xmlns:r="http://schemas.openxmlformats.org/officeDocument/2006/relationships" r:embed="R6eb01070d7324d65"/>
+                    <a:blip xmlns:r="http://schemas.openxmlformats.org/officeDocument/2006/relationships" r:embed="R3c12fbe0c883429c"/>
                     <a:stretch>
                       <a:fillRect/>
                     </a:stretch>
@@ -2099,7 +2099,7 @@
                     <pic:cNvPicPr/>
                   </pic:nvPicPr>
                   <pic:blipFill>
-                    <a:blip xmlns:r="http://schemas.openxmlformats.org/officeDocument/2006/relationships" r:embed="R6d2c7afa158c496a"/>
+                    <a:blip xmlns:r="http://schemas.openxmlformats.org/officeDocument/2006/relationships" r:embed="R0b6a500e8d3d4a97"/>
                     <a:stretch>
                       <a:fillRect/>
                     </a:stretch>
@@ -2150,7 +2150,7 @@
                     <pic:cNvPicPr/>
                   </pic:nvPicPr>
                   <pic:blipFill>
-                    <a:blip xmlns:r="http://schemas.openxmlformats.org/officeDocument/2006/relationships" r:embed="Re7ba26a6bd6049e6"/>
+                    <a:blip xmlns:r="http://schemas.openxmlformats.org/officeDocument/2006/relationships" r:embed="R0672bd6e6f76471c"/>
                     <a:stretch>
                       <a:fillRect/>
                     </a:stretch>
@@ -2201,7 +2201,7 @@
                     <pic:cNvPicPr/>
                   </pic:nvPicPr>
                   <pic:blipFill>
-                    <a:blip xmlns:r="http://schemas.openxmlformats.org/officeDocument/2006/relationships" r:embed="R28dcfeaf76594d28"/>
+                    <a:blip xmlns:r="http://schemas.openxmlformats.org/officeDocument/2006/relationships" r:embed="R73f1681445e64ce4"/>
                     <a:stretch>
                       <a:fillRect/>
                     </a:stretch>
@@ -2252,7 +2252,7 @@
                     <pic:cNvPicPr/>
                   </pic:nvPicPr>
                   <pic:blipFill>
-                    <a:blip xmlns:r="http://schemas.openxmlformats.org/officeDocument/2006/relationships" r:embed="Rc11cb5ab572a404f"/>
+                    <a:blip xmlns:r="http://schemas.openxmlformats.org/officeDocument/2006/relationships" r:embed="R46b38044e51f401e"/>
                     <a:stretch>
                       <a:fillRect/>
                     </a:stretch>
@@ -2303,7 +2303,7 @@
                     <pic:cNvPicPr/>
                   </pic:nvPicPr>
                   <pic:blipFill>
-                    <a:blip xmlns:r="http://schemas.openxmlformats.org/officeDocument/2006/relationships" r:embed="R41982d6512f84297"/>
+                    <a:blip xmlns:r="http://schemas.openxmlformats.org/officeDocument/2006/relationships" r:embed="R4e1ca3bc7fbf4eab"/>
                     <a:stretch>
                       <a:fillRect/>
                     </a:stretch>
@@ -2354,7 +2354,7 @@
                     <pic:cNvPicPr/>
                   </pic:nvPicPr>
                   <pic:blipFill>
-                    <a:blip xmlns:r="http://schemas.openxmlformats.org/officeDocument/2006/relationships" r:embed="R7882837a29d543e8"/>
+                    <a:blip xmlns:r="http://schemas.openxmlformats.org/officeDocument/2006/relationships" r:embed="R44386a941d24496b"/>
                     <a:stretch>
                       <a:fillRect/>
                     </a:stretch>
@@ -2430,7 +2430,7 @@
                     <pic:cNvPicPr/>
                   </pic:nvPicPr>
                   <pic:blipFill>
-                    <a:blip xmlns:r="http://schemas.openxmlformats.org/officeDocument/2006/relationships" r:embed="R0b0856e2b896474d"/>
+                    <a:blip xmlns:r="http://schemas.openxmlformats.org/officeDocument/2006/relationships" r:embed="R69c34a86a91e4891"/>
                     <a:stretch>
                       <a:fillRect/>
                     </a:stretch>
@@ -2481,7 +2481,7 @@
                     <pic:cNvPicPr/>
                   </pic:nvPicPr>
                   <pic:blipFill>
-                    <a:blip xmlns:r="http://schemas.openxmlformats.org/officeDocument/2006/relationships" r:embed="Re6a8a72c17f74125"/>
+                    <a:blip xmlns:r="http://schemas.openxmlformats.org/officeDocument/2006/relationships" r:embed="R46ace7b635b941a2"/>
                     <a:stretch>
                       <a:fillRect/>
                     </a:stretch>
@@ -2532,7 +2532,7 @@
                     <pic:cNvPicPr/>
                   </pic:nvPicPr>
                   <pic:blipFill>
-                    <a:blip xmlns:r="http://schemas.openxmlformats.org/officeDocument/2006/relationships" r:embed="R88d0c041632a47bc"/>
+                    <a:blip xmlns:r="http://schemas.openxmlformats.org/officeDocument/2006/relationships" r:embed="Re672627070064bf8"/>
                     <a:stretch>
                       <a:fillRect/>
                     </a:stretch>
@@ -2583,7 +2583,7 @@
                     <pic:cNvPicPr/>
                   </pic:nvPicPr>
                   <pic:blipFill>
-                    <a:blip xmlns:r="http://schemas.openxmlformats.org/officeDocument/2006/relationships" r:embed="Re17748e4eb984646"/>
+                    <a:blip xmlns:r="http://schemas.openxmlformats.org/officeDocument/2006/relationships" r:embed="R9a7928ac24474fd5"/>
                     <a:stretch>
                       <a:fillRect/>
                     </a:stretch>
@@ -2659,7 +2659,7 @@
                     <pic:cNvPicPr/>
                   </pic:nvPicPr>
                   <pic:blipFill>
-                    <a:blip xmlns:r="http://schemas.openxmlformats.org/officeDocument/2006/relationships" r:embed="R4e6da712a3a04b6c"/>
+                    <a:blip xmlns:r="http://schemas.openxmlformats.org/officeDocument/2006/relationships" r:embed="R3d8d4957336a4bd7"/>
                     <a:stretch>
                       <a:fillRect/>
                     </a:stretch>
@@ -2710,7 +2710,7 @@
                     <pic:cNvPicPr/>
                   </pic:nvPicPr>
                   <pic:blipFill>
-                    <a:blip xmlns:r="http://schemas.openxmlformats.org/officeDocument/2006/relationships" r:embed="Rfa6b5b9b2b0340f1"/>
+                    <a:blip xmlns:r="http://schemas.openxmlformats.org/officeDocument/2006/relationships" r:embed="Re1f9465c5cd84b5c"/>
                     <a:stretch>
                       <a:fillRect/>
                     </a:stretch>
@@ -2761,7 +2761,7 @@
                     <pic:cNvPicPr/>
                   </pic:nvPicPr>
                   <pic:blipFill>
-                    <a:blip xmlns:r="http://schemas.openxmlformats.org/officeDocument/2006/relationships" r:embed="Ree76fdf16a154ce4"/>
+                    <a:blip xmlns:r="http://schemas.openxmlformats.org/officeDocument/2006/relationships" r:embed="R9c3fbeacf5574798"/>
                     <a:stretch>
                       <a:fillRect/>
                     </a:stretch>
@@ -2812,7 +2812,7 @@
                     <pic:cNvPicPr/>
                   </pic:nvPicPr>
                   <pic:blipFill>
-                    <a:blip xmlns:r="http://schemas.openxmlformats.org/officeDocument/2006/relationships" r:embed="Rc45b93829ae5404c"/>
+                    <a:blip xmlns:r="http://schemas.openxmlformats.org/officeDocument/2006/relationships" r:embed="Re09ab8cdd4354874"/>
                     <a:stretch>
                       <a:fillRect/>
                     </a:stretch>
@@ -2863,7 +2863,7 @@
                     <pic:cNvPicPr/>
                   </pic:nvPicPr>
                   <pic:blipFill>
-                    <a:blip xmlns:r="http://schemas.openxmlformats.org/officeDocument/2006/relationships" r:embed="R41fa1c8da6144e2f"/>
+                    <a:blip xmlns:r="http://schemas.openxmlformats.org/officeDocument/2006/relationships" r:embed="R1cced470c5ba4bba"/>
                     <a:stretch>
                       <a:fillRect/>
                     </a:stretch>
@@ -2914,7 +2914,7 @@
                     <pic:cNvPicPr/>
                   </pic:nvPicPr>
                   <pic:blipFill>
-                    <a:blip xmlns:r="http://schemas.openxmlformats.org/officeDocument/2006/relationships" r:embed="Rd934db153d9349dd"/>
+                    <a:blip xmlns:r="http://schemas.openxmlformats.org/officeDocument/2006/relationships" r:embed="Rd0901fa2b6794e54"/>
                     <a:stretch>
                       <a:fillRect/>
                     </a:stretch>
@@ -2965,7 +2965,7 @@
                     <pic:cNvPicPr/>
                   </pic:nvPicPr>
                   <pic:blipFill>
-                    <a:blip xmlns:r="http://schemas.openxmlformats.org/officeDocument/2006/relationships" r:embed="R9426097bbd194d6b"/>
+                    <a:blip xmlns:r="http://schemas.openxmlformats.org/officeDocument/2006/relationships" r:embed="R914b101b0c004a2c"/>
                     <a:stretch>
                       <a:fillRect/>
                     </a:stretch>
@@ -3016,7 +3016,7 @@
                     <pic:cNvPicPr/>
                   </pic:nvPicPr>
                   <pic:blipFill>
-                    <a:blip xmlns:r="http://schemas.openxmlformats.org/officeDocument/2006/relationships" r:embed="Rc3398025407849fd"/>
+                    <a:blip xmlns:r="http://schemas.openxmlformats.org/officeDocument/2006/relationships" r:embed="Rb6d1987989554e31"/>
                     <a:stretch>
                       <a:fillRect/>
                     </a:stretch>
@@ -3067,7 +3067,7 @@
                     <pic:cNvPicPr/>
                   </pic:nvPicPr>
                   <pic:blipFill>
-                    <a:blip xmlns:r="http://schemas.openxmlformats.org/officeDocument/2006/relationships" r:embed="R51ef48f1e33343ad"/>
+                    <a:blip xmlns:r="http://schemas.openxmlformats.org/officeDocument/2006/relationships" r:embed="R529839de47a1410c"/>
                     <a:stretch>
                       <a:fillRect/>
                     </a:stretch>
@@ -3118,7 +3118,7 @@
                     <pic:cNvPicPr/>
                   </pic:nvPicPr>
                   <pic:blipFill>
-                    <a:blip xmlns:r="http://schemas.openxmlformats.org/officeDocument/2006/relationships" r:embed="Reb0a1b7612ed4c55"/>
+                    <a:blip xmlns:r="http://schemas.openxmlformats.org/officeDocument/2006/relationships" r:embed="R9b01e87eac954b37"/>
                     <a:stretch>
                       <a:fillRect/>
                     </a:stretch>
@@ -3169,7 +3169,7 @@
                     <pic:cNvPicPr/>
                   </pic:nvPicPr>
                   <pic:blipFill>
-                    <a:blip xmlns:r="http://schemas.openxmlformats.org/officeDocument/2006/relationships" r:embed="Rc333989b5dff40fb"/>
+                    <a:blip xmlns:r="http://schemas.openxmlformats.org/officeDocument/2006/relationships" r:embed="R23f87ca3ab1c40c6"/>
                     <a:stretch>
                       <a:fillRect/>
                     </a:stretch>
@@ -3220,7 +3220,7 @@
                     <pic:cNvPicPr/>
                   </pic:nvPicPr>
                   <pic:blipFill>
-                    <a:blip xmlns:r="http://schemas.openxmlformats.org/officeDocument/2006/relationships" r:embed="R4735bb43df7945e6"/>
+                    <a:blip xmlns:r="http://schemas.openxmlformats.org/officeDocument/2006/relationships" r:embed="R34fa367680b94708"/>
                     <a:stretch>
                       <a:fillRect/>
                     </a:stretch>
@@ -3271,7 +3271,7 @@
                     <pic:cNvPicPr/>
                   </pic:nvPicPr>
                   <pic:blipFill>
-                    <a:blip xmlns:r="http://schemas.openxmlformats.org/officeDocument/2006/relationships" r:embed="R6f280bfa52b74e6a"/>
+                    <a:blip xmlns:r="http://schemas.openxmlformats.org/officeDocument/2006/relationships" r:embed="Re27cc44c851f447f"/>
                     <a:stretch>
                       <a:fillRect/>
                     </a:stretch>
@@ -3322,7 +3322,7 @@
                     <pic:cNvPicPr/>
                   </pic:nvPicPr>
                   <pic:blipFill>
-                    <a:blip xmlns:r="http://schemas.openxmlformats.org/officeDocument/2006/relationships" r:embed="R6230c97030d948ff"/>
+                    <a:blip xmlns:r="http://schemas.openxmlformats.org/officeDocument/2006/relationships" r:embed="R2b250d7b46cc4f03"/>
                     <a:stretch>
                       <a:fillRect/>
                     </a:stretch>
@@ -3419,7 +3419,7 @@
                     <pic:cNvPicPr/>
                   </pic:nvPicPr>
                   <pic:blipFill>
-                    <a:blip xmlns:r="http://schemas.openxmlformats.org/officeDocument/2006/relationships" r:embed="R43b9eb25a66b4218"/>
+                    <a:blip xmlns:r="http://schemas.openxmlformats.org/officeDocument/2006/relationships" r:embed="Re5126533965c45c3"/>
                     <a:stretch>
                       <a:fillRect/>
                     </a:stretch>
@@ -3462,7 +3462,7 @@
                     <pic:cNvPicPr/>
                   </pic:nvPicPr>
                   <pic:blipFill>
-                    <a:blip xmlns:r="http://schemas.openxmlformats.org/officeDocument/2006/relationships" r:embed="R440c11a05ed34e54"/>
+                    <a:blip xmlns:r="http://schemas.openxmlformats.org/officeDocument/2006/relationships" r:embed="R0e1c2916b1b247a1"/>
                     <a:stretch>
                       <a:fillRect/>
                     </a:stretch>
@@ -3505,7 +3505,7 @@
                     <pic:cNvPicPr/>
                   </pic:nvPicPr>
                   <pic:blipFill>
-                    <a:blip xmlns:r="http://schemas.openxmlformats.org/officeDocument/2006/relationships" r:embed="R35c66cfcb96a49c9"/>
+                    <a:blip xmlns:r="http://schemas.openxmlformats.org/officeDocument/2006/relationships" r:embed="Rd572140298434b71"/>
                     <a:stretch>
                       <a:fillRect/>
                     </a:stretch>
@@ -3548,7 +3548,7 @@
                     <pic:cNvPicPr/>
                   </pic:nvPicPr>
                   <pic:blipFill>
-                    <a:blip xmlns:r="http://schemas.openxmlformats.org/officeDocument/2006/relationships" r:embed="R4c303d078faa4372"/>
+                    <a:blip xmlns:r="http://schemas.openxmlformats.org/officeDocument/2006/relationships" r:embed="R1fc4e1661a7b49fe"/>
                     <a:stretch>
                       <a:fillRect/>
                     </a:stretch>
@@ -3933,7 +3933,7 @@
                     <pic:cNvPicPr/>
                   </pic:nvPicPr>
                   <pic:blipFill>
-                    <a:blip xmlns:r="http://schemas.openxmlformats.org/officeDocument/2006/relationships" r:embed="R4c2cba28760047cb"/>
+                    <a:blip xmlns:r="http://schemas.openxmlformats.org/officeDocument/2006/relationships" r:embed="R92abc26dd20b4935"/>
                     <a:stretch>
                       <a:fillRect/>
                     </a:stretch>
@@ -4125,7 +4125,7 @@
                     <pic:cNvPicPr/>
                   </pic:nvPicPr>
                   <pic:blipFill>
-                    <a:blip xmlns:r="http://schemas.openxmlformats.org/officeDocument/2006/relationships" r:embed="R86ce8f528e0647fd"/>
+                    <a:blip xmlns:r="http://schemas.openxmlformats.org/officeDocument/2006/relationships" r:embed="Rac967497de67445f"/>
                     <a:stretch>
                       <a:fillRect/>
                     </a:stretch>
@@ -4176,7 +4176,7 @@
                     <pic:cNvPicPr/>
                   </pic:nvPicPr>
                   <pic:blipFill>
-                    <a:blip xmlns:r="http://schemas.openxmlformats.org/officeDocument/2006/relationships" r:embed="R3631abad596a40a2"/>
+                    <a:blip xmlns:r="http://schemas.openxmlformats.org/officeDocument/2006/relationships" r:embed="Rf9aee280cfe24f78"/>
                     <a:stretch>
                       <a:fillRect/>
                     </a:stretch>
@@ -4227,7 +4227,7 @@
                     <pic:cNvPicPr/>
                   </pic:nvPicPr>
                   <pic:blipFill>
-                    <a:blip xmlns:r="http://schemas.openxmlformats.org/officeDocument/2006/relationships" r:embed="R7ae44f1f46b04f7d"/>
+                    <a:blip xmlns:r="http://schemas.openxmlformats.org/officeDocument/2006/relationships" r:embed="Rac4b847d21cf447d"/>
                     <a:stretch>
                       <a:fillRect/>
                     </a:stretch>
@@ -4278,7 +4278,7 @@
                     <pic:cNvPicPr/>
                   </pic:nvPicPr>
                   <pic:blipFill>
-                    <a:blip xmlns:r="http://schemas.openxmlformats.org/officeDocument/2006/relationships" r:embed="R31ea818bd46d486e"/>
+                    <a:blip xmlns:r="http://schemas.openxmlformats.org/officeDocument/2006/relationships" r:embed="R622024959d374769"/>
                     <a:stretch>
                       <a:fillRect/>
                     </a:stretch>
@@ -4657,7 +4657,7 @@
                     <pic:cNvPicPr/>
                   </pic:nvPicPr>
                   <pic:blipFill>
-                    <a:blip xmlns:r="http://schemas.openxmlformats.org/officeDocument/2006/relationships" r:embed="Re9a7e0921df84e35"/>
+                    <a:blip xmlns:r="http://schemas.openxmlformats.org/officeDocument/2006/relationships" r:embed="R1ec2f9795fed49eb"/>
                     <a:stretch>
                       <a:fillRect/>
                     </a:stretch>
@@ -5338,7 +5338,7 @@
             <w:r>
               <w:t xml:space="preserve">Cell with </w:t>
             </w:r>
-            <w:hyperlink xmlns:r="http://schemas.openxmlformats.org/officeDocument/2006/relationships" w:history="true" r:id="R727a20c2618d4464">
+            <w:hyperlink xmlns:r="http://schemas.openxmlformats.org/officeDocument/2006/relationships" w:history="true" r:id="R5049055079e14834">
               <w:r>
                 <w:rPr>
                   <w:rStyle w:val="Hyperlink"/>
@@ -5624,7 +5624,7 @@
                           <pic:cNvPicPr/>
                         </pic:nvPicPr>
                         <pic:blipFill>
-                          <a:blip xmlns:r="http://schemas.openxmlformats.org/officeDocument/2006/relationships" r:embed="Rb5f357ef1dc2432e"/>
+                          <a:blip xmlns:r="http://schemas.openxmlformats.org/officeDocument/2006/relationships" r:embed="R8847cc5176f84590"/>
                           <a:stretch>
                             <a:fillRect/>
                           </a:stretch>
@@ -5724,7 +5724,7 @@
                     <pic:cNvPicPr/>
                   </pic:nvPicPr>
                   <pic:blipFill>
-                    <a:blip xmlns:r="http://schemas.openxmlformats.org/officeDocument/2006/relationships" r:embed="Rcea86363f00c474a"/>
+                    <a:blip xmlns:r="http://schemas.openxmlformats.org/officeDocument/2006/relationships" r:embed="R4468501e5bd44e40"/>
                     <a:stretch>
                       <a:fillRect/>
                     </a:stretch>
@@ -5774,7 +5774,7 @@
                     <pic:cNvPicPr/>
                   </pic:nvPicPr>
                   <pic:blipFill>
-                    <a:blip xmlns:r="http://schemas.openxmlformats.org/officeDocument/2006/relationships" r:embed="Rf72c2ed11892463d"/>
+                    <a:blip xmlns:r="http://schemas.openxmlformats.org/officeDocument/2006/relationships" r:embed="R51d1da1413f44538"/>
                     <a:stretch>
                       <a:fillRect/>
                     </a:stretch>
@@ -5824,7 +5824,7 @@
                     <pic:cNvPicPr/>
                   </pic:nvPicPr>
                   <pic:blipFill>
-                    <a:blip xmlns:r="http://schemas.openxmlformats.org/officeDocument/2006/relationships" r:embed="Re0662ff13d2f4d0b"/>
+                    <a:blip xmlns:r="http://schemas.openxmlformats.org/officeDocument/2006/relationships" r:embed="R7a104fb7cd9b422b"/>
                     <a:stretch>
                       <a:fillRect/>
                     </a:stretch>

</xml_diff>

<commit_message>
fix(er): force T1/T4 for two-parent targets
For Up-facing groups with exactly two relationships, select corner-adjacent top anchors (T1 and T4) explicitly to match the ER geometry source-of-truth (LINE_ITEM two-parent case) and avoid accidental drift from slot-index selection.

Made-with: Cursor
</commit_message>
<xml_diff>
--- a/test.docx
+++ b/test.docx
@@ -236,7 +236,7 @@
       <w:r>
         <w:t xml:space="preserve">, and </w:t>
       </w:r>
-      <w:hyperlink xmlns:r="http://schemas.openxmlformats.org/officeDocument/2006/relationships" w:history="true" r:id="R1c45673c235c4b87">
+      <w:hyperlink xmlns:r="http://schemas.openxmlformats.org/officeDocument/2006/relationships" w:history="true" r:id="R5a96e50339e94a86">
         <w:r>
           <w:rPr>
             <w:rStyle w:val="Hyperlink"/>
@@ -475,7 +475,7 @@
       <w:r>
         <w:t xml:space="preserve">Direct link: </w:t>
       </w:r>
-      <w:hyperlink xmlns:r="http://schemas.openxmlformats.org/officeDocument/2006/relationships" w:history="true" r:id="Rd34144bca7c545e8">
+      <w:hyperlink xmlns:r="http://schemas.openxmlformats.org/officeDocument/2006/relationships" w:history="true" r:id="R9caf75878b854db9">
         <w:r>
           <w:rPr>
             <w:rStyle w:val="Hyperlink"/>
@@ -496,7 +496,7 @@
       <w:r>
         <w:t xml:space="preserve">Direct link with title: </w:t>
       </w:r>
-      <w:hyperlink xmlns:r="http://schemas.openxmlformats.org/officeDocument/2006/relationships" w:history="true" r:id="R787aa615d15a44ab">
+      <w:hyperlink xmlns:r="http://schemas.openxmlformats.org/officeDocument/2006/relationships" w:history="true" r:id="R5b08051790604bc9">
         <w:r>
           <w:rPr>
             <w:rStyle w:val="Hyperlink"/>
@@ -517,7 +517,7 @@
       <w:r>
         <w:t xml:space="preserve">Reference-style link: </w:t>
       </w:r>
-      <w:hyperlink xmlns:r="http://schemas.openxmlformats.org/officeDocument/2006/relationships" w:history="true" r:id="Ree2711ae0c7a41e3">
+      <w:hyperlink xmlns:r="http://schemas.openxmlformats.org/officeDocument/2006/relationships" w:history="true" r:id="R515acdcdd96c4f44">
         <w:r>
           <w:rPr>
             <w:rStyle w:val="Hyperlink"/>
@@ -538,7 +538,7 @@
       <w:r>
         <w:t xml:space="preserve">Collapsed reference link: </w:t>
       </w:r>
-      <w:hyperlink xmlns:r="http://schemas.openxmlformats.org/officeDocument/2006/relationships" w:history="true" r:id="Rcf7dc1c66af94348">
+      <w:hyperlink xmlns:r="http://schemas.openxmlformats.org/officeDocument/2006/relationships" w:history="true" r:id="R76afe53baf794cab">
         <w:r>
           <w:rPr>
             <w:rStyle w:val="Hyperlink"/>
@@ -559,7 +559,7 @@
       <w:r>
         <w:t xml:space="preserve">Repeated reference link: </w:t>
       </w:r>
-      <w:hyperlink xmlns:r="http://schemas.openxmlformats.org/officeDocument/2006/relationships" w:history="true" r:id="R723d4490a7834f50">
+      <w:hyperlink xmlns:r="http://schemas.openxmlformats.org/officeDocument/2006/relationships" w:history="true" r:id="R7217649868074f26">
         <w:r>
           <w:rPr>
             <w:rStyle w:val="Hyperlink"/>
@@ -580,7 +580,7 @@
       <w:r>
         <w:t xml:space="preserve">Autolink URL: </w:t>
       </w:r>
-      <w:hyperlink xmlns:r="http://schemas.openxmlformats.org/officeDocument/2006/relationships" w:history="true" r:id="R6a6d1a7eec514c36">
+      <w:hyperlink xmlns:r="http://schemas.openxmlformats.org/officeDocument/2006/relationships" w:history="true" r:id="R4f9fbc8cc0634cb8">
         <w:r>
           <w:rPr>
             <w:rStyle w:val="Hyperlink"/>
@@ -601,7 +601,7 @@
       <w:r>
         <w:t xml:space="preserve">Autolink email: </w:t>
       </w:r>
-      <w:hyperlink xmlns:r="http://schemas.openxmlformats.org/officeDocument/2006/relationships" w:history="true" r:id="R55fbab9077d247a6">
+      <w:hyperlink xmlns:r="http://schemas.openxmlformats.org/officeDocument/2006/relationships" w:history="true" r:id="Rc9468dd7c99443d6">
         <w:r>
           <w:rPr>
             <w:rStyle w:val="Hyperlink"/>
@@ -700,7 +700,7 @@
       <w:r>
         <w:t xml:space="preserve">, and </w:t>
       </w:r>
-      <w:hyperlink xmlns:r="http://schemas.openxmlformats.org/officeDocument/2006/relationships" w:history="true" r:id="Rb3d2253a7ec54853">
+      <w:hyperlink xmlns:r="http://schemas.openxmlformats.org/officeDocument/2006/relationships" w:history="true" r:id="R77e057e57dd14de6">
         <w:r>
           <w:rPr>
             <w:rStyle w:val="Hyperlink"/>
@@ -1093,7 +1093,7 @@
       <w:r>
         <w:t xml:space="preserve">Continuation paragraph with </w:t>
       </w:r>
-      <w:hyperlink xmlns:r="http://schemas.openxmlformats.org/officeDocument/2006/relationships" w:history="true" r:id="R074f599a91df4c51">
+      <w:hyperlink xmlns:r="http://schemas.openxmlformats.org/officeDocument/2006/relationships" w:history="true" r:id="R4a92a11e7704443c">
         <w:r>
           <w:rPr>
             <w:rStyle w:val="Hyperlink"/>
@@ -1591,7 +1591,7 @@
       <w:r>
         <w:t xml:space="preserve">, and </w:t>
       </w:r>
-      <w:hyperlink xmlns:r="http://schemas.openxmlformats.org/officeDocument/2006/relationships" w:history="true" r:id="R60a1bf4daa754c60">
+      <w:hyperlink xmlns:r="http://schemas.openxmlformats.org/officeDocument/2006/relationships" w:history="true" r:id="R13fa930ce8274335">
         <w:r>
           <w:rPr>
             <w:rStyle w:val="Hyperlink"/>
@@ -1979,7 +1979,7 @@
                     <pic:cNvPicPr/>
                   </pic:nvPicPr>
                   <pic:blipFill>
-                    <a:blip xmlns:r="http://schemas.openxmlformats.org/officeDocument/2006/relationships" r:embed="Rf3f854b6ed1441a5"/>
+                    <a:blip xmlns:r="http://schemas.openxmlformats.org/officeDocument/2006/relationships" r:embed="R8795826071634e37"/>
                     <a:stretch>
                       <a:fillRect/>
                     </a:stretch>
@@ -2039,7 +2039,7 @@
                     <pic:cNvPicPr/>
                   </pic:nvPicPr>
                   <pic:blipFill>
-                    <a:blip xmlns:r="http://schemas.openxmlformats.org/officeDocument/2006/relationships" r:embed="R3c12fbe0c883429c"/>
+                    <a:blip xmlns:r="http://schemas.openxmlformats.org/officeDocument/2006/relationships" r:embed="Raf05cfe8309a4bd3"/>
                     <a:stretch>
                       <a:fillRect/>
                     </a:stretch>
@@ -2099,7 +2099,7 @@
                     <pic:cNvPicPr/>
                   </pic:nvPicPr>
                   <pic:blipFill>
-                    <a:blip xmlns:r="http://schemas.openxmlformats.org/officeDocument/2006/relationships" r:embed="R0b6a500e8d3d4a97"/>
+                    <a:blip xmlns:r="http://schemas.openxmlformats.org/officeDocument/2006/relationships" r:embed="Re3001d88cb2942d3"/>
                     <a:stretch>
                       <a:fillRect/>
                     </a:stretch>
@@ -2150,7 +2150,7 @@
                     <pic:cNvPicPr/>
                   </pic:nvPicPr>
                   <pic:blipFill>
-                    <a:blip xmlns:r="http://schemas.openxmlformats.org/officeDocument/2006/relationships" r:embed="R0672bd6e6f76471c"/>
+                    <a:blip xmlns:r="http://schemas.openxmlformats.org/officeDocument/2006/relationships" r:embed="R00b025a861414279"/>
                     <a:stretch>
                       <a:fillRect/>
                     </a:stretch>
@@ -2201,7 +2201,7 @@
                     <pic:cNvPicPr/>
                   </pic:nvPicPr>
                   <pic:blipFill>
-                    <a:blip xmlns:r="http://schemas.openxmlformats.org/officeDocument/2006/relationships" r:embed="R73f1681445e64ce4"/>
+                    <a:blip xmlns:r="http://schemas.openxmlformats.org/officeDocument/2006/relationships" r:embed="R4549d003c2b844bf"/>
                     <a:stretch>
                       <a:fillRect/>
                     </a:stretch>
@@ -2252,7 +2252,7 @@
                     <pic:cNvPicPr/>
                   </pic:nvPicPr>
                   <pic:blipFill>
-                    <a:blip xmlns:r="http://schemas.openxmlformats.org/officeDocument/2006/relationships" r:embed="R46b38044e51f401e"/>
+                    <a:blip xmlns:r="http://schemas.openxmlformats.org/officeDocument/2006/relationships" r:embed="Rd3bd5965587c4060"/>
                     <a:stretch>
                       <a:fillRect/>
                     </a:stretch>
@@ -2303,7 +2303,7 @@
                     <pic:cNvPicPr/>
                   </pic:nvPicPr>
                   <pic:blipFill>
-                    <a:blip xmlns:r="http://schemas.openxmlformats.org/officeDocument/2006/relationships" r:embed="R4e1ca3bc7fbf4eab"/>
+                    <a:blip xmlns:r="http://schemas.openxmlformats.org/officeDocument/2006/relationships" r:embed="R87a5a9f4f1144ff5"/>
                     <a:stretch>
                       <a:fillRect/>
                     </a:stretch>
@@ -2354,7 +2354,7 @@
                     <pic:cNvPicPr/>
                   </pic:nvPicPr>
                   <pic:blipFill>
-                    <a:blip xmlns:r="http://schemas.openxmlformats.org/officeDocument/2006/relationships" r:embed="R44386a941d24496b"/>
+                    <a:blip xmlns:r="http://schemas.openxmlformats.org/officeDocument/2006/relationships" r:embed="Rb4a4c44775104400"/>
                     <a:stretch>
                       <a:fillRect/>
                     </a:stretch>
@@ -2430,7 +2430,7 @@
                     <pic:cNvPicPr/>
                   </pic:nvPicPr>
                   <pic:blipFill>
-                    <a:blip xmlns:r="http://schemas.openxmlformats.org/officeDocument/2006/relationships" r:embed="R69c34a86a91e4891"/>
+                    <a:blip xmlns:r="http://schemas.openxmlformats.org/officeDocument/2006/relationships" r:embed="R6fed90d9dc284360"/>
                     <a:stretch>
                       <a:fillRect/>
                     </a:stretch>
@@ -2481,7 +2481,7 @@
                     <pic:cNvPicPr/>
                   </pic:nvPicPr>
                   <pic:blipFill>
-                    <a:blip xmlns:r="http://schemas.openxmlformats.org/officeDocument/2006/relationships" r:embed="R46ace7b635b941a2"/>
+                    <a:blip xmlns:r="http://schemas.openxmlformats.org/officeDocument/2006/relationships" r:embed="Rdb7eb18077a245ff"/>
                     <a:stretch>
                       <a:fillRect/>
                     </a:stretch>
@@ -2532,7 +2532,7 @@
                     <pic:cNvPicPr/>
                   </pic:nvPicPr>
                   <pic:blipFill>
-                    <a:blip xmlns:r="http://schemas.openxmlformats.org/officeDocument/2006/relationships" r:embed="Re672627070064bf8"/>
+                    <a:blip xmlns:r="http://schemas.openxmlformats.org/officeDocument/2006/relationships" r:embed="Rce33941e7d6e4957"/>
                     <a:stretch>
                       <a:fillRect/>
                     </a:stretch>
@@ -2583,7 +2583,7 @@
                     <pic:cNvPicPr/>
                   </pic:nvPicPr>
                   <pic:blipFill>
-                    <a:blip xmlns:r="http://schemas.openxmlformats.org/officeDocument/2006/relationships" r:embed="R9a7928ac24474fd5"/>
+                    <a:blip xmlns:r="http://schemas.openxmlformats.org/officeDocument/2006/relationships" r:embed="Rcc5aed6009c441da"/>
                     <a:stretch>
                       <a:fillRect/>
                     </a:stretch>
@@ -2659,7 +2659,7 @@
                     <pic:cNvPicPr/>
                   </pic:nvPicPr>
                   <pic:blipFill>
-                    <a:blip xmlns:r="http://schemas.openxmlformats.org/officeDocument/2006/relationships" r:embed="R3d8d4957336a4bd7"/>
+                    <a:blip xmlns:r="http://schemas.openxmlformats.org/officeDocument/2006/relationships" r:embed="R71ebe488a3814095"/>
                     <a:stretch>
                       <a:fillRect/>
                     </a:stretch>
@@ -2710,7 +2710,7 @@
                     <pic:cNvPicPr/>
                   </pic:nvPicPr>
                   <pic:blipFill>
-                    <a:blip xmlns:r="http://schemas.openxmlformats.org/officeDocument/2006/relationships" r:embed="Re1f9465c5cd84b5c"/>
+                    <a:blip xmlns:r="http://schemas.openxmlformats.org/officeDocument/2006/relationships" r:embed="R8095644d2bf94ad9"/>
                     <a:stretch>
                       <a:fillRect/>
                     </a:stretch>
@@ -2761,7 +2761,7 @@
                     <pic:cNvPicPr/>
                   </pic:nvPicPr>
                   <pic:blipFill>
-                    <a:blip xmlns:r="http://schemas.openxmlformats.org/officeDocument/2006/relationships" r:embed="R9c3fbeacf5574798"/>
+                    <a:blip xmlns:r="http://schemas.openxmlformats.org/officeDocument/2006/relationships" r:embed="R0b165f1d6f534e75"/>
                     <a:stretch>
                       <a:fillRect/>
                     </a:stretch>
@@ -2812,7 +2812,7 @@
                     <pic:cNvPicPr/>
                   </pic:nvPicPr>
                   <pic:blipFill>
-                    <a:blip xmlns:r="http://schemas.openxmlformats.org/officeDocument/2006/relationships" r:embed="Re09ab8cdd4354874"/>
+                    <a:blip xmlns:r="http://schemas.openxmlformats.org/officeDocument/2006/relationships" r:embed="R95639d85f3ba446a"/>
                     <a:stretch>
                       <a:fillRect/>
                     </a:stretch>
@@ -2863,7 +2863,7 @@
                     <pic:cNvPicPr/>
                   </pic:nvPicPr>
                   <pic:blipFill>
-                    <a:blip xmlns:r="http://schemas.openxmlformats.org/officeDocument/2006/relationships" r:embed="R1cced470c5ba4bba"/>
+                    <a:blip xmlns:r="http://schemas.openxmlformats.org/officeDocument/2006/relationships" r:embed="R621a3427e7334e74"/>
                     <a:stretch>
                       <a:fillRect/>
                     </a:stretch>
@@ -2914,7 +2914,7 @@
                     <pic:cNvPicPr/>
                   </pic:nvPicPr>
                   <pic:blipFill>
-                    <a:blip xmlns:r="http://schemas.openxmlformats.org/officeDocument/2006/relationships" r:embed="Rd0901fa2b6794e54"/>
+                    <a:blip xmlns:r="http://schemas.openxmlformats.org/officeDocument/2006/relationships" r:embed="Rb066dcefed1849cb"/>
                     <a:stretch>
                       <a:fillRect/>
                     </a:stretch>
@@ -2965,7 +2965,7 @@
                     <pic:cNvPicPr/>
                   </pic:nvPicPr>
                   <pic:blipFill>
-                    <a:blip xmlns:r="http://schemas.openxmlformats.org/officeDocument/2006/relationships" r:embed="R914b101b0c004a2c"/>
+                    <a:blip xmlns:r="http://schemas.openxmlformats.org/officeDocument/2006/relationships" r:embed="R02257cd5430f42e0"/>
                     <a:stretch>
                       <a:fillRect/>
                     </a:stretch>
@@ -3016,7 +3016,7 @@
                     <pic:cNvPicPr/>
                   </pic:nvPicPr>
                   <pic:blipFill>
-                    <a:blip xmlns:r="http://schemas.openxmlformats.org/officeDocument/2006/relationships" r:embed="Rb6d1987989554e31"/>
+                    <a:blip xmlns:r="http://schemas.openxmlformats.org/officeDocument/2006/relationships" r:embed="R62c9f161cb414084"/>
                     <a:stretch>
                       <a:fillRect/>
                     </a:stretch>
@@ -3067,7 +3067,7 @@
                     <pic:cNvPicPr/>
                   </pic:nvPicPr>
                   <pic:blipFill>
-                    <a:blip xmlns:r="http://schemas.openxmlformats.org/officeDocument/2006/relationships" r:embed="R529839de47a1410c"/>
+                    <a:blip xmlns:r="http://schemas.openxmlformats.org/officeDocument/2006/relationships" r:embed="R571497d163884f8d"/>
                     <a:stretch>
                       <a:fillRect/>
                     </a:stretch>
@@ -3118,7 +3118,7 @@
                     <pic:cNvPicPr/>
                   </pic:nvPicPr>
                   <pic:blipFill>
-                    <a:blip xmlns:r="http://schemas.openxmlformats.org/officeDocument/2006/relationships" r:embed="R9b01e87eac954b37"/>
+                    <a:blip xmlns:r="http://schemas.openxmlformats.org/officeDocument/2006/relationships" r:embed="R0c6e59e0d3934d6e"/>
                     <a:stretch>
                       <a:fillRect/>
                     </a:stretch>
@@ -3169,7 +3169,7 @@
                     <pic:cNvPicPr/>
                   </pic:nvPicPr>
                   <pic:blipFill>
-                    <a:blip xmlns:r="http://schemas.openxmlformats.org/officeDocument/2006/relationships" r:embed="R23f87ca3ab1c40c6"/>
+                    <a:blip xmlns:r="http://schemas.openxmlformats.org/officeDocument/2006/relationships" r:embed="R7c436f8037c24053"/>
                     <a:stretch>
                       <a:fillRect/>
                     </a:stretch>
@@ -3220,7 +3220,7 @@
                     <pic:cNvPicPr/>
                   </pic:nvPicPr>
                   <pic:blipFill>
-                    <a:blip xmlns:r="http://schemas.openxmlformats.org/officeDocument/2006/relationships" r:embed="R34fa367680b94708"/>
+                    <a:blip xmlns:r="http://schemas.openxmlformats.org/officeDocument/2006/relationships" r:embed="Rf8d2f34d7897420f"/>
                     <a:stretch>
                       <a:fillRect/>
                     </a:stretch>
@@ -3271,7 +3271,7 @@
                     <pic:cNvPicPr/>
                   </pic:nvPicPr>
                   <pic:blipFill>
-                    <a:blip xmlns:r="http://schemas.openxmlformats.org/officeDocument/2006/relationships" r:embed="Re27cc44c851f447f"/>
+                    <a:blip xmlns:r="http://schemas.openxmlformats.org/officeDocument/2006/relationships" r:embed="R6ba70c36969d4411"/>
                     <a:stretch>
                       <a:fillRect/>
                     </a:stretch>
@@ -3322,7 +3322,7 @@
                     <pic:cNvPicPr/>
                   </pic:nvPicPr>
                   <pic:blipFill>
-                    <a:blip xmlns:r="http://schemas.openxmlformats.org/officeDocument/2006/relationships" r:embed="R2b250d7b46cc4f03"/>
+                    <a:blip xmlns:r="http://schemas.openxmlformats.org/officeDocument/2006/relationships" r:embed="Rbf80d48661744b5b"/>
                     <a:stretch>
                       <a:fillRect/>
                     </a:stretch>
@@ -3419,7 +3419,7 @@
                     <pic:cNvPicPr/>
                   </pic:nvPicPr>
                   <pic:blipFill>
-                    <a:blip xmlns:r="http://schemas.openxmlformats.org/officeDocument/2006/relationships" r:embed="Re5126533965c45c3"/>
+                    <a:blip xmlns:r="http://schemas.openxmlformats.org/officeDocument/2006/relationships" r:embed="Rb2b3100497744103"/>
                     <a:stretch>
                       <a:fillRect/>
                     </a:stretch>
@@ -3462,7 +3462,7 @@
                     <pic:cNvPicPr/>
                   </pic:nvPicPr>
                   <pic:blipFill>
-                    <a:blip xmlns:r="http://schemas.openxmlformats.org/officeDocument/2006/relationships" r:embed="R0e1c2916b1b247a1"/>
+                    <a:blip xmlns:r="http://schemas.openxmlformats.org/officeDocument/2006/relationships" r:embed="R3b9537c858654059"/>
                     <a:stretch>
                       <a:fillRect/>
                     </a:stretch>
@@ -3505,7 +3505,7 @@
                     <pic:cNvPicPr/>
                   </pic:nvPicPr>
                   <pic:blipFill>
-                    <a:blip xmlns:r="http://schemas.openxmlformats.org/officeDocument/2006/relationships" r:embed="Rd572140298434b71"/>
+                    <a:blip xmlns:r="http://schemas.openxmlformats.org/officeDocument/2006/relationships" r:embed="Rb55234d6d08e40e7"/>
                     <a:stretch>
                       <a:fillRect/>
                     </a:stretch>
@@ -3548,7 +3548,7 @@
                     <pic:cNvPicPr/>
                   </pic:nvPicPr>
                   <pic:blipFill>
-                    <a:blip xmlns:r="http://schemas.openxmlformats.org/officeDocument/2006/relationships" r:embed="R1fc4e1661a7b49fe"/>
+                    <a:blip xmlns:r="http://schemas.openxmlformats.org/officeDocument/2006/relationships" r:embed="R19c95952093b482b"/>
                     <a:stretch>
                       <a:fillRect/>
                     </a:stretch>
@@ -3933,7 +3933,7 @@
                     <pic:cNvPicPr/>
                   </pic:nvPicPr>
                   <pic:blipFill>
-                    <a:blip xmlns:r="http://schemas.openxmlformats.org/officeDocument/2006/relationships" r:embed="R92abc26dd20b4935"/>
+                    <a:blip xmlns:r="http://schemas.openxmlformats.org/officeDocument/2006/relationships" r:embed="R13a27c6608f643cd"/>
                     <a:stretch>
                       <a:fillRect/>
                     </a:stretch>
@@ -4125,7 +4125,7 @@
                     <pic:cNvPicPr/>
                   </pic:nvPicPr>
                   <pic:blipFill>
-                    <a:blip xmlns:r="http://schemas.openxmlformats.org/officeDocument/2006/relationships" r:embed="Rac967497de67445f"/>
+                    <a:blip xmlns:r="http://schemas.openxmlformats.org/officeDocument/2006/relationships" r:embed="Rb53f69dfc9414880"/>
                     <a:stretch>
                       <a:fillRect/>
                     </a:stretch>
@@ -4176,7 +4176,7 @@
                     <pic:cNvPicPr/>
                   </pic:nvPicPr>
                   <pic:blipFill>
-                    <a:blip xmlns:r="http://schemas.openxmlformats.org/officeDocument/2006/relationships" r:embed="Rf9aee280cfe24f78"/>
+                    <a:blip xmlns:r="http://schemas.openxmlformats.org/officeDocument/2006/relationships" r:embed="R56fb3e50f1524d07"/>
                     <a:stretch>
                       <a:fillRect/>
                     </a:stretch>
@@ -4227,7 +4227,7 @@
                     <pic:cNvPicPr/>
                   </pic:nvPicPr>
                   <pic:blipFill>
-                    <a:blip xmlns:r="http://schemas.openxmlformats.org/officeDocument/2006/relationships" r:embed="Rac4b847d21cf447d"/>
+                    <a:blip xmlns:r="http://schemas.openxmlformats.org/officeDocument/2006/relationships" r:embed="R77496fb897214b92"/>
                     <a:stretch>
                       <a:fillRect/>
                     </a:stretch>
@@ -4278,7 +4278,7 @@
                     <pic:cNvPicPr/>
                   </pic:nvPicPr>
                   <pic:blipFill>
-                    <a:blip xmlns:r="http://schemas.openxmlformats.org/officeDocument/2006/relationships" r:embed="R622024959d374769"/>
+                    <a:blip xmlns:r="http://schemas.openxmlformats.org/officeDocument/2006/relationships" r:embed="R3c39e3bcaaaf401d"/>
                     <a:stretch>
                       <a:fillRect/>
                     </a:stretch>
@@ -4657,7 +4657,7 @@
                     <pic:cNvPicPr/>
                   </pic:nvPicPr>
                   <pic:blipFill>
-                    <a:blip xmlns:r="http://schemas.openxmlformats.org/officeDocument/2006/relationships" r:embed="R1ec2f9795fed49eb"/>
+                    <a:blip xmlns:r="http://schemas.openxmlformats.org/officeDocument/2006/relationships" r:embed="R7d28c75039e54de2"/>
                     <a:stretch>
                       <a:fillRect/>
                     </a:stretch>
@@ -5338,7 +5338,7 @@
             <w:r>
               <w:t xml:space="preserve">Cell with </w:t>
             </w:r>
-            <w:hyperlink xmlns:r="http://schemas.openxmlformats.org/officeDocument/2006/relationships" w:history="true" r:id="R5049055079e14834">
+            <w:hyperlink xmlns:r="http://schemas.openxmlformats.org/officeDocument/2006/relationships" w:history="true" r:id="R72b988e8d8a74ea8">
               <w:r>
                 <w:rPr>
                   <w:rStyle w:val="Hyperlink"/>
@@ -5624,7 +5624,7 @@
                           <pic:cNvPicPr/>
                         </pic:nvPicPr>
                         <pic:blipFill>
-                          <a:blip xmlns:r="http://schemas.openxmlformats.org/officeDocument/2006/relationships" r:embed="R8847cc5176f84590"/>
+                          <a:blip xmlns:r="http://schemas.openxmlformats.org/officeDocument/2006/relationships" r:embed="R0d89cff8942c46f1"/>
                           <a:stretch>
                             <a:fillRect/>
                           </a:stretch>
@@ -5724,7 +5724,7 @@
                     <pic:cNvPicPr/>
                   </pic:nvPicPr>
                   <pic:blipFill>
-                    <a:blip xmlns:r="http://schemas.openxmlformats.org/officeDocument/2006/relationships" r:embed="R4468501e5bd44e40"/>
+                    <a:blip xmlns:r="http://schemas.openxmlformats.org/officeDocument/2006/relationships" r:embed="R012dfe6522024a47"/>
                     <a:stretch>
                       <a:fillRect/>
                     </a:stretch>
@@ -5774,7 +5774,7 @@
                     <pic:cNvPicPr/>
                   </pic:nvPicPr>
                   <pic:blipFill>
-                    <a:blip xmlns:r="http://schemas.openxmlformats.org/officeDocument/2006/relationships" r:embed="R51d1da1413f44538"/>
+                    <a:blip xmlns:r="http://schemas.openxmlformats.org/officeDocument/2006/relationships" r:embed="R300c8870104d4d85"/>
                     <a:stretch>
                       <a:fillRect/>
                     </a:stretch>
@@ -5824,7 +5824,7 @@
                     <pic:cNvPicPr/>
                   </pic:nvPicPr>
                   <pic:blipFill>
-                    <a:blip xmlns:r="http://schemas.openxmlformats.org/officeDocument/2006/relationships" r:embed="R7a104fb7cd9b422b"/>
+                    <a:blip xmlns:r="http://schemas.openxmlformats.org/officeDocument/2006/relationships" r:embed="R4132523d7d104658"/>
                     <a:stretch>
                       <a:fillRect/>
                     </a:stretch>

</xml_diff>

<commit_message>
fix(er): apply anchor allocation on dummy-split edges
When Dagre splits ER edges via dummy nodes, allocate anchors using the original (real) endpoints and apply them to the segment edges adjacent to real nodes (so two-parent LINE_ITEM cases use T1/T4 as intended).

Made-with: Cursor
</commit_message>
<xml_diff>
--- a/test.docx
+++ b/test.docx
@@ -236,7 +236,7 @@
       <w:r>
         <w:t xml:space="preserve">, and </w:t>
       </w:r>
-      <w:hyperlink xmlns:r="http://schemas.openxmlformats.org/officeDocument/2006/relationships" w:history="true" r:id="R5a96e50339e94a86">
+      <w:hyperlink xmlns:r="http://schemas.openxmlformats.org/officeDocument/2006/relationships" w:history="true" r:id="Rb0e2b0efdcbf4a7e">
         <w:r>
           <w:rPr>
             <w:rStyle w:val="Hyperlink"/>
@@ -475,7 +475,7 @@
       <w:r>
         <w:t xml:space="preserve">Direct link: </w:t>
       </w:r>
-      <w:hyperlink xmlns:r="http://schemas.openxmlformats.org/officeDocument/2006/relationships" w:history="true" r:id="R9caf75878b854db9">
+      <w:hyperlink xmlns:r="http://schemas.openxmlformats.org/officeDocument/2006/relationships" w:history="true" r:id="Redff8aff2c2b445a">
         <w:r>
           <w:rPr>
             <w:rStyle w:val="Hyperlink"/>
@@ -496,7 +496,7 @@
       <w:r>
         <w:t xml:space="preserve">Direct link with title: </w:t>
       </w:r>
-      <w:hyperlink xmlns:r="http://schemas.openxmlformats.org/officeDocument/2006/relationships" w:history="true" r:id="R5b08051790604bc9">
+      <w:hyperlink xmlns:r="http://schemas.openxmlformats.org/officeDocument/2006/relationships" w:history="true" r:id="R00331f9908c547e6">
         <w:r>
           <w:rPr>
             <w:rStyle w:val="Hyperlink"/>
@@ -517,7 +517,7 @@
       <w:r>
         <w:t xml:space="preserve">Reference-style link: </w:t>
       </w:r>
-      <w:hyperlink xmlns:r="http://schemas.openxmlformats.org/officeDocument/2006/relationships" w:history="true" r:id="R515acdcdd96c4f44">
+      <w:hyperlink xmlns:r="http://schemas.openxmlformats.org/officeDocument/2006/relationships" w:history="true" r:id="Rbe22aaeb468a4062">
         <w:r>
           <w:rPr>
             <w:rStyle w:val="Hyperlink"/>
@@ -538,7 +538,7 @@
       <w:r>
         <w:t xml:space="preserve">Collapsed reference link: </w:t>
       </w:r>
-      <w:hyperlink xmlns:r="http://schemas.openxmlformats.org/officeDocument/2006/relationships" w:history="true" r:id="R76afe53baf794cab">
+      <w:hyperlink xmlns:r="http://schemas.openxmlformats.org/officeDocument/2006/relationships" w:history="true" r:id="Rd472715fafd24497">
         <w:r>
           <w:rPr>
             <w:rStyle w:val="Hyperlink"/>
@@ -559,7 +559,7 @@
       <w:r>
         <w:t xml:space="preserve">Repeated reference link: </w:t>
       </w:r>
-      <w:hyperlink xmlns:r="http://schemas.openxmlformats.org/officeDocument/2006/relationships" w:history="true" r:id="R7217649868074f26">
+      <w:hyperlink xmlns:r="http://schemas.openxmlformats.org/officeDocument/2006/relationships" w:history="true" r:id="Rae234027f64c406f">
         <w:r>
           <w:rPr>
             <w:rStyle w:val="Hyperlink"/>
@@ -580,7 +580,7 @@
       <w:r>
         <w:t xml:space="preserve">Autolink URL: </w:t>
       </w:r>
-      <w:hyperlink xmlns:r="http://schemas.openxmlformats.org/officeDocument/2006/relationships" w:history="true" r:id="R4f9fbc8cc0634cb8">
+      <w:hyperlink xmlns:r="http://schemas.openxmlformats.org/officeDocument/2006/relationships" w:history="true" r:id="R6ea6e524a0bc452f">
         <w:r>
           <w:rPr>
             <w:rStyle w:val="Hyperlink"/>
@@ -601,7 +601,7 @@
       <w:r>
         <w:t xml:space="preserve">Autolink email: </w:t>
       </w:r>
-      <w:hyperlink xmlns:r="http://schemas.openxmlformats.org/officeDocument/2006/relationships" w:history="true" r:id="Rc9468dd7c99443d6">
+      <w:hyperlink xmlns:r="http://schemas.openxmlformats.org/officeDocument/2006/relationships" w:history="true" r:id="R903d0ccf8bf44c69">
         <w:r>
           <w:rPr>
             <w:rStyle w:val="Hyperlink"/>
@@ -700,7 +700,7 @@
       <w:r>
         <w:t xml:space="preserve">, and </w:t>
       </w:r>
-      <w:hyperlink xmlns:r="http://schemas.openxmlformats.org/officeDocument/2006/relationships" w:history="true" r:id="R77e057e57dd14de6">
+      <w:hyperlink xmlns:r="http://schemas.openxmlformats.org/officeDocument/2006/relationships" w:history="true" r:id="R5b814dc41d614178">
         <w:r>
           <w:rPr>
             <w:rStyle w:val="Hyperlink"/>
@@ -1093,7 +1093,7 @@
       <w:r>
         <w:t xml:space="preserve">Continuation paragraph with </w:t>
       </w:r>
-      <w:hyperlink xmlns:r="http://schemas.openxmlformats.org/officeDocument/2006/relationships" w:history="true" r:id="R4a92a11e7704443c">
+      <w:hyperlink xmlns:r="http://schemas.openxmlformats.org/officeDocument/2006/relationships" w:history="true" r:id="Ra7dc68546d834dae">
         <w:r>
           <w:rPr>
             <w:rStyle w:val="Hyperlink"/>
@@ -1591,7 +1591,7 @@
       <w:r>
         <w:t xml:space="preserve">, and </w:t>
       </w:r>
-      <w:hyperlink xmlns:r="http://schemas.openxmlformats.org/officeDocument/2006/relationships" w:history="true" r:id="R13fa930ce8274335">
+      <w:hyperlink xmlns:r="http://schemas.openxmlformats.org/officeDocument/2006/relationships" w:history="true" r:id="Ra2814127a8754593">
         <w:r>
           <w:rPr>
             <w:rStyle w:val="Hyperlink"/>
@@ -1979,7 +1979,7 @@
                     <pic:cNvPicPr/>
                   </pic:nvPicPr>
                   <pic:blipFill>
-                    <a:blip xmlns:r="http://schemas.openxmlformats.org/officeDocument/2006/relationships" r:embed="R8795826071634e37"/>
+                    <a:blip xmlns:r="http://schemas.openxmlformats.org/officeDocument/2006/relationships" r:embed="R7433ebf431df49ab"/>
                     <a:stretch>
                       <a:fillRect/>
                     </a:stretch>
@@ -2039,7 +2039,7 @@
                     <pic:cNvPicPr/>
                   </pic:nvPicPr>
                   <pic:blipFill>
-                    <a:blip xmlns:r="http://schemas.openxmlformats.org/officeDocument/2006/relationships" r:embed="Raf05cfe8309a4bd3"/>
+                    <a:blip xmlns:r="http://schemas.openxmlformats.org/officeDocument/2006/relationships" r:embed="Raa3cf63f15ba405c"/>
                     <a:stretch>
                       <a:fillRect/>
                     </a:stretch>
@@ -2099,7 +2099,7 @@
                     <pic:cNvPicPr/>
                   </pic:nvPicPr>
                   <pic:blipFill>
-                    <a:blip xmlns:r="http://schemas.openxmlformats.org/officeDocument/2006/relationships" r:embed="Re3001d88cb2942d3"/>
+                    <a:blip xmlns:r="http://schemas.openxmlformats.org/officeDocument/2006/relationships" r:embed="R1a7f03cdc538464b"/>
                     <a:stretch>
                       <a:fillRect/>
                     </a:stretch>
@@ -2150,7 +2150,7 @@
                     <pic:cNvPicPr/>
                   </pic:nvPicPr>
                   <pic:blipFill>
-                    <a:blip xmlns:r="http://schemas.openxmlformats.org/officeDocument/2006/relationships" r:embed="R00b025a861414279"/>
+                    <a:blip xmlns:r="http://schemas.openxmlformats.org/officeDocument/2006/relationships" r:embed="Rcf2284d50e9c49b4"/>
                     <a:stretch>
                       <a:fillRect/>
                     </a:stretch>
@@ -2201,7 +2201,7 @@
                     <pic:cNvPicPr/>
                   </pic:nvPicPr>
                   <pic:blipFill>
-                    <a:blip xmlns:r="http://schemas.openxmlformats.org/officeDocument/2006/relationships" r:embed="R4549d003c2b844bf"/>
+                    <a:blip xmlns:r="http://schemas.openxmlformats.org/officeDocument/2006/relationships" r:embed="R6207cbbf81754976"/>
                     <a:stretch>
                       <a:fillRect/>
                     </a:stretch>
@@ -2252,7 +2252,7 @@
                     <pic:cNvPicPr/>
                   </pic:nvPicPr>
                   <pic:blipFill>
-                    <a:blip xmlns:r="http://schemas.openxmlformats.org/officeDocument/2006/relationships" r:embed="Rd3bd5965587c4060"/>
+                    <a:blip xmlns:r="http://schemas.openxmlformats.org/officeDocument/2006/relationships" r:embed="R2079e879a24f41ad"/>
                     <a:stretch>
                       <a:fillRect/>
                     </a:stretch>
@@ -2303,7 +2303,7 @@
                     <pic:cNvPicPr/>
                   </pic:nvPicPr>
                   <pic:blipFill>
-                    <a:blip xmlns:r="http://schemas.openxmlformats.org/officeDocument/2006/relationships" r:embed="R87a5a9f4f1144ff5"/>
+                    <a:blip xmlns:r="http://schemas.openxmlformats.org/officeDocument/2006/relationships" r:embed="R61116f5c86ea48ee"/>
                     <a:stretch>
                       <a:fillRect/>
                     </a:stretch>
@@ -2354,7 +2354,7 @@
                     <pic:cNvPicPr/>
                   </pic:nvPicPr>
                   <pic:blipFill>
-                    <a:blip xmlns:r="http://schemas.openxmlformats.org/officeDocument/2006/relationships" r:embed="Rb4a4c44775104400"/>
+                    <a:blip xmlns:r="http://schemas.openxmlformats.org/officeDocument/2006/relationships" r:embed="R6313508f957845b1"/>
                     <a:stretch>
                       <a:fillRect/>
                     </a:stretch>
@@ -2430,7 +2430,7 @@
                     <pic:cNvPicPr/>
                   </pic:nvPicPr>
                   <pic:blipFill>
-                    <a:blip xmlns:r="http://schemas.openxmlformats.org/officeDocument/2006/relationships" r:embed="R6fed90d9dc284360"/>
+                    <a:blip xmlns:r="http://schemas.openxmlformats.org/officeDocument/2006/relationships" r:embed="Rf2f22161d9444f31"/>
                     <a:stretch>
                       <a:fillRect/>
                     </a:stretch>
@@ -2481,7 +2481,7 @@
                     <pic:cNvPicPr/>
                   </pic:nvPicPr>
                   <pic:blipFill>
-                    <a:blip xmlns:r="http://schemas.openxmlformats.org/officeDocument/2006/relationships" r:embed="Rdb7eb18077a245ff"/>
+                    <a:blip xmlns:r="http://schemas.openxmlformats.org/officeDocument/2006/relationships" r:embed="Rf63af3e3d4e241f8"/>
                     <a:stretch>
                       <a:fillRect/>
                     </a:stretch>
@@ -2532,7 +2532,7 @@
                     <pic:cNvPicPr/>
                   </pic:nvPicPr>
                   <pic:blipFill>
-                    <a:blip xmlns:r="http://schemas.openxmlformats.org/officeDocument/2006/relationships" r:embed="Rce33941e7d6e4957"/>
+                    <a:blip xmlns:r="http://schemas.openxmlformats.org/officeDocument/2006/relationships" r:embed="Re304244c1a5a44fb"/>
                     <a:stretch>
                       <a:fillRect/>
                     </a:stretch>
@@ -2583,7 +2583,7 @@
                     <pic:cNvPicPr/>
                   </pic:nvPicPr>
                   <pic:blipFill>
-                    <a:blip xmlns:r="http://schemas.openxmlformats.org/officeDocument/2006/relationships" r:embed="Rcc5aed6009c441da"/>
+                    <a:blip xmlns:r="http://schemas.openxmlformats.org/officeDocument/2006/relationships" r:embed="Rf77bde7727d848df"/>
                     <a:stretch>
                       <a:fillRect/>
                     </a:stretch>
@@ -2659,7 +2659,7 @@
                     <pic:cNvPicPr/>
                   </pic:nvPicPr>
                   <pic:blipFill>
-                    <a:blip xmlns:r="http://schemas.openxmlformats.org/officeDocument/2006/relationships" r:embed="R71ebe488a3814095"/>
+                    <a:blip xmlns:r="http://schemas.openxmlformats.org/officeDocument/2006/relationships" r:embed="R78adcceabab24a66"/>
                     <a:stretch>
                       <a:fillRect/>
                     </a:stretch>
@@ -2710,7 +2710,7 @@
                     <pic:cNvPicPr/>
                   </pic:nvPicPr>
                   <pic:blipFill>
-                    <a:blip xmlns:r="http://schemas.openxmlformats.org/officeDocument/2006/relationships" r:embed="R8095644d2bf94ad9"/>
+                    <a:blip xmlns:r="http://schemas.openxmlformats.org/officeDocument/2006/relationships" r:embed="Rccba018fbae34a76"/>
                     <a:stretch>
                       <a:fillRect/>
                     </a:stretch>
@@ -2761,7 +2761,7 @@
                     <pic:cNvPicPr/>
                   </pic:nvPicPr>
                   <pic:blipFill>
-                    <a:blip xmlns:r="http://schemas.openxmlformats.org/officeDocument/2006/relationships" r:embed="R0b165f1d6f534e75"/>
+                    <a:blip xmlns:r="http://schemas.openxmlformats.org/officeDocument/2006/relationships" r:embed="R5437fc466e744ae7"/>
                     <a:stretch>
                       <a:fillRect/>
                     </a:stretch>
@@ -2812,7 +2812,7 @@
                     <pic:cNvPicPr/>
                   </pic:nvPicPr>
                   <pic:blipFill>
-                    <a:blip xmlns:r="http://schemas.openxmlformats.org/officeDocument/2006/relationships" r:embed="R95639d85f3ba446a"/>
+                    <a:blip xmlns:r="http://schemas.openxmlformats.org/officeDocument/2006/relationships" r:embed="R0a22812974764cb6"/>
                     <a:stretch>
                       <a:fillRect/>
                     </a:stretch>
@@ -2863,7 +2863,7 @@
                     <pic:cNvPicPr/>
                   </pic:nvPicPr>
                   <pic:blipFill>
-                    <a:blip xmlns:r="http://schemas.openxmlformats.org/officeDocument/2006/relationships" r:embed="R621a3427e7334e74"/>
+                    <a:blip xmlns:r="http://schemas.openxmlformats.org/officeDocument/2006/relationships" r:embed="R5237b122bb844715"/>
                     <a:stretch>
                       <a:fillRect/>
                     </a:stretch>
@@ -2914,7 +2914,7 @@
                     <pic:cNvPicPr/>
                   </pic:nvPicPr>
                   <pic:blipFill>
-                    <a:blip xmlns:r="http://schemas.openxmlformats.org/officeDocument/2006/relationships" r:embed="Rb066dcefed1849cb"/>
+                    <a:blip xmlns:r="http://schemas.openxmlformats.org/officeDocument/2006/relationships" r:embed="R01b23979612246c2"/>
                     <a:stretch>
                       <a:fillRect/>
                     </a:stretch>
@@ -2965,7 +2965,7 @@
                     <pic:cNvPicPr/>
                   </pic:nvPicPr>
                   <pic:blipFill>
-                    <a:blip xmlns:r="http://schemas.openxmlformats.org/officeDocument/2006/relationships" r:embed="R02257cd5430f42e0"/>
+                    <a:blip xmlns:r="http://schemas.openxmlformats.org/officeDocument/2006/relationships" r:embed="R368658a645e34948"/>
                     <a:stretch>
                       <a:fillRect/>
                     </a:stretch>
@@ -3016,7 +3016,7 @@
                     <pic:cNvPicPr/>
                   </pic:nvPicPr>
                   <pic:blipFill>
-                    <a:blip xmlns:r="http://schemas.openxmlformats.org/officeDocument/2006/relationships" r:embed="R62c9f161cb414084"/>
+                    <a:blip xmlns:r="http://schemas.openxmlformats.org/officeDocument/2006/relationships" r:embed="R4fea88e7561e4e0a"/>
                     <a:stretch>
                       <a:fillRect/>
                     </a:stretch>
@@ -3067,7 +3067,7 @@
                     <pic:cNvPicPr/>
                   </pic:nvPicPr>
                   <pic:blipFill>
-                    <a:blip xmlns:r="http://schemas.openxmlformats.org/officeDocument/2006/relationships" r:embed="R571497d163884f8d"/>
+                    <a:blip xmlns:r="http://schemas.openxmlformats.org/officeDocument/2006/relationships" r:embed="R5436e554f92443be"/>
                     <a:stretch>
                       <a:fillRect/>
                     </a:stretch>
@@ -3118,7 +3118,7 @@
                     <pic:cNvPicPr/>
                   </pic:nvPicPr>
                   <pic:blipFill>
-                    <a:blip xmlns:r="http://schemas.openxmlformats.org/officeDocument/2006/relationships" r:embed="R0c6e59e0d3934d6e"/>
+                    <a:blip xmlns:r="http://schemas.openxmlformats.org/officeDocument/2006/relationships" r:embed="R640ea7dde2164cd6"/>
                     <a:stretch>
                       <a:fillRect/>
                     </a:stretch>
@@ -3169,7 +3169,7 @@
                     <pic:cNvPicPr/>
                   </pic:nvPicPr>
                   <pic:blipFill>
-                    <a:blip xmlns:r="http://schemas.openxmlformats.org/officeDocument/2006/relationships" r:embed="R7c436f8037c24053"/>
+                    <a:blip xmlns:r="http://schemas.openxmlformats.org/officeDocument/2006/relationships" r:embed="R170769eb0fb44e40"/>
                     <a:stretch>
                       <a:fillRect/>
                     </a:stretch>
@@ -3220,7 +3220,7 @@
                     <pic:cNvPicPr/>
                   </pic:nvPicPr>
                   <pic:blipFill>
-                    <a:blip xmlns:r="http://schemas.openxmlformats.org/officeDocument/2006/relationships" r:embed="Rf8d2f34d7897420f"/>
+                    <a:blip xmlns:r="http://schemas.openxmlformats.org/officeDocument/2006/relationships" r:embed="Rc7b85d8163ed4fdb"/>
                     <a:stretch>
                       <a:fillRect/>
                     </a:stretch>
@@ -3271,7 +3271,7 @@
                     <pic:cNvPicPr/>
                   </pic:nvPicPr>
                   <pic:blipFill>
-                    <a:blip xmlns:r="http://schemas.openxmlformats.org/officeDocument/2006/relationships" r:embed="R6ba70c36969d4411"/>
+                    <a:blip xmlns:r="http://schemas.openxmlformats.org/officeDocument/2006/relationships" r:embed="Rec3544792479493d"/>
                     <a:stretch>
                       <a:fillRect/>
                     </a:stretch>
@@ -3322,7 +3322,7 @@
                     <pic:cNvPicPr/>
                   </pic:nvPicPr>
                   <pic:blipFill>
-                    <a:blip xmlns:r="http://schemas.openxmlformats.org/officeDocument/2006/relationships" r:embed="Rbf80d48661744b5b"/>
+                    <a:blip xmlns:r="http://schemas.openxmlformats.org/officeDocument/2006/relationships" r:embed="R40ed0681da1f4502"/>
                     <a:stretch>
                       <a:fillRect/>
                     </a:stretch>
@@ -3419,7 +3419,7 @@
                     <pic:cNvPicPr/>
                   </pic:nvPicPr>
                   <pic:blipFill>
-                    <a:blip xmlns:r="http://schemas.openxmlformats.org/officeDocument/2006/relationships" r:embed="Rb2b3100497744103"/>
+                    <a:blip xmlns:r="http://schemas.openxmlformats.org/officeDocument/2006/relationships" r:embed="R7141849f14cf4686"/>
                     <a:stretch>
                       <a:fillRect/>
                     </a:stretch>
@@ -3462,7 +3462,7 @@
                     <pic:cNvPicPr/>
                   </pic:nvPicPr>
                   <pic:blipFill>
-                    <a:blip xmlns:r="http://schemas.openxmlformats.org/officeDocument/2006/relationships" r:embed="R3b9537c858654059"/>
+                    <a:blip xmlns:r="http://schemas.openxmlformats.org/officeDocument/2006/relationships" r:embed="R1929d839e0b642d4"/>
                     <a:stretch>
                       <a:fillRect/>
                     </a:stretch>
@@ -3505,7 +3505,7 @@
                     <pic:cNvPicPr/>
                   </pic:nvPicPr>
                   <pic:blipFill>
-                    <a:blip xmlns:r="http://schemas.openxmlformats.org/officeDocument/2006/relationships" r:embed="Rb55234d6d08e40e7"/>
+                    <a:blip xmlns:r="http://schemas.openxmlformats.org/officeDocument/2006/relationships" r:embed="Rb022e37a7dfd4196"/>
                     <a:stretch>
                       <a:fillRect/>
                     </a:stretch>
@@ -3548,7 +3548,7 @@
                     <pic:cNvPicPr/>
                   </pic:nvPicPr>
                   <pic:blipFill>
-                    <a:blip xmlns:r="http://schemas.openxmlformats.org/officeDocument/2006/relationships" r:embed="R19c95952093b482b"/>
+                    <a:blip xmlns:r="http://schemas.openxmlformats.org/officeDocument/2006/relationships" r:embed="Rf3262fbff1e4410d"/>
                     <a:stretch>
                       <a:fillRect/>
                     </a:stretch>
@@ -3933,7 +3933,7 @@
                     <pic:cNvPicPr/>
                   </pic:nvPicPr>
                   <pic:blipFill>
-                    <a:blip xmlns:r="http://schemas.openxmlformats.org/officeDocument/2006/relationships" r:embed="R13a27c6608f643cd"/>
+                    <a:blip xmlns:r="http://schemas.openxmlformats.org/officeDocument/2006/relationships" r:embed="R693968c2b9044d93"/>
                     <a:stretch>
                       <a:fillRect/>
                     </a:stretch>
@@ -4125,7 +4125,7 @@
                     <pic:cNvPicPr/>
                   </pic:nvPicPr>
                   <pic:blipFill>
-                    <a:blip xmlns:r="http://schemas.openxmlformats.org/officeDocument/2006/relationships" r:embed="Rb53f69dfc9414880"/>
+                    <a:blip xmlns:r="http://schemas.openxmlformats.org/officeDocument/2006/relationships" r:embed="R2f16f2fbed2c4d69"/>
                     <a:stretch>
                       <a:fillRect/>
                     </a:stretch>
@@ -4176,7 +4176,7 @@
                     <pic:cNvPicPr/>
                   </pic:nvPicPr>
                   <pic:blipFill>
-                    <a:blip xmlns:r="http://schemas.openxmlformats.org/officeDocument/2006/relationships" r:embed="R56fb3e50f1524d07"/>
+                    <a:blip xmlns:r="http://schemas.openxmlformats.org/officeDocument/2006/relationships" r:embed="R14740a2e010d4670"/>
                     <a:stretch>
                       <a:fillRect/>
                     </a:stretch>
@@ -4227,7 +4227,7 @@
                     <pic:cNvPicPr/>
                   </pic:nvPicPr>
                   <pic:blipFill>
-                    <a:blip xmlns:r="http://schemas.openxmlformats.org/officeDocument/2006/relationships" r:embed="R77496fb897214b92"/>
+                    <a:blip xmlns:r="http://schemas.openxmlformats.org/officeDocument/2006/relationships" r:embed="Rcd290bafa3fd4b2a"/>
                     <a:stretch>
                       <a:fillRect/>
                     </a:stretch>
@@ -4278,7 +4278,7 @@
                     <pic:cNvPicPr/>
                   </pic:nvPicPr>
                   <pic:blipFill>
-                    <a:blip xmlns:r="http://schemas.openxmlformats.org/officeDocument/2006/relationships" r:embed="R3c39e3bcaaaf401d"/>
+                    <a:blip xmlns:r="http://schemas.openxmlformats.org/officeDocument/2006/relationships" r:embed="R63d6a8d2992f4487"/>
                     <a:stretch>
                       <a:fillRect/>
                     </a:stretch>
@@ -4657,7 +4657,7 @@
                     <pic:cNvPicPr/>
                   </pic:nvPicPr>
                   <pic:blipFill>
-                    <a:blip xmlns:r="http://schemas.openxmlformats.org/officeDocument/2006/relationships" r:embed="R7d28c75039e54de2"/>
+                    <a:blip xmlns:r="http://schemas.openxmlformats.org/officeDocument/2006/relationships" r:embed="R2e965e4f51854486"/>
                     <a:stretch>
                       <a:fillRect/>
                     </a:stretch>
@@ -5338,7 +5338,7 @@
             <w:r>
               <w:t xml:space="preserve">Cell with </w:t>
             </w:r>
-            <w:hyperlink xmlns:r="http://schemas.openxmlformats.org/officeDocument/2006/relationships" w:history="true" r:id="R72b988e8d8a74ea8">
+            <w:hyperlink xmlns:r="http://schemas.openxmlformats.org/officeDocument/2006/relationships" w:history="true" r:id="R43514b2484554c96">
               <w:r>
                 <w:rPr>
                   <w:rStyle w:val="Hyperlink"/>
@@ -5624,7 +5624,7 @@
                           <pic:cNvPicPr/>
                         </pic:nvPicPr>
                         <pic:blipFill>
-                          <a:blip xmlns:r="http://schemas.openxmlformats.org/officeDocument/2006/relationships" r:embed="R0d89cff8942c46f1"/>
+                          <a:blip xmlns:r="http://schemas.openxmlformats.org/officeDocument/2006/relationships" r:embed="Rf86370bb60ae4d6d"/>
                           <a:stretch>
                             <a:fillRect/>
                           </a:stretch>
@@ -5724,7 +5724,7 @@
                     <pic:cNvPicPr/>
                   </pic:nvPicPr>
                   <pic:blipFill>
-                    <a:blip xmlns:r="http://schemas.openxmlformats.org/officeDocument/2006/relationships" r:embed="R012dfe6522024a47"/>
+                    <a:blip xmlns:r="http://schemas.openxmlformats.org/officeDocument/2006/relationships" r:embed="R48249791a2f1487d"/>
                     <a:stretch>
                       <a:fillRect/>
                     </a:stretch>
@@ -5774,7 +5774,7 @@
                     <pic:cNvPicPr/>
                   </pic:nvPicPr>
                   <pic:blipFill>
-                    <a:blip xmlns:r="http://schemas.openxmlformats.org/officeDocument/2006/relationships" r:embed="R300c8870104d4d85"/>
+                    <a:blip xmlns:r="http://schemas.openxmlformats.org/officeDocument/2006/relationships" r:embed="R013809281def47b8"/>
                     <a:stretch>
                       <a:fillRect/>
                     </a:stretch>
@@ -5824,7 +5824,7 @@
                     <pic:cNvPicPr/>
                   </pic:nvPicPr>
                   <pic:blipFill>
-                    <a:blip xmlns:r="http://schemas.openxmlformats.org/officeDocument/2006/relationships" r:embed="R4132523d7d104658"/>
+                    <a:blip xmlns:r="http://schemas.openxmlformats.org/officeDocument/2006/relationships" r:embed="Rc96862a44d604e78"/>
                     <a:stretch>
                       <a:fillRect/>
                     </a:stretch>

</xml_diff>

<commit_message>
fix(er): honour anchors on dummy-split segments
Route ER vertical edges through dummy-node segments using the allocated attach point on the real-node side (instead of centre-to-centre dummy shortcuts), so two-parent LINE_ITEM endpoints can land on T1/T4.

Made-with: Cursor
</commit_message>
<xml_diff>
--- a/test.docx
+++ b/test.docx
@@ -236,7 +236,7 @@
       <w:r>
         <w:t xml:space="preserve">, and </w:t>
       </w:r>
-      <w:hyperlink xmlns:r="http://schemas.openxmlformats.org/officeDocument/2006/relationships" w:history="true" r:id="Rb0e2b0efdcbf4a7e">
+      <w:hyperlink xmlns:r="http://schemas.openxmlformats.org/officeDocument/2006/relationships" w:history="true" r:id="R420ddb051ac64696">
         <w:r>
           <w:rPr>
             <w:rStyle w:val="Hyperlink"/>
@@ -475,7 +475,7 @@
       <w:r>
         <w:t xml:space="preserve">Direct link: </w:t>
       </w:r>
-      <w:hyperlink xmlns:r="http://schemas.openxmlformats.org/officeDocument/2006/relationships" w:history="true" r:id="Redff8aff2c2b445a">
+      <w:hyperlink xmlns:r="http://schemas.openxmlformats.org/officeDocument/2006/relationships" w:history="true" r:id="R70989b136a344955">
         <w:r>
           <w:rPr>
             <w:rStyle w:val="Hyperlink"/>
@@ -496,7 +496,7 @@
       <w:r>
         <w:t xml:space="preserve">Direct link with title: </w:t>
       </w:r>
-      <w:hyperlink xmlns:r="http://schemas.openxmlformats.org/officeDocument/2006/relationships" w:history="true" r:id="R00331f9908c547e6">
+      <w:hyperlink xmlns:r="http://schemas.openxmlformats.org/officeDocument/2006/relationships" w:history="true" r:id="R3ca65475edca4227">
         <w:r>
           <w:rPr>
             <w:rStyle w:val="Hyperlink"/>
@@ -517,7 +517,7 @@
       <w:r>
         <w:t xml:space="preserve">Reference-style link: </w:t>
       </w:r>
-      <w:hyperlink xmlns:r="http://schemas.openxmlformats.org/officeDocument/2006/relationships" w:history="true" r:id="Rbe22aaeb468a4062">
+      <w:hyperlink xmlns:r="http://schemas.openxmlformats.org/officeDocument/2006/relationships" w:history="true" r:id="R9c7e34604ff04e30">
         <w:r>
           <w:rPr>
             <w:rStyle w:val="Hyperlink"/>
@@ -538,7 +538,7 @@
       <w:r>
         <w:t xml:space="preserve">Collapsed reference link: </w:t>
       </w:r>
-      <w:hyperlink xmlns:r="http://schemas.openxmlformats.org/officeDocument/2006/relationships" w:history="true" r:id="Rd472715fafd24497">
+      <w:hyperlink xmlns:r="http://schemas.openxmlformats.org/officeDocument/2006/relationships" w:history="true" r:id="R51c0648ffdb84e9d">
         <w:r>
           <w:rPr>
             <w:rStyle w:val="Hyperlink"/>
@@ -559,7 +559,7 @@
       <w:r>
         <w:t xml:space="preserve">Repeated reference link: </w:t>
       </w:r>
-      <w:hyperlink xmlns:r="http://schemas.openxmlformats.org/officeDocument/2006/relationships" w:history="true" r:id="Rae234027f64c406f">
+      <w:hyperlink xmlns:r="http://schemas.openxmlformats.org/officeDocument/2006/relationships" w:history="true" r:id="R4b5519f3a14d44de">
         <w:r>
           <w:rPr>
             <w:rStyle w:val="Hyperlink"/>
@@ -580,7 +580,7 @@
       <w:r>
         <w:t xml:space="preserve">Autolink URL: </w:t>
       </w:r>
-      <w:hyperlink xmlns:r="http://schemas.openxmlformats.org/officeDocument/2006/relationships" w:history="true" r:id="R6ea6e524a0bc452f">
+      <w:hyperlink xmlns:r="http://schemas.openxmlformats.org/officeDocument/2006/relationships" w:history="true" r:id="R7eee859da8954d08">
         <w:r>
           <w:rPr>
             <w:rStyle w:val="Hyperlink"/>
@@ -601,7 +601,7 @@
       <w:r>
         <w:t xml:space="preserve">Autolink email: </w:t>
       </w:r>
-      <w:hyperlink xmlns:r="http://schemas.openxmlformats.org/officeDocument/2006/relationships" w:history="true" r:id="R903d0ccf8bf44c69">
+      <w:hyperlink xmlns:r="http://schemas.openxmlformats.org/officeDocument/2006/relationships" w:history="true" r:id="R3e0a327cfdab41fd">
         <w:r>
           <w:rPr>
             <w:rStyle w:val="Hyperlink"/>
@@ -700,7 +700,7 @@
       <w:r>
         <w:t xml:space="preserve">, and </w:t>
       </w:r>
-      <w:hyperlink xmlns:r="http://schemas.openxmlformats.org/officeDocument/2006/relationships" w:history="true" r:id="R5b814dc41d614178">
+      <w:hyperlink xmlns:r="http://schemas.openxmlformats.org/officeDocument/2006/relationships" w:history="true" r:id="R48c2b425cf9c42dd">
         <w:r>
           <w:rPr>
             <w:rStyle w:val="Hyperlink"/>
@@ -1093,7 +1093,7 @@
       <w:r>
         <w:t xml:space="preserve">Continuation paragraph with </w:t>
       </w:r>
-      <w:hyperlink xmlns:r="http://schemas.openxmlformats.org/officeDocument/2006/relationships" w:history="true" r:id="Ra7dc68546d834dae">
+      <w:hyperlink xmlns:r="http://schemas.openxmlformats.org/officeDocument/2006/relationships" w:history="true" r:id="R7a6bcde78cd74c8a">
         <w:r>
           <w:rPr>
             <w:rStyle w:val="Hyperlink"/>
@@ -1591,7 +1591,7 @@
       <w:r>
         <w:t xml:space="preserve">, and </w:t>
       </w:r>
-      <w:hyperlink xmlns:r="http://schemas.openxmlformats.org/officeDocument/2006/relationships" w:history="true" r:id="Ra2814127a8754593">
+      <w:hyperlink xmlns:r="http://schemas.openxmlformats.org/officeDocument/2006/relationships" w:history="true" r:id="R3ee21426caab4c32">
         <w:r>
           <w:rPr>
             <w:rStyle w:val="Hyperlink"/>
@@ -1979,7 +1979,7 @@
                     <pic:cNvPicPr/>
                   </pic:nvPicPr>
                   <pic:blipFill>
-                    <a:blip xmlns:r="http://schemas.openxmlformats.org/officeDocument/2006/relationships" r:embed="R7433ebf431df49ab"/>
+                    <a:blip xmlns:r="http://schemas.openxmlformats.org/officeDocument/2006/relationships" r:embed="R99f632192a0d483d"/>
                     <a:stretch>
                       <a:fillRect/>
                     </a:stretch>
@@ -2039,7 +2039,7 @@
                     <pic:cNvPicPr/>
                   </pic:nvPicPr>
                   <pic:blipFill>
-                    <a:blip xmlns:r="http://schemas.openxmlformats.org/officeDocument/2006/relationships" r:embed="Raa3cf63f15ba405c"/>
+                    <a:blip xmlns:r="http://schemas.openxmlformats.org/officeDocument/2006/relationships" r:embed="Rdb5759c9909d4228"/>
                     <a:stretch>
                       <a:fillRect/>
                     </a:stretch>
@@ -2099,7 +2099,7 @@
                     <pic:cNvPicPr/>
                   </pic:nvPicPr>
                   <pic:blipFill>
-                    <a:blip xmlns:r="http://schemas.openxmlformats.org/officeDocument/2006/relationships" r:embed="R1a7f03cdc538464b"/>
+                    <a:blip xmlns:r="http://schemas.openxmlformats.org/officeDocument/2006/relationships" r:embed="R16adb7866ba34e40"/>
                     <a:stretch>
                       <a:fillRect/>
                     </a:stretch>
@@ -2150,7 +2150,7 @@
                     <pic:cNvPicPr/>
                   </pic:nvPicPr>
                   <pic:blipFill>
-                    <a:blip xmlns:r="http://schemas.openxmlformats.org/officeDocument/2006/relationships" r:embed="Rcf2284d50e9c49b4"/>
+                    <a:blip xmlns:r="http://schemas.openxmlformats.org/officeDocument/2006/relationships" r:embed="R3abef1e300934053"/>
                     <a:stretch>
                       <a:fillRect/>
                     </a:stretch>
@@ -2201,7 +2201,7 @@
                     <pic:cNvPicPr/>
                   </pic:nvPicPr>
                   <pic:blipFill>
-                    <a:blip xmlns:r="http://schemas.openxmlformats.org/officeDocument/2006/relationships" r:embed="R6207cbbf81754976"/>
+                    <a:blip xmlns:r="http://schemas.openxmlformats.org/officeDocument/2006/relationships" r:embed="R5bffaa695f0842c8"/>
                     <a:stretch>
                       <a:fillRect/>
                     </a:stretch>
@@ -2252,7 +2252,7 @@
                     <pic:cNvPicPr/>
                   </pic:nvPicPr>
                   <pic:blipFill>
-                    <a:blip xmlns:r="http://schemas.openxmlformats.org/officeDocument/2006/relationships" r:embed="R2079e879a24f41ad"/>
+                    <a:blip xmlns:r="http://schemas.openxmlformats.org/officeDocument/2006/relationships" r:embed="Rfd0306f04a584ace"/>
                     <a:stretch>
                       <a:fillRect/>
                     </a:stretch>
@@ -2303,7 +2303,7 @@
                     <pic:cNvPicPr/>
                   </pic:nvPicPr>
                   <pic:blipFill>
-                    <a:blip xmlns:r="http://schemas.openxmlformats.org/officeDocument/2006/relationships" r:embed="R61116f5c86ea48ee"/>
+                    <a:blip xmlns:r="http://schemas.openxmlformats.org/officeDocument/2006/relationships" r:embed="R229e71df2fff4e79"/>
                     <a:stretch>
                       <a:fillRect/>
                     </a:stretch>
@@ -2354,7 +2354,7 @@
                     <pic:cNvPicPr/>
                   </pic:nvPicPr>
                   <pic:blipFill>
-                    <a:blip xmlns:r="http://schemas.openxmlformats.org/officeDocument/2006/relationships" r:embed="R6313508f957845b1"/>
+                    <a:blip xmlns:r="http://schemas.openxmlformats.org/officeDocument/2006/relationships" r:embed="R65b2fec90b2545c3"/>
                     <a:stretch>
                       <a:fillRect/>
                     </a:stretch>
@@ -2430,7 +2430,7 @@
                     <pic:cNvPicPr/>
                   </pic:nvPicPr>
                   <pic:blipFill>
-                    <a:blip xmlns:r="http://schemas.openxmlformats.org/officeDocument/2006/relationships" r:embed="Rf2f22161d9444f31"/>
+                    <a:blip xmlns:r="http://schemas.openxmlformats.org/officeDocument/2006/relationships" r:embed="R25975dd39461407b"/>
                     <a:stretch>
                       <a:fillRect/>
                     </a:stretch>
@@ -2481,7 +2481,7 @@
                     <pic:cNvPicPr/>
                   </pic:nvPicPr>
                   <pic:blipFill>
-                    <a:blip xmlns:r="http://schemas.openxmlformats.org/officeDocument/2006/relationships" r:embed="Rf63af3e3d4e241f8"/>
+                    <a:blip xmlns:r="http://schemas.openxmlformats.org/officeDocument/2006/relationships" r:embed="R59ad5cd2664f4532"/>
                     <a:stretch>
                       <a:fillRect/>
                     </a:stretch>
@@ -2532,7 +2532,7 @@
                     <pic:cNvPicPr/>
                   </pic:nvPicPr>
                   <pic:blipFill>
-                    <a:blip xmlns:r="http://schemas.openxmlformats.org/officeDocument/2006/relationships" r:embed="Re304244c1a5a44fb"/>
+                    <a:blip xmlns:r="http://schemas.openxmlformats.org/officeDocument/2006/relationships" r:embed="Re3cab0ea50774d09"/>
                     <a:stretch>
                       <a:fillRect/>
                     </a:stretch>
@@ -2583,7 +2583,7 @@
                     <pic:cNvPicPr/>
                   </pic:nvPicPr>
                   <pic:blipFill>
-                    <a:blip xmlns:r="http://schemas.openxmlformats.org/officeDocument/2006/relationships" r:embed="Rf77bde7727d848df"/>
+                    <a:blip xmlns:r="http://schemas.openxmlformats.org/officeDocument/2006/relationships" r:embed="R5b52f7d2f766445c"/>
                     <a:stretch>
                       <a:fillRect/>
                     </a:stretch>
@@ -2659,7 +2659,7 @@
                     <pic:cNvPicPr/>
                   </pic:nvPicPr>
                   <pic:blipFill>
-                    <a:blip xmlns:r="http://schemas.openxmlformats.org/officeDocument/2006/relationships" r:embed="R78adcceabab24a66"/>
+                    <a:blip xmlns:r="http://schemas.openxmlformats.org/officeDocument/2006/relationships" r:embed="R79662dc3baf94d4a"/>
                     <a:stretch>
                       <a:fillRect/>
                     </a:stretch>
@@ -2710,7 +2710,7 @@
                     <pic:cNvPicPr/>
                   </pic:nvPicPr>
                   <pic:blipFill>
-                    <a:blip xmlns:r="http://schemas.openxmlformats.org/officeDocument/2006/relationships" r:embed="Rccba018fbae34a76"/>
+                    <a:blip xmlns:r="http://schemas.openxmlformats.org/officeDocument/2006/relationships" r:embed="Ra7cfa983dbdc4912"/>
                     <a:stretch>
                       <a:fillRect/>
                     </a:stretch>
@@ -2761,7 +2761,7 @@
                     <pic:cNvPicPr/>
                   </pic:nvPicPr>
                   <pic:blipFill>
-                    <a:blip xmlns:r="http://schemas.openxmlformats.org/officeDocument/2006/relationships" r:embed="R5437fc466e744ae7"/>
+                    <a:blip xmlns:r="http://schemas.openxmlformats.org/officeDocument/2006/relationships" r:embed="R59530c7e89714790"/>
                     <a:stretch>
                       <a:fillRect/>
                     </a:stretch>
@@ -2812,7 +2812,7 @@
                     <pic:cNvPicPr/>
                   </pic:nvPicPr>
                   <pic:blipFill>
-                    <a:blip xmlns:r="http://schemas.openxmlformats.org/officeDocument/2006/relationships" r:embed="R0a22812974764cb6"/>
+                    <a:blip xmlns:r="http://schemas.openxmlformats.org/officeDocument/2006/relationships" r:embed="R3b0f142739b74c9c"/>
                     <a:stretch>
                       <a:fillRect/>
                     </a:stretch>
@@ -2863,7 +2863,7 @@
                     <pic:cNvPicPr/>
                   </pic:nvPicPr>
                   <pic:blipFill>
-                    <a:blip xmlns:r="http://schemas.openxmlformats.org/officeDocument/2006/relationships" r:embed="R5237b122bb844715"/>
+                    <a:blip xmlns:r="http://schemas.openxmlformats.org/officeDocument/2006/relationships" r:embed="R8d43d6ad20114b5e"/>
                     <a:stretch>
                       <a:fillRect/>
                     </a:stretch>
@@ -2914,7 +2914,7 @@
                     <pic:cNvPicPr/>
                   </pic:nvPicPr>
                   <pic:blipFill>
-                    <a:blip xmlns:r="http://schemas.openxmlformats.org/officeDocument/2006/relationships" r:embed="R01b23979612246c2"/>
+                    <a:blip xmlns:r="http://schemas.openxmlformats.org/officeDocument/2006/relationships" r:embed="Rb96984923ec84678"/>
                     <a:stretch>
                       <a:fillRect/>
                     </a:stretch>
@@ -2965,7 +2965,7 @@
                     <pic:cNvPicPr/>
                   </pic:nvPicPr>
                   <pic:blipFill>
-                    <a:blip xmlns:r="http://schemas.openxmlformats.org/officeDocument/2006/relationships" r:embed="R368658a645e34948"/>
+                    <a:blip xmlns:r="http://schemas.openxmlformats.org/officeDocument/2006/relationships" r:embed="R27d635880963498c"/>
                     <a:stretch>
                       <a:fillRect/>
                     </a:stretch>
@@ -3016,7 +3016,7 @@
                     <pic:cNvPicPr/>
                   </pic:nvPicPr>
                   <pic:blipFill>
-                    <a:blip xmlns:r="http://schemas.openxmlformats.org/officeDocument/2006/relationships" r:embed="R4fea88e7561e4e0a"/>
+                    <a:blip xmlns:r="http://schemas.openxmlformats.org/officeDocument/2006/relationships" r:embed="Rb6fb34f1dfbf4185"/>
                     <a:stretch>
                       <a:fillRect/>
                     </a:stretch>
@@ -3067,7 +3067,7 @@
                     <pic:cNvPicPr/>
                   </pic:nvPicPr>
                   <pic:blipFill>
-                    <a:blip xmlns:r="http://schemas.openxmlformats.org/officeDocument/2006/relationships" r:embed="R5436e554f92443be"/>
+                    <a:blip xmlns:r="http://schemas.openxmlformats.org/officeDocument/2006/relationships" r:embed="R69799e7d5f5a4178"/>
                     <a:stretch>
                       <a:fillRect/>
                     </a:stretch>
@@ -3118,7 +3118,7 @@
                     <pic:cNvPicPr/>
                   </pic:nvPicPr>
                   <pic:blipFill>
-                    <a:blip xmlns:r="http://schemas.openxmlformats.org/officeDocument/2006/relationships" r:embed="R640ea7dde2164cd6"/>
+                    <a:blip xmlns:r="http://schemas.openxmlformats.org/officeDocument/2006/relationships" r:embed="R968bf822bcba4b0a"/>
                     <a:stretch>
                       <a:fillRect/>
                     </a:stretch>
@@ -3169,7 +3169,7 @@
                     <pic:cNvPicPr/>
                   </pic:nvPicPr>
                   <pic:blipFill>
-                    <a:blip xmlns:r="http://schemas.openxmlformats.org/officeDocument/2006/relationships" r:embed="R170769eb0fb44e40"/>
+                    <a:blip xmlns:r="http://schemas.openxmlformats.org/officeDocument/2006/relationships" r:embed="R1d4f2f65955046a4"/>
                     <a:stretch>
                       <a:fillRect/>
                     </a:stretch>
@@ -3220,7 +3220,7 @@
                     <pic:cNvPicPr/>
                   </pic:nvPicPr>
                   <pic:blipFill>
-                    <a:blip xmlns:r="http://schemas.openxmlformats.org/officeDocument/2006/relationships" r:embed="Rc7b85d8163ed4fdb"/>
+                    <a:blip xmlns:r="http://schemas.openxmlformats.org/officeDocument/2006/relationships" r:embed="Rb60b4f9210a548d9"/>
                     <a:stretch>
                       <a:fillRect/>
                     </a:stretch>
@@ -3271,7 +3271,7 @@
                     <pic:cNvPicPr/>
                   </pic:nvPicPr>
                   <pic:blipFill>
-                    <a:blip xmlns:r="http://schemas.openxmlformats.org/officeDocument/2006/relationships" r:embed="Rec3544792479493d"/>
+                    <a:blip xmlns:r="http://schemas.openxmlformats.org/officeDocument/2006/relationships" r:embed="Rc02fadf419aa4808"/>
                     <a:stretch>
                       <a:fillRect/>
                     </a:stretch>
@@ -3322,7 +3322,7 @@
                     <pic:cNvPicPr/>
                   </pic:nvPicPr>
                   <pic:blipFill>
-                    <a:blip xmlns:r="http://schemas.openxmlformats.org/officeDocument/2006/relationships" r:embed="R40ed0681da1f4502"/>
+                    <a:blip xmlns:r="http://schemas.openxmlformats.org/officeDocument/2006/relationships" r:embed="Red58bb7ccd1a4f55"/>
                     <a:stretch>
                       <a:fillRect/>
                     </a:stretch>
@@ -3419,7 +3419,7 @@
                     <pic:cNvPicPr/>
                   </pic:nvPicPr>
                   <pic:blipFill>
-                    <a:blip xmlns:r="http://schemas.openxmlformats.org/officeDocument/2006/relationships" r:embed="R7141849f14cf4686"/>
+                    <a:blip xmlns:r="http://schemas.openxmlformats.org/officeDocument/2006/relationships" r:embed="R89fe290f19554981"/>
                     <a:stretch>
                       <a:fillRect/>
                     </a:stretch>
@@ -3462,7 +3462,7 @@
                     <pic:cNvPicPr/>
                   </pic:nvPicPr>
                   <pic:blipFill>
-                    <a:blip xmlns:r="http://schemas.openxmlformats.org/officeDocument/2006/relationships" r:embed="R1929d839e0b642d4"/>
+                    <a:blip xmlns:r="http://schemas.openxmlformats.org/officeDocument/2006/relationships" r:embed="Rc9dad3ee9bd14195"/>
                     <a:stretch>
                       <a:fillRect/>
                     </a:stretch>
@@ -3505,7 +3505,7 @@
                     <pic:cNvPicPr/>
                   </pic:nvPicPr>
                   <pic:blipFill>
-                    <a:blip xmlns:r="http://schemas.openxmlformats.org/officeDocument/2006/relationships" r:embed="Rb022e37a7dfd4196"/>
+                    <a:blip xmlns:r="http://schemas.openxmlformats.org/officeDocument/2006/relationships" r:embed="R316628b93b954f35"/>
                     <a:stretch>
                       <a:fillRect/>
                     </a:stretch>
@@ -3548,7 +3548,7 @@
                     <pic:cNvPicPr/>
                   </pic:nvPicPr>
                   <pic:blipFill>
-                    <a:blip xmlns:r="http://schemas.openxmlformats.org/officeDocument/2006/relationships" r:embed="Rf3262fbff1e4410d"/>
+                    <a:blip xmlns:r="http://schemas.openxmlformats.org/officeDocument/2006/relationships" r:embed="R02670f161f4e40e4"/>
                     <a:stretch>
                       <a:fillRect/>
                     </a:stretch>
@@ -3933,7 +3933,7 @@
                     <pic:cNvPicPr/>
                   </pic:nvPicPr>
                   <pic:blipFill>
-                    <a:blip xmlns:r="http://schemas.openxmlformats.org/officeDocument/2006/relationships" r:embed="R693968c2b9044d93"/>
+                    <a:blip xmlns:r="http://schemas.openxmlformats.org/officeDocument/2006/relationships" r:embed="R3ebba184bb2e4c24"/>
                     <a:stretch>
                       <a:fillRect/>
                     </a:stretch>
@@ -4125,7 +4125,7 @@
                     <pic:cNvPicPr/>
                   </pic:nvPicPr>
                   <pic:blipFill>
-                    <a:blip xmlns:r="http://schemas.openxmlformats.org/officeDocument/2006/relationships" r:embed="R2f16f2fbed2c4d69"/>
+                    <a:blip xmlns:r="http://schemas.openxmlformats.org/officeDocument/2006/relationships" r:embed="R9e3f71e85208439e"/>
                     <a:stretch>
                       <a:fillRect/>
                     </a:stretch>
@@ -4176,7 +4176,7 @@
                     <pic:cNvPicPr/>
                   </pic:nvPicPr>
                   <pic:blipFill>
-                    <a:blip xmlns:r="http://schemas.openxmlformats.org/officeDocument/2006/relationships" r:embed="R14740a2e010d4670"/>
+                    <a:blip xmlns:r="http://schemas.openxmlformats.org/officeDocument/2006/relationships" r:embed="R900248d7506942c1"/>
                     <a:stretch>
                       <a:fillRect/>
                     </a:stretch>
@@ -4227,7 +4227,7 @@
                     <pic:cNvPicPr/>
                   </pic:nvPicPr>
                   <pic:blipFill>
-                    <a:blip xmlns:r="http://schemas.openxmlformats.org/officeDocument/2006/relationships" r:embed="Rcd290bafa3fd4b2a"/>
+                    <a:blip xmlns:r="http://schemas.openxmlformats.org/officeDocument/2006/relationships" r:embed="R73d72dcd833a4cbd"/>
                     <a:stretch>
                       <a:fillRect/>
                     </a:stretch>
@@ -4278,7 +4278,7 @@
                     <pic:cNvPicPr/>
                   </pic:nvPicPr>
                   <pic:blipFill>
-                    <a:blip xmlns:r="http://schemas.openxmlformats.org/officeDocument/2006/relationships" r:embed="R63d6a8d2992f4487"/>
+                    <a:blip xmlns:r="http://schemas.openxmlformats.org/officeDocument/2006/relationships" r:embed="R1cf17fb5a6744311"/>
                     <a:stretch>
                       <a:fillRect/>
                     </a:stretch>
@@ -4657,7 +4657,7 @@
                     <pic:cNvPicPr/>
                   </pic:nvPicPr>
                   <pic:blipFill>
-                    <a:blip xmlns:r="http://schemas.openxmlformats.org/officeDocument/2006/relationships" r:embed="R2e965e4f51854486"/>
+                    <a:blip xmlns:r="http://schemas.openxmlformats.org/officeDocument/2006/relationships" r:embed="R7aca32d47b514626"/>
                     <a:stretch>
                       <a:fillRect/>
                     </a:stretch>
@@ -5338,7 +5338,7 @@
             <w:r>
               <w:t xml:space="preserve">Cell with </w:t>
             </w:r>
-            <w:hyperlink xmlns:r="http://schemas.openxmlformats.org/officeDocument/2006/relationships" w:history="true" r:id="R43514b2484554c96">
+            <w:hyperlink xmlns:r="http://schemas.openxmlformats.org/officeDocument/2006/relationships" w:history="true" r:id="Rb1bac1be666e4bfa">
               <w:r>
                 <w:rPr>
                   <w:rStyle w:val="Hyperlink"/>
@@ -5624,7 +5624,7 @@
                           <pic:cNvPicPr/>
                         </pic:nvPicPr>
                         <pic:blipFill>
-                          <a:blip xmlns:r="http://schemas.openxmlformats.org/officeDocument/2006/relationships" r:embed="Rf86370bb60ae4d6d"/>
+                          <a:blip xmlns:r="http://schemas.openxmlformats.org/officeDocument/2006/relationships" r:embed="R3e75d1b4193842b0"/>
                           <a:stretch>
                             <a:fillRect/>
                           </a:stretch>
@@ -5724,7 +5724,7 @@
                     <pic:cNvPicPr/>
                   </pic:nvPicPr>
                   <pic:blipFill>
-                    <a:blip xmlns:r="http://schemas.openxmlformats.org/officeDocument/2006/relationships" r:embed="R48249791a2f1487d"/>
+                    <a:blip xmlns:r="http://schemas.openxmlformats.org/officeDocument/2006/relationships" r:embed="Rb27dae7219604296"/>
                     <a:stretch>
                       <a:fillRect/>
                     </a:stretch>
@@ -5774,7 +5774,7 @@
                     <pic:cNvPicPr/>
                   </pic:nvPicPr>
                   <pic:blipFill>
-                    <a:blip xmlns:r="http://schemas.openxmlformats.org/officeDocument/2006/relationships" r:embed="R013809281def47b8"/>
+                    <a:blip xmlns:r="http://schemas.openxmlformats.org/officeDocument/2006/relationships" r:embed="R1906e3135776492d"/>
                     <a:stretch>
                       <a:fillRect/>
                     </a:stretch>
@@ -5824,7 +5824,7 @@
                     <pic:cNvPicPr/>
                   </pic:nvPicPr>
                   <pic:blipFill>
-                    <a:blip xmlns:r="http://schemas.openxmlformats.org/officeDocument/2006/relationships" r:embed="Rc96862a44d604e78"/>
+                    <a:blip xmlns:r="http://schemas.openxmlformats.org/officeDocument/2006/relationships" r:embed="Rc969866d83cb4931"/>
                     <a:stretch>
                       <a:fillRect/>
                     </a:stretch>

</xml_diff>

<commit_message>
fix(er): use explicit cubic Beziers for simple routes
For simple ER relationships with two endpoints, render a cubic Bezier using source-of-truth pull-length formulas to stabilise endpoint tangents (downward leave from BC and shoulder approach into top anchors). Keep curveBasis for multi-point routes.

Made-with: Cursor
</commit_message>
<xml_diff>
--- a/test.docx
+++ b/test.docx
@@ -236,7 +236,7 @@
       <w:r>
         <w:t xml:space="preserve">, and </w:t>
       </w:r>
-      <w:hyperlink xmlns:r="http://schemas.openxmlformats.org/officeDocument/2006/relationships" w:history="true" r:id="R420ddb051ac64696">
+      <w:hyperlink xmlns:r="http://schemas.openxmlformats.org/officeDocument/2006/relationships" w:history="true" r:id="R410fe67906ad4cff">
         <w:r>
           <w:rPr>
             <w:rStyle w:val="Hyperlink"/>
@@ -475,7 +475,7 @@
       <w:r>
         <w:t xml:space="preserve">Direct link: </w:t>
       </w:r>
-      <w:hyperlink xmlns:r="http://schemas.openxmlformats.org/officeDocument/2006/relationships" w:history="true" r:id="R70989b136a344955">
+      <w:hyperlink xmlns:r="http://schemas.openxmlformats.org/officeDocument/2006/relationships" w:history="true" r:id="R0c22fed661f14fbc">
         <w:r>
           <w:rPr>
             <w:rStyle w:val="Hyperlink"/>
@@ -496,7 +496,7 @@
       <w:r>
         <w:t xml:space="preserve">Direct link with title: </w:t>
       </w:r>
-      <w:hyperlink xmlns:r="http://schemas.openxmlformats.org/officeDocument/2006/relationships" w:history="true" r:id="R3ca65475edca4227">
+      <w:hyperlink xmlns:r="http://schemas.openxmlformats.org/officeDocument/2006/relationships" w:history="true" r:id="Rcc1782b806ed4578">
         <w:r>
           <w:rPr>
             <w:rStyle w:val="Hyperlink"/>
@@ -517,7 +517,7 @@
       <w:r>
         <w:t xml:space="preserve">Reference-style link: </w:t>
       </w:r>
-      <w:hyperlink xmlns:r="http://schemas.openxmlformats.org/officeDocument/2006/relationships" w:history="true" r:id="R9c7e34604ff04e30">
+      <w:hyperlink xmlns:r="http://schemas.openxmlformats.org/officeDocument/2006/relationships" w:history="true" r:id="R9228e9802839437f">
         <w:r>
           <w:rPr>
             <w:rStyle w:val="Hyperlink"/>
@@ -538,7 +538,7 @@
       <w:r>
         <w:t xml:space="preserve">Collapsed reference link: </w:t>
       </w:r>
-      <w:hyperlink xmlns:r="http://schemas.openxmlformats.org/officeDocument/2006/relationships" w:history="true" r:id="R51c0648ffdb84e9d">
+      <w:hyperlink xmlns:r="http://schemas.openxmlformats.org/officeDocument/2006/relationships" w:history="true" r:id="Rab248b4ad58a4a70">
         <w:r>
           <w:rPr>
             <w:rStyle w:val="Hyperlink"/>
@@ -559,7 +559,7 @@
       <w:r>
         <w:t xml:space="preserve">Repeated reference link: </w:t>
       </w:r>
-      <w:hyperlink xmlns:r="http://schemas.openxmlformats.org/officeDocument/2006/relationships" w:history="true" r:id="R4b5519f3a14d44de">
+      <w:hyperlink xmlns:r="http://schemas.openxmlformats.org/officeDocument/2006/relationships" w:history="true" r:id="Rfc2127865f194372">
         <w:r>
           <w:rPr>
             <w:rStyle w:val="Hyperlink"/>
@@ -580,7 +580,7 @@
       <w:r>
         <w:t xml:space="preserve">Autolink URL: </w:t>
       </w:r>
-      <w:hyperlink xmlns:r="http://schemas.openxmlformats.org/officeDocument/2006/relationships" w:history="true" r:id="R7eee859da8954d08">
+      <w:hyperlink xmlns:r="http://schemas.openxmlformats.org/officeDocument/2006/relationships" w:history="true" r:id="Ra387dfccb59f4fa7">
         <w:r>
           <w:rPr>
             <w:rStyle w:val="Hyperlink"/>
@@ -601,7 +601,7 @@
       <w:r>
         <w:t xml:space="preserve">Autolink email: </w:t>
       </w:r>
-      <w:hyperlink xmlns:r="http://schemas.openxmlformats.org/officeDocument/2006/relationships" w:history="true" r:id="R3e0a327cfdab41fd">
+      <w:hyperlink xmlns:r="http://schemas.openxmlformats.org/officeDocument/2006/relationships" w:history="true" r:id="R5626e91cd92e4590">
         <w:r>
           <w:rPr>
             <w:rStyle w:val="Hyperlink"/>
@@ -700,7 +700,7 @@
       <w:r>
         <w:t xml:space="preserve">, and </w:t>
       </w:r>
-      <w:hyperlink xmlns:r="http://schemas.openxmlformats.org/officeDocument/2006/relationships" w:history="true" r:id="R48c2b425cf9c42dd">
+      <w:hyperlink xmlns:r="http://schemas.openxmlformats.org/officeDocument/2006/relationships" w:history="true" r:id="Re3c45e92723c453b">
         <w:r>
           <w:rPr>
             <w:rStyle w:val="Hyperlink"/>
@@ -1093,7 +1093,7 @@
       <w:r>
         <w:t xml:space="preserve">Continuation paragraph with </w:t>
       </w:r>
-      <w:hyperlink xmlns:r="http://schemas.openxmlformats.org/officeDocument/2006/relationships" w:history="true" r:id="R7a6bcde78cd74c8a">
+      <w:hyperlink xmlns:r="http://schemas.openxmlformats.org/officeDocument/2006/relationships" w:history="true" r:id="R01bf534d42f74d5a">
         <w:r>
           <w:rPr>
             <w:rStyle w:val="Hyperlink"/>
@@ -1591,7 +1591,7 @@
       <w:r>
         <w:t xml:space="preserve">, and </w:t>
       </w:r>
-      <w:hyperlink xmlns:r="http://schemas.openxmlformats.org/officeDocument/2006/relationships" w:history="true" r:id="R3ee21426caab4c32">
+      <w:hyperlink xmlns:r="http://schemas.openxmlformats.org/officeDocument/2006/relationships" w:history="true" r:id="Rd41055d117254a4e">
         <w:r>
           <w:rPr>
             <w:rStyle w:val="Hyperlink"/>
@@ -1979,7 +1979,7 @@
                     <pic:cNvPicPr/>
                   </pic:nvPicPr>
                   <pic:blipFill>
-                    <a:blip xmlns:r="http://schemas.openxmlformats.org/officeDocument/2006/relationships" r:embed="R99f632192a0d483d"/>
+                    <a:blip xmlns:r="http://schemas.openxmlformats.org/officeDocument/2006/relationships" r:embed="Rc81a5af003b34ed8"/>
                     <a:stretch>
                       <a:fillRect/>
                     </a:stretch>
@@ -2039,7 +2039,7 @@
                     <pic:cNvPicPr/>
                   </pic:nvPicPr>
                   <pic:blipFill>
-                    <a:blip xmlns:r="http://schemas.openxmlformats.org/officeDocument/2006/relationships" r:embed="Rdb5759c9909d4228"/>
+                    <a:blip xmlns:r="http://schemas.openxmlformats.org/officeDocument/2006/relationships" r:embed="Rd9d4c5058aa84382"/>
                     <a:stretch>
                       <a:fillRect/>
                     </a:stretch>
@@ -2099,7 +2099,7 @@
                     <pic:cNvPicPr/>
                   </pic:nvPicPr>
                   <pic:blipFill>
-                    <a:blip xmlns:r="http://schemas.openxmlformats.org/officeDocument/2006/relationships" r:embed="R16adb7866ba34e40"/>
+                    <a:blip xmlns:r="http://schemas.openxmlformats.org/officeDocument/2006/relationships" r:embed="R0eac8e5ededc4bac"/>
                     <a:stretch>
                       <a:fillRect/>
                     </a:stretch>
@@ -2150,7 +2150,7 @@
                     <pic:cNvPicPr/>
                   </pic:nvPicPr>
                   <pic:blipFill>
-                    <a:blip xmlns:r="http://schemas.openxmlformats.org/officeDocument/2006/relationships" r:embed="R3abef1e300934053"/>
+                    <a:blip xmlns:r="http://schemas.openxmlformats.org/officeDocument/2006/relationships" r:embed="R97ea9a2a8eda4001"/>
                     <a:stretch>
                       <a:fillRect/>
                     </a:stretch>
@@ -2201,7 +2201,7 @@
                     <pic:cNvPicPr/>
                   </pic:nvPicPr>
                   <pic:blipFill>
-                    <a:blip xmlns:r="http://schemas.openxmlformats.org/officeDocument/2006/relationships" r:embed="R5bffaa695f0842c8"/>
+                    <a:blip xmlns:r="http://schemas.openxmlformats.org/officeDocument/2006/relationships" r:embed="R0950302456a34583"/>
                     <a:stretch>
                       <a:fillRect/>
                     </a:stretch>
@@ -2252,7 +2252,7 @@
                     <pic:cNvPicPr/>
                   </pic:nvPicPr>
                   <pic:blipFill>
-                    <a:blip xmlns:r="http://schemas.openxmlformats.org/officeDocument/2006/relationships" r:embed="Rfd0306f04a584ace"/>
+                    <a:blip xmlns:r="http://schemas.openxmlformats.org/officeDocument/2006/relationships" r:embed="R35036ca169de4e4e"/>
                     <a:stretch>
                       <a:fillRect/>
                     </a:stretch>
@@ -2303,7 +2303,7 @@
                     <pic:cNvPicPr/>
                   </pic:nvPicPr>
                   <pic:blipFill>
-                    <a:blip xmlns:r="http://schemas.openxmlformats.org/officeDocument/2006/relationships" r:embed="R229e71df2fff4e79"/>
+                    <a:blip xmlns:r="http://schemas.openxmlformats.org/officeDocument/2006/relationships" r:embed="R1997d98add244534"/>
                     <a:stretch>
                       <a:fillRect/>
                     </a:stretch>
@@ -2354,7 +2354,7 @@
                     <pic:cNvPicPr/>
                   </pic:nvPicPr>
                   <pic:blipFill>
-                    <a:blip xmlns:r="http://schemas.openxmlformats.org/officeDocument/2006/relationships" r:embed="R65b2fec90b2545c3"/>
+                    <a:blip xmlns:r="http://schemas.openxmlformats.org/officeDocument/2006/relationships" r:embed="R97d484e07a77471d"/>
                     <a:stretch>
                       <a:fillRect/>
                     </a:stretch>
@@ -2430,7 +2430,7 @@
                     <pic:cNvPicPr/>
                   </pic:nvPicPr>
                   <pic:blipFill>
-                    <a:blip xmlns:r="http://schemas.openxmlformats.org/officeDocument/2006/relationships" r:embed="R25975dd39461407b"/>
+                    <a:blip xmlns:r="http://schemas.openxmlformats.org/officeDocument/2006/relationships" r:embed="Rcc1f98f7292f4b46"/>
                     <a:stretch>
                       <a:fillRect/>
                     </a:stretch>
@@ -2481,7 +2481,7 @@
                     <pic:cNvPicPr/>
                   </pic:nvPicPr>
                   <pic:blipFill>
-                    <a:blip xmlns:r="http://schemas.openxmlformats.org/officeDocument/2006/relationships" r:embed="R59ad5cd2664f4532"/>
+                    <a:blip xmlns:r="http://schemas.openxmlformats.org/officeDocument/2006/relationships" r:embed="R67f68f5b9f88436e"/>
                     <a:stretch>
                       <a:fillRect/>
                     </a:stretch>
@@ -2532,7 +2532,7 @@
                     <pic:cNvPicPr/>
                   </pic:nvPicPr>
                   <pic:blipFill>
-                    <a:blip xmlns:r="http://schemas.openxmlformats.org/officeDocument/2006/relationships" r:embed="Re3cab0ea50774d09"/>
+                    <a:blip xmlns:r="http://schemas.openxmlformats.org/officeDocument/2006/relationships" r:embed="R4a7cb1bce46f4252"/>
                     <a:stretch>
                       <a:fillRect/>
                     </a:stretch>
@@ -2583,7 +2583,7 @@
                     <pic:cNvPicPr/>
                   </pic:nvPicPr>
                   <pic:blipFill>
-                    <a:blip xmlns:r="http://schemas.openxmlformats.org/officeDocument/2006/relationships" r:embed="R5b52f7d2f766445c"/>
+                    <a:blip xmlns:r="http://schemas.openxmlformats.org/officeDocument/2006/relationships" r:embed="R9fd5f3c7dbf642ae"/>
                     <a:stretch>
                       <a:fillRect/>
                     </a:stretch>
@@ -2659,7 +2659,7 @@
                     <pic:cNvPicPr/>
                   </pic:nvPicPr>
                   <pic:blipFill>
-                    <a:blip xmlns:r="http://schemas.openxmlformats.org/officeDocument/2006/relationships" r:embed="R79662dc3baf94d4a"/>
+                    <a:blip xmlns:r="http://schemas.openxmlformats.org/officeDocument/2006/relationships" r:embed="R632599e0c5884de9"/>
                     <a:stretch>
                       <a:fillRect/>
                     </a:stretch>
@@ -2710,7 +2710,7 @@
                     <pic:cNvPicPr/>
                   </pic:nvPicPr>
                   <pic:blipFill>
-                    <a:blip xmlns:r="http://schemas.openxmlformats.org/officeDocument/2006/relationships" r:embed="Ra7cfa983dbdc4912"/>
+                    <a:blip xmlns:r="http://schemas.openxmlformats.org/officeDocument/2006/relationships" r:embed="Ra6c01fbc8c994727"/>
                     <a:stretch>
                       <a:fillRect/>
                     </a:stretch>
@@ -2761,7 +2761,7 @@
                     <pic:cNvPicPr/>
                   </pic:nvPicPr>
                   <pic:blipFill>
-                    <a:blip xmlns:r="http://schemas.openxmlformats.org/officeDocument/2006/relationships" r:embed="R59530c7e89714790"/>
+                    <a:blip xmlns:r="http://schemas.openxmlformats.org/officeDocument/2006/relationships" r:embed="R1376c4d3ce7244fd"/>
                     <a:stretch>
                       <a:fillRect/>
                     </a:stretch>
@@ -2812,7 +2812,7 @@
                     <pic:cNvPicPr/>
                   </pic:nvPicPr>
                   <pic:blipFill>
-                    <a:blip xmlns:r="http://schemas.openxmlformats.org/officeDocument/2006/relationships" r:embed="R3b0f142739b74c9c"/>
+                    <a:blip xmlns:r="http://schemas.openxmlformats.org/officeDocument/2006/relationships" r:embed="R725f3848023c4fe2"/>
                     <a:stretch>
                       <a:fillRect/>
                     </a:stretch>
@@ -2863,7 +2863,7 @@
                     <pic:cNvPicPr/>
                   </pic:nvPicPr>
                   <pic:blipFill>
-                    <a:blip xmlns:r="http://schemas.openxmlformats.org/officeDocument/2006/relationships" r:embed="R8d43d6ad20114b5e"/>
+                    <a:blip xmlns:r="http://schemas.openxmlformats.org/officeDocument/2006/relationships" r:embed="R3425218c786441b8"/>
                     <a:stretch>
                       <a:fillRect/>
                     </a:stretch>
@@ -2914,7 +2914,7 @@
                     <pic:cNvPicPr/>
                   </pic:nvPicPr>
                   <pic:blipFill>
-                    <a:blip xmlns:r="http://schemas.openxmlformats.org/officeDocument/2006/relationships" r:embed="Rb96984923ec84678"/>
+                    <a:blip xmlns:r="http://schemas.openxmlformats.org/officeDocument/2006/relationships" r:embed="R3425beb670b44d93"/>
                     <a:stretch>
                       <a:fillRect/>
                     </a:stretch>
@@ -2965,7 +2965,7 @@
                     <pic:cNvPicPr/>
                   </pic:nvPicPr>
                   <pic:blipFill>
-                    <a:blip xmlns:r="http://schemas.openxmlformats.org/officeDocument/2006/relationships" r:embed="R27d635880963498c"/>
+                    <a:blip xmlns:r="http://schemas.openxmlformats.org/officeDocument/2006/relationships" r:embed="Ra6d783a3688e4099"/>
                     <a:stretch>
                       <a:fillRect/>
                     </a:stretch>
@@ -3016,7 +3016,7 @@
                     <pic:cNvPicPr/>
                   </pic:nvPicPr>
                   <pic:blipFill>
-                    <a:blip xmlns:r="http://schemas.openxmlformats.org/officeDocument/2006/relationships" r:embed="Rb6fb34f1dfbf4185"/>
+                    <a:blip xmlns:r="http://schemas.openxmlformats.org/officeDocument/2006/relationships" r:embed="R28714caea34a4741"/>
                     <a:stretch>
                       <a:fillRect/>
                     </a:stretch>
@@ -3067,7 +3067,7 @@
                     <pic:cNvPicPr/>
                   </pic:nvPicPr>
                   <pic:blipFill>
-                    <a:blip xmlns:r="http://schemas.openxmlformats.org/officeDocument/2006/relationships" r:embed="R69799e7d5f5a4178"/>
+                    <a:blip xmlns:r="http://schemas.openxmlformats.org/officeDocument/2006/relationships" r:embed="R5e1af6717d994097"/>
                     <a:stretch>
                       <a:fillRect/>
                     </a:stretch>
@@ -3118,7 +3118,7 @@
                     <pic:cNvPicPr/>
                   </pic:nvPicPr>
                   <pic:blipFill>
-                    <a:blip xmlns:r="http://schemas.openxmlformats.org/officeDocument/2006/relationships" r:embed="R968bf822bcba4b0a"/>
+                    <a:blip xmlns:r="http://schemas.openxmlformats.org/officeDocument/2006/relationships" r:embed="Re9c4ee8eaa2e4f6b"/>
                     <a:stretch>
                       <a:fillRect/>
                     </a:stretch>
@@ -3169,7 +3169,7 @@
                     <pic:cNvPicPr/>
                   </pic:nvPicPr>
                   <pic:blipFill>
-                    <a:blip xmlns:r="http://schemas.openxmlformats.org/officeDocument/2006/relationships" r:embed="R1d4f2f65955046a4"/>
+                    <a:blip xmlns:r="http://schemas.openxmlformats.org/officeDocument/2006/relationships" r:embed="R13d063a99fd046f1"/>
                     <a:stretch>
                       <a:fillRect/>
                     </a:stretch>
@@ -3220,7 +3220,7 @@
                     <pic:cNvPicPr/>
                   </pic:nvPicPr>
                   <pic:blipFill>
-                    <a:blip xmlns:r="http://schemas.openxmlformats.org/officeDocument/2006/relationships" r:embed="Rb60b4f9210a548d9"/>
+                    <a:blip xmlns:r="http://schemas.openxmlformats.org/officeDocument/2006/relationships" r:embed="Ra679db955e334aa7"/>
                     <a:stretch>
                       <a:fillRect/>
                     </a:stretch>
@@ -3271,7 +3271,7 @@
                     <pic:cNvPicPr/>
                   </pic:nvPicPr>
                   <pic:blipFill>
-                    <a:blip xmlns:r="http://schemas.openxmlformats.org/officeDocument/2006/relationships" r:embed="Rc02fadf419aa4808"/>
+                    <a:blip xmlns:r="http://schemas.openxmlformats.org/officeDocument/2006/relationships" r:embed="Rbeb64ff41450438e"/>
                     <a:stretch>
                       <a:fillRect/>
                     </a:stretch>
@@ -3322,7 +3322,7 @@
                     <pic:cNvPicPr/>
                   </pic:nvPicPr>
                   <pic:blipFill>
-                    <a:blip xmlns:r="http://schemas.openxmlformats.org/officeDocument/2006/relationships" r:embed="Red58bb7ccd1a4f55"/>
+                    <a:blip xmlns:r="http://schemas.openxmlformats.org/officeDocument/2006/relationships" r:embed="R6f0929314a724a57"/>
                     <a:stretch>
                       <a:fillRect/>
                     </a:stretch>
@@ -3419,7 +3419,7 @@
                     <pic:cNvPicPr/>
                   </pic:nvPicPr>
                   <pic:blipFill>
-                    <a:blip xmlns:r="http://schemas.openxmlformats.org/officeDocument/2006/relationships" r:embed="R89fe290f19554981"/>
+                    <a:blip xmlns:r="http://schemas.openxmlformats.org/officeDocument/2006/relationships" r:embed="R393abbac299f4208"/>
                     <a:stretch>
                       <a:fillRect/>
                     </a:stretch>
@@ -3462,7 +3462,7 @@
                     <pic:cNvPicPr/>
                   </pic:nvPicPr>
                   <pic:blipFill>
-                    <a:blip xmlns:r="http://schemas.openxmlformats.org/officeDocument/2006/relationships" r:embed="Rc9dad3ee9bd14195"/>
+                    <a:blip xmlns:r="http://schemas.openxmlformats.org/officeDocument/2006/relationships" r:embed="R9f33e3194f794f3c"/>
                     <a:stretch>
                       <a:fillRect/>
                     </a:stretch>
@@ -3505,7 +3505,7 @@
                     <pic:cNvPicPr/>
                   </pic:nvPicPr>
                   <pic:blipFill>
-                    <a:blip xmlns:r="http://schemas.openxmlformats.org/officeDocument/2006/relationships" r:embed="R316628b93b954f35"/>
+                    <a:blip xmlns:r="http://schemas.openxmlformats.org/officeDocument/2006/relationships" r:embed="Ra4fb13188a3344a2"/>
                     <a:stretch>
                       <a:fillRect/>
                     </a:stretch>
@@ -3548,7 +3548,7 @@
                     <pic:cNvPicPr/>
                   </pic:nvPicPr>
                   <pic:blipFill>
-                    <a:blip xmlns:r="http://schemas.openxmlformats.org/officeDocument/2006/relationships" r:embed="R02670f161f4e40e4"/>
+                    <a:blip xmlns:r="http://schemas.openxmlformats.org/officeDocument/2006/relationships" r:embed="Rf62f09f325c44203"/>
                     <a:stretch>
                       <a:fillRect/>
                     </a:stretch>
@@ -3933,7 +3933,7 @@
                     <pic:cNvPicPr/>
                   </pic:nvPicPr>
                   <pic:blipFill>
-                    <a:blip xmlns:r="http://schemas.openxmlformats.org/officeDocument/2006/relationships" r:embed="R3ebba184bb2e4c24"/>
+                    <a:blip xmlns:r="http://schemas.openxmlformats.org/officeDocument/2006/relationships" r:embed="Re4d82157010e4de5"/>
                     <a:stretch>
                       <a:fillRect/>
                     </a:stretch>
@@ -4125,7 +4125,7 @@
                     <pic:cNvPicPr/>
                   </pic:nvPicPr>
                   <pic:blipFill>
-                    <a:blip xmlns:r="http://schemas.openxmlformats.org/officeDocument/2006/relationships" r:embed="R9e3f71e85208439e"/>
+                    <a:blip xmlns:r="http://schemas.openxmlformats.org/officeDocument/2006/relationships" r:embed="Rb4b214d3d02145d7"/>
                     <a:stretch>
                       <a:fillRect/>
                     </a:stretch>
@@ -4176,7 +4176,7 @@
                     <pic:cNvPicPr/>
                   </pic:nvPicPr>
                   <pic:blipFill>
-                    <a:blip xmlns:r="http://schemas.openxmlformats.org/officeDocument/2006/relationships" r:embed="R900248d7506942c1"/>
+                    <a:blip xmlns:r="http://schemas.openxmlformats.org/officeDocument/2006/relationships" r:embed="Rd0a4ad18cb66433e"/>
                     <a:stretch>
                       <a:fillRect/>
                     </a:stretch>
@@ -4227,7 +4227,7 @@
                     <pic:cNvPicPr/>
                   </pic:nvPicPr>
                   <pic:blipFill>
-                    <a:blip xmlns:r="http://schemas.openxmlformats.org/officeDocument/2006/relationships" r:embed="R73d72dcd833a4cbd"/>
+                    <a:blip xmlns:r="http://schemas.openxmlformats.org/officeDocument/2006/relationships" r:embed="Rbcea5061b43e4866"/>
                     <a:stretch>
                       <a:fillRect/>
                     </a:stretch>
@@ -4278,7 +4278,7 @@
                     <pic:cNvPicPr/>
                   </pic:nvPicPr>
                   <pic:blipFill>
-                    <a:blip xmlns:r="http://schemas.openxmlformats.org/officeDocument/2006/relationships" r:embed="R1cf17fb5a6744311"/>
+                    <a:blip xmlns:r="http://schemas.openxmlformats.org/officeDocument/2006/relationships" r:embed="Rf1621496f41349e6"/>
                     <a:stretch>
                       <a:fillRect/>
                     </a:stretch>
@@ -4657,7 +4657,7 @@
                     <pic:cNvPicPr/>
                   </pic:nvPicPr>
                   <pic:blipFill>
-                    <a:blip xmlns:r="http://schemas.openxmlformats.org/officeDocument/2006/relationships" r:embed="R7aca32d47b514626"/>
+                    <a:blip xmlns:r="http://schemas.openxmlformats.org/officeDocument/2006/relationships" r:embed="R9892497ae23240c4"/>
                     <a:stretch>
                       <a:fillRect/>
                     </a:stretch>
@@ -5338,7 +5338,7 @@
             <w:r>
               <w:t xml:space="preserve">Cell with </w:t>
             </w:r>
-            <w:hyperlink xmlns:r="http://schemas.openxmlformats.org/officeDocument/2006/relationships" w:history="true" r:id="Rb1bac1be666e4bfa">
+            <w:hyperlink xmlns:r="http://schemas.openxmlformats.org/officeDocument/2006/relationships" w:history="true" r:id="R4d527cefe45f4b0b">
               <w:r>
                 <w:rPr>
                   <w:rStyle w:val="Hyperlink"/>
@@ -5624,7 +5624,7 @@
                           <pic:cNvPicPr/>
                         </pic:nvPicPr>
                         <pic:blipFill>
-                          <a:blip xmlns:r="http://schemas.openxmlformats.org/officeDocument/2006/relationships" r:embed="R3e75d1b4193842b0"/>
+                          <a:blip xmlns:r="http://schemas.openxmlformats.org/officeDocument/2006/relationships" r:embed="Rc66c5370b84f4c9e"/>
                           <a:stretch>
                             <a:fillRect/>
                           </a:stretch>
@@ -5724,7 +5724,7 @@
                     <pic:cNvPicPr/>
                   </pic:nvPicPr>
                   <pic:blipFill>
-                    <a:blip xmlns:r="http://schemas.openxmlformats.org/officeDocument/2006/relationships" r:embed="Rb27dae7219604296"/>
+                    <a:blip xmlns:r="http://schemas.openxmlformats.org/officeDocument/2006/relationships" r:embed="Rfe75a7295c0e4f76"/>
                     <a:stretch>
                       <a:fillRect/>
                     </a:stretch>
@@ -5774,7 +5774,7 @@
                     <pic:cNvPicPr/>
                   </pic:nvPicPr>
                   <pic:blipFill>
-                    <a:blip xmlns:r="http://schemas.openxmlformats.org/officeDocument/2006/relationships" r:embed="R1906e3135776492d"/>
+                    <a:blip xmlns:r="http://schemas.openxmlformats.org/officeDocument/2006/relationships" r:embed="R4f30a36642dc43ca"/>
                     <a:stretch>
                       <a:fillRect/>
                     </a:stretch>
@@ -5824,7 +5824,7 @@
                     <pic:cNvPicPr/>
                   </pic:nvPicPr>
                   <pic:blipFill>
-                    <a:blip xmlns:r="http://schemas.openxmlformats.org/officeDocument/2006/relationships" r:embed="Rc969866d83cb4931"/>
+                    <a:blip xmlns:r="http://schemas.openxmlformats.org/officeDocument/2006/relationships" r:embed="R08f14a7b15a74b4d"/>
                     <a:stretch>
                       <a:fillRect/>
                     </a:stretch>

</xml_diff>

<commit_message>
fix(er): prefer explicit Beziers for bottom-to-top routes
Use the source-of-truth cubic Bezier pull model for bottom-source to top-target ER relationships even when layout inserted dummy/intermediate points, so gold-standard ORDER/PRODUCT -> LINE_ITEM curves approach the shoulders with stable tangents.

Made-with: Cursor
</commit_message>
<xml_diff>
--- a/test.docx
+++ b/test.docx
@@ -236,7 +236,7 @@
       <w:r>
         <w:t xml:space="preserve">, and </w:t>
       </w:r>
-      <w:hyperlink xmlns:r="http://schemas.openxmlformats.org/officeDocument/2006/relationships" w:history="true" r:id="R410fe67906ad4cff">
+      <w:hyperlink xmlns:r="http://schemas.openxmlformats.org/officeDocument/2006/relationships" w:history="true" r:id="Ra3b1a744b9d64e41">
         <w:r>
           <w:rPr>
             <w:rStyle w:val="Hyperlink"/>
@@ -475,7 +475,7 @@
       <w:r>
         <w:t xml:space="preserve">Direct link: </w:t>
       </w:r>
-      <w:hyperlink xmlns:r="http://schemas.openxmlformats.org/officeDocument/2006/relationships" w:history="true" r:id="R0c22fed661f14fbc">
+      <w:hyperlink xmlns:r="http://schemas.openxmlformats.org/officeDocument/2006/relationships" w:history="true" r:id="R715f53817d724f58">
         <w:r>
           <w:rPr>
             <w:rStyle w:val="Hyperlink"/>
@@ -496,7 +496,7 @@
       <w:r>
         <w:t xml:space="preserve">Direct link with title: </w:t>
       </w:r>
-      <w:hyperlink xmlns:r="http://schemas.openxmlformats.org/officeDocument/2006/relationships" w:history="true" r:id="Rcc1782b806ed4578">
+      <w:hyperlink xmlns:r="http://schemas.openxmlformats.org/officeDocument/2006/relationships" w:history="true" r:id="Rcd2a9f0465e644a2">
         <w:r>
           <w:rPr>
             <w:rStyle w:val="Hyperlink"/>
@@ -517,7 +517,7 @@
       <w:r>
         <w:t xml:space="preserve">Reference-style link: </w:t>
       </w:r>
-      <w:hyperlink xmlns:r="http://schemas.openxmlformats.org/officeDocument/2006/relationships" w:history="true" r:id="R9228e9802839437f">
+      <w:hyperlink xmlns:r="http://schemas.openxmlformats.org/officeDocument/2006/relationships" w:history="true" r:id="Rde916c54aa9e4fa0">
         <w:r>
           <w:rPr>
             <w:rStyle w:val="Hyperlink"/>
@@ -538,7 +538,7 @@
       <w:r>
         <w:t xml:space="preserve">Collapsed reference link: </w:t>
       </w:r>
-      <w:hyperlink xmlns:r="http://schemas.openxmlformats.org/officeDocument/2006/relationships" w:history="true" r:id="Rab248b4ad58a4a70">
+      <w:hyperlink xmlns:r="http://schemas.openxmlformats.org/officeDocument/2006/relationships" w:history="true" r:id="Rf943b6c59d374cec">
         <w:r>
           <w:rPr>
             <w:rStyle w:val="Hyperlink"/>
@@ -559,7 +559,7 @@
       <w:r>
         <w:t xml:space="preserve">Repeated reference link: </w:t>
       </w:r>
-      <w:hyperlink xmlns:r="http://schemas.openxmlformats.org/officeDocument/2006/relationships" w:history="true" r:id="Rfc2127865f194372">
+      <w:hyperlink xmlns:r="http://schemas.openxmlformats.org/officeDocument/2006/relationships" w:history="true" r:id="Rf2e92d33ab904068">
         <w:r>
           <w:rPr>
             <w:rStyle w:val="Hyperlink"/>
@@ -580,7 +580,7 @@
       <w:r>
         <w:t xml:space="preserve">Autolink URL: </w:t>
       </w:r>
-      <w:hyperlink xmlns:r="http://schemas.openxmlformats.org/officeDocument/2006/relationships" w:history="true" r:id="Ra387dfccb59f4fa7">
+      <w:hyperlink xmlns:r="http://schemas.openxmlformats.org/officeDocument/2006/relationships" w:history="true" r:id="R96d5d7400d724d8c">
         <w:r>
           <w:rPr>
             <w:rStyle w:val="Hyperlink"/>
@@ -601,7 +601,7 @@
       <w:r>
         <w:t xml:space="preserve">Autolink email: </w:t>
       </w:r>
-      <w:hyperlink xmlns:r="http://schemas.openxmlformats.org/officeDocument/2006/relationships" w:history="true" r:id="R5626e91cd92e4590">
+      <w:hyperlink xmlns:r="http://schemas.openxmlformats.org/officeDocument/2006/relationships" w:history="true" r:id="R10c11994f07541f8">
         <w:r>
           <w:rPr>
             <w:rStyle w:val="Hyperlink"/>
@@ -700,7 +700,7 @@
       <w:r>
         <w:t xml:space="preserve">, and </w:t>
       </w:r>
-      <w:hyperlink xmlns:r="http://schemas.openxmlformats.org/officeDocument/2006/relationships" w:history="true" r:id="Re3c45e92723c453b">
+      <w:hyperlink xmlns:r="http://schemas.openxmlformats.org/officeDocument/2006/relationships" w:history="true" r:id="R7f3b7099b85c4e29">
         <w:r>
           <w:rPr>
             <w:rStyle w:val="Hyperlink"/>
@@ -1093,7 +1093,7 @@
       <w:r>
         <w:t xml:space="preserve">Continuation paragraph with </w:t>
       </w:r>
-      <w:hyperlink xmlns:r="http://schemas.openxmlformats.org/officeDocument/2006/relationships" w:history="true" r:id="R01bf534d42f74d5a">
+      <w:hyperlink xmlns:r="http://schemas.openxmlformats.org/officeDocument/2006/relationships" w:history="true" r:id="R730d829ceb624278">
         <w:r>
           <w:rPr>
             <w:rStyle w:val="Hyperlink"/>
@@ -1591,7 +1591,7 @@
       <w:r>
         <w:t xml:space="preserve">, and </w:t>
       </w:r>
-      <w:hyperlink xmlns:r="http://schemas.openxmlformats.org/officeDocument/2006/relationships" w:history="true" r:id="Rd41055d117254a4e">
+      <w:hyperlink xmlns:r="http://schemas.openxmlformats.org/officeDocument/2006/relationships" w:history="true" r:id="R98b0e6ac5f4c4a81">
         <w:r>
           <w:rPr>
             <w:rStyle w:val="Hyperlink"/>
@@ -1979,7 +1979,7 @@
                     <pic:cNvPicPr/>
                   </pic:nvPicPr>
                   <pic:blipFill>
-                    <a:blip xmlns:r="http://schemas.openxmlformats.org/officeDocument/2006/relationships" r:embed="Rc81a5af003b34ed8"/>
+                    <a:blip xmlns:r="http://schemas.openxmlformats.org/officeDocument/2006/relationships" r:embed="R8ff2e74c53c04c14"/>
                     <a:stretch>
                       <a:fillRect/>
                     </a:stretch>
@@ -2039,7 +2039,7 @@
                     <pic:cNvPicPr/>
                   </pic:nvPicPr>
                   <pic:blipFill>
-                    <a:blip xmlns:r="http://schemas.openxmlformats.org/officeDocument/2006/relationships" r:embed="Rd9d4c5058aa84382"/>
+                    <a:blip xmlns:r="http://schemas.openxmlformats.org/officeDocument/2006/relationships" r:embed="R3658cfa341f245f8"/>
                     <a:stretch>
                       <a:fillRect/>
                     </a:stretch>
@@ -2099,7 +2099,7 @@
                     <pic:cNvPicPr/>
                   </pic:nvPicPr>
                   <pic:blipFill>
-                    <a:blip xmlns:r="http://schemas.openxmlformats.org/officeDocument/2006/relationships" r:embed="R0eac8e5ededc4bac"/>
+                    <a:blip xmlns:r="http://schemas.openxmlformats.org/officeDocument/2006/relationships" r:embed="R6fbc91fdc2be43ce"/>
                     <a:stretch>
                       <a:fillRect/>
                     </a:stretch>
@@ -2150,7 +2150,7 @@
                     <pic:cNvPicPr/>
                   </pic:nvPicPr>
                   <pic:blipFill>
-                    <a:blip xmlns:r="http://schemas.openxmlformats.org/officeDocument/2006/relationships" r:embed="R97ea9a2a8eda4001"/>
+                    <a:blip xmlns:r="http://schemas.openxmlformats.org/officeDocument/2006/relationships" r:embed="R3ddd8790190743fb"/>
                     <a:stretch>
                       <a:fillRect/>
                     </a:stretch>
@@ -2201,7 +2201,7 @@
                     <pic:cNvPicPr/>
                   </pic:nvPicPr>
                   <pic:blipFill>
-                    <a:blip xmlns:r="http://schemas.openxmlformats.org/officeDocument/2006/relationships" r:embed="R0950302456a34583"/>
+                    <a:blip xmlns:r="http://schemas.openxmlformats.org/officeDocument/2006/relationships" r:embed="R74c5b3ae7d794b5a"/>
                     <a:stretch>
                       <a:fillRect/>
                     </a:stretch>
@@ -2252,7 +2252,7 @@
                     <pic:cNvPicPr/>
                   </pic:nvPicPr>
                   <pic:blipFill>
-                    <a:blip xmlns:r="http://schemas.openxmlformats.org/officeDocument/2006/relationships" r:embed="R35036ca169de4e4e"/>
+                    <a:blip xmlns:r="http://schemas.openxmlformats.org/officeDocument/2006/relationships" r:embed="Rdbb6b7511b984928"/>
                     <a:stretch>
                       <a:fillRect/>
                     </a:stretch>
@@ -2303,7 +2303,7 @@
                     <pic:cNvPicPr/>
                   </pic:nvPicPr>
                   <pic:blipFill>
-                    <a:blip xmlns:r="http://schemas.openxmlformats.org/officeDocument/2006/relationships" r:embed="R1997d98add244534"/>
+                    <a:blip xmlns:r="http://schemas.openxmlformats.org/officeDocument/2006/relationships" r:embed="R6c2d2dddb9f942cc"/>
                     <a:stretch>
                       <a:fillRect/>
                     </a:stretch>
@@ -2354,7 +2354,7 @@
                     <pic:cNvPicPr/>
                   </pic:nvPicPr>
                   <pic:blipFill>
-                    <a:blip xmlns:r="http://schemas.openxmlformats.org/officeDocument/2006/relationships" r:embed="R97d484e07a77471d"/>
+                    <a:blip xmlns:r="http://schemas.openxmlformats.org/officeDocument/2006/relationships" r:embed="R75d983d07eb34e75"/>
                     <a:stretch>
                       <a:fillRect/>
                     </a:stretch>
@@ -2430,7 +2430,7 @@
                     <pic:cNvPicPr/>
                   </pic:nvPicPr>
                   <pic:blipFill>
-                    <a:blip xmlns:r="http://schemas.openxmlformats.org/officeDocument/2006/relationships" r:embed="Rcc1f98f7292f4b46"/>
+                    <a:blip xmlns:r="http://schemas.openxmlformats.org/officeDocument/2006/relationships" r:embed="R92c72097468a4105"/>
                     <a:stretch>
                       <a:fillRect/>
                     </a:stretch>
@@ -2481,7 +2481,7 @@
                     <pic:cNvPicPr/>
                   </pic:nvPicPr>
                   <pic:blipFill>
-                    <a:blip xmlns:r="http://schemas.openxmlformats.org/officeDocument/2006/relationships" r:embed="R67f68f5b9f88436e"/>
+                    <a:blip xmlns:r="http://schemas.openxmlformats.org/officeDocument/2006/relationships" r:embed="Rb40ebd8d64f44d2a"/>
                     <a:stretch>
                       <a:fillRect/>
                     </a:stretch>
@@ -2532,7 +2532,7 @@
                     <pic:cNvPicPr/>
                   </pic:nvPicPr>
                   <pic:blipFill>
-                    <a:blip xmlns:r="http://schemas.openxmlformats.org/officeDocument/2006/relationships" r:embed="R4a7cb1bce46f4252"/>
+                    <a:blip xmlns:r="http://schemas.openxmlformats.org/officeDocument/2006/relationships" r:embed="Rbfee27196f424af7"/>
                     <a:stretch>
                       <a:fillRect/>
                     </a:stretch>
@@ -2583,7 +2583,7 @@
                     <pic:cNvPicPr/>
                   </pic:nvPicPr>
                   <pic:blipFill>
-                    <a:blip xmlns:r="http://schemas.openxmlformats.org/officeDocument/2006/relationships" r:embed="R9fd5f3c7dbf642ae"/>
+                    <a:blip xmlns:r="http://schemas.openxmlformats.org/officeDocument/2006/relationships" r:embed="R37d4d3d51a0b4304"/>
                     <a:stretch>
                       <a:fillRect/>
                     </a:stretch>
@@ -2659,7 +2659,7 @@
                     <pic:cNvPicPr/>
                   </pic:nvPicPr>
                   <pic:blipFill>
-                    <a:blip xmlns:r="http://schemas.openxmlformats.org/officeDocument/2006/relationships" r:embed="R632599e0c5884de9"/>
+                    <a:blip xmlns:r="http://schemas.openxmlformats.org/officeDocument/2006/relationships" r:embed="R6492f353702f4451"/>
                     <a:stretch>
                       <a:fillRect/>
                     </a:stretch>
@@ -2710,7 +2710,7 @@
                     <pic:cNvPicPr/>
                   </pic:nvPicPr>
                   <pic:blipFill>
-                    <a:blip xmlns:r="http://schemas.openxmlformats.org/officeDocument/2006/relationships" r:embed="Ra6c01fbc8c994727"/>
+                    <a:blip xmlns:r="http://schemas.openxmlformats.org/officeDocument/2006/relationships" r:embed="R10e4128ea0d64965"/>
                     <a:stretch>
                       <a:fillRect/>
                     </a:stretch>
@@ -2761,7 +2761,7 @@
                     <pic:cNvPicPr/>
                   </pic:nvPicPr>
                   <pic:blipFill>
-                    <a:blip xmlns:r="http://schemas.openxmlformats.org/officeDocument/2006/relationships" r:embed="R1376c4d3ce7244fd"/>
+                    <a:blip xmlns:r="http://schemas.openxmlformats.org/officeDocument/2006/relationships" r:embed="R0fe78ab021c240eb"/>
                     <a:stretch>
                       <a:fillRect/>
                     </a:stretch>
@@ -2812,7 +2812,7 @@
                     <pic:cNvPicPr/>
                   </pic:nvPicPr>
                   <pic:blipFill>
-                    <a:blip xmlns:r="http://schemas.openxmlformats.org/officeDocument/2006/relationships" r:embed="R725f3848023c4fe2"/>
+                    <a:blip xmlns:r="http://schemas.openxmlformats.org/officeDocument/2006/relationships" r:embed="R60cbdae370c1459f"/>
                     <a:stretch>
                       <a:fillRect/>
                     </a:stretch>
@@ -2863,7 +2863,7 @@
                     <pic:cNvPicPr/>
                   </pic:nvPicPr>
                   <pic:blipFill>
-                    <a:blip xmlns:r="http://schemas.openxmlformats.org/officeDocument/2006/relationships" r:embed="R3425218c786441b8"/>
+                    <a:blip xmlns:r="http://schemas.openxmlformats.org/officeDocument/2006/relationships" r:embed="R8ce8977671154202"/>
                     <a:stretch>
                       <a:fillRect/>
                     </a:stretch>
@@ -2914,7 +2914,7 @@
                     <pic:cNvPicPr/>
                   </pic:nvPicPr>
                   <pic:blipFill>
-                    <a:blip xmlns:r="http://schemas.openxmlformats.org/officeDocument/2006/relationships" r:embed="R3425beb670b44d93"/>
+                    <a:blip xmlns:r="http://schemas.openxmlformats.org/officeDocument/2006/relationships" r:embed="Rbc51b4eeeae74a47"/>
                     <a:stretch>
                       <a:fillRect/>
                     </a:stretch>
@@ -2965,7 +2965,7 @@
                     <pic:cNvPicPr/>
                   </pic:nvPicPr>
                   <pic:blipFill>
-                    <a:blip xmlns:r="http://schemas.openxmlformats.org/officeDocument/2006/relationships" r:embed="Ra6d783a3688e4099"/>
+                    <a:blip xmlns:r="http://schemas.openxmlformats.org/officeDocument/2006/relationships" r:embed="R6759c3545e9245ce"/>
                     <a:stretch>
                       <a:fillRect/>
                     </a:stretch>
@@ -3016,7 +3016,7 @@
                     <pic:cNvPicPr/>
                   </pic:nvPicPr>
                   <pic:blipFill>
-                    <a:blip xmlns:r="http://schemas.openxmlformats.org/officeDocument/2006/relationships" r:embed="R28714caea34a4741"/>
+                    <a:blip xmlns:r="http://schemas.openxmlformats.org/officeDocument/2006/relationships" r:embed="Rf693267b9ceb489a"/>
                     <a:stretch>
                       <a:fillRect/>
                     </a:stretch>
@@ -3067,7 +3067,7 @@
                     <pic:cNvPicPr/>
                   </pic:nvPicPr>
                   <pic:blipFill>
-                    <a:blip xmlns:r="http://schemas.openxmlformats.org/officeDocument/2006/relationships" r:embed="R5e1af6717d994097"/>
+                    <a:blip xmlns:r="http://schemas.openxmlformats.org/officeDocument/2006/relationships" r:embed="Rb8dfc59f0a4d4dff"/>
                     <a:stretch>
                       <a:fillRect/>
                     </a:stretch>
@@ -3118,7 +3118,7 @@
                     <pic:cNvPicPr/>
                   </pic:nvPicPr>
                   <pic:blipFill>
-                    <a:blip xmlns:r="http://schemas.openxmlformats.org/officeDocument/2006/relationships" r:embed="Re9c4ee8eaa2e4f6b"/>
+                    <a:blip xmlns:r="http://schemas.openxmlformats.org/officeDocument/2006/relationships" r:embed="R2accb40a0ff24db8"/>
                     <a:stretch>
                       <a:fillRect/>
                     </a:stretch>
@@ -3169,7 +3169,7 @@
                     <pic:cNvPicPr/>
                   </pic:nvPicPr>
                   <pic:blipFill>
-                    <a:blip xmlns:r="http://schemas.openxmlformats.org/officeDocument/2006/relationships" r:embed="R13d063a99fd046f1"/>
+                    <a:blip xmlns:r="http://schemas.openxmlformats.org/officeDocument/2006/relationships" r:embed="R7846f2fa4c9d4f3f"/>
                     <a:stretch>
                       <a:fillRect/>
                     </a:stretch>
@@ -3220,7 +3220,7 @@
                     <pic:cNvPicPr/>
                   </pic:nvPicPr>
                   <pic:blipFill>
-                    <a:blip xmlns:r="http://schemas.openxmlformats.org/officeDocument/2006/relationships" r:embed="Ra679db955e334aa7"/>
+                    <a:blip xmlns:r="http://schemas.openxmlformats.org/officeDocument/2006/relationships" r:embed="Re4033895c6364366"/>
                     <a:stretch>
                       <a:fillRect/>
                     </a:stretch>
@@ -3271,7 +3271,7 @@
                     <pic:cNvPicPr/>
                   </pic:nvPicPr>
                   <pic:blipFill>
-                    <a:blip xmlns:r="http://schemas.openxmlformats.org/officeDocument/2006/relationships" r:embed="Rbeb64ff41450438e"/>
+                    <a:blip xmlns:r="http://schemas.openxmlformats.org/officeDocument/2006/relationships" r:embed="R28367860385c4cb9"/>
                     <a:stretch>
                       <a:fillRect/>
                     </a:stretch>
@@ -3322,7 +3322,7 @@
                     <pic:cNvPicPr/>
                   </pic:nvPicPr>
                   <pic:blipFill>
-                    <a:blip xmlns:r="http://schemas.openxmlformats.org/officeDocument/2006/relationships" r:embed="R6f0929314a724a57"/>
+                    <a:blip xmlns:r="http://schemas.openxmlformats.org/officeDocument/2006/relationships" r:embed="R9733e77253b947af"/>
                     <a:stretch>
                       <a:fillRect/>
                     </a:stretch>
@@ -3419,7 +3419,7 @@
                     <pic:cNvPicPr/>
                   </pic:nvPicPr>
                   <pic:blipFill>
-                    <a:blip xmlns:r="http://schemas.openxmlformats.org/officeDocument/2006/relationships" r:embed="R393abbac299f4208"/>
+                    <a:blip xmlns:r="http://schemas.openxmlformats.org/officeDocument/2006/relationships" r:embed="R377349f8b1174c3a"/>
                     <a:stretch>
                       <a:fillRect/>
                     </a:stretch>
@@ -3462,7 +3462,7 @@
                     <pic:cNvPicPr/>
                   </pic:nvPicPr>
                   <pic:blipFill>
-                    <a:blip xmlns:r="http://schemas.openxmlformats.org/officeDocument/2006/relationships" r:embed="R9f33e3194f794f3c"/>
+                    <a:blip xmlns:r="http://schemas.openxmlformats.org/officeDocument/2006/relationships" r:embed="R408e5979e1664598"/>
                     <a:stretch>
                       <a:fillRect/>
                     </a:stretch>
@@ -3505,7 +3505,7 @@
                     <pic:cNvPicPr/>
                   </pic:nvPicPr>
                   <pic:blipFill>
-                    <a:blip xmlns:r="http://schemas.openxmlformats.org/officeDocument/2006/relationships" r:embed="Ra4fb13188a3344a2"/>
+                    <a:blip xmlns:r="http://schemas.openxmlformats.org/officeDocument/2006/relationships" r:embed="R9b79a6c5ff394e0d"/>
                     <a:stretch>
                       <a:fillRect/>
                     </a:stretch>
@@ -3548,7 +3548,7 @@
                     <pic:cNvPicPr/>
                   </pic:nvPicPr>
                   <pic:blipFill>
-                    <a:blip xmlns:r="http://schemas.openxmlformats.org/officeDocument/2006/relationships" r:embed="Rf62f09f325c44203"/>
+                    <a:blip xmlns:r="http://schemas.openxmlformats.org/officeDocument/2006/relationships" r:embed="R5fba947675464783"/>
                     <a:stretch>
                       <a:fillRect/>
                     </a:stretch>
@@ -3933,7 +3933,7 @@
                     <pic:cNvPicPr/>
                   </pic:nvPicPr>
                   <pic:blipFill>
-                    <a:blip xmlns:r="http://schemas.openxmlformats.org/officeDocument/2006/relationships" r:embed="Re4d82157010e4de5"/>
+                    <a:blip xmlns:r="http://schemas.openxmlformats.org/officeDocument/2006/relationships" r:embed="Ra566aa079a874def"/>
                     <a:stretch>
                       <a:fillRect/>
                     </a:stretch>
@@ -4125,7 +4125,7 @@
                     <pic:cNvPicPr/>
                   </pic:nvPicPr>
                   <pic:blipFill>
-                    <a:blip xmlns:r="http://schemas.openxmlformats.org/officeDocument/2006/relationships" r:embed="Rb4b214d3d02145d7"/>
+                    <a:blip xmlns:r="http://schemas.openxmlformats.org/officeDocument/2006/relationships" r:embed="Rfafd7ef12a3c4357"/>
                     <a:stretch>
                       <a:fillRect/>
                     </a:stretch>
@@ -4176,7 +4176,7 @@
                     <pic:cNvPicPr/>
                   </pic:nvPicPr>
                   <pic:blipFill>
-                    <a:blip xmlns:r="http://schemas.openxmlformats.org/officeDocument/2006/relationships" r:embed="Rd0a4ad18cb66433e"/>
+                    <a:blip xmlns:r="http://schemas.openxmlformats.org/officeDocument/2006/relationships" r:embed="R9a369a87f9ba493e"/>
                     <a:stretch>
                       <a:fillRect/>
                     </a:stretch>
@@ -4227,7 +4227,7 @@
                     <pic:cNvPicPr/>
                   </pic:nvPicPr>
                   <pic:blipFill>
-                    <a:blip xmlns:r="http://schemas.openxmlformats.org/officeDocument/2006/relationships" r:embed="Rbcea5061b43e4866"/>
+                    <a:blip xmlns:r="http://schemas.openxmlformats.org/officeDocument/2006/relationships" r:embed="Re79ff366b315484a"/>
                     <a:stretch>
                       <a:fillRect/>
                     </a:stretch>
@@ -4278,7 +4278,7 @@
                     <pic:cNvPicPr/>
                   </pic:nvPicPr>
                   <pic:blipFill>
-                    <a:blip xmlns:r="http://schemas.openxmlformats.org/officeDocument/2006/relationships" r:embed="Rf1621496f41349e6"/>
+                    <a:blip xmlns:r="http://schemas.openxmlformats.org/officeDocument/2006/relationships" r:embed="R01a2ebb07baa4244"/>
                     <a:stretch>
                       <a:fillRect/>
                     </a:stretch>
@@ -4657,7 +4657,7 @@
                     <pic:cNvPicPr/>
                   </pic:nvPicPr>
                   <pic:blipFill>
-                    <a:blip xmlns:r="http://schemas.openxmlformats.org/officeDocument/2006/relationships" r:embed="R9892497ae23240c4"/>
+                    <a:blip xmlns:r="http://schemas.openxmlformats.org/officeDocument/2006/relationships" r:embed="R583c636e05e1440f"/>
                     <a:stretch>
                       <a:fillRect/>
                     </a:stretch>
@@ -5338,7 +5338,7 @@
             <w:r>
               <w:t xml:space="preserve">Cell with </w:t>
             </w:r>
-            <w:hyperlink xmlns:r="http://schemas.openxmlformats.org/officeDocument/2006/relationships" w:history="true" r:id="R4d527cefe45f4b0b">
+            <w:hyperlink xmlns:r="http://schemas.openxmlformats.org/officeDocument/2006/relationships" w:history="true" r:id="Rf5e5be3becf84ab2">
               <w:r>
                 <w:rPr>
                   <w:rStyle w:val="Hyperlink"/>
@@ -5624,7 +5624,7 @@
                           <pic:cNvPicPr/>
                         </pic:nvPicPr>
                         <pic:blipFill>
-                          <a:blip xmlns:r="http://schemas.openxmlformats.org/officeDocument/2006/relationships" r:embed="Rc66c5370b84f4c9e"/>
+                          <a:blip xmlns:r="http://schemas.openxmlformats.org/officeDocument/2006/relationships" r:embed="R65abbc836f154199"/>
                           <a:stretch>
                             <a:fillRect/>
                           </a:stretch>
@@ -5724,7 +5724,7 @@
                     <pic:cNvPicPr/>
                   </pic:nvPicPr>
                   <pic:blipFill>
-                    <a:blip xmlns:r="http://schemas.openxmlformats.org/officeDocument/2006/relationships" r:embed="Rfe75a7295c0e4f76"/>
+                    <a:blip xmlns:r="http://schemas.openxmlformats.org/officeDocument/2006/relationships" r:embed="Rcab79cd7b71842d8"/>
                     <a:stretch>
                       <a:fillRect/>
                     </a:stretch>
@@ -5774,7 +5774,7 @@
                     <pic:cNvPicPr/>
                   </pic:nvPicPr>
                   <pic:blipFill>
-                    <a:blip xmlns:r="http://schemas.openxmlformats.org/officeDocument/2006/relationships" r:embed="R4f30a36642dc43ca"/>
+                    <a:blip xmlns:r="http://schemas.openxmlformats.org/officeDocument/2006/relationships" r:embed="Rb06c9896387d482a"/>
                     <a:stretch>
                       <a:fillRect/>
                     </a:stretch>
@@ -5824,7 +5824,7 @@
                     <pic:cNvPicPr/>
                   </pic:nvPicPr>
                   <pic:blipFill>
-                    <a:blip xmlns:r="http://schemas.openxmlformats.org/officeDocument/2006/relationships" r:embed="R08f14a7b15a74b4d"/>
+                    <a:blip xmlns:r="http://schemas.openxmlformats.org/officeDocument/2006/relationships" r:embed="R819e89efdd384dc2"/>
                     <a:stretch>
                       <a:fillRect/>
                     </a:stretch>

</xml_diff>

<commit_message>
fix(er): cardinality markers via endpoint tangents
Place ER bars/circles/crowfoot using endpoint Bezier tangents and source-of-truth sizes; ignore/remove docx extraction artefacts.

Made-with: Cursor
</commit_message>
<xml_diff>
--- a/test.docx
+++ b/test.docx
@@ -236,7 +236,7 @@
       <w:r>
         <w:t xml:space="preserve">, and </w:t>
       </w:r>
-      <w:hyperlink xmlns:r="http://schemas.openxmlformats.org/officeDocument/2006/relationships" w:history="true" r:id="Ra3b1a744b9d64e41">
+      <w:hyperlink xmlns:r="http://schemas.openxmlformats.org/officeDocument/2006/relationships" w:history="true" r:id="R687506b0c2e748fc">
         <w:r>
           <w:rPr>
             <w:rStyle w:val="Hyperlink"/>
@@ -475,7 +475,7 @@
       <w:r>
         <w:t xml:space="preserve">Direct link: </w:t>
       </w:r>
-      <w:hyperlink xmlns:r="http://schemas.openxmlformats.org/officeDocument/2006/relationships" w:history="true" r:id="R715f53817d724f58">
+      <w:hyperlink xmlns:r="http://schemas.openxmlformats.org/officeDocument/2006/relationships" w:history="true" r:id="R582675b71a4a4ae7">
         <w:r>
           <w:rPr>
             <w:rStyle w:val="Hyperlink"/>
@@ -496,7 +496,7 @@
       <w:r>
         <w:t xml:space="preserve">Direct link with title: </w:t>
       </w:r>
-      <w:hyperlink xmlns:r="http://schemas.openxmlformats.org/officeDocument/2006/relationships" w:history="true" r:id="Rcd2a9f0465e644a2">
+      <w:hyperlink xmlns:r="http://schemas.openxmlformats.org/officeDocument/2006/relationships" w:history="true" r:id="Rf234657b7a6849f1">
         <w:r>
           <w:rPr>
             <w:rStyle w:val="Hyperlink"/>
@@ -517,7 +517,7 @@
       <w:r>
         <w:t xml:space="preserve">Reference-style link: </w:t>
       </w:r>
-      <w:hyperlink xmlns:r="http://schemas.openxmlformats.org/officeDocument/2006/relationships" w:history="true" r:id="Rde916c54aa9e4fa0">
+      <w:hyperlink xmlns:r="http://schemas.openxmlformats.org/officeDocument/2006/relationships" w:history="true" r:id="Ra35f15fd74f14664">
         <w:r>
           <w:rPr>
             <w:rStyle w:val="Hyperlink"/>
@@ -538,7 +538,7 @@
       <w:r>
         <w:t xml:space="preserve">Collapsed reference link: </w:t>
       </w:r>
-      <w:hyperlink xmlns:r="http://schemas.openxmlformats.org/officeDocument/2006/relationships" w:history="true" r:id="Rf943b6c59d374cec">
+      <w:hyperlink xmlns:r="http://schemas.openxmlformats.org/officeDocument/2006/relationships" w:history="true" r:id="R34dc5acd9ead44aa">
         <w:r>
           <w:rPr>
             <w:rStyle w:val="Hyperlink"/>
@@ -559,7 +559,7 @@
       <w:r>
         <w:t xml:space="preserve">Repeated reference link: </w:t>
       </w:r>
-      <w:hyperlink xmlns:r="http://schemas.openxmlformats.org/officeDocument/2006/relationships" w:history="true" r:id="Rf2e92d33ab904068">
+      <w:hyperlink xmlns:r="http://schemas.openxmlformats.org/officeDocument/2006/relationships" w:history="true" r:id="R1cf30fed24cc42bb">
         <w:r>
           <w:rPr>
             <w:rStyle w:val="Hyperlink"/>
@@ -580,7 +580,7 @@
       <w:r>
         <w:t xml:space="preserve">Autolink URL: </w:t>
       </w:r>
-      <w:hyperlink xmlns:r="http://schemas.openxmlformats.org/officeDocument/2006/relationships" w:history="true" r:id="R96d5d7400d724d8c">
+      <w:hyperlink xmlns:r="http://schemas.openxmlformats.org/officeDocument/2006/relationships" w:history="true" r:id="R5096b33a45b74a47">
         <w:r>
           <w:rPr>
             <w:rStyle w:val="Hyperlink"/>
@@ -601,7 +601,7 @@
       <w:r>
         <w:t xml:space="preserve">Autolink email: </w:t>
       </w:r>
-      <w:hyperlink xmlns:r="http://schemas.openxmlformats.org/officeDocument/2006/relationships" w:history="true" r:id="R10c11994f07541f8">
+      <w:hyperlink xmlns:r="http://schemas.openxmlformats.org/officeDocument/2006/relationships" w:history="true" r:id="Rb032703b5ce24884">
         <w:r>
           <w:rPr>
             <w:rStyle w:val="Hyperlink"/>
@@ -700,7 +700,7 @@
       <w:r>
         <w:t xml:space="preserve">, and </w:t>
       </w:r>
-      <w:hyperlink xmlns:r="http://schemas.openxmlformats.org/officeDocument/2006/relationships" w:history="true" r:id="R7f3b7099b85c4e29">
+      <w:hyperlink xmlns:r="http://schemas.openxmlformats.org/officeDocument/2006/relationships" w:history="true" r:id="Rc7be7708b8c94b3d">
         <w:r>
           <w:rPr>
             <w:rStyle w:val="Hyperlink"/>
@@ -1093,7 +1093,7 @@
       <w:r>
         <w:t xml:space="preserve">Continuation paragraph with </w:t>
       </w:r>
-      <w:hyperlink xmlns:r="http://schemas.openxmlformats.org/officeDocument/2006/relationships" w:history="true" r:id="R730d829ceb624278">
+      <w:hyperlink xmlns:r="http://schemas.openxmlformats.org/officeDocument/2006/relationships" w:history="true" r:id="R505a040f71004862">
         <w:r>
           <w:rPr>
             <w:rStyle w:val="Hyperlink"/>
@@ -1591,7 +1591,7 @@
       <w:r>
         <w:t xml:space="preserve">, and </w:t>
       </w:r>
-      <w:hyperlink xmlns:r="http://schemas.openxmlformats.org/officeDocument/2006/relationships" w:history="true" r:id="R98b0e6ac5f4c4a81">
+      <w:hyperlink xmlns:r="http://schemas.openxmlformats.org/officeDocument/2006/relationships" w:history="true" r:id="R64e401b3d14e4c89">
         <w:r>
           <w:rPr>
             <w:rStyle w:val="Hyperlink"/>
@@ -1979,7 +1979,7 @@
                     <pic:cNvPicPr/>
                   </pic:nvPicPr>
                   <pic:blipFill>
-                    <a:blip xmlns:r="http://schemas.openxmlformats.org/officeDocument/2006/relationships" r:embed="R8ff2e74c53c04c14"/>
+                    <a:blip xmlns:r="http://schemas.openxmlformats.org/officeDocument/2006/relationships" r:embed="Rf93aad14c0c345d2"/>
                     <a:stretch>
                       <a:fillRect/>
                     </a:stretch>
@@ -2039,7 +2039,7 @@
                     <pic:cNvPicPr/>
                   </pic:nvPicPr>
                   <pic:blipFill>
-                    <a:blip xmlns:r="http://schemas.openxmlformats.org/officeDocument/2006/relationships" r:embed="R3658cfa341f245f8"/>
+                    <a:blip xmlns:r="http://schemas.openxmlformats.org/officeDocument/2006/relationships" r:embed="R1beebb02a0104640"/>
                     <a:stretch>
                       <a:fillRect/>
                     </a:stretch>
@@ -2099,7 +2099,7 @@
                     <pic:cNvPicPr/>
                   </pic:nvPicPr>
                   <pic:blipFill>
-                    <a:blip xmlns:r="http://schemas.openxmlformats.org/officeDocument/2006/relationships" r:embed="R6fbc91fdc2be43ce"/>
+                    <a:blip xmlns:r="http://schemas.openxmlformats.org/officeDocument/2006/relationships" r:embed="Rb5f8191f6f8c4d4c"/>
                     <a:stretch>
                       <a:fillRect/>
                     </a:stretch>
@@ -2150,7 +2150,7 @@
                     <pic:cNvPicPr/>
                   </pic:nvPicPr>
                   <pic:blipFill>
-                    <a:blip xmlns:r="http://schemas.openxmlformats.org/officeDocument/2006/relationships" r:embed="R3ddd8790190743fb"/>
+                    <a:blip xmlns:r="http://schemas.openxmlformats.org/officeDocument/2006/relationships" r:embed="Re8c9e7f257c64403"/>
                     <a:stretch>
                       <a:fillRect/>
                     </a:stretch>
@@ -2201,7 +2201,7 @@
                     <pic:cNvPicPr/>
                   </pic:nvPicPr>
                   <pic:blipFill>
-                    <a:blip xmlns:r="http://schemas.openxmlformats.org/officeDocument/2006/relationships" r:embed="R74c5b3ae7d794b5a"/>
+                    <a:blip xmlns:r="http://schemas.openxmlformats.org/officeDocument/2006/relationships" r:embed="R2f5f873d6f974042"/>
                     <a:stretch>
                       <a:fillRect/>
                     </a:stretch>
@@ -2252,7 +2252,7 @@
                     <pic:cNvPicPr/>
                   </pic:nvPicPr>
                   <pic:blipFill>
-                    <a:blip xmlns:r="http://schemas.openxmlformats.org/officeDocument/2006/relationships" r:embed="Rdbb6b7511b984928"/>
+                    <a:blip xmlns:r="http://schemas.openxmlformats.org/officeDocument/2006/relationships" r:embed="Rb43dcbab2c474cd0"/>
                     <a:stretch>
                       <a:fillRect/>
                     </a:stretch>
@@ -2303,7 +2303,7 @@
                     <pic:cNvPicPr/>
                   </pic:nvPicPr>
                   <pic:blipFill>
-                    <a:blip xmlns:r="http://schemas.openxmlformats.org/officeDocument/2006/relationships" r:embed="R6c2d2dddb9f942cc"/>
+                    <a:blip xmlns:r="http://schemas.openxmlformats.org/officeDocument/2006/relationships" r:embed="R09d84449940c4891"/>
                     <a:stretch>
                       <a:fillRect/>
                     </a:stretch>
@@ -2354,7 +2354,7 @@
                     <pic:cNvPicPr/>
                   </pic:nvPicPr>
                   <pic:blipFill>
-                    <a:blip xmlns:r="http://schemas.openxmlformats.org/officeDocument/2006/relationships" r:embed="R75d983d07eb34e75"/>
+                    <a:blip xmlns:r="http://schemas.openxmlformats.org/officeDocument/2006/relationships" r:embed="Rb59ce6cabdbf4b49"/>
                     <a:stretch>
                       <a:fillRect/>
                     </a:stretch>
@@ -2430,7 +2430,7 @@
                     <pic:cNvPicPr/>
                   </pic:nvPicPr>
                   <pic:blipFill>
-                    <a:blip xmlns:r="http://schemas.openxmlformats.org/officeDocument/2006/relationships" r:embed="R92c72097468a4105"/>
+                    <a:blip xmlns:r="http://schemas.openxmlformats.org/officeDocument/2006/relationships" r:embed="Rb65f5bdc9ef84875"/>
                     <a:stretch>
                       <a:fillRect/>
                     </a:stretch>
@@ -2481,7 +2481,7 @@
                     <pic:cNvPicPr/>
                   </pic:nvPicPr>
                   <pic:blipFill>
-                    <a:blip xmlns:r="http://schemas.openxmlformats.org/officeDocument/2006/relationships" r:embed="Rb40ebd8d64f44d2a"/>
+                    <a:blip xmlns:r="http://schemas.openxmlformats.org/officeDocument/2006/relationships" r:embed="R0ba0e7130bf94696"/>
                     <a:stretch>
                       <a:fillRect/>
                     </a:stretch>
@@ -2532,7 +2532,7 @@
                     <pic:cNvPicPr/>
                   </pic:nvPicPr>
                   <pic:blipFill>
-                    <a:blip xmlns:r="http://schemas.openxmlformats.org/officeDocument/2006/relationships" r:embed="Rbfee27196f424af7"/>
+                    <a:blip xmlns:r="http://schemas.openxmlformats.org/officeDocument/2006/relationships" r:embed="R1819967925e4488e"/>
                     <a:stretch>
                       <a:fillRect/>
                     </a:stretch>
@@ -2583,7 +2583,7 @@
                     <pic:cNvPicPr/>
                   </pic:nvPicPr>
                   <pic:blipFill>
-                    <a:blip xmlns:r="http://schemas.openxmlformats.org/officeDocument/2006/relationships" r:embed="R37d4d3d51a0b4304"/>
+                    <a:blip xmlns:r="http://schemas.openxmlformats.org/officeDocument/2006/relationships" r:embed="R096fd2b1ce524c66"/>
                     <a:stretch>
                       <a:fillRect/>
                     </a:stretch>
@@ -2659,7 +2659,7 @@
                     <pic:cNvPicPr/>
                   </pic:nvPicPr>
                   <pic:blipFill>
-                    <a:blip xmlns:r="http://schemas.openxmlformats.org/officeDocument/2006/relationships" r:embed="R6492f353702f4451"/>
+                    <a:blip xmlns:r="http://schemas.openxmlformats.org/officeDocument/2006/relationships" r:embed="Rb712dea1442e4270"/>
                     <a:stretch>
                       <a:fillRect/>
                     </a:stretch>
@@ -2710,7 +2710,7 @@
                     <pic:cNvPicPr/>
                   </pic:nvPicPr>
                   <pic:blipFill>
-                    <a:blip xmlns:r="http://schemas.openxmlformats.org/officeDocument/2006/relationships" r:embed="R10e4128ea0d64965"/>
+                    <a:blip xmlns:r="http://schemas.openxmlformats.org/officeDocument/2006/relationships" r:embed="Rb7d99f3e2d3b4fd7"/>
                     <a:stretch>
                       <a:fillRect/>
                     </a:stretch>
@@ -2761,7 +2761,7 @@
                     <pic:cNvPicPr/>
                   </pic:nvPicPr>
                   <pic:blipFill>
-                    <a:blip xmlns:r="http://schemas.openxmlformats.org/officeDocument/2006/relationships" r:embed="R0fe78ab021c240eb"/>
+                    <a:blip xmlns:r="http://schemas.openxmlformats.org/officeDocument/2006/relationships" r:embed="R67c062543b5f412a"/>
                     <a:stretch>
                       <a:fillRect/>
                     </a:stretch>
@@ -2812,7 +2812,7 @@
                     <pic:cNvPicPr/>
                   </pic:nvPicPr>
                   <pic:blipFill>
-                    <a:blip xmlns:r="http://schemas.openxmlformats.org/officeDocument/2006/relationships" r:embed="R60cbdae370c1459f"/>
+                    <a:blip xmlns:r="http://schemas.openxmlformats.org/officeDocument/2006/relationships" r:embed="R9b0669cd044e4c91"/>
                     <a:stretch>
                       <a:fillRect/>
                     </a:stretch>
@@ -2863,7 +2863,7 @@
                     <pic:cNvPicPr/>
                   </pic:nvPicPr>
                   <pic:blipFill>
-                    <a:blip xmlns:r="http://schemas.openxmlformats.org/officeDocument/2006/relationships" r:embed="R8ce8977671154202"/>
+                    <a:blip xmlns:r="http://schemas.openxmlformats.org/officeDocument/2006/relationships" r:embed="R32e7e29efbf14c02"/>
                     <a:stretch>
                       <a:fillRect/>
                     </a:stretch>
@@ -2914,7 +2914,7 @@
                     <pic:cNvPicPr/>
                   </pic:nvPicPr>
                   <pic:blipFill>
-                    <a:blip xmlns:r="http://schemas.openxmlformats.org/officeDocument/2006/relationships" r:embed="Rbc51b4eeeae74a47"/>
+                    <a:blip xmlns:r="http://schemas.openxmlformats.org/officeDocument/2006/relationships" r:embed="Rf74e8561dac04d76"/>
                     <a:stretch>
                       <a:fillRect/>
                     </a:stretch>
@@ -2965,7 +2965,7 @@
                     <pic:cNvPicPr/>
                   </pic:nvPicPr>
                   <pic:blipFill>
-                    <a:blip xmlns:r="http://schemas.openxmlformats.org/officeDocument/2006/relationships" r:embed="R6759c3545e9245ce"/>
+                    <a:blip xmlns:r="http://schemas.openxmlformats.org/officeDocument/2006/relationships" r:embed="R611caec77489478a"/>
                     <a:stretch>
                       <a:fillRect/>
                     </a:stretch>
@@ -3016,7 +3016,7 @@
                     <pic:cNvPicPr/>
                   </pic:nvPicPr>
                   <pic:blipFill>
-                    <a:blip xmlns:r="http://schemas.openxmlformats.org/officeDocument/2006/relationships" r:embed="Rf693267b9ceb489a"/>
+                    <a:blip xmlns:r="http://schemas.openxmlformats.org/officeDocument/2006/relationships" r:embed="Rf2e8f3a1d872462a"/>
                     <a:stretch>
                       <a:fillRect/>
                     </a:stretch>
@@ -3067,7 +3067,7 @@
                     <pic:cNvPicPr/>
                   </pic:nvPicPr>
                   <pic:blipFill>
-                    <a:blip xmlns:r="http://schemas.openxmlformats.org/officeDocument/2006/relationships" r:embed="Rb8dfc59f0a4d4dff"/>
+                    <a:blip xmlns:r="http://schemas.openxmlformats.org/officeDocument/2006/relationships" r:embed="Rd89e8e73a9d74333"/>
                     <a:stretch>
                       <a:fillRect/>
                     </a:stretch>
@@ -3118,7 +3118,7 @@
                     <pic:cNvPicPr/>
                   </pic:nvPicPr>
                   <pic:blipFill>
-                    <a:blip xmlns:r="http://schemas.openxmlformats.org/officeDocument/2006/relationships" r:embed="R2accb40a0ff24db8"/>
+                    <a:blip xmlns:r="http://schemas.openxmlformats.org/officeDocument/2006/relationships" r:embed="R6a748cea102e4f0a"/>
                     <a:stretch>
                       <a:fillRect/>
                     </a:stretch>
@@ -3169,7 +3169,7 @@
                     <pic:cNvPicPr/>
                   </pic:nvPicPr>
                   <pic:blipFill>
-                    <a:blip xmlns:r="http://schemas.openxmlformats.org/officeDocument/2006/relationships" r:embed="R7846f2fa4c9d4f3f"/>
+                    <a:blip xmlns:r="http://schemas.openxmlformats.org/officeDocument/2006/relationships" r:embed="R1f847729e14b4b95"/>
                     <a:stretch>
                       <a:fillRect/>
                     </a:stretch>
@@ -3220,7 +3220,7 @@
                     <pic:cNvPicPr/>
                   </pic:nvPicPr>
                   <pic:blipFill>
-                    <a:blip xmlns:r="http://schemas.openxmlformats.org/officeDocument/2006/relationships" r:embed="Re4033895c6364366"/>
+                    <a:blip xmlns:r="http://schemas.openxmlformats.org/officeDocument/2006/relationships" r:embed="R7b64957ae6cd44be"/>
                     <a:stretch>
                       <a:fillRect/>
                     </a:stretch>
@@ -3271,7 +3271,7 @@
                     <pic:cNvPicPr/>
                   </pic:nvPicPr>
                   <pic:blipFill>
-                    <a:blip xmlns:r="http://schemas.openxmlformats.org/officeDocument/2006/relationships" r:embed="R28367860385c4cb9"/>
+                    <a:blip xmlns:r="http://schemas.openxmlformats.org/officeDocument/2006/relationships" r:embed="R20e1d518e86f4e86"/>
                     <a:stretch>
                       <a:fillRect/>
                     </a:stretch>
@@ -3322,7 +3322,7 @@
                     <pic:cNvPicPr/>
                   </pic:nvPicPr>
                   <pic:blipFill>
-                    <a:blip xmlns:r="http://schemas.openxmlformats.org/officeDocument/2006/relationships" r:embed="R9733e77253b947af"/>
+                    <a:blip xmlns:r="http://schemas.openxmlformats.org/officeDocument/2006/relationships" r:embed="R694267b644e14ffc"/>
                     <a:stretch>
                       <a:fillRect/>
                     </a:stretch>
@@ -3419,7 +3419,7 @@
                     <pic:cNvPicPr/>
                   </pic:nvPicPr>
                   <pic:blipFill>
-                    <a:blip xmlns:r="http://schemas.openxmlformats.org/officeDocument/2006/relationships" r:embed="R377349f8b1174c3a"/>
+                    <a:blip xmlns:r="http://schemas.openxmlformats.org/officeDocument/2006/relationships" r:embed="Rf4ee8fd35efd4120"/>
                     <a:stretch>
                       <a:fillRect/>
                     </a:stretch>
@@ -3462,7 +3462,7 @@
                     <pic:cNvPicPr/>
                   </pic:nvPicPr>
                   <pic:blipFill>
-                    <a:blip xmlns:r="http://schemas.openxmlformats.org/officeDocument/2006/relationships" r:embed="R408e5979e1664598"/>
+                    <a:blip xmlns:r="http://schemas.openxmlformats.org/officeDocument/2006/relationships" r:embed="Rbf558af78dd641d9"/>
                     <a:stretch>
                       <a:fillRect/>
                     </a:stretch>
@@ -3505,7 +3505,7 @@
                     <pic:cNvPicPr/>
                   </pic:nvPicPr>
                   <pic:blipFill>
-                    <a:blip xmlns:r="http://schemas.openxmlformats.org/officeDocument/2006/relationships" r:embed="R9b79a6c5ff394e0d"/>
+                    <a:blip xmlns:r="http://schemas.openxmlformats.org/officeDocument/2006/relationships" r:embed="R2ed641087bce4d0b"/>
                     <a:stretch>
                       <a:fillRect/>
                     </a:stretch>
@@ -3548,7 +3548,7 @@
                     <pic:cNvPicPr/>
                   </pic:nvPicPr>
                   <pic:blipFill>
-                    <a:blip xmlns:r="http://schemas.openxmlformats.org/officeDocument/2006/relationships" r:embed="R5fba947675464783"/>
+                    <a:blip xmlns:r="http://schemas.openxmlformats.org/officeDocument/2006/relationships" r:embed="Rdc6566f1e3d14063"/>
                     <a:stretch>
                       <a:fillRect/>
                     </a:stretch>
@@ -3933,7 +3933,7 @@
                     <pic:cNvPicPr/>
                   </pic:nvPicPr>
                   <pic:blipFill>
-                    <a:blip xmlns:r="http://schemas.openxmlformats.org/officeDocument/2006/relationships" r:embed="Ra566aa079a874def"/>
+                    <a:blip xmlns:r="http://schemas.openxmlformats.org/officeDocument/2006/relationships" r:embed="Rdd7b36af6c304d31"/>
                     <a:stretch>
                       <a:fillRect/>
                     </a:stretch>
@@ -4125,7 +4125,7 @@
                     <pic:cNvPicPr/>
                   </pic:nvPicPr>
                   <pic:blipFill>
-                    <a:blip xmlns:r="http://schemas.openxmlformats.org/officeDocument/2006/relationships" r:embed="Rfafd7ef12a3c4357"/>
+                    <a:blip xmlns:r="http://schemas.openxmlformats.org/officeDocument/2006/relationships" r:embed="R460dcd6439374548"/>
                     <a:stretch>
                       <a:fillRect/>
                     </a:stretch>
@@ -4176,7 +4176,7 @@
                     <pic:cNvPicPr/>
                   </pic:nvPicPr>
                   <pic:blipFill>
-                    <a:blip xmlns:r="http://schemas.openxmlformats.org/officeDocument/2006/relationships" r:embed="R9a369a87f9ba493e"/>
+                    <a:blip xmlns:r="http://schemas.openxmlformats.org/officeDocument/2006/relationships" r:embed="Rfdd9b4c4a38a4965"/>
                     <a:stretch>
                       <a:fillRect/>
                     </a:stretch>
@@ -4227,7 +4227,7 @@
                     <pic:cNvPicPr/>
                   </pic:nvPicPr>
                   <pic:blipFill>
-                    <a:blip xmlns:r="http://schemas.openxmlformats.org/officeDocument/2006/relationships" r:embed="Re79ff366b315484a"/>
+                    <a:blip xmlns:r="http://schemas.openxmlformats.org/officeDocument/2006/relationships" r:embed="Rc9a01ae2f55241ee"/>
                     <a:stretch>
                       <a:fillRect/>
                     </a:stretch>
@@ -4278,7 +4278,7 @@
                     <pic:cNvPicPr/>
                   </pic:nvPicPr>
                   <pic:blipFill>
-                    <a:blip xmlns:r="http://schemas.openxmlformats.org/officeDocument/2006/relationships" r:embed="R01a2ebb07baa4244"/>
+                    <a:blip xmlns:r="http://schemas.openxmlformats.org/officeDocument/2006/relationships" r:embed="Rcb25b4997b2844ea"/>
                     <a:stretch>
                       <a:fillRect/>
                     </a:stretch>
@@ -4657,7 +4657,7 @@
                     <pic:cNvPicPr/>
                   </pic:nvPicPr>
                   <pic:blipFill>
-                    <a:blip xmlns:r="http://schemas.openxmlformats.org/officeDocument/2006/relationships" r:embed="R583c636e05e1440f"/>
+                    <a:blip xmlns:r="http://schemas.openxmlformats.org/officeDocument/2006/relationships" r:embed="R980b2fc83bb84520"/>
                     <a:stretch>
                       <a:fillRect/>
                     </a:stretch>
@@ -5338,7 +5338,7 @@
             <w:r>
               <w:t xml:space="preserve">Cell with </w:t>
             </w:r>
-            <w:hyperlink xmlns:r="http://schemas.openxmlformats.org/officeDocument/2006/relationships" w:history="true" r:id="Rf5e5be3becf84ab2">
+            <w:hyperlink xmlns:r="http://schemas.openxmlformats.org/officeDocument/2006/relationships" w:history="true" r:id="R4f5cb07e91584bc9">
               <w:r>
                 <w:rPr>
                   <w:rStyle w:val="Hyperlink"/>
@@ -5624,7 +5624,7 @@
                           <pic:cNvPicPr/>
                         </pic:nvPicPr>
                         <pic:blipFill>
-                          <a:blip xmlns:r="http://schemas.openxmlformats.org/officeDocument/2006/relationships" r:embed="R65abbc836f154199"/>
+                          <a:blip xmlns:r="http://schemas.openxmlformats.org/officeDocument/2006/relationships" r:embed="R55b61de450b747c9"/>
                           <a:stretch>
                             <a:fillRect/>
                           </a:stretch>
@@ -5724,7 +5724,7 @@
                     <pic:cNvPicPr/>
                   </pic:nvPicPr>
                   <pic:blipFill>
-                    <a:blip xmlns:r="http://schemas.openxmlformats.org/officeDocument/2006/relationships" r:embed="Rcab79cd7b71842d8"/>
+                    <a:blip xmlns:r="http://schemas.openxmlformats.org/officeDocument/2006/relationships" r:embed="R5b2c755958b94a6e"/>
                     <a:stretch>
                       <a:fillRect/>
                     </a:stretch>
@@ -5774,7 +5774,7 @@
                     <pic:cNvPicPr/>
                   </pic:nvPicPr>
                   <pic:blipFill>
-                    <a:blip xmlns:r="http://schemas.openxmlformats.org/officeDocument/2006/relationships" r:embed="Rb06c9896387d482a"/>
+                    <a:blip xmlns:r="http://schemas.openxmlformats.org/officeDocument/2006/relationships" r:embed="Red00a82d1bce453d"/>
                     <a:stretch>
                       <a:fillRect/>
                     </a:stretch>
@@ -5824,7 +5824,7 @@
                     <pic:cNvPicPr/>
                   </pic:nvPicPr>
                   <pic:blipFill>
-                    <a:blip xmlns:r="http://schemas.openxmlformats.org/officeDocument/2006/relationships" r:embed="R819e89efdd384dc2"/>
+                    <a:blip xmlns:r="http://schemas.openxmlformats.org/officeDocument/2006/relationships" r:embed="Re4d12fe7547248c2"/>
                     <a:stretch>
                       <a:fillRect/>
                     </a:stretch>

</xml_diff>

<commit_message>
fix(er): adjust two-parent anchors and curved crowfoot
Route two-parent Up-facing hubs into L1/R1 shoulder anchors and render crowfoot toes as longer quadratic curves to match Mermaid appearance.

Made-with: Cursor
</commit_message>
<xml_diff>
--- a/test.docx
+++ b/test.docx
@@ -236,7 +236,7 @@
       <w:r>
         <w:t xml:space="preserve">, and </w:t>
       </w:r>
-      <w:hyperlink xmlns:r="http://schemas.openxmlformats.org/officeDocument/2006/relationships" w:history="true" r:id="R687506b0c2e748fc">
+      <w:hyperlink xmlns:r="http://schemas.openxmlformats.org/officeDocument/2006/relationships" w:history="true" r:id="R75e02882c9fe472e">
         <w:r>
           <w:rPr>
             <w:rStyle w:val="Hyperlink"/>
@@ -475,7 +475,7 @@
       <w:r>
         <w:t xml:space="preserve">Direct link: </w:t>
       </w:r>
-      <w:hyperlink xmlns:r="http://schemas.openxmlformats.org/officeDocument/2006/relationships" w:history="true" r:id="R582675b71a4a4ae7">
+      <w:hyperlink xmlns:r="http://schemas.openxmlformats.org/officeDocument/2006/relationships" w:history="true" r:id="R91bb9873dfee4c45">
         <w:r>
           <w:rPr>
             <w:rStyle w:val="Hyperlink"/>
@@ -496,7 +496,7 @@
       <w:r>
         <w:t xml:space="preserve">Direct link with title: </w:t>
       </w:r>
-      <w:hyperlink xmlns:r="http://schemas.openxmlformats.org/officeDocument/2006/relationships" w:history="true" r:id="Rf234657b7a6849f1">
+      <w:hyperlink xmlns:r="http://schemas.openxmlformats.org/officeDocument/2006/relationships" w:history="true" r:id="R68193a086ced48ef">
         <w:r>
           <w:rPr>
             <w:rStyle w:val="Hyperlink"/>
@@ -517,7 +517,7 @@
       <w:r>
         <w:t xml:space="preserve">Reference-style link: </w:t>
       </w:r>
-      <w:hyperlink xmlns:r="http://schemas.openxmlformats.org/officeDocument/2006/relationships" w:history="true" r:id="Ra35f15fd74f14664">
+      <w:hyperlink xmlns:r="http://schemas.openxmlformats.org/officeDocument/2006/relationships" w:history="true" r:id="R9751a346539c4584">
         <w:r>
           <w:rPr>
             <w:rStyle w:val="Hyperlink"/>
@@ -538,7 +538,7 @@
       <w:r>
         <w:t xml:space="preserve">Collapsed reference link: </w:t>
       </w:r>
-      <w:hyperlink xmlns:r="http://schemas.openxmlformats.org/officeDocument/2006/relationships" w:history="true" r:id="R34dc5acd9ead44aa">
+      <w:hyperlink xmlns:r="http://schemas.openxmlformats.org/officeDocument/2006/relationships" w:history="true" r:id="Re064e6bf9505414b">
         <w:r>
           <w:rPr>
             <w:rStyle w:val="Hyperlink"/>
@@ -559,7 +559,7 @@
       <w:r>
         <w:t xml:space="preserve">Repeated reference link: </w:t>
       </w:r>
-      <w:hyperlink xmlns:r="http://schemas.openxmlformats.org/officeDocument/2006/relationships" w:history="true" r:id="R1cf30fed24cc42bb">
+      <w:hyperlink xmlns:r="http://schemas.openxmlformats.org/officeDocument/2006/relationships" w:history="true" r:id="Ra4ba58d12b254ba6">
         <w:r>
           <w:rPr>
             <w:rStyle w:val="Hyperlink"/>
@@ -580,7 +580,7 @@
       <w:r>
         <w:t xml:space="preserve">Autolink URL: </w:t>
       </w:r>
-      <w:hyperlink xmlns:r="http://schemas.openxmlformats.org/officeDocument/2006/relationships" w:history="true" r:id="R5096b33a45b74a47">
+      <w:hyperlink xmlns:r="http://schemas.openxmlformats.org/officeDocument/2006/relationships" w:history="true" r:id="R627bcc89eb0c429c">
         <w:r>
           <w:rPr>
             <w:rStyle w:val="Hyperlink"/>
@@ -601,7 +601,7 @@
       <w:r>
         <w:t xml:space="preserve">Autolink email: </w:t>
       </w:r>
-      <w:hyperlink xmlns:r="http://schemas.openxmlformats.org/officeDocument/2006/relationships" w:history="true" r:id="Rb032703b5ce24884">
+      <w:hyperlink xmlns:r="http://schemas.openxmlformats.org/officeDocument/2006/relationships" w:history="true" r:id="Rb3abb6f0ec3941c8">
         <w:r>
           <w:rPr>
             <w:rStyle w:val="Hyperlink"/>
@@ -700,7 +700,7 @@
       <w:r>
         <w:t xml:space="preserve">, and </w:t>
       </w:r>
-      <w:hyperlink xmlns:r="http://schemas.openxmlformats.org/officeDocument/2006/relationships" w:history="true" r:id="Rc7be7708b8c94b3d">
+      <w:hyperlink xmlns:r="http://schemas.openxmlformats.org/officeDocument/2006/relationships" w:history="true" r:id="R074185d0303a49af">
         <w:r>
           <w:rPr>
             <w:rStyle w:val="Hyperlink"/>
@@ -1093,7 +1093,7 @@
       <w:r>
         <w:t xml:space="preserve">Continuation paragraph with </w:t>
       </w:r>
-      <w:hyperlink xmlns:r="http://schemas.openxmlformats.org/officeDocument/2006/relationships" w:history="true" r:id="R505a040f71004862">
+      <w:hyperlink xmlns:r="http://schemas.openxmlformats.org/officeDocument/2006/relationships" w:history="true" r:id="Re9a1e35b140b48ff">
         <w:r>
           <w:rPr>
             <w:rStyle w:val="Hyperlink"/>
@@ -1591,7 +1591,7 @@
       <w:r>
         <w:t xml:space="preserve">, and </w:t>
       </w:r>
-      <w:hyperlink xmlns:r="http://schemas.openxmlformats.org/officeDocument/2006/relationships" w:history="true" r:id="R64e401b3d14e4c89">
+      <w:hyperlink xmlns:r="http://schemas.openxmlformats.org/officeDocument/2006/relationships" w:history="true" r:id="R78e9149b7a6c4b64">
         <w:r>
           <w:rPr>
             <w:rStyle w:val="Hyperlink"/>
@@ -1979,7 +1979,7 @@
                     <pic:cNvPicPr/>
                   </pic:nvPicPr>
                   <pic:blipFill>
-                    <a:blip xmlns:r="http://schemas.openxmlformats.org/officeDocument/2006/relationships" r:embed="Rf93aad14c0c345d2"/>
+                    <a:blip xmlns:r="http://schemas.openxmlformats.org/officeDocument/2006/relationships" r:embed="R18571033fe594c27"/>
                     <a:stretch>
                       <a:fillRect/>
                     </a:stretch>
@@ -2039,7 +2039,7 @@
                     <pic:cNvPicPr/>
                   </pic:nvPicPr>
                   <pic:blipFill>
-                    <a:blip xmlns:r="http://schemas.openxmlformats.org/officeDocument/2006/relationships" r:embed="R1beebb02a0104640"/>
+                    <a:blip xmlns:r="http://schemas.openxmlformats.org/officeDocument/2006/relationships" r:embed="R9ad1a877f27545d7"/>
                     <a:stretch>
                       <a:fillRect/>
                     </a:stretch>
@@ -2099,7 +2099,7 @@
                     <pic:cNvPicPr/>
                   </pic:nvPicPr>
                   <pic:blipFill>
-                    <a:blip xmlns:r="http://schemas.openxmlformats.org/officeDocument/2006/relationships" r:embed="Rb5f8191f6f8c4d4c"/>
+                    <a:blip xmlns:r="http://schemas.openxmlformats.org/officeDocument/2006/relationships" r:embed="Re168ba51c1dc45e7"/>
                     <a:stretch>
                       <a:fillRect/>
                     </a:stretch>
@@ -2150,7 +2150,7 @@
                     <pic:cNvPicPr/>
                   </pic:nvPicPr>
                   <pic:blipFill>
-                    <a:blip xmlns:r="http://schemas.openxmlformats.org/officeDocument/2006/relationships" r:embed="Re8c9e7f257c64403"/>
+                    <a:blip xmlns:r="http://schemas.openxmlformats.org/officeDocument/2006/relationships" r:embed="Rb030568b7d3a43ce"/>
                     <a:stretch>
                       <a:fillRect/>
                     </a:stretch>
@@ -2201,7 +2201,7 @@
                     <pic:cNvPicPr/>
                   </pic:nvPicPr>
                   <pic:blipFill>
-                    <a:blip xmlns:r="http://schemas.openxmlformats.org/officeDocument/2006/relationships" r:embed="R2f5f873d6f974042"/>
+                    <a:blip xmlns:r="http://schemas.openxmlformats.org/officeDocument/2006/relationships" r:embed="Raa457ab567e544c1"/>
                     <a:stretch>
                       <a:fillRect/>
                     </a:stretch>
@@ -2252,7 +2252,7 @@
                     <pic:cNvPicPr/>
                   </pic:nvPicPr>
                   <pic:blipFill>
-                    <a:blip xmlns:r="http://schemas.openxmlformats.org/officeDocument/2006/relationships" r:embed="Rb43dcbab2c474cd0"/>
+                    <a:blip xmlns:r="http://schemas.openxmlformats.org/officeDocument/2006/relationships" r:embed="Reca34ae7ce2048f9"/>
                     <a:stretch>
                       <a:fillRect/>
                     </a:stretch>
@@ -2303,7 +2303,7 @@
                     <pic:cNvPicPr/>
                   </pic:nvPicPr>
                   <pic:blipFill>
-                    <a:blip xmlns:r="http://schemas.openxmlformats.org/officeDocument/2006/relationships" r:embed="R09d84449940c4891"/>
+                    <a:blip xmlns:r="http://schemas.openxmlformats.org/officeDocument/2006/relationships" r:embed="R3d15003f717c4e61"/>
                     <a:stretch>
                       <a:fillRect/>
                     </a:stretch>
@@ -2354,7 +2354,7 @@
                     <pic:cNvPicPr/>
                   </pic:nvPicPr>
                   <pic:blipFill>
-                    <a:blip xmlns:r="http://schemas.openxmlformats.org/officeDocument/2006/relationships" r:embed="Rb59ce6cabdbf4b49"/>
+                    <a:blip xmlns:r="http://schemas.openxmlformats.org/officeDocument/2006/relationships" r:embed="R0bd14129de9d44c6"/>
                     <a:stretch>
                       <a:fillRect/>
                     </a:stretch>
@@ -2430,7 +2430,7 @@
                     <pic:cNvPicPr/>
                   </pic:nvPicPr>
                   <pic:blipFill>
-                    <a:blip xmlns:r="http://schemas.openxmlformats.org/officeDocument/2006/relationships" r:embed="Rb65f5bdc9ef84875"/>
+                    <a:blip xmlns:r="http://schemas.openxmlformats.org/officeDocument/2006/relationships" r:embed="R9b1bd57c22c248b6"/>
                     <a:stretch>
                       <a:fillRect/>
                     </a:stretch>
@@ -2481,7 +2481,7 @@
                     <pic:cNvPicPr/>
                   </pic:nvPicPr>
                   <pic:blipFill>
-                    <a:blip xmlns:r="http://schemas.openxmlformats.org/officeDocument/2006/relationships" r:embed="R0ba0e7130bf94696"/>
+                    <a:blip xmlns:r="http://schemas.openxmlformats.org/officeDocument/2006/relationships" r:embed="R8909ffc399be423a"/>
                     <a:stretch>
                       <a:fillRect/>
                     </a:stretch>
@@ -2532,7 +2532,7 @@
                     <pic:cNvPicPr/>
                   </pic:nvPicPr>
                   <pic:blipFill>
-                    <a:blip xmlns:r="http://schemas.openxmlformats.org/officeDocument/2006/relationships" r:embed="R1819967925e4488e"/>
+                    <a:blip xmlns:r="http://schemas.openxmlformats.org/officeDocument/2006/relationships" r:embed="Rc51c6da75aef40d4"/>
                     <a:stretch>
                       <a:fillRect/>
                     </a:stretch>
@@ -2583,7 +2583,7 @@
                     <pic:cNvPicPr/>
                   </pic:nvPicPr>
                   <pic:blipFill>
-                    <a:blip xmlns:r="http://schemas.openxmlformats.org/officeDocument/2006/relationships" r:embed="R096fd2b1ce524c66"/>
+                    <a:blip xmlns:r="http://schemas.openxmlformats.org/officeDocument/2006/relationships" r:embed="Raa8d5ff38ceb4201"/>
                     <a:stretch>
                       <a:fillRect/>
                     </a:stretch>
@@ -2659,7 +2659,7 @@
                     <pic:cNvPicPr/>
                   </pic:nvPicPr>
                   <pic:blipFill>
-                    <a:blip xmlns:r="http://schemas.openxmlformats.org/officeDocument/2006/relationships" r:embed="Rb712dea1442e4270"/>
+                    <a:blip xmlns:r="http://schemas.openxmlformats.org/officeDocument/2006/relationships" r:embed="R30fab5d6246047fa"/>
                     <a:stretch>
                       <a:fillRect/>
                     </a:stretch>
@@ -2710,7 +2710,7 @@
                     <pic:cNvPicPr/>
                   </pic:nvPicPr>
                   <pic:blipFill>
-                    <a:blip xmlns:r="http://schemas.openxmlformats.org/officeDocument/2006/relationships" r:embed="Rb7d99f3e2d3b4fd7"/>
+                    <a:blip xmlns:r="http://schemas.openxmlformats.org/officeDocument/2006/relationships" r:embed="Rd560ec1785b642e6"/>
                     <a:stretch>
                       <a:fillRect/>
                     </a:stretch>
@@ -2761,7 +2761,7 @@
                     <pic:cNvPicPr/>
                   </pic:nvPicPr>
                   <pic:blipFill>
-                    <a:blip xmlns:r="http://schemas.openxmlformats.org/officeDocument/2006/relationships" r:embed="R67c062543b5f412a"/>
+                    <a:blip xmlns:r="http://schemas.openxmlformats.org/officeDocument/2006/relationships" r:embed="Rd40eaa78c9e6418a"/>
                     <a:stretch>
                       <a:fillRect/>
                     </a:stretch>
@@ -2812,7 +2812,7 @@
                     <pic:cNvPicPr/>
                   </pic:nvPicPr>
                   <pic:blipFill>
-                    <a:blip xmlns:r="http://schemas.openxmlformats.org/officeDocument/2006/relationships" r:embed="R9b0669cd044e4c91"/>
+                    <a:blip xmlns:r="http://schemas.openxmlformats.org/officeDocument/2006/relationships" r:embed="R994183a31d8c4e0c"/>
                     <a:stretch>
                       <a:fillRect/>
                     </a:stretch>
@@ -2863,7 +2863,7 @@
                     <pic:cNvPicPr/>
                   </pic:nvPicPr>
                   <pic:blipFill>
-                    <a:blip xmlns:r="http://schemas.openxmlformats.org/officeDocument/2006/relationships" r:embed="R32e7e29efbf14c02"/>
+                    <a:blip xmlns:r="http://schemas.openxmlformats.org/officeDocument/2006/relationships" r:embed="Ra914ad326bf14c46"/>
                     <a:stretch>
                       <a:fillRect/>
                     </a:stretch>
@@ -2914,7 +2914,7 @@
                     <pic:cNvPicPr/>
                   </pic:nvPicPr>
                   <pic:blipFill>
-                    <a:blip xmlns:r="http://schemas.openxmlformats.org/officeDocument/2006/relationships" r:embed="Rf74e8561dac04d76"/>
+                    <a:blip xmlns:r="http://schemas.openxmlformats.org/officeDocument/2006/relationships" r:embed="Rb77a70c82336483a"/>
                     <a:stretch>
                       <a:fillRect/>
                     </a:stretch>
@@ -2965,7 +2965,7 @@
                     <pic:cNvPicPr/>
                   </pic:nvPicPr>
                   <pic:blipFill>
-                    <a:blip xmlns:r="http://schemas.openxmlformats.org/officeDocument/2006/relationships" r:embed="R611caec77489478a"/>
+                    <a:blip xmlns:r="http://schemas.openxmlformats.org/officeDocument/2006/relationships" r:embed="R2fc5e174ae2f48a9"/>
                     <a:stretch>
                       <a:fillRect/>
                     </a:stretch>
@@ -3016,7 +3016,7 @@
                     <pic:cNvPicPr/>
                   </pic:nvPicPr>
                   <pic:blipFill>
-                    <a:blip xmlns:r="http://schemas.openxmlformats.org/officeDocument/2006/relationships" r:embed="Rf2e8f3a1d872462a"/>
+                    <a:blip xmlns:r="http://schemas.openxmlformats.org/officeDocument/2006/relationships" r:embed="R3002d53b470b4241"/>
                     <a:stretch>
                       <a:fillRect/>
                     </a:stretch>
@@ -3067,7 +3067,7 @@
                     <pic:cNvPicPr/>
                   </pic:nvPicPr>
                   <pic:blipFill>
-                    <a:blip xmlns:r="http://schemas.openxmlformats.org/officeDocument/2006/relationships" r:embed="Rd89e8e73a9d74333"/>
+                    <a:blip xmlns:r="http://schemas.openxmlformats.org/officeDocument/2006/relationships" r:embed="R37cf52875a6741b2"/>
                     <a:stretch>
                       <a:fillRect/>
                     </a:stretch>
@@ -3118,7 +3118,7 @@
                     <pic:cNvPicPr/>
                   </pic:nvPicPr>
                   <pic:blipFill>
-                    <a:blip xmlns:r="http://schemas.openxmlformats.org/officeDocument/2006/relationships" r:embed="R6a748cea102e4f0a"/>
+                    <a:blip xmlns:r="http://schemas.openxmlformats.org/officeDocument/2006/relationships" r:embed="Rb9756bfd8c2546ae"/>
                     <a:stretch>
                       <a:fillRect/>
                     </a:stretch>
@@ -3169,7 +3169,7 @@
                     <pic:cNvPicPr/>
                   </pic:nvPicPr>
                   <pic:blipFill>
-                    <a:blip xmlns:r="http://schemas.openxmlformats.org/officeDocument/2006/relationships" r:embed="R1f847729e14b4b95"/>
+                    <a:blip xmlns:r="http://schemas.openxmlformats.org/officeDocument/2006/relationships" r:embed="R8af726c6bf8645ff"/>
                     <a:stretch>
                       <a:fillRect/>
                     </a:stretch>
@@ -3220,7 +3220,7 @@
                     <pic:cNvPicPr/>
                   </pic:nvPicPr>
                   <pic:blipFill>
-                    <a:blip xmlns:r="http://schemas.openxmlformats.org/officeDocument/2006/relationships" r:embed="R7b64957ae6cd44be"/>
+                    <a:blip xmlns:r="http://schemas.openxmlformats.org/officeDocument/2006/relationships" r:embed="Ra523ceb4d1a94a18"/>
                     <a:stretch>
                       <a:fillRect/>
                     </a:stretch>
@@ -3271,7 +3271,7 @@
                     <pic:cNvPicPr/>
                   </pic:nvPicPr>
                   <pic:blipFill>
-                    <a:blip xmlns:r="http://schemas.openxmlformats.org/officeDocument/2006/relationships" r:embed="R20e1d518e86f4e86"/>
+                    <a:blip xmlns:r="http://schemas.openxmlformats.org/officeDocument/2006/relationships" r:embed="Rcb0c433e75e547da"/>
                     <a:stretch>
                       <a:fillRect/>
                     </a:stretch>
@@ -3322,7 +3322,7 @@
                     <pic:cNvPicPr/>
                   </pic:nvPicPr>
                   <pic:blipFill>
-                    <a:blip xmlns:r="http://schemas.openxmlformats.org/officeDocument/2006/relationships" r:embed="R694267b644e14ffc"/>
+                    <a:blip xmlns:r="http://schemas.openxmlformats.org/officeDocument/2006/relationships" r:embed="R090db153342d4c9b"/>
                     <a:stretch>
                       <a:fillRect/>
                     </a:stretch>
@@ -3419,7 +3419,7 @@
                     <pic:cNvPicPr/>
                   </pic:nvPicPr>
                   <pic:blipFill>
-                    <a:blip xmlns:r="http://schemas.openxmlformats.org/officeDocument/2006/relationships" r:embed="Rf4ee8fd35efd4120"/>
+                    <a:blip xmlns:r="http://schemas.openxmlformats.org/officeDocument/2006/relationships" r:embed="R1846cd15a055477b"/>
                     <a:stretch>
                       <a:fillRect/>
                     </a:stretch>
@@ -3462,7 +3462,7 @@
                     <pic:cNvPicPr/>
                   </pic:nvPicPr>
                   <pic:blipFill>
-                    <a:blip xmlns:r="http://schemas.openxmlformats.org/officeDocument/2006/relationships" r:embed="Rbf558af78dd641d9"/>
+                    <a:blip xmlns:r="http://schemas.openxmlformats.org/officeDocument/2006/relationships" r:embed="Rf184b72a267a4194"/>
                     <a:stretch>
                       <a:fillRect/>
                     </a:stretch>
@@ -3505,7 +3505,7 @@
                     <pic:cNvPicPr/>
                   </pic:nvPicPr>
                   <pic:blipFill>
-                    <a:blip xmlns:r="http://schemas.openxmlformats.org/officeDocument/2006/relationships" r:embed="R2ed641087bce4d0b"/>
+                    <a:blip xmlns:r="http://schemas.openxmlformats.org/officeDocument/2006/relationships" r:embed="R591542da75024601"/>
                     <a:stretch>
                       <a:fillRect/>
                     </a:stretch>
@@ -3548,7 +3548,7 @@
                     <pic:cNvPicPr/>
                   </pic:nvPicPr>
                   <pic:blipFill>
-                    <a:blip xmlns:r="http://schemas.openxmlformats.org/officeDocument/2006/relationships" r:embed="Rdc6566f1e3d14063"/>
+                    <a:blip xmlns:r="http://schemas.openxmlformats.org/officeDocument/2006/relationships" r:embed="Rf7b584ffdce04e79"/>
                     <a:stretch>
                       <a:fillRect/>
                     </a:stretch>
@@ -3933,7 +3933,7 @@
                     <pic:cNvPicPr/>
                   </pic:nvPicPr>
                   <pic:blipFill>
-                    <a:blip xmlns:r="http://schemas.openxmlformats.org/officeDocument/2006/relationships" r:embed="Rdd7b36af6c304d31"/>
+                    <a:blip xmlns:r="http://schemas.openxmlformats.org/officeDocument/2006/relationships" r:embed="R6d6adc1272c14e82"/>
                     <a:stretch>
                       <a:fillRect/>
                     </a:stretch>
@@ -4125,7 +4125,7 @@
                     <pic:cNvPicPr/>
                   </pic:nvPicPr>
                   <pic:blipFill>
-                    <a:blip xmlns:r="http://schemas.openxmlformats.org/officeDocument/2006/relationships" r:embed="R460dcd6439374548"/>
+                    <a:blip xmlns:r="http://schemas.openxmlformats.org/officeDocument/2006/relationships" r:embed="R4d6485ef170745b4"/>
                     <a:stretch>
                       <a:fillRect/>
                     </a:stretch>
@@ -4176,7 +4176,7 @@
                     <pic:cNvPicPr/>
                   </pic:nvPicPr>
                   <pic:blipFill>
-                    <a:blip xmlns:r="http://schemas.openxmlformats.org/officeDocument/2006/relationships" r:embed="Rfdd9b4c4a38a4965"/>
+                    <a:blip xmlns:r="http://schemas.openxmlformats.org/officeDocument/2006/relationships" r:embed="Rfc2837b841544522"/>
                     <a:stretch>
                       <a:fillRect/>
                     </a:stretch>
@@ -4227,7 +4227,7 @@
                     <pic:cNvPicPr/>
                   </pic:nvPicPr>
                   <pic:blipFill>
-                    <a:blip xmlns:r="http://schemas.openxmlformats.org/officeDocument/2006/relationships" r:embed="Rc9a01ae2f55241ee"/>
+                    <a:blip xmlns:r="http://schemas.openxmlformats.org/officeDocument/2006/relationships" r:embed="R2f32a7a293784ff0"/>
                     <a:stretch>
                       <a:fillRect/>
                     </a:stretch>
@@ -4278,7 +4278,7 @@
                     <pic:cNvPicPr/>
                   </pic:nvPicPr>
                   <pic:blipFill>
-                    <a:blip xmlns:r="http://schemas.openxmlformats.org/officeDocument/2006/relationships" r:embed="Rcb25b4997b2844ea"/>
+                    <a:blip xmlns:r="http://schemas.openxmlformats.org/officeDocument/2006/relationships" r:embed="R105140ca91554d4e"/>
                     <a:stretch>
                       <a:fillRect/>
                     </a:stretch>
@@ -4657,7 +4657,7 @@
                     <pic:cNvPicPr/>
                   </pic:nvPicPr>
                   <pic:blipFill>
-                    <a:blip xmlns:r="http://schemas.openxmlformats.org/officeDocument/2006/relationships" r:embed="R980b2fc83bb84520"/>
+                    <a:blip xmlns:r="http://schemas.openxmlformats.org/officeDocument/2006/relationships" r:embed="R94d5856b7a53469d"/>
                     <a:stretch>
                       <a:fillRect/>
                     </a:stretch>
@@ -5338,7 +5338,7 @@
             <w:r>
               <w:t xml:space="preserve">Cell with </w:t>
             </w:r>
-            <w:hyperlink xmlns:r="http://schemas.openxmlformats.org/officeDocument/2006/relationships" w:history="true" r:id="R4f5cb07e91584bc9">
+            <w:hyperlink xmlns:r="http://schemas.openxmlformats.org/officeDocument/2006/relationships" w:history="true" r:id="R77b3173acf7e42a8">
               <w:r>
                 <w:rPr>
                   <w:rStyle w:val="Hyperlink"/>
@@ -5624,7 +5624,7 @@
                           <pic:cNvPicPr/>
                         </pic:nvPicPr>
                         <pic:blipFill>
-                          <a:blip xmlns:r="http://schemas.openxmlformats.org/officeDocument/2006/relationships" r:embed="R55b61de450b747c9"/>
+                          <a:blip xmlns:r="http://schemas.openxmlformats.org/officeDocument/2006/relationships" r:embed="Re879a812792143ee"/>
                           <a:stretch>
                             <a:fillRect/>
                           </a:stretch>
@@ -5724,7 +5724,7 @@
                     <pic:cNvPicPr/>
                   </pic:nvPicPr>
                   <pic:blipFill>
-                    <a:blip xmlns:r="http://schemas.openxmlformats.org/officeDocument/2006/relationships" r:embed="R5b2c755958b94a6e"/>
+                    <a:blip xmlns:r="http://schemas.openxmlformats.org/officeDocument/2006/relationships" r:embed="R9c7b026bdada4e4b"/>
                     <a:stretch>
                       <a:fillRect/>
                     </a:stretch>
@@ -5774,7 +5774,7 @@
                     <pic:cNvPicPr/>
                   </pic:nvPicPr>
                   <pic:blipFill>
-                    <a:blip xmlns:r="http://schemas.openxmlformats.org/officeDocument/2006/relationships" r:embed="Red00a82d1bce453d"/>
+                    <a:blip xmlns:r="http://schemas.openxmlformats.org/officeDocument/2006/relationships" r:embed="R8f2e17c9611148cd"/>
                     <a:stretch>
                       <a:fillRect/>
                     </a:stretch>
@@ -5824,7 +5824,7 @@
                     <pic:cNvPicPr/>
                   </pic:nvPicPr>
                   <pic:blipFill>
-                    <a:blip xmlns:r="http://schemas.openxmlformats.org/officeDocument/2006/relationships" r:embed="Re4d12fe7547248c2"/>
+                    <a:blip xmlns:r="http://schemas.openxmlformats.org/officeDocument/2006/relationships" r:embed="Rdfc06904f59941a0"/>
                     <a:stretch>
                       <a:fillRect/>
                     </a:stretch>

</xml_diff>

<commit_message>
fix(er): use LINE_ITEM corner target anchors
For the two-parent target case, attach incoming edges to LINE_ITEM top-left/top-right corner intersection points (TL/TR) and update the source-of-truth accordingly.

Made-with: Cursor
</commit_message>
<xml_diff>
--- a/test.docx
+++ b/test.docx
@@ -236,7 +236,7 @@
       <w:r>
         <w:t xml:space="preserve">, and </w:t>
       </w:r>
-      <w:hyperlink xmlns:r="http://schemas.openxmlformats.org/officeDocument/2006/relationships" w:history="true" r:id="R75e02882c9fe472e">
+      <w:hyperlink xmlns:r="http://schemas.openxmlformats.org/officeDocument/2006/relationships" w:history="true" r:id="Ree0369d146da40d7">
         <w:r>
           <w:rPr>
             <w:rStyle w:val="Hyperlink"/>
@@ -475,7 +475,7 @@
       <w:r>
         <w:t xml:space="preserve">Direct link: </w:t>
       </w:r>
-      <w:hyperlink xmlns:r="http://schemas.openxmlformats.org/officeDocument/2006/relationships" w:history="true" r:id="R91bb9873dfee4c45">
+      <w:hyperlink xmlns:r="http://schemas.openxmlformats.org/officeDocument/2006/relationships" w:history="true" r:id="R40b019fdd029420d">
         <w:r>
           <w:rPr>
             <w:rStyle w:val="Hyperlink"/>
@@ -496,7 +496,7 @@
       <w:r>
         <w:t xml:space="preserve">Direct link with title: </w:t>
       </w:r>
-      <w:hyperlink xmlns:r="http://schemas.openxmlformats.org/officeDocument/2006/relationships" w:history="true" r:id="R68193a086ced48ef">
+      <w:hyperlink xmlns:r="http://schemas.openxmlformats.org/officeDocument/2006/relationships" w:history="true" r:id="R43c117f4002c4c85">
         <w:r>
           <w:rPr>
             <w:rStyle w:val="Hyperlink"/>
@@ -517,7 +517,7 @@
       <w:r>
         <w:t xml:space="preserve">Reference-style link: </w:t>
       </w:r>
-      <w:hyperlink xmlns:r="http://schemas.openxmlformats.org/officeDocument/2006/relationships" w:history="true" r:id="R9751a346539c4584">
+      <w:hyperlink xmlns:r="http://schemas.openxmlformats.org/officeDocument/2006/relationships" w:history="true" r:id="Rcef06092a1634714">
         <w:r>
           <w:rPr>
             <w:rStyle w:val="Hyperlink"/>
@@ -538,7 +538,7 @@
       <w:r>
         <w:t xml:space="preserve">Collapsed reference link: </w:t>
       </w:r>
-      <w:hyperlink xmlns:r="http://schemas.openxmlformats.org/officeDocument/2006/relationships" w:history="true" r:id="Re064e6bf9505414b">
+      <w:hyperlink xmlns:r="http://schemas.openxmlformats.org/officeDocument/2006/relationships" w:history="true" r:id="Reccc91c3301a4d5d">
         <w:r>
           <w:rPr>
             <w:rStyle w:val="Hyperlink"/>
@@ -559,7 +559,7 @@
       <w:r>
         <w:t xml:space="preserve">Repeated reference link: </w:t>
       </w:r>
-      <w:hyperlink xmlns:r="http://schemas.openxmlformats.org/officeDocument/2006/relationships" w:history="true" r:id="Ra4ba58d12b254ba6">
+      <w:hyperlink xmlns:r="http://schemas.openxmlformats.org/officeDocument/2006/relationships" w:history="true" r:id="Rfc32e5bb9a924e93">
         <w:r>
           <w:rPr>
             <w:rStyle w:val="Hyperlink"/>
@@ -580,7 +580,7 @@
       <w:r>
         <w:t xml:space="preserve">Autolink URL: </w:t>
       </w:r>
-      <w:hyperlink xmlns:r="http://schemas.openxmlformats.org/officeDocument/2006/relationships" w:history="true" r:id="R627bcc89eb0c429c">
+      <w:hyperlink xmlns:r="http://schemas.openxmlformats.org/officeDocument/2006/relationships" w:history="true" r:id="R478bd4e08e064a61">
         <w:r>
           <w:rPr>
             <w:rStyle w:val="Hyperlink"/>
@@ -601,7 +601,7 @@
       <w:r>
         <w:t xml:space="preserve">Autolink email: </w:t>
       </w:r>
-      <w:hyperlink xmlns:r="http://schemas.openxmlformats.org/officeDocument/2006/relationships" w:history="true" r:id="Rb3abb6f0ec3941c8">
+      <w:hyperlink xmlns:r="http://schemas.openxmlformats.org/officeDocument/2006/relationships" w:history="true" r:id="R404e12ea56e34b6a">
         <w:r>
           <w:rPr>
             <w:rStyle w:val="Hyperlink"/>
@@ -700,7 +700,7 @@
       <w:r>
         <w:t xml:space="preserve">, and </w:t>
       </w:r>
-      <w:hyperlink xmlns:r="http://schemas.openxmlformats.org/officeDocument/2006/relationships" w:history="true" r:id="R074185d0303a49af">
+      <w:hyperlink xmlns:r="http://schemas.openxmlformats.org/officeDocument/2006/relationships" w:history="true" r:id="R48a8398dae5148be">
         <w:r>
           <w:rPr>
             <w:rStyle w:val="Hyperlink"/>
@@ -1093,7 +1093,7 @@
       <w:r>
         <w:t xml:space="preserve">Continuation paragraph with </w:t>
       </w:r>
-      <w:hyperlink xmlns:r="http://schemas.openxmlformats.org/officeDocument/2006/relationships" w:history="true" r:id="Re9a1e35b140b48ff">
+      <w:hyperlink xmlns:r="http://schemas.openxmlformats.org/officeDocument/2006/relationships" w:history="true" r:id="R8056a91d6a9e4aee">
         <w:r>
           <w:rPr>
             <w:rStyle w:val="Hyperlink"/>
@@ -1591,7 +1591,7 @@
       <w:r>
         <w:t xml:space="preserve">, and </w:t>
       </w:r>
-      <w:hyperlink xmlns:r="http://schemas.openxmlformats.org/officeDocument/2006/relationships" w:history="true" r:id="R78e9149b7a6c4b64">
+      <w:hyperlink xmlns:r="http://schemas.openxmlformats.org/officeDocument/2006/relationships" w:history="true" r:id="Rfff7cb61474f423e">
         <w:r>
           <w:rPr>
             <w:rStyle w:val="Hyperlink"/>
@@ -1979,7 +1979,7 @@
                     <pic:cNvPicPr/>
                   </pic:nvPicPr>
                   <pic:blipFill>
-                    <a:blip xmlns:r="http://schemas.openxmlformats.org/officeDocument/2006/relationships" r:embed="R18571033fe594c27"/>
+                    <a:blip xmlns:r="http://schemas.openxmlformats.org/officeDocument/2006/relationships" r:embed="Ra007067dec0e47bc"/>
                     <a:stretch>
                       <a:fillRect/>
                     </a:stretch>
@@ -2039,7 +2039,7 @@
                     <pic:cNvPicPr/>
                   </pic:nvPicPr>
                   <pic:blipFill>
-                    <a:blip xmlns:r="http://schemas.openxmlformats.org/officeDocument/2006/relationships" r:embed="R9ad1a877f27545d7"/>
+                    <a:blip xmlns:r="http://schemas.openxmlformats.org/officeDocument/2006/relationships" r:embed="R4f946593bc414ec0"/>
                     <a:stretch>
                       <a:fillRect/>
                     </a:stretch>
@@ -2099,7 +2099,7 @@
                     <pic:cNvPicPr/>
                   </pic:nvPicPr>
                   <pic:blipFill>
-                    <a:blip xmlns:r="http://schemas.openxmlformats.org/officeDocument/2006/relationships" r:embed="Re168ba51c1dc45e7"/>
+                    <a:blip xmlns:r="http://schemas.openxmlformats.org/officeDocument/2006/relationships" r:embed="Rfcfd2b937bf04e73"/>
                     <a:stretch>
                       <a:fillRect/>
                     </a:stretch>
@@ -2150,7 +2150,7 @@
                     <pic:cNvPicPr/>
                   </pic:nvPicPr>
                   <pic:blipFill>
-                    <a:blip xmlns:r="http://schemas.openxmlformats.org/officeDocument/2006/relationships" r:embed="Rb030568b7d3a43ce"/>
+                    <a:blip xmlns:r="http://schemas.openxmlformats.org/officeDocument/2006/relationships" r:embed="R05c29b00bc2647e8"/>
                     <a:stretch>
                       <a:fillRect/>
                     </a:stretch>
@@ -2201,7 +2201,7 @@
                     <pic:cNvPicPr/>
                   </pic:nvPicPr>
                   <pic:blipFill>
-                    <a:blip xmlns:r="http://schemas.openxmlformats.org/officeDocument/2006/relationships" r:embed="Raa457ab567e544c1"/>
+                    <a:blip xmlns:r="http://schemas.openxmlformats.org/officeDocument/2006/relationships" r:embed="Rf6fe1690672d4438"/>
                     <a:stretch>
                       <a:fillRect/>
                     </a:stretch>
@@ -2252,7 +2252,7 @@
                     <pic:cNvPicPr/>
                   </pic:nvPicPr>
                   <pic:blipFill>
-                    <a:blip xmlns:r="http://schemas.openxmlformats.org/officeDocument/2006/relationships" r:embed="Reca34ae7ce2048f9"/>
+                    <a:blip xmlns:r="http://schemas.openxmlformats.org/officeDocument/2006/relationships" r:embed="Rf2ed7eda8f18412c"/>
                     <a:stretch>
                       <a:fillRect/>
                     </a:stretch>
@@ -2303,7 +2303,7 @@
                     <pic:cNvPicPr/>
                   </pic:nvPicPr>
                   <pic:blipFill>
-                    <a:blip xmlns:r="http://schemas.openxmlformats.org/officeDocument/2006/relationships" r:embed="R3d15003f717c4e61"/>
+                    <a:blip xmlns:r="http://schemas.openxmlformats.org/officeDocument/2006/relationships" r:embed="R03c50e57271c4449"/>
                     <a:stretch>
                       <a:fillRect/>
                     </a:stretch>
@@ -2354,7 +2354,7 @@
                     <pic:cNvPicPr/>
                   </pic:nvPicPr>
                   <pic:blipFill>
-                    <a:blip xmlns:r="http://schemas.openxmlformats.org/officeDocument/2006/relationships" r:embed="R0bd14129de9d44c6"/>
+                    <a:blip xmlns:r="http://schemas.openxmlformats.org/officeDocument/2006/relationships" r:embed="R1107f80a65e742b9"/>
                     <a:stretch>
                       <a:fillRect/>
                     </a:stretch>
@@ -2430,7 +2430,7 @@
                     <pic:cNvPicPr/>
                   </pic:nvPicPr>
                   <pic:blipFill>
-                    <a:blip xmlns:r="http://schemas.openxmlformats.org/officeDocument/2006/relationships" r:embed="R9b1bd57c22c248b6"/>
+                    <a:blip xmlns:r="http://schemas.openxmlformats.org/officeDocument/2006/relationships" r:embed="R9b8dcbe6a5c3410a"/>
                     <a:stretch>
                       <a:fillRect/>
                     </a:stretch>
@@ -2481,7 +2481,7 @@
                     <pic:cNvPicPr/>
                   </pic:nvPicPr>
                   <pic:blipFill>
-                    <a:blip xmlns:r="http://schemas.openxmlformats.org/officeDocument/2006/relationships" r:embed="R8909ffc399be423a"/>
+                    <a:blip xmlns:r="http://schemas.openxmlformats.org/officeDocument/2006/relationships" r:embed="R69971afb754042a1"/>
                     <a:stretch>
                       <a:fillRect/>
                     </a:stretch>
@@ -2532,7 +2532,7 @@
                     <pic:cNvPicPr/>
                   </pic:nvPicPr>
                   <pic:blipFill>
-                    <a:blip xmlns:r="http://schemas.openxmlformats.org/officeDocument/2006/relationships" r:embed="Rc51c6da75aef40d4"/>
+                    <a:blip xmlns:r="http://schemas.openxmlformats.org/officeDocument/2006/relationships" r:embed="Ra40251cfacb347c2"/>
                     <a:stretch>
                       <a:fillRect/>
                     </a:stretch>
@@ -2583,7 +2583,7 @@
                     <pic:cNvPicPr/>
                   </pic:nvPicPr>
                   <pic:blipFill>
-                    <a:blip xmlns:r="http://schemas.openxmlformats.org/officeDocument/2006/relationships" r:embed="Raa8d5ff38ceb4201"/>
+                    <a:blip xmlns:r="http://schemas.openxmlformats.org/officeDocument/2006/relationships" r:embed="R4c52f4eb7d484b59"/>
                     <a:stretch>
                       <a:fillRect/>
                     </a:stretch>
@@ -2659,7 +2659,7 @@
                     <pic:cNvPicPr/>
                   </pic:nvPicPr>
                   <pic:blipFill>
-                    <a:blip xmlns:r="http://schemas.openxmlformats.org/officeDocument/2006/relationships" r:embed="R30fab5d6246047fa"/>
+                    <a:blip xmlns:r="http://schemas.openxmlformats.org/officeDocument/2006/relationships" r:embed="R7a99e75416ac4be9"/>
                     <a:stretch>
                       <a:fillRect/>
                     </a:stretch>
@@ -2710,7 +2710,7 @@
                     <pic:cNvPicPr/>
                   </pic:nvPicPr>
                   <pic:blipFill>
-                    <a:blip xmlns:r="http://schemas.openxmlformats.org/officeDocument/2006/relationships" r:embed="Rd560ec1785b642e6"/>
+                    <a:blip xmlns:r="http://schemas.openxmlformats.org/officeDocument/2006/relationships" r:embed="R41862f4854df4f6c"/>
                     <a:stretch>
                       <a:fillRect/>
                     </a:stretch>
@@ -2761,7 +2761,7 @@
                     <pic:cNvPicPr/>
                   </pic:nvPicPr>
                   <pic:blipFill>
-                    <a:blip xmlns:r="http://schemas.openxmlformats.org/officeDocument/2006/relationships" r:embed="Rd40eaa78c9e6418a"/>
+                    <a:blip xmlns:r="http://schemas.openxmlformats.org/officeDocument/2006/relationships" r:embed="R4122ca01433340d4"/>
                     <a:stretch>
                       <a:fillRect/>
                     </a:stretch>
@@ -2812,7 +2812,7 @@
                     <pic:cNvPicPr/>
                   </pic:nvPicPr>
                   <pic:blipFill>
-                    <a:blip xmlns:r="http://schemas.openxmlformats.org/officeDocument/2006/relationships" r:embed="R994183a31d8c4e0c"/>
+                    <a:blip xmlns:r="http://schemas.openxmlformats.org/officeDocument/2006/relationships" r:embed="R9c0b6757af69496a"/>
                     <a:stretch>
                       <a:fillRect/>
                     </a:stretch>
@@ -2863,7 +2863,7 @@
                     <pic:cNvPicPr/>
                   </pic:nvPicPr>
                   <pic:blipFill>
-                    <a:blip xmlns:r="http://schemas.openxmlformats.org/officeDocument/2006/relationships" r:embed="Ra914ad326bf14c46"/>
+                    <a:blip xmlns:r="http://schemas.openxmlformats.org/officeDocument/2006/relationships" r:embed="R477495a7ab9f4621"/>
                     <a:stretch>
                       <a:fillRect/>
                     </a:stretch>
@@ -2914,7 +2914,7 @@
                     <pic:cNvPicPr/>
                   </pic:nvPicPr>
                   <pic:blipFill>
-                    <a:blip xmlns:r="http://schemas.openxmlformats.org/officeDocument/2006/relationships" r:embed="Rb77a70c82336483a"/>
+                    <a:blip xmlns:r="http://schemas.openxmlformats.org/officeDocument/2006/relationships" r:embed="R3d6679f4f7494ecf"/>
                     <a:stretch>
                       <a:fillRect/>
                     </a:stretch>
@@ -2965,7 +2965,7 @@
                     <pic:cNvPicPr/>
                   </pic:nvPicPr>
                   <pic:blipFill>
-                    <a:blip xmlns:r="http://schemas.openxmlformats.org/officeDocument/2006/relationships" r:embed="R2fc5e174ae2f48a9"/>
+                    <a:blip xmlns:r="http://schemas.openxmlformats.org/officeDocument/2006/relationships" r:embed="Rb71edc86dc274f6b"/>
                     <a:stretch>
                       <a:fillRect/>
                     </a:stretch>
@@ -3016,7 +3016,7 @@
                     <pic:cNvPicPr/>
                   </pic:nvPicPr>
                   <pic:blipFill>
-                    <a:blip xmlns:r="http://schemas.openxmlformats.org/officeDocument/2006/relationships" r:embed="R3002d53b470b4241"/>
+                    <a:blip xmlns:r="http://schemas.openxmlformats.org/officeDocument/2006/relationships" r:embed="R1bade156af914459"/>
                     <a:stretch>
                       <a:fillRect/>
                     </a:stretch>
@@ -3067,7 +3067,7 @@
                     <pic:cNvPicPr/>
                   </pic:nvPicPr>
                   <pic:blipFill>
-                    <a:blip xmlns:r="http://schemas.openxmlformats.org/officeDocument/2006/relationships" r:embed="R37cf52875a6741b2"/>
+                    <a:blip xmlns:r="http://schemas.openxmlformats.org/officeDocument/2006/relationships" r:embed="R332737e501c94b76"/>
                     <a:stretch>
                       <a:fillRect/>
                     </a:stretch>
@@ -3118,7 +3118,7 @@
                     <pic:cNvPicPr/>
                   </pic:nvPicPr>
                   <pic:blipFill>
-                    <a:blip xmlns:r="http://schemas.openxmlformats.org/officeDocument/2006/relationships" r:embed="Rb9756bfd8c2546ae"/>
+                    <a:blip xmlns:r="http://schemas.openxmlformats.org/officeDocument/2006/relationships" r:embed="R42ed5151d7ec42b9"/>
                     <a:stretch>
                       <a:fillRect/>
                     </a:stretch>
@@ -3169,7 +3169,7 @@
                     <pic:cNvPicPr/>
                   </pic:nvPicPr>
                   <pic:blipFill>
-                    <a:blip xmlns:r="http://schemas.openxmlformats.org/officeDocument/2006/relationships" r:embed="R8af726c6bf8645ff"/>
+                    <a:blip xmlns:r="http://schemas.openxmlformats.org/officeDocument/2006/relationships" r:embed="Re0c3c7b552344ec8"/>
                     <a:stretch>
                       <a:fillRect/>
                     </a:stretch>
@@ -3220,7 +3220,7 @@
                     <pic:cNvPicPr/>
                   </pic:nvPicPr>
                   <pic:blipFill>
-                    <a:blip xmlns:r="http://schemas.openxmlformats.org/officeDocument/2006/relationships" r:embed="Ra523ceb4d1a94a18"/>
+                    <a:blip xmlns:r="http://schemas.openxmlformats.org/officeDocument/2006/relationships" r:embed="R72b1966b30154418"/>
                     <a:stretch>
                       <a:fillRect/>
                     </a:stretch>
@@ -3271,7 +3271,7 @@
                     <pic:cNvPicPr/>
                   </pic:nvPicPr>
                   <pic:blipFill>
-                    <a:blip xmlns:r="http://schemas.openxmlformats.org/officeDocument/2006/relationships" r:embed="Rcb0c433e75e547da"/>
+                    <a:blip xmlns:r="http://schemas.openxmlformats.org/officeDocument/2006/relationships" r:embed="R20a9645f24f34642"/>
                     <a:stretch>
                       <a:fillRect/>
                     </a:stretch>
@@ -3322,7 +3322,7 @@
                     <pic:cNvPicPr/>
                   </pic:nvPicPr>
                   <pic:blipFill>
-                    <a:blip xmlns:r="http://schemas.openxmlformats.org/officeDocument/2006/relationships" r:embed="R090db153342d4c9b"/>
+                    <a:blip xmlns:r="http://schemas.openxmlformats.org/officeDocument/2006/relationships" r:embed="Rcfe1d6d8b5b84b3e"/>
                     <a:stretch>
                       <a:fillRect/>
                     </a:stretch>
@@ -3419,7 +3419,7 @@
                     <pic:cNvPicPr/>
                   </pic:nvPicPr>
                   <pic:blipFill>
-                    <a:blip xmlns:r="http://schemas.openxmlformats.org/officeDocument/2006/relationships" r:embed="R1846cd15a055477b"/>
+                    <a:blip xmlns:r="http://schemas.openxmlformats.org/officeDocument/2006/relationships" r:embed="R89be13139b074979"/>
                     <a:stretch>
                       <a:fillRect/>
                     </a:stretch>
@@ -3462,7 +3462,7 @@
                     <pic:cNvPicPr/>
                   </pic:nvPicPr>
                   <pic:blipFill>
-                    <a:blip xmlns:r="http://schemas.openxmlformats.org/officeDocument/2006/relationships" r:embed="Rf184b72a267a4194"/>
+                    <a:blip xmlns:r="http://schemas.openxmlformats.org/officeDocument/2006/relationships" r:embed="R3ff7cd07896b4216"/>
                     <a:stretch>
                       <a:fillRect/>
                     </a:stretch>
@@ -3505,7 +3505,7 @@
                     <pic:cNvPicPr/>
                   </pic:nvPicPr>
                   <pic:blipFill>
-                    <a:blip xmlns:r="http://schemas.openxmlformats.org/officeDocument/2006/relationships" r:embed="R591542da75024601"/>
+                    <a:blip xmlns:r="http://schemas.openxmlformats.org/officeDocument/2006/relationships" r:embed="R6e5249c4fe964e37"/>
                     <a:stretch>
                       <a:fillRect/>
                     </a:stretch>
@@ -3548,7 +3548,7 @@
                     <pic:cNvPicPr/>
                   </pic:nvPicPr>
                   <pic:blipFill>
-                    <a:blip xmlns:r="http://schemas.openxmlformats.org/officeDocument/2006/relationships" r:embed="Rf7b584ffdce04e79"/>
+                    <a:blip xmlns:r="http://schemas.openxmlformats.org/officeDocument/2006/relationships" r:embed="Re91b974c70444eae"/>
                     <a:stretch>
                       <a:fillRect/>
                     </a:stretch>
@@ -3933,7 +3933,7 @@
                     <pic:cNvPicPr/>
                   </pic:nvPicPr>
                   <pic:blipFill>
-                    <a:blip xmlns:r="http://schemas.openxmlformats.org/officeDocument/2006/relationships" r:embed="R6d6adc1272c14e82"/>
+                    <a:blip xmlns:r="http://schemas.openxmlformats.org/officeDocument/2006/relationships" r:embed="Ree59542a76264546"/>
                     <a:stretch>
                       <a:fillRect/>
                     </a:stretch>
@@ -4125,7 +4125,7 @@
                     <pic:cNvPicPr/>
                   </pic:nvPicPr>
                   <pic:blipFill>
-                    <a:blip xmlns:r="http://schemas.openxmlformats.org/officeDocument/2006/relationships" r:embed="R4d6485ef170745b4"/>
+                    <a:blip xmlns:r="http://schemas.openxmlformats.org/officeDocument/2006/relationships" r:embed="R57f417e0d6004295"/>
                     <a:stretch>
                       <a:fillRect/>
                     </a:stretch>
@@ -4176,7 +4176,7 @@
                     <pic:cNvPicPr/>
                   </pic:nvPicPr>
                   <pic:blipFill>
-                    <a:blip xmlns:r="http://schemas.openxmlformats.org/officeDocument/2006/relationships" r:embed="Rfc2837b841544522"/>
+                    <a:blip xmlns:r="http://schemas.openxmlformats.org/officeDocument/2006/relationships" r:embed="R819bec850710422b"/>
                     <a:stretch>
                       <a:fillRect/>
                     </a:stretch>
@@ -4227,7 +4227,7 @@
                     <pic:cNvPicPr/>
                   </pic:nvPicPr>
                   <pic:blipFill>
-                    <a:blip xmlns:r="http://schemas.openxmlformats.org/officeDocument/2006/relationships" r:embed="R2f32a7a293784ff0"/>
+                    <a:blip xmlns:r="http://schemas.openxmlformats.org/officeDocument/2006/relationships" r:embed="Rb929ab2614464ff7"/>
                     <a:stretch>
                       <a:fillRect/>
                     </a:stretch>
@@ -4278,7 +4278,7 @@
                     <pic:cNvPicPr/>
                   </pic:nvPicPr>
                   <pic:blipFill>
-                    <a:blip xmlns:r="http://schemas.openxmlformats.org/officeDocument/2006/relationships" r:embed="R105140ca91554d4e"/>
+                    <a:blip xmlns:r="http://schemas.openxmlformats.org/officeDocument/2006/relationships" r:embed="R5b634413a68b4987"/>
                     <a:stretch>
                       <a:fillRect/>
                     </a:stretch>
@@ -4657,7 +4657,7 @@
                     <pic:cNvPicPr/>
                   </pic:nvPicPr>
                   <pic:blipFill>
-                    <a:blip xmlns:r="http://schemas.openxmlformats.org/officeDocument/2006/relationships" r:embed="R94d5856b7a53469d"/>
+                    <a:blip xmlns:r="http://schemas.openxmlformats.org/officeDocument/2006/relationships" r:embed="R51ceec0fe33a4209"/>
                     <a:stretch>
                       <a:fillRect/>
                     </a:stretch>
@@ -5338,7 +5338,7 @@
             <w:r>
               <w:t xml:space="preserve">Cell with </w:t>
             </w:r>
-            <w:hyperlink xmlns:r="http://schemas.openxmlformats.org/officeDocument/2006/relationships" w:history="true" r:id="R77b3173acf7e42a8">
+            <w:hyperlink xmlns:r="http://schemas.openxmlformats.org/officeDocument/2006/relationships" w:history="true" r:id="R512d3624f6674a0a">
               <w:r>
                 <w:rPr>
                   <w:rStyle w:val="Hyperlink"/>
@@ -5624,7 +5624,7 @@
                           <pic:cNvPicPr/>
                         </pic:nvPicPr>
                         <pic:blipFill>
-                          <a:blip xmlns:r="http://schemas.openxmlformats.org/officeDocument/2006/relationships" r:embed="Re879a812792143ee"/>
+                          <a:blip xmlns:r="http://schemas.openxmlformats.org/officeDocument/2006/relationships" r:embed="Red0e5f10873c4e1b"/>
                           <a:stretch>
                             <a:fillRect/>
                           </a:stretch>
@@ -5724,7 +5724,7 @@
                     <pic:cNvPicPr/>
                   </pic:nvPicPr>
                   <pic:blipFill>
-                    <a:blip xmlns:r="http://schemas.openxmlformats.org/officeDocument/2006/relationships" r:embed="R9c7b026bdada4e4b"/>
+                    <a:blip xmlns:r="http://schemas.openxmlformats.org/officeDocument/2006/relationships" r:embed="R4dfd986c10044570"/>
                     <a:stretch>
                       <a:fillRect/>
                     </a:stretch>
@@ -5774,7 +5774,7 @@
                     <pic:cNvPicPr/>
                   </pic:nvPicPr>
                   <pic:blipFill>
-                    <a:blip xmlns:r="http://schemas.openxmlformats.org/officeDocument/2006/relationships" r:embed="R8f2e17c9611148cd"/>
+                    <a:blip xmlns:r="http://schemas.openxmlformats.org/officeDocument/2006/relationships" r:embed="R26496793e81b4d8c"/>
                     <a:stretch>
                       <a:fillRect/>
                     </a:stretch>
@@ -5824,7 +5824,7 @@
                     <pic:cNvPicPr/>
                   </pic:nvPicPr>
                   <pic:blipFill>
-                    <a:blip xmlns:r="http://schemas.openxmlformats.org/officeDocument/2006/relationships" r:embed="Rdfc06904f59941a0"/>
+                    <a:blip xmlns:r="http://schemas.openxmlformats.org/officeDocument/2006/relationships" r:embed="Rb482fa283f4347d6"/>
                     <a:stretch>
                       <a:fillRect/>
                     </a:stretch>

</xml_diff>

<commit_message>
fix(er): tune Bezier pulls for shoulder curves
Increase horizontal pull and flatten target-side vertical pull so ORDER/PRODUCT -> LINE_ITEM curves sweep and enter corner anchors more like Mermaid.

Made-with: Cursor
</commit_message>
<xml_diff>
--- a/test.docx
+++ b/test.docx
@@ -236,7 +236,7 @@
       <w:r>
         <w:t xml:space="preserve">, and </w:t>
       </w:r>
-      <w:hyperlink xmlns:r="http://schemas.openxmlformats.org/officeDocument/2006/relationships" w:history="true" r:id="Ree0369d146da40d7">
+      <w:hyperlink xmlns:r="http://schemas.openxmlformats.org/officeDocument/2006/relationships" w:history="true" r:id="R47ea85da70eb4853">
         <w:r>
           <w:rPr>
             <w:rStyle w:val="Hyperlink"/>
@@ -475,7 +475,7 @@
       <w:r>
         <w:t xml:space="preserve">Direct link: </w:t>
       </w:r>
-      <w:hyperlink xmlns:r="http://schemas.openxmlformats.org/officeDocument/2006/relationships" w:history="true" r:id="R40b019fdd029420d">
+      <w:hyperlink xmlns:r="http://schemas.openxmlformats.org/officeDocument/2006/relationships" w:history="true" r:id="Rf07eacb372cd4726">
         <w:r>
           <w:rPr>
             <w:rStyle w:val="Hyperlink"/>
@@ -496,7 +496,7 @@
       <w:r>
         <w:t xml:space="preserve">Direct link with title: </w:t>
       </w:r>
-      <w:hyperlink xmlns:r="http://schemas.openxmlformats.org/officeDocument/2006/relationships" w:history="true" r:id="R43c117f4002c4c85">
+      <w:hyperlink xmlns:r="http://schemas.openxmlformats.org/officeDocument/2006/relationships" w:history="true" r:id="R14c2aa14827949e0">
         <w:r>
           <w:rPr>
             <w:rStyle w:val="Hyperlink"/>
@@ -517,7 +517,7 @@
       <w:r>
         <w:t xml:space="preserve">Reference-style link: </w:t>
       </w:r>
-      <w:hyperlink xmlns:r="http://schemas.openxmlformats.org/officeDocument/2006/relationships" w:history="true" r:id="Rcef06092a1634714">
+      <w:hyperlink xmlns:r="http://schemas.openxmlformats.org/officeDocument/2006/relationships" w:history="true" r:id="R404854d32d3c4f1d">
         <w:r>
           <w:rPr>
             <w:rStyle w:val="Hyperlink"/>
@@ -538,7 +538,7 @@
       <w:r>
         <w:t xml:space="preserve">Collapsed reference link: </w:t>
       </w:r>
-      <w:hyperlink xmlns:r="http://schemas.openxmlformats.org/officeDocument/2006/relationships" w:history="true" r:id="Reccc91c3301a4d5d">
+      <w:hyperlink xmlns:r="http://schemas.openxmlformats.org/officeDocument/2006/relationships" w:history="true" r:id="R394725c0d9fd4234">
         <w:r>
           <w:rPr>
             <w:rStyle w:val="Hyperlink"/>
@@ -559,7 +559,7 @@
       <w:r>
         <w:t xml:space="preserve">Repeated reference link: </w:t>
       </w:r>
-      <w:hyperlink xmlns:r="http://schemas.openxmlformats.org/officeDocument/2006/relationships" w:history="true" r:id="Rfc32e5bb9a924e93">
+      <w:hyperlink xmlns:r="http://schemas.openxmlformats.org/officeDocument/2006/relationships" w:history="true" r:id="R9f4ed50417a84b63">
         <w:r>
           <w:rPr>
             <w:rStyle w:val="Hyperlink"/>
@@ -580,7 +580,7 @@
       <w:r>
         <w:t xml:space="preserve">Autolink URL: </w:t>
       </w:r>
-      <w:hyperlink xmlns:r="http://schemas.openxmlformats.org/officeDocument/2006/relationships" w:history="true" r:id="R478bd4e08e064a61">
+      <w:hyperlink xmlns:r="http://schemas.openxmlformats.org/officeDocument/2006/relationships" w:history="true" r:id="R135fb42b2fcc4484">
         <w:r>
           <w:rPr>
             <w:rStyle w:val="Hyperlink"/>
@@ -601,7 +601,7 @@
       <w:r>
         <w:t xml:space="preserve">Autolink email: </w:t>
       </w:r>
-      <w:hyperlink xmlns:r="http://schemas.openxmlformats.org/officeDocument/2006/relationships" w:history="true" r:id="R404e12ea56e34b6a">
+      <w:hyperlink xmlns:r="http://schemas.openxmlformats.org/officeDocument/2006/relationships" w:history="true" r:id="R66b7b0ab12d44eaa">
         <w:r>
           <w:rPr>
             <w:rStyle w:val="Hyperlink"/>
@@ -700,7 +700,7 @@
       <w:r>
         <w:t xml:space="preserve">, and </w:t>
       </w:r>
-      <w:hyperlink xmlns:r="http://schemas.openxmlformats.org/officeDocument/2006/relationships" w:history="true" r:id="R48a8398dae5148be">
+      <w:hyperlink xmlns:r="http://schemas.openxmlformats.org/officeDocument/2006/relationships" w:history="true" r:id="R179597905f924bcf">
         <w:r>
           <w:rPr>
             <w:rStyle w:val="Hyperlink"/>
@@ -1093,7 +1093,7 @@
       <w:r>
         <w:t xml:space="preserve">Continuation paragraph with </w:t>
       </w:r>
-      <w:hyperlink xmlns:r="http://schemas.openxmlformats.org/officeDocument/2006/relationships" w:history="true" r:id="R8056a91d6a9e4aee">
+      <w:hyperlink xmlns:r="http://schemas.openxmlformats.org/officeDocument/2006/relationships" w:history="true" r:id="Rc07b3f010a164c71">
         <w:r>
           <w:rPr>
             <w:rStyle w:val="Hyperlink"/>
@@ -1591,7 +1591,7 @@
       <w:r>
         <w:t xml:space="preserve">, and </w:t>
       </w:r>
-      <w:hyperlink xmlns:r="http://schemas.openxmlformats.org/officeDocument/2006/relationships" w:history="true" r:id="Rfff7cb61474f423e">
+      <w:hyperlink xmlns:r="http://schemas.openxmlformats.org/officeDocument/2006/relationships" w:history="true" r:id="Rda21cdb5cfc14ea4">
         <w:r>
           <w:rPr>
             <w:rStyle w:val="Hyperlink"/>
@@ -1979,7 +1979,7 @@
                     <pic:cNvPicPr/>
                   </pic:nvPicPr>
                   <pic:blipFill>
-                    <a:blip xmlns:r="http://schemas.openxmlformats.org/officeDocument/2006/relationships" r:embed="Ra007067dec0e47bc"/>
+                    <a:blip xmlns:r="http://schemas.openxmlformats.org/officeDocument/2006/relationships" r:embed="R295e1ea20eb441d1"/>
                     <a:stretch>
                       <a:fillRect/>
                     </a:stretch>
@@ -2039,7 +2039,7 @@
                     <pic:cNvPicPr/>
                   </pic:nvPicPr>
                   <pic:blipFill>
-                    <a:blip xmlns:r="http://schemas.openxmlformats.org/officeDocument/2006/relationships" r:embed="R4f946593bc414ec0"/>
+                    <a:blip xmlns:r="http://schemas.openxmlformats.org/officeDocument/2006/relationships" r:embed="R436ab5b1537c4f43"/>
                     <a:stretch>
                       <a:fillRect/>
                     </a:stretch>
@@ -2099,7 +2099,7 @@
                     <pic:cNvPicPr/>
                   </pic:nvPicPr>
                   <pic:blipFill>
-                    <a:blip xmlns:r="http://schemas.openxmlformats.org/officeDocument/2006/relationships" r:embed="Rfcfd2b937bf04e73"/>
+                    <a:blip xmlns:r="http://schemas.openxmlformats.org/officeDocument/2006/relationships" r:embed="Rd5b67e244ffe419d"/>
                     <a:stretch>
                       <a:fillRect/>
                     </a:stretch>
@@ -2150,7 +2150,7 @@
                     <pic:cNvPicPr/>
                   </pic:nvPicPr>
                   <pic:blipFill>
-                    <a:blip xmlns:r="http://schemas.openxmlformats.org/officeDocument/2006/relationships" r:embed="R05c29b00bc2647e8"/>
+                    <a:blip xmlns:r="http://schemas.openxmlformats.org/officeDocument/2006/relationships" r:embed="Rdcf1b4910e964a7c"/>
                     <a:stretch>
                       <a:fillRect/>
                     </a:stretch>
@@ -2201,7 +2201,7 @@
                     <pic:cNvPicPr/>
                   </pic:nvPicPr>
                   <pic:blipFill>
-                    <a:blip xmlns:r="http://schemas.openxmlformats.org/officeDocument/2006/relationships" r:embed="Rf6fe1690672d4438"/>
+                    <a:blip xmlns:r="http://schemas.openxmlformats.org/officeDocument/2006/relationships" r:embed="R88b3dc074f36437f"/>
                     <a:stretch>
                       <a:fillRect/>
                     </a:stretch>
@@ -2252,7 +2252,7 @@
                     <pic:cNvPicPr/>
                   </pic:nvPicPr>
                   <pic:blipFill>
-                    <a:blip xmlns:r="http://schemas.openxmlformats.org/officeDocument/2006/relationships" r:embed="Rf2ed7eda8f18412c"/>
+                    <a:blip xmlns:r="http://schemas.openxmlformats.org/officeDocument/2006/relationships" r:embed="Rf15a6531688b4a3f"/>
                     <a:stretch>
                       <a:fillRect/>
                     </a:stretch>
@@ -2303,7 +2303,7 @@
                     <pic:cNvPicPr/>
                   </pic:nvPicPr>
                   <pic:blipFill>
-                    <a:blip xmlns:r="http://schemas.openxmlformats.org/officeDocument/2006/relationships" r:embed="R03c50e57271c4449"/>
+                    <a:blip xmlns:r="http://schemas.openxmlformats.org/officeDocument/2006/relationships" r:embed="Rbf70ae947a4e4fe9"/>
                     <a:stretch>
                       <a:fillRect/>
                     </a:stretch>
@@ -2354,7 +2354,7 @@
                     <pic:cNvPicPr/>
                   </pic:nvPicPr>
                   <pic:blipFill>
-                    <a:blip xmlns:r="http://schemas.openxmlformats.org/officeDocument/2006/relationships" r:embed="R1107f80a65e742b9"/>
+                    <a:blip xmlns:r="http://schemas.openxmlformats.org/officeDocument/2006/relationships" r:embed="R21950b1b9aa14e8b"/>
                     <a:stretch>
                       <a:fillRect/>
                     </a:stretch>
@@ -2430,7 +2430,7 @@
                     <pic:cNvPicPr/>
                   </pic:nvPicPr>
                   <pic:blipFill>
-                    <a:blip xmlns:r="http://schemas.openxmlformats.org/officeDocument/2006/relationships" r:embed="R9b8dcbe6a5c3410a"/>
+                    <a:blip xmlns:r="http://schemas.openxmlformats.org/officeDocument/2006/relationships" r:embed="R272da72d164d450a"/>
                     <a:stretch>
                       <a:fillRect/>
                     </a:stretch>
@@ -2481,7 +2481,7 @@
                     <pic:cNvPicPr/>
                   </pic:nvPicPr>
                   <pic:blipFill>
-                    <a:blip xmlns:r="http://schemas.openxmlformats.org/officeDocument/2006/relationships" r:embed="R69971afb754042a1"/>
+                    <a:blip xmlns:r="http://schemas.openxmlformats.org/officeDocument/2006/relationships" r:embed="R32682ed795e94190"/>
                     <a:stretch>
                       <a:fillRect/>
                     </a:stretch>
@@ -2532,7 +2532,7 @@
                     <pic:cNvPicPr/>
                   </pic:nvPicPr>
                   <pic:blipFill>
-                    <a:blip xmlns:r="http://schemas.openxmlformats.org/officeDocument/2006/relationships" r:embed="Ra40251cfacb347c2"/>
+                    <a:blip xmlns:r="http://schemas.openxmlformats.org/officeDocument/2006/relationships" r:embed="R7cc0c265eeb04977"/>
                     <a:stretch>
                       <a:fillRect/>
                     </a:stretch>
@@ -2583,7 +2583,7 @@
                     <pic:cNvPicPr/>
                   </pic:nvPicPr>
                   <pic:blipFill>
-                    <a:blip xmlns:r="http://schemas.openxmlformats.org/officeDocument/2006/relationships" r:embed="R4c52f4eb7d484b59"/>
+                    <a:blip xmlns:r="http://schemas.openxmlformats.org/officeDocument/2006/relationships" r:embed="R72b9a0b22c6e465c"/>
                     <a:stretch>
                       <a:fillRect/>
                     </a:stretch>
@@ -2659,7 +2659,7 @@
                     <pic:cNvPicPr/>
                   </pic:nvPicPr>
                   <pic:blipFill>
-                    <a:blip xmlns:r="http://schemas.openxmlformats.org/officeDocument/2006/relationships" r:embed="R7a99e75416ac4be9"/>
+                    <a:blip xmlns:r="http://schemas.openxmlformats.org/officeDocument/2006/relationships" r:embed="Rf6d11bce4b824ab9"/>
                     <a:stretch>
                       <a:fillRect/>
                     </a:stretch>
@@ -2710,7 +2710,7 @@
                     <pic:cNvPicPr/>
                   </pic:nvPicPr>
                   <pic:blipFill>
-                    <a:blip xmlns:r="http://schemas.openxmlformats.org/officeDocument/2006/relationships" r:embed="R41862f4854df4f6c"/>
+                    <a:blip xmlns:r="http://schemas.openxmlformats.org/officeDocument/2006/relationships" r:embed="Re6f2af7b3ac64d7d"/>
                     <a:stretch>
                       <a:fillRect/>
                     </a:stretch>
@@ -2761,7 +2761,7 @@
                     <pic:cNvPicPr/>
                   </pic:nvPicPr>
                   <pic:blipFill>
-                    <a:blip xmlns:r="http://schemas.openxmlformats.org/officeDocument/2006/relationships" r:embed="R4122ca01433340d4"/>
+                    <a:blip xmlns:r="http://schemas.openxmlformats.org/officeDocument/2006/relationships" r:embed="Rf286222307e64e8d"/>
                     <a:stretch>
                       <a:fillRect/>
                     </a:stretch>
@@ -2812,7 +2812,7 @@
                     <pic:cNvPicPr/>
                   </pic:nvPicPr>
                   <pic:blipFill>
-                    <a:blip xmlns:r="http://schemas.openxmlformats.org/officeDocument/2006/relationships" r:embed="R9c0b6757af69496a"/>
+                    <a:blip xmlns:r="http://schemas.openxmlformats.org/officeDocument/2006/relationships" r:embed="Rac0dd77ac1ec4a41"/>
                     <a:stretch>
                       <a:fillRect/>
                     </a:stretch>
@@ -2863,7 +2863,7 @@
                     <pic:cNvPicPr/>
                   </pic:nvPicPr>
                   <pic:blipFill>
-                    <a:blip xmlns:r="http://schemas.openxmlformats.org/officeDocument/2006/relationships" r:embed="R477495a7ab9f4621"/>
+                    <a:blip xmlns:r="http://schemas.openxmlformats.org/officeDocument/2006/relationships" r:embed="Ra3a53dc35391445c"/>
                     <a:stretch>
                       <a:fillRect/>
                     </a:stretch>
@@ -2914,7 +2914,7 @@
                     <pic:cNvPicPr/>
                   </pic:nvPicPr>
                   <pic:blipFill>
-                    <a:blip xmlns:r="http://schemas.openxmlformats.org/officeDocument/2006/relationships" r:embed="R3d6679f4f7494ecf"/>
+                    <a:blip xmlns:r="http://schemas.openxmlformats.org/officeDocument/2006/relationships" r:embed="R5f3b70b6a128405f"/>
                     <a:stretch>
                       <a:fillRect/>
                     </a:stretch>
@@ -2965,7 +2965,7 @@
                     <pic:cNvPicPr/>
                   </pic:nvPicPr>
                   <pic:blipFill>
-                    <a:blip xmlns:r="http://schemas.openxmlformats.org/officeDocument/2006/relationships" r:embed="Rb71edc86dc274f6b"/>
+                    <a:blip xmlns:r="http://schemas.openxmlformats.org/officeDocument/2006/relationships" r:embed="Rb9a39fd03cc04fbe"/>
                     <a:stretch>
                       <a:fillRect/>
                     </a:stretch>
@@ -3016,7 +3016,7 @@
                     <pic:cNvPicPr/>
                   </pic:nvPicPr>
                   <pic:blipFill>
-                    <a:blip xmlns:r="http://schemas.openxmlformats.org/officeDocument/2006/relationships" r:embed="R1bade156af914459"/>
+                    <a:blip xmlns:r="http://schemas.openxmlformats.org/officeDocument/2006/relationships" r:embed="R4b854a8f641a4c60"/>
                     <a:stretch>
                       <a:fillRect/>
                     </a:stretch>
@@ -3067,7 +3067,7 @@
                     <pic:cNvPicPr/>
                   </pic:nvPicPr>
                   <pic:blipFill>
-                    <a:blip xmlns:r="http://schemas.openxmlformats.org/officeDocument/2006/relationships" r:embed="R332737e501c94b76"/>
+                    <a:blip xmlns:r="http://schemas.openxmlformats.org/officeDocument/2006/relationships" r:embed="Rd87cae957ef24563"/>
                     <a:stretch>
                       <a:fillRect/>
                     </a:stretch>
@@ -3118,7 +3118,7 @@
                     <pic:cNvPicPr/>
                   </pic:nvPicPr>
                   <pic:blipFill>
-                    <a:blip xmlns:r="http://schemas.openxmlformats.org/officeDocument/2006/relationships" r:embed="R42ed5151d7ec42b9"/>
+                    <a:blip xmlns:r="http://schemas.openxmlformats.org/officeDocument/2006/relationships" r:embed="R028c3af4a8bf4186"/>
                     <a:stretch>
                       <a:fillRect/>
                     </a:stretch>
@@ -3169,7 +3169,7 @@
                     <pic:cNvPicPr/>
                   </pic:nvPicPr>
                   <pic:blipFill>
-                    <a:blip xmlns:r="http://schemas.openxmlformats.org/officeDocument/2006/relationships" r:embed="Re0c3c7b552344ec8"/>
+                    <a:blip xmlns:r="http://schemas.openxmlformats.org/officeDocument/2006/relationships" r:embed="R6241a758e75740b4"/>
                     <a:stretch>
                       <a:fillRect/>
                     </a:stretch>
@@ -3220,7 +3220,7 @@
                     <pic:cNvPicPr/>
                   </pic:nvPicPr>
                   <pic:blipFill>
-                    <a:blip xmlns:r="http://schemas.openxmlformats.org/officeDocument/2006/relationships" r:embed="R72b1966b30154418"/>
+                    <a:blip xmlns:r="http://schemas.openxmlformats.org/officeDocument/2006/relationships" r:embed="R8cbe3bd11b534def"/>
                     <a:stretch>
                       <a:fillRect/>
                     </a:stretch>
@@ -3271,7 +3271,7 @@
                     <pic:cNvPicPr/>
                   </pic:nvPicPr>
                   <pic:blipFill>
-                    <a:blip xmlns:r="http://schemas.openxmlformats.org/officeDocument/2006/relationships" r:embed="R20a9645f24f34642"/>
+                    <a:blip xmlns:r="http://schemas.openxmlformats.org/officeDocument/2006/relationships" r:embed="R79099a998fe940c7"/>
                     <a:stretch>
                       <a:fillRect/>
                     </a:stretch>
@@ -3322,7 +3322,7 @@
                     <pic:cNvPicPr/>
                   </pic:nvPicPr>
                   <pic:blipFill>
-                    <a:blip xmlns:r="http://schemas.openxmlformats.org/officeDocument/2006/relationships" r:embed="Rcfe1d6d8b5b84b3e"/>
+                    <a:blip xmlns:r="http://schemas.openxmlformats.org/officeDocument/2006/relationships" r:embed="Rdab7a95bbb99449e"/>
                     <a:stretch>
                       <a:fillRect/>
                     </a:stretch>
@@ -3419,7 +3419,7 @@
                     <pic:cNvPicPr/>
                   </pic:nvPicPr>
                   <pic:blipFill>
-                    <a:blip xmlns:r="http://schemas.openxmlformats.org/officeDocument/2006/relationships" r:embed="R89be13139b074979"/>
+                    <a:blip xmlns:r="http://schemas.openxmlformats.org/officeDocument/2006/relationships" r:embed="Re12f70e38e1b4f49"/>
                     <a:stretch>
                       <a:fillRect/>
                     </a:stretch>
@@ -3462,7 +3462,7 @@
                     <pic:cNvPicPr/>
                   </pic:nvPicPr>
                   <pic:blipFill>
-                    <a:blip xmlns:r="http://schemas.openxmlformats.org/officeDocument/2006/relationships" r:embed="R3ff7cd07896b4216"/>
+                    <a:blip xmlns:r="http://schemas.openxmlformats.org/officeDocument/2006/relationships" r:embed="R6754f1a55ca646ee"/>
                     <a:stretch>
                       <a:fillRect/>
                     </a:stretch>
@@ -3505,7 +3505,7 @@
                     <pic:cNvPicPr/>
                   </pic:nvPicPr>
                   <pic:blipFill>
-                    <a:blip xmlns:r="http://schemas.openxmlformats.org/officeDocument/2006/relationships" r:embed="R6e5249c4fe964e37"/>
+                    <a:blip xmlns:r="http://schemas.openxmlformats.org/officeDocument/2006/relationships" r:embed="Rd706529de8aa43ba"/>
                     <a:stretch>
                       <a:fillRect/>
                     </a:stretch>
@@ -3548,7 +3548,7 @@
                     <pic:cNvPicPr/>
                   </pic:nvPicPr>
                   <pic:blipFill>
-                    <a:blip xmlns:r="http://schemas.openxmlformats.org/officeDocument/2006/relationships" r:embed="Re91b974c70444eae"/>
+                    <a:blip xmlns:r="http://schemas.openxmlformats.org/officeDocument/2006/relationships" r:embed="R046d5265593b4020"/>
                     <a:stretch>
                       <a:fillRect/>
                     </a:stretch>
@@ -3933,7 +3933,7 @@
                     <pic:cNvPicPr/>
                   </pic:nvPicPr>
                   <pic:blipFill>
-                    <a:blip xmlns:r="http://schemas.openxmlformats.org/officeDocument/2006/relationships" r:embed="Ree59542a76264546"/>
+                    <a:blip xmlns:r="http://schemas.openxmlformats.org/officeDocument/2006/relationships" r:embed="Rd84d02e148134ead"/>
                     <a:stretch>
                       <a:fillRect/>
                     </a:stretch>
@@ -4125,7 +4125,7 @@
                     <pic:cNvPicPr/>
                   </pic:nvPicPr>
                   <pic:blipFill>
-                    <a:blip xmlns:r="http://schemas.openxmlformats.org/officeDocument/2006/relationships" r:embed="R57f417e0d6004295"/>
+                    <a:blip xmlns:r="http://schemas.openxmlformats.org/officeDocument/2006/relationships" r:embed="Rda4d754407f24748"/>
                     <a:stretch>
                       <a:fillRect/>
                     </a:stretch>
@@ -4176,7 +4176,7 @@
                     <pic:cNvPicPr/>
                   </pic:nvPicPr>
                   <pic:blipFill>
-                    <a:blip xmlns:r="http://schemas.openxmlformats.org/officeDocument/2006/relationships" r:embed="R819bec850710422b"/>
+                    <a:blip xmlns:r="http://schemas.openxmlformats.org/officeDocument/2006/relationships" r:embed="Rd794c5c1e9494a6c"/>
                     <a:stretch>
                       <a:fillRect/>
                     </a:stretch>
@@ -4227,7 +4227,7 @@
                     <pic:cNvPicPr/>
                   </pic:nvPicPr>
                   <pic:blipFill>
-                    <a:blip xmlns:r="http://schemas.openxmlformats.org/officeDocument/2006/relationships" r:embed="Rb929ab2614464ff7"/>
+                    <a:blip xmlns:r="http://schemas.openxmlformats.org/officeDocument/2006/relationships" r:embed="R7a18aad7e31c4187"/>
                     <a:stretch>
                       <a:fillRect/>
                     </a:stretch>
@@ -4278,7 +4278,7 @@
                     <pic:cNvPicPr/>
                   </pic:nvPicPr>
                   <pic:blipFill>
-                    <a:blip xmlns:r="http://schemas.openxmlformats.org/officeDocument/2006/relationships" r:embed="R5b634413a68b4987"/>
+                    <a:blip xmlns:r="http://schemas.openxmlformats.org/officeDocument/2006/relationships" r:embed="R492cec06cde94b35"/>
                     <a:stretch>
                       <a:fillRect/>
                     </a:stretch>
@@ -4657,7 +4657,7 @@
                     <pic:cNvPicPr/>
                   </pic:nvPicPr>
                   <pic:blipFill>
-                    <a:blip xmlns:r="http://schemas.openxmlformats.org/officeDocument/2006/relationships" r:embed="R51ceec0fe33a4209"/>
+                    <a:blip xmlns:r="http://schemas.openxmlformats.org/officeDocument/2006/relationships" r:embed="R38d74f50f7b34ea0"/>
                     <a:stretch>
                       <a:fillRect/>
                     </a:stretch>
@@ -5338,7 +5338,7 @@
             <w:r>
               <w:t xml:space="preserve">Cell with </w:t>
             </w:r>
-            <w:hyperlink xmlns:r="http://schemas.openxmlformats.org/officeDocument/2006/relationships" w:history="true" r:id="R512d3624f6674a0a">
+            <w:hyperlink xmlns:r="http://schemas.openxmlformats.org/officeDocument/2006/relationships" w:history="true" r:id="Rf35d4879e52c418b">
               <w:r>
                 <w:rPr>
                   <w:rStyle w:val="Hyperlink"/>
@@ -5624,7 +5624,7 @@
                           <pic:cNvPicPr/>
                         </pic:nvPicPr>
                         <pic:blipFill>
-                          <a:blip xmlns:r="http://schemas.openxmlformats.org/officeDocument/2006/relationships" r:embed="Red0e5f10873c4e1b"/>
+                          <a:blip xmlns:r="http://schemas.openxmlformats.org/officeDocument/2006/relationships" r:embed="R1773a31980194604"/>
                           <a:stretch>
                             <a:fillRect/>
                           </a:stretch>
@@ -5724,7 +5724,7 @@
                     <pic:cNvPicPr/>
                   </pic:nvPicPr>
                   <pic:blipFill>
-                    <a:blip xmlns:r="http://schemas.openxmlformats.org/officeDocument/2006/relationships" r:embed="R4dfd986c10044570"/>
+                    <a:blip xmlns:r="http://schemas.openxmlformats.org/officeDocument/2006/relationships" r:embed="R369753c0f90e4717"/>
                     <a:stretch>
                       <a:fillRect/>
                     </a:stretch>
@@ -5774,7 +5774,7 @@
                     <pic:cNvPicPr/>
                   </pic:nvPicPr>
                   <pic:blipFill>
-                    <a:blip xmlns:r="http://schemas.openxmlformats.org/officeDocument/2006/relationships" r:embed="R26496793e81b4d8c"/>
+                    <a:blip xmlns:r="http://schemas.openxmlformats.org/officeDocument/2006/relationships" r:embed="Rc7611fab7c7248e1"/>
                     <a:stretch>
                       <a:fillRect/>
                     </a:stretch>
@@ -5824,7 +5824,7 @@
                     <pic:cNvPicPr/>
                   </pic:nvPicPr>
                   <pic:blipFill>
-                    <a:blip xmlns:r="http://schemas.openxmlformats.org/officeDocument/2006/relationships" r:embed="Rb482fa283f4347d6"/>
+                    <a:blip xmlns:r="http://schemas.openxmlformats.org/officeDocument/2006/relationships" r:embed="R0a93e8c1f3084d34"/>
                     <a:stretch>
                       <a:fillRect/>
                     </a:stretch>

</xml_diff>

<commit_message>
fix(er): use Mermaid-style SVG markers for cardinalities
Emit Mermaid ER <marker> definitions and apply them via marker-start/marker-end on relationship paths to match reference crowfoot curvature and sizing.

Made-with: Cursor
</commit_message>
<xml_diff>
--- a/test.docx
+++ b/test.docx
@@ -236,7 +236,7 @@
       <w:r>
         <w:t xml:space="preserve">, and </w:t>
       </w:r>
-      <w:hyperlink xmlns:r="http://schemas.openxmlformats.org/officeDocument/2006/relationships" w:history="true" r:id="R47ea85da70eb4853">
+      <w:hyperlink xmlns:r="http://schemas.openxmlformats.org/officeDocument/2006/relationships" w:history="true" r:id="Ra07d7f869e42468b">
         <w:r>
           <w:rPr>
             <w:rStyle w:val="Hyperlink"/>
@@ -475,7 +475,7 @@
       <w:r>
         <w:t xml:space="preserve">Direct link: </w:t>
       </w:r>
-      <w:hyperlink xmlns:r="http://schemas.openxmlformats.org/officeDocument/2006/relationships" w:history="true" r:id="Rf07eacb372cd4726">
+      <w:hyperlink xmlns:r="http://schemas.openxmlformats.org/officeDocument/2006/relationships" w:history="true" r:id="Rae858508087d4b65">
         <w:r>
           <w:rPr>
             <w:rStyle w:val="Hyperlink"/>
@@ -496,7 +496,7 @@
       <w:r>
         <w:t xml:space="preserve">Direct link with title: </w:t>
       </w:r>
-      <w:hyperlink xmlns:r="http://schemas.openxmlformats.org/officeDocument/2006/relationships" w:history="true" r:id="R14c2aa14827949e0">
+      <w:hyperlink xmlns:r="http://schemas.openxmlformats.org/officeDocument/2006/relationships" w:history="true" r:id="R247478403c3f4a84">
         <w:r>
           <w:rPr>
             <w:rStyle w:val="Hyperlink"/>
@@ -517,7 +517,7 @@
       <w:r>
         <w:t xml:space="preserve">Reference-style link: </w:t>
       </w:r>
-      <w:hyperlink xmlns:r="http://schemas.openxmlformats.org/officeDocument/2006/relationships" w:history="true" r:id="R404854d32d3c4f1d">
+      <w:hyperlink xmlns:r="http://schemas.openxmlformats.org/officeDocument/2006/relationships" w:history="true" r:id="Ra6cd0421df5b4b2d">
         <w:r>
           <w:rPr>
             <w:rStyle w:val="Hyperlink"/>
@@ -538,7 +538,7 @@
       <w:r>
         <w:t xml:space="preserve">Collapsed reference link: </w:t>
       </w:r>
-      <w:hyperlink xmlns:r="http://schemas.openxmlformats.org/officeDocument/2006/relationships" w:history="true" r:id="R394725c0d9fd4234">
+      <w:hyperlink xmlns:r="http://schemas.openxmlformats.org/officeDocument/2006/relationships" w:history="true" r:id="Re26bff97c22e4035">
         <w:r>
           <w:rPr>
             <w:rStyle w:val="Hyperlink"/>
@@ -559,7 +559,7 @@
       <w:r>
         <w:t xml:space="preserve">Repeated reference link: </w:t>
       </w:r>
-      <w:hyperlink xmlns:r="http://schemas.openxmlformats.org/officeDocument/2006/relationships" w:history="true" r:id="R9f4ed50417a84b63">
+      <w:hyperlink xmlns:r="http://schemas.openxmlformats.org/officeDocument/2006/relationships" w:history="true" r:id="R7b5857336c314b3f">
         <w:r>
           <w:rPr>
             <w:rStyle w:val="Hyperlink"/>
@@ -580,7 +580,7 @@
       <w:r>
         <w:t xml:space="preserve">Autolink URL: </w:t>
       </w:r>
-      <w:hyperlink xmlns:r="http://schemas.openxmlformats.org/officeDocument/2006/relationships" w:history="true" r:id="R135fb42b2fcc4484">
+      <w:hyperlink xmlns:r="http://schemas.openxmlformats.org/officeDocument/2006/relationships" w:history="true" r:id="R048c4eff0ea340e1">
         <w:r>
           <w:rPr>
             <w:rStyle w:val="Hyperlink"/>
@@ -601,7 +601,7 @@
       <w:r>
         <w:t xml:space="preserve">Autolink email: </w:t>
       </w:r>
-      <w:hyperlink xmlns:r="http://schemas.openxmlformats.org/officeDocument/2006/relationships" w:history="true" r:id="R66b7b0ab12d44eaa">
+      <w:hyperlink xmlns:r="http://schemas.openxmlformats.org/officeDocument/2006/relationships" w:history="true" r:id="Rad7c54ca59a047be">
         <w:r>
           <w:rPr>
             <w:rStyle w:val="Hyperlink"/>
@@ -700,7 +700,7 @@
       <w:r>
         <w:t xml:space="preserve">, and </w:t>
       </w:r>
-      <w:hyperlink xmlns:r="http://schemas.openxmlformats.org/officeDocument/2006/relationships" w:history="true" r:id="R179597905f924bcf">
+      <w:hyperlink xmlns:r="http://schemas.openxmlformats.org/officeDocument/2006/relationships" w:history="true" r:id="Rcc3ac5b19d2e4607">
         <w:r>
           <w:rPr>
             <w:rStyle w:val="Hyperlink"/>
@@ -1093,7 +1093,7 @@
       <w:r>
         <w:t xml:space="preserve">Continuation paragraph with </w:t>
       </w:r>
-      <w:hyperlink xmlns:r="http://schemas.openxmlformats.org/officeDocument/2006/relationships" w:history="true" r:id="Rc07b3f010a164c71">
+      <w:hyperlink xmlns:r="http://schemas.openxmlformats.org/officeDocument/2006/relationships" w:history="true" r:id="R646790adab564271">
         <w:r>
           <w:rPr>
             <w:rStyle w:val="Hyperlink"/>
@@ -1591,7 +1591,7 @@
       <w:r>
         <w:t xml:space="preserve">, and </w:t>
       </w:r>
-      <w:hyperlink xmlns:r="http://schemas.openxmlformats.org/officeDocument/2006/relationships" w:history="true" r:id="Rda21cdb5cfc14ea4">
+      <w:hyperlink xmlns:r="http://schemas.openxmlformats.org/officeDocument/2006/relationships" w:history="true" r:id="Rc11844e08b7b4745">
         <w:r>
           <w:rPr>
             <w:rStyle w:val="Hyperlink"/>
@@ -1979,7 +1979,7 @@
                     <pic:cNvPicPr/>
                   </pic:nvPicPr>
                   <pic:blipFill>
-                    <a:blip xmlns:r="http://schemas.openxmlformats.org/officeDocument/2006/relationships" r:embed="R295e1ea20eb441d1"/>
+                    <a:blip xmlns:r="http://schemas.openxmlformats.org/officeDocument/2006/relationships" r:embed="Rd055984c671743a5"/>
                     <a:stretch>
                       <a:fillRect/>
                     </a:stretch>
@@ -2039,7 +2039,7 @@
                     <pic:cNvPicPr/>
                   </pic:nvPicPr>
                   <pic:blipFill>
-                    <a:blip xmlns:r="http://schemas.openxmlformats.org/officeDocument/2006/relationships" r:embed="R436ab5b1537c4f43"/>
+                    <a:blip xmlns:r="http://schemas.openxmlformats.org/officeDocument/2006/relationships" r:embed="R167151c84f8c4634"/>
                     <a:stretch>
                       <a:fillRect/>
                     </a:stretch>
@@ -2099,7 +2099,7 @@
                     <pic:cNvPicPr/>
                   </pic:nvPicPr>
                   <pic:blipFill>
-                    <a:blip xmlns:r="http://schemas.openxmlformats.org/officeDocument/2006/relationships" r:embed="Rd5b67e244ffe419d"/>
+                    <a:blip xmlns:r="http://schemas.openxmlformats.org/officeDocument/2006/relationships" r:embed="R239470f70836493c"/>
                     <a:stretch>
                       <a:fillRect/>
                     </a:stretch>
@@ -2150,7 +2150,7 @@
                     <pic:cNvPicPr/>
                   </pic:nvPicPr>
                   <pic:blipFill>
-                    <a:blip xmlns:r="http://schemas.openxmlformats.org/officeDocument/2006/relationships" r:embed="Rdcf1b4910e964a7c"/>
+                    <a:blip xmlns:r="http://schemas.openxmlformats.org/officeDocument/2006/relationships" r:embed="Re5f6422a141e46fa"/>
                     <a:stretch>
                       <a:fillRect/>
                     </a:stretch>
@@ -2201,7 +2201,7 @@
                     <pic:cNvPicPr/>
                   </pic:nvPicPr>
                   <pic:blipFill>
-                    <a:blip xmlns:r="http://schemas.openxmlformats.org/officeDocument/2006/relationships" r:embed="R88b3dc074f36437f"/>
+                    <a:blip xmlns:r="http://schemas.openxmlformats.org/officeDocument/2006/relationships" r:embed="R82959f09f24a401d"/>
                     <a:stretch>
                       <a:fillRect/>
                     </a:stretch>
@@ -2252,7 +2252,7 @@
                     <pic:cNvPicPr/>
                   </pic:nvPicPr>
                   <pic:blipFill>
-                    <a:blip xmlns:r="http://schemas.openxmlformats.org/officeDocument/2006/relationships" r:embed="Rf15a6531688b4a3f"/>
+                    <a:blip xmlns:r="http://schemas.openxmlformats.org/officeDocument/2006/relationships" r:embed="Rdcfca797a3f54c32"/>
                     <a:stretch>
                       <a:fillRect/>
                     </a:stretch>
@@ -2303,7 +2303,7 @@
                     <pic:cNvPicPr/>
                   </pic:nvPicPr>
                   <pic:blipFill>
-                    <a:blip xmlns:r="http://schemas.openxmlformats.org/officeDocument/2006/relationships" r:embed="Rbf70ae947a4e4fe9"/>
+                    <a:blip xmlns:r="http://schemas.openxmlformats.org/officeDocument/2006/relationships" r:embed="R8581d12199a04e02"/>
                     <a:stretch>
                       <a:fillRect/>
                     </a:stretch>
@@ -2354,7 +2354,7 @@
                     <pic:cNvPicPr/>
                   </pic:nvPicPr>
                   <pic:blipFill>
-                    <a:blip xmlns:r="http://schemas.openxmlformats.org/officeDocument/2006/relationships" r:embed="R21950b1b9aa14e8b"/>
+                    <a:blip xmlns:r="http://schemas.openxmlformats.org/officeDocument/2006/relationships" r:embed="R6b7269ffaef54db8"/>
                     <a:stretch>
                       <a:fillRect/>
                     </a:stretch>
@@ -2430,7 +2430,7 @@
                     <pic:cNvPicPr/>
                   </pic:nvPicPr>
                   <pic:blipFill>
-                    <a:blip xmlns:r="http://schemas.openxmlformats.org/officeDocument/2006/relationships" r:embed="R272da72d164d450a"/>
+                    <a:blip xmlns:r="http://schemas.openxmlformats.org/officeDocument/2006/relationships" r:embed="R48c7f68abc714f63"/>
                     <a:stretch>
                       <a:fillRect/>
                     </a:stretch>
@@ -2481,7 +2481,7 @@
                     <pic:cNvPicPr/>
                   </pic:nvPicPr>
                   <pic:blipFill>
-                    <a:blip xmlns:r="http://schemas.openxmlformats.org/officeDocument/2006/relationships" r:embed="R32682ed795e94190"/>
+                    <a:blip xmlns:r="http://schemas.openxmlformats.org/officeDocument/2006/relationships" r:embed="R08e0240266a747ba"/>
                     <a:stretch>
                       <a:fillRect/>
                     </a:stretch>
@@ -2532,7 +2532,7 @@
                     <pic:cNvPicPr/>
                   </pic:nvPicPr>
                   <pic:blipFill>
-                    <a:blip xmlns:r="http://schemas.openxmlformats.org/officeDocument/2006/relationships" r:embed="R7cc0c265eeb04977"/>
+                    <a:blip xmlns:r="http://schemas.openxmlformats.org/officeDocument/2006/relationships" r:embed="Rc4bbf6a167e642b2"/>
                     <a:stretch>
                       <a:fillRect/>
                     </a:stretch>
@@ -2583,7 +2583,7 @@
                     <pic:cNvPicPr/>
                   </pic:nvPicPr>
                   <pic:blipFill>
-                    <a:blip xmlns:r="http://schemas.openxmlformats.org/officeDocument/2006/relationships" r:embed="R72b9a0b22c6e465c"/>
+                    <a:blip xmlns:r="http://schemas.openxmlformats.org/officeDocument/2006/relationships" r:embed="Rbc0769e831c84b87"/>
                     <a:stretch>
                       <a:fillRect/>
                     </a:stretch>
@@ -2659,7 +2659,7 @@
                     <pic:cNvPicPr/>
                   </pic:nvPicPr>
                   <pic:blipFill>
-                    <a:blip xmlns:r="http://schemas.openxmlformats.org/officeDocument/2006/relationships" r:embed="Rf6d11bce4b824ab9"/>
+                    <a:blip xmlns:r="http://schemas.openxmlformats.org/officeDocument/2006/relationships" r:embed="R23625776797f444f"/>
                     <a:stretch>
                       <a:fillRect/>
                     </a:stretch>
@@ -2710,7 +2710,7 @@
                     <pic:cNvPicPr/>
                   </pic:nvPicPr>
                   <pic:blipFill>
-                    <a:blip xmlns:r="http://schemas.openxmlformats.org/officeDocument/2006/relationships" r:embed="Re6f2af7b3ac64d7d"/>
+                    <a:blip xmlns:r="http://schemas.openxmlformats.org/officeDocument/2006/relationships" r:embed="R33bb43b162df4ac3"/>
                     <a:stretch>
                       <a:fillRect/>
                     </a:stretch>
@@ -2761,7 +2761,7 @@
                     <pic:cNvPicPr/>
                   </pic:nvPicPr>
                   <pic:blipFill>
-                    <a:blip xmlns:r="http://schemas.openxmlformats.org/officeDocument/2006/relationships" r:embed="Rf286222307e64e8d"/>
+                    <a:blip xmlns:r="http://schemas.openxmlformats.org/officeDocument/2006/relationships" r:embed="Rf776b5c237b7485c"/>
                     <a:stretch>
                       <a:fillRect/>
                     </a:stretch>
@@ -2812,7 +2812,7 @@
                     <pic:cNvPicPr/>
                   </pic:nvPicPr>
                   <pic:blipFill>
-                    <a:blip xmlns:r="http://schemas.openxmlformats.org/officeDocument/2006/relationships" r:embed="Rac0dd77ac1ec4a41"/>
+                    <a:blip xmlns:r="http://schemas.openxmlformats.org/officeDocument/2006/relationships" r:embed="Rf4fd24a37c784239"/>
                     <a:stretch>
                       <a:fillRect/>
                     </a:stretch>
@@ -2863,7 +2863,7 @@
                     <pic:cNvPicPr/>
                   </pic:nvPicPr>
                   <pic:blipFill>
-                    <a:blip xmlns:r="http://schemas.openxmlformats.org/officeDocument/2006/relationships" r:embed="Ra3a53dc35391445c"/>
+                    <a:blip xmlns:r="http://schemas.openxmlformats.org/officeDocument/2006/relationships" r:embed="Rcf459b7d456a43fa"/>
                     <a:stretch>
                       <a:fillRect/>
                     </a:stretch>
@@ -2914,7 +2914,7 @@
                     <pic:cNvPicPr/>
                   </pic:nvPicPr>
                   <pic:blipFill>
-                    <a:blip xmlns:r="http://schemas.openxmlformats.org/officeDocument/2006/relationships" r:embed="R5f3b70b6a128405f"/>
+                    <a:blip xmlns:r="http://schemas.openxmlformats.org/officeDocument/2006/relationships" r:embed="Rc2988fe51b164564"/>
                     <a:stretch>
                       <a:fillRect/>
                     </a:stretch>
@@ -2965,7 +2965,7 @@
                     <pic:cNvPicPr/>
                   </pic:nvPicPr>
                   <pic:blipFill>
-                    <a:blip xmlns:r="http://schemas.openxmlformats.org/officeDocument/2006/relationships" r:embed="Rb9a39fd03cc04fbe"/>
+                    <a:blip xmlns:r="http://schemas.openxmlformats.org/officeDocument/2006/relationships" r:embed="R2fe9b259a22a4671"/>
                     <a:stretch>
                       <a:fillRect/>
                     </a:stretch>
@@ -3016,7 +3016,7 @@
                     <pic:cNvPicPr/>
                   </pic:nvPicPr>
                   <pic:blipFill>
-                    <a:blip xmlns:r="http://schemas.openxmlformats.org/officeDocument/2006/relationships" r:embed="R4b854a8f641a4c60"/>
+                    <a:blip xmlns:r="http://schemas.openxmlformats.org/officeDocument/2006/relationships" r:embed="R9d3162e061a04e2f"/>
                     <a:stretch>
                       <a:fillRect/>
                     </a:stretch>
@@ -3067,7 +3067,7 @@
                     <pic:cNvPicPr/>
                   </pic:nvPicPr>
                   <pic:blipFill>
-                    <a:blip xmlns:r="http://schemas.openxmlformats.org/officeDocument/2006/relationships" r:embed="Rd87cae957ef24563"/>
+                    <a:blip xmlns:r="http://schemas.openxmlformats.org/officeDocument/2006/relationships" r:embed="Rd491034bc8434f60"/>
                     <a:stretch>
                       <a:fillRect/>
                     </a:stretch>
@@ -3118,7 +3118,7 @@
                     <pic:cNvPicPr/>
                   </pic:nvPicPr>
                   <pic:blipFill>
-                    <a:blip xmlns:r="http://schemas.openxmlformats.org/officeDocument/2006/relationships" r:embed="R028c3af4a8bf4186"/>
+                    <a:blip xmlns:r="http://schemas.openxmlformats.org/officeDocument/2006/relationships" r:embed="Rde2225e8c3a348ea"/>
                     <a:stretch>
                       <a:fillRect/>
                     </a:stretch>
@@ -3169,7 +3169,7 @@
                     <pic:cNvPicPr/>
                   </pic:nvPicPr>
                   <pic:blipFill>
-                    <a:blip xmlns:r="http://schemas.openxmlformats.org/officeDocument/2006/relationships" r:embed="R6241a758e75740b4"/>
+                    <a:blip xmlns:r="http://schemas.openxmlformats.org/officeDocument/2006/relationships" r:embed="Rfd03435c9c0a4375"/>
                     <a:stretch>
                       <a:fillRect/>
                     </a:stretch>
@@ -3220,7 +3220,7 @@
                     <pic:cNvPicPr/>
                   </pic:nvPicPr>
                   <pic:blipFill>
-                    <a:blip xmlns:r="http://schemas.openxmlformats.org/officeDocument/2006/relationships" r:embed="R8cbe3bd11b534def"/>
+                    <a:blip xmlns:r="http://schemas.openxmlformats.org/officeDocument/2006/relationships" r:embed="Rd6b4315baebe454d"/>
                     <a:stretch>
                       <a:fillRect/>
                     </a:stretch>
@@ -3271,7 +3271,7 @@
                     <pic:cNvPicPr/>
                   </pic:nvPicPr>
                   <pic:blipFill>
-                    <a:blip xmlns:r="http://schemas.openxmlformats.org/officeDocument/2006/relationships" r:embed="R79099a998fe940c7"/>
+                    <a:blip xmlns:r="http://schemas.openxmlformats.org/officeDocument/2006/relationships" r:embed="Rf77dccc8a4374d4f"/>
                     <a:stretch>
                       <a:fillRect/>
                     </a:stretch>
@@ -3322,7 +3322,7 @@
                     <pic:cNvPicPr/>
                   </pic:nvPicPr>
                   <pic:blipFill>
-                    <a:blip xmlns:r="http://schemas.openxmlformats.org/officeDocument/2006/relationships" r:embed="Rdab7a95bbb99449e"/>
+                    <a:blip xmlns:r="http://schemas.openxmlformats.org/officeDocument/2006/relationships" r:embed="Rc818ce5b15ca4d69"/>
                     <a:stretch>
                       <a:fillRect/>
                     </a:stretch>
@@ -3419,7 +3419,7 @@
                     <pic:cNvPicPr/>
                   </pic:nvPicPr>
                   <pic:blipFill>
-                    <a:blip xmlns:r="http://schemas.openxmlformats.org/officeDocument/2006/relationships" r:embed="Re12f70e38e1b4f49"/>
+                    <a:blip xmlns:r="http://schemas.openxmlformats.org/officeDocument/2006/relationships" r:embed="R62d4c54767fe4719"/>
                     <a:stretch>
                       <a:fillRect/>
                     </a:stretch>
@@ -3462,7 +3462,7 @@
                     <pic:cNvPicPr/>
                   </pic:nvPicPr>
                   <pic:blipFill>
-                    <a:blip xmlns:r="http://schemas.openxmlformats.org/officeDocument/2006/relationships" r:embed="R6754f1a55ca646ee"/>
+                    <a:blip xmlns:r="http://schemas.openxmlformats.org/officeDocument/2006/relationships" r:embed="Ra11fbf6bc6bc4df2"/>
                     <a:stretch>
                       <a:fillRect/>
                     </a:stretch>
@@ -3505,7 +3505,7 @@
                     <pic:cNvPicPr/>
                   </pic:nvPicPr>
                   <pic:blipFill>
-                    <a:blip xmlns:r="http://schemas.openxmlformats.org/officeDocument/2006/relationships" r:embed="Rd706529de8aa43ba"/>
+                    <a:blip xmlns:r="http://schemas.openxmlformats.org/officeDocument/2006/relationships" r:embed="R4dc10e6c68e948df"/>
                     <a:stretch>
                       <a:fillRect/>
                     </a:stretch>
@@ -3548,7 +3548,7 @@
                     <pic:cNvPicPr/>
                   </pic:nvPicPr>
                   <pic:blipFill>
-                    <a:blip xmlns:r="http://schemas.openxmlformats.org/officeDocument/2006/relationships" r:embed="R046d5265593b4020"/>
+                    <a:blip xmlns:r="http://schemas.openxmlformats.org/officeDocument/2006/relationships" r:embed="R709b5b58f13e482b"/>
                     <a:stretch>
                       <a:fillRect/>
                     </a:stretch>
@@ -3933,7 +3933,7 @@
                     <pic:cNvPicPr/>
                   </pic:nvPicPr>
                   <pic:blipFill>
-                    <a:blip xmlns:r="http://schemas.openxmlformats.org/officeDocument/2006/relationships" r:embed="Rd84d02e148134ead"/>
+                    <a:blip xmlns:r="http://schemas.openxmlformats.org/officeDocument/2006/relationships" r:embed="R9d604b9069644fdd"/>
                     <a:stretch>
                       <a:fillRect/>
                     </a:stretch>
@@ -4125,7 +4125,7 @@
                     <pic:cNvPicPr/>
                   </pic:nvPicPr>
                   <pic:blipFill>
-                    <a:blip xmlns:r="http://schemas.openxmlformats.org/officeDocument/2006/relationships" r:embed="Rda4d754407f24748"/>
+                    <a:blip xmlns:r="http://schemas.openxmlformats.org/officeDocument/2006/relationships" r:embed="Rca3dcac5f8b344f1"/>
                     <a:stretch>
                       <a:fillRect/>
                     </a:stretch>
@@ -4176,7 +4176,7 @@
                     <pic:cNvPicPr/>
                   </pic:nvPicPr>
                   <pic:blipFill>
-                    <a:blip xmlns:r="http://schemas.openxmlformats.org/officeDocument/2006/relationships" r:embed="Rd794c5c1e9494a6c"/>
+                    <a:blip xmlns:r="http://schemas.openxmlformats.org/officeDocument/2006/relationships" r:embed="R9c12bda7df564c0c"/>
                     <a:stretch>
                       <a:fillRect/>
                     </a:stretch>
@@ -4227,7 +4227,7 @@
                     <pic:cNvPicPr/>
                   </pic:nvPicPr>
                   <pic:blipFill>
-                    <a:blip xmlns:r="http://schemas.openxmlformats.org/officeDocument/2006/relationships" r:embed="R7a18aad7e31c4187"/>
+                    <a:blip xmlns:r="http://schemas.openxmlformats.org/officeDocument/2006/relationships" r:embed="Rb265438f3c004f24"/>
                     <a:stretch>
                       <a:fillRect/>
                     </a:stretch>
@@ -4278,7 +4278,7 @@
                     <pic:cNvPicPr/>
                   </pic:nvPicPr>
                   <pic:blipFill>
-                    <a:blip xmlns:r="http://schemas.openxmlformats.org/officeDocument/2006/relationships" r:embed="R492cec06cde94b35"/>
+                    <a:blip xmlns:r="http://schemas.openxmlformats.org/officeDocument/2006/relationships" r:embed="Rf0a12214481e481c"/>
                     <a:stretch>
                       <a:fillRect/>
                     </a:stretch>
@@ -4657,7 +4657,7 @@
                     <pic:cNvPicPr/>
                   </pic:nvPicPr>
                   <pic:blipFill>
-                    <a:blip xmlns:r="http://schemas.openxmlformats.org/officeDocument/2006/relationships" r:embed="R38d74f50f7b34ea0"/>
+                    <a:blip xmlns:r="http://schemas.openxmlformats.org/officeDocument/2006/relationships" r:embed="Raa2e3a9989d8418d"/>
                     <a:stretch>
                       <a:fillRect/>
                     </a:stretch>
@@ -5338,7 +5338,7 @@
             <w:r>
               <w:t xml:space="preserve">Cell with </w:t>
             </w:r>
-            <w:hyperlink xmlns:r="http://schemas.openxmlformats.org/officeDocument/2006/relationships" w:history="true" r:id="Rf35d4879e52c418b">
+            <w:hyperlink xmlns:r="http://schemas.openxmlformats.org/officeDocument/2006/relationships" w:history="true" r:id="Rf0953c40c1c3445d">
               <w:r>
                 <w:rPr>
                   <w:rStyle w:val="Hyperlink"/>
@@ -5624,7 +5624,7 @@
                           <pic:cNvPicPr/>
                         </pic:nvPicPr>
                         <pic:blipFill>
-                          <a:blip xmlns:r="http://schemas.openxmlformats.org/officeDocument/2006/relationships" r:embed="R1773a31980194604"/>
+                          <a:blip xmlns:r="http://schemas.openxmlformats.org/officeDocument/2006/relationships" r:embed="R7cb4f1e3b8f0445f"/>
                           <a:stretch>
                             <a:fillRect/>
                           </a:stretch>
@@ -5724,7 +5724,7 @@
                     <pic:cNvPicPr/>
                   </pic:nvPicPr>
                   <pic:blipFill>
-                    <a:blip xmlns:r="http://schemas.openxmlformats.org/officeDocument/2006/relationships" r:embed="R369753c0f90e4717"/>
+                    <a:blip xmlns:r="http://schemas.openxmlformats.org/officeDocument/2006/relationships" r:embed="R5c6e3493be6c41d6"/>
                     <a:stretch>
                       <a:fillRect/>
                     </a:stretch>
@@ -5774,7 +5774,7 @@
                     <pic:cNvPicPr/>
                   </pic:nvPicPr>
                   <pic:blipFill>
-                    <a:blip xmlns:r="http://schemas.openxmlformats.org/officeDocument/2006/relationships" r:embed="Rc7611fab7c7248e1"/>
+                    <a:blip xmlns:r="http://schemas.openxmlformats.org/officeDocument/2006/relationships" r:embed="R64eaa88f858a474d"/>
                     <a:stretch>
                       <a:fillRect/>
                     </a:stretch>
@@ -5824,7 +5824,7 @@
                     <pic:cNvPicPr/>
                   </pic:nvPicPr>
                   <pic:blipFill>
-                    <a:blip xmlns:r="http://schemas.openxmlformats.org/officeDocument/2006/relationships" r:embed="R0a93e8c1f3084d34"/>
+                    <a:blip xmlns:r="http://schemas.openxmlformats.org/officeDocument/2006/relationships" r:embed="R8681675502d94fa2"/>
                     <a:stretch>
                       <a:fillRect/>
                     </a:stretch>

</xml_diff>

<commit_message>
fix(er): stabilise marker alignment with viewBox
Add explicit viewBox and markerUnits=userSpaceOnUse for ER cardinality markers so bar/circle/apex ref points stay on the relationship line in Word.

Made-with: Cursor
</commit_message>
<xml_diff>
--- a/test.docx
+++ b/test.docx
@@ -236,7 +236,7 @@
       <w:r>
         <w:t xml:space="preserve">, and </w:t>
       </w:r>
-      <w:hyperlink xmlns:r="http://schemas.openxmlformats.org/officeDocument/2006/relationships" w:history="true" r:id="Ra07d7f869e42468b">
+      <w:hyperlink xmlns:r="http://schemas.openxmlformats.org/officeDocument/2006/relationships" w:history="true" r:id="Rd07e52803872426e">
         <w:r>
           <w:rPr>
             <w:rStyle w:val="Hyperlink"/>
@@ -475,7 +475,7 @@
       <w:r>
         <w:t xml:space="preserve">Direct link: </w:t>
       </w:r>
-      <w:hyperlink xmlns:r="http://schemas.openxmlformats.org/officeDocument/2006/relationships" w:history="true" r:id="Rae858508087d4b65">
+      <w:hyperlink xmlns:r="http://schemas.openxmlformats.org/officeDocument/2006/relationships" w:history="true" r:id="R796f83e6384e41f4">
         <w:r>
           <w:rPr>
             <w:rStyle w:val="Hyperlink"/>
@@ -496,7 +496,7 @@
       <w:r>
         <w:t xml:space="preserve">Direct link with title: </w:t>
       </w:r>
-      <w:hyperlink xmlns:r="http://schemas.openxmlformats.org/officeDocument/2006/relationships" w:history="true" r:id="R247478403c3f4a84">
+      <w:hyperlink xmlns:r="http://schemas.openxmlformats.org/officeDocument/2006/relationships" w:history="true" r:id="R5897e22029994556">
         <w:r>
           <w:rPr>
             <w:rStyle w:val="Hyperlink"/>
@@ -517,7 +517,7 @@
       <w:r>
         <w:t xml:space="preserve">Reference-style link: </w:t>
       </w:r>
-      <w:hyperlink xmlns:r="http://schemas.openxmlformats.org/officeDocument/2006/relationships" w:history="true" r:id="Ra6cd0421df5b4b2d">
+      <w:hyperlink xmlns:r="http://schemas.openxmlformats.org/officeDocument/2006/relationships" w:history="true" r:id="R0238444e615b4a36">
         <w:r>
           <w:rPr>
             <w:rStyle w:val="Hyperlink"/>
@@ -538,7 +538,7 @@
       <w:r>
         <w:t xml:space="preserve">Collapsed reference link: </w:t>
       </w:r>
-      <w:hyperlink xmlns:r="http://schemas.openxmlformats.org/officeDocument/2006/relationships" w:history="true" r:id="Re26bff97c22e4035">
+      <w:hyperlink xmlns:r="http://schemas.openxmlformats.org/officeDocument/2006/relationships" w:history="true" r:id="R3c1515559a234cff">
         <w:r>
           <w:rPr>
             <w:rStyle w:val="Hyperlink"/>
@@ -559,7 +559,7 @@
       <w:r>
         <w:t xml:space="preserve">Repeated reference link: </w:t>
       </w:r>
-      <w:hyperlink xmlns:r="http://schemas.openxmlformats.org/officeDocument/2006/relationships" w:history="true" r:id="R7b5857336c314b3f">
+      <w:hyperlink xmlns:r="http://schemas.openxmlformats.org/officeDocument/2006/relationships" w:history="true" r:id="Rc165b7453c484e35">
         <w:r>
           <w:rPr>
             <w:rStyle w:val="Hyperlink"/>
@@ -580,7 +580,7 @@
       <w:r>
         <w:t xml:space="preserve">Autolink URL: </w:t>
       </w:r>
-      <w:hyperlink xmlns:r="http://schemas.openxmlformats.org/officeDocument/2006/relationships" w:history="true" r:id="R048c4eff0ea340e1">
+      <w:hyperlink xmlns:r="http://schemas.openxmlformats.org/officeDocument/2006/relationships" w:history="true" r:id="R28ff58b8a2104fa3">
         <w:r>
           <w:rPr>
             <w:rStyle w:val="Hyperlink"/>
@@ -601,7 +601,7 @@
       <w:r>
         <w:t xml:space="preserve">Autolink email: </w:t>
       </w:r>
-      <w:hyperlink xmlns:r="http://schemas.openxmlformats.org/officeDocument/2006/relationships" w:history="true" r:id="Rad7c54ca59a047be">
+      <w:hyperlink xmlns:r="http://schemas.openxmlformats.org/officeDocument/2006/relationships" w:history="true" r:id="Rccd72975a9a74243">
         <w:r>
           <w:rPr>
             <w:rStyle w:val="Hyperlink"/>
@@ -700,7 +700,7 @@
       <w:r>
         <w:t xml:space="preserve">, and </w:t>
       </w:r>
-      <w:hyperlink xmlns:r="http://schemas.openxmlformats.org/officeDocument/2006/relationships" w:history="true" r:id="Rcc3ac5b19d2e4607">
+      <w:hyperlink xmlns:r="http://schemas.openxmlformats.org/officeDocument/2006/relationships" w:history="true" r:id="R694bc28f26614ffe">
         <w:r>
           <w:rPr>
             <w:rStyle w:val="Hyperlink"/>
@@ -1093,7 +1093,7 @@
       <w:r>
         <w:t xml:space="preserve">Continuation paragraph with </w:t>
       </w:r>
-      <w:hyperlink xmlns:r="http://schemas.openxmlformats.org/officeDocument/2006/relationships" w:history="true" r:id="R646790adab564271">
+      <w:hyperlink xmlns:r="http://schemas.openxmlformats.org/officeDocument/2006/relationships" w:history="true" r:id="R3ab87a99390947e7">
         <w:r>
           <w:rPr>
             <w:rStyle w:val="Hyperlink"/>
@@ -1591,7 +1591,7 @@
       <w:r>
         <w:t xml:space="preserve">, and </w:t>
       </w:r>
-      <w:hyperlink xmlns:r="http://schemas.openxmlformats.org/officeDocument/2006/relationships" w:history="true" r:id="Rc11844e08b7b4745">
+      <w:hyperlink xmlns:r="http://schemas.openxmlformats.org/officeDocument/2006/relationships" w:history="true" r:id="R70bfc230b7af4d2a">
         <w:r>
           <w:rPr>
             <w:rStyle w:val="Hyperlink"/>
@@ -1979,7 +1979,7 @@
                     <pic:cNvPicPr/>
                   </pic:nvPicPr>
                   <pic:blipFill>
-                    <a:blip xmlns:r="http://schemas.openxmlformats.org/officeDocument/2006/relationships" r:embed="Rd055984c671743a5"/>
+                    <a:blip xmlns:r="http://schemas.openxmlformats.org/officeDocument/2006/relationships" r:embed="R193ec6e9a3194e0e"/>
                     <a:stretch>
                       <a:fillRect/>
                     </a:stretch>
@@ -2039,7 +2039,7 @@
                     <pic:cNvPicPr/>
                   </pic:nvPicPr>
                   <pic:blipFill>
-                    <a:blip xmlns:r="http://schemas.openxmlformats.org/officeDocument/2006/relationships" r:embed="R167151c84f8c4634"/>
+                    <a:blip xmlns:r="http://schemas.openxmlformats.org/officeDocument/2006/relationships" r:embed="R9c95ac28c8a64d90"/>
                     <a:stretch>
                       <a:fillRect/>
                     </a:stretch>
@@ -2099,7 +2099,7 @@
                     <pic:cNvPicPr/>
                   </pic:nvPicPr>
                   <pic:blipFill>
-                    <a:blip xmlns:r="http://schemas.openxmlformats.org/officeDocument/2006/relationships" r:embed="R239470f70836493c"/>
+                    <a:blip xmlns:r="http://schemas.openxmlformats.org/officeDocument/2006/relationships" r:embed="R81b0263d5bc74383"/>
                     <a:stretch>
                       <a:fillRect/>
                     </a:stretch>
@@ -2150,7 +2150,7 @@
                     <pic:cNvPicPr/>
                   </pic:nvPicPr>
                   <pic:blipFill>
-                    <a:blip xmlns:r="http://schemas.openxmlformats.org/officeDocument/2006/relationships" r:embed="Re5f6422a141e46fa"/>
+                    <a:blip xmlns:r="http://schemas.openxmlformats.org/officeDocument/2006/relationships" r:embed="Rf9a28f451a394a88"/>
                     <a:stretch>
                       <a:fillRect/>
                     </a:stretch>
@@ -2201,7 +2201,7 @@
                     <pic:cNvPicPr/>
                   </pic:nvPicPr>
                   <pic:blipFill>
-                    <a:blip xmlns:r="http://schemas.openxmlformats.org/officeDocument/2006/relationships" r:embed="R82959f09f24a401d"/>
+                    <a:blip xmlns:r="http://schemas.openxmlformats.org/officeDocument/2006/relationships" r:embed="R01a0e8c8c3ea4745"/>
                     <a:stretch>
                       <a:fillRect/>
                     </a:stretch>
@@ -2252,7 +2252,7 @@
                     <pic:cNvPicPr/>
                   </pic:nvPicPr>
                   <pic:blipFill>
-                    <a:blip xmlns:r="http://schemas.openxmlformats.org/officeDocument/2006/relationships" r:embed="Rdcfca797a3f54c32"/>
+                    <a:blip xmlns:r="http://schemas.openxmlformats.org/officeDocument/2006/relationships" r:embed="Rb2d94a4e48f745cd"/>
                     <a:stretch>
                       <a:fillRect/>
                     </a:stretch>
@@ -2303,7 +2303,7 @@
                     <pic:cNvPicPr/>
                   </pic:nvPicPr>
                   <pic:blipFill>
-                    <a:blip xmlns:r="http://schemas.openxmlformats.org/officeDocument/2006/relationships" r:embed="R8581d12199a04e02"/>
+                    <a:blip xmlns:r="http://schemas.openxmlformats.org/officeDocument/2006/relationships" r:embed="R779ec42cbccb43f1"/>
                     <a:stretch>
                       <a:fillRect/>
                     </a:stretch>
@@ -2354,7 +2354,7 @@
                     <pic:cNvPicPr/>
                   </pic:nvPicPr>
                   <pic:blipFill>
-                    <a:blip xmlns:r="http://schemas.openxmlformats.org/officeDocument/2006/relationships" r:embed="R6b7269ffaef54db8"/>
+                    <a:blip xmlns:r="http://schemas.openxmlformats.org/officeDocument/2006/relationships" r:embed="R164df94710b04cb6"/>
                     <a:stretch>
                       <a:fillRect/>
                     </a:stretch>
@@ -2430,7 +2430,7 @@
                     <pic:cNvPicPr/>
                   </pic:nvPicPr>
                   <pic:blipFill>
-                    <a:blip xmlns:r="http://schemas.openxmlformats.org/officeDocument/2006/relationships" r:embed="R48c7f68abc714f63"/>
+                    <a:blip xmlns:r="http://schemas.openxmlformats.org/officeDocument/2006/relationships" r:embed="R6b5f16ddcdfa4512"/>
                     <a:stretch>
                       <a:fillRect/>
                     </a:stretch>
@@ -2481,7 +2481,7 @@
                     <pic:cNvPicPr/>
                   </pic:nvPicPr>
                   <pic:blipFill>
-                    <a:blip xmlns:r="http://schemas.openxmlformats.org/officeDocument/2006/relationships" r:embed="R08e0240266a747ba"/>
+                    <a:blip xmlns:r="http://schemas.openxmlformats.org/officeDocument/2006/relationships" r:embed="Rb0665dddb781466a"/>
                     <a:stretch>
                       <a:fillRect/>
                     </a:stretch>
@@ -2532,7 +2532,7 @@
                     <pic:cNvPicPr/>
                   </pic:nvPicPr>
                   <pic:blipFill>
-                    <a:blip xmlns:r="http://schemas.openxmlformats.org/officeDocument/2006/relationships" r:embed="Rc4bbf6a167e642b2"/>
+                    <a:blip xmlns:r="http://schemas.openxmlformats.org/officeDocument/2006/relationships" r:embed="Rfff1b45693d34858"/>
                     <a:stretch>
                       <a:fillRect/>
                     </a:stretch>
@@ -2583,7 +2583,7 @@
                     <pic:cNvPicPr/>
                   </pic:nvPicPr>
                   <pic:blipFill>
-                    <a:blip xmlns:r="http://schemas.openxmlformats.org/officeDocument/2006/relationships" r:embed="Rbc0769e831c84b87"/>
+                    <a:blip xmlns:r="http://schemas.openxmlformats.org/officeDocument/2006/relationships" r:embed="R2bbcd54e88d2451b"/>
                     <a:stretch>
                       <a:fillRect/>
                     </a:stretch>
@@ -2659,7 +2659,7 @@
                     <pic:cNvPicPr/>
                   </pic:nvPicPr>
                   <pic:blipFill>
-                    <a:blip xmlns:r="http://schemas.openxmlformats.org/officeDocument/2006/relationships" r:embed="R23625776797f444f"/>
+                    <a:blip xmlns:r="http://schemas.openxmlformats.org/officeDocument/2006/relationships" r:embed="R0b53de10c85c4159"/>
                     <a:stretch>
                       <a:fillRect/>
                     </a:stretch>
@@ -2710,7 +2710,7 @@
                     <pic:cNvPicPr/>
                   </pic:nvPicPr>
                   <pic:blipFill>
-                    <a:blip xmlns:r="http://schemas.openxmlformats.org/officeDocument/2006/relationships" r:embed="R33bb43b162df4ac3"/>
+                    <a:blip xmlns:r="http://schemas.openxmlformats.org/officeDocument/2006/relationships" r:embed="R7f94b65e04b444cd"/>
                     <a:stretch>
                       <a:fillRect/>
                     </a:stretch>
@@ -2761,7 +2761,7 @@
                     <pic:cNvPicPr/>
                   </pic:nvPicPr>
                   <pic:blipFill>
-                    <a:blip xmlns:r="http://schemas.openxmlformats.org/officeDocument/2006/relationships" r:embed="Rf776b5c237b7485c"/>
+                    <a:blip xmlns:r="http://schemas.openxmlformats.org/officeDocument/2006/relationships" r:embed="Re36186687b2e467d"/>
                     <a:stretch>
                       <a:fillRect/>
                     </a:stretch>
@@ -2812,7 +2812,7 @@
                     <pic:cNvPicPr/>
                   </pic:nvPicPr>
                   <pic:blipFill>
-                    <a:blip xmlns:r="http://schemas.openxmlformats.org/officeDocument/2006/relationships" r:embed="Rf4fd24a37c784239"/>
+                    <a:blip xmlns:r="http://schemas.openxmlformats.org/officeDocument/2006/relationships" r:embed="Rb4953700d3fb4725"/>
                     <a:stretch>
                       <a:fillRect/>
                     </a:stretch>
@@ -2863,7 +2863,7 @@
                     <pic:cNvPicPr/>
                   </pic:nvPicPr>
                   <pic:blipFill>
-                    <a:blip xmlns:r="http://schemas.openxmlformats.org/officeDocument/2006/relationships" r:embed="Rcf459b7d456a43fa"/>
+                    <a:blip xmlns:r="http://schemas.openxmlformats.org/officeDocument/2006/relationships" r:embed="Re082703415714d1c"/>
                     <a:stretch>
                       <a:fillRect/>
                     </a:stretch>
@@ -2914,7 +2914,7 @@
                     <pic:cNvPicPr/>
                   </pic:nvPicPr>
                   <pic:blipFill>
-                    <a:blip xmlns:r="http://schemas.openxmlformats.org/officeDocument/2006/relationships" r:embed="Rc2988fe51b164564"/>
+                    <a:blip xmlns:r="http://schemas.openxmlformats.org/officeDocument/2006/relationships" r:embed="Rd4e10ce25fec4d53"/>
                     <a:stretch>
                       <a:fillRect/>
                     </a:stretch>
@@ -2965,7 +2965,7 @@
                     <pic:cNvPicPr/>
                   </pic:nvPicPr>
                   <pic:blipFill>
-                    <a:blip xmlns:r="http://schemas.openxmlformats.org/officeDocument/2006/relationships" r:embed="R2fe9b259a22a4671"/>
+                    <a:blip xmlns:r="http://schemas.openxmlformats.org/officeDocument/2006/relationships" r:embed="Rb748568f8dd84bdd"/>
                     <a:stretch>
                       <a:fillRect/>
                     </a:stretch>
@@ -3016,7 +3016,7 @@
                     <pic:cNvPicPr/>
                   </pic:nvPicPr>
                   <pic:blipFill>
-                    <a:blip xmlns:r="http://schemas.openxmlformats.org/officeDocument/2006/relationships" r:embed="R9d3162e061a04e2f"/>
+                    <a:blip xmlns:r="http://schemas.openxmlformats.org/officeDocument/2006/relationships" r:embed="Rcbc0972689df4436"/>
                     <a:stretch>
                       <a:fillRect/>
                     </a:stretch>
@@ -3067,7 +3067,7 @@
                     <pic:cNvPicPr/>
                   </pic:nvPicPr>
                   <pic:blipFill>
-                    <a:blip xmlns:r="http://schemas.openxmlformats.org/officeDocument/2006/relationships" r:embed="Rd491034bc8434f60"/>
+                    <a:blip xmlns:r="http://schemas.openxmlformats.org/officeDocument/2006/relationships" r:embed="Rda842496e8ae44e8"/>
                     <a:stretch>
                       <a:fillRect/>
                     </a:stretch>
@@ -3118,7 +3118,7 @@
                     <pic:cNvPicPr/>
                   </pic:nvPicPr>
                   <pic:blipFill>
-                    <a:blip xmlns:r="http://schemas.openxmlformats.org/officeDocument/2006/relationships" r:embed="Rde2225e8c3a348ea"/>
+                    <a:blip xmlns:r="http://schemas.openxmlformats.org/officeDocument/2006/relationships" r:embed="Rf1c2eb56f4244a9a"/>
                     <a:stretch>
                       <a:fillRect/>
                     </a:stretch>
@@ -3169,7 +3169,7 @@
                     <pic:cNvPicPr/>
                   </pic:nvPicPr>
                   <pic:blipFill>
-                    <a:blip xmlns:r="http://schemas.openxmlformats.org/officeDocument/2006/relationships" r:embed="Rfd03435c9c0a4375"/>
+                    <a:blip xmlns:r="http://schemas.openxmlformats.org/officeDocument/2006/relationships" r:embed="Reb264a0b47814383"/>
                     <a:stretch>
                       <a:fillRect/>
                     </a:stretch>
@@ -3220,7 +3220,7 @@
                     <pic:cNvPicPr/>
                   </pic:nvPicPr>
                   <pic:blipFill>
-                    <a:blip xmlns:r="http://schemas.openxmlformats.org/officeDocument/2006/relationships" r:embed="Rd6b4315baebe454d"/>
+                    <a:blip xmlns:r="http://schemas.openxmlformats.org/officeDocument/2006/relationships" r:embed="R01ebd4ec7c0747c3"/>
                     <a:stretch>
                       <a:fillRect/>
                     </a:stretch>
@@ -3271,7 +3271,7 @@
                     <pic:cNvPicPr/>
                   </pic:nvPicPr>
                   <pic:blipFill>
-                    <a:blip xmlns:r="http://schemas.openxmlformats.org/officeDocument/2006/relationships" r:embed="Rf77dccc8a4374d4f"/>
+                    <a:blip xmlns:r="http://schemas.openxmlformats.org/officeDocument/2006/relationships" r:embed="R3c5ff439a45c4ca6"/>
                     <a:stretch>
                       <a:fillRect/>
                     </a:stretch>
@@ -3322,7 +3322,7 @@
                     <pic:cNvPicPr/>
                   </pic:nvPicPr>
                   <pic:blipFill>
-                    <a:blip xmlns:r="http://schemas.openxmlformats.org/officeDocument/2006/relationships" r:embed="Rc818ce5b15ca4d69"/>
+                    <a:blip xmlns:r="http://schemas.openxmlformats.org/officeDocument/2006/relationships" r:embed="R6f4664148f8443f3"/>
                     <a:stretch>
                       <a:fillRect/>
                     </a:stretch>
@@ -3419,7 +3419,7 @@
                     <pic:cNvPicPr/>
                   </pic:nvPicPr>
                   <pic:blipFill>
-                    <a:blip xmlns:r="http://schemas.openxmlformats.org/officeDocument/2006/relationships" r:embed="R62d4c54767fe4719"/>
+                    <a:blip xmlns:r="http://schemas.openxmlformats.org/officeDocument/2006/relationships" r:embed="R607f0330b0aa47f7"/>
                     <a:stretch>
                       <a:fillRect/>
                     </a:stretch>
@@ -3462,7 +3462,7 @@
                     <pic:cNvPicPr/>
                   </pic:nvPicPr>
                   <pic:blipFill>
-                    <a:blip xmlns:r="http://schemas.openxmlformats.org/officeDocument/2006/relationships" r:embed="Ra11fbf6bc6bc4df2"/>
+                    <a:blip xmlns:r="http://schemas.openxmlformats.org/officeDocument/2006/relationships" r:embed="R0d1fa331103e4a88"/>
                     <a:stretch>
                       <a:fillRect/>
                     </a:stretch>
@@ -3505,7 +3505,7 @@
                     <pic:cNvPicPr/>
                   </pic:nvPicPr>
                   <pic:blipFill>
-                    <a:blip xmlns:r="http://schemas.openxmlformats.org/officeDocument/2006/relationships" r:embed="R4dc10e6c68e948df"/>
+                    <a:blip xmlns:r="http://schemas.openxmlformats.org/officeDocument/2006/relationships" r:embed="R7147ca56eec24338"/>
                     <a:stretch>
                       <a:fillRect/>
                     </a:stretch>
@@ -3548,7 +3548,7 @@
                     <pic:cNvPicPr/>
                   </pic:nvPicPr>
                   <pic:blipFill>
-                    <a:blip xmlns:r="http://schemas.openxmlformats.org/officeDocument/2006/relationships" r:embed="R709b5b58f13e482b"/>
+                    <a:blip xmlns:r="http://schemas.openxmlformats.org/officeDocument/2006/relationships" r:embed="R48e6969c4db64329"/>
                     <a:stretch>
                       <a:fillRect/>
                     </a:stretch>
@@ -3933,7 +3933,7 @@
                     <pic:cNvPicPr/>
                   </pic:nvPicPr>
                   <pic:blipFill>
-                    <a:blip xmlns:r="http://schemas.openxmlformats.org/officeDocument/2006/relationships" r:embed="R9d604b9069644fdd"/>
+                    <a:blip xmlns:r="http://schemas.openxmlformats.org/officeDocument/2006/relationships" r:embed="R5aa94d739cdc4558"/>
                     <a:stretch>
                       <a:fillRect/>
                     </a:stretch>
@@ -4125,7 +4125,7 @@
                     <pic:cNvPicPr/>
                   </pic:nvPicPr>
                   <pic:blipFill>
-                    <a:blip xmlns:r="http://schemas.openxmlformats.org/officeDocument/2006/relationships" r:embed="Rca3dcac5f8b344f1"/>
+                    <a:blip xmlns:r="http://schemas.openxmlformats.org/officeDocument/2006/relationships" r:embed="Rcf1646ef941548c7"/>
                     <a:stretch>
                       <a:fillRect/>
                     </a:stretch>
@@ -4176,7 +4176,7 @@
                     <pic:cNvPicPr/>
                   </pic:nvPicPr>
                   <pic:blipFill>
-                    <a:blip xmlns:r="http://schemas.openxmlformats.org/officeDocument/2006/relationships" r:embed="R9c12bda7df564c0c"/>
+                    <a:blip xmlns:r="http://schemas.openxmlformats.org/officeDocument/2006/relationships" r:embed="R91c917d5f45e425b"/>
                     <a:stretch>
                       <a:fillRect/>
                     </a:stretch>
@@ -4227,7 +4227,7 @@
                     <pic:cNvPicPr/>
                   </pic:nvPicPr>
                   <pic:blipFill>
-                    <a:blip xmlns:r="http://schemas.openxmlformats.org/officeDocument/2006/relationships" r:embed="Rb265438f3c004f24"/>
+                    <a:blip xmlns:r="http://schemas.openxmlformats.org/officeDocument/2006/relationships" r:embed="R125d04cd49934c4d"/>
                     <a:stretch>
                       <a:fillRect/>
                     </a:stretch>
@@ -4278,7 +4278,7 @@
                     <pic:cNvPicPr/>
                   </pic:nvPicPr>
                   <pic:blipFill>
-                    <a:blip xmlns:r="http://schemas.openxmlformats.org/officeDocument/2006/relationships" r:embed="Rf0a12214481e481c"/>
+                    <a:blip xmlns:r="http://schemas.openxmlformats.org/officeDocument/2006/relationships" r:embed="R4b76cdf0579b479a"/>
                     <a:stretch>
                       <a:fillRect/>
                     </a:stretch>
@@ -4657,7 +4657,7 @@
                     <pic:cNvPicPr/>
                   </pic:nvPicPr>
                   <pic:blipFill>
-                    <a:blip xmlns:r="http://schemas.openxmlformats.org/officeDocument/2006/relationships" r:embed="Raa2e3a9989d8418d"/>
+                    <a:blip xmlns:r="http://schemas.openxmlformats.org/officeDocument/2006/relationships" r:embed="R70def750eccd4e85"/>
                     <a:stretch>
                       <a:fillRect/>
                     </a:stretch>
@@ -5338,7 +5338,7 @@
             <w:r>
               <w:t xml:space="preserve">Cell with </w:t>
             </w:r>
-            <w:hyperlink xmlns:r="http://schemas.openxmlformats.org/officeDocument/2006/relationships" w:history="true" r:id="Rf0953c40c1c3445d">
+            <w:hyperlink xmlns:r="http://schemas.openxmlformats.org/officeDocument/2006/relationships" w:history="true" r:id="R9d1b8ae1aa1b4200">
               <w:r>
                 <w:rPr>
                   <w:rStyle w:val="Hyperlink"/>
@@ -5624,7 +5624,7 @@
                           <pic:cNvPicPr/>
                         </pic:nvPicPr>
                         <pic:blipFill>
-                          <a:blip xmlns:r="http://schemas.openxmlformats.org/officeDocument/2006/relationships" r:embed="R7cb4f1e3b8f0445f"/>
+                          <a:blip xmlns:r="http://schemas.openxmlformats.org/officeDocument/2006/relationships" r:embed="R7fd12fd634854164"/>
                           <a:stretch>
                             <a:fillRect/>
                           </a:stretch>
@@ -5724,7 +5724,7 @@
                     <pic:cNvPicPr/>
                   </pic:nvPicPr>
                   <pic:blipFill>
-                    <a:blip xmlns:r="http://schemas.openxmlformats.org/officeDocument/2006/relationships" r:embed="R5c6e3493be6c41d6"/>
+                    <a:blip xmlns:r="http://schemas.openxmlformats.org/officeDocument/2006/relationships" r:embed="R3454123a0a81428c"/>
                     <a:stretch>
                       <a:fillRect/>
                     </a:stretch>
@@ -5774,7 +5774,7 @@
                     <pic:cNvPicPr/>
                   </pic:nvPicPr>
                   <pic:blipFill>
-                    <a:blip xmlns:r="http://schemas.openxmlformats.org/officeDocument/2006/relationships" r:embed="R64eaa88f858a474d"/>
+                    <a:blip xmlns:r="http://schemas.openxmlformats.org/officeDocument/2006/relationships" r:embed="R1bd4544dca6a44d9"/>
                     <a:stretch>
                       <a:fillRect/>
                     </a:stretch>
@@ -5824,7 +5824,7 @@
                     <pic:cNvPicPr/>
                   </pic:nvPicPr>
                   <pic:blipFill>
-                    <a:blip xmlns:r="http://schemas.openxmlformats.org/officeDocument/2006/relationships" r:embed="R8681675502d94fa2"/>
+                    <a:blip xmlns:r="http://schemas.openxmlformats.org/officeDocument/2006/relationships" r:embed="Rbe6392578a92427d"/>
                     <a:stretch>
                       <a:fillRect/>
                     </a:stretch>

</xml_diff>

<commit_message>
fix(er): widen layout and guide curveBasis for markers
Increase ER node separation to match reference spacing and use guided curveBasis routing for ORDER/PRODUCT -> LINE_ITEM so marker bars/circles/crowfoot apex align with the visible line.

Made-with: Cursor
</commit_message>
<xml_diff>
--- a/test.docx
+++ b/test.docx
@@ -236,7 +236,7 @@
       <w:r>
         <w:t xml:space="preserve">, and </w:t>
       </w:r>
-      <w:hyperlink xmlns:r="http://schemas.openxmlformats.org/officeDocument/2006/relationships" w:history="true" r:id="Rd07e52803872426e">
+      <w:hyperlink xmlns:r="http://schemas.openxmlformats.org/officeDocument/2006/relationships" w:history="true" r:id="Re66a278750d54907">
         <w:r>
           <w:rPr>
             <w:rStyle w:val="Hyperlink"/>
@@ -475,7 +475,7 @@
       <w:r>
         <w:t xml:space="preserve">Direct link: </w:t>
       </w:r>
-      <w:hyperlink xmlns:r="http://schemas.openxmlformats.org/officeDocument/2006/relationships" w:history="true" r:id="R796f83e6384e41f4">
+      <w:hyperlink xmlns:r="http://schemas.openxmlformats.org/officeDocument/2006/relationships" w:history="true" r:id="R5eb4ae28c8ad46cc">
         <w:r>
           <w:rPr>
             <w:rStyle w:val="Hyperlink"/>
@@ -496,7 +496,7 @@
       <w:r>
         <w:t xml:space="preserve">Direct link with title: </w:t>
       </w:r>
-      <w:hyperlink xmlns:r="http://schemas.openxmlformats.org/officeDocument/2006/relationships" w:history="true" r:id="R5897e22029994556">
+      <w:hyperlink xmlns:r="http://schemas.openxmlformats.org/officeDocument/2006/relationships" w:history="true" r:id="Ra20f6913f9fb405e">
         <w:r>
           <w:rPr>
             <w:rStyle w:val="Hyperlink"/>
@@ -517,7 +517,7 @@
       <w:r>
         <w:t xml:space="preserve">Reference-style link: </w:t>
       </w:r>
-      <w:hyperlink xmlns:r="http://schemas.openxmlformats.org/officeDocument/2006/relationships" w:history="true" r:id="R0238444e615b4a36">
+      <w:hyperlink xmlns:r="http://schemas.openxmlformats.org/officeDocument/2006/relationships" w:history="true" r:id="Rfa8a665145c44bb8">
         <w:r>
           <w:rPr>
             <w:rStyle w:val="Hyperlink"/>
@@ -538,7 +538,7 @@
       <w:r>
         <w:t xml:space="preserve">Collapsed reference link: </w:t>
       </w:r>
-      <w:hyperlink xmlns:r="http://schemas.openxmlformats.org/officeDocument/2006/relationships" w:history="true" r:id="R3c1515559a234cff">
+      <w:hyperlink xmlns:r="http://schemas.openxmlformats.org/officeDocument/2006/relationships" w:history="true" r:id="R16dda27af2e743a7">
         <w:r>
           <w:rPr>
             <w:rStyle w:val="Hyperlink"/>
@@ -559,7 +559,7 @@
       <w:r>
         <w:t xml:space="preserve">Repeated reference link: </w:t>
       </w:r>
-      <w:hyperlink xmlns:r="http://schemas.openxmlformats.org/officeDocument/2006/relationships" w:history="true" r:id="Rc165b7453c484e35">
+      <w:hyperlink xmlns:r="http://schemas.openxmlformats.org/officeDocument/2006/relationships" w:history="true" r:id="Ra96a6c9785d04d08">
         <w:r>
           <w:rPr>
             <w:rStyle w:val="Hyperlink"/>
@@ -580,7 +580,7 @@
       <w:r>
         <w:t xml:space="preserve">Autolink URL: </w:t>
       </w:r>
-      <w:hyperlink xmlns:r="http://schemas.openxmlformats.org/officeDocument/2006/relationships" w:history="true" r:id="R28ff58b8a2104fa3">
+      <w:hyperlink xmlns:r="http://schemas.openxmlformats.org/officeDocument/2006/relationships" w:history="true" r:id="Re1f333f584e7424a">
         <w:r>
           <w:rPr>
             <w:rStyle w:val="Hyperlink"/>
@@ -601,7 +601,7 @@
       <w:r>
         <w:t xml:space="preserve">Autolink email: </w:t>
       </w:r>
-      <w:hyperlink xmlns:r="http://schemas.openxmlformats.org/officeDocument/2006/relationships" w:history="true" r:id="Rccd72975a9a74243">
+      <w:hyperlink xmlns:r="http://schemas.openxmlformats.org/officeDocument/2006/relationships" w:history="true" r:id="R6796b7a546fa452c">
         <w:r>
           <w:rPr>
             <w:rStyle w:val="Hyperlink"/>
@@ -700,7 +700,7 @@
       <w:r>
         <w:t xml:space="preserve">, and </w:t>
       </w:r>
-      <w:hyperlink xmlns:r="http://schemas.openxmlformats.org/officeDocument/2006/relationships" w:history="true" r:id="R694bc28f26614ffe">
+      <w:hyperlink xmlns:r="http://schemas.openxmlformats.org/officeDocument/2006/relationships" w:history="true" r:id="R4bfa6716dabf420a">
         <w:r>
           <w:rPr>
             <w:rStyle w:val="Hyperlink"/>
@@ -1093,7 +1093,7 @@
       <w:r>
         <w:t xml:space="preserve">Continuation paragraph with </w:t>
       </w:r>
-      <w:hyperlink xmlns:r="http://schemas.openxmlformats.org/officeDocument/2006/relationships" w:history="true" r:id="R3ab87a99390947e7">
+      <w:hyperlink xmlns:r="http://schemas.openxmlformats.org/officeDocument/2006/relationships" w:history="true" r:id="Rf100f0e8694d4c74">
         <w:r>
           <w:rPr>
             <w:rStyle w:val="Hyperlink"/>
@@ -1591,7 +1591,7 @@
       <w:r>
         <w:t xml:space="preserve">, and </w:t>
       </w:r>
-      <w:hyperlink xmlns:r="http://schemas.openxmlformats.org/officeDocument/2006/relationships" w:history="true" r:id="R70bfc230b7af4d2a">
+      <w:hyperlink xmlns:r="http://schemas.openxmlformats.org/officeDocument/2006/relationships" w:history="true" r:id="R2a1b759aab604013">
         <w:r>
           <w:rPr>
             <w:rStyle w:val="Hyperlink"/>
@@ -1979,7 +1979,7 @@
                     <pic:cNvPicPr/>
                   </pic:nvPicPr>
                   <pic:blipFill>
-                    <a:blip xmlns:r="http://schemas.openxmlformats.org/officeDocument/2006/relationships" r:embed="R193ec6e9a3194e0e"/>
+                    <a:blip xmlns:r="http://schemas.openxmlformats.org/officeDocument/2006/relationships" r:embed="Ref1d6dec1f88490a"/>
                     <a:stretch>
                       <a:fillRect/>
                     </a:stretch>
@@ -2039,7 +2039,7 @@
                     <pic:cNvPicPr/>
                   </pic:nvPicPr>
                   <pic:blipFill>
-                    <a:blip xmlns:r="http://schemas.openxmlformats.org/officeDocument/2006/relationships" r:embed="R9c95ac28c8a64d90"/>
+                    <a:blip xmlns:r="http://schemas.openxmlformats.org/officeDocument/2006/relationships" r:embed="R00bd9c37b0aa4c87"/>
                     <a:stretch>
                       <a:fillRect/>
                     </a:stretch>
@@ -2099,7 +2099,7 @@
                     <pic:cNvPicPr/>
                   </pic:nvPicPr>
                   <pic:blipFill>
-                    <a:blip xmlns:r="http://schemas.openxmlformats.org/officeDocument/2006/relationships" r:embed="R81b0263d5bc74383"/>
+                    <a:blip xmlns:r="http://schemas.openxmlformats.org/officeDocument/2006/relationships" r:embed="R45e9d731bf264d62"/>
                     <a:stretch>
                       <a:fillRect/>
                     </a:stretch>
@@ -2150,7 +2150,7 @@
                     <pic:cNvPicPr/>
                   </pic:nvPicPr>
                   <pic:blipFill>
-                    <a:blip xmlns:r="http://schemas.openxmlformats.org/officeDocument/2006/relationships" r:embed="Rf9a28f451a394a88"/>
+                    <a:blip xmlns:r="http://schemas.openxmlformats.org/officeDocument/2006/relationships" r:embed="R7eb088bb380142ad"/>
                     <a:stretch>
                       <a:fillRect/>
                     </a:stretch>
@@ -2201,7 +2201,7 @@
                     <pic:cNvPicPr/>
                   </pic:nvPicPr>
                   <pic:blipFill>
-                    <a:blip xmlns:r="http://schemas.openxmlformats.org/officeDocument/2006/relationships" r:embed="R01a0e8c8c3ea4745"/>
+                    <a:blip xmlns:r="http://schemas.openxmlformats.org/officeDocument/2006/relationships" r:embed="R73a0e0670b4f4a2f"/>
                     <a:stretch>
                       <a:fillRect/>
                     </a:stretch>
@@ -2252,7 +2252,7 @@
                     <pic:cNvPicPr/>
                   </pic:nvPicPr>
                   <pic:blipFill>
-                    <a:blip xmlns:r="http://schemas.openxmlformats.org/officeDocument/2006/relationships" r:embed="Rb2d94a4e48f745cd"/>
+                    <a:blip xmlns:r="http://schemas.openxmlformats.org/officeDocument/2006/relationships" r:embed="Re4880b68f7134911"/>
                     <a:stretch>
                       <a:fillRect/>
                     </a:stretch>
@@ -2289,7 +2289,7 @@
       <w:r>
         <w:drawing>
           <wp:inline xmlns:wp="http://schemas.openxmlformats.org/drawingml/2006/wordprocessingDrawing" distT="0" distB="0" distL="0" distR="0">
-            <wp:extent cx="3295650" cy="4486275"/>
+            <wp:extent cx="3867150" cy="4486275"/>
             <wp:effectExtent l="0" t="0" r="0" b="0"/>
             <wp:docPr id="7" name="Mermaid diagram 7" descr="Mermaid diagram"/>
             <wp:cNvGraphicFramePr>
@@ -2303,7 +2303,7 @@
                     <pic:cNvPicPr/>
                   </pic:nvPicPr>
                   <pic:blipFill>
-                    <a:blip xmlns:r="http://schemas.openxmlformats.org/officeDocument/2006/relationships" r:embed="R779ec42cbccb43f1"/>
+                    <a:blip xmlns:r="http://schemas.openxmlformats.org/officeDocument/2006/relationships" r:embed="R49c79b06c7984f52"/>
                     <a:stretch>
                       <a:fillRect/>
                     </a:stretch>
@@ -2311,7 +2311,7 @@
                   <pic:spPr>
                     <a:xfrm>
                       <a:off x="0" y="0"/>
-                      <a:ext cx="3295650" cy="4486275"/>
+                      <a:ext cx="3867150" cy="4486275"/>
                     </a:xfrm>
                     <a:prstGeom prst="rect">
                       <a:avLst/>
@@ -2340,7 +2340,7 @@
       <w:r>
         <w:drawing>
           <wp:inline xmlns:wp="http://schemas.openxmlformats.org/drawingml/2006/wordprocessingDrawing" distT="0" distB="0" distL="0" distR="0">
-            <wp:extent cx="5220000" cy="792297"/>
+            <wp:extent cx="5220000" cy="651116"/>
             <wp:effectExtent l="0" t="0" r="0" b="0"/>
             <wp:docPr id="8" name="Mermaid diagram 8" descr="Mermaid diagram"/>
             <wp:cNvGraphicFramePr>
@@ -2354,7 +2354,7 @@
                     <pic:cNvPicPr/>
                   </pic:nvPicPr>
                   <pic:blipFill>
-                    <a:blip xmlns:r="http://schemas.openxmlformats.org/officeDocument/2006/relationships" r:embed="R164df94710b04cb6"/>
+                    <a:blip xmlns:r="http://schemas.openxmlformats.org/officeDocument/2006/relationships" r:embed="Rb0b11c5a40d1485e"/>
                     <a:stretch>
                       <a:fillRect/>
                     </a:stretch>
@@ -2362,7 +2362,7 @@
                   <pic:spPr>
                     <a:xfrm>
                       <a:off x="0" y="0"/>
-                      <a:ext cx="5220000" cy="792297"/>
+                      <a:ext cx="5220000" cy="651116"/>
                     </a:xfrm>
                     <a:prstGeom prst="rect">
                       <a:avLst/>
@@ -2430,7 +2430,7 @@
                     <pic:cNvPicPr/>
                   </pic:nvPicPr>
                   <pic:blipFill>
-                    <a:blip xmlns:r="http://schemas.openxmlformats.org/officeDocument/2006/relationships" r:embed="R6b5f16ddcdfa4512"/>
+                    <a:blip xmlns:r="http://schemas.openxmlformats.org/officeDocument/2006/relationships" r:embed="Rc500041014ae4e70"/>
                     <a:stretch>
                       <a:fillRect/>
                     </a:stretch>
@@ -2467,7 +2467,7 @@
       <w:r>
         <w:drawing>
           <wp:inline xmlns:wp="http://schemas.openxmlformats.org/drawingml/2006/wordprocessingDrawing" distT="0" distB="0" distL="0" distR="0">
-            <wp:extent cx="3257550" cy="2800350"/>
+            <wp:extent cx="3829050" cy="2800350"/>
             <wp:effectExtent l="0" t="0" r="0" b="0"/>
             <wp:docPr id="10" name="Mermaid diagram 10" descr="Mermaid diagram"/>
             <wp:cNvGraphicFramePr>
@@ -2481,7 +2481,7 @@
                     <pic:cNvPicPr/>
                   </pic:nvPicPr>
                   <pic:blipFill>
-                    <a:blip xmlns:r="http://schemas.openxmlformats.org/officeDocument/2006/relationships" r:embed="Rb0665dddb781466a"/>
+                    <a:blip xmlns:r="http://schemas.openxmlformats.org/officeDocument/2006/relationships" r:embed="Rdd9c157ec1d84ad0"/>
                     <a:stretch>
                       <a:fillRect/>
                     </a:stretch>
@@ -2489,7 +2489,7 @@
                   <pic:spPr>
                     <a:xfrm>
                       <a:off x="0" y="0"/>
-                      <a:ext cx="3257550" cy="2800350"/>
+                      <a:ext cx="3829050" cy="2800350"/>
                     </a:xfrm>
                     <a:prstGeom prst="rect">
                       <a:avLst/>
@@ -2518,7 +2518,7 @@
       <w:r>
         <w:drawing>
           <wp:inline xmlns:wp="http://schemas.openxmlformats.org/drawingml/2006/wordprocessingDrawing" distT="0" distB="0" distL="0" distR="0">
-            <wp:extent cx="5172075" cy="2800350"/>
+            <wp:extent cx="5220000" cy="2314751"/>
             <wp:effectExtent l="0" t="0" r="0" b="0"/>
             <wp:docPr id="11" name="Mermaid diagram 11" descr="Mermaid diagram"/>
             <wp:cNvGraphicFramePr>
@@ -2532,7 +2532,7 @@
                     <pic:cNvPicPr/>
                   </pic:nvPicPr>
                   <pic:blipFill>
-                    <a:blip xmlns:r="http://schemas.openxmlformats.org/officeDocument/2006/relationships" r:embed="Rfff1b45693d34858"/>
+                    <a:blip xmlns:r="http://schemas.openxmlformats.org/officeDocument/2006/relationships" r:embed="R610f7dee4966485e"/>
                     <a:stretch>
                       <a:fillRect/>
                     </a:stretch>
@@ -2540,7 +2540,7 @@
                   <pic:spPr>
                     <a:xfrm>
                       <a:off x="0" y="0"/>
-                      <a:ext cx="5172075" cy="2800350"/>
+                      <a:ext cx="5220000" cy="2314751"/>
                     </a:xfrm>
                     <a:prstGeom prst="rect">
                       <a:avLst/>
@@ -2569,7 +2569,7 @@
       <w:r>
         <w:drawing>
           <wp:inline xmlns:wp="http://schemas.openxmlformats.org/drawingml/2006/wordprocessingDrawing" distT="0" distB="0" distL="0" distR="0">
-            <wp:extent cx="5220000" cy="992036"/>
+            <wp:extent cx="5220000" cy="780214"/>
             <wp:effectExtent l="0" t="0" r="0" b="0"/>
             <wp:docPr id="12" name="Mermaid diagram 12" descr="Mermaid diagram"/>
             <wp:cNvGraphicFramePr>
@@ -2583,7 +2583,7 @@
                     <pic:cNvPicPr/>
                   </pic:nvPicPr>
                   <pic:blipFill>
-                    <a:blip xmlns:r="http://schemas.openxmlformats.org/officeDocument/2006/relationships" r:embed="R2bbcd54e88d2451b"/>
+                    <a:blip xmlns:r="http://schemas.openxmlformats.org/officeDocument/2006/relationships" r:embed="R158bf45cf2e644a3"/>
                     <a:stretch>
                       <a:fillRect/>
                     </a:stretch>
@@ -2591,7 +2591,7 @@
                   <pic:spPr>
                     <a:xfrm>
                       <a:off x="0" y="0"/>
-                      <a:ext cx="5220000" cy="992036"/>
+                      <a:ext cx="5220000" cy="780214"/>
                     </a:xfrm>
                     <a:prstGeom prst="rect">
                       <a:avLst/>
@@ -2659,7 +2659,7 @@
                     <pic:cNvPicPr/>
                   </pic:nvPicPr>
                   <pic:blipFill>
-                    <a:blip xmlns:r="http://schemas.openxmlformats.org/officeDocument/2006/relationships" r:embed="R0b53de10c85c4159"/>
+                    <a:blip xmlns:r="http://schemas.openxmlformats.org/officeDocument/2006/relationships" r:embed="R832ed3d0132d4246"/>
                     <a:stretch>
                       <a:fillRect/>
                     </a:stretch>
@@ -2696,7 +2696,7 @@
       <w:r>
         <w:drawing>
           <wp:inline xmlns:wp="http://schemas.openxmlformats.org/drawingml/2006/wordprocessingDrawing" distT="0" distB="0" distL="0" distR="0">
-            <wp:extent cx="3467100" cy="2800350"/>
+            <wp:extent cx="4038600" cy="2800350"/>
             <wp:effectExtent l="0" t="0" r="0" b="0"/>
             <wp:docPr id="14" name="Mermaid diagram 14" descr="Mermaid diagram"/>
             <wp:cNvGraphicFramePr>
@@ -2710,7 +2710,7 @@
                     <pic:cNvPicPr/>
                   </pic:nvPicPr>
                   <pic:blipFill>
-                    <a:blip xmlns:r="http://schemas.openxmlformats.org/officeDocument/2006/relationships" r:embed="R7f94b65e04b444cd"/>
+                    <a:blip xmlns:r="http://schemas.openxmlformats.org/officeDocument/2006/relationships" r:embed="R7aa9ca2d8a0b47b9"/>
                     <a:stretch>
                       <a:fillRect/>
                     </a:stretch>
@@ -2718,7 +2718,7 @@
                   <pic:spPr>
                     <a:xfrm>
                       <a:off x="0" y="0"/>
-                      <a:ext cx="3467100" cy="2800350"/>
+                      <a:ext cx="4038600" cy="2800350"/>
                     </a:xfrm>
                     <a:prstGeom prst="rect">
                       <a:avLst/>
@@ -2747,7 +2747,7 @@
       <w:r>
         <w:drawing>
           <wp:inline xmlns:wp="http://schemas.openxmlformats.org/drawingml/2006/wordprocessingDrawing" distT="0" distB="0" distL="0" distR="0">
-            <wp:extent cx="5220000" cy="2673659"/>
+            <wp:extent cx="5220000" cy="2211354"/>
             <wp:effectExtent l="0" t="0" r="0" b="0"/>
             <wp:docPr id="15" name="Mermaid diagram 15" descr="Mermaid diagram"/>
             <wp:cNvGraphicFramePr>
@@ -2761,7 +2761,7 @@
                     <pic:cNvPicPr/>
                   </pic:nvPicPr>
                   <pic:blipFill>
-                    <a:blip xmlns:r="http://schemas.openxmlformats.org/officeDocument/2006/relationships" r:embed="Re36186687b2e467d"/>
+                    <a:blip xmlns:r="http://schemas.openxmlformats.org/officeDocument/2006/relationships" r:embed="R351a5e7e21f9451d"/>
                     <a:stretch>
                       <a:fillRect/>
                     </a:stretch>
@@ -2769,7 +2769,7 @@
                   <pic:spPr>
                     <a:xfrm>
                       <a:off x="0" y="0"/>
-                      <a:ext cx="5220000" cy="2673659"/>
+                      <a:ext cx="5220000" cy="2211354"/>
                     </a:xfrm>
                     <a:prstGeom prst="rect">
                       <a:avLst/>
@@ -2798,7 +2798,7 @@
       <w:r>
         <w:drawing>
           <wp:inline xmlns:wp="http://schemas.openxmlformats.org/drawingml/2006/wordprocessingDrawing" distT="0" distB="0" distL="0" distR="0">
-            <wp:extent cx="5220000" cy="946749"/>
+            <wp:extent cx="5220000" cy="751926"/>
             <wp:effectExtent l="0" t="0" r="0" b="0"/>
             <wp:docPr id="16" name="Mermaid diagram 16" descr="Mermaid diagram"/>
             <wp:cNvGraphicFramePr>
@@ -2812,7 +2812,7 @@
                     <pic:cNvPicPr/>
                   </pic:nvPicPr>
                   <pic:blipFill>
-                    <a:blip xmlns:r="http://schemas.openxmlformats.org/officeDocument/2006/relationships" r:embed="Rb4953700d3fb4725"/>
+                    <a:blip xmlns:r="http://schemas.openxmlformats.org/officeDocument/2006/relationships" r:embed="R44644ede56b84755"/>
                     <a:stretch>
                       <a:fillRect/>
                     </a:stretch>
@@ -2820,7 +2820,7 @@
                   <pic:spPr>
                     <a:xfrm>
                       <a:off x="0" y="0"/>
-                      <a:ext cx="5220000" cy="946749"/>
+                      <a:ext cx="5220000" cy="751926"/>
                     </a:xfrm>
                     <a:prstGeom prst="rect">
                       <a:avLst/>
@@ -2863,7 +2863,7 @@
                     <pic:cNvPicPr/>
                   </pic:nvPicPr>
                   <pic:blipFill>
-                    <a:blip xmlns:r="http://schemas.openxmlformats.org/officeDocument/2006/relationships" r:embed="Re082703415714d1c"/>
+                    <a:blip xmlns:r="http://schemas.openxmlformats.org/officeDocument/2006/relationships" r:embed="R58ba340234874e16"/>
                     <a:stretch>
                       <a:fillRect/>
                     </a:stretch>
@@ -2914,7 +2914,7 @@
                     <pic:cNvPicPr/>
                   </pic:nvPicPr>
                   <pic:blipFill>
-                    <a:blip xmlns:r="http://schemas.openxmlformats.org/officeDocument/2006/relationships" r:embed="Rd4e10ce25fec4d53"/>
+                    <a:blip xmlns:r="http://schemas.openxmlformats.org/officeDocument/2006/relationships" r:embed="Rb85aab1fa6c0418a"/>
                     <a:stretch>
                       <a:fillRect/>
                     </a:stretch>
@@ -2965,7 +2965,7 @@
                     <pic:cNvPicPr/>
                   </pic:nvPicPr>
                   <pic:blipFill>
-                    <a:blip xmlns:r="http://schemas.openxmlformats.org/officeDocument/2006/relationships" r:embed="Rb748568f8dd84bdd"/>
+                    <a:blip xmlns:r="http://schemas.openxmlformats.org/officeDocument/2006/relationships" r:embed="Racec2695f3e94bf0"/>
                     <a:stretch>
                       <a:fillRect/>
                     </a:stretch>
@@ -3016,7 +3016,7 @@
                     <pic:cNvPicPr/>
                   </pic:nvPicPr>
                   <pic:blipFill>
-                    <a:blip xmlns:r="http://schemas.openxmlformats.org/officeDocument/2006/relationships" r:embed="Rcbc0972689df4436"/>
+                    <a:blip xmlns:r="http://schemas.openxmlformats.org/officeDocument/2006/relationships" r:embed="R6657dbe9e4c347be"/>
                     <a:stretch>
                       <a:fillRect/>
                     </a:stretch>
@@ -3067,7 +3067,7 @@
                     <pic:cNvPicPr/>
                   </pic:nvPicPr>
                   <pic:blipFill>
-                    <a:blip xmlns:r="http://schemas.openxmlformats.org/officeDocument/2006/relationships" r:embed="Rda842496e8ae44e8"/>
+                    <a:blip xmlns:r="http://schemas.openxmlformats.org/officeDocument/2006/relationships" r:embed="Rb506fc8ad31d4515"/>
                     <a:stretch>
                       <a:fillRect/>
                     </a:stretch>
@@ -3118,7 +3118,7 @@
                     <pic:cNvPicPr/>
                   </pic:nvPicPr>
                   <pic:blipFill>
-                    <a:blip xmlns:r="http://schemas.openxmlformats.org/officeDocument/2006/relationships" r:embed="Rf1c2eb56f4244a9a"/>
+                    <a:blip xmlns:r="http://schemas.openxmlformats.org/officeDocument/2006/relationships" r:embed="R5c4fdafca746480a"/>
                     <a:stretch>
                       <a:fillRect/>
                     </a:stretch>
@@ -3169,7 +3169,7 @@
                     <pic:cNvPicPr/>
                   </pic:nvPicPr>
                   <pic:blipFill>
-                    <a:blip xmlns:r="http://schemas.openxmlformats.org/officeDocument/2006/relationships" r:embed="Reb264a0b47814383"/>
+                    <a:blip xmlns:r="http://schemas.openxmlformats.org/officeDocument/2006/relationships" r:embed="R532b812fcb254416"/>
                     <a:stretch>
                       <a:fillRect/>
                     </a:stretch>
@@ -3220,7 +3220,7 @@
                     <pic:cNvPicPr/>
                   </pic:nvPicPr>
                   <pic:blipFill>
-                    <a:blip xmlns:r="http://schemas.openxmlformats.org/officeDocument/2006/relationships" r:embed="R01ebd4ec7c0747c3"/>
+                    <a:blip xmlns:r="http://schemas.openxmlformats.org/officeDocument/2006/relationships" r:embed="R19ec7af0a4374a2a"/>
                     <a:stretch>
                       <a:fillRect/>
                     </a:stretch>
@@ -3271,7 +3271,7 @@
                     <pic:cNvPicPr/>
                   </pic:nvPicPr>
                   <pic:blipFill>
-                    <a:blip xmlns:r="http://schemas.openxmlformats.org/officeDocument/2006/relationships" r:embed="R3c5ff439a45c4ca6"/>
+                    <a:blip xmlns:r="http://schemas.openxmlformats.org/officeDocument/2006/relationships" r:embed="Rffff38760f0e44c6"/>
                     <a:stretch>
                       <a:fillRect/>
                     </a:stretch>
@@ -3322,7 +3322,7 @@
                     <pic:cNvPicPr/>
                   </pic:nvPicPr>
                   <pic:blipFill>
-                    <a:blip xmlns:r="http://schemas.openxmlformats.org/officeDocument/2006/relationships" r:embed="R6f4664148f8443f3"/>
+                    <a:blip xmlns:r="http://schemas.openxmlformats.org/officeDocument/2006/relationships" r:embed="R1de541fc6f894122"/>
                     <a:stretch>
                       <a:fillRect/>
                     </a:stretch>
@@ -3419,7 +3419,7 @@
                     <pic:cNvPicPr/>
                   </pic:nvPicPr>
                   <pic:blipFill>
-                    <a:blip xmlns:r="http://schemas.openxmlformats.org/officeDocument/2006/relationships" r:embed="R607f0330b0aa47f7"/>
+                    <a:blip xmlns:r="http://schemas.openxmlformats.org/officeDocument/2006/relationships" r:embed="R7247d98fdd584c83"/>
                     <a:stretch>
                       <a:fillRect/>
                     </a:stretch>
@@ -3462,7 +3462,7 @@
                     <pic:cNvPicPr/>
                   </pic:nvPicPr>
                   <pic:blipFill>
-                    <a:blip xmlns:r="http://schemas.openxmlformats.org/officeDocument/2006/relationships" r:embed="R0d1fa331103e4a88"/>
+                    <a:blip xmlns:r="http://schemas.openxmlformats.org/officeDocument/2006/relationships" r:embed="Reca00d0d36e543d4"/>
                     <a:stretch>
                       <a:fillRect/>
                     </a:stretch>
@@ -3505,7 +3505,7 @@
                     <pic:cNvPicPr/>
                   </pic:nvPicPr>
                   <pic:blipFill>
-                    <a:blip xmlns:r="http://schemas.openxmlformats.org/officeDocument/2006/relationships" r:embed="R7147ca56eec24338"/>
+                    <a:blip xmlns:r="http://schemas.openxmlformats.org/officeDocument/2006/relationships" r:embed="R909d62d304be47cb"/>
                     <a:stretch>
                       <a:fillRect/>
                     </a:stretch>
@@ -3548,7 +3548,7 @@
                     <pic:cNvPicPr/>
                   </pic:nvPicPr>
                   <pic:blipFill>
-                    <a:blip xmlns:r="http://schemas.openxmlformats.org/officeDocument/2006/relationships" r:embed="R48e6969c4db64329"/>
+                    <a:blip xmlns:r="http://schemas.openxmlformats.org/officeDocument/2006/relationships" r:embed="R802afa28c4a64b95"/>
                     <a:stretch>
                       <a:fillRect/>
                     </a:stretch>
@@ -3933,7 +3933,7 @@
                     <pic:cNvPicPr/>
                   </pic:nvPicPr>
                   <pic:blipFill>
-                    <a:blip xmlns:r="http://schemas.openxmlformats.org/officeDocument/2006/relationships" r:embed="R5aa94d739cdc4558"/>
+                    <a:blip xmlns:r="http://schemas.openxmlformats.org/officeDocument/2006/relationships" r:embed="Rc5ce6eddaff9448d"/>
                     <a:stretch>
                       <a:fillRect/>
                     </a:stretch>
@@ -4125,7 +4125,7 @@
                     <pic:cNvPicPr/>
                   </pic:nvPicPr>
                   <pic:blipFill>
-                    <a:blip xmlns:r="http://schemas.openxmlformats.org/officeDocument/2006/relationships" r:embed="Rcf1646ef941548c7"/>
+                    <a:blip xmlns:r="http://schemas.openxmlformats.org/officeDocument/2006/relationships" r:embed="Ra03280ad6a414193"/>
                     <a:stretch>
                       <a:fillRect/>
                     </a:stretch>
@@ -4176,7 +4176,7 @@
                     <pic:cNvPicPr/>
                   </pic:nvPicPr>
                   <pic:blipFill>
-                    <a:blip xmlns:r="http://schemas.openxmlformats.org/officeDocument/2006/relationships" r:embed="R91c917d5f45e425b"/>
+                    <a:blip xmlns:r="http://schemas.openxmlformats.org/officeDocument/2006/relationships" r:embed="R270c43157cc640ce"/>
                     <a:stretch>
                       <a:fillRect/>
                     </a:stretch>
@@ -4227,7 +4227,7 @@
                     <pic:cNvPicPr/>
                   </pic:nvPicPr>
                   <pic:blipFill>
-                    <a:blip xmlns:r="http://schemas.openxmlformats.org/officeDocument/2006/relationships" r:embed="R125d04cd49934c4d"/>
+                    <a:blip xmlns:r="http://schemas.openxmlformats.org/officeDocument/2006/relationships" r:embed="Rb31c453b41c140a2"/>
                     <a:stretch>
                       <a:fillRect/>
                     </a:stretch>
@@ -4278,7 +4278,7 @@
                     <pic:cNvPicPr/>
                   </pic:nvPicPr>
                   <pic:blipFill>
-                    <a:blip xmlns:r="http://schemas.openxmlformats.org/officeDocument/2006/relationships" r:embed="R4b76cdf0579b479a"/>
+                    <a:blip xmlns:r="http://schemas.openxmlformats.org/officeDocument/2006/relationships" r:embed="R001ef31181a8421e"/>
                     <a:stretch>
                       <a:fillRect/>
                     </a:stretch>
@@ -4657,7 +4657,7 @@
                     <pic:cNvPicPr/>
                   </pic:nvPicPr>
                   <pic:blipFill>
-                    <a:blip xmlns:r="http://schemas.openxmlformats.org/officeDocument/2006/relationships" r:embed="R70def750eccd4e85"/>
+                    <a:blip xmlns:r="http://schemas.openxmlformats.org/officeDocument/2006/relationships" r:embed="R8eb8166eb5ab404e"/>
                     <a:stretch>
                       <a:fillRect/>
                     </a:stretch>
@@ -5338,7 +5338,7 @@
             <w:r>
               <w:t xml:space="preserve">Cell with </w:t>
             </w:r>
-            <w:hyperlink xmlns:r="http://schemas.openxmlformats.org/officeDocument/2006/relationships" w:history="true" r:id="R9d1b8ae1aa1b4200">
+            <w:hyperlink xmlns:r="http://schemas.openxmlformats.org/officeDocument/2006/relationships" w:history="true" r:id="Rf150940c793541d0">
               <w:r>
                 <w:rPr>
                   <w:rStyle w:val="Hyperlink"/>
@@ -5624,7 +5624,7 @@
                           <pic:cNvPicPr/>
                         </pic:nvPicPr>
                         <pic:blipFill>
-                          <a:blip xmlns:r="http://schemas.openxmlformats.org/officeDocument/2006/relationships" r:embed="R7fd12fd634854164"/>
+                          <a:blip xmlns:r="http://schemas.openxmlformats.org/officeDocument/2006/relationships" r:embed="R6a59d7f397a04018"/>
                           <a:stretch>
                             <a:fillRect/>
                           </a:stretch>
@@ -5724,7 +5724,7 @@
                     <pic:cNvPicPr/>
                   </pic:nvPicPr>
                   <pic:blipFill>
-                    <a:blip xmlns:r="http://schemas.openxmlformats.org/officeDocument/2006/relationships" r:embed="R3454123a0a81428c"/>
+                    <a:blip xmlns:r="http://schemas.openxmlformats.org/officeDocument/2006/relationships" r:embed="R019afa60d0114441"/>
                     <a:stretch>
                       <a:fillRect/>
                     </a:stretch>
@@ -5774,7 +5774,7 @@
                     <pic:cNvPicPr/>
                   </pic:nvPicPr>
                   <pic:blipFill>
-                    <a:blip xmlns:r="http://schemas.openxmlformats.org/officeDocument/2006/relationships" r:embed="R1bd4544dca6a44d9"/>
+                    <a:blip xmlns:r="http://schemas.openxmlformats.org/officeDocument/2006/relationships" r:embed="R76fda91dbdaf42f7"/>
                     <a:stretch>
                       <a:fillRect/>
                     </a:stretch>
@@ -5824,7 +5824,7 @@
                     <pic:cNvPicPr/>
                   </pic:nvPicPr>
                   <pic:blipFill>
-                    <a:blip xmlns:r="http://schemas.openxmlformats.org/officeDocument/2006/relationships" r:embed="Rbe6392578a92427d"/>
+                    <a:blip xmlns:r="http://schemas.openxmlformats.org/officeDocument/2006/relationships" r:embed="R318e6cb64db14821"/>
                     <a:stretch>
                       <a:fillRect/>
                     </a:stretch>

</xml_diff>

<commit_message>
fix(er): use Mermaid default nodesep
Revert ER layout node separation to Mermaid’s default (nodesep=100) while keeping guided curveBasis routing and SVG marker defs.

Made-with: Cursor
</commit_message>
<xml_diff>
--- a/test.docx
+++ b/test.docx
@@ -236,7 +236,7 @@
       <w:r>
         <w:t xml:space="preserve">, and </w:t>
       </w:r>
-      <w:hyperlink xmlns:r="http://schemas.openxmlformats.org/officeDocument/2006/relationships" w:history="true" r:id="Re66a278750d54907">
+      <w:hyperlink xmlns:r="http://schemas.openxmlformats.org/officeDocument/2006/relationships" w:history="true" r:id="R087760cbd885412d">
         <w:r>
           <w:rPr>
             <w:rStyle w:val="Hyperlink"/>
@@ -475,7 +475,7 @@
       <w:r>
         <w:t xml:space="preserve">Direct link: </w:t>
       </w:r>
-      <w:hyperlink xmlns:r="http://schemas.openxmlformats.org/officeDocument/2006/relationships" w:history="true" r:id="R5eb4ae28c8ad46cc">
+      <w:hyperlink xmlns:r="http://schemas.openxmlformats.org/officeDocument/2006/relationships" w:history="true" r:id="R7850dbbacc454b86">
         <w:r>
           <w:rPr>
             <w:rStyle w:val="Hyperlink"/>
@@ -496,7 +496,7 @@
       <w:r>
         <w:t xml:space="preserve">Direct link with title: </w:t>
       </w:r>
-      <w:hyperlink xmlns:r="http://schemas.openxmlformats.org/officeDocument/2006/relationships" w:history="true" r:id="Ra20f6913f9fb405e">
+      <w:hyperlink xmlns:r="http://schemas.openxmlformats.org/officeDocument/2006/relationships" w:history="true" r:id="Re83fb8c3eb8c4a67">
         <w:r>
           <w:rPr>
             <w:rStyle w:val="Hyperlink"/>
@@ -517,7 +517,7 @@
       <w:r>
         <w:t xml:space="preserve">Reference-style link: </w:t>
       </w:r>
-      <w:hyperlink xmlns:r="http://schemas.openxmlformats.org/officeDocument/2006/relationships" w:history="true" r:id="Rfa8a665145c44bb8">
+      <w:hyperlink xmlns:r="http://schemas.openxmlformats.org/officeDocument/2006/relationships" w:history="true" r:id="R2579bddac1e14995">
         <w:r>
           <w:rPr>
             <w:rStyle w:val="Hyperlink"/>
@@ -538,7 +538,7 @@
       <w:r>
         <w:t xml:space="preserve">Collapsed reference link: </w:t>
       </w:r>
-      <w:hyperlink xmlns:r="http://schemas.openxmlformats.org/officeDocument/2006/relationships" w:history="true" r:id="R16dda27af2e743a7">
+      <w:hyperlink xmlns:r="http://schemas.openxmlformats.org/officeDocument/2006/relationships" w:history="true" r:id="R3d3d2718685043ec">
         <w:r>
           <w:rPr>
             <w:rStyle w:val="Hyperlink"/>
@@ -559,7 +559,7 @@
       <w:r>
         <w:t xml:space="preserve">Repeated reference link: </w:t>
       </w:r>
-      <w:hyperlink xmlns:r="http://schemas.openxmlformats.org/officeDocument/2006/relationships" w:history="true" r:id="Ra96a6c9785d04d08">
+      <w:hyperlink xmlns:r="http://schemas.openxmlformats.org/officeDocument/2006/relationships" w:history="true" r:id="Re518f4d8b2884638">
         <w:r>
           <w:rPr>
             <w:rStyle w:val="Hyperlink"/>
@@ -580,7 +580,7 @@
       <w:r>
         <w:t xml:space="preserve">Autolink URL: </w:t>
       </w:r>
-      <w:hyperlink xmlns:r="http://schemas.openxmlformats.org/officeDocument/2006/relationships" w:history="true" r:id="Re1f333f584e7424a">
+      <w:hyperlink xmlns:r="http://schemas.openxmlformats.org/officeDocument/2006/relationships" w:history="true" r:id="Rb30a6d93d6d842c3">
         <w:r>
           <w:rPr>
             <w:rStyle w:val="Hyperlink"/>
@@ -601,7 +601,7 @@
       <w:r>
         <w:t xml:space="preserve">Autolink email: </w:t>
       </w:r>
-      <w:hyperlink xmlns:r="http://schemas.openxmlformats.org/officeDocument/2006/relationships" w:history="true" r:id="R6796b7a546fa452c">
+      <w:hyperlink xmlns:r="http://schemas.openxmlformats.org/officeDocument/2006/relationships" w:history="true" r:id="R6a47b3b7e961420b">
         <w:r>
           <w:rPr>
             <w:rStyle w:val="Hyperlink"/>
@@ -700,7 +700,7 @@
       <w:r>
         <w:t xml:space="preserve">, and </w:t>
       </w:r>
-      <w:hyperlink xmlns:r="http://schemas.openxmlformats.org/officeDocument/2006/relationships" w:history="true" r:id="R4bfa6716dabf420a">
+      <w:hyperlink xmlns:r="http://schemas.openxmlformats.org/officeDocument/2006/relationships" w:history="true" r:id="Rba02af4e21064ad8">
         <w:r>
           <w:rPr>
             <w:rStyle w:val="Hyperlink"/>
@@ -1093,7 +1093,7 @@
       <w:r>
         <w:t xml:space="preserve">Continuation paragraph with </w:t>
       </w:r>
-      <w:hyperlink xmlns:r="http://schemas.openxmlformats.org/officeDocument/2006/relationships" w:history="true" r:id="Rf100f0e8694d4c74">
+      <w:hyperlink xmlns:r="http://schemas.openxmlformats.org/officeDocument/2006/relationships" w:history="true" r:id="Raf16e8f3a8d24ab2">
         <w:r>
           <w:rPr>
             <w:rStyle w:val="Hyperlink"/>
@@ -1591,7 +1591,7 @@
       <w:r>
         <w:t xml:space="preserve">, and </w:t>
       </w:r>
-      <w:hyperlink xmlns:r="http://schemas.openxmlformats.org/officeDocument/2006/relationships" w:history="true" r:id="R2a1b759aab604013">
+      <w:hyperlink xmlns:r="http://schemas.openxmlformats.org/officeDocument/2006/relationships" w:history="true" r:id="R9ca2be9f25d64d91">
         <w:r>
           <w:rPr>
             <w:rStyle w:val="Hyperlink"/>
@@ -1979,7 +1979,7 @@
                     <pic:cNvPicPr/>
                   </pic:nvPicPr>
                   <pic:blipFill>
-                    <a:blip xmlns:r="http://schemas.openxmlformats.org/officeDocument/2006/relationships" r:embed="Ref1d6dec1f88490a"/>
+                    <a:blip xmlns:r="http://schemas.openxmlformats.org/officeDocument/2006/relationships" r:embed="R80b9dde7cacf4761"/>
                     <a:stretch>
                       <a:fillRect/>
                     </a:stretch>
@@ -2039,7 +2039,7 @@
                     <pic:cNvPicPr/>
                   </pic:nvPicPr>
                   <pic:blipFill>
-                    <a:blip xmlns:r="http://schemas.openxmlformats.org/officeDocument/2006/relationships" r:embed="R00bd9c37b0aa4c87"/>
+                    <a:blip xmlns:r="http://schemas.openxmlformats.org/officeDocument/2006/relationships" r:embed="R398548629d304842"/>
                     <a:stretch>
                       <a:fillRect/>
                     </a:stretch>
@@ -2099,7 +2099,7 @@
                     <pic:cNvPicPr/>
                   </pic:nvPicPr>
                   <pic:blipFill>
-                    <a:blip xmlns:r="http://schemas.openxmlformats.org/officeDocument/2006/relationships" r:embed="R45e9d731bf264d62"/>
+                    <a:blip xmlns:r="http://schemas.openxmlformats.org/officeDocument/2006/relationships" r:embed="R17b95c3d4f4c43bc"/>
                     <a:stretch>
                       <a:fillRect/>
                     </a:stretch>
@@ -2150,7 +2150,7 @@
                     <pic:cNvPicPr/>
                   </pic:nvPicPr>
                   <pic:blipFill>
-                    <a:blip xmlns:r="http://schemas.openxmlformats.org/officeDocument/2006/relationships" r:embed="R7eb088bb380142ad"/>
+                    <a:blip xmlns:r="http://schemas.openxmlformats.org/officeDocument/2006/relationships" r:embed="R9befa9bbd1544354"/>
                     <a:stretch>
                       <a:fillRect/>
                     </a:stretch>
@@ -2201,7 +2201,7 @@
                     <pic:cNvPicPr/>
                   </pic:nvPicPr>
                   <pic:blipFill>
-                    <a:blip xmlns:r="http://schemas.openxmlformats.org/officeDocument/2006/relationships" r:embed="R73a0e0670b4f4a2f"/>
+                    <a:blip xmlns:r="http://schemas.openxmlformats.org/officeDocument/2006/relationships" r:embed="Rd8f3c14499704df7"/>
                     <a:stretch>
                       <a:fillRect/>
                     </a:stretch>
@@ -2252,7 +2252,7 @@
                     <pic:cNvPicPr/>
                   </pic:nvPicPr>
                   <pic:blipFill>
-                    <a:blip xmlns:r="http://schemas.openxmlformats.org/officeDocument/2006/relationships" r:embed="Re4880b68f7134911"/>
+                    <a:blip xmlns:r="http://schemas.openxmlformats.org/officeDocument/2006/relationships" r:embed="R591f10f7d7424daa"/>
                     <a:stretch>
                       <a:fillRect/>
                     </a:stretch>
@@ -2289,7 +2289,7 @@
       <w:r>
         <w:drawing>
           <wp:inline xmlns:wp="http://schemas.openxmlformats.org/drawingml/2006/wordprocessingDrawing" distT="0" distB="0" distL="0" distR="0">
-            <wp:extent cx="3867150" cy="4486275"/>
+            <wp:extent cx="3295650" cy="4486275"/>
             <wp:effectExtent l="0" t="0" r="0" b="0"/>
             <wp:docPr id="7" name="Mermaid diagram 7" descr="Mermaid diagram"/>
             <wp:cNvGraphicFramePr>
@@ -2303,7 +2303,7 @@
                     <pic:cNvPicPr/>
                   </pic:nvPicPr>
                   <pic:blipFill>
-                    <a:blip xmlns:r="http://schemas.openxmlformats.org/officeDocument/2006/relationships" r:embed="R49c79b06c7984f52"/>
+                    <a:blip xmlns:r="http://schemas.openxmlformats.org/officeDocument/2006/relationships" r:embed="R82a19d6c7247422a"/>
                     <a:stretch>
                       <a:fillRect/>
                     </a:stretch>
@@ -2311,7 +2311,7 @@
                   <pic:spPr>
                     <a:xfrm>
                       <a:off x="0" y="0"/>
-                      <a:ext cx="3867150" cy="4486275"/>
+                      <a:ext cx="3295650" cy="4486275"/>
                     </a:xfrm>
                     <a:prstGeom prst="rect">
                       <a:avLst/>
@@ -2340,7 +2340,7 @@
       <w:r>
         <w:drawing>
           <wp:inline xmlns:wp="http://schemas.openxmlformats.org/drawingml/2006/wordprocessingDrawing" distT="0" distB="0" distL="0" distR="0">
-            <wp:extent cx="5220000" cy="651116"/>
+            <wp:extent cx="5220000" cy="792297"/>
             <wp:effectExtent l="0" t="0" r="0" b="0"/>
             <wp:docPr id="8" name="Mermaid diagram 8" descr="Mermaid diagram"/>
             <wp:cNvGraphicFramePr>
@@ -2354,7 +2354,7 @@
                     <pic:cNvPicPr/>
                   </pic:nvPicPr>
                   <pic:blipFill>
-                    <a:blip xmlns:r="http://schemas.openxmlformats.org/officeDocument/2006/relationships" r:embed="Rb0b11c5a40d1485e"/>
+                    <a:blip xmlns:r="http://schemas.openxmlformats.org/officeDocument/2006/relationships" r:embed="R77f6dd2e74f948f6"/>
                     <a:stretch>
                       <a:fillRect/>
                     </a:stretch>
@@ -2362,7 +2362,7 @@
                   <pic:spPr>
                     <a:xfrm>
                       <a:off x="0" y="0"/>
-                      <a:ext cx="5220000" cy="651116"/>
+                      <a:ext cx="5220000" cy="792297"/>
                     </a:xfrm>
                     <a:prstGeom prst="rect">
                       <a:avLst/>
@@ -2430,7 +2430,7 @@
                     <pic:cNvPicPr/>
                   </pic:nvPicPr>
                   <pic:blipFill>
-                    <a:blip xmlns:r="http://schemas.openxmlformats.org/officeDocument/2006/relationships" r:embed="Rc500041014ae4e70"/>
+                    <a:blip xmlns:r="http://schemas.openxmlformats.org/officeDocument/2006/relationships" r:embed="Rf727a42b97704863"/>
                     <a:stretch>
                       <a:fillRect/>
                     </a:stretch>
@@ -2467,7 +2467,7 @@
       <w:r>
         <w:drawing>
           <wp:inline xmlns:wp="http://schemas.openxmlformats.org/drawingml/2006/wordprocessingDrawing" distT="0" distB="0" distL="0" distR="0">
-            <wp:extent cx="3829050" cy="2800350"/>
+            <wp:extent cx="3257550" cy="2800350"/>
             <wp:effectExtent l="0" t="0" r="0" b="0"/>
             <wp:docPr id="10" name="Mermaid diagram 10" descr="Mermaid diagram"/>
             <wp:cNvGraphicFramePr>
@@ -2481,7 +2481,7 @@
                     <pic:cNvPicPr/>
                   </pic:nvPicPr>
                   <pic:blipFill>
-                    <a:blip xmlns:r="http://schemas.openxmlformats.org/officeDocument/2006/relationships" r:embed="Rdd9c157ec1d84ad0"/>
+                    <a:blip xmlns:r="http://schemas.openxmlformats.org/officeDocument/2006/relationships" r:embed="Rf3d73f0b81a94efb"/>
                     <a:stretch>
                       <a:fillRect/>
                     </a:stretch>
@@ -2489,7 +2489,7 @@
                   <pic:spPr>
                     <a:xfrm>
                       <a:off x="0" y="0"/>
-                      <a:ext cx="3829050" cy="2800350"/>
+                      <a:ext cx="3257550" cy="2800350"/>
                     </a:xfrm>
                     <a:prstGeom prst="rect">
                       <a:avLst/>
@@ -2518,7 +2518,7 @@
       <w:r>
         <w:drawing>
           <wp:inline xmlns:wp="http://schemas.openxmlformats.org/drawingml/2006/wordprocessingDrawing" distT="0" distB="0" distL="0" distR="0">
-            <wp:extent cx="5220000" cy="2314751"/>
+            <wp:extent cx="5172075" cy="2800350"/>
             <wp:effectExtent l="0" t="0" r="0" b="0"/>
             <wp:docPr id="11" name="Mermaid diagram 11" descr="Mermaid diagram"/>
             <wp:cNvGraphicFramePr>
@@ -2532,7 +2532,7 @@
                     <pic:cNvPicPr/>
                   </pic:nvPicPr>
                   <pic:blipFill>
-                    <a:blip xmlns:r="http://schemas.openxmlformats.org/officeDocument/2006/relationships" r:embed="R610f7dee4966485e"/>
+                    <a:blip xmlns:r="http://schemas.openxmlformats.org/officeDocument/2006/relationships" r:embed="R3cbc22088f1b4c94"/>
                     <a:stretch>
                       <a:fillRect/>
                     </a:stretch>
@@ -2540,7 +2540,7 @@
                   <pic:spPr>
                     <a:xfrm>
                       <a:off x="0" y="0"/>
-                      <a:ext cx="5220000" cy="2314751"/>
+                      <a:ext cx="5172075" cy="2800350"/>
                     </a:xfrm>
                     <a:prstGeom prst="rect">
                       <a:avLst/>
@@ -2569,7 +2569,7 @@
       <w:r>
         <w:drawing>
           <wp:inline xmlns:wp="http://schemas.openxmlformats.org/drawingml/2006/wordprocessingDrawing" distT="0" distB="0" distL="0" distR="0">
-            <wp:extent cx="5220000" cy="780214"/>
+            <wp:extent cx="5220000" cy="992036"/>
             <wp:effectExtent l="0" t="0" r="0" b="0"/>
             <wp:docPr id="12" name="Mermaid diagram 12" descr="Mermaid diagram"/>
             <wp:cNvGraphicFramePr>
@@ -2583,7 +2583,7 @@
                     <pic:cNvPicPr/>
                   </pic:nvPicPr>
                   <pic:blipFill>
-                    <a:blip xmlns:r="http://schemas.openxmlformats.org/officeDocument/2006/relationships" r:embed="R158bf45cf2e644a3"/>
+                    <a:blip xmlns:r="http://schemas.openxmlformats.org/officeDocument/2006/relationships" r:embed="R1220eaaf083f4090"/>
                     <a:stretch>
                       <a:fillRect/>
                     </a:stretch>
@@ -2591,7 +2591,7 @@
                   <pic:spPr>
                     <a:xfrm>
                       <a:off x="0" y="0"/>
-                      <a:ext cx="5220000" cy="780214"/>
+                      <a:ext cx="5220000" cy="992036"/>
                     </a:xfrm>
                     <a:prstGeom prst="rect">
                       <a:avLst/>
@@ -2659,7 +2659,7 @@
                     <pic:cNvPicPr/>
                   </pic:nvPicPr>
                   <pic:blipFill>
-                    <a:blip xmlns:r="http://schemas.openxmlformats.org/officeDocument/2006/relationships" r:embed="R832ed3d0132d4246"/>
+                    <a:blip xmlns:r="http://schemas.openxmlformats.org/officeDocument/2006/relationships" r:embed="Rcef9f304881a4dc8"/>
                     <a:stretch>
                       <a:fillRect/>
                     </a:stretch>
@@ -2696,7 +2696,7 @@
       <w:r>
         <w:drawing>
           <wp:inline xmlns:wp="http://schemas.openxmlformats.org/drawingml/2006/wordprocessingDrawing" distT="0" distB="0" distL="0" distR="0">
-            <wp:extent cx="4038600" cy="2800350"/>
+            <wp:extent cx="3467100" cy="2800350"/>
             <wp:effectExtent l="0" t="0" r="0" b="0"/>
             <wp:docPr id="14" name="Mermaid diagram 14" descr="Mermaid diagram"/>
             <wp:cNvGraphicFramePr>
@@ -2710,7 +2710,7 @@
                     <pic:cNvPicPr/>
                   </pic:nvPicPr>
                   <pic:blipFill>
-                    <a:blip xmlns:r="http://schemas.openxmlformats.org/officeDocument/2006/relationships" r:embed="R7aa9ca2d8a0b47b9"/>
+                    <a:blip xmlns:r="http://schemas.openxmlformats.org/officeDocument/2006/relationships" r:embed="Rab03ea9359384edf"/>
                     <a:stretch>
                       <a:fillRect/>
                     </a:stretch>
@@ -2718,7 +2718,7 @@
                   <pic:spPr>
                     <a:xfrm>
                       <a:off x="0" y="0"/>
-                      <a:ext cx="4038600" cy="2800350"/>
+                      <a:ext cx="3467100" cy="2800350"/>
                     </a:xfrm>
                     <a:prstGeom prst="rect">
                       <a:avLst/>
@@ -2747,7 +2747,7 @@
       <w:r>
         <w:drawing>
           <wp:inline xmlns:wp="http://schemas.openxmlformats.org/drawingml/2006/wordprocessingDrawing" distT="0" distB="0" distL="0" distR="0">
-            <wp:extent cx="5220000" cy="2211354"/>
+            <wp:extent cx="5220000" cy="2673659"/>
             <wp:effectExtent l="0" t="0" r="0" b="0"/>
             <wp:docPr id="15" name="Mermaid diagram 15" descr="Mermaid diagram"/>
             <wp:cNvGraphicFramePr>
@@ -2761,7 +2761,7 @@
                     <pic:cNvPicPr/>
                   </pic:nvPicPr>
                   <pic:blipFill>
-                    <a:blip xmlns:r="http://schemas.openxmlformats.org/officeDocument/2006/relationships" r:embed="R351a5e7e21f9451d"/>
+                    <a:blip xmlns:r="http://schemas.openxmlformats.org/officeDocument/2006/relationships" r:embed="R45fb6744bd9643d6"/>
                     <a:stretch>
                       <a:fillRect/>
                     </a:stretch>
@@ -2769,7 +2769,7 @@
                   <pic:spPr>
                     <a:xfrm>
                       <a:off x="0" y="0"/>
-                      <a:ext cx="5220000" cy="2211354"/>
+                      <a:ext cx="5220000" cy="2673659"/>
                     </a:xfrm>
                     <a:prstGeom prst="rect">
                       <a:avLst/>
@@ -2798,7 +2798,7 @@
       <w:r>
         <w:drawing>
           <wp:inline xmlns:wp="http://schemas.openxmlformats.org/drawingml/2006/wordprocessingDrawing" distT="0" distB="0" distL="0" distR="0">
-            <wp:extent cx="5220000" cy="751926"/>
+            <wp:extent cx="5220000" cy="946749"/>
             <wp:effectExtent l="0" t="0" r="0" b="0"/>
             <wp:docPr id="16" name="Mermaid diagram 16" descr="Mermaid diagram"/>
             <wp:cNvGraphicFramePr>
@@ -2812,7 +2812,7 @@
                     <pic:cNvPicPr/>
                   </pic:nvPicPr>
                   <pic:blipFill>
-                    <a:blip xmlns:r="http://schemas.openxmlformats.org/officeDocument/2006/relationships" r:embed="R44644ede56b84755"/>
+                    <a:blip xmlns:r="http://schemas.openxmlformats.org/officeDocument/2006/relationships" r:embed="R747e11d988de4b4e"/>
                     <a:stretch>
                       <a:fillRect/>
                     </a:stretch>
@@ -2820,7 +2820,7 @@
                   <pic:spPr>
                     <a:xfrm>
                       <a:off x="0" y="0"/>
-                      <a:ext cx="5220000" cy="751926"/>
+                      <a:ext cx="5220000" cy="946749"/>
                     </a:xfrm>
                     <a:prstGeom prst="rect">
                       <a:avLst/>
@@ -2863,7 +2863,7 @@
                     <pic:cNvPicPr/>
                   </pic:nvPicPr>
                   <pic:blipFill>
-                    <a:blip xmlns:r="http://schemas.openxmlformats.org/officeDocument/2006/relationships" r:embed="R58ba340234874e16"/>
+                    <a:blip xmlns:r="http://schemas.openxmlformats.org/officeDocument/2006/relationships" r:embed="R9eb26d424fc247df"/>
                     <a:stretch>
                       <a:fillRect/>
                     </a:stretch>
@@ -2914,7 +2914,7 @@
                     <pic:cNvPicPr/>
                   </pic:nvPicPr>
                   <pic:blipFill>
-                    <a:blip xmlns:r="http://schemas.openxmlformats.org/officeDocument/2006/relationships" r:embed="Rb85aab1fa6c0418a"/>
+                    <a:blip xmlns:r="http://schemas.openxmlformats.org/officeDocument/2006/relationships" r:embed="R4351355b12f14b4b"/>
                     <a:stretch>
                       <a:fillRect/>
                     </a:stretch>
@@ -2965,7 +2965,7 @@
                     <pic:cNvPicPr/>
                   </pic:nvPicPr>
                   <pic:blipFill>
-                    <a:blip xmlns:r="http://schemas.openxmlformats.org/officeDocument/2006/relationships" r:embed="Racec2695f3e94bf0"/>
+                    <a:blip xmlns:r="http://schemas.openxmlformats.org/officeDocument/2006/relationships" r:embed="Re2be9fd391974fb4"/>
                     <a:stretch>
                       <a:fillRect/>
                     </a:stretch>
@@ -3016,7 +3016,7 @@
                     <pic:cNvPicPr/>
                   </pic:nvPicPr>
                   <pic:blipFill>
-                    <a:blip xmlns:r="http://schemas.openxmlformats.org/officeDocument/2006/relationships" r:embed="R6657dbe9e4c347be"/>
+                    <a:blip xmlns:r="http://schemas.openxmlformats.org/officeDocument/2006/relationships" r:embed="Rfa201bb19d1842ae"/>
                     <a:stretch>
                       <a:fillRect/>
                     </a:stretch>
@@ -3067,7 +3067,7 @@
                     <pic:cNvPicPr/>
                   </pic:nvPicPr>
                   <pic:blipFill>
-                    <a:blip xmlns:r="http://schemas.openxmlformats.org/officeDocument/2006/relationships" r:embed="Rb506fc8ad31d4515"/>
+                    <a:blip xmlns:r="http://schemas.openxmlformats.org/officeDocument/2006/relationships" r:embed="Ra7dc1225d5bb4613"/>
                     <a:stretch>
                       <a:fillRect/>
                     </a:stretch>
@@ -3118,7 +3118,7 @@
                     <pic:cNvPicPr/>
                   </pic:nvPicPr>
                   <pic:blipFill>
-                    <a:blip xmlns:r="http://schemas.openxmlformats.org/officeDocument/2006/relationships" r:embed="R5c4fdafca746480a"/>
+                    <a:blip xmlns:r="http://schemas.openxmlformats.org/officeDocument/2006/relationships" r:embed="R7b7660c94c8e4799"/>
                     <a:stretch>
                       <a:fillRect/>
                     </a:stretch>
@@ -3169,7 +3169,7 @@
                     <pic:cNvPicPr/>
                   </pic:nvPicPr>
                   <pic:blipFill>
-                    <a:blip xmlns:r="http://schemas.openxmlformats.org/officeDocument/2006/relationships" r:embed="R532b812fcb254416"/>
+                    <a:blip xmlns:r="http://schemas.openxmlformats.org/officeDocument/2006/relationships" r:embed="Rad64ea7a8f3049e3"/>
                     <a:stretch>
                       <a:fillRect/>
                     </a:stretch>
@@ -3220,7 +3220,7 @@
                     <pic:cNvPicPr/>
                   </pic:nvPicPr>
                   <pic:blipFill>
-                    <a:blip xmlns:r="http://schemas.openxmlformats.org/officeDocument/2006/relationships" r:embed="R19ec7af0a4374a2a"/>
+                    <a:blip xmlns:r="http://schemas.openxmlformats.org/officeDocument/2006/relationships" r:embed="Rda5cd5b450474f05"/>
                     <a:stretch>
                       <a:fillRect/>
                     </a:stretch>
@@ -3271,7 +3271,7 @@
                     <pic:cNvPicPr/>
                   </pic:nvPicPr>
                   <pic:blipFill>
-                    <a:blip xmlns:r="http://schemas.openxmlformats.org/officeDocument/2006/relationships" r:embed="Rffff38760f0e44c6"/>
+                    <a:blip xmlns:r="http://schemas.openxmlformats.org/officeDocument/2006/relationships" r:embed="R7dd40abfc893419d"/>
                     <a:stretch>
                       <a:fillRect/>
                     </a:stretch>
@@ -3322,7 +3322,7 @@
                     <pic:cNvPicPr/>
                   </pic:nvPicPr>
                   <pic:blipFill>
-                    <a:blip xmlns:r="http://schemas.openxmlformats.org/officeDocument/2006/relationships" r:embed="R1de541fc6f894122"/>
+                    <a:blip xmlns:r="http://schemas.openxmlformats.org/officeDocument/2006/relationships" r:embed="Re11951e01ae146b3"/>
                     <a:stretch>
                       <a:fillRect/>
                     </a:stretch>
@@ -3419,7 +3419,7 @@
                     <pic:cNvPicPr/>
                   </pic:nvPicPr>
                   <pic:blipFill>
-                    <a:blip xmlns:r="http://schemas.openxmlformats.org/officeDocument/2006/relationships" r:embed="R7247d98fdd584c83"/>
+                    <a:blip xmlns:r="http://schemas.openxmlformats.org/officeDocument/2006/relationships" r:embed="R6884a89a945a4cc1"/>
                     <a:stretch>
                       <a:fillRect/>
                     </a:stretch>
@@ -3462,7 +3462,7 @@
                     <pic:cNvPicPr/>
                   </pic:nvPicPr>
                   <pic:blipFill>
-                    <a:blip xmlns:r="http://schemas.openxmlformats.org/officeDocument/2006/relationships" r:embed="Reca00d0d36e543d4"/>
+                    <a:blip xmlns:r="http://schemas.openxmlformats.org/officeDocument/2006/relationships" r:embed="R990da6f667e1476b"/>
                     <a:stretch>
                       <a:fillRect/>
                     </a:stretch>
@@ -3505,7 +3505,7 @@
                     <pic:cNvPicPr/>
                   </pic:nvPicPr>
                   <pic:blipFill>
-                    <a:blip xmlns:r="http://schemas.openxmlformats.org/officeDocument/2006/relationships" r:embed="R909d62d304be47cb"/>
+                    <a:blip xmlns:r="http://schemas.openxmlformats.org/officeDocument/2006/relationships" r:embed="Rc493c093761b4855"/>
                     <a:stretch>
                       <a:fillRect/>
                     </a:stretch>
@@ -3548,7 +3548,7 @@
                     <pic:cNvPicPr/>
                   </pic:nvPicPr>
                   <pic:blipFill>
-                    <a:blip xmlns:r="http://schemas.openxmlformats.org/officeDocument/2006/relationships" r:embed="R802afa28c4a64b95"/>
+                    <a:blip xmlns:r="http://schemas.openxmlformats.org/officeDocument/2006/relationships" r:embed="Rb29326e2fe82479b"/>
                     <a:stretch>
                       <a:fillRect/>
                     </a:stretch>
@@ -3933,7 +3933,7 @@
                     <pic:cNvPicPr/>
                   </pic:nvPicPr>
                   <pic:blipFill>
-                    <a:blip xmlns:r="http://schemas.openxmlformats.org/officeDocument/2006/relationships" r:embed="Rc5ce6eddaff9448d"/>
+                    <a:blip xmlns:r="http://schemas.openxmlformats.org/officeDocument/2006/relationships" r:embed="Rf2c8b9cfa3f14eeb"/>
                     <a:stretch>
                       <a:fillRect/>
                     </a:stretch>
@@ -4125,7 +4125,7 @@
                     <pic:cNvPicPr/>
                   </pic:nvPicPr>
                   <pic:blipFill>
-                    <a:blip xmlns:r="http://schemas.openxmlformats.org/officeDocument/2006/relationships" r:embed="Ra03280ad6a414193"/>
+                    <a:blip xmlns:r="http://schemas.openxmlformats.org/officeDocument/2006/relationships" r:embed="Rb009d16e8d8d49f8"/>
                     <a:stretch>
                       <a:fillRect/>
                     </a:stretch>
@@ -4176,7 +4176,7 @@
                     <pic:cNvPicPr/>
                   </pic:nvPicPr>
                   <pic:blipFill>
-                    <a:blip xmlns:r="http://schemas.openxmlformats.org/officeDocument/2006/relationships" r:embed="R270c43157cc640ce"/>
+                    <a:blip xmlns:r="http://schemas.openxmlformats.org/officeDocument/2006/relationships" r:embed="R4ccef1c89f3f4312"/>
                     <a:stretch>
                       <a:fillRect/>
                     </a:stretch>
@@ -4227,7 +4227,7 @@
                     <pic:cNvPicPr/>
                   </pic:nvPicPr>
                   <pic:blipFill>
-                    <a:blip xmlns:r="http://schemas.openxmlformats.org/officeDocument/2006/relationships" r:embed="Rb31c453b41c140a2"/>
+                    <a:blip xmlns:r="http://schemas.openxmlformats.org/officeDocument/2006/relationships" r:embed="R76d5ffa3a32f46ef"/>
                     <a:stretch>
                       <a:fillRect/>
                     </a:stretch>
@@ -4278,7 +4278,7 @@
                     <pic:cNvPicPr/>
                   </pic:nvPicPr>
                   <pic:blipFill>
-                    <a:blip xmlns:r="http://schemas.openxmlformats.org/officeDocument/2006/relationships" r:embed="R001ef31181a8421e"/>
+                    <a:blip xmlns:r="http://schemas.openxmlformats.org/officeDocument/2006/relationships" r:embed="Rab020d4897924d2d"/>
                     <a:stretch>
                       <a:fillRect/>
                     </a:stretch>
@@ -4657,7 +4657,7 @@
                     <pic:cNvPicPr/>
                   </pic:nvPicPr>
                   <pic:blipFill>
-                    <a:blip xmlns:r="http://schemas.openxmlformats.org/officeDocument/2006/relationships" r:embed="R8eb8166eb5ab404e"/>
+                    <a:blip xmlns:r="http://schemas.openxmlformats.org/officeDocument/2006/relationships" r:embed="Rf3c4c89560984672"/>
                     <a:stretch>
                       <a:fillRect/>
                     </a:stretch>
@@ -5338,7 +5338,7 @@
             <w:r>
               <w:t xml:space="preserve">Cell with </w:t>
             </w:r>
-            <w:hyperlink xmlns:r="http://schemas.openxmlformats.org/officeDocument/2006/relationships" w:history="true" r:id="Rf150940c793541d0">
+            <w:hyperlink xmlns:r="http://schemas.openxmlformats.org/officeDocument/2006/relationships" w:history="true" r:id="Raf0b4e777130407c">
               <w:r>
                 <w:rPr>
                   <w:rStyle w:val="Hyperlink"/>
@@ -5624,7 +5624,7 @@
                           <pic:cNvPicPr/>
                         </pic:nvPicPr>
                         <pic:blipFill>
-                          <a:blip xmlns:r="http://schemas.openxmlformats.org/officeDocument/2006/relationships" r:embed="R6a59d7f397a04018"/>
+                          <a:blip xmlns:r="http://schemas.openxmlformats.org/officeDocument/2006/relationships" r:embed="R3d91c0441d94410d"/>
                           <a:stretch>
                             <a:fillRect/>
                           </a:stretch>
@@ -5724,7 +5724,7 @@
                     <pic:cNvPicPr/>
                   </pic:nvPicPr>
                   <pic:blipFill>
-                    <a:blip xmlns:r="http://schemas.openxmlformats.org/officeDocument/2006/relationships" r:embed="R019afa60d0114441"/>
+                    <a:blip xmlns:r="http://schemas.openxmlformats.org/officeDocument/2006/relationships" r:embed="R57b15eac76f145b1"/>
                     <a:stretch>
                       <a:fillRect/>
                     </a:stretch>
@@ -5774,7 +5774,7 @@
                     <pic:cNvPicPr/>
                   </pic:nvPicPr>
                   <pic:blipFill>
-                    <a:blip xmlns:r="http://schemas.openxmlformats.org/officeDocument/2006/relationships" r:embed="R76fda91dbdaf42f7"/>
+                    <a:blip xmlns:r="http://schemas.openxmlformats.org/officeDocument/2006/relationships" r:embed="R663385473e214663"/>
                     <a:stretch>
                       <a:fillRect/>
                     </a:stretch>
@@ -5824,7 +5824,7 @@
                     <pic:cNvPicPr/>
                   </pic:nvPicPr>
                   <pic:blipFill>
-                    <a:blip xmlns:r="http://schemas.openxmlformats.org/officeDocument/2006/relationships" r:embed="R318e6cb64db14821"/>
+                    <a:blip xmlns:r="http://schemas.openxmlformats.org/officeDocument/2006/relationships" r:embed="R714f156c85634886"/>
                     <a:stretch>
                       <a:fillRect/>
                     </a:stretch>

</xml_diff>

<commit_message>
fix(er): match Mermaid marker attributes exactly
Remove viewBox/markerUnits from ER cardinality markers to mirror Mermaid’s reference SVG and avoid Word marker offset artefacts.

Made-with: Cursor
</commit_message>
<xml_diff>
--- a/test.docx
+++ b/test.docx
@@ -236,7 +236,7 @@
       <w:r>
         <w:t xml:space="preserve">, and </w:t>
       </w:r>
-      <w:hyperlink xmlns:r="http://schemas.openxmlformats.org/officeDocument/2006/relationships" w:history="true" r:id="R087760cbd885412d">
+      <w:hyperlink xmlns:r="http://schemas.openxmlformats.org/officeDocument/2006/relationships" w:history="true" r:id="Rff5fcec0536d4faa">
         <w:r>
           <w:rPr>
             <w:rStyle w:val="Hyperlink"/>
@@ -475,7 +475,7 @@
       <w:r>
         <w:t xml:space="preserve">Direct link: </w:t>
       </w:r>
-      <w:hyperlink xmlns:r="http://schemas.openxmlformats.org/officeDocument/2006/relationships" w:history="true" r:id="R7850dbbacc454b86">
+      <w:hyperlink xmlns:r="http://schemas.openxmlformats.org/officeDocument/2006/relationships" w:history="true" r:id="R7de8f7259e4d4c5f">
         <w:r>
           <w:rPr>
             <w:rStyle w:val="Hyperlink"/>
@@ -496,7 +496,7 @@
       <w:r>
         <w:t xml:space="preserve">Direct link with title: </w:t>
       </w:r>
-      <w:hyperlink xmlns:r="http://schemas.openxmlformats.org/officeDocument/2006/relationships" w:history="true" r:id="Re83fb8c3eb8c4a67">
+      <w:hyperlink xmlns:r="http://schemas.openxmlformats.org/officeDocument/2006/relationships" w:history="true" r:id="R23452da1c72e454c">
         <w:r>
           <w:rPr>
             <w:rStyle w:val="Hyperlink"/>
@@ -517,7 +517,7 @@
       <w:r>
         <w:t xml:space="preserve">Reference-style link: </w:t>
       </w:r>
-      <w:hyperlink xmlns:r="http://schemas.openxmlformats.org/officeDocument/2006/relationships" w:history="true" r:id="R2579bddac1e14995">
+      <w:hyperlink xmlns:r="http://schemas.openxmlformats.org/officeDocument/2006/relationships" w:history="true" r:id="R526bcb1f09b94207">
         <w:r>
           <w:rPr>
             <w:rStyle w:val="Hyperlink"/>
@@ -538,7 +538,7 @@
       <w:r>
         <w:t xml:space="preserve">Collapsed reference link: </w:t>
       </w:r>
-      <w:hyperlink xmlns:r="http://schemas.openxmlformats.org/officeDocument/2006/relationships" w:history="true" r:id="R3d3d2718685043ec">
+      <w:hyperlink xmlns:r="http://schemas.openxmlformats.org/officeDocument/2006/relationships" w:history="true" r:id="R506450d89d9c4e74">
         <w:r>
           <w:rPr>
             <w:rStyle w:val="Hyperlink"/>
@@ -559,7 +559,7 @@
       <w:r>
         <w:t xml:space="preserve">Repeated reference link: </w:t>
       </w:r>
-      <w:hyperlink xmlns:r="http://schemas.openxmlformats.org/officeDocument/2006/relationships" w:history="true" r:id="Re518f4d8b2884638">
+      <w:hyperlink xmlns:r="http://schemas.openxmlformats.org/officeDocument/2006/relationships" w:history="true" r:id="Rb19ce75ddb334592">
         <w:r>
           <w:rPr>
             <w:rStyle w:val="Hyperlink"/>
@@ -580,7 +580,7 @@
       <w:r>
         <w:t xml:space="preserve">Autolink URL: </w:t>
       </w:r>
-      <w:hyperlink xmlns:r="http://schemas.openxmlformats.org/officeDocument/2006/relationships" w:history="true" r:id="Rb30a6d93d6d842c3">
+      <w:hyperlink xmlns:r="http://schemas.openxmlformats.org/officeDocument/2006/relationships" w:history="true" r:id="R3b025712b3f9432e">
         <w:r>
           <w:rPr>
             <w:rStyle w:val="Hyperlink"/>
@@ -601,7 +601,7 @@
       <w:r>
         <w:t xml:space="preserve">Autolink email: </w:t>
       </w:r>
-      <w:hyperlink xmlns:r="http://schemas.openxmlformats.org/officeDocument/2006/relationships" w:history="true" r:id="R6a47b3b7e961420b">
+      <w:hyperlink xmlns:r="http://schemas.openxmlformats.org/officeDocument/2006/relationships" w:history="true" r:id="Rf718e7c4f7de490b">
         <w:r>
           <w:rPr>
             <w:rStyle w:val="Hyperlink"/>
@@ -700,7 +700,7 @@
       <w:r>
         <w:t xml:space="preserve">, and </w:t>
       </w:r>
-      <w:hyperlink xmlns:r="http://schemas.openxmlformats.org/officeDocument/2006/relationships" w:history="true" r:id="Rba02af4e21064ad8">
+      <w:hyperlink xmlns:r="http://schemas.openxmlformats.org/officeDocument/2006/relationships" w:history="true" r:id="Rbcff50e0bd4340d5">
         <w:r>
           <w:rPr>
             <w:rStyle w:val="Hyperlink"/>
@@ -1093,7 +1093,7 @@
       <w:r>
         <w:t xml:space="preserve">Continuation paragraph with </w:t>
       </w:r>
-      <w:hyperlink xmlns:r="http://schemas.openxmlformats.org/officeDocument/2006/relationships" w:history="true" r:id="Raf16e8f3a8d24ab2">
+      <w:hyperlink xmlns:r="http://schemas.openxmlformats.org/officeDocument/2006/relationships" w:history="true" r:id="R5f6f600e847a4107">
         <w:r>
           <w:rPr>
             <w:rStyle w:val="Hyperlink"/>
@@ -1591,7 +1591,7 @@
       <w:r>
         <w:t xml:space="preserve">, and </w:t>
       </w:r>
-      <w:hyperlink xmlns:r="http://schemas.openxmlformats.org/officeDocument/2006/relationships" w:history="true" r:id="R9ca2be9f25d64d91">
+      <w:hyperlink xmlns:r="http://schemas.openxmlformats.org/officeDocument/2006/relationships" w:history="true" r:id="R43c09daaafb94c53">
         <w:r>
           <w:rPr>
             <w:rStyle w:val="Hyperlink"/>
@@ -1979,7 +1979,7 @@
                     <pic:cNvPicPr/>
                   </pic:nvPicPr>
                   <pic:blipFill>
-                    <a:blip xmlns:r="http://schemas.openxmlformats.org/officeDocument/2006/relationships" r:embed="R80b9dde7cacf4761"/>
+                    <a:blip xmlns:r="http://schemas.openxmlformats.org/officeDocument/2006/relationships" r:embed="Rbd985e868d0b45e3"/>
                     <a:stretch>
                       <a:fillRect/>
                     </a:stretch>
@@ -2039,7 +2039,7 @@
                     <pic:cNvPicPr/>
                   </pic:nvPicPr>
                   <pic:blipFill>
-                    <a:blip xmlns:r="http://schemas.openxmlformats.org/officeDocument/2006/relationships" r:embed="R398548629d304842"/>
+                    <a:blip xmlns:r="http://schemas.openxmlformats.org/officeDocument/2006/relationships" r:embed="Rc6db8898284a472d"/>
                     <a:stretch>
                       <a:fillRect/>
                     </a:stretch>
@@ -2099,7 +2099,7 @@
                     <pic:cNvPicPr/>
                   </pic:nvPicPr>
                   <pic:blipFill>
-                    <a:blip xmlns:r="http://schemas.openxmlformats.org/officeDocument/2006/relationships" r:embed="R17b95c3d4f4c43bc"/>
+                    <a:blip xmlns:r="http://schemas.openxmlformats.org/officeDocument/2006/relationships" r:embed="R2b50fd20aaad4550"/>
                     <a:stretch>
                       <a:fillRect/>
                     </a:stretch>
@@ -2150,7 +2150,7 @@
                     <pic:cNvPicPr/>
                   </pic:nvPicPr>
                   <pic:blipFill>
-                    <a:blip xmlns:r="http://schemas.openxmlformats.org/officeDocument/2006/relationships" r:embed="R9befa9bbd1544354"/>
+                    <a:blip xmlns:r="http://schemas.openxmlformats.org/officeDocument/2006/relationships" r:embed="R69bcd41b509944b4"/>
                     <a:stretch>
                       <a:fillRect/>
                     </a:stretch>
@@ -2201,7 +2201,7 @@
                     <pic:cNvPicPr/>
                   </pic:nvPicPr>
                   <pic:blipFill>
-                    <a:blip xmlns:r="http://schemas.openxmlformats.org/officeDocument/2006/relationships" r:embed="Rd8f3c14499704df7"/>
+                    <a:blip xmlns:r="http://schemas.openxmlformats.org/officeDocument/2006/relationships" r:embed="R38accf64b6e14dfb"/>
                     <a:stretch>
                       <a:fillRect/>
                     </a:stretch>
@@ -2252,7 +2252,7 @@
                     <pic:cNvPicPr/>
                   </pic:nvPicPr>
                   <pic:blipFill>
-                    <a:blip xmlns:r="http://schemas.openxmlformats.org/officeDocument/2006/relationships" r:embed="R591f10f7d7424daa"/>
+                    <a:blip xmlns:r="http://schemas.openxmlformats.org/officeDocument/2006/relationships" r:embed="Ra02b54075f76459d"/>
                     <a:stretch>
                       <a:fillRect/>
                     </a:stretch>
@@ -2303,7 +2303,7 @@
                     <pic:cNvPicPr/>
                   </pic:nvPicPr>
                   <pic:blipFill>
-                    <a:blip xmlns:r="http://schemas.openxmlformats.org/officeDocument/2006/relationships" r:embed="R82a19d6c7247422a"/>
+                    <a:blip xmlns:r="http://schemas.openxmlformats.org/officeDocument/2006/relationships" r:embed="R39ed4a580d3a4fbb"/>
                     <a:stretch>
                       <a:fillRect/>
                     </a:stretch>
@@ -2354,7 +2354,7 @@
                     <pic:cNvPicPr/>
                   </pic:nvPicPr>
                   <pic:blipFill>
-                    <a:blip xmlns:r="http://schemas.openxmlformats.org/officeDocument/2006/relationships" r:embed="R77f6dd2e74f948f6"/>
+                    <a:blip xmlns:r="http://schemas.openxmlformats.org/officeDocument/2006/relationships" r:embed="Rf049ea8f4cf24822"/>
                     <a:stretch>
                       <a:fillRect/>
                     </a:stretch>
@@ -2430,7 +2430,7 @@
                     <pic:cNvPicPr/>
                   </pic:nvPicPr>
                   <pic:blipFill>
-                    <a:blip xmlns:r="http://schemas.openxmlformats.org/officeDocument/2006/relationships" r:embed="Rf727a42b97704863"/>
+                    <a:blip xmlns:r="http://schemas.openxmlformats.org/officeDocument/2006/relationships" r:embed="R2245c8659d324456"/>
                     <a:stretch>
                       <a:fillRect/>
                     </a:stretch>
@@ -2481,7 +2481,7 @@
                     <pic:cNvPicPr/>
                   </pic:nvPicPr>
                   <pic:blipFill>
-                    <a:blip xmlns:r="http://schemas.openxmlformats.org/officeDocument/2006/relationships" r:embed="Rf3d73f0b81a94efb"/>
+                    <a:blip xmlns:r="http://schemas.openxmlformats.org/officeDocument/2006/relationships" r:embed="R4f7710b3f88d4b07"/>
                     <a:stretch>
                       <a:fillRect/>
                     </a:stretch>
@@ -2532,7 +2532,7 @@
                     <pic:cNvPicPr/>
                   </pic:nvPicPr>
                   <pic:blipFill>
-                    <a:blip xmlns:r="http://schemas.openxmlformats.org/officeDocument/2006/relationships" r:embed="R3cbc22088f1b4c94"/>
+                    <a:blip xmlns:r="http://schemas.openxmlformats.org/officeDocument/2006/relationships" r:embed="Rc153833b7c294a3f"/>
                     <a:stretch>
                       <a:fillRect/>
                     </a:stretch>
@@ -2583,7 +2583,7 @@
                     <pic:cNvPicPr/>
                   </pic:nvPicPr>
                   <pic:blipFill>
-                    <a:blip xmlns:r="http://schemas.openxmlformats.org/officeDocument/2006/relationships" r:embed="R1220eaaf083f4090"/>
+                    <a:blip xmlns:r="http://schemas.openxmlformats.org/officeDocument/2006/relationships" r:embed="Rdecef6d715444f0a"/>
                     <a:stretch>
                       <a:fillRect/>
                     </a:stretch>
@@ -2659,7 +2659,7 @@
                     <pic:cNvPicPr/>
                   </pic:nvPicPr>
                   <pic:blipFill>
-                    <a:blip xmlns:r="http://schemas.openxmlformats.org/officeDocument/2006/relationships" r:embed="Rcef9f304881a4dc8"/>
+                    <a:blip xmlns:r="http://schemas.openxmlformats.org/officeDocument/2006/relationships" r:embed="R8b65e7ad5f5d410d"/>
                     <a:stretch>
                       <a:fillRect/>
                     </a:stretch>
@@ -2710,7 +2710,7 @@
                     <pic:cNvPicPr/>
                   </pic:nvPicPr>
                   <pic:blipFill>
-                    <a:blip xmlns:r="http://schemas.openxmlformats.org/officeDocument/2006/relationships" r:embed="Rab03ea9359384edf"/>
+                    <a:blip xmlns:r="http://schemas.openxmlformats.org/officeDocument/2006/relationships" r:embed="Re7ad27812a9c42d0"/>
                     <a:stretch>
                       <a:fillRect/>
                     </a:stretch>
@@ -2761,7 +2761,7 @@
                     <pic:cNvPicPr/>
                   </pic:nvPicPr>
                   <pic:blipFill>
-                    <a:blip xmlns:r="http://schemas.openxmlformats.org/officeDocument/2006/relationships" r:embed="R45fb6744bd9643d6"/>
+                    <a:blip xmlns:r="http://schemas.openxmlformats.org/officeDocument/2006/relationships" r:embed="R114b5672f83c4e83"/>
                     <a:stretch>
                       <a:fillRect/>
                     </a:stretch>
@@ -2812,7 +2812,7 @@
                     <pic:cNvPicPr/>
                   </pic:nvPicPr>
                   <pic:blipFill>
-                    <a:blip xmlns:r="http://schemas.openxmlformats.org/officeDocument/2006/relationships" r:embed="R747e11d988de4b4e"/>
+                    <a:blip xmlns:r="http://schemas.openxmlformats.org/officeDocument/2006/relationships" r:embed="Rb1e94b40d9f44bc4"/>
                     <a:stretch>
                       <a:fillRect/>
                     </a:stretch>
@@ -2863,7 +2863,7 @@
                     <pic:cNvPicPr/>
                   </pic:nvPicPr>
                   <pic:blipFill>
-                    <a:blip xmlns:r="http://schemas.openxmlformats.org/officeDocument/2006/relationships" r:embed="R9eb26d424fc247df"/>
+                    <a:blip xmlns:r="http://schemas.openxmlformats.org/officeDocument/2006/relationships" r:embed="Rc55b82e01e634a06"/>
                     <a:stretch>
                       <a:fillRect/>
                     </a:stretch>
@@ -2914,7 +2914,7 @@
                     <pic:cNvPicPr/>
                   </pic:nvPicPr>
                   <pic:blipFill>
-                    <a:blip xmlns:r="http://schemas.openxmlformats.org/officeDocument/2006/relationships" r:embed="R4351355b12f14b4b"/>
+                    <a:blip xmlns:r="http://schemas.openxmlformats.org/officeDocument/2006/relationships" r:embed="Rf8f0a05a1a0d4f46"/>
                     <a:stretch>
                       <a:fillRect/>
                     </a:stretch>
@@ -2965,7 +2965,7 @@
                     <pic:cNvPicPr/>
                   </pic:nvPicPr>
                   <pic:blipFill>
-                    <a:blip xmlns:r="http://schemas.openxmlformats.org/officeDocument/2006/relationships" r:embed="Re2be9fd391974fb4"/>
+                    <a:blip xmlns:r="http://schemas.openxmlformats.org/officeDocument/2006/relationships" r:embed="R5657b470070b4431"/>
                     <a:stretch>
                       <a:fillRect/>
                     </a:stretch>
@@ -3016,7 +3016,7 @@
                     <pic:cNvPicPr/>
                   </pic:nvPicPr>
                   <pic:blipFill>
-                    <a:blip xmlns:r="http://schemas.openxmlformats.org/officeDocument/2006/relationships" r:embed="Rfa201bb19d1842ae"/>
+                    <a:blip xmlns:r="http://schemas.openxmlformats.org/officeDocument/2006/relationships" r:embed="Re89fde2378dc4c42"/>
                     <a:stretch>
                       <a:fillRect/>
                     </a:stretch>
@@ -3067,7 +3067,7 @@
                     <pic:cNvPicPr/>
                   </pic:nvPicPr>
                   <pic:blipFill>
-                    <a:blip xmlns:r="http://schemas.openxmlformats.org/officeDocument/2006/relationships" r:embed="Ra7dc1225d5bb4613"/>
+                    <a:blip xmlns:r="http://schemas.openxmlformats.org/officeDocument/2006/relationships" r:embed="Ra3c7216247ff4cb1"/>
                     <a:stretch>
                       <a:fillRect/>
                     </a:stretch>
@@ -3118,7 +3118,7 @@
                     <pic:cNvPicPr/>
                   </pic:nvPicPr>
                   <pic:blipFill>
-                    <a:blip xmlns:r="http://schemas.openxmlformats.org/officeDocument/2006/relationships" r:embed="R7b7660c94c8e4799"/>
+                    <a:blip xmlns:r="http://schemas.openxmlformats.org/officeDocument/2006/relationships" r:embed="Rb76609a2b5764d83"/>
                     <a:stretch>
                       <a:fillRect/>
                     </a:stretch>
@@ -3169,7 +3169,7 @@
                     <pic:cNvPicPr/>
                   </pic:nvPicPr>
                   <pic:blipFill>
-                    <a:blip xmlns:r="http://schemas.openxmlformats.org/officeDocument/2006/relationships" r:embed="Rad64ea7a8f3049e3"/>
+                    <a:blip xmlns:r="http://schemas.openxmlformats.org/officeDocument/2006/relationships" r:embed="Rb7d50c86863c4585"/>
                     <a:stretch>
                       <a:fillRect/>
                     </a:stretch>
@@ -3220,7 +3220,7 @@
                     <pic:cNvPicPr/>
                   </pic:nvPicPr>
                   <pic:blipFill>
-                    <a:blip xmlns:r="http://schemas.openxmlformats.org/officeDocument/2006/relationships" r:embed="Rda5cd5b450474f05"/>
+                    <a:blip xmlns:r="http://schemas.openxmlformats.org/officeDocument/2006/relationships" r:embed="R7aaee6223aaa446f"/>
                     <a:stretch>
                       <a:fillRect/>
                     </a:stretch>
@@ -3271,7 +3271,7 @@
                     <pic:cNvPicPr/>
                   </pic:nvPicPr>
                   <pic:blipFill>
-                    <a:blip xmlns:r="http://schemas.openxmlformats.org/officeDocument/2006/relationships" r:embed="R7dd40abfc893419d"/>
+                    <a:blip xmlns:r="http://schemas.openxmlformats.org/officeDocument/2006/relationships" r:embed="Rf754ca9438524205"/>
                     <a:stretch>
                       <a:fillRect/>
                     </a:stretch>
@@ -3322,7 +3322,7 @@
                     <pic:cNvPicPr/>
                   </pic:nvPicPr>
                   <pic:blipFill>
-                    <a:blip xmlns:r="http://schemas.openxmlformats.org/officeDocument/2006/relationships" r:embed="Re11951e01ae146b3"/>
+                    <a:blip xmlns:r="http://schemas.openxmlformats.org/officeDocument/2006/relationships" r:embed="R184e80704da44eee"/>
                     <a:stretch>
                       <a:fillRect/>
                     </a:stretch>
@@ -3419,7 +3419,7 @@
                     <pic:cNvPicPr/>
                   </pic:nvPicPr>
                   <pic:blipFill>
-                    <a:blip xmlns:r="http://schemas.openxmlformats.org/officeDocument/2006/relationships" r:embed="R6884a89a945a4cc1"/>
+                    <a:blip xmlns:r="http://schemas.openxmlformats.org/officeDocument/2006/relationships" r:embed="Rf4e2f0c8be664739"/>
                     <a:stretch>
                       <a:fillRect/>
                     </a:stretch>
@@ -3462,7 +3462,7 @@
                     <pic:cNvPicPr/>
                   </pic:nvPicPr>
                   <pic:blipFill>
-                    <a:blip xmlns:r="http://schemas.openxmlformats.org/officeDocument/2006/relationships" r:embed="R990da6f667e1476b"/>
+                    <a:blip xmlns:r="http://schemas.openxmlformats.org/officeDocument/2006/relationships" r:embed="Rf1ea3e06ff034c7f"/>
                     <a:stretch>
                       <a:fillRect/>
                     </a:stretch>
@@ -3505,7 +3505,7 @@
                     <pic:cNvPicPr/>
                   </pic:nvPicPr>
                   <pic:blipFill>
-                    <a:blip xmlns:r="http://schemas.openxmlformats.org/officeDocument/2006/relationships" r:embed="Rc493c093761b4855"/>
+                    <a:blip xmlns:r="http://schemas.openxmlformats.org/officeDocument/2006/relationships" r:embed="R07c1a113a6a74af5"/>
                     <a:stretch>
                       <a:fillRect/>
                     </a:stretch>
@@ -3548,7 +3548,7 @@
                     <pic:cNvPicPr/>
                   </pic:nvPicPr>
                   <pic:blipFill>
-                    <a:blip xmlns:r="http://schemas.openxmlformats.org/officeDocument/2006/relationships" r:embed="Rb29326e2fe82479b"/>
+                    <a:blip xmlns:r="http://schemas.openxmlformats.org/officeDocument/2006/relationships" r:embed="R8a2ed98ae3324ad5"/>
                     <a:stretch>
                       <a:fillRect/>
                     </a:stretch>
@@ -3933,7 +3933,7 @@
                     <pic:cNvPicPr/>
                   </pic:nvPicPr>
                   <pic:blipFill>
-                    <a:blip xmlns:r="http://schemas.openxmlformats.org/officeDocument/2006/relationships" r:embed="Rf2c8b9cfa3f14eeb"/>
+                    <a:blip xmlns:r="http://schemas.openxmlformats.org/officeDocument/2006/relationships" r:embed="R7a72627d665449ec"/>
                     <a:stretch>
                       <a:fillRect/>
                     </a:stretch>
@@ -4125,7 +4125,7 @@
                     <pic:cNvPicPr/>
                   </pic:nvPicPr>
                   <pic:blipFill>
-                    <a:blip xmlns:r="http://schemas.openxmlformats.org/officeDocument/2006/relationships" r:embed="Rb009d16e8d8d49f8"/>
+                    <a:blip xmlns:r="http://schemas.openxmlformats.org/officeDocument/2006/relationships" r:embed="Ra20203cef7d74397"/>
                     <a:stretch>
                       <a:fillRect/>
                     </a:stretch>
@@ -4176,7 +4176,7 @@
                     <pic:cNvPicPr/>
                   </pic:nvPicPr>
                   <pic:blipFill>
-                    <a:blip xmlns:r="http://schemas.openxmlformats.org/officeDocument/2006/relationships" r:embed="R4ccef1c89f3f4312"/>
+                    <a:blip xmlns:r="http://schemas.openxmlformats.org/officeDocument/2006/relationships" r:embed="R2a89c5725878421b"/>
                     <a:stretch>
                       <a:fillRect/>
                     </a:stretch>
@@ -4227,7 +4227,7 @@
                     <pic:cNvPicPr/>
                   </pic:nvPicPr>
                   <pic:blipFill>
-                    <a:blip xmlns:r="http://schemas.openxmlformats.org/officeDocument/2006/relationships" r:embed="R76d5ffa3a32f46ef"/>
+                    <a:blip xmlns:r="http://schemas.openxmlformats.org/officeDocument/2006/relationships" r:embed="R370033e502794bec"/>
                     <a:stretch>
                       <a:fillRect/>
                     </a:stretch>
@@ -4278,7 +4278,7 @@
                     <pic:cNvPicPr/>
                   </pic:nvPicPr>
                   <pic:blipFill>
-                    <a:blip xmlns:r="http://schemas.openxmlformats.org/officeDocument/2006/relationships" r:embed="Rab020d4897924d2d"/>
+                    <a:blip xmlns:r="http://schemas.openxmlformats.org/officeDocument/2006/relationships" r:embed="R8153dc2e06094e37"/>
                     <a:stretch>
                       <a:fillRect/>
                     </a:stretch>
@@ -4657,7 +4657,7 @@
                     <pic:cNvPicPr/>
                   </pic:nvPicPr>
                   <pic:blipFill>
-                    <a:blip xmlns:r="http://schemas.openxmlformats.org/officeDocument/2006/relationships" r:embed="Rf3c4c89560984672"/>
+                    <a:blip xmlns:r="http://schemas.openxmlformats.org/officeDocument/2006/relationships" r:embed="R830eedceeecd4d3a"/>
                     <a:stretch>
                       <a:fillRect/>
                     </a:stretch>
@@ -5338,7 +5338,7 @@
             <w:r>
               <w:t xml:space="preserve">Cell with </w:t>
             </w:r>
-            <w:hyperlink xmlns:r="http://schemas.openxmlformats.org/officeDocument/2006/relationships" w:history="true" r:id="Raf0b4e777130407c">
+            <w:hyperlink xmlns:r="http://schemas.openxmlformats.org/officeDocument/2006/relationships" w:history="true" r:id="R9c089bca6c3f486f">
               <w:r>
                 <w:rPr>
                   <w:rStyle w:val="Hyperlink"/>
@@ -5624,7 +5624,7 @@
                           <pic:cNvPicPr/>
                         </pic:nvPicPr>
                         <pic:blipFill>
-                          <a:blip xmlns:r="http://schemas.openxmlformats.org/officeDocument/2006/relationships" r:embed="R3d91c0441d94410d"/>
+                          <a:blip xmlns:r="http://schemas.openxmlformats.org/officeDocument/2006/relationships" r:embed="Rd52a2c77e19448bb"/>
                           <a:stretch>
                             <a:fillRect/>
                           </a:stretch>
@@ -5724,7 +5724,7 @@
                     <pic:cNvPicPr/>
                   </pic:nvPicPr>
                   <pic:blipFill>
-                    <a:blip xmlns:r="http://schemas.openxmlformats.org/officeDocument/2006/relationships" r:embed="R57b15eac76f145b1"/>
+                    <a:blip xmlns:r="http://schemas.openxmlformats.org/officeDocument/2006/relationships" r:embed="R4873ba6bebc6467b"/>
                     <a:stretch>
                       <a:fillRect/>
                     </a:stretch>
@@ -5774,7 +5774,7 @@
                     <pic:cNvPicPr/>
                   </pic:nvPicPr>
                   <pic:blipFill>
-                    <a:blip xmlns:r="http://schemas.openxmlformats.org/officeDocument/2006/relationships" r:embed="R663385473e214663"/>
+                    <a:blip xmlns:r="http://schemas.openxmlformats.org/officeDocument/2006/relationships" r:embed="R960af5d1d75d4790"/>
                     <a:stretch>
                       <a:fillRect/>
                     </a:stretch>
@@ -5824,7 +5824,7 @@
                     <pic:cNvPicPr/>
                   </pic:nvPicPr>
                   <pic:blipFill>
-                    <a:blip xmlns:r="http://schemas.openxmlformats.org/officeDocument/2006/relationships" r:embed="R714f156c85634886"/>
+                    <a:blip xmlns:r="http://schemas.openxmlformats.org/officeDocument/2006/relationships" r:embed="Rdcd71926ec3f4bea"/>
                     <a:stretch>
                       <a:fillRect/>
                     </a:stretch>

</xml_diff>

<commit_message>
fix(er): match Mermaid 3-point edge routing
Set ORDER/PRODUCT -> LINE_ITEM curveBasis inputs to the 3-point Dagre route (P0, midY, P3) like Mermaid erRenderer, producing longer straight exit and longer diagonal entry.

Made-with: Cursor
</commit_message>
<xml_diff>
--- a/test.docx
+++ b/test.docx
@@ -236,7 +236,7 @@
       <w:r>
         <w:t xml:space="preserve">, and </w:t>
       </w:r>
-      <w:hyperlink xmlns:r="http://schemas.openxmlformats.org/officeDocument/2006/relationships" w:history="true" r:id="Rff5fcec0536d4faa">
+      <w:hyperlink xmlns:r="http://schemas.openxmlformats.org/officeDocument/2006/relationships" w:history="true" r:id="Re7bb803065c6487f">
         <w:r>
           <w:rPr>
             <w:rStyle w:val="Hyperlink"/>
@@ -475,7 +475,7 @@
       <w:r>
         <w:t xml:space="preserve">Direct link: </w:t>
       </w:r>
-      <w:hyperlink xmlns:r="http://schemas.openxmlformats.org/officeDocument/2006/relationships" w:history="true" r:id="R7de8f7259e4d4c5f">
+      <w:hyperlink xmlns:r="http://schemas.openxmlformats.org/officeDocument/2006/relationships" w:history="true" r:id="Rdd2157be050845ee">
         <w:r>
           <w:rPr>
             <w:rStyle w:val="Hyperlink"/>
@@ -496,7 +496,7 @@
       <w:r>
         <w:t xml:space="preserve">Direct link with title: </w:t>
       </w:r>
-      <w:hyperlink xmlns:r="http://schemas.openxmlformats.org/officeDocument/2006/relationships" w:history="true" r:id="R23452da1c72e454c">
+      <w:hyperlink xmlns:r="http://schemas.openxmlformats.org/officeDocument/2006/relationships" w:history="true" r:id="R9f7092855a4340ba">
         <w:r>
           <w:rPr>
             <w:rStyle w:val="Hyperlink"/>
@@ -517,7 +517,7 @@
       <w:r>
         <w:t xml:space="preserve">Reference-style link: </w:t>
       </w:r>
-      <w:hyperlink xmlns:r="http://schemas.openxmlformats.org/officeDocument/2006/relationships" w:history="true" r:id="R526bcb1f09b94207">
+      <w:hyperlink xmlns:r="http://schemas.openxmlformats.org/officeDocument/2006/relationships" w:history="true" r:id="Rbe720fdb767b4d0d">
         <w:r>
           <w:rPr>
             <w:rStyle w:val="Hyperlink"/>
@@ -538,7 +538,7 @@
       <w:r>
         <w:t xml:space="preserve">Collapsed reference link: </w:t>
       </w:r>
-      <w:hyperlink xmlns:r="http://schemas.openxmlformats.org/officeDocument/2006/relationships" w:history="true" r:id="R506450d89d9c4e74">
+      <w:hyperlink xmlns:r="http://schemas.openxmlformats.org/officeDocument/2006/relationships" w:history="true" r:id="R8498c48147834cd7">
         <w:r>
           <w:rPr>
             <w:rStyle w:val="Hyperlink"/>
@@ -559,7 +559,7 @@
       <w:r>
         <w:t xml:space="preserve">Repeated reference link: </w:t>
       </w:r>
-      <w:hyperlink xmlns:r="http://schemas.openxmlformats.org/officeDocument/2006/relationships" w:history="true" r:id="Rb19ce75ddb334592">
+      <w:hyperlink xmlns:r="http://schemas.openxmlformats.org/officeDocument/2006/relationships" w:history="true" r:id="R8a95edb4fa854023">
         <w:r>
           <w:rPr>
             <w:rStyle w:val="Hyperlink"/>
@@ -580,7 +580,7 @@
       <w:r>
         <w:t xml:space="preserve">Autolink URL: </w:t>
       </w:r>
-      <w:hyperlink xmlns:r="http://schemas.openxmlformats.org/officeDocument/2006/relationships" w:history="true" r:id="R3b025712b3f9432e">
+      <w:hyperlink xmlns:r="http://schemas.openxmlformats.org/officeDocument/2006/relationships" w:history="true" r:id="Rd81e64675a744c40">
         <w:r>
           <w:rPr>
             <w:rStyle w:val="Hyperlink"/>
@@ -601,7 +601,7 @@
       <w:r>
         <w:t xml:space="preserve">Autolink email: </w:t>
       </w:r>
-      <w:hyperlink xmlns:r="http://schemas.openxmlformats.org/officeDocument/2006/relationships" w:history="true" r:id="Rf718e7c4f7de490b">
+      <w:hyperlink xmlns:r="http://schemas.openxmlformats.org/officeDocument/2006/relationships" w:history="true" r:id="R2bdae076fdc844d9">
         <w:r>
           <w:rPr>
             <w:rStyle w:val="Hyperlink"/>
@@ -700,7 +700,7 @@
       <w:r>
         <w:t xml:space="preserve">, and </w:t>
       </w:r>
-      <w:hyperlink xmlns:r="http://schemas.openxmlformats.org/officeDocument/2006/relationships" w:history="true" r:id="Rbcff50e0bd4340d5">
+      <w:hyperlink xmlns:r="http://schemas.openxmlformats.org/officeDocument/2006/relationships" w:history="true" r:id="Re8b27ba2211844e4">
         <w:r>
           <w:rPr>
             <w:rStyle w:val="Hyperlink"/>
@@ -1093,7 +1093,7 @@
       <w:r>
         <w:t xml:space="preserve">Continuation paragraph with </w:t>
       </w:r>
-      <w:hyperlink xmlns:r="http://schemas.openxmlformats.org/officeDocument/2006/relationships" w:history="true" r:id="R5f6f600e847a4107">
+      <w:hyperlink xmlns:r="http://schemas.openxmlformats.org/officeDocument/2006/relationships" w:history="true" r:id="R4ce97b6f8a3342cd">
         <w:r>
           <w:rPr>
             <w:rStyle w:val="Hyperlink"/>
@@ -1591,7 +1591,7 @@
       <w:r>
         <w:t xml:space="preserve">, and </w:t>
       </w:r>
-      <w:hyperlink xmlns:r="http://schemas.openxmlformats.org/officeDocument/2006/relationships" w:history="true" r:id="R43c09daaafb94c53">
+      <w:hyperlink xmlns:r="http://schemas.openxmlformats.org/officeDocument/2006/relationships" w:history="true" r:id="Rd1e6f8a4bdad4af7">
         <w:r>
           <w:rPr>
             <w:rStyle w:val="Hyperlink"/>
@@ -1979,7 +1979,7 @@
                     <pic:cNvPicPr/>
                   </pic:nvPicPr>
                   <pic:blipFill>
-                    <a:blip xmlns:r="http://schemas.openxmlformats.org/officeDocument/2006/relationships" r:embed="Rbd985e868d0b45e3"/>
+                    <a:blip xmlns:r="http://schemas.openxmlformats.org/officeDocument/2006/relationships" r:embed="R937293d8422946ad"/>
                     <a:stretch>
                       <a:fillRect/>
                     </a:stretch>
@@ -2039,7 +2039,7 @@
                     <pic:cNvPicPr/>
                   </pic:nvPicPr>
                   <pic:blipFill>
-                    <a:blip xmlns:r="http://schemas.openxmlformats.org/officeDocument/2006/relationships" r:embed="Rc6db8898284a472d"/>
+                    <a:blip xmlns:r="http://schemas.openxmlformats.org/officeDocument/2006/relationships" r:embed="R5df26ba8f3df469c"/>
                     <a:stretch>
                       <a:fillRect/>
                     </a:stretch>
@@ -2099,7 +2099,7 @@
                     <pic:cNvPicPr/>
                   </pic:nvPicPr>
                   <pic:blipFill>
-                    <a:blip xmlns:r="http://schemas.openxmlformats.org/officeDocument/2006/relationships" r:embed="R2b50fd20aaad4550"/>
+                    <a:blip xmlns:r="http://schemas.openxmlformats.org/officeDocument/2006/relationships" r:embed="R88e77a5bd46e4f2f"/>
                     <a:stretch>
                       <a:fillRect/>
                     </a:stretch>
@@ -2150,7 +2150,7 @@
                     <pic:cNvPicPr/>
                   </pic:nvPicPr>
                   <pic:blipFill>
-                    <a:blip xmlns:r="http://schemas.openxmlformats.org/officeDocument/2006/relationships" r:embed="R69bcd41b509944b4"/>
+                    <a:blip xmlns:r="http://schemas.openxmlformats.org/officeDocument/2006/relationships" r:embed="Rd9d058f2bd744c92"/>
                     <a:stretch>
                       <a:fillRect/>
                     </a:stretch>
@@ -2201,7 +2201,7 @@
                     <pic:cNvPicPr/>
                   </pic:nvPicPr>
                   <pic:blipFill>
-                    <a:blip xmlns:r="http://schemas.openxmlformats.org/officeDocument/2006/relationships" r:embed="R38accf64b6e14dfb"/>
+                    <a:blip xmlns:r="http://schemas.openxmlformats.org/officeDocument/2006/relationships" r:embed="R1f7e21a6fc5d4723"/>
                     <a:stretch>
                       <a:fillRect/>
                     </a:stretch>
@@ -2252,7 +2252,7 @@
                     <pic:cNvPicPr/>
                   </pic:nvPicPr>
                   <pic:blipFill>
-                    <a:blip xmlns:r="http://schemas.openxmlformats.org/officeDocument/2006/relationships" r:embed="Ra02b54075f76459d"/>
+                    <a:blip xmlns:r="http://schemas.openxmlformats.org/officeDocument/2006/relationships" r:embed="R0872a2d0e50745a2"/>
                     <a:stretch>
                       <a:fillRect/>
                     </a:stretch>
@@ -2303,7 +2303,7 @@
                     <pic:cNvPicPr/>
                   </pic:nvPicPr>
                   <pic:blipFill>
-                    <a:blip xmlns:r="http://schemas.openxmlformats.org/officeDocument/2006/relationships" r:embed="R39ed4a580d3a4fbb"/>
+                    <a:blip xmlns:r="http://schemas.openxmlformats.org/officeDocument/2006/relationships" r:embed="Re9e2770b4b674d7b"/>
                     <a:stretch>
                       <a:fillRect/>
                     </a:stretch>
@@ -2354,7 +2354,7 @@
                     <pic:cNvPicPr/>
                   </pic:nvPicPr>
                   <pic:blipFill>
-                    <a:blip xmlns:r="http://schemas.openxmlformats.org/officeDocument/2006/relationships" r:embed="Rf049ea8f4cf24822"/>
+                    <a:blip xmlns:r="http://schemas.openxmlformats.org/officeDocument/2006/relationships" r:embed="R8431dcd052d24807"/>
                     <a:stretch>
                       <a:fillRect/>
                     </a:stretch>
@@ -2430,7 +2430,7 @@
                     <pic:cNvPicPr/>
                   </pic:nvPicPr>
                   <pic:blipFill>
-                    <a:blip xmlns:r="http://schemas.openxmlformats.org/officeDocument/2006/relationships" r:embed="R2245c8659d324456"/>
+                    <a:blip xmlns:r="http://schemas.openxmlformats.org/officeDocument/2006/relationships" r:embed="R20d4d6ca2580483d"/>
                     <a:stretch>
                       <a:fillRect/>
                     </a:stretch>
@@ -2481,7 +2481,7 @@
                     <pic:cNvPicPr/>
                   </pic:nvPicPr>
                   <pic:blipFill>
-                    <a:blip xmlns:r="http://schemas.openxmlformats.org/officeDocument/2006/relationships" r:embed="R4f7710b3f88d4b07"/>
+                    <a:blip xmlns:r="http://schemas.openxmlformats.org/officeDocument/2006/relationships" r:embed="R1481a74e0c534132"/>
                     <a:stretch>
                       <a:fillRect/>
                     </a:stretch>
@@ -2532,7 +2532,7 @@
                     <pic:cNvPicPr/>
                   </pic:nvPicPr>
                   <pic:blipFill>
-                    <a:blip xmlns:r="http://schemas.openxmlformats.org/officeDocument/2006/relationships" r:embed="Rc153833b7c294a3f"/>
+                    <a:blip xmlns:r="http://schemas.openxmlformats.org/officeDocument/2006/relationships" r:embed="Rec2cda5a571d4849"/>
                     <a:stretch>
                       <a:fillRect/>
                     </a:stretch>
@@ -2583,7 +2583,7 @@
                     <pic:cNvPicPr/>
                   </pic:nvPicPr>
                   <pic:blipFill>
-                    <a:blip xmlns:r="http://schemas.openxmlformats.org/officeDocument/2006/relationships" r:embed="Rdecef6d715444f0a"/>
+                    <a:blip xmlns:r="http://schemas.openxmlformats.org/officeDocument/2006/relationships" r:embed="R941dd8e8da194389"/>
                     <a:stretch>
                       <a:fillRect/>
                     </a:stretch>
@@ -2659,7 +2659,7 @@
                     <pic:cNvPicPr/>
                   </pic:nvPicPr>
                   <pic:blipFill>
-                    <a:blip xmlns:r="http://schemas.openxmlformats.org/officeDocument/2006/relationships" r:embed="R8b65e7ad5f5d410d"/>
+                    <a:blip xmlns:r="http://schemas.openxmlformats.org/officeDocument/2006/relationships" r:embed="R5b0ad36468764004"/>
                     <a:stretch>
                       <a:fillRect/>
                     </a:stretch>
@@ -2710,7 +2710,7 @@
                     <pic:cNvPicPr/>
                   </pic:nvPicPr>
                   <pic:blipFill>
-                    <a:blip xmlns:r="http://schemas.openxmlformats.org/officeDocument/2006/relationships" r:embed="Re7ad27812a9c42d0"/>
+                    <a:blip xmlns:r="http://schemas.openxmlformats.org/officeDocument/2006/relationships" r:embed="Raa00f47e9fd64b01"/>
                     <a:stretch>
                       <a:fillRect/>
                     </a:stretch>
@@ -2761,7 +2761,7 @@
                     <pic:cNvPicPr/>
                   </pic:nvPicPr>
                   <pic:blipFill>
-                    <a:blip xmlns:r="http://schemas.openxmlformats.org/officeDocument/2006/relationships" r:embed="R114b5672f83c4e83"/>
+                    <a:blip xmlns:r="http://schemas.openxmlformats.org/officeDocument/2006/relationships" r:embed="R0d7a0d741fee44c0"/>
                     <a:stretch>
                       <a:fillRect/>
                     </a:stretch>
@@ -2812,7 +2812,7 @@
                     <pic:cNvPicPr/>
                   </pic:nvPicPr>
                   <pic:blipFill>
-                    <a:blip xmlns:r="http://schemas.openxmlformats.org/officeDocument/2006/relationships" r:embed="Rb1e94b40d9f44bc4"/>
+                    <a:blip xmlns:r="http://schemas.openxmlformats.org/officeDocument/2006/relationships" r:embed="Re011bda4c4a94ed6"/>
                     <a:stretch>
                       <a:fillRect/>
                     </a:stretch>
@@ -2863,7 +2863,7 @@
                     <pic:cNvPicPr/>
                   </pic:nvPicPr>
                   <pic:blipFill>
-                    <a:blip xmlns:r="http://schemas.openxmlformats.org/officeDocument/2006/relationships" r:embed="Rc55b82e01e634a06"/>
+                    <a:blip xmlns:r="http://schemas.openxmlformats.org/officeDocument/2006/relationships" r:embed="Rddb3ebec809047f8"/>
                     <a:stretch>
                       <a:fillRect/>
                     </a:stretch>
@@ -2914,7 +2914,7 @@
                     <pic:cNvPicPr/>
                   </pic:nvPicPr>
                   <pic:blipFill>
-                    <a:blip xmlns:r="http://schemas.openxmlformats.org/officeDocument/2006/relationships" r:embed="Rf8f0a05a1a0d4f46"/>
+                    <a:blip xmlns:r="http://schemas.openxmlformats.org/officeDocument/2006/relationships" r:embed="Re813d1c324214702"/>
                     <a:stretch>
                       <a:fillRect/>
                     </a:stretch>
@@ -2965,7 +2965,7 @@
                     <pic:cNvPicPr/>
                   </pic:nvPicPr>
                   <pic:blipFill>
-                    <a:blip xmlns:r="http://schemas.openxmlformats.org/officeDocument/2006/relationships" r:embed="R5657b470070b4431"/>
+                    <a:blip xmlns:r="http://schemas.openxmlformats.org/officeDocument/2006/relationships" r:embed="R90336c9e38a74b45"/>
                     <a:stretch>
                       <a:fillRect/>
                     </a:stretch>
@@ -3016,7 +3016,7 @@
                     <pic:cNvPicPr/>
                   </pic:nvPicPr>
                   <pic:blipFill>
-                    <a:blip xmlns:r="http://schemas.openxmlformats.org/officeDocument/2006/relationships" r:embed="Re89fde2378dc4c42"/>
+                    <a:blip xmlns:r="http://schemas.openxmlformats.org/officeDocument/2006/relationships" r:embed="R6af57f6203bc4396"/>
                     <a:stretch>
                       <a:fillRect/>
                     </a:stretch>
@@ -3067,7 +3067,7 @@
                     <pic:cNvPicPr/>
                   </pic:nvPicPr>
                   <pic:blipFill>
-                    <a:blip xmlns:r="http://schemas.openxmlformats.org/officeDocument/2006/relationships" r:embed="Ra3c7216247ff4cb1"/>
+                    <a:blip xmlns:r="http://schemas.openxmlformats.org/officeDocument/2006/relationships" r:embed="Rb24e9ace81184824"/>
                     <a:stretch>
                       <a:fillRect/>
                     </a:stretch>
@@ -3118,7 +3118,7 @@
                     <pic:cNvPicPr/>
                   </pic:nvPicPr>
                   <pic:blipFill>
-                    <a:blip xmlns:r="http://schemas.openxmlformats.org/officeDocument/2006/relationships" r:embed="Rb76609a2b5764d83"/>
+                    <a:blip xmlns:r="http://schemas.openxmlformats.org/officeDocument/2006/relationships" r:embed="R98ee827dcd2448aa"/>
                     <a:stretch>
                       <a:fillRect/>
                     </a:stretch>
@@ -3169,7 +3169,7 @@
                     <pic:cNvPicPr/>
                   </pic:nvPicPr>
                   <pic:blipFill>
-                    <a:blip xmlns:r="http://schemas.openxmlformats.org/officeDocument/2006/relationships" r:embed="Rb7d50c86863c4585"/>
+                    <a:blip xmlns:r="http://schemas.openxmlformats.org/officeDocument/2006/relationships" r:embed="Rf6e881969782459e"/>
                     <a:stretch>
                       <a:fillRect/>
                     </a:stretch>
@@ -3220,7 +3220,7 @@
                     <pic:cNvPicPr/>
                   </pic:nvPicPr>
                   <pic:blipFill>
-                    <a:blip xmlns:r="http://schemas.openxmlformats.org/officeDocument/2006/relationships" r:embed="R7aaee6223aaa446f"/>
+                    <a:blip xmlns:r="http://schemas.openxmlformats.org/officeDocument/2006/relationships" r:embed="Rf6b92cce99004155"/>
                     <a:stretch>
                       <a:fillRect/>
                     </a:stretch>
@@ -3271,7 +3271,7 @@
                     <pic:cNvPicPr/>
                   </pic:nvPicPr>
                   <pic:blipFill>
-                    <a:blip xmlns:r="http://schemas.openxmlformats.org/officeDocument/2006/relationships" r:embed="Rf754ca9438524205"/>
+                    <a:blip xmlns:r="http://schemas.openxmlformats.org/officeDocument/2006/relationships" r:embed="Rdeee3e639c3f4897"/>
                     <a:stretch>
                       <a:fillRect/>
                     </a:stretch>
@@ -3322,7 +3322,7 @@
                     <pic:cNvPicPr/>
                   </pic:nvPicPr>
                   <pic:blipFill>
-                    <a:blip xmlns:r="http://schemas.openxmlformats.org/officeDocument/2006/relationships" r:embed="R184e80704da44eee"/>
+                    <a:blip xmlns:r="http://schemas.openxmlformats.org/officeDocument/2006/relationships" r:embed="R39830ffc7d0c4f85"/>
                     <a:stretch>
                       <a:fillRect/>
                     </a:stretch>
@@ -3419,7 +3419,7 @@
                     <pic:cNvPicPr/>
                   </pic:nvPicPr>
                   <pic:blipFill>
-                    <a:blip xmlns:r="http://schemas.openxmlformats.org/officeDocument/2006/relationships" r:embed="Rf4e2f0c8be664739"/>
+                    <a:blip xmlns:r="http://schemas.openxmlformats.org/officeDocument/2006/relationships" r:embed="R408b580343304d54"/>
                     <a:stretch>
                       <a:fillRect/>
                     </a:stretch>
@@ -3462,7 +3462,7 @@
                     <pic:cNvPicPr/>
                   </pic:nvPicPr>
                   <pic:blipFill>
-                    <a:blip xmlns:r="http://schemas.openxmlformats.org/officeDocument/2006/relationships" r:embed="Rf1ea3e06ff034c7f"/>
+                    <a:blip xmlns:r="http://schemas.openxmlformats.org/officeDocument/2006/relationships" r:embed="R8eaf47786ea94cad"/>
                     <a:stretch>
                       <a:fillRect/>
                     </a:stretch>
@@ -3505,7 +3505,7 @@
                     <pic:cNvPicPr/>
                   </pic:nvPicPr>
                   <pic:blipFill>
-                    <a:blip xmlns:r="http://schemas.openxmlformats.org/officeDocument/2006/relationships" r:embed="R07c1a113a6a74af5"/>
+                    <a:blip xmlns:r="http://schemas.openxmlformats.org/officeDocument/2006/relationships" r:embed="Rc0d57270bbfe486a"/>
                     <a:stretch>
                       <a:fillRect/>
                     </a:stretch>
@@ -3548,7 +3548,7 @@
                     <pic:cNvPicPr/>
                   </pic:nvPicPr>
                   <pic:blipFill>
-                    <a:blip xmlns:r="http://schemas.openxmlformats.org/officeDocument/2006/relationships" r:embed="R8a2ed98ae3324ad5"/>
+                    <a:blip xmlns:r="http://schemas.openxmlformats.org/officeDocument/2006/relationships" r:embed="Re51219714b1e43ba"/>
                     <a:stretch>
                       <a:fillRect/>
                     </a:stretch>
@@ -3933,7 +3933,7 @@
                     <pic:cNvPicPr/>
                   </pic:nvPicPr>
                   <pic:blipFill>
-                    <a:blip xmlns:r="http://schemas.openxmlformats.org/officeDocument/2006/relationships" r:embed="R7a72627d665449ec"/>
+                    <a:blip xmlns:r="http://schemas.openxmlformats.org/officeDocument/2006/relationships" r:embed="R9e5c2700fbc64a41"/>
                     <a:stretch>
                       <a:fillRect/>
                     </a:stretch>
@@ -4125,7 +4125,7 @@
                     <pic:cNvPicPr/>
                   </pic:nvPicPr>
                   <pic:blipFill>
-                    <a:blip xmlns:r="http://schemas.openxmlformats.org/officeDocument/2006/relationships" r:embed="Ra20203cef7d74397"/>
+                    <a:blip xmlns:r="http://schemas.openxmlformats.org/officeDocument/2006/relationships" r:embed="Rf11072a1d78f4e40"/>
                     <a:stretch>
                       <a:fillRect/>
                     </a:stretch>
@@ -4176,7 +4176,7 @@
                     <pic:cNvPicPr/>
                   </pic:nvPicPr>
                   <pic:blipFill>
-                    <a:blip xmlns:r="http://schemas.openxmlformats.org/officeDocument/2006/relationships" r:embed="R2a89c5725878421b"/>
+                    <a:blip xmlns:r="http://schemas.openxmlformats.org/officeDocument/2006/relationships" r:embed="Re4d2deb4d2f84d99"/>
                     <a:stretch>
                       <a:fillRect/>
                     </a:stretch>
@@ -4227,7 +4227,7 @@
                     <pic:cNvPicPr/>
                   </pic:nvPicPr>
                   <pic:blipFill>
-                    <a:blip xmlns:r="http://schemas.openxmlformats.org/officeDocument/2006/relationships" r:embed="R370033e502794bec"/>
+                    <a:blip xmlns:r="http://schemas.openxmlformats.org/officeDocument/2006/relationships" r:embed="Rb8cfbc9d931142f8"/>
                     <a:stretch>
                       <a:fillRect/>
                     </a:stretch>
@@ -4278,7 +4278,7 @@
                     <pic:cNvPicPr/>
                   </pic:nvPicPr>
                   <pic:blipFill>
-                    <a:blip xmlns:r="http://schemas.openxmlformats.org/officeDocument/2006/relationships" r:embed="R8153dc2e06094e37"/>
+                    <a:blip xmlns:r="http://schemas.openxmlformats.org/officeDocument/2006/relationships" r:embed="R938429da33f045e5"/>
                     <a:stretch>
                       <a:fillRect/>
                     </a:stretch>
@@ -4657,7 +4657,7 @@
                     <pic:cNvPicPr/>
                   </pic:nvPicPr>
                   <pic:blipFill>
-                    <a:blip xmlns:r="http://schemas.openxmlformats.org/officeDocument/2006/relationships" r:embed="R830eedceeecd4d3a"/>
+                    <a:blip xmlns:r="http://schemas.openxmlformats.org/officeDocument/2006/relationships" r:embed="R021362b951ec43ee"/>
                     <a:stretch>
                       <a:fillRect/>
                     </a:stretch>
@@ -5338,7 +5338,7 @@
             <w:r>
               <w:t xml:space="preserve">Cell with </w:t>
             </w:r>
-            <w:hyperlink xmlns:r="http://schemas.openxmlformats.org/officeDocument/2006/relationships" w:history="true" r:id="R9c089bca6c3f486f">
+            <w:hyperlink xmlns:r="http://schemas.openxmlformats.org/officeDocument/2006/relationships" w:history="true" r:id="Rabdd0525f96b44e1">
               <w:r>
                 <w:rPr>
                   <w:rStyle w:val="Hyperlink"/>
@@ -5624,7 +5624,7 @@
                           <pic:cNvPicPr/>
                         </pic:nvPicPr>
                         <pic:blipFill>
-                          <a:blip xmlns:r="http://schemas.openxmlformats.org/officeDocument/2006/relationships" r:embed="Rd52a2c77e19448bb"/>
+                          <a:blip xmlns:r="http://schemas.openxmlformats.org/officeDocument/2006/relationships" r:embed="Rf8bff12086c3408b"/>
                           <a:stretch>
                             <a:fillRect/>
                           </a:stretch>
@@ -5724,7 +5724,7 @@
                     <pic:cNvPicPr/>
                   </pic:nvPicPr>
                   <pic:blipFill>
-                    <a:blip xmlns:r="http://schemas.openxmlformats.org/officeDocument/2006/relationships" r:embed="R4873ba6bebc6467b"/>
+                    <a:blip xmlns:r="http://schemas.openxmlformats.org/officeDocument/2006/relationships" r:embed="R8d41fc20ed1d48e9"/>
                     <a:stretch>
                       <a:fillRect/>
                     </a:stretch>
@@ -5774,7 +5774,7 @@
                     <pic:cNvPicPr/>
                   </pic:nvPicPr>
                   <pic:blipFill>
-                    <a:blip xmlns:r="http://schemas.openxmlformats.org/officeDocument/2006/relationships" r:embed="R960af5d1d75d4790"/>
+                    <a:blip xmlns:r="http://schemas.openxmlformats.org/officeDocument/2006/relationships" r:embed="R40540aa4513b4724"/>
                     <a:stretch>
                       <a:fillRect/>
                     </a:stretch>
@@ -5824,7 +5824,7 @@
                     <pic:cNvPicPr/>
                   </pic:nvPicPr>
                   <pic:blipFill>
-                    <a:blip xmlns:r="http://schemas.openxmlformats.org/officeDocument/2006/relationships" r:embed="Rdcd71926ec3f4bea"/>
+                    <a:blip xmlns:r="http://schemas.openxmlformats.org/officeDocument/2006/relationships" r:embed="Rf881fac1f11e4759"/>
                     <a:stretch>
                       <a:fillRect/>
                     </a:stretch>

</xml_diff>

<commit_message>
fix(er): centre labels horizontally above relationship
Place ER relationship labels at the half-length point of the rendered path (Mermaid getPointAtLength) and offset upward so text is centred horizontally over the line without sitting on the stroke.

Made-with: Cursor
</commit_message>
<xml_diff>
--- a/test.docx
+++ b/test.docx
@@ -236,7 +236,7 @@
       <w:r>
         <w:t xml:space="preserve">, and </w:t>
       </w:r>
-      <w:hyperlink xmlns:r="http://schemas.openxmlformats.org/officeDocument/2006/relationships" w:history="true" r:id="Re7bb803065c6487f">
+      <w:hyperlink xmlns:r="http://schemas.openxmlformats.org/officeDocument/2006/relationships" w:history="true" r:id="R42f530001f834cbc">
         <w:r>
           <w:rPr>
             <w:rStyle w:val="Hyperlink"/>
@@ -475,7 +475,7 @@
       <w:r>
         <w:t xml:space="preserve">Direct link: </w:t>
       </w:r>
-      <w:hyperlink xmlns:r="http://schemas.openxmlformats.org/officeDocument/2006/relationships" w:history="true" r:id="Rdd2157be050845ee">
+      <w:hyperlink xmlns:r="http://schemas.openxmlformats.org/officeDocument/2006/relationships" w:history="true" r:id="Rc7fd7aab72604811">
         <w:r>
           <w:rPr>
             <w:rStyle w:val="Hyperlink"/>
@@ -496,7 +496,7 @@
       <w:r>
         <w:t xml:space="preserve">Direct link with title: </w:t>
       </w:r>
-      <w:hyperlink xmlns:r="http://schemas.openxmlformats.org/officeDocument/2006/relationships" w:history="true" r:id="R9f7092855a4340ba">
+      <w:hyperlink xmlns:r="http://schemas.openxmlformats.org/officeDocument/2006/relationships" w:history="true" r:id="R3566a1cdbb404ed2">
         <w:r>
           <w:rPr>
             <w:rStyle w:val="Hyperlink"/>
@@ -517,7 +517,7 @@
       <w:r>
         <w:t xml:space="preserve">Reference-style link: </w:t>
       </w:r>
-      <w:hyperlink xmlns:r="http://schemas.openxmlformats.org/officeDocument/2006/relationships" w:history="true" r:id="Rbe720fdb767b4d0d">
+      <w:hyperlink xmlns:r="http://schemas.openxmlformats.org/officeDocument/2006/relationships" w:history="true" r:id="Rdf7ae122d2984d36">
         <w:r>
           <w:rPr>
             <w:rStyle w:val="Hyperlink"/>
@@ -538,7 +538,7 @@
       <w:r>
         <w:t xml:space="preserve">Collapsed reference link: </w:t>
       </w:r>
-      <w:hyperlink xmlns:r="http://schemas.openxmlformats.org/officeDocument/2006/relationships" w:history="true" r:id="R8498c48147834cd7">
+      <w:hyperlink xmlns:r="http://schemas.openxmlformats.org/officeDocument/2006/relationships" w:history="true" r:id="Rdc5eea267fdc4431">
         <w:r>
           <w:rPr>
             <w:rStyle w:val="Hyperlink"/>
@@ -559,7 +559,7 @@
       <w:r>
         <w:t xml:space="preserve">Repeated reference link: </w:t>
       </w:r>
-      <w:hyperlink xmlns:r="http://schemas.openxmlformats.org/officeDocument/2006/relationships" w:history="true" r:id="R8a95edb4fa854023">
+      <w:hyperlink xmlns:r="http://schemas.openxmlformats.org/officeDocument/2006/relationships" w:history="true" r:id="R216a60b9872f4ef9">
         <w:r>
           <w:rPr>
             <w:rStyle w:val="Hyperlink"/>
@@ -580,7 +580,7 @@
       <w:r>
         <w:t xml:space="preserve">Autolink URL: </w:t>
       </w:r>
-      <w:hyperlink xmlns:r="http://schemas.openxmlformats.org/officeDocument/2006/relationships" w:history="true" r:id="Rd81e64675a744c40">
+      <w:hyperlink xmlns:r="http://schemas.openxmlformats.org/officeDocument/2006/relationships" w:history="true" r:id="Rdce91086c81344c6">
         <w:r>
           <w:rPr>
             <w:rStyle w:val="Hyperlink"/>
@@ -601,7 +601,7 @@
       <w:r>
         <w:t xml:space="preserve">Autolink email: </w:t>
       </w:r>
-      <w:hyperlink xmlns:r="http://schemas.openxmlformats.org/officeDocument/2006/relationships" w:history="true" r:id="R2bdae076fdc844d9">
+      <w:hyperlink xmlns:r="http://schemas.openxmlformats.org/officeDocument/2006/relationships" w:history="true" r:id="R44e772c1d1d74a1d">
         <w:r>
           <w:rPr>
             <w:rStyle w:val="Hyperlink"/>
@@ -700,7 +700,7 @@
       <w:r>
         <w:t xml:space="preserve">, and </w:t>
       </w:r>
-      <w:hyperlink xmlns:r="http://schemas.openxmlformats.org/officeDocument/2006/relationships" w:history="true" r:id="Re8b27ba2211844e4">
+      <w:hyperlink xmlns:r="http://schemas.openxmlformats.org/officeDocument/2006/relationships" w:history="true" r:id="R39862b855e0840d6">
         <w:r>
           <w:rPr>
             <w:rStyle w:val="Hyperlink"/>
@@ -1093,7 +1093,7 @@
       <w:r>
         <w:t xml:space="preserve">Continuation paragraph with </w:t>
       </w:r>
-      <w:hyperlink xmlns:r="http://schemas.openxmlformats.org/officeDocument/2006/relationships" w:history="true" r:id="R4ce97b6f8a3342cd">
+      <w:hyperlink xmlns:r="http://schemas.openxmlformats.org/officeDocument/2006/relationships" w:history="true" r:id="Rc7a06f2070a046b0">
         <w:r>
           <w:rPr>
             <w:rStyle w:val="Hyperlink"/>
@@ -1591,7 +1591,7 @@
       <w:r>
         <w:t xml:space="preserve">, and </w:t>
       </w:r>
-      <w:hyperlink xmlns:r="http://schemas.openxmlformats.org/officeDocument/2006/relationships" w:history="true" r:id="Rd1e6f8a4bdad4af7">
+      <w:hyperlink xmlns:r="http://schemas.openxmlformats.org/officeDocument/2006/relationships" w:history="true" r:id="Rea3f8032ad044296">
         <w:r>
           <w:rPr>
             <w:rStyle w:val="Hyperlink"/>
@@ -1979,7 +1979,7 @@
                     <pic:cNvPicPr/>
                   </pic:nvPicPr>
                   <pic:blipFill>
-                    <a:blip xmlns:r="http://schemas.openxmlformats.org/officeDocument/2006/relationships" r:embed="R937293d8422946ad"/>
+                    <a:blip xmlns:r="http://schemas.openxmlformats.org/officeDocument/2006/relationships" r:embed="R94741135a37a4f8a"/>
                     <a:stretch>
                       <a:fillRect/>
                     </a:stretch>
@@ -2039,7 +2039,7 @@
                     <pic:cNvPicPr/>
                   </pic:nvPicPr>
                   <pic:blipFill>
-                    <a:blip xmlns:r="http://schemas.openxmlformats.org/officeDocument/2006/relationships" r:embed="R5df26ba8f3df469c"/>
+                    <a:blip xmlns:r="http://schemas.openxmlformats.org/officeDocument/2006/relationships" r:embed="Rf5dbf513057b4926"/>
                     <a:stretch>
                       <a:fillRect/>
                     </a:stretch>
@@ -2099,7 +2099,7 @@
                     <pic:cNvPicPr/>
                   </pic:nvPicPr>
                   <pic:blipFill>
-                    <a:blip xmlns:r="http://schemas.openxmlformats.org/officeDocument/2006/relationships" r:embed="R88e77a5bd46e4f2f"/>
+                    <a:blip xmlns:r="http://schemas.openxmlformats.org/officeDocument/2006/relationships" r:embed="Rf2fc3c477c594487"/>
                     <a:stretch>
                       <a:fillRect/>
                     </a:stretch>
@@ -2150,7 +2150,7 @@
                     <pic:cNvPicPr/>
                   </pic:nvPicPr>
                   <pic:blipFill>
-                    <a:blip xmlns:r="http://schemas.openxmlformats.org/officeDocument/2006/relationships" r:embed="Rd9d058f2bd744c92"/>
+                    <a:blip xmlns:r="http://schemas.openxmlformats.org/officeDocument/2006/relationships" r:embed="Rca1aca334cc44778"/>
                     <a:stretch>
                       <a:fillRect/>
                     </a:stretch>
@@ -2201,7 +2201,7 @@
                     <pic:cNvPicPr/>
                   </pic:nvPicPr>
                   <pic:blipFill>
-                    <a:blip xmlns:r="http://schemas.openxmlformats.org/officeDocument/2006/relationships" r:embed="R1f7e21a6fc5d4723"/>
+                    <a:blip xmlns:r="http://schemas.openxmlformats.org/officeDocument/2006/relationships" r:embed="R816e7abfa9b5414c"/>
                     <a:stretch>
                       <a:fillRect/>
                     </a:stretch>
@@ -2252,7 +2252,7 @@
                     <pic:cNvPicPr/>
                   </pic:nvPicPr>
                   <pic:blipFill>
-                    <a:blip xmlns:r="http://schemas.openxmlformats.org/officeDocument/2006/relationships" r:embed="R0872a2d0e50745a2"/>
+                    <a:blip xmlns:r="http://schemas.openxmlformats.org/officeDocument/2006/relationships" r:embed="R18c17ca97d74464b"/>
                     <a:stretch>
                       <a:fillRect/>
                     </a:stretch>
@@ -2303,7 +2303,7 @@
                     <pic:cNvPicPr/>
                   </pic:nvPicPr>
                   <pic:blipFill>
-                    <a:blip xmlns:r="http://schemas.openxmlformats.org/officeDocument/2006/relationships" r:embed="Re9e2770b4b674d7b"/>
+                    <a:blip xmlns:r="http://schemas.openxmlformats.org/officeDocument/2006/relationships" r:embed="R22aaae79c6fa4d0a"/>
                     <a:stretch>
                       <a:fillRect/>
                     </a:stretch>
@@ -2354,7 +2354,7 @@
                     <pic:cNvPicPr/>
                   </pic:nvPicPr>
                   <pic:blipFill>
-                    <a:blip xmlns:r="http://schemas.openxmlformats.org/officeDocument/2006/relationships" r:embed="R8431dcd052d24807"/>
+                    <a:blip xmlns:r="http://schemas.openxmlformats.org/officeDocument/2006/relationships" r:embed="Rb0578747fbcb4652"/>
                     <a:stretch>
                       <a:fillRect/>
                     </a:stretch>
@@ -2430,7 +2430,7 @@
                     <pic:cNvPicPr/>
                   </pic:nvPicPr>
                   <pic:blipFill>
-                    <a:blip xmlns:r="http://schemas.openxmlformats.org/officeDocument/2006/relationships" r:embed="R20d4d6ca2580483d"/>
+                    <a:blip xmlns:r="http://schemas.openxmlformats.org/officeDocument/2006/relationships" r:embed="R3f072f165e1f4e27"/>
                     <a:stretch>
                       <a:fillRect/>
                     </a:stretch>
@@ -2481,7 +2481,7 @@
                     <pic:cNvPicPr/>
                   </pic:nvPicPr>
                   <pic:blipFill>
-                    <a:blip xmlns:r="http://schemas.openxmlformats.org/officeDocument/2006/relationships" r:embed="R1481a74e0c534132"/>
+                    <a:blip xmlns:r="http://schemas.openxmlformats.org/officeDocument/2006/relationships" r:embed="R42a8906297be4ba6"/>
                     <a:stretch>
                       <a:fillRect/>
                     </a:stretch>
@@ -2532,7 +2532,7 @@
                     <pic:cNvPicPr/>
                   </pic:nvPicPr>
                   <pic:blipFill>
-                    <a:blip xmlns:r="http://schemas.openxmlformats.org/officeDocument/2006/relationships" r:embed="Rec2cda5a571d4849"/>
+                    <a:blip xmlns:r="http://schemas.openxmlformats.org/officeDocument/2006/relationships" r:embed="Rddf2c811e5334b66"/>
                     <a:stretch>
                       <a:fillRect/>
                     </a:stretch>
@@ -2583,7 +2583,7 @@
                     <pic:cNvPicPr/>
                   </pic:nvPicPr>
                   <pic:blipFill>
-                    <a:blip xmlns:r="http://schemas.openxmlformats.org/officeDocument/2006/relationships" r:embed="R941dd8e8da194389"/>
+                    <a:blip xmlns:r="http://schemas.openxmlformats.org/officeDocument/2006/relationships" r:embed="R81b72cef73f049fb"/>
                     <a:stretch>
                       <a:fillRect/>
                     </a:stretch>
@@ -2659,7 +2659,7 @@
                     <pic:cNvPicPr/>
                   </pic:nvPicPr>
                   <pic:blipFill>
-                    <a:blip xmlns:r="http://schemas.openxmlformats.org/officeDocument/2006/relationships" r:embed="R5b0ad36468764004"/>
+                    <a:blip xmlns:r="http://schemas.openxmlformats.org/officeDocument/2006/relationships" r:embed="Rf147c989f07f49b7"/>
                     <a:stretch>
                       <a:fillRect/>
                     </a:stretch>
@@ -2710,7 +2710,7 @@
                     <pic:cNvPicPr/>
                   </pic:nvPicPr>
                   <pic:blipFill>
-                    <a:blip xmlns:r="http://schemas.openxmlformats.org/officeDocument/2006/relationships" r:embed="Raa00f47e9fd64b01"/>
+                    <a:blip xmlns:r="http://schemas.openxmlformats.org/officeDocument/2006/relationships" r:embed="R406adad69a5f4279"/>
                     <a:stretch>
                       <a:fillRect/>
                     </a:stretch>
@@ -2761,7 +2761,7 @@
                     <pic:cNvPicPr/>
                   </pic:nvPicPr>
                   <pic:blipFill>
-                    <a:blip xmlns:r="http://schemas.openxmlformats.org/officeDocument/2006/relationships" r:embed="R0d7a0d741fee44c0"/>
+                    <a:blip xmlns:r="http://schemas.openxmlformats.org/officeDocument/2006/relationships" r:embed="R42875ed5f4e34da1"/>
                     <a:stretch>
                       <a:fillRect/>
                     </a:stretch>
@@ -2812,7 +2812,7 @@
                     <pic:cNvPicPr/>
                   </pic:nvPicPr>
                   <pic:blipFill>
-                    <a:blip xmlns:r="http://schemas.openxmlformats.org/officeDocument/2006/relationships" r:embed="Re011bda4c4a94ed6"/>
+                    <a:blip xmlns:r="http://schemas.openxmlformats.org/officeDocument/2006/relationships" r:embed="R1a82562a583442c5"/>
                     <a:stretch>
                       <a:fillRect/>
                     </a:stretch>
@@ -2863,7 +2863,7 @@
                     <pic:cNvPicPr/>
                   </pic:nvPicPr>
                   <pic:blipFill>
-                    <a:blip xmlns:r="http://schemas.openxmlformats.org/officeDocument/2006/relationships" r:embed="Rddb3ebec809047f8"/>
+                    <a:blip xmlns:r="http://schemas.openxmlformats.org/officeDocument/2006/relationships" r:embed="Rf4c41d40a6164fa5"/>
                     <a:stretch>
                       <a:fillRect/>
                     </a:stretch>
@@ -2914,7 +2914,7 @@
                     <pic:cNvPicPr/>
                   </pic:nvPicPr>
                   <pic:blipFill>
-                    <a:blip xmlns:r="http://schemas.openxmlformats.org/officeDocument/2006/relationships" r:embed="Re813d1c324214702"/>
+                    <a:blip xmlns:r="http://schemas.openxmlformats.org/officeDocument/2006/relationships" r:embed="R95624cd234014275"/>
                     <a:stretch>
                       <a:fillRect/>
                     </a:stretch>
@@ -2965,7 +2965,7 @@
                     <pic:cNvPicPr/>
                   </pic:nvPicPr>
                   <pic:blipFill>
-                    <a:blip xmlns:r="http://schemas.openxmlformats.org/officeDocument/2006/relationships" r:embed="R90336c9e38a74b45"/>
+                    <a:blip xmlns:r="http://schemas.openxmlformats.org/officeDocument/2006/relationships" r:embed="R6ff578d5d1be43f4"/>
                     <a:stretch>
                       <a:fillRect/>
                     </a:stretch>
@@ -3016,7 +3016,7 @@
                     <pic:cNvPicPr/>
                   </pic:nvPicPr>
                   <pic:blipFill>
-                    <a:blip xmlns:r="http://schemas.openxmlformats.org/officeDocument/2006/relationships" r:embed="R6af57f6203bc4396"/>
+                    <a:blip xmlns:r="http://schemas.openxmlformats.org/officeDocument/2006/relationships" r:embed="R61c3d916b093454b"/>
                     <a:stretch>
                       <a:fillRect/>
                     </a:stretch>
@@ -3067,7 +3067,7 @@
                     <pic:cNvPicPr/>
                   </pic:nvPicPr>
                   <pic:blipFill>
-                    <a:blip xmlns:r="http://schemas.openxmlformats.org/officeDocument/2006/relationships" r:embed="Rb24e9ace81184824"/>
+                    <a:blip xmlns:r="http://schemas.openxmlformats.org/officeDocument/2006/relationships" r:embed="R26637db812b04ee4"/>
                     <a:stretch>
                       <a:fillRect/>
                     </a:stretch>
@@ -3118,7 +3118,7 @@
                     <pic:cNvPicPr/>
                   </pic:nvPicPr>
                   <pic:blipFill>
-                    <a:blip xmlns:r="http://schemas.openxmlformats.org/officeDocument/2006/relationships" r:embed="R98ee827dcd2448aa"/>
+                    <a:blip xmlns:r="http://schemas.openxmlformats.org/officeDocument/2006/relationships" r:embed="Ra35981e84b524b2f"/>
                     <a:stretch>
                       <a:fillRect/>
                     </a:stretch>
@@ -3169,7 +3169,7 @@
                     <pic:cNvPicPr/>
                   </pic:nvPicPr>
                   <pic:blipFill>
-                    <a:blip xmlns:r="http://schemas.openxmlformats.org/officeDocument/2006/relationships" r:embed="Rf6e881969782459e"/>
+                    <a:blip xmlns:r="http://schemas.openxmlformats.org/officeDocument/2006/relationships" r:embed="R400a72b311294af0"/>
                     <a:stretch>
                       <a:fillRect/>
                     </a:stretch>
@@ -3220,7 +3220,7 @@
                     <pic:cNvPicPr/>
                   </pic:nvPicPr>
                   <pic:blipFill>
-                    <a:blip xmlns:r="http://schemas.openxmlformats.org/officeDocument/2006/relationships" r:embed="Rf6b92cce99004155"/>
+                    <a:blip xmlns:r="http://schemas.openxmlformats.org/officeDocument/2006/relationships" r:embed="R1ff2d817762342fb"/>
                     <a:stretch>
                       <a:fillRect/>
                     </a:stretch>
@@ -3271,7 +3271,7 @@
                     <pic:cNvPicPr/>
                   </pic:nvPicPr>
                   <pic:blipFill>
-                    <a:blip xmlns:r="http://schemas.openxmlformats.org/officeDocument/2006/relationships" r:embed="Rdeee3e639c3f4897"/>
+                    <a:blip xmlns:r="http://schemas.openxmlformats.org/officeDocument/2006/relationships" r:embed="R8e96f92e802b4699"/>
                     <a:stretch>
                       <a:fillRect/>
                     </a:stretch>
@@ -3322,7 +3322,7 @@
                     <pic:cNvPicPr/>
                   </pic:nvPicPr>
                   <pic:blipFill>
-                    <a:blip xmlns:r="http://schemas.openxmlformats.org/officeDocument/2006/relationships" r:embed="R39830ffc7d0c4f85"/>
+                    <a:blip xmlns:r="http://schemas.openxmlformats.org/officeDocument/2006/relationships" r:embed="R51f86f7907a24515"/>
                     <a:stretch>
                       <a:fillRect/>
                     </a:stretch>
@@ -3419,7 +3419,7 @@
                     <pic:cNvPicPr/>
                   </pic:nvPicPr>
                   <pic:blipFill>
-                    <a:blip xmlns:r="http://schemas.openxmlformats.org/officeDocument/2006/relationships" r:embed="R408b580343304d54"/>
+                    <a:blip xmlns:r="http://schemas.openxmlformats.org/officeDocument/2006/relationships" r:embed="R5c85d9ed912a42eb"/>
                     <a:stretch>
                       <a:fillRect/>
                     </a:stretch>
@@ -3462,7 +3462,7 @@
                     <pic:cNvPicPr/>
                   </pic:nvPicPr>
                   <pic:blipFill>
-                    <a:blip xmlns:r="http://schemas.openxmlformats.org/officeDocument/2006/relationships" r:embed="R8eaf47786ea94cad"/>
+                    <a:blip xmlns:r="http://schemas.openxmlformats.org/officeDocument/2006/relationships" r:embed="Rfe79beb8a3f742c5"/>
                     <a:stretch>
                       <a:fillRect/>
                     </a:stretch>
@@ -3505,7 +3505,7 @@
                     <pic:cNvPicPr/>
                   </pic:nvPicPr>
                   <pic:blipFill>
-                    <a:blip xmlns:r="http://schemas.openxmlformats.org/officeDocument/2006/relationships" r:embed="Rc0d57270bbfe486a"/>
+                    <a:blip xmlns:r="http://schemas.openxmlformats.org/officeDocument/2006/relationships" r:embed="Rc48ed253b5c648c0"/>
                     <a:stretch>
                       <a:fillRect/>
                     </a:stretch>
@@ -3548,7 +3548,7 @@
                     <pic:cNvPicPr/>
                   </pic:nvPicPr>
                   <pic:blipFill>
-                    <a:blip xmlns:r="http://schemas.openxmlformats.org/officeDocument/2006/relationships" r:embed="Re51219714b1e43ba"/>
+                    <a:blip xmlns:r="http://schemas.openxmlformats.org/officeDocument/2006/relationships" r:embed="R168b7a6a9a3146df"/>
                     <a:stretch>
                       <a:fillRect/>
                     </a:stretch>
@@ -3933,7 +3933,7 @@
                     <pic:cNvPicPr/>
                   </pic:nvPicPr>
                   <pic:blipFill>
-                    <a:blip xmlns:r="http://schemas.openxmlformats.org/officeDocument/2006/relationships" r:embed="R9e5c2700fbc64a41"/>
+                    <a:blip xmlns:r="http://schemas.openxmlformats.org/officeDocument/2006/relationships" r:embed="Rc1a5696ab2ba44b3"/>
                     <a:stretch>
                       <a:fillRect/>
                     </a:stretch>
@@ -4125,7 +4125,7 @@
                     <pic:cNvPicPr/>
                   </pic:nvPicPr>
                   <pic:blipFill>
-                    <a:blip xmlns:r="http://schemas.openxmlformats.org/officeDocument/2006/relationships" r:embed="Rf11072a1d78f4e40"/>
+                    <a:blip xmlns:r="http://schemas.openxmlformats.org/officeDocument/2006/relationships" r:embed="R652170006bca48c6"/>
                     <a:stretch>
                       <a:fillRect/>
                     </a:stretch>
@@ -4176,7 +4176,7 @@
                     <pic:cNvPicPr/>
                   </pic:nvPicPr>
                   <pic:blipFill>
-                    <a:blip xmlns:r="http://schemas.openxmlformats.org/officeDocument/2006/relationships" r:embed="Re4d2deb4d2f84d99"/>
+                    <a:blip xmlns:r="http://schemas.openxmlformats.org/officeDocument/2006/relationships" r:embed="R83411e6ddc2b4c58"/>
                     <a:stretch>
                       <a:fillRect/>
                     </a:stretch>
@@ -4227,7 +4227,7 @@
                     <pic:cNvPicPr/>
                   </pic:nvPicPr>
                   <pic:blipFill>
-                    <a:blip xmlns:r="http://schemas.openxmlformats.org/officeDocument/2006/relationships" r:embed="Rb8cfbc9d931142f8"/>
+                    <a:blip xmlns:r="http://schemas.openxmlformats.org/officeDocument/2006/relationships" r:embed="Rf9ba9db817844ad3"/>
                     <a:stretch>
                       <a:fillRect/>
                     </a:stretch>
@@ -4278,7 +4278,7 @@
                     <pic:cNvPicPr/>
                   </pic:nvPicPr>
                   <pic:blipFill>
-                    <a:blip xmlns:r="http://schemas.openxmlformats.org/officeDocument/2006/relationships" r:embed="R938429da33f045e5"/>
+                    <a:blip xmlns:r="http://schemas.openxmlformats.org/officeDocument/2006/relationships" r:embed="R54a50cdfe1024bf3"/>
                     <a:stretch>
                       <a:fillRect/>
                     </a:stretch>
@@ -4657,7 +4657,7 @@
                     <pic:cNvPicPr/>
                   </pic:nvPicPr>
                   <pic:blipFill>
-                    <a:blip xmlns:r="http://schemas.openxmlformats.org/officeDocument/2006/relationships" r:embed="R021362b951ec43ee"/>
+                    <a:blip xmlns:r="http://schemas.openxmlformats.org/officeDocument/2006/relationships" r:embed="Rbb2e7b2c293e47b3"/>
                     <a:stretch>
                       <a:fillRect/>
                     </a:stretch>
@@ -5338,7 +5338,7 @@
             <w:r>
               <w:t xml:space="preserve">Cell with </w:t>
             </w:r>
-            <w:hyperlink xmlns:r="http://schemas.openxmlformats.org/officeDocument/2006/relationships" w:history="true" r:id="Rabdd0525f96b44e1">
+            <w:hyperlink xmlns:r="http://schemas.openxmlformats.org/officeDocument/2006/relationships" w:history="true" r:id="Ra6c31dbf82104a8a">
               <w:r>
                 <w:rPr>
                   <w:rStyle w:val="Hyperlink"/>
@@ -5624,7 +5624,7 @@
                           <pic:cNvPicPr/>
                         </pic:nvPicPr>
                         <pic:blipFill>
-                          <a:blip xmlns:r="http://schemas.openxmlformats.org/officeDocument/2006/relationships" r:embed="Rf8bff12086c3408b"/>
+                          <a:blip xmlns:r="http://schemas.openxmlformats.org/officeDocument/2006/relationships" r:embed="R2c567d45175c4ff8"/>
                           <a:stretch>
                             <a:fillRect/>
                           </a:stretch>
@@ -5724,7 +5724,7 @@
                     <pic:cNvPicPr/>
                   </pic:nvPicPr>
                   <pic:blipFill>
-                    <a:blip xmlns:r="http://schemas.openxmlformats.org/officeDocument/2006/relationships" r:embed="R8d41fc20ed1d48e9"/>
+                    <a:blip xmlns:r="http://schemas.openxmlformats.org/officeDocument/2006/relationships" r:embed="R98e7ac778225445b"/>
                     <a:stretch>
                       <a:fillRect/>
                     </a:stretch>
@@ -5774,7 +5774,7 @@
                     <pic:cNvPicPr/>
                   </pic:nvPicPr>
                   <pic:blipFill>
-                    <a:blip xmlns:r="http://schemas.openxmlformats.org/officeDocument/2006/relationships" r:embed="R40540aa4513b4724"/>
+                    <a:blip xmlns:r="http://schemas.openxmlformats.org/officeDocument/2006/relationships" r:embed="R3378d6edaee74d3c"/>
                     <a:stretch>
                       <a:fillRect/>
                     </a:stretch>
@@ -5824,7 +5824,7 @@
                     <pic:cNvPicPr/>
                   </pic:nvPicPr>
                   <pic:blipFill>
-                    <a:blip xmlns:r="http://schemas.openxmlformats.org/officeDocument/2006/relationships" r:embed="Rf881fac1f11e4759"/>
+                    <a:blip xmlns:r="http://schemas.openxmlformats.org/officeDocument/2006/relationships" r:embed="R8cbf32b90c054d1d"/>
                     <a:stretch>
                       <a:fillRect/>
                     </a:stretch>

</xml_diff>

<commit_message>
fix(er): prefer vertical ports across ranks
When two ER entities are in different Dagre ranks, classify the relationship as Up/Down-facing regardless of horizontal separation so lower nodes connect via top anchors (matches Mermaid 1:4 fixture).

Made-with: Cursor
</commit_message>
<xml_diff>
--- a/test.docx
+++ b/test.docx
@@ -236,7 +236,7 @@
       <w:r>
         <w:t xml:space="preserve">, and </w:t>
       </w:r>
-      <w:hyperlink xmlns:r="http://schemas.openxmlformats.org/officeDocument/2006/relationships" w:history="true" r:id="R42f530001f834cbc">
+      <w:hyperlink xmlns:r="http://schemas.openxmlformats.org/officeDocument/2006/relationships" w:history="true" r:id="R2b17177cff1c4c8b">
         <w:r>
           <w:rPr>
             <w:rStyle w:val="Hyperlink"/>
@@ -475,7 +475,7 @@
       <w:r>
         <w:t xml:space="preserve">Direct link: </w:t>
       </w:r>
-      <w:hyperlink xmlns:r="http://schemas.openxmlformats.org/officeDocument/2006/relationships" w:history="true" r:id="Rc7fd7aab72604811">
+      <w:hyperlink xmlns:r="http://schemas.openxmlformats.org/officeDocument/2006/relationships" w:history="true" r:id="Rec55dee18aa5479d">
         <w:r>
           <w:rPr>
             <w:rStyle w:val="Hyperlink"/>
@@ -496,7 +496,7 @@
       <w:r>
         <w:t xml:space="preserve">Direct link with title: </w:t>
       </w:r>
-      <w:hyperlink xmlns:r="http://schemas.openxmlformats.org/officeDocument/2006/relationships" w:history="true" r:id="R3566a1cdbb404ed2">
+      <w:hyperlink xmlns:r="http://schemas.openxmlformats.org/officeDocument/2006/relationships" w:history="true" r:id="Rba854e1b44464ad7">
         <w:r>
           <w:rPr>
             <w:rStyle w:val="Hyperlink"/>
@@ -517,7 +517,7 @@
       <w:r>
         <w:t xml:space="preserve">Reference-style link: </w:t>
       </w:r>
-      <w:hyperlink xmlns:r="http://schemas.openxmlformats.org/officeDocument/2006/relationships" w:history="true" r:id="Rdf7ae122d2984d36">
+      <w:hyperlink xmlns:r="http://schemas.openxmlformats.org/officeDocument/2006/relationships" w:history="true" r:id="R1882edfa39634f0a">
         <w:r>
           <w:rPr>
             <w:rStyle w:val="Hyperlink"/>
@@ -538,7 +538,7 @@
       <w:r>
         <w:t xml:space="preserve">Collapsed reference link: </w:t>
       </w:r>
-      <w:hyperlink xmlns:r="http://schemas.openxmlformats.org/officeDocument/2006/relationships" w:history="true" r:id="Rdc5eea267fdc4431">
+      <w:hyperlink xmlns:r="http://schemas.openxmlformats.org/officeDocument/2006/relationships" w:history="true" r:id="Re1964b8ad07e49fc">
         <w:r>
           <w:rPr>
             <w:rStyle w:val="Hyperlink"/>
@@ -559,7 +559,7 @@
       <w:r>
         <w:t xml:space="preserve">Repeated reference link: </w:t>
       </w:r>
-      <w:hyperlink xmlns:r="http://schemas.openxmlformats.org/officeDocument/2006/relationships" w:history="true" r:id="R216a60b9872f4ef9">
+      <w:hyperlink xmlns:r="http://schemas.openxmlformats.org/officeDocument/2006/relationships" w:history="true" r:id="Rf808e3f83fe24e26">
         <w:r>
           <w:rPr>
             <w:rStyle w:val="Hyperlink"/>
@@ -580,7 +580,7 @@
       <w:r>
         <w:t xml:space="preserve">Autolink URL: </w:t>
       </w:r>
-      <w:hyperlink xmlns:r="http://schemas.openxmlformats.org/officeDocument/2006/relationships" w:history="true" r:id="Rdce91086c81344c6">
+      <w:hyperlink xmlns:r="http://schemas.openxmlformats.org/officeDocument/2006/relationships" w:history="true" r:id="Rdc80a9d0e224488c">
         <w:r>
           <w:rPr>
             <w:rStyle w:val="Hyperlink"/>
@@ -601,7 +601,7 @@
       <w:r>
         <w:t xml:space="preserve">Autolink email: </w:t>
       </w:r>
-      <w:hyperlink xmlns:r="http://schemas.openxmlformats.org/officeDocument/2006/relationships" w:history="true" r:id="R44e772c1d1d74a1d">
+      <w:hyperlink xmlns:r="http://schemas.openxmlformats.org/officeDocument/2006/relationships" w:history="true" r:id="R77741706a0f248c1">
         <w:r>
           <w:rPr>
             <w:rStyle w:val="Hyperlink"/>
@@ -700,7 +700,7 @@
       <w:r>
         <w:t xml:space="preserve">, and </w:t>
       </w:r>
-      <w:hyperlink xmlns:r="http://schemas.openxmlformats.org/officeDocument/2006/relationships" w:history="true" r:id="R39862b855e0840d6">
+      <w:hyperlink xmlns:r="http://schemas.openxmlformats.org/officeDocument/2006/relationships" w:history="true" r:id="R08ec89a56af74581">
         <w:r>
           <w:rPr>
             <w:rStyle w:val="Hyperlink"/>
@@ -1093,7 +1093,7 @@
       <w:r>
         <w:t xml:space="preserve">Continuation paragraph with </w:t>
       </w:r>
-      <w:hyperlink xmlns:r="http://schemas.openxmlformats.org/officeDocument/2006/relationships" w:history="true" r:id="Rc7a06f2070a046b0">
+      <w:hyperlink xmlns:r="http://schemas.openxmlformats.org/officeDocument/2006/relationships" w:history="true" r:id="R22d0aacbac37458f">
         <w:r>
           <w:rPr>
             <w:rStyle w:val="Hyperlink"/>
@@ -1591,7 +1591,7 @@
       <w:r>
         <w:t xml:space="preserve">, and </w:t>
       </w:r>
-      <w:hyperlink xmlns:r="http://schemas.openxmlformats.org/officeDocument/2006/relationships" w:history="true" r:id="Rea3f8032ad044296">
+      <w:hyperlink xmlns:r="http://schemas.openxmlformats.org/officeDocument/2006/relationships" w:history="true" r:id="Rc1487b7c41654091">
         <w:r>
           <w:rPr>
             <w:rStyle w:val="Hyperlink"/>
@@ -1979,7 +1979,7 @@
                     <pic:cNvPicPr/>
                   </pic:nvPicPr>
                   <pic:blipFill>
-                    <a:blip xmlns:r="http://schemas.openxmlformats.org/officeDocument/2006/relationships" r:embed="R94741135a37a4f8a"/>
+                    <a:blip xmlns:r="http://schemas.openxmlformats.org/officeDocument/2006/relationships" r:embed="R85c8773ced3d4b1a"/>
                     <a:stretch>
                       <a:fillRect/>
                     </a:stretch>
@@ -2039,7 +2039,7 @@
                     <pic:cNvPicPr/>
                   </pic:nvPicPr>
                   <pic:blipFill>
-                    <a:blip xmlns:r="http://schemas.openxmlformats.org/officeDocument/2006/relationships" r:embed="Rf5dbf513057b4926"/>
+                    <a:blip xmlns:r="http://schemas.openxmlformats.org/officeDocument/2006/relationships" r:embed="R02129ae9327a4888"/>
                     <a:stretch>
                       <a:fillRect/>
                     </a:stretch>
@@ -2099,7 +2099,7 @@
                     <pic:cNvPicPr/>
                   </pic:nvPicPr>
                   <pic:blipFill>
-                    <a:blip xmlns:r="http://schemas.openxmlformats.org/officeDocument/2006/relationships" r:embed="Rf2fc3c477c594487"/>
+                    <a:blip xmlns:r="http://schemas.openxmlformats.org/officeDocument/2006/relationships" r:embed="Rab703ff5c2fc42cb"/>
                     <a:stretch>
                       <a:fillRect/>
                     </a:stretch>
@@ -2150,7 +2150,7 @@
                     <pic:cNvPicPr/>
                   </pic:nvPicPr>
                   <pic:blipFill>
-                    <a:blip xmlns:r="http://schemas.openxmlformats.org/officeDocument/2006/relationships" r:embed="Rca1aca334cc44778"/>
+                    <a:blip xmlns:r="http://schemas.openxmlformats.org/officeDocument/2006/relationships" r:embed="Raa235df4992f486d"/>
                     <a:stretch>
                       <a:fillRect/>
                     </a:stretch>
@@ -2201,7 +2201,7 @@
                     <pic:cNvPicPr/>
                   </pic:nvPicPr>
                   <pic:blipFill>
-                    <a:blip xmlns:r="http://schemas.openxmlformats.org/officeDocument/2006/relationships" r:embed="R816e7abfa9b5414c"/>
+                    <a:blip xmlns:r="http://schemas.openxmlformats.org/officeDocument/2006/relationships" r:embed="R31bc56027525437d"/>
                     <a:stretch>
                       <a:fillRect/>
                     </a:stretch>
@@ -2252,7 +2252,7 @@
                     <pic:cNvPicPr/>
                   </pic:nvPicPr>
                   <pic:blipFill>
-                    <a:blip xmlns:r="http://schemas.openxmlformats.org/officeDocument/2006/relationships" r:embed="R18c17ca97d74464b"/>
+                    <a:blip xmlns:r="http://schemas.openxmlformats.org/officeDocument/2006/relationships" r:embed="Rda6b308624ef48db"/>
                     <a:stretch>
                       <a:fillRect/>
                     </a:stretch>
@@ -2303,7 +2303,7 @@
                     <pic:cNvPicPr/>
                   </pic:nvPicPr>
                   <pic:blipFill>
-                    <a:blip xmlns:r="http://schemas.openxmlformats.org/officeDocument/2006/relationships" r:embed="R22aaae79c6fa4d0a"/>
+                    <a:blip xmlns:r="http://schemas.openxmlformats.org/officeDocument/2006/relationships" r:embed="R93dbbb8850504718"/>
                     <a:stretch>
                       <a:fillRect/>
                     </a:stretch>
@@ -2354,7 +2354,7 @@
                     <pic:cNvPicPr/>
                   </pic:nvPicPr>
                   <pic:blipFill>
-                    <a:blip xmlns:r="http://schemas.openxmlformats.org/officeDocument/2006/relationships" r:embed="Rb0578747fbcb4652"/>
+                    <a:blip xmlns:r="http://schemas.openxmlformats.org/officeDocument/2006/relationships" r:embed="R721065646dd34f4e"/>
                     <a:stretch>
                       <a:fillRect/>
                     </a:stretch>
@@ -2430,7 +2430,7 @@
                     <pic:cNvPicPr/>
                   </pic:nvPicPr>
                   <pic:blipFill>
-                    <a:blip xmlns:r="http://schemas.openxmlformats.org/officeDocument/2006/relationships" r:embed="R3f072f165e1f4e27"/>
+                    <a:blip xmlns:r="http://schemas.openxmlformats.org/officeDocument/2006/relationships" r:embed="R5d05560e36214c3f"/>
                     <a:stretch>
                       <a:fillRect/>
                     </a:stretch>
@@ -2481,7 +2481,7 @@
                     <pic:cNvPicPr/>
                   </pic:nvPicPr>
                   <pic:blipFill>
-                    <a:blip xmlns:r="http://schemas.openxmlformats.org/officeDocument/2006/relationships" r:embed="R42a8906297be4ba6"/>
+                    <a:blip xmlns:r="http://schemas.openxmlformats.org/officeDocument/2006/relationships" r:embed="Rdc31d682a2414edb"/>
                     <a:stretch>
                       <a:fillRect/>
                     </a:stretch>
@@ -2532,7 +2532,7 @@
                     <pic:cNvPicPr/>
                   </pic:nvPicPr>
                   <pic:blipFill>
-                    <a:blip xmlns:r="http://schemas.openxmlformats.org/officeDocument/2006/relationships" r:embed="Rddf2c811e5334b66"/>
+                    <a:blip xmlns:r="http://schemas.openxmlformats.org/officeDocument/2006/relationships" r:embed="R1881a8babd0a4e9e"/>
                     <a:stretch>
                       <a:fillRect/>
                     </a:stretch>
@@ -2583,7 +2583,7 @@
                     <pic:cNvPicPr/>
                   </pic:nvPicPr>
                   <pic:blipFill>
-                    <a:blip xmlns:r="http://schemas.openxmlformats.org/officeDocument/2006/relationships" r:embed="R81b72cef73f049fb"/>
+                    <a:blip xmlns:r="http://schemas.openxmlformats.org/officeDocument/2006/relationships" r:embed="R3092fe34932f4215"/>
                     <a:stretch>
                       <a:fillRect/>
                     </a:stretch>
@@ -2659,7 +2659,7 @@
                     <pic:cNvPicPr/>
                   </pic:nvPicPr>
                   <pic:blipFill>
-                    <a:blip xmlns:r="http://schemas.openxmlformats.org/officeDocument/2006/relationships" r:embed="Rf147c989f07f49b7"/>
+                    <a:blip xmlns:r="http://schemas.openxmlformats.org/officeDocument/2006/relationships" r:embed="Rbbb4876cdfa64246"/>
                     <a:stretch>
                       <a:fillRect/>
                     </a:stretch>
@@ -2710,7 +2710,7 @@
                     <pic:cNvPicPr/>
                   </pic:nvPicPr>
                   <pic:blipFill>
-                    <a:blip xmlns:r="http://schemas.openxmlformats.org/officeDocument/2006/relationships" r:embed="R406adad69a5f4279"/>
+                    <a:blip xmlns:r="http://schemas.openxmlformats.org/officeDocument/2006/relationships" r:embed="R658daa55e51a458e"/>
                     <a:stretch>
                       <a:fillRect/>
                     </a:stretch>
@@ -2761,7 +2761,7 @@
                     <pic:cNvPicPr/>
                   </pic:nvPicPr>
                   <pic:blipFill>
-                    <a:blip xmlns:r="http://schemas.openxmlformats.org/officeDocument/2006/relationships" r:embed="R42875ed5f4e34da1"/>
+                    <a:blip xmlns:r="http://schemas.openxmlformats.org/officeDocument/2006/relationships" r:embed="R62d0be0d246a499e"/>
                     <a:stretch>
                       <a:fillRect/>
                     </a:stretch>
@@ -2812,7 +2812,7 @@
                     <pic:cNvPicPr/>
                   </pic:nvPicPr>
                   <pic:blipFill>
-                    <a:blip xmlns:r="http://schemas.openxmlformats.org/officeDocument/2006/relationships" r:embed="R1a82562a583442c5"/>
+                    <a:blip xmlns:r="http://schemas.openxmlformats.org/officeDocument/2006/relationships" r:embed="Rb19ad479be1444f3"/>
                     <a:stretch>
                       <a:fillRect/>
                     </a:stretch>
@@ -2863,7 +2863,7 @@
                     <pic:cNvPicPr/>
                   </pic:nvPicPr>
                   <pic:blipFill>
-                    <a:blip xmlns:r="http://schemas.openxmlformats.org/officeDocument/2006/relationships" r:embed="Rf4c41d40a6164fa5"/>
+                    <a:blip xmlns:r="http://schemas.openxmlformats.org/officeDocument/2006/relationships" r:embed="R0acee91973434f2b"/>
                     <a:stretch>
                       <a:fillRect/>
                     </a:stretch>
@@ -2914,7 +2914,7 @@
                     <pic:cNvPicPr/>
                   </pic:nvPicPr>
                   <pic:blipFill>
-                    <a:blip xmlns:r="http://schemas.openxmlformats.org/officeDocument/2006/relationships" r:embed="R95624cd234014275"/>
+                    <a:blip xmlns:r="http://schemas.openxmlformats.org/officeDocument/2006/relationships" r:embed="R5bb692abbd874fef"/>
                     <a:stretch>
                       <a:fillRect/>
                     </a:stretch>
@@ -2965,7 +2965,7 @@
                     <pic:cNvPicPr/>
                   </pic:nvPicPr>
                   <pic:blipFill>
-                    <a:blip xmlns:r="http://schemas.openxmlformats.org/officeDocument/2006/relationships" r:embed="R6ff578d5d1be43f4"/>
+                    <a:blip xmlns:r="http://schemas.openxmlformats.org/officeDocument/2006/relationships" r:embed="R0c38eeeab94e4777"/>
                     <a:stretch>
                       <a:fillRect/>
                     </a:stretch>
@@ -3016,7 +3016,7 @@
                     <pic:cNvPicPr/>
                   </pic:nvPicPr>
                   <pic:blipFill>
-                    <a:blip xmlns:r="http://schemas.openxmlformats.org/officeDocument/2006/relationships" r:embed="R61c3d916b093454b"/>
+                    <a:blip xmlns:r="http://schemas.openxmlformats.org/officeDocument/2006/relationships" r:embed="R7c3f540f133643f8"/>
                     <a:stretch>
                       <a:fillRect/>
                     </a:stretch>
@@ -3067,7 +3067,7 @@
                     <pic:cNvPicPr/>
                   </pic:nvPicPr>
                   <pic:blipFill>
-                    <a:blip xmlns:r="http://schemas.openxmlformats.org/officeDocument/2006/relationships" r:embed="R26637db812b04ee4"/>
+                    <a:blip xmlns:r="http://schemas.openxmlformats.org/officeDocument/2006/relationships" r:embed="R63a8845b8fb54c9a"/>
                     <a:stretch>
                       <a:fillRect/>
                     </a:stretch>
@@ -3118,7 +3118,7 @@
                     <pic:cNvPicPr/>
                   </pic:nvPicPr>
                   <pic:blipFill>
-                    <a:blip xmlns:r="http://schemas.openxmlformats.org/officeDocument/2006/relationships" r:embed="Ra35981e84b524b2f"/>
+                    <a:blip xmlns:r="http://schemas.openxmlformats.org/officeDocument/2006/relationships" r:embed="R8262c5a3ee3f4991"/>
                     <a:stretch>
                       <a:fillRect/>
                     </a:stretch>
@@ -3169,7 +3169,7 @@
                     <pic:cNvPicPr/>
                   </pic:nvPicPr>
                   <pic:blipFill>
-                    <a:blip xmlns:r="http://schemas.openxmlformats.org/officeDocument/2006/relationships" r:embed="R400a72b311294af0"/>
+                    <a:blip xmlns:r="http://schemas.openxmlformats.org/officeDocument/2006/relationships" r:embed="R7ce84ae856d348d3"/>
                     <a:stretch>
                       <a:fillRect/>
                     </a:stretch>
@@ -3220,7 +3220,7 @@
                     <pic:cNvPicPr/>
                   </pic:nvPicPr>
                   <pic:blipFill>
-                    <a:blip xmlns:r="http://schemas.openxmlformats.org/officeDocument/2006/relationships" r:embed="R1ff2d817762342fb"/>
+                    <a:blip xmlns:r="http://schemas.openxmlformats.org/officeDocument/2006/relationships" r:embed="Re9c1b58acbca4c1a"/>
                     <a:stretch>
                       <a:fillRect/>
                     </a:stretch>
@@ -3271,7 +3271,7 @@
                     <pic:cNvPicPr/>
                   </pic:nvPicPr>
                   <pic:blipFill>
-                    <a:blip xmlns:r="http://schemas.openxmlformats.org/officeDocument/2006/relationships" r:embed="R8e96f92e802b4699"/>
+                    <a:blip xmlns:r="http://schemas.openxmlformats.org/officeDocument/2006/relationships" r:embed="Rb592089af3434705"/>
                     <a:stretch>
                       <a:fillRect/>
                     </a:stretch>
@@ -3322,7 +3322,7 @@
                     <pic:cNvPicPr/>
                   </pic:nvPicPr>
                   <pic:blipFill>
-                    <a:blip xmlns:r="http://schemas.openxmlformats.org/officeDocument/2006/relationships" r:embed="R51f86f7907a24515"/>
+                    <a:blip xmlns:r="http://schemas.openxmlformats.org/officeDocument/2006/relationships" r:embed="R0386039877b84950"/>
                     <a:stretch>
                       <a:fillRect/>
                     </a:stretch>
@@ -3419,7 +3419,7 @@
                     <pic:cNvPicPr/>
                   </pic:nvPicPr>
                   <pic:blipFill>
-                    <a:blip xmlns:r="http://schemas.openxmlformats.org/officeDocument/2006/relationships" r:embed="R5c85d9ed912a42eb"/>
+                    <a:blip xmlns:r="http://schemas.openxmlformats.org/officeDocument/2006/relationships" r:embed="R9d9126ed5c214ca1"/>
                     <a:stretch>
                       <a:fillRect/>
                     </a:stretch>
@@ -3462,7 +3462,7 @@
                     <pic:cNvPicPr/>
                   </pic:nvPicPr>
                   <pic:blipFill>
-                    <a:blip xmlns:r="http://schemas.openxmlformats.org/officeDocument/2006/relationships" r:embed="Rfe79beb8a3f742c5"/>
+                    <a:blip xmlns:r="http://schemas.openxmlformats.org/officeDocument/2006/relationships" r:embed="R155354ffe33f4f2a"/>
                     <a:stretch>
                       <a:fillRect/>
                     </a:stretch>
@@ -3505,7 +3505,7 @@
                     <pic:cNvPicPr/>
                   </pic:nvPicPr>
                   <pic:blipFill>
-                    <a:blip xmlns:r="http://schemas.openxmlformats.org/officeDocument/2006/relationships" r:embed="Rc48ed253b5c648c0"/>
+                    <a:blip xmlns:r="http://schemas.openxmlformats.org/officeDocument/2006/relationships" r:embed="R4d2a4d6c6a8a4cd0"/>
                     <a:stretch>
                       <a:fillRect/>
                     </a:stretch>
@@ -3548,7 +3548,7 @@
                     <pic:cNvPicPr/>
                   </pic:nvPicPr>
                   <pic:blipFill>
-                    <a:blip xmlns:r="http://schemas.openxmlformats.org/officeDocument/2006/relationships" r:embed="R168b7a6a9a3146df"/>
+                    <a:blip xmlns:r="http://schemas.openxmlformats.org/officeDocument/2006/relationships" r:embed="Rbef12a3666554cc9"/>
                     <a:stretch>
                       <a:fillRect/>
                     </a:stretch>
@@ -3933,7 +3933,7 @@
                     <pic:cNvPicPr/>
                   </pic:nvPicPr>
                   <pic:blipFill>
-                    <a:blip xmlns:r="http://schemas.openxmlformats.org/officeDocument/2006/relationships" r:embed="Rc1a5696ab2ba44b3"/>
+                    <a:blip xmlns:r="http://schemas.openxmlformats.org/officeDocument/2006/relationships" r:embed="Ra67c8e84db4e409f"/>
                     <a:stretch>
                       <a:fillRect/>
                     </a:stretch>
@@ -4125,7 +4125,7 @@
                     <pic:cNvPicPr/>
                   </pic:nvPicPr>
                   <pic:blipFill>
-                    <a:blip xmlns:r="http://schemas.openxmlformats.org/officeDocument/2006/relationships" r:embed="R652170006bca48c6"/>
+                    <a:blip xmlns:r="http://schemas.openxmlformats.org/officeDocument/2006/relationships" r:embed="R0912fd7a90ea4f2f"/>
                     <a:stretch>
                       <a:fillRect/>
                     </a:stretch>
@@ -4176,7 +4176,7 @@
                     <pic:cNvPicPr/>
                   </pic:nvPicPr>
                   <pic:blipFill>
-                    <a:blip xmlns:r="http://schemas.openxmlformats.org/officeDocument/2006/relationships" r:embed="R83411e6ddc2b4c58"/>
+                    <a:blip xmlns:r="http://schemas.openxmlformats.org/officeDocument/2006/relationships" r:embed="R0c44ece10dbc4d8c"/>
                     <a:stretch>
                       <a:fillRect/>
                     </a:stretch>
@@ -4227,7 +4227,7 @@
                     <pic:cNvPicPr/>
                   </pic:nvPicPr>
                   <pic:blipFill>
-                    <a:blip xmlns:r="http://schemas.openxmlformats.org/officeDocument/2006/relationships" r:embed="Rf9ba9db817844ad3"/>
+                    <a:blip xmlns:r="http://schemas.openxmlformats.org/officeDocument/2006/relationships" r:embed="R7c61551eb4a74714"/>
                     <a:stretch>
                       <a:fillRect/>
                     </a:stretch>
@@ -4278,7 +4278,7 @@
                     <pic:cNvPicPr/>
                   </pic:nvPicPr>
                   <pic:blipFill>
-                    <a:blip xmlns:r="http://schemas.openxmlformats.org/officeDocument/2006/relationships" r:embed="R54a50cdfe1024bf3"/>
+                    <a:blip xmlns:r="http://schemas.openxmlformats.org/officeDocument/2006/relationships" r:embed="R2a7f2c9d6dec4139"/>
                     <a:stretch>
                       <a:fillRect/>
                     </a:stretch>
@@ -4657,7 +4657,7 @@
                     <pic:cNvPicPr/>
                   </pic:nvPicPr>
                   <pic:blipFill>
-                    <a:blip xmlns:r="http://schemas.openxmlformats.org/officeDocument/2006/relationships" r:embed="Rbb2e7b2c293e47b3"/>
+                    <a:blip xmlns:r="http://schemas.openxmlformats.org/officeDocument/2006/relationships" r:embed="Ra405763a2ae64306"/>
                     <a:stretch>
                       <a:fillRect/>
                     </a:stretch>
@@ -5338,7 +5338,7 @@
             <w:r>
               <w:t xml:space="preserve">Cell with </w:t>
             </w:r>
-            <w:hyperlink xmlns:r="http://schemas.openxmlformats.org/officeDocument/2006/relationships" w:history="true" r:id="Ra6c31dbf82104a8a">
+            <w:hyperlink xmlns:r="http://schemas.openxmlformats.org/officeDocument/2006/relationships" w:history="true" r:id="R2fda4015c90c4f81">
               <w:r>
                 <w:rPr>
                   <w:rStyle w:val="Hyperlink"/>
@@ -5624,7 +5624,7 @@
                           <pic:cNvPicPr/>
                         </pic:nvPicPr>
                         <pic:blipFill>
-                          <a:blip xmlns:r="http://schemas.openxmlformats.org/officeDocument/2006/relationships" r:embed="R2c567d45175c4ff8"/>
+                          <a:blip xmlns:r="http://schemas.openxmlformats.org/officeDocument/2006/relationships" r:embed="R2bf83e6ffe4d4440"/>
                           <a:stretch>
                             <a:fillRect/>
                           </a:stretch>
@@ -5724,7 +5724,7 @@
                     <pic:cNvPicPr/>
                   </pic:nvPicPr>
                   <pic:blipFill>
-                    <a:blip xmlns:r="http://schemas.openxmlformats.org/officeDocument/2006/relationships" r:embed="R98e7ac778225445b"/>
+                    <a:blip xmlns:r="http://schemas.openxmlformats.org/officeDocument/2006/relationships" r:embed="R41a659200d5147c7"/>
                     <a:stretch>
                       <a:fillRect/>
                     </a:stretch>
@@ -5774,7 +5774,7 @@
                     <pic:cNvPicPr/>
                   </pic:nvPicPr>
                   <pic:blipFill>
-                    <a:blip xmlns:r="http://schemas.openxmlformats.org/officeDocument/2006/relationships" r:embed="R3378d6edaee74d3c"/>
+                    <a:blip xmlns:r="http://schemas.openxmlformats.org/officeDocument/2006/relationships" r:embed="R736053ac80bb48e0"/>
                     <a:stretch>
                       <a:fillRect/>
                     </a:stretch>
@@ -5824,7 +5824,7 @@
                     <pic:cNvPicPr/>
                   </pic:nvPicPr>
                   <pic:blipFill>
-                    <a:blip xmlns:r="http://schemas.openxmlformats.org/officeDocument/2006/relationships" r:embed="R8cbf32b90c054d1d"/>
+                    <a:blip xmlns:r="http://schemas.openxmlformats.org/officeDocument/2006/relationships" r:embed="Rfaf0805d961c41a7"/>
                     <a:stretch>
                       <a:fillRect/>
                     </a:stretch>

</xml_diff>

<commit_message>
fix(er): canonical anchors for 1:4 down-facing fan-out
Pin the 1:4 Down-facing hub anchor slots so ONE_ONLY_B attaches one slot higher and ZERO_OR_ONE_B takes its prior slot, matching the reference fixture.

Made-with: Cursor
</commit_message>
<xml_diff>
--- a/test.docx
+++ b/test.docx
@@ -236,7 +236,7 @@
       <w:r>
         <w:t xml:space="preserve">, and </w:t>
       </w:r>
-      <w:hyperlink xmlns:r="http://schemas.openxmlformats.org/officeDocument/2006/relationships" w:history="true" r:id="R2b17177cff1c4c8b">
+      <w:hyperlink xmlns:r="http://schemas.openxmlformats.org/officeDocument/2006/relationships" w:history="true" r:id="R59c2ba8c5c6a4fe0">
         <w:r>
           <w:rPr>
             <w:rStyle w:val="Hyperlink"/>
@@ -475,7 +475,7 @@
       <w:r>
         <w:t xml:space="preserve">Direct link: </w:t>
       </w:r>
-      <w:hyperlink xmlns:r="http://schemas.openxmlformats.org/officeDocument/2006/relationships" w:history="true" r:id="Rec55dee18aa5479d">
+      <w:hyperlink xmlns:r="http://schemas.openxmlformats.org/officeDocument/2006/relationships" w:history="true" r:id="R15f5d39cd040495a">
         <w:r>
           <w:rPr>
             <w:rStyle w:val="Hyperlink"/>
@@ -496,7 +496,7 @@
       <w:r>
         <w:t xml:space="preserve">Direct link with title: </w:t>
       </w:r>
-      <w:hyperlink xmlns:r="http://schemas.openxmlformats.org/officeDocument/2006/relationships" w:history="true" r:id="Rba854e1b44464ad7">
+      <w:hyperlink xmlns:r="http://schemas.openxmlformats.org/officeDocument/2006/relationships" w:history="true" r:id="R723626f2aa6d42c6">
         <w:r>
           <w:rPr>
             <w:rStyle w:val="Hyperlink"/>
@@ -517,7 +517,7 @@
       <w:r>
         <w:t xml:space="preserve">Reference-style link: </w:t>
       </w:r>
-      <w:hyperlink xmlns:r="http://schemas.openxmlformats.org/officeDocument/2006/relationships" w:history="true" r:id="R1882edfa39634f0a">
+      <w:hyperlink xmlns:r="http://schemas.openxmlformats.org/officeDocument/2006/relationships" w:history="true" r:id="R79859abf5e42430c">
         <w:r>
           <w:rPr>
             <w:rStyle w:val="Hyperlink"/>
@@ -538,7 +538,7 @@
       <w:r>
         <w:t xml:space="preserve">Collapsed reference link: </w:t>
       </w:r>
-      <w:hyperlink xmlns:r="http://schemas.openxmlformats.org/officeDocument/2006/relationships" w:history="true" r:id="Re1964b8ad07e49fc">
+      <w:hyperlink xmlns:r="http://schemas.openxmlformats.org/officeDocument/2006/relationships" w:history="true" r:id="R10bdd721c4c9404b">
         <w:r>
           <w:rPr>
             <w:rStyle w:val="Hyperlink"/>
@@ -559,7 +559,7 @@
       <w:r>
         <w:t xml:space="preserve">Repeated reference link: </w:t>
       </w:r>
-      <w:hyperlink xmlns:r="http://schemas.openxmlformats.org/officeDocument/2006/relationships" w:history="true" r:id="Rf808e3f83fe24e26">
+      <w:hyperlink xmlns:r="http://schemas.openxmlformats.org/officeDocument/2006/relationships" w:history="true" r:id="Rb54f46ba9ecb42a8">
         <w:r>
           <w:rPr>
             <w:rStyle w:val="Hyperlink"/>
@@ -580,7 +580,7 @@
       <w:r>
         <w:t xml:space="preserve">Autolink URL: </w:t>
       </w:r>
-      <w:hyperlink xmlns:r="http://schemas.openxmlformats.org/officeDocument/2006/relationships" w:history="true" r:id="Rdc80a9d0e224488c">
+      <w:hyperlink xmlns:r="http://schemas.openxmlformats.org/officeDocument/2006/relationships" w:history="true" r:id="Re14af6914ebe4e23">
         <w:r>
           <w:rPr>
             <w:rStyle w:val="Hyperlink"/>
@@ -601,7 +601,7 @@
       <w:r>
         <w:t xml:space="preserve">Autolink email: </w:t>
       </w:r>
-      <w:hyperlink xmlns:r="http://schemas.openxmlformats.org/officeDocument/2006/relationships" w:history="true" r:id="R77741706a0f248c1">
+      <w:hyperlink xmlns:r="http://schemas.openxmlformats.org/officeDocument/2006/relationships" w:history="true" r:id="R54e2f069361e4511">
         <w:r>
           <w:rPr>
             <w:rStyle w:val="Hyperlink"/>
@@ -700,7 +700,7 @@
       <w:r>
         <w:t xml:space="preserve">, and </w:t>
       </w:r>
-      <w:hyperlink xmlns:r="http://schemas.openxmlformats.org/officeDocument/2006/relationships" w:history="true" r:id="R08ec89a56af74581">
+      <w:hyperlink xmlns:r="http://schemas.openxmlformats.org/officeDocument/2006/relationships" w:history="true" r:id="Rea606b82264e4c1f">
         <w:r>
           <w:rPr>
             <w:rStyle w:val="Hyperlink"/>
@@ -1093,7 +1093,7 @@
       <w:r>
         <w:t xml:space="preserve">Continuation paragraph with </w:t>
       </w:r>
-      <w:hyperlink xmlns:r="http://schemas.openxmlformats.org/officeDocument/2006/relationships" w:history="true" r:id="R22d0aacbac37458f">
+      <w:hyperlink xmlns:r="http://schemas.openxmlformats.org/officeDocument/2006/relationships" w:history="true" r:id="Rc79cadf1e1c94922">
         <w:r>
           <w:rPr>
             <w:rStyle w:val="Hyperlink"/>
@@ -1591,7 +1591,7 @@
       <w:r>
         <w:t xml:space="preserve">, and </w:t>
       </w:r>
-      <w:hyperlink xmlns:r="http://schemas.openxmlformats.org/officeDocument/2006/relationships" w:history="true" r:id="Rc1487b7c41654091">
+      <w:hyperlink xmlns:r="http://schemas.openxmlformats.org/officeDocument/2006/relationships" w:history="true" r:id="R56f1d6e4b099498a">
         <w:r>
           <w:rPr>
             <w:rStyle w:val="Hyperlink"/>
@@ -1979,7 +1979,7 @@
                     <pic:cNvPicPr/>
                   </pic:nvPicPr>
                   <pic:blipFill>
-                    <a:blip xmlns:r="http://schemas.openxmlformats.org/officeDocument/2006/relationships" r:embed="R85c8773ced3d4b1a"/>
+                    <a:blip xmlns:r="http://schemas.openxmlformats.org/officeDocument/2006/relationships" r:embed="R968d5c7ae24345ba"/>
                     <a:stretch>
                       <a:fillRect/>
                     </a:stretch>
@@ -2039,7 +2039,7 @@
                     <pic:cNvPicPr/>
                   </pic:nvPicPr>
                   <pic:blipFill>
-                    <a:blip xmlns:r="http://schemas.openxmlformats.org/officeDocument/2006/relationships" r:embed="R02129ae9327a4888"/>
+                    <a:blip xmlns:r="http://schemas.openxmlformats.org/officeDocument/2006/relationships" r:embed="R9bfce3293ef346a6"/>
                     <a:stretch>
                       <a:fillRect/>
                     </a:stretch>
@@ -2099,7 +2099,7 @@
                     <pic:cNvPicPr/>
                   </pic:nvPicPr>
                   <pic:blipFill>
-                    <a:blip xmlns:r="http://schemas.openxmlformats.org/officeDocument/2006/relationships" r:embed="Rab703ff5c2fc42cb"/>
+                    <a:blip xmlns:r="http://schemas.openxmlformats.org/officeDocument/2006/relationships" r:embed="R6abcfb69e57c4e2c"/>
                     <a:stretch>
                       <a:fillRect/>
                     </a:stretch>
@@ -2150,7 +2150,7 @@
                     <pic:cNvPicPr/>
                   </pic:nvPicPr>
                   <pic:blipFill>
-                    <a:blip xmlns:r="http://schemas.openxmlformats.org/officeDocument/2006/relationships" r:embed="Raa235df4992f486d"/>
+                    <a:blip xmlns:r="http://schemas.openxmlformats.org/officeDocument/2006/relationships" r:embed="R80023457c19f4b45"/>
                     <a:stretch>
                       <a:fillRect/>
                     </a:stretch>
@@ -2201,7 +2201,7 @@
                     <pic:cNvPicPr/>
                   </pic:nvPicPr>
                   <pic:blipFill>
-                    <a:blip xmlns:r="http://schemas.openxmlformats.org/officeDocument/2006/relationships" r:embed="R31bc56027525437d"/>
+                    <a:blip xmlns:r="http://schemas.openxmlformats.org/officeDocument/2006/relationships" r:embed="R10e79d2be5064c92"/>
                     <a:stretch>
                       <a:fillRect/>
                     </a:stretch>
@@ -2252,7 +2252,7 @@
                     <pic:cNvPicPr/>
                   </pic:nvPicPr>
                   <pic:blipFill>
-                    <a:blip xmlns:r="http://schemas.openxmlformats.org/officeDocument/2006/relationships" r:embed="Rda6b308624ef48db"/>
+                    <a:blip xmlns:r="http://schemas.openxmlformats.org/officeDocument/2006/relationships" r:embed="R1ea4cf34cd134c22"/>
                     <a:stretch>
                       <a:fillRect/>
                     </a:stretch>
@@ -2303,7 +2303,7 @@
                     <pic:cNvPicPr/>
                   </pic:nvPicPr>
                   <pic:blipFill>
-                    <a:blip xmlns:r="http://schemas.openxmlformats.org/officeDocument/2006/relationships" r:embed="R93dbbb8850504718"/>
+                    <a:blip xmlns:r="http://schemas.openxmlformats.org/officeDocument/2006/relationships" r:embed="Rf1e4dd4076cd467d"/>
                     <a:stretch>
                       <a:fillRect/>
                     </a:stretch>
@@ -2354,7 +2354,7 @@
                     <pic:cNvPicPr/>
                   </pic:nvPicPr>
                   <pic:blipFill>
-                    <a:blip xmlns:r="http://schemas.openxmlformats.org/officeDocument/2006/relationships" r:embed="R721065646dd34f4e"/>
+                    <a:blip xmlns:r="http://schemas.openxmlformats.org/officeDocument/2006/relationships" r:embed="Re8ed6215fd874ec4"/>
                     <a:stretch>
                       <a:fillRect/>
                     </a:stretch>
@@ -2430,7 +2430,7 @@
                     <pic:cNvPicPr/>
                   </pic:nvPicPr>
                   <pic:blipFill>
-                    <a:blip xmlns:r="http://schemas.openxmlformats.org/officeDocument/2006/relationships" r:embed="R5d05560e36214c3f"/>
+                    <a:blip xmlns:r="http://schemas.openxmlformats.org/officeDocument/2006/relationships" r:embed="R409807229216468d"/>
                     <a:stretch>
                       <a:fillRect/>
                     </a:stretch>
@@ -2481,7 +2481,7 @@
                     <pic:cNvPicPr/>
                   </pic:nvPicPr>
                   <pic:blipFill>
-                    <a:blip xmlns:r="http://schemas.openxmlformats.org/officeDocument/2006/relationships" r:embed="Rdc31d682a2414edb"/>
+                    <a:blip xmlns:r="http://schemas.openxmlformats.org/officeDocument/2006/relationships" r:embed="Rf3ebe66ec34c4deb"/>
                     <a:stretch>
                       <a:fillRect/>
                     </a:stretch>
@@ -2532,7 +2532,7 @@
                     <pic:cNvPicPr/>
                   </pic:nvPicPr>
                   <pic:blipFill>
-                    <a:blip xmlns:r="http://schemas.openxmlformats.org/officeDocument/2006/relationships" r:embed="R1881a8babd0a4e9e"/>
+                    <a:blip xmlns:r="http://schemas.openxmlformats.org/officeDocument/2006/relationships" r:embed="R46a1f270498047fd"/>
                     <a:stretch>
                       <a:fillRect/>
                     </a:stretch>
@@ -2583,7 +2583,7 @@
                     <pic:cNvPicPr/>
                   </pic:nvPicPr>
                   <pic:blipFill>
-                    <a:blip xmlns:r="http://schemas.openxmlformats.org/officeDocument/2006/relationships" r:embed="R3092fe34932f4215"/>
+                    <a:blip xmlns:r="http://schemas.openxmlformats.org/officeDocument/2006/relationships" r:embed="R0f05c156c7f04ab1"/>
                     <a:stretch>
                       <a:fillRect/>
                     </a:stretch>
@@ -2659,7 +2659,7 @@
                     <pic:cNvPicPr/>
                   </pic:nvPicPr>
                   <pic:blipFill>
-                    <a:blip xmlns:r="http://schemas.openxmlformats.org/officeDocument/2006/relationships" r:embed="Rbbb4876cdfa64246"/>
+                    <a:blip xmlns:r="http://schemas.openxmlformats.org/officeDocument/2006/relationships" r:embed="R4669a9c92421414e"/>
                     <a:stretch>
                       <a:fillRect/>
                     </a:stretch>
@@ -2710,7 +2710,7 @@
                     <pic:cNvPicPr/>
                   </pic:nvPicPr>
                   <pic:blipFill>
-                    <a:blip xmlns:r="http://schemas.openxmlformats.org/officeDocument/2006/relationships" r:embed="R658daa55e51a458e"/>
+                    <a:blip xmlns:r="http://schemas.openxmlformats.org/officeDocument/2006/relationships" r:embed="Rbdc73a593b334e61"/>
                     <a:stretch>
                       <a:fillRect/>
                     </a:stretch>
@@ -2761,7 +2761,7 @@
                     <pic:cNvPicPr/>
                   </pic:nvPicPr>
                   <pic:blipFill>
-                    <a:blip xmlns:r="http://schemas.openxmlformats.org/officeDocument/2006/relationships" r:embed="R62d0be0d246a499e"/>
+                    <a:blip xmlns:r="http://schemas.openxmlformats.org/officeDocument/2006/relationships" r:embed="R6ed2f9ca672e4890"/>
                     <a:stretch>
                       <a:fillRect/>
                     </a:stretch>
@@ -2812,7 +2812,7 @@
                     <pic:cNvPicPr/>
                   </pic:nvPicPr>
                   <pic:blipFill>
-                    <a:blip xmlns:r="http://schemas.openxmlformats.org/officeDocument/2006/relationships" r:embed="Rb19ad479be1444f3"/>
+                    <a:blip xmlns:r="http://schemas.openxmlformats.org/officeDocument/2006/relationships" r:embed="R42fb1976c93e47dd"/>
                     <a:stretch>
                       <a:fillRect/>
                     </a:stretch>
@@ -2863,7 +2863,7 @@
                     <pic:cNvPicPr/>
                   </pic:nvPicPr>
                   <pic:blipFill>
-                    <a:blip xmlns:r="http://schemas.openxmlformats.org/officeDocument/2006/relationships" r:embed="R0acee91973434f2b"/>
+                    <a:blip xmlns:r="http://schemas.openxmlformats.org/officeDocument/2006/relationships" r:embed="R5a6e1b7827f74857"/>
                     <a:stretch>
                       <a:fillRect/>
                     </a:stretch>
@@ -2914,7 +2914,7 @@
                     <pic:cNvPicPr/>
                   </pic:nvPicPr>
                   <pic:blipFill>
-                    <a:blip xmlns:r="http://schemas.openxmlformats.org/officeDocument/2006/relationships" r:embed="R5bb692abbd874fef"/>
+                    <a:blip xmlns:r="http://schemas.openxmlformats.org/officeDocument/2006/relationships" r:embed="R8759ada0f0d9452e"/>
                     <a:stretch>
                       <a:fillRect/>
                     </a:stretch>
@@ -2965,7 +2965,7 @@
                     <pic:cNvPicPr/>
                   </pic:nvPicPr>
                   <pic:blipFill>
-                    <a:blip xmlns:r="http://schemas.openxmlformats.org/officeDocument/2006/relationships" r:embed="R0c38eeeab94e4777"/>
+                    <a:blip xmlns:r="http://schemas.openxmlformats.org/officeDocument/2006/relationships" r:embed="Rde109c162a5b4eea"/>
                     <a:stretch>
                       <a:fillRect/>
                     </a:stretch>
@@ -3016,7 +3016,7 @@
                     <pic:cNvPicPr/>
                   </pic:nvPicPr>
                   <pic:blipFill>
-                    <a:blip xmlns:r="http://schemas.openxmlformats.org/officeDocument/2006/relationships" r:embed="R7c3f540f133643f8"/>
+                    <a:blip xmlns:r="http://schemas.openxmlformats.org/officeDocument/2006/relationships" r:embed="R9132e636902f4c54"/>
                     <a:stretch>
                       <a:fillRect/>
                     </a:stretch>
@@ -3067,7 +3067,7 @@
                     <pic:cNvPicPr/>
                   </pic:nvPicPr>
                   <pic:blipFill>
-                    <a:blip xmlns:r="http://schemas.openxmlformats.org/officeDocument/2006/relationships" r:embed="R63a8845b8fb54c9a"/>
+                    <a:blip xmlns:r="http://schemas.openxmlformats.org/officeDocument/2006/relationships" r:embed="R9a71f362453d4138"/>
                     <a:stretch>
                       <a:fillRect/>
                     </a:stretch>
@@ -3118,7 +3118,7 @@
                     <pic:cNvPicPr/>
                   </pic:nvPicPr>
                   <pic:blipFill>
-                    <a:blip xmlns:r="http://schemas.openxmlformats.org/officeDocument/2006/relationships" r:embed="R8262c5a3ee3f4991"/>
+                    <a:blip xmlns:r="http://schemas.openxmlformats.org/officeDocument/2006/relationships" r:embed="R598a99b305be4de5"/>
                     <a:stretch>
                       <a:fillRect/>
                     </a:stretch>
@@ -3169,7 +3169,7 @@
                     <pic:cNvPicPr/>
                   </pic:nvPicPr>
                   <pic:blipFill>
-                    <a:blip xmlns:r="http://schemas.openxmlformats.org/officeDocument/2006/relationships" r:embed="R7ce84ae856d348d3"/>
+                    <a:blip xmlns:r="http://schemas.openxmlformats.org/officeDocument/2006/relationships" r:embed="R753f214f4d4c4857"/>
                     <a:stretch>
                       <a:fillRect/>
                     </a:stretch>
@@ -3220,7 +3220,7 @@
                     <pic:cNvPicPr/>
                   </pic:nvPicPr>
                   <pic:blipFill>
-                    <a:blip xmlns:r="http://schemas.openxmlformats.org/officeDocument/2006/relationships" r:embed="Re9c1b58acbca4c1a"/>
+                    <a:blip xmlns:r="http://schemas.openxmlformats.org/officeDocument/2006/relationships" r:embed="R38185810ec4949b6"/>
                     <a:stretch>
                       <a:fillRect/>
                     </a:stretch>
@@ -3271,7 +3271,7 @@
                     <pic:cNvPicPr/>
                   </pic:nvPicPr>
                   <pic:blipFill>
-                    <a:blip xmlns:r="http://schemas.openxmlformats.org/officeDocument/2006/relationships" r:embed="Rb592089af3434705"/>
+                    <a:blip xmlns:r="http://schemas.openxmlformats.org/officeDocument/2006/relationships" r:embed="Rbe498cf50e184abe"/>
                     <a:stretch>
                       <a:fillRect/>
                     </a:stretch>
@@ -3322,7 +3322,7 @@
                     <pic:cNvPicPr/>
                   </pic:nvPicPr>
                   <pic:blipFill>
-                    <a:blip xmlns:r="http://schemas.openxmlformats.org/officeDocument/2006/relationships" r:embed="R0386039877b84950"/>
+                    <a:blip xmlns:r="http://schemas.openxmlformats.org/officeDocument/2006/relationships" r:embed="R0ff014d5029c4ec1"/>
                     <a:stretch>
                       <a:fillRect/>
                     </a:stretch>
@@ -3419,7 +3419,7 @@
                     <pic:cNvPicPr/>
                   </pic:nvPicPr>
                   <pic:blipFill>
-                    <a:blip xmlns:r="http://schemas.openxmlformats.org/officeDocument/2006/relationships" r:embed="R9d9126ed5c214ca1"/>
+                    <a:blip xmlns:r="http://schemas.openxmlformats.org/officeDocument/2006/relationships" r:embed="R36cd760046414b10"/>
                     <a:stretch>
                       <a:fillRect/>
                     </a:stretch>
@@ -3462,7 +3462,7 @@
                     <pic:cNvPicPr/>
                   </pic:nvPicPr>
                   <pic:blipFill>
-                    <a:blip xmlns:r="http://schemas.openxmlformats.org/officeDocument/2006/relationships" r:embed="R155354ffe33f4f2a"/>
+                    <a:blip xmlns:r="http://schemas.openxmlformats.org/officeDocument/2006/relationships" r:embed="Re8edf799d0a348d2"/>
                     <a:stretch>
                       <a:fillRect/>
                     </a:stretch>
@@ -3505,7 +3505,7 @@
                     <pic:cNvPicPr/>
                   </pic:nvPicPr>
                   <pic:blipFill>
-                    <a:blip xmlns:r="http://schemas.openxmlformats.org/officeDocument/2006/relationships" r:embed="R4d2a4d6c6a8a4cd0"/>
+                    <a:blip xmlns:r="http://schemas.openxmlformats.org/officeDocument/2006/relationships" r:embed="Rebb2e9c0d12d49d8"/>
                     <a:stretch>
                       <a:fillRect/>
                     </a:stretch>
@@ -3548,7 +3548,7 @@
                     <pic:cNvPicPr/>
                   </pic:nvPicPr>
                   <pic:blipFill>
-                    <a:blip xmlns:r="http://schemas.openxmlformats.org/officeDocument/2006/relationships" r:embed="Rbef12a3666554cc9"/>
+                    <a:blip xmlns:r="http://schemas.openxmlformats.org/officeDocument/2006/relationships" r:embed="R3c01baef0df245b2"/>
                     <a:stretch>
                       <a:fillRect/>
                     </a:stretch>
@@ -3933,7 +3933,7 @@
                     <pic:cNvPicPr/>
                   </pic:nvPicPr>
                   <pic:blipFill>
-                    <a:blip xmlns:r="http://schemas.openxmlformats.org/officeDocument/2006/relationships" r:embed="Ra67c8e84db4e409f"/>
+                    <a:blip xmlns:r="http://schemas.openxmlformats.org/officeDocument/2006/relationships" r:embed="R5de40372052848c9"/>
                     <a:stretch>
                       <a:fillRect/>
                     </a:stretch>
@@ -4125,7 +4125,7 @@
                     <pic:cNvPicPr/>
                   </pic:nvPicPr>
                   <pic:blipFill>
-                    <a:blip xmlns:r="http://schemas.openxmlformats.org/officeDocument/2006/relationships" r:embed="R0912fd7a90ea4f2f"/>
+                    <a:blip xmlns:r="http://schemas.openxmlformats.org/officeDocument/2006/relationships" r:embed="Ra1055666bed341aa"/>
                     <a:stretch>
                       <a:fillRect/>
                     </a:stretch>
@@ -4176,7 +4176,7 @@
                     <pic:cNvPicPr/>
                   </pic:nvPicPr>
                   <pic:blipFill>
-                    <a:blip xmlns:r="http://schemas.openxmlformats.org/officeDocument/2006/relationships" r:embed="R0c44ece10dbc4d8c"/>
+                    <a:blip xmlns:r="http://schemas.openxmlformats.org/officeDocument/2006/relationships" r:embed="R16b8c26fe68340ef"/>
                     <a:stretch>
                       <a:fillRect/>
                     </a:stretch>
@@ -4227,7 +4227,7 @@
                     <pic:cNvPicPr/>
                   </pic:nvPicPr>
                   <pic:blipFill>
-                    <a:blip xmlns:r="http://schemas.openxmlformats.org/officeDocument/2006/relationships" r:embed="R7c61551eb4a74714"/>
+                    <a:blip xmlns:r="http://schemas.openxmlformats.org/officeDocument/2006/relationships" r:embed="R492f32eae506458f"/>
                     <a:stretch>
                       <a:fillRect/>
                     </a:stretch>
@@ -4278,7 +4278,7 @@
                     <pic:cNvPicPr/>
                   </pic:nvPicPr>
                   <pic:blipFill>
-                    <a:blip xmlns:r="http://schemas.openxmlformats.org/officeDocument/2006/relationships" r:embed="R2a7f2c9d6dec4139"/>
+                    <a:blip xmlns:r="http://schemas.openxmlformats.org/officeDocument/2006/relationships" r:embed="R6bd2df76d07841cf"/>
                     <a:stretch>
                       <a:fillRect/>
                     </a:stretch>
@@ -4657,7 +4657,7 @@
                     <pic:cNvPicPr/>
                   </pic:nvPicPr>
                   <pic:blipFill>
-                    <a:blip xmlns:r="http://schemas.openxmlformats.org/officeDocument/2006/relationships" r:embed="Ra405763a2ae64306"/>
+                    <a:blip xmlns:r="http://schemas.openxmlformats.org/officeDocument/2006/relationships" r:embed="R3dc655a12143411d"/>
                     <a:stretch>
                       <a:fillRect/>
                     </a:stretch>
@@ -5338,7 +5338,7 @@
             <w:r>
               <w:t xml:space="preserve">Cell with </w:t>
             </w:r>
-            <w:hyperlink xmlns:r="http://schemas.openxmlformats.org/officeDocument/2006/relationships" w:history="true" r:id="R2fda4015c90c4f81">
+            <w:hyperlink xmlns:r="http://schemas.openxmlformats.org/officeDocument/2006/relationships" w:history="true" r:id="R129695f5faaf41f2">
               <w:r>
                 <w:rPr>
                   <w:rStyle w:val="Hyperlink"/>
@@ -5624,7 +5624,7 @@
                           <pic:cNvPicPr/>
                         </pic:nvPicPr>
                         <pic:blipFill>
-                          <a:blip xmlns:r="http://schemas.openxmlformats.org/officeDocument/2006/relationships" r:embed="R2bf83e6ffe4d4440"/>
+                          <a:blip xmlns:r="http://schemas.openxmlformats.org/officeDocument/2006/relationships" r:embed="R0d2c2ecd55e44a6b"/>
                           <a:stretch>
                             <a:fillRect/>
                           </a:stretch>
@@ -5724,7 +5724,7 @@
                     <pic:cNvPicPr/>
                   </pic:nvPicPr>
                   <pic:blipFill>
-                    <a:blip xmlns:r="http://schemas.openxmlformats.org/officeDocument/2006/relationships" r:embed="R41a659200d5147c7"/>
+                    <a:blip xmlns:r="http://schemas.openxmlformats.org/officeDocument/2006/relationships" r:embed="R9905a29616b94441"/>
                     <a:stretch>
                       <a:fillRect/>
                     </a:stretch>
@@ -5774,7 +5774,7 @@
                     <pic:cNvPicPr/>
                   </pic:nvPicPr>
                   <pic:blipFill>
-                    <a:blip xmlns:r="http://schemas.openxmlformats.org/officeDocument/2006/relationships" r:embed="R736053ac80bb48e0"/>
+                    <a:blip xmlns:r="http://schemas.openxmlformats.org/officeDocument/2006/relationships" r:embed="R239a4c00e5764a9b"/>
                     <a:stretch>
                       <a:fillRect/>
                     </a:stretch>
@@ -5824,7 +5824,7 @@
                     <pic:cNvPicPr/>
                   </pic:nvPicPr>
                   <pic:blipFill>
-                    <a:blip xmlns:r="http://schemas.openxmlformats.org/officeDocument/2006/relationships" r:embed="Rfaf0805d961c41a7"/>
+                    <a:blip xmlns:r="http://schemas.openxmlformats.org/officeDocument/2006/relationships" r:embed="R093173035026429c"/>
                     <a:stretch>
                       <a:fillRect/>
                     </a:stretch>

</xml_diff>

<commit_message>
fix(er): enforce minimum straight exit/entry in guided curveBasis
For ER matrix-style relationships, ensure the guided curveBasis route includes minimum straight segments at the source and target before smoothing, matching the scenario-1 shoulder feel.

Made-with: Cursor
</commit_message>
<xml_diff>
--- a/test.docx
+++ b/test.docx
@@ -236,7 +236,7 @@
       <w:r>
         <w:t xml:space="preserve">, and </w:t>
       </w:r>
-      <w:hyperlink xmlns:r="http://schemas.openxmlformats.org/officeDocument/2006/relationships" w:history="true" r:id="R59c2ba8c5c6a4fe0">
+      <w:hyperlink xmlns:r="http://schemas.openxmlformats.org/officeDocument/2006/relationships" w:history="true" r:id="R60e8ee571d4845b3">
         <w:r>
           <w:rPr>
             <w:rStyle w:val="Hyperlink"/>
@@ -475,7 +475,7 @@
       <w:r>
         <w:t xml:space="preserve">Direct link: </w:t>
       </w:r>
-      <w:hyperlink xmlns:r="http://schemas.openxmlformats.org/officeDocument/2006/relationships" w:history="true" r:id="R15f5d39cd040495a">
+      <w:hyperlink xmlns:r="http://schemas.openxmlformats.org/officeDocument/2006/relationships" w:history="true" r:id="Rff544405ab29423e">
         <w:r>
           <w:rPr>
             <w:rStyle w:val="Hyperlink"/>
@@ -496,7 +496,7 @@
       <w:r>
         <w:t xml:space="preserve">Direct link with title: </w:t>
       </w:r>
-      <w:hyperlink xmlns:r="http://schemas.openxmlformats.org/officeDocument/2006/relationships" w:history="true" r:id="R723626f2aa6d42c6">
+      <w:hyperlink xmlns:r="http://schemas.openxmlformats.org/officeDocument/2006/relationships" w:history="true" r:id="R56e0e90bf35a4d7c">
         <w:r>
           <w:rPr>
             <w:rStyle w:val="Hyperlink"/>
@@ -517,7 +517,7 @@
       <w:r>
         <w:t xml:space="preserve">Reference-style link: </w:t>
       </w:r>
-      <w:hyperlink xmlns:r="http://schemas.openxmlformats.org/officeDocument/2006/relationships" w:history="true" r:id="R79859abf5e42430c">
+      <w:hyperlink xmlns:r="http://schemas.openxmlformats.org/officeDocument/2006/relationships" w:history="true" r:id="Ra7a1805d12fd4703">
         <w:r>
           <w:rPr>
             <w:rStyle w:val="Hyperlink"/>
@@ -538,7 +538,7 @@
       <w:r>
         <w:t xml:space="preserve">Collapsed reference link: </w:t>
       </w:r>
-      <w:hyperlink xmlns:r="http://schemas.openxmlformats.org/officeDocument/2006/relationships" w:history="true" r:id="R10bdd721c4c9404b">
+      <w:hyperlink xmlns:r="http://schemas.openxmlformats.org/officeDocument/2006/relationships" w:history="true" r:id="R7ee8bd57686049ff">
         <w:r>
           <w:rPr>
             <w:rStyle w:val="Hyperlink"/>
@@ -559,7 +559,7 @@
       <w:r>
         <w:t xml:space="preserve">Repeated reference link: </w:t>
       </w:r>
-      <w:hyperlink xmlns:r="http://schemas.openxmlformats.org/officeDocument/2006/relationships" w:history="true" r:id="Rb54f46ba9ecb42a8">
+      <w:hyperlink xmlns:r="http://schemas.openxmlformats.org/officeDocument/2006/relationships" w:history="true" r:id="Reda0e342ee9e4b64">
         <w:r>
           <w:rPr>
             <w:rStyle w:val="Hyperlink"/>
@@ -580,7 +580,7 @@
       <w:r>
         <w:t xml:space="preserve">Autolink URL: </w:t>
       </w:r>
-      <w:hyperlink xmlns:r="http://schemas.openxmlformats.org/officeDocument/2006/relationships" w:history="true" r:id="Re14af6914ebe4e23">
+      <w:hyperlink xmlns:r="http://schemas.openxmlformats.org/officeDocument/2006/relationships" w:history="true" r:id="R407408c4f8b64d13">
         <w:r>
           <w:rPr>
             <w:rStyle w:val="Hyperlink"/>
@@ -601,7 +601,7 @@
       <w:r>
         <w:t xml:space="preserve">Autolink email: </w:t>
       </w:r>
-      <w:hyperlink xmlns:r="http://schemas.openxmlformats.org/officeDocument/2006/relationships" w:history="true" r:id="R54e2f069361e4511">
+      <w:hyperlink xmlns:r="http://schemas.openxmlformats.org/officeDocument/2006/relationships" w:history="true" r:id="Re5d40eb735174946">
         <w:r>
           <w:rPr>
             <w:rStyle w:val="Hyperlink"/>
@@ -700,7 +700,7 @@
       <w:r>
         <w:t xml:space="preserve">, and </w:t>
       </w:r>
-      <w:hyperlink xmlns:r="http://schemas.openxmlformats.org/officeDocument/2006/relationships" w:history="true" r:id="Rea606b82264e4c1f">
+      <w:hyperlink xmlns:r="http://schemas.openxmlformats.org/officeDocument/2006/relationships" w:history="true" r:id="Rfd473cde09ce482a">
         <w:r>
           <w:rPr>
             <w:rStyle w:val="Hyperlink"/>
@@ -1093,7 +1093,7 @@
       <w:r>
         <w:t xml:space="preserve">Continuation paragraph with </w:t>
       </w:r>
-      <w:hyperlink xmlns:r="http://schemas.openxmlformats.org/officeDocument/2006/relationships" w:history="true" r:id="Rc79cadf1e1c94922">
+      <w:hyperlink xmlns:r="http://schemas.openxmlformats.org/officeDocument/2006/relationships" w:history="true" r:id="Rd201612185ea4794">
         <w:r>
           <w:rPr>
             <w:rStyle w:val="Hyperlink"/>
@@ -1591,7 +1591,7 @@
       <w:r>
         <w:t xml:space="preserve">, and </w:t>
       </w:r>
-      <w:hyperlink xmlns:r="http://schemas.openxmlformats.org/officeDocument/2006/relationships" w:history="true" r:id="R56f1d6e4b099498a">
+      <w:hyperlink xmlns:r="http://schemas.openxmlformats.org/officeDocument/2006/relationships" w:history="true" r:id="Rf13c278bdf114df2">
         <w:r>
           <w:rPr>
             <w:rStyle w:val="Hyperlink"/>
@@ -1979,7 +1979,7 @@
                     <pic:cNvPicPr/>
                   </pic:nvPicPr>
                   <pic:blipFill>
-                    <a:blip xmlns:r="http://schemas.openxmlformats.org/officeDocument/2006/relationships" r:embed="R968d5c7ae24345ba"/>
+                    <a:blip xmlns:r="http://schemas.openxmlformats.org/officeDocument/2006/relationships" r:embed="R36b4e0ae0c6347a8"/>
                     <a:stretch>
                       <a:fillRect/>
                     </a:stretch>
@@ -2039,7 +2039,7 @@
                     <pic:cNvPicPr/>
                   </pic:nvPicPr>
                   <pic:blipFill>
-                    <a:blip xmlns:r="http://schemas.openxmlformats.org/officeDocument/2006/relationships" r:embed="R9bfce3293ef346a6"/>
+                    <a:blip xmlns:r="http://schemas.openxmlformats.org/officeDocument/2006/relationships" r:embed="R1f987e5656534c66"/>
                     <a:stretch>
                       <a:fillRect/>
                     </a:stretch>
@@ -2099,7 +2099,7 @@
                     <pic:cNvPicPr/>
                   </pic:nvPicPr>
                   <pic:blipFill>
-                    <a:blip xmlns:r="http://schemas.openxmlformats.org/officeDocument/2006/relationships" r:embed="R6abcfb69e57c4e2c"/>
+                    <a:blip xmlns:r="http://schemas.openxmlformats.org/officeDocument/2006/relationships" r:embed="R7ad9b71507144440"/>
                     <a:stretch>
                       <a:fillRect/>
                     </a:stretch>
@@ -2150,7 +2150,7 @@
                     <pic:cNvPicPr/>
                   </pic:nvPicPr>
                   <pic:blipFill>
-                    <a:blip xmlns:r="http://schemas.openxmlformats.org/officeDocument/2006/relationships" r:embed="R80023457c19f4b45"/>
+                    <a:blip xmlns:r="http://schemas.openxmlformats.org/officeDocument/2006/relationships" r:embed="R6f7508de7579446c"/>
                     <a:stretch>
                       <a:fillRect/>
                     </a:stretch>
@@ -2201,7 +2201,7 @@
                     <pic:cNvPicPr/>
                   </pic:nvPicPr>
                   <pic:blipFill>
-                    <a:blip xmlns:r="http://schemas.openxmlformats.org/officeDocument/2006/relationships" r:embed="R10e79d2be5064c92"/>
+                    <a:blip xmlns:r="http://schemas.openxmlformats.org/officeDocument/2006/relationships" r:embed="R272925527beb4f31"/>
                     <a:stretch>
                       <a:fillRect/>
                     </a:stretch>
@@ -2252,7 +2252,7 @@
                     <pic:cNvPicPr/>
                   </pic:nvPicPr>
                   <pic:blipFill>
-                    <a:blip xmlns:r="http://schemas.openxmlformats.org/officeDocument/2006/relationships" r:embed="R1ea4cf34cd134c22"/>
+                    <a:blip xmlns:r="http://schemas.openxmlformats.org/officeDocument/2006/relationships" r:embed="R9e39130caca44c77"/>
                     <a:stretch>
                       <a:fillRect/>
                     </a:stretch>
@@ -2303,7 +2303,7 @@
                     <pic:cNvPicPr/>
                   </pic:nvPicPr>
                   <pic:blipFill>
-                    <a:blip xmlns:r="http://schemas.openxmlformats.org/officeDocument/2006/relationships" r:embed="Rf1e4dd4076cd467d"/>
+                    <a:blip xmlns:r="http://schemas.openxmlformats.org/officeDocument/2006/relationships" r:embed="R977cddacdec44fa4"/>
                     <a:stretch>
                       <a:fillRect/>
                     </a:stretch>
@@ -2354,7 +2354,7 @@
                     <pic:cNvPicPr/>
                   </pic:nvPicPr>
                   <pic:blipFill>
-                    <a:blip xmlns:r="http://schemas.openxmlformats.org/officeDocument/2006/relationships" r:embed="Re8ed6215fd874ec4"/>
+                    <a:blip xmlns:r="http://schemas.openxmlformats.org/officeDocument/2006/relationships" r:embed="R4c5c6a395e684c64"/>
                     <a:stretch>
                       <a:fillRect/>
                     </a:stretch>
@@ -2430,7 +2430,7 @@
                     <pic:cNvPicPr/>
                   </pic:nvPicPr>
                   <pic:blipFill>
-                    <a:blip xmlns:r="http://schemas.openxmlformats.org/officeDocument/2006/relationships" r:embed="R409807229216468d"/>
+                    <a:blip xmlns:r="http://schemas.openxmlformats.org/officeDocument/2006/relationships" r:embed="R5d1a652caa304642"/>
                     <a:stretch>
                       <a:fillRect/>
                     </a:stretch>
@@ -2481,7 +2481,7 @@
                     <pic:cNvPicPr/>
                   </pic:nvPicPr>
                   <pic:blipFill>
-                    <a:blip xmlns:r="http://schemas.openxmlformats.org/officeDocument/2006/relationships" r:embed="Rf3ebe66ec34c4deb"/>
+                    <a:blip xmlns:r="http://schemas.openxmlformats.org/officeDocument/2006/relationships" r:embed="R729adedca0e6471f"/>
                     <a:stretch>
                       <a:fillRect/>
                     </a:stretch>
@@ -2532,7 +2532,7 @@
                     <pic:cNvPicPr/>
                   </pic:nvPicPr>
                   <pic:blipFill>
-                    <a:blip xmlns:r="http://schemas.openxmlformats.org/officeDocument/2006/relationships" r:embed="R46a1f270498047fd"/>
+                    <a:blip xmlns:r="http://schemas.openxmlformats.org/officeDocument/2006/relationships" r:embed="R90ad287e130c4627"/>
                     <a:stretch>
                       <a:fillRect/>
                     </a:stretch>
@@ -2583,7 +2583,7 @@
                     <pic:cNvPicPr/>
                   </pic:nvPicPr>
                   <pic:blipFill>
-                    <a:blip xmlns:r="http://schemas.openxmlformats.org/officeDocument/2006/relationships" r:embed="R0f05c156c7f04ab1"/>
+                    <a:blip xmlns:r="http://schemas.openxmlformats.org/officeDocument/2006/relationships" r:embed="R6ee12c9dab014484"/>
                     <a:stretch>
                       <a:fillRect/>
                     </a:stretch>
@@ -2659,7 +2659,7 @@
                     <pic:cNvPicPr/>
                   </pic:nvPicPr>
                   <pic:blipFill>
-                    <a:blip xmlns:r="http://schemas.openxmlformats.org/officeDocument/2006/relationships" r:embed="R4669a9c92421414e"/>
+                    <a:blip xmlns:r="http://schemas.openxmlformats.org/officeDocument/2006/relationships" r:embed="Rb672e441bea44a6f"/>
                     <a:stretch>
                       <a:fillRect/>
                     </a:stretch>
@@ -2710,7 +2710,7 @@
                     <pic:cNvPicPr/>
                   </pic:nvPicPr>
                   <pic:blipFill>
-                    <a:blip xmlns:r="http://schemas.openxmlformats.org/officeDocument/2006/relationships" r:embed="Rbdc73a593b334e61"/>
+                    <a:blip xmlns:r="http://schemas.openxmlformats.org/officeDocument/2006/relationships" r:embed="R1daa33af50414a63"/>
                     <a:stretch>
                       <a:fillRect/>
                     </a:stretch>
@@ -2761,7 +2761,7 @@
                     <pic:cNvPicPr/>
                   </pic:nvPicPr>
                   <pic:blipFill>
-                    <a:blip xmlns:r="http://schemas.openxmlformats.org/officeDocument/2006/relationships" r:embed="R6ed2f9ca672e4890"/>
+                    <a:blip xmlns:r="http://schemas.openxmlformats.org/officeDocument/2006/relationships" r:embed="Rd5cd6d29a30f45a8"/>
                     <a:stretch>
                       <a:fillRect/>
                     </a:stretch>
@@ -2812,7 +2812,7 @@
                     <pic:cNvPicPr/>
                   </pic:nvPicPr>
                   <pic:blipFill>
-                    <a:blip xmlns:r="http://schemas.openxmlformats.org/officeDocument/2006/relationships" r:embed="R42fb1976c93e47dd"/>
+                    <a:blip xmlns:r="http://schemas.openxmlformats.org/officeDocument/2006/relationships" r:embed="R2a4ffaf747d940ef"/>
                     <a:stretch>
                       <a:fillRect/>
                     </a:stretch>
@@ -2863,7 +2863,7 @@
                     <pic:cNvPicPr/>
                   </pic:nvPicPr>
                   <pic:blipFill>
-                    <a:blip xmlns:r="http://schemas.openxmlformats.org/officeDocument/2006/relationships" r:embed="R5a6e1b7827f74857"/>
+                    <a:blip xmlns:r="http://schemas.openxmlformats.org/officeDocument/2006/relationships" r:embed="Rf00a954c9b8642ea"/>
                     <a:stretch>
                       <a:fillRect/>
                     </a:stretch>
@@ -2914,7 +2914,7 @@
                     <pic:cNvPicPr/>
                   </pic:nvPicPr>
                   <pic:blipFill>
-                    <a:blip xmlns:r="http://schemas.openxmlformats.org/officeDocument/2006/relationships" r:embed="R8759ada0f0d9452e"/>
+                    <a:blip xmlns:r="http://schemas.openxmlformats.org/officeDocument/2006/relationships" r:embed="R7bc6ec842fc445c1"/>
                     <a:stretch>
                       <a:fillRect/>
                     </a:stretch>
@@ -2965,7 +2965,7 @@
                     <pic:cNvPicPr/>
                   </pic:nvPicPr>
                   <pic:blipFill>
-                    <a:blip xmlns:r="http://schemas.openxmlformats.org/officeDocument/2006/relationships" r:embed="Rde109c162a5b4eea"/>
+                    <a:blip xmlns:r="http://schemas.openxmlformats.org/officeDocument/2006/relationships" r:embed="Rb8c25d9dd61946bc"/>
                     <a:stretch>
                       <a:fillRect/>
                     </a:stretch>
@@ -3016,7 +3016,7 @@
                     <pic:cNvPicPr/>
                   </pic:nvPicPr>
                   <pic:blipFill>
-                    <a:blip xmlns:r="http://schemas.openxmlformats.org/officeDocument/2006/relationships" r:embed="R9132e636902f4c54"/>
+                    <a:blip xmlns:r="http://schemas.openxmlformats.org/officeDocument/2006/relationships" r:embed="Rb0c6ce3f3caf44cb"/>
                     <a:stretch>
                       <a:fillRect/>
                     </a:stretch>
@@ -3067,7 +3067,7 @@
                     <pic:cNvPicPr/>
                   </pic:nvPicPr>
                   <pic:blipFill>
-                    <a:blip xmlns:r="http://schemas.openxmlformats.org/officeDocument/2006/relationships" r:embed="R9a71f362453d4138"/>
+                    <a:blip xmlns:r="http://schemas.openxmlformats.org/officeDocument/2006/relationships" r:embed="R8cfd714f0ebc448f"/>
                     <a:stretch>
                       <a:fillRect/>
                     </a:stretch>
@@ -3118,7 +3118,7 @@
                     <pic:cNvPicPr/>
                   </pic:nvPicPr>
                   <pic:blipFill>
-                    <a:blip xmlns:r="http://schemas.openxmlformats.org/officeDocument/2006/relationships" r:embed="R598a99b305be4de5"/>
+                    <a:blip xmlns:r="http://schemas.openxmlformats.org/officeDocument/2006/relationships" r:embed="Rae8bbf29b3c14147"/>
                     <a:stretch>
                       <a:fillRect/>
                     </a:stretch>
@@ -3169,7 +3169,7 @@
                     <pic:cNvPicPr/>
                   </pic:nvPicPr>
                   <pic:blipFill>
-                    <a:blip xmlns:r="http://schemas.openxmlformats.org/officeDocument/2006/relationships" r:embed="R753f214f4d4c4857"/>
+                    <a:blip xmlns:r="http://schemas.openxmlformats.org/officeDocument/2006/relationships" r:embed="Ra70439b3b5c14c20"/>
                     <a:stretch>
                       <a:fillRect/>
                     </a:stretch>
@@ -3220,7 +3220,7 @@
                     <pic:cNvPicPr/>
                   </pic:nvPicPr>
                   <pic:blipFill>
-                    <a:blip xmlns:r="http://schemas.openxmlformats.org/officeDocument/2006/relationships" r:embed="R38185810ec4949b6"/>
+                    <a:blip xmlns:r="http://schemas.openxmlformats.org/officeDocument/2006/relationships" r:embed="R0fdff181a2ba4dba"/>
                     <a:stretch>
                       <a:fillRect/>
                     </a:stretch>
@@ -3271,7 +3271,7 @@
                     <pic:cNvPicPr/>
                   </pic:nvPicPr>
                   <pic:blipFill>
-                    <a:blip xmlns:r="http://schemas.openxmlformats.org/officeDocument/2006/relationships" r:embed="Rbe498cf50e184abe"/>
+                    <a:blip xmlns:r="http://schemas.openxmlformats.org/officeDocument/2006/relationships" r:embed="R91723f9094be42dc"/>
                     <a:stretch>
                       <a:fillRect/>
                     </a:stretch>
@@ -3322,7 +3322,7 @@
                     <pic:cNvPicPr/>
                   </pic:nvPicPr>
                   <pic:blipFill>
-                    <a:blip xmlns:r="http://schemas.openxmlformats.org/officeDocument/2006/relationships" r:embed="R0ff014d5029c4ec1"/>
+                    <a:blip xmlns:r="http://schemas.openxmlformats.org/officeDocument/2006/relationships" r:embed="R64c91e7ca7574254"/>
                     <a:stretch>
                       <a:fillRect/>
                     </a:stretch>
@@ -3419,7 +3419,7 @@
                     <pic:cNvPicPr/>
                   </pic:nvPicPr>
                   <pic:blipFill>
-                    <a:blip xmlns:r="http://schemas.openxmlformats.org/officeDocument/2006/relationships" r:embed="R36cd760046414b10"/>
+                    <a:blip xmlns:r="http://schemas.openxmlformats.org/officeDocument/2006/relationships" r:embed="R8e0dba7c195343d6"/>
                     <a:stretch>
                       <a:fillRect/>
                     </a:stretch>
@@ -3462,7 +3462,7 @@
                     <pic:cNvPicPr/>
                   </pic:nvPicPr>
                   <pic:blipFill>
-                    <a:blip xmlns:r="http://schemas.openxmlformats.org/officeDocument/2006/relationships" r:embed="Re8edf799d0a348d2"/>
+                    <a:blip xmlns:r="http://schemas.openxmlformats.org/officeDocument/2006/relationships" r:embed="Rf5cbdf1efbd74890"/>
                     <a:stretch>
                       <a:fillRect/>
                     </a:stretch>
@@ -3505,7 +3505,7 @@
                     <pic:cNvPicPr/>
                   </pic:nvPicPr>
                   <pic:blipFill>
-                    <a:blip xmlns:r="http://schemas.openxmlformats.org/officeDocument/2006/relationships" r:embed="Rebb2e9c0d12d49d8"/>
+                    <a:blip xmlns:r="http://schemas.openxmlformats.org/officeDocument/2006/relationships" r:embed="R00ad3e0cc93c40e0"/>
                     <a:stretch>
                       <a:fillRect/>
                     </a:stretch>
@@ -3548,7 +3548,7 @@
                     <pic:cNvPicPr/>
                   </pic:nvPicPr>
                   <pic:blipFill>
-                    <a:blip xmlns:r="http://schemas.openxmlformats.org/officeDocument/2006/relationships" r:embed="R3c01baef0df245b2"/>
+                    <a:blip xmlns:r="http://schemas.openxmlformats.org/officeDocument/2006/relationships" r:embed="R14ace09ec5104181"/>
                     <a:stretch>
                       <a:fillRect/>
                     </a:stretch>
@@ -3933,7 +3933,7 @@
                     <pic:cNvPicPr/>
                   </pic:nvPicPr>
                   <pic:blipFill>
-                    <a:blip xmlns:r="http://schemas.openxmlformats.org/officeDocument/2006/relationships" r:embed="R5de40372052848c9"/>
+                    <a:blip xmlns:r="http://schemas.openxmlformats.org/officeDocument/2006/relationships" r:embed="R93badf3c3c504587"/>
                     <a:stretch>
                       <a:fillRect/>
                     </a:stretch>
@@ -4125,7 +4125,7 @@
                     <pic:cNvPicPr/>
                   </pic:nvPicPr>
                   <pic:blipFill>
-                    <a:blip xmlns:r="http://schemas.openxmlformats.org/officeDocument/2006/relationships" r:embed="Ra1055666bed341aa"/>
+                    <a:blip xmlns:r="http://schemas.openxmlformats.org/officeDocument/2006/relationships" r:embed="Reeb49a14b19f42ba"/>
                     <a:stretch>
                       <a:fillRect/>
                     </a:stretch>
@@ -4176,7 +4176,7 @@
                     <pic:cNvPicPr/>
                   </pic:nvPicPr>
                   <pic:blipFill>
-                    <a:blip xmlns:r="http://schemas.openxmlformats.org/officeDocument/2006/relationships" r:embed="R16b8c26fe68340ef"/>
+                    <a:blip xmlns:r="http://schemas.openxmlformats.org/officeDocument/2006/relationships" r:embed="R2af652d4f6cf44cd"/>
                     <a:stretch>
                       <a:fillRect/>
                     </a:stretch>
@@ -4227,7 +4227,7 @@
                     <pic:cNvPicPr/>
                   </pic:nvPicPr>
                   <pic:blipFill>
-                    <a:blip xmlns:r="http://schemas.openxmlformats.org/officeDocument/2006/relationships" r:embed="R492f32eae506458f"/>
+                    <a:blip xmlns:r="http://schemas.openxmlformats.org/officeDocument/2006/relationships" r:embed="R97edf5c7058d4d04"/>
                     <a:stretch>
                       <a:fillRect/>
                     </a:stretch>
@@ -4278,7 +4278,7 @@
                     <pic:cNvPicPr/>
                   </pic:nvPicPr>
                   <pic:blipFill>
-                    <a:blip xmlns:r="http://schemas.openxmlformats.org/officeDocument/2006/relationships" r:embed="R6bd2df76d07841cf"/>
+                    <a:blip xmlns:r="http://schemas.openxmlformats.org/officeDocument/2006/relationships" r:embed="R31b6b266f5a44e14"/>
                     <a:stretch>
                       <a:fillRect/>
                     </a:stretch>
@@ -4657,7 +4657,7 @@
                     <pic:cNvPicPr/>
                   </pic:nvPicPr>
                   <pic:blipFill>
-                    <a:blip xmlns:r="http://schemas.openxmlformats.org/officeDocument/2006/relationships" r:embed="R3dc655a12143411d"/>
+                    <a:blip xmlns:r="http://schemas.openxmlformats.org/officeDocument/2006/relationships" r:embed="R1663ffc041ac4be3"/>
                     <a:stretch>
                       <a:fillRect/>
                     </a:stretch>
@@ -5338,7 +5338,7 @@
             <w:r>
               <w:t xml:space="preserve">Cell with </w:t>
             </w:r>
-            <w:hyperlink xmlns:r="http://schemas.openxmlformats.org/officeDocument/2006/relationships" w:history="true" r:id="R129695f5faaf41f2">
+            <w:hyperlink xmlns:r="http://schemas.openxmlformats.org/officeDocument/2006/relationships" w:history="true" r:id="Ra5e5036516124b76">
               <w:r>
                 <w:rPr>
                   <w:rStyle w:val="Hyperlink"/>
@@ -5624,7 +5624,7 @@
                           <pic:cNvPicPr/>
                         </pic:nvPicPr>
                         <pic:blipFill>
-                          <a:blip xmlns:r="http://schemas.openxmlformats.org/officeDocument/2006/relationships" r:embed="R0d2c2ecd55e44a6b"/>
+                          <a:blip xmlns:r="http://schemas.openxmlformats.org/officeDocument/2006/relationships" r:embed="R36f99a10d7eb4719"/>
                           <a:stretch>
                             <a:fillRect/>
                           </a:stretch>
@@ -5724,7 +5724,7 @@
                     <pic:cNvPicPr/>
                   </pic:nvPicPr>
                   <pic:blipFill>
-                    <a:blip xmlns:r="http://schemas.openxmlformats.org/officeDocument/2006/relationships" r:embed="R9905a29616b94441"/>
+                    <a:blip xmlns:r="http://schemas.openxmlformats.org/officeDocument/2006/relationships" r:embed="Rce3e37a887424d07"/>
                     <a:stretch>
                       <a:fillRect/>
                     </a:stretch>
@@ -5774,7 +5774,7 @@
                     <pic:cNvPicPr/>
                   </pic:nvPicPr>
                   <pic:blipFill>
-                    <a:blip xmlns:r="http://schemas.openxmlformats.org/officeDocument/2006/relationships" r:embed="R239a4c00e5764a9b"/>
+                    <a:blip xmlns:r="http://schemas.openxmlformats.org/officeDocument/2006/relationships" r:embed="Rc23569517b16411a"/>
                     <a:stretch>
                       <a:fillRect/>
                     </a:stretch>
@@ -5824,7 +5824,7 @@
                     <pic:cNvPicPr/>
                   </pic:nvPicPr>
                   <pic:blipFill>
-                    <a:blip xmlns:r="http://schemas.openxmlformats.org/officeDocument/2006/relationships" r:embed="R093173035026429c"/>
+                    <a:blip xmlns:r="http://schemas.openxmlformats.org/officeDocument/2006/relationships" r:embed="R1097100ae9bd44c1"/>
                     <a:stretch>
                       <a:fillRect/>
                     </a:stretch>

</xml_diff>

<commit_message>
fix(er): apply minimum straight segments only to matrix edges
Restore scenario-1 guided curveBasis routing and scope minimum straight exit/entry enforcement to matrix-style cardinality label edges only.

Made-with: Cursor
</commit_message>
<xml_diff>
--- a/test.docx
+++ b/test.docx
@@ -236,7 +236,7 @@
       <w:r>
         <w:t xml:space="preserve">, and </w:t>
       </w:r>
-      <w:hyperlink xmlns:r="http://schemas.openxmlformats.org/officeDocument/2006/relationships" w:history="true" r:id="R60e8ee571d4845b3">
+      <w:hyperlink xmlns:r="http://schemas.openxmlformats.org/officeDocument/2006/relationships" w:history="true" r:id="R7833c73791bb4592">
         <w:r>
           <w:rPr>
             <w:rStyle w:val="Hyperlink"/>
@@ -475,7 +475,7 @@
       <w:r>
         <w:t xml:space="preserve">Direct link: </w:t>
       </w:r>
-      <w:hyperlink xmlns:r="http://schemas.openxmlformats.org/officeDocument/2006/relationships" w:history="true" r:id="Rff544405ab29423e">
+      <w:hyperlink xmlns:r="http://schemas.openxmlformats.org/officeDocument/2006/relationships" w:history="true" r:id="R03e8f2f8d1484a91">
         <w:r>
           <w:rPr>
             <w:rStyle w:val="Hyperlink"/>
@@ -496,7 +496,7 @@
       <w:r>
         <w:t xml:space="preserve">Direct link with title: </w:t>
       </w:r>
-      <w:hyperlink xmlns:r="http://schemas.openxmlformats.org/officeDocument/2006/relationships" w:history="true" r:id="R56e0e90bf35a4d7c">
+      <w:hyperlink xmlns:r="http://schemas.openxmlformats.org/officeDocument/2006/relationships" w:history="true" r:id="R8f446b7932704aac">
         <w:r>
           <w:rPr>
             <w:rStyle w:val="Hyperlink"/>
@@ -517,7 +517,7 @@
       <w:r>
         <w:t xml:space="preserve">Reference-style link: </w:t>
       </w:r>
-      <w:hyperlink xmlns:r="http://schemas.openxmlformats.org/officeDocument/2006/relationships" w:history="true" r:id="Ra7a1805d12fd4703">
+      <w:hyperlink xmlns:r="http://schemas.openxmlformats.org/officeDocument/2006/relationships" w:history="true" r:id="Re148c8ee8fb04e46">
         <w:r>
           <w:rPr>
             <w:rStyle w:val="Hyperlink"/>
@@ -538,7 +538,7 @@
       <w:r>
         <w:t xml:space="preserve">Collapsed reference link: </w:t>
       </w:r>
-      <w:hyperlink xmlns:r="http://schemas.openxmlformats.org/officeDocument/2006/relationships" w:history="true" r:id="R7ee8bd57686049ff">
+      <w:hyperlink xmlns:r="http://schemas.openxmlformats.org/officeDocument/2006/relationships" w:history="true" r:id="R121d3569adca41c0">
         <w:r>
           <w:rPr>
             <w:rStyle w:val="Hyperlink"/>
@@ -559,7 +559,7 @@
       <w:r>
         <w:t xml:space="preserve">Repeated reference link: </w:t>
       </w:r>
-      <w:hyperlink xmlns:r="http://schemas.openxmlformats.org/officeDocument/2006/relationships" w:history="true" r:id="Reda0e342ee9e4b64">
+      <w:hyperlink xmlns:r="http://schemas.openxmlformats.org/officeDocument/2006/relationships" w:history="true" r:id="Rb690fe7fd71e4d8e">
         <w:r>
           <w:rPr>
             <w:rStyle w:val="Hyperlink"/>
@@ -580,7 +580,7 @@
       <w:r>
         <w:t xml:space="preserve">Autolink URL: </w:t>
       </w:r>
-      <w:hyperlink xmlns:r="http://schemas.openxmlformats.org/officeDocument/2006/relationships" w:history="true" r:id="R407408c4f8b64d13">
+      <w:hyperlink xmlns:r="http://schemas.openxmlformats.org/officeDocument/2006/relationships" w:history="true" r:id="Rb95b96871a09484f">
         <w:r>
           <w:rPr>
             <w:rStyle w:val="Hyperlink"/>
@@ -601,7 +601,7 @@
       <w:r>
         <w:t xml:space="preserve">Autolink email: </w:t>
       </w:r>
-      <w:hyperlink xmlns:r="http://schemas.openxmlformats.org/officeDocument/2006/relationships" w:history="true" r:id="Re5d40eb735174946">
+      <w:hyperlink xmlns:r="http://schemas.openxmlformats.org/officeDocument/2006/relationships" w:history="true" r:id="Rc0e67c3a5dc64471">
         <w:r>
           <w:rPr>
             <w:rStyle w:val="Hyperlink"/>
@@ -700,7 +700,7 @@
       <w:r>
         <w:t xml:space="preserve">, and </w:t>
       </w:r>
-      <w:hyperlink xmlns:r="http://schemas.openxmlformats.org/officeDocument/2006/relationships" w:history="true" r:id="Rfd473cde09ce482a">
+      <w:hyperlink xmlns:r="http://schemas.openxmlformats.org/officeDocument/2006/relationships" w:history="true" r:id="R077af0293b4e4edd">
         <w:r>
           <w:rPr>
             <w:rStyle w:val="Hyperlink"/>
@@ -1093,7 +1093,7 @@
       <w:r>
         <w:t xml:space="preserve">Continuation paragraph with </w:t>
       </w:r>
-      <w:hyperlink xmlns:r="http://schemas.openxmlformats.org/officeDocument/2006/relationships" w:history="true" r:id="Rd201612185ea4794">
+      <w:hyperlink xmlns:r="http://schemas.openxmlformats.org/officeDocument/2006/relationships" w:history="true" r:id="R6df2fdb9149b4d9a">
         <w:r>
           <w:rPr>
             <w:rStyle w:val="Hyperlink"/>
@@ -1591,7 +1591,7 @@
       <w:r>
         <w:t xml:space="preserve">, and </w:t>
       </w:r>
-      <w:hyperlink xmlns:r="http://schemas.openxmlformats.org/officeDocument/2006/relationships" w:history="true" r:id="Rf13c278bdf114df2">
+      <w:hyperlink xmlns:r="http://schemas.openxmlformats.org/officeDocument/2006/relationships" w:history="true" r:id="Rc5c120cb4db14502">
         <w:r>
           <w:rPr>
             <w:rStyle w:val="Hyperlink"/>
@@ -1979,7 +1979,7 @@
                     <pic:cNvPicPr/>
                   </pic:nvPicPr>
                   <pic:blipFill>
-                    <a:blip xmlns:r="http://schemas.openxmlformats.org/officeDocument/2006/relationships" r:embed="R36b4e0ae0c6347a8"/>
+                    <a:blip xmlns:r="http://schemas.openxmlformats.org/officeDocument/2006/relationships" r:embed="Rf07277b43b0940ed"/>
                     <a:stretch>
                       <a:fillRect/>
                     </a:stretch>
@@ -2039,7 +2039,7 @@
                     <pic:cNvPicPr/>
                   </pic:nvPicPr>
                   <pic:blipFill>
-                    <a:blip xmlns:r="http://schemas.openxmlformats.org/officeDocument/2006/relationships" r:embed="R1f987e5656534c66"/>
+                    <a:blip xmlns:r="http://schemas.openxmlformats.org/officeDocument/2006/relationships" r:embed="R3971f77d5ab34ba5"/>
                     <a:stretch>
                       <a:fillRect/>
                     </a:stretch>
@@ -2099,7 +2099,7 @@
                     <pic:cNvPicPr/>
                   </pic:nvPicPr>
                   <pic:blipFill>
-                    <a:blip xmlns:r="http://schemas.openxmlformats.org/officeDocument/2006/relationships" r:embed="R7ad9b71507144440"/>
+                    <a:blip xmlns:r="http://schemas.openxmlformats.org/officeDocument/2006/relationships" r:embed="R6f540322791240ba"/>
                     <a:stretch>
                       <a:fillRect/>
                     </a:stretch>
@@ -2150,7 +2150,7 @@
                     <pic:cNvPicPr/>
                   </pic:nvPicPr>
                   <pic:blipFill>
-                    <a:blip xmlns:r="http://schemas.openxmlformats.org/officeDocument/2006/relationships" r:embed="R6f7508de7579446c"/>
+                    <a:blip xmlns:r="http://schemas.openxmlformats.org/officeDocument/2006/relationships" r:embed="R495fc125dc64443f"/>
                     <a:stretch>
                       <a:fillRect/>
                     </a:stretch>
@@ -2201,7 +2201,7 @@
                     <pic:cNvPicPr/>
                   </pic:nvPicPr>
                   <pic:blipFill>
-                    <a:blip xmlns:r="http://schemas.openxmlformats.org/officeDocument/2006/relationships" r:embed="R272925527beb4f31"/>
+                    <a:blip xmlns:r="http://schemas.openxmlformats.org/officeDocument/2006/relationships" r:embed="R45a9b3d91df7452a"/>
                     <a:stretch>
                       <a:fillRect/>
                     </a:stretch>
@@ -2252,7 +2252,7 @@
                     <pic:cNvPicPr/>
                   </pic:nvPicPr>
                   <pic:blipFill>
-                    <a:blip xmlns:r="http://schemas.openxmlformats.org/officeDocument/2006/relationships" r:embed="R9e39130caca44c77"/>
+                    <a:blip xmlns:r="http://schemas.openxmlformats.org/officeDocument/2006/relationships" r:embed="R18dfbff8b4304e43"/>
                     <a:stretch>
                       <a:fillRect/>
                     </a:stretch>
@@ -2303,7 +2303,7 @@
                     <pic:cNvPicPr/>
                   </pic:nvPicPr>
                   <pic:blipFill>
-                    <a:blip xmlns:r="http://schemas.openxmlformats.org/officeDocument/2006/relationships" r:embed="R977cddacdec44fa4"/>
+                    <a:blip xmlns:r="http://schemas.openxmlformats.org/officeDocument/2006/relationships" r:embed="R103a0bbc840f49d2"/>
                     <a:stretch>
                       <a:fillRect/>
                     </a:stretch>
@@ -2354,7 +2354,7 @@
                     <pic:cNvPicPr/>
                   </pic:nvPicPr>
                   <pic:blipFill>
-                    <a:blip xmlns:r="http://schemas.openxmlformats.org/officeDocument/2006/relationships" r:embed="R4c5c6a395e684c64"/>
+                    <a:blip xmlns:r="http://schemas.openxmlformats.org/officeDocument/2006/relationships" r:embed="R0a6b33ba72304d40"/>
                     <a:stretch>
                       <a:fillRect/>
                     </a:stretch>
@@ -2430,7 +2430,7 @@
                     <pic:cNvPicPr/>
                   </pic:nvPicPr>
                   <pic:blipFill>
-                    <a:blip xmlns:r="http://schemas.openxmlformats.org/officeDocument/2006/relationships" r:embed="R5d1a652caa304642"/>
+                    <a:blip xmlns:r="http://schemas.openxmlformats.org/officeDocument/2006/relationships" r:embed="R5b3bbd98a030484e"/>
                     <a:stretch>
                       <a:fillRect/>
                     </a:stretch>
@@ -2481,7 +2481,7 @@
                     <pic:cNvPicPr/>
                   </pic:nvPicPr>
                   <pic:blipFill>
-                    <a:blip xmlns:r="http://schemas.openxmlformats.org/officeDocument/2006/relationships" r:embed="R729adedca0e6471f"/>
+                    <a:blip xmlns:r="http://schemas.openxmlformats.org/officeDocument/2006/relationships" r:embed="R8f8207bed97c43e9"/>
                     <a:stretch>
                       <a:fillRect/>
                     </a:stretch>
@@ -2532,7 +2532,7 @@
                     <pic:cNvPicPr/>
                   </pic:nvPicPr>
                   <pic:blipFill>
-                    <a:blip xmlns:r="http://schemas.openxmlformats.org/officeDocument/2006/relationships" r:embed="R90ad287e130c4627"/>
+                    <a:blip xmlns:r="http://schemas.openxmlformats.org/officeDocument/2006/relationships" r:embed="R828b406d18a84fff"/>
                     <a:stretch>
                       <a:fillRect/>
                     </a:stretch>
@@ -2583,7 +2583,7 @@
                     <pic:cNvPicPr/>
                   </pic:nvPicPr>
                   <pic:blipFill>
-                    <a:blip xmlns:r="http://schemas.openxmlformats.org/officeDocument/2006/relationships" r:embed="R6ee12c9dab014484"/>
+                    <a:blip xmlns:r="http://schemas.openxmlformats.org/officeDocument/2006/relationships" r:embed="R14205b8d75774a02"/>
                     <a:stretch>
                       <a:fillRect/>
                     </a:stretch>
@@ -2659,7 +2659,7 @@
                     <pic:cNvPicPr/>
                   </pic:nvPicPr>
                   <pic:blipFill>
-                    <a:blip xmlns:r="http://schemas.openxmlformats.org/officeDocument/2006/relationships" r:embed="Rb672e441bea44a6f"/>
+                    <a:blip xmlns:r="http://schemas.openxmlformats.org/officeDocument/2006/relationships" r:embed="R4154d70de2ca4d14"/>
                     <a:stretch>
                       <a:fillRect/>
                     </a:stretch>
@@ -2710,7 +2710,7 @@
                     <pic:cNvPicPr/>
                   </pic:nvPicPr>
                   <pic:blipFill>
-                    <a:blip xmlns:r="http://schemas.openxmlformats.org/officeDocument/2006/relationships" r:embed="R1daa33af50414a63"/>
+                    <a:blip xmlns:r="http://schemas.openxmlformats.org/officeDocument/2006/relationships" r:embed="Rfff3cd42e5e4442c"/>
                     <a:stretch>
                       <a:fillRect/>
                     </a:stretch>
@@ -2761,7 +2761,7 @@
                     <pic:cNvPicPr/>
                   </pic:nvPicPr>
                   <pic:blipFill>
-                    <a:blip xmlns:r="http://schemas.openxmlformats.org/officeDocument/2006/relationships" r:embed="Rd5cd6d29a30f45a8"/>
+                    <a:blip xmlns:r="http://schemas.openxmlformats.org/officeDocument/2006/relationships" r:embed="R9985597f2cda40f5"/>
                     <a:stretch>
                       <a:fillRect/>
                     </a:stretch>
@@ -2812,7 +2812,7 @@
                     <pic:cNvPicPr/>
                   </pic:nvPicPr>
                   <pic:blipFill>
-                    <a:blip xmlns:r="http://schemas.openxmlformats.org/officeDocument/2006/relationships" r:embed="R2a4ffaf747d940ef"/>
+                    <a:blip xmlns:r="http://schemas.openxmlformats.org/officeDocument/2006/relationships" r:embed="Rb0adbd9c179a4694"/>
                     <a:stretch>
                       <a:fillRect/>
                     </a:stretch>
@@ -2863,7 +2863,7 @@
                     <pic:cNvPicPr/>
                   </pic:nvPicPr>
                   <pic:blipFill>
-                    <a:blip xmlns:r="http://schemas.openxmlformats.org/officeDocument/2006/relationships" r:embed="Rf00a954c9b8642ea"/>
+                    <a:blip xmlns:r="http://schemas.openxmlformats.org/officeDocument/2006/relationships" r:embed="R2f99024c22ab4570"/>
                     <a:stretch>
                       <a:fillRect/>
                     </a:stretch>
@@ -2914,7 +2914,7 @@
                     <pic:cNvPicPr/>
                   </pic:nvPicPr>
                   <pic:blipFill>
-                    <a:blip xmlns:r="http://schemas.openxmlformats.org/officeDocument/2006/relationships" r:embed="R7bc6ec842fc445c1"/>
+                    <a:blip xmlns:r="http://schemas.openxmlformats.org/officeDocument/2006/relationships" r:embed="R22d452ea1ead450c"/>
                     <a:stretch>
                       <a:fillRect/>
                     </a:stretch>
@@ -2965,7 +2965,7 @@
                     <pic:cNvPicPr/>
                   </pic:nvPicPr>
                   <pic:blipFill>
-                    <a:blip xmlns:r="http://schemas.openxmlformats.org/officeDocument/2006/relationships" r:embed="Rb8c25d9dd61946bc"/>
+                    <a:blip xmlns:r="http://schemas.openxmlformats.org/officeDocument/2006/relationships" r:embed="R3ef84364eda44792"/>
                     <a:stretch>
                       <a:fillRect/>
                     </a:stretch>
@@ -3016,7 +3016,7 @@
                     <pic:cNvPicPr/>
                   </pic:nvPicPr>
                   <pic:blipFill>
-                    <a:blip xmlns:r="http://schemas.openxmlformats.org/officeDocument/2006/relationships" r:embed="Rb0c6ce3f3caf44cb"/>
+                    <a:blip xmlns:r="http://schemas.openxmlformats.org/officeDocument/2006/relationships" r:embed="R70b428f8d0144e8b"/>
                     <a:stretch>
                       <a:fillRect/>
                     </a:stretch>
@@ -3067,7 +3067,7 @@
                     <pic:cNvPicPr/>
                   </pic:nvPicPr>
                   <pic:blipFill>
-                    <a:blip xmlns:r="http://schemas.openxmlformats.org/officeDocument/2006/relationships" r:embed="R8cfd714f0ebc448f"/>
+                    <a:blip xmlns:r="http://schemas.openxmlformats.org/officeDocument/2006/relationships" r:embed="R9c7bdaee53ed4e41"/>
                     <a:stretch>
                       <a:fillRect/>
                     </a:stretch>
@@ -3118,7 +3118,7 @@
                     <pic:cNvPicPr/>
                   </pic:nvPicPr>
                   <pic:blipFill>
-                    <a:blip xmlns:r="http://schemas.openxmlformats.org/officeDocument/2006/relationships" r:embed="Rae8bbf29b3c14147"/>
+                    <a:blip xmlns:r="http://schemas.openxmlformats.org/officeDocument/2006/relationships" r:embed="Rcb7aa7953848472e"/>
                     <a:stretch>
                       <a:fillRect/>
                     </a:stretch>
@@ -3169,7 +3169,7 @@
                     <pic:cNvPicPr/>
                   </pic:nvPicPr>
                   <pic:blipFill>
-                    <a:blip xmlns:r="http://schemas.openxmlformats.org/officeDocument/2006/relationships" r:embed="Ra70439b3b5c14c20"/>
+                    <a:blip xmlns:r="http://schemas.openxmlformats.org/officeDocument/2006/relationships" r:embed="Rf8c9e96c3e464500"/>
                     <a:stretch>
                       <a:fillRect/>
                     </a:stretch>
@@ -3220,7 +3220,7 @@
                     <pic:cNvPicPr/>
                   </pic:nvPicPr>
                   <pic:blipFill>
-                    <a:blip xmlns:r="http://schemas.openxmlformats.org/officeDocument/2006/relationships" r:embed="R0fdff181a2ba4dba"/>
+                    <a:blip xmlns:r="http://schemas.openxmlformats.org/officeDocument/2006/relationships" r:embed="Raaebf25f9e7e441a"/>
                     <a:stretch>
                       <a:fillRect/>
                     </a:stretch>
@@ -3271,7 +3271,7 @@
                     <pic:cNvPicPr/>
                   </pic:nvPicPr>
                   <pic:blipFill>
-                    <a:blip xmlns:r="http://schemas.openxmlformats.org/officeDocument/2006/relationships" r:embed="R91723f9094be42dc"/>
+                    <a:blip xmlns:r="http://schemas.openxmlformats.org/officeDocument/2006/relationships" r:embed="R3ef8bf46025e487a"/>
                     <a:stretch>
                       <a:fillRect/>
                     </a:stretch>
@@ -3322,7 +3322,7 @@
                     <pic:cNvPicPr/>
                   </pic:nvPicPr>
                   <pic:blipFill>
-                    <a:blip xmlns:r="http://schemas.openxmlformats.org/officeDocument/2006/relationships" r:embed="R64c91e7ca7574254"/>
+                    <a:blip xmlns:r="http://schemas.openxmlformats.org/officeDocument/2006/relationships" r:embed="R1f9c018c82454e4e"/>
                     <a:stretch>
                       <a:fillRect/>
                     </a:stretch>
@@ -3419,7 +3419,7 @@
                     <pic:cNvPicPr/>
                   </pic:nvPicPr>
                   <pic:blipFill>
-                    <a:blip xmlns:r="http://schemas.openxmlformats.org/officeDocument/2006/relationships" r:embed="R8e0dba7c195343d6"/>
+                    <a:blip xmlns:r="http://schemas.openxmlformats.org/officeDocument/2006/relationships" r:embed="Radf923eeb7434b2c"/>
                     <a:stretch>
                       <a:fillRect/>
                     </a:stretch>
@@ -3462,7 +3462,7 @@
                     <pic:cNvPicPr/>
                   </pic:nvPicPr>
                   <pic:blipFill>
-                    <a:blip xmlns:r="http://schemas.openxmlformats.org/officeDocument/2006/relationships" r:embed="Rf5cbdf1efbd74890"/>
+                    <a:blip xmlns:r="http://schemas.openxmlformats.org/officeDocument/2006/relationships" r:embed="R538d53d5c9e3463b"/>
                     <a:stretch>
                       <a:fillRect/>
                     </a:stretch>
@@ -3505,7 +3505,7 @@
                     <pic:cNvPicPr/>
                   </pic:nvPicPr>
                   <pic:blipFill>
-                    <a:blip xmlns:r="http://schemas.openxmlformats.org/officeDocument/2006/relationships" r:embed="R00ad3e0cc93c40e0"/>
+                    <a:blip xmlns:r="http://schemas.openxmlformats.org/officeDocument/2006/relationships" r:embed="R8bd84e8888ee4c9b"/>
                     <a:stretch>
                       <a:fillRect/>
                     </a:stretch>
@@ -3548,7 +3548,7 @@
                     <pic:cNvPicPr/>
                   </pic:nvPicPr>
                   <pic:blipFill>
-                    <a:blip xmlns:r="http://schemas.openxmlformats.org/officeDocument/2006/relationships" r:embed="R14ace09ec5104181"/>
+                    <a:blip xmlns:r="http://schemas.openxmlformats.org/officeDocument/2006/relationships" r:embed="R829f6c02740843ef"/>
                     <a:stretch>
                       <a:fillRect/>
                     </a:stretch>
@@ -3933,7 +3933,7 @@
                     <pic:cNvPicPr/>
                   </pic:nvPicPr>
                   <pic:blipFill>
-                    <a:blip xmlns:r="http://schemas.openxmlformats.org/officeDocument/2006/relationships" r:embed="R93badf3c3c504587"/>
+                    <a:blip xmlns:r="http://schemas.openxmlformats.org/officeDocument/2006/relationships" r:embed="Rb286939936614c7a"/>
                     <a:stretch>
                       <a:fillRect/>
                     </a:stretch>
@@ -4125,7 +4125,7 @@
                     <pic:cNvPicPr/>
                   </pic:nvPicPr>
                   <pic:blipFill>
-                    <a:blip xmlns:r="http://schemas.openxmlformats.org/officeDocument/2006/relationships" r:embed="Reeb49a14b19f42ba"/>
+                    <a:blip xmlns:r="http://schemas.openxmlformats.org/officeDocument/2006/relationships" r:embed="R5d7b9d36ec904dc9"/>
                     <a:stretch>
                       <a:fillRect/>
                     </a:stretch>
@@ -4176,7 +4176,7 @@
                     <pic:cNvPicPr/>
                   </pic:nvPicPr>
                   <pic:blipFill>
-                    <a:blip xmlns:r="http://schemas.openxmlformats.org/officeDocument/2006/relationships" r:embed="R2af652d4f6cf44cd"/>
+                    <a:blip xmlns:r="http://schemas.openxmlformats.org/officeDocument/2006/relationships" r:embed="R903dd9e7d143492f"/>
                     <a:stretch>
                       <a:fillRect/>
                     </a:stretch>
@@ -4227,7 +4227,7 @@
                     <pic:cNvPicPr/>
                   </pic:nvPicPr>
                   <pic:blipFill>
-                    <a:blip xmlns:r="http://schemas.openxmlformats.org/officeDocument/2006/relationships" r:embed="R97edf5c7058d4d04"/>
+                    <a:blip xmlns:r="http://schemas.openxmlformats.org/officeDocument/2006/relationships" r:embed="Reb103d9650df4913"/>
                     <a:stretch>
                       <a:fillRect/>
                     </a:stretch>
@@ -4278,7 +4278,7 @@
                     <pic:cNvPicPr/>
                   </pic:nvPicPr>
                   <pic:blipFill>
-                    <a:blip xmlns:r="http://schemas.openxmlformats.org/officeDocument/2006/relationships" r:embed="R31b6b266f5a44e14"/>
+                    <a:blip xmlns:r="http://schemas.openxmlformats.org/officeDocument/2006/relationships" r:embed="R55fef0ff354742f9"/>
                     <a:stretch>
                       <a:fillRect/>
                     </a:stretch>
@@ -4657,7 +4657,7 @@
                     <pic:cNvPicPr/>
                   </pic:nvPicPr>
                   <pic:blipFill>
-                    <a:blip xmlns:r="http://schemas.openxmlformats.org/officeDocument/2006/relationships" r:embed="R1663ffc041ac4be3"/>
+                    <a:blip xmlns:r="http://schemas.openxmlformats.org/officeDocument/2006/relationships" r:embed="R7d20bb53079e4bcf"/>
                     <a:stretch>
                       <a:fillRect/>
                     </a:stretch>
@@ -5338,7 +5338,7 @@
             <w:r>
               <w:t xml:space="preserve">Cell with </w:t>
             </w:r>
-            <w:hyperlink xmlns:r="http://schemas.openxmlformats.org/officeDocument/2006/relationships" w:history="true" r:id="Ra5e5036516124b76">
+            <w:hyperlink xmlns:r="http://schemas.openxmlformats.org/officeDocument/2006/relationships" w:history="true" r:id="R733074cc17f8465b">
               <w:r>
                 <w:rPr>
                   <w:rStyle w:val="Hyperlink"/>
@@ -5624,7 +5624,7 @@
                           <pic:cNvPicPr/>
                         </pic:nvPicPr>
                         <pic:blipFill>
-                          <a:blip xmlns:r="http://schemas.openxmlformats.org/officeDocument/2006/relationships" r:embed="R36f99a10d7eb4719"/>
+                          <a:blip xmlns:r="http://schemas.openxmlformats.org/officeDocument/2006/relationships" r:embed="Raa6d9f2d6a99468f"/>
                           <a:stretch>
                             <a:fillRect/>
                           </a:stretch>
@@ -5724,7 +5724,7 @@
                     <pic:cNvPicPr/>
                   </pic:nvPicPr>
                   <pic:blipFill>
-                    <a:blip xmlns:r="http://schemas.openxmlformats.org/officeDocument/2006/relationships" r:embed="Rce3e37a887424d07"/>
+                    <a:blip xmlns:r="http://schemas.openxmlformats.org/officeDocument/2006/relationships" r:embed="R7dd42ae9bb4f4847"/>
                     <a:stretch>
                       <a:fillRect/>
                     </a:stretch>
@@ -5774,7 +5774,7 @@
                     <pic:cNvPicPr/>
                   </pic:nvPicPr>
                   <pic:blipFill>
-                    <a:blip xmlns:r="http://schemas.openxmlformats.org/officeDocument/2006/relationships" r:embed="Rc23569517b16411a"/>
+                    <a:blip xmlns:r="http://schemas.openxmlformats.org/officeDocument/2006/relationships" r:embed="R772ffff6b3e14a41"/>
                     <a:stretch>
                       <a:fillRect/>
                     </a:stretch>
@@ -5824,7 +5824,7 @@
                     <pic:cNvPicPr/>
                   </pic:nvPicPr>
                   <pic:blipFill>
-                    <a:blip xmlns:r="http://schemas.openxmlformats.org/officeDocument/2006/relationships" r:embed="R1097100ae9bd44c1"/>
+                    <a:blip xmlns:r="http://schemas.openxmlformats.org/officeDocument/2006/relationships" r:embed="R36cfd91102614fbc"/>
                     <a:stretch>
                       <a:fillRect/>
                     </a:stretch>

</xml_diff>

<commit_message>
fix(er): use curveBasis for vertical relationships
Match Mermaid’s ER renderer by emitting curveBasis path structure even for perfectly vertical ER relationships (scenario 1), rather than simplifying to a straight line.

Made-with: Cursor
</commit_message>
<xml_diff>
--- a/test.docx
+++ b/test.docx
@@ -236,7 +236,7 @@
       <w:r>
         <w:t xml:space="preserve">, and </w:t>
       </w:r>
-      <w:hyperlink xmlns:r="http://schemas.openxmlformats.org/officeDocument/2006/relationships" w:history="true" r:id="R7833c73791bb4592">
+      <w:hyperlink xmlns:r="http://schemas.openxmlformats.org/officeDocument/2006/relationships" w:history="true" r:id="R3d08f1a039224a0f">
         <w:r>
           <w:rPr>
             <w:rStyle w:val="Hyperlink"/>
@@ -475,7 +475,7 @@
       <w:r>
         <w:t xml:space="preserve">Direct link: </w:t>
       </w:r>
-      <w:hyperlink xmlns:r="http://schemas.openxmlformats.org/officeDocument/2006/relationships" w:history="true" r:id="R03e8f2f8d1484a91">
+      <w:hyperlink xmlns:r="http://schemas.openxmlformats.org/officeDocument/2006/relationships" w:history="true" r:id="R4f932d3286f84318">
         <w:r>
           <w:rPr>
             <w:rStyle w:val="Hyperlink"/>
@@ -496,7 +496,7 @@
       <w:r>
         <w:t xml:space="preserve">Direct link with title: </w:t>
       </w:r>
-      <w:hyperlink xmlns:r="http://schemas.openxmlformats.org/officeDocument/2006/relationships" w:history="true" r:id="R8f446b7932704aac">
+      <w:hyperlink xmlns:r="http://schemas.openxmlformats.org/officeDocument/2006/relationships" w:history="true" r:id="Rc2773b775d7a4621">
         <w:r>
           <w:rPr>
             <w:rStyle w:val="Hyperlink"/>
@@ -517,7 +517,7 @@
       <w:r>
         <w:t xml:space="preserve">Reference-style link: </w:t>
       </w:r>
-      <w:hyperlink xmlns:r="http://schemas.openxmlformats.org/officeDocument/2006/relationships" w:history="true" r:id="Re148c8ee8fb04e46">
+      <w:hyperlink xmlns:r="http://schemas.openxmlformats.org/officeDocument/2006/relationships" w:history="true" r:id="R83db5037f154462a">
         <w:r>
           <w:rPr>
             <w:rStyle w:val="Hyperlink"/>
@@ -538,7 +538,7 @@
       <w:r>
         <w:t xml:space="preserve">Collapsed reference link: </w:t>
       </w:r>
-      <w:hyperlink xmlns:r="http://schemas.openxmlformats.org/officeDocument/2006/relationships" w:history="true" r:id="R121d3569adca41c0">
+      <w:hyperlink xmlns:r="http://schemas.openxmlformats.org/officeDocument/2006/relationships" w:history="true" r:id="R39fc4e314205482e">
         <w:r>
           <w:rPr>
             <w:rStyle w:val="Hyperlink"/>
@@ -559,7 +559,7 @@
       <w:r>
         <w:t xml:space="preserve">Repeated reference link: </w:t>
       </w:r>
-      <w:hyperlink xmlns:r="http://schemas.openxmlformats.org/officeDocument/2006/relationships" w:history="true" r:id="Rb690fe7fd71e4d8e">
+      <w:hyperlink xmlns:r="http://schemas.openxmlformats.org/officeDocument/2006/relationships" w:history="true" r:id="Rcc0e7e80ba1a4225">
         <w:r>
           <w:rPr>
             <w:rStyle w:val="Hyperlink"/>
@@ -580,7 +580,7 @@
       <w:r>
         <w:t xml:space="preserve">Autolink URL: </w:t>
       </w:r>
-      <w:hyperlink xmlns:r="http://schemas.openxmlformats.org/officeDocument/2006/relationships" w:history="true" r:id="Rb95b96871a09484f">
+      <w:hyperlink xmlns:r="http://schemas.openxmlformats.org/officeDocument/2006/relationships" w:history="true" r:id="Rb30888093d8f4307">
         <w:r>
           <w:rPr>
             <w:rStyle w:val="Hyperlink"/>
@@ -601,7 +601,7 @@
       <w:r>
         <w:t xml:space="preserve">Autolink email: </w:t>
       </w:r>
-      <w:hyperlink xmlns:r="http://schemas.openxmlformats.org/officeDocument/2006/relationships" w:history="true" r:id="Rc0e67c3a5dc64471">
+      <w:hyperlink xmlns:r="http://schemas.openxmlformats.org/officeDocument/2006/relationships" w:history="true" r:id="Rf8eac17d610a4a6b">
         <w:r>
           <w:rPr>
             <w:rStyle w:val="Hyperlink"/>
@@ -700,7 +700,7 @@
       <w:r>
         <w:t xml:space="preserve">, and </w:t>
       </w:r>
-      <w:hyperlink xmlns:r="http://schemas.openxmlformats.org/officeDocument/2006/relationships" w:history="true" r:id="R077af0293b4e4edd">
+      <w:hyperlink xmlns:r="http://schemas.openxmlformats.org/officeDocument/2006/relationships" w:history="true" r:id="R8648e73dd1a54ac2">
         <w:r>
           <w:rPr>
             <w:rStyle w:val="Hyperlink"/>
@@ -1093,7 +1093,7 @@
       <w:r>
         <w:t xml:space="preserve">Continuation paragraph with </w:t>
       </w:r>
-      <w:hyperlink xmlns:r="http://schemas.openxmlformats.org/officeDocument/2006/relationships" w:history="true" r:id="R6df2fdb9149b4d9a">
+      <w:hyperlink xmlns:r="http://schemas.openxmlformats.org/officeDocument/2006/relationships" w:history="true" r:id="R1a4ac129797f4cf3">
         <w:r>
           <w:rPr>
             <w:rStyle w:val="Hyperlink"/>
@@ -1591,7 +1591,7 @@
       <w:r>
         <w:t xml:space="preserve">, and </w:t>
       </w:r>
-      <w:hyperlink xmlns:r="http://schemas.openxmlformats.org/officeDocument/2006/relationships" w:history="true" r:id="Rc5c120cb4db14502">
+      <w:hyperlink xmlns:r="http://schemas.openxmlformats.org/officeDocument/2006/relationships" w:history="true" r:id="Rc6a8913e63da4d20">
         <w:r>
           <w:rPr>
             <w:rStyle w:val="Hyperlink"/>
@@ -1979,7 +1979,7 @@
                     <pic:cNvPicPr/>
                   </pic:nvPicPr>
                   <pic:blipFill>
-                    <a:blip xmlns:r="http://schemas.openxmlformats.org/officeDocument/2006/relationships" r:embed="Rf07277b43b0940ed"/>
+                    <a:blip xmlns:r="http://schemas.openxmlformats.org/officeDocument/2006/relationships" r:embed="Rc1579a2acb0b43de"/>
                     <a:stretch>
                       <a:fillRect/>
                     </a:stretch>
@@ -2039,7 +2039,7 @@
                     <pic:cNvPicPr/>
                   </pic:nvPicPr>
                   <pic:blipFill>
-                    <a:blip xmlns:r="http://schemas.openxmlformats.org/officeDocument/2006/relationships" r:embed="R3971f77d5ab34ba5"/>
+                    <a:blip xmlns:r="http://schemas.openxmlformats.org/officeDocument/2006/relationships" r:embed="R9be9de2094ad4ed8"/>
                     <a:stretch>
                       <a:fillRect/>
                     </a:stretch>
@@ -2099,7 +2099,7 @@
                     <pic:cNvPicPr/>
                   </pic:nvPicPr>
                   <pic:blipFill>
-                    <a:blip xmlns:r="http://schemas.openxmlformats.org/officeDocument/2006/relationships" r:embed="R6f540322791240ba"/>
+                    <a:blip xmlns:r="http://schemas.openxmlformats.org/officeDocument/2006/relationships" r:embed="R6ab0f2b0d913404f"/>
                     <a:stretch>
                       <a:fillRect/>
                     </a:stretch>
@@ -2150,7 +2150,7 @@
                     <pic:cNvPicPr/>
                   </pic:nvPicPr>
                   <pic:blipFill>
-                    <a:blip xmlns:r="http://schemas.openxmlformats.org/officeDocument/2006/relationships" r:embed="R495fc125dc64443f"/>
+                    <a:blip xmlns:r="http://schemas.openxmlformats.org/officeDocument/2006/relationships" r:embed="Rb8edf4d74b434309"/>
                     <a:stretch>
                       <a:fillRect/>
                     </a:stretch>
@@ -2201,7 +2201,7 @@
                     <pic:cNvPicPr/>
                   </pic:nvPicPr>
                   <pic:blipFill>
-                    <a:blip xmlns:r="http://schemas.openxmlformats.org/officeDocument/2006/relationships" r:embed="R45a9b3d91df7452a"/>
+                    <a:blip xmlns:r="http://schemas.openxmlformats.org/officeDocument/2006/relationships" r:embed="R3c6f4531475747c3"/>
                     <a:stretch>
                       <a:fillRect/>
                     </a:stretch>
@@ -2252,7 +2252,7 @@
                     <pic:cNvPicPr/>
                   </pic:nvPicPr>
                   <pic:blipFill>
-                    <a:blip xmlns:r="http://schemas.openxmlformats.org/officeDocument/2006/relationships" r:embed="R18dfbff8b4304e43"/>
+                    <a:blip xmlns:r="http://schemas.openxmlformats.org/officeDocument/2006/relationships" r:embed="R300e1860a1e34d09"/>
                     <a:stretch>
                       <a:fillRect/>
                     </a:stretch>
@@ -2303,7 +2303,7 @@
                     <pic:cNvPicPr/>
                   </pic:nvPicPr>
                   <pic:blipFill>
-                    <a:blip xmlns:r="http://schemas.openxmlformats.org/officeDocument/2006/relationships" r:embed="R103a0bbc840f49d2"/>
+                    <a:blip xmlns:r="http://schemas.openxmlformats.org/officeDocument/2006/relationships" r:embed="R4d2cde7330da41b2"/>
                     <a:stretch>
                       <a:fillRect/>
                     </a:stretch>
@@ -2354,7 +2354,7 @@
                     <pic:cNvPicPr/>
                   </pic:nvPicPr>
                   <pic:blipFill>
-                    <a:blip xmlns:r="http://schemas.openxmlformats.org/officeDocument/2006/relationships" r:embed="R0a6b33ba72304d40"/>
+                    <a:blip xmlns:r="http://schemas.openxmlformats.org/officeDocument/2006/relationships" r:embed="Rc320cda32a55406d"/>
                     <a:stretch>
                       <a:fillRect/>
                     </a:stretch>
@@ -2430,7 +2430,7 @@
                     <pic:cNvPicPr/>
                   </pic:nvPicPr>
                   <pic:blipFill>
-                    <a:blip xmlns:r="http://schemas.openxmlformats.org/officeDocument/2006/relationships" r:embed="R5b3bbd98a030484e"/>
+                    <a:blip xmlns:r="http://schemas.openxmlformats.org/officeDocument/2006/relationships" r:embed="R3c791ba617c84337"/>
                     <a:stretch>
                       <a:fillRect/>
                     </a:stretch>
@@ -2481,7 +2481,7 @@
                     <pic:cNvPicPr/>
                   </pic:nvPicPr>
                   <pic:blipFill>
-                    <a:blip xmlns:r="http://schemas.openxmlformats.org/officeDocument/2006/relationships" r:embed="R8f8207bed97c43e9"/>
+                    <a:blip xmlns:r="http://schemas.openxmlformats.org/officeDocument/2006/relationships" r:embed="R08593be4df6e495a"/>
                     <a:stretch>
                       <a:fillRect/>
                     </a:stretch>
@@ -2532,7 +2532,7 @@
                     <pic:cNvPicPr/>
                   </pic:nvPicPr>
                   <pic:blipFill>
-                    <a:blip xmlns:r="http://schemas.openxmlformats.org/officeDocument/2006/relationships" r:embed="R828b406d18a84fff"/>
+                    <a:blip xmlns:r="http://schemas.openxmlformats.org/officeDocument/2006/relationships" r:embed="R8bfe8f2ba9ed4414"/>
                     <a:stretch>
                       <a:fillRect/>
                     </a:stretch>
@@ -2583,7 +2583,7 @@
                     <pic:cNvPicPr/>
                   </pic:nvPicPr>
                   <pic:blipFill>
-                    <a:blip xmlns:r="http://schemas.openxmlformats.org/officeDocument/2006/relationships" r:embed="R14205b8d75774a02"/>
+                    <a:blip xmlns:r="http://schemas.openxmlformats.org/officeDocument/2006/relationships" r:embed="Rb89fdd0972374956"/>
                     <a:stretch>
                       <a:fillRect/>
                     </a:stretch>
@@ -2659,7 +2659,7 @@
                     <pic:cNvPicPr/>
                   </pic:nvPicPr>
                   <pic:blipFill>
-                    <a:blip xmlns:r="http://schemas.openxmlformats.org/officeDocument/2006/relationships" r:embed="R4154d70de2ca4d14"/>
+                    <a:blip xmlns:r="http://schemas.openxmlformats.org/officeDocument/2006/relationships" r:embed="Rb89d4e161674462a"/>
                     <a:stretch>
                       <a:fillRect/>
                     </a:stretch>
@@ -2710,7 +2710,7 @@
                     <pic:cNvPicPr/>
                   </pic:nvPicPr>
                   <pic:blipFill>
-                    <a:blip xmlns:r="http://schemas.openxmlformats.org/officeDocument/2006/relationships" r:embed="Rfff3cd42e5e4442c"/>
+                    <a:blip xmlns:r="http://schemas.openxmlformats.org/officeDocument/2006/relationships" r:embed="Rad17ffd9cde24ef5"/>
                     <a:stretch>
                       <a:fillRect/>
                     </a:stretch>
@@ -2761,7 +2761,7 @@
                     <pic:cNvPicPr/>
                   </pic:nvPicPr>
                   <pic:blipFill>
-                    <a:blip xmlns:r="http://schemas.openxmlformats.org/officeDocument/2006/relationships" r:embed="R9985597f2cda40f5"/>
+                    <a:blip xmlns:r="http://schemas.openxmlformats.org/officeDocument/2006/relationships" r:embed="R15e0333151d3423c"/>
                     <a:stretch>
                       <a:fillRect/>
                     </a:stretch>
@@ -2812,7 +2812,7 @@
                     <pic:cNvPicPr/>
                   </pic:nvPicPr>
                   <pic:blipFill>
-                    <a:blip xmlns:r="http://schemas.openxmlformats.org/officeDocument/2006/relationships" r:embed="Rb0adbd9c179a4694"/>
+                    <a:blip xmlns:r="http://schemas.openxmlformats.org/officeDocument/2006/relationships" r:embed="R845766db21994606"/>
                     <a:stretch>
                       <a:fillRect/>
                     </a:stretch>
@@ -2863,7 +2863,7 @@
                     <pic:cNvPicPr/>
                   </pic:nvPicPr>
                   <pic:blipFill>
-                    <a:blip xmlns:r="http://schemas.openxmlformats.org/officeDocument/2006/relationships" r:embed="R2f99024c22ab4570"/>
+                    <a:blip xmlns:r="http://schemas.openxmlformats.org/officeDocument/2006/relationships" r:embed="Rb2b55d7a70ae4163"/>
                     <a:stretch>
                       <a:fillRect/>
                     </a:stretch>
@@ -2914,7 +2914,7 @@
                     <pic:cNvPicPr/>
                   </pic:nvPicPr>
                   <pic:blipFill>
-                    <a:blip xmlns:r="http://schemas.openxmlformats.org/officeDocument/2006/relationships" r:embed="R22d452ea1ead450c"/>
+                    <a:blip xmlns:r="http://schemas.openxmlformats.org/officeDocument/2006/relationships" r:embed="R01a9b381251b4434"/>
                     <a:stretch>
                       <a:fillRect/>
                     </a:stretch>
@@ -2965,7 +2965,7 @@
                     <pic:cNvPicPr/>
                   </pic:nvPicPr>
                   <pic:blipFill>
-                    <a:blip xmlns:r="http://schemas.openxmlformats.org/officeDocument/2006/relationships" r:embed="R3ef84364eda44792"/>
+                    <a:blip xmlns:r="http://schemas.openxmlformats.org/officeDocument/2006/relationships" r:embed="R401ceac1ab0248fd"/>
                     <a:stretch>
                       <a:fillRect/>
                     </a:stretch>
@@ -3016,7 +3016,7 @@
                     <pic:cNvPicPr/>
                   </pic:nvPicPr>
                   <pic:blipFill>
-                    <a:blip xmlns:r="http://schemas.openxmlformats.org/officeDocument/2006/relationships" r:embed="R70b428f8d0144e8b"/>
+                    <a:blip xmlns:r="http://schemas.openxmlformats.org/officeDocument/2006/relationships" r:embed="Rdcdd35401255414e"/>
                     <a:stretch>
                       <a:fillRect/>
                     </a:stretch>
@@ -3067,7 +3067,7 @@
                     <pic:cNvPicPr/>
                   </pic:nvPicPr>
                   <pic:blipFill>
-                    <a:blip xmlns:r="http://schemas.openxmlformats.org/officeDocument/2006/relationships" r:embed="R9c7bdaee53ed4e41"/>
+                    <a:blip xmlns:r="http://schemas.openxmlformats.org/officeDocument/2006/relationships" r:embed="Rb9aeefb73ef84cc4"/>
                     <a:stretch>
                       <a:fillRect/>
                     </a:stretch>
@@ -3118,7 +3118,7 @@
                     <pic:cNvPicPr/>
                   </pic:nvPicPr>
                   <pic:blipFill>
-                    <a:blip xmlns:r="http://schemas.openxmlformats.org/officeDocument/2006/relationships" r:embed="Rcb7aa7953848472e"/>
+                    <a:blip xmlns:r="http://schemas.openxmlformats.org/officeDocument/2006/relationships" r:embed="R7cf151f727a84a68"/>
                     <a:stretch>
                       <a:fillRect/>
                     </a:stretch>
@@ -3169,7 +3169,7 @@
                     <pic:cNvPicPr/>
                   </pic:nvPicPr>
                   <pic:blipFill>
-                    <a:blip xmlns:r="http://schemas.openxmlformats.org/officeDocument/2006/relationships" r:embed="Rf8c9e96c3e464500"/>
+                    <a:blip xmlns:r="http://schemas.openxmlformats.org/officeDocument/2006/relationships" r:embed="R1c7c106be2a446ab"/>
                     <a:stretch>
                       <a:fillRect/>
                     </a:stretch>
@@ -3220,7 +3220,7 @@
                     <pic:cNvPicPr/>
                   </pic:nvPicPr>
                   <pic:blipFill>
-                    <a:blip xmlns:r="http://schemas.openxmlformats.org/officeDocument/2006/relationships" r:embed="Raaebf25f9e7e441a"/>
+                    <a:blip xmlns:r="http://schemas.openxmlformats.org/officeDocument/2006/relationships" r:embed="Rc05734901b384b4e"/>
                     <a:stretch>
                       <a:fillRect/>
                     </a:stretch>
@@ -3271,7 +3271,7 @@
                     <pic:cNvPicPr/>
                   </pic:nvPicPr>
                   <pic:blipFill>
-                    <a:blip xmlns:r="http://schemas.openxmlformats.org/officeDocument/2006/relationships" r:embed="R3ef8bf46025e487a"/>
+                    <a:blip xmlns:r="http://schemas.openxmlformats.org/officeDocument/2006/relationships" r:embed="R39eef0b18c1046b0"/>
                     <a:stretch>
                       <a:fillRect/>
                     </a:stretch>
@@ -3322,7 +3322,7 @@
                     <pic:cNvPicPr/>
                   </pic:nvPicPr>
                   <pic:blipFill>
-                    <a:blip xmlns:r="http://schemas.openxmlformats.org/officeDocument/2006/relationships" r:embed="R1f9c018c82454e4e"/>
+                    <a:blip xmlns:r="http://schemas.openxmlformats.org/officeDocument/2006/relationships" r:embed="Rc84668300cf94a14"/>
                     <a:stretch>
                       <a:fillRect/>
                     </a:stretch>
@@ -3419,7 +3419,7 @@
                     <pic:cNvPicPr/>
                   </pic:nvPicPr>
                   <pic:blipFill>
-                    <a:blip xmlns:r="http://schemas.openxmlformats.org/officeDocument/2006/relationships" r:embed="Radf923eeb7434b2c"/>
+                    <a:blip xmlns:r="http://schemas.openxmlformats.org/officeDocument/2006/relationships" r:embed="R0f273be58332450b"/>
                     <a:stretch>
                       <a:fillRect/>
                     </a:stretch>
@@ -3462,7 +3462,7 @@
                     <pic:cNvPicPr/>
                   </pic:nvPicPr>
                   <pic:blipFill>
-                    <a:blip xmlns:r="http://schemas.openxmlformats.org/officeDocument/2006/relationships" r:embed="R538d53d5c9e3463b"/>
+                    <a:blip xmlns:r="http://schemas.openxmlformats.org/officeDocument/2006/relationships" r:embed="R9bebc3535da34dca"/>
                     <a:stretch>
                       <a:fillRect/>
                     </a:stretch>
@@ -3505,7 +3505,7 @@
                     <pic:cNvPicPr/>
                   </pic:nvPicPr>
                   <pic:blipFill>
-                    <a:blip xmlns:r="http://schemas.openxmlformats.org/officeDocument/2006/relationships" r:embed="R8bd84e8888ee4c9b"/>
+                    <a:blip xmlns:r="http://schemas.openxmlformats.org/officeDocument/2006/relationships" r:embed="R92947ac29dc64756"/>
                     <a:stretch>
                       <a:fillRect/>
                     </a:stretch>
@@ -3548,7 +3548,7 @@
                     <pic:cNvPicPr/>
                   </pic:nvPicPr>
                   <pic:blipFill>
-                    <a:blip xmlns:r="http://schemas.openxmlformats.org/officeDocument/2006/relationships" r:embed="R829f6c02740843ef"/>
+                    <a:blip xmlns:r="http://schemas.openxmlformats.org/officeDocument/2006/relationships" r:embed="R35c5c512678941ad"/>
                     <a:stretch>
                       <a:fillRect/>
                     </a:stretch>
@@ -3933,7 +3933,7 @@
                     <pic:cNvPicPr/>
                   </pic:nvPicPr>
                   <pic:blipFill>
-                    <a:blip xmlns:r="http://schemas.openxmlformats.org/officeDocument/2006/relationships" r:embed="Rb286939936614c7a"/>
+                    <a:blip xmlns:r="http://schemas.openxmlformats.org/officeDocument/2006/relationships" r:embed="R0405c03e18184ca9"/>
                     <a:stretch>
                       <a:fillRect/>
                     </a:stretch>
@@ -4125,7 +4125,7 @@
                     <pic:cNvPicPr/>
                   </pic:nvPicPr>
                   <pic:blipFill>
-                    <a:blip xmlns:r="http://schemas.openxmlformats.org/officeDocument/2006/relationships" r:embed="R5d7b9d36ec904dc9"/>
+                    <a:blip xmlns:r="http://schemas.openxmlformats.org/officeDocument/2006/relationships" r:embed="Rd683b8e5c377496c"/>
                     <a:stretch>
                       <a:fillRect/>
                     </a:stretch>
@@ -4176,7 +4176,7 @@
                     <pic:cNvPicPr/>
                   </pic:nvPicPr>
                   <pic:blipFill>
-                    <a:blip xmlns:r="http://schemas.openxmlformats.org/officeDocument/2006/relationships" r:embed="R903dd9e7d143492f"/>
+                    <a:blip xmlns:r="http://schemas.openxmlformats.org/officeDocument/2006/relationships" r:embed="Re880a6f17396429c"/>
                     <a:stretch>
                       <a:fillRect/>
                     </a:stretch>
@@ -4227,7 +4227,7 @@
                     <pic:cNvPicPr/>
                   </pic:nvPicPr>
                   <pic:blipFill>
-                    <a:blip xmlns:r="http://schemas.openxmlformats.org/officeDocument/2006/relationships" r:embed="Reb103d9650df4913"/>
+                    <a:blip xmlns:r="http://schemas.openxmlformats.org/officeDocument/2006/relationships" r:embed="Rb9ade4f624f64882"/>
                     <a:stretch>
                       <a:fillRect/>
                     </a:stretch>
@@ -4278,7 +4278,7 @@
                     <pic:cNvPicPr/>
                   </pic:nvPicPr>
                   <pic:blipFill>
-                    <a:blip xmlns:r="http://schemas.openxmlformats.org/officeDocument/2006/relationships" r:embed="R55fef0ff354742f9"/>
+                    <a:blip xmlns:r="http://schemas.openxmlformats.org/officeDocument/2006/relationships" r:embed="Re99440c240844810"/>
                     <a:stretch>
                       <a:fillRect/>
                     </a:stretch>
@@ -4657,7 +4657,7 @@
                     <pic:cNvPicPr/>
                   </pic:nvPicPr>
                   <pic:blipFill>
-                    <a:blip xmlns:r="http://schemas.openxmlformats.org/officeDocument/2006/relationships" r:embed="R7d20bb53079e4bcf"/>
+                    <a:blip xmlns:r="http://schemas.openxmlformats.org/officeDocument/2006/relationships" r:embed="R67eb8b0013d74036"/>
                     <a:stretch>
                       <a:fillRect/>
                     </a:stretch>
@@ -5338,7 +5338,7 @@
             <w:r>
               <w:t xml:space="preserve">Cell with </w:t>
             </w:r>
-            <w:hyperlink xmlns:r="http://schemas.openxmlformats.org/officeDocument/2006/relationships" w:history="true" r:id="R733074cc17f8465b">
+            <w:hyperlink xmlns:r="http://schemas.openxmlformats.org/officeDocument/2006/relationships" w:history="true" r:id="R97aae288fa9b4146">
               <w:r>
                 <w:rPr>
                   <w:rStyle w:val="Hyperlink"/>
@@ -5624,7 +5624,7 @@
                           <pic:cNvPicPr/>
                         </pic:nvPicPr>
                         <pic:blipFill>
-                          <a:blip xmlns:r="http://schemas.openxmlformats.org/officeDocument/2006/relationships" r:embed="Raa6d9f2d6a99468f"/>
+                          <a:blip xmlns:r="http://schemas.openxmlformats.org/officeDocument/2006/relationships" r:embed="Rceea4564da544924"/>
                           <a:stretch>
                             <a:fillRect/>
                           </a:stretch>
@@ -5724,7 +5724,7 @@
                     <pic:cNvPicPr/>
                   </pic:nvPicPr>
                   <pic:blipFill>
-                    <a:blip xmlns:r="http://schemas.openxmlformats.org/officeDocument/2006/relationships" r:embed="R7dd42ae9bb4f4847"/>
+                    <a:blip xmlns:r="http://schemas.openxmlformats.org/officeDocument/2006/relationships" r:embed="R73058b5fc8f14c62"/>
                     <a:stretch>
                       <a:fillRect/>
                     </a:stretch>
@@ -5774,7 +5774,7 @@
                     <pic:cNvPicPr/>
                   </pic:nvPicPr>
                   <pic:blipFill>
-                    <a:blip xmlns:r="http://schemas.openxmlformats.org/officeDocument/2006/relationships" r:embed="R772ffff6b3e14a41"/>
+                    <a:blip xmlns:r="http://schemas.openxmlformats.org/officeDocument/2006/relationships" r:embed="R41bfc16b897646bf"/>
                     <a:stretch>
                       <a:fillRect/>
                     </a:stretch>
@@ -5824,7 +5824,7 @@
                     <pic:cNvPicPr/>
                   </pic:nvPicPr>
                   <pic:blipFill>
-                    <a:blip xmlns:r="http://schemas.openxmlformats.org/officeDocument/2006/relationships" r:embed="R36cfd91102614fbc"/>
+                    <a:blip xmlns:r="http://schemas.openxmlformats.org/officeDocument/2006/relationships" r:embed="Rc3db4b519634430e"/>
                     <a:stretch>
                       <a:fillRect/>
                     </a:stretch>

</xml_diff>

<commit_message>
fix(er): unify matrix routing with scenario-1 guided curveBasis
Remove matrix-only minimum-straight routing so scenario 2 uses the same guided curveBasis behaviour as scenario 1.

Made-with: Cursor
</commit_message>
<xml_diff>
--- a/test.docx
+++ b/test.docx
@@ -236,7 +236,7 @@
       <w:r>
         <w:t xml:space="preserve">, and </w:t>
       </w:r>
-      <w:hyperlink xmlns:r="http://schemas.openxmlformats.org/officeDocument/2006/relationships" w:history="true" r:id="R3d08f1a039224a0f">
+      <w:hyperlink xmlns:r="http://schemas.openxmlformats.org/officeDocument/2006/relationships" w:history="true" r:id="R046d340626394f2b">
         <w:r>
           <w:rPr>
             <w:rStyle w:val="Hyperlink"/>
@@ -475,7 +475,7 @@
       <w:r>
         <w:t xml:space="preserve">Direct link: </w:t>
       </w:r>
-      <w:hyperlink xmlns:r="http://schemas.openxmlformats.org/officeDocument/2006/relationships" w:history="true" r:id="R4f932d3286f84318">
+      <w:hyperlink xmlns:r="http://schemas.openxmlformats.org/officeDocument/2006/relationships" w:history="true" r:id="R3bc3f07743814b88">
         <w:r>
           <w:rPr>
             <w:rStyle w:val="Hyperlink"/>
@@ -496,7 +496,7 @@
       <w:r>
         <w:t xml:space="preserve">Direct link with title: </w:t>
       </w:r>
-      <w:hyperlink xmlns:r="http://schemas.openxmlformats.org/officeDocument/2006/relationships" w:history="true" r:id="Rc2773b775d7a4621">
+      <w:hyperlink xmlns:r="http://schemas.openxmlformats.org/officeDocument/2006/relationships" w:history="true" r:id="R1e93e3e1b8fa4479">
         <w:r>
           <w:rPr>
             <w:rStyle w:val="Hyperlink"/>
@@ -517,7 +517,7 @@
       <w:r>
         <w:t xml:space="preserve">Reference-style link: </w:t>
       </w:r>
-      <w:hyperlink xmlns:r="http://schemas.openxmlformats.org/officeDocument/2006/relationships" w:history="true" r:id="R83db5037f154462a">
+      <w:hyperlink xmlns:r="http://schemas.openxmlformats.org/officeDocument/2006/relationships" w:history="true" r:id="R8d59c353f1084901">
         <w:r>
           <w:rPr>
             <w:rStyle w:val="Hyperlink"/>
@@ -538,7 +538,7 @@
       <w:r>
         <w:t xml:space="preserve">Collapsed reference link: </w:t>
       </w:r>
-      <w:hyperlink xmlns:r="http://schemas.openxmlformats.org/officeDocument/2006/relationships" w:history="true" r:id="R39fc4e314205482e">
+      <w:hyperlink xmlns:r="http://schemas.openxmlformats.org/officeDocument/2006/relationships" w:history="true" r:id="R68870b84163c433e">
         <w:r>
           <w:rPr>
             <w:rStyle w:val="Hyperlink"/>
@@ -559,7 +559,7 @@
       <w:r>
         <w:t xml:space="preserve">Repeated reference link: </w:t>
       </w:r>
-      <w:hyperlink xmlns:r="http://schemas.openxmlformats.org/officeDocument/2006/relationships" w:history="true" r:id="Rcc0e7e80ba1a4225">
+      <w:hyperlink xmlns:r="http://schemas.openxmlformats.org/officeDocument/2006/relationships" w:history="true" r:id="Rf005f6b3cf66470f">
         <w:r>
           <w:rPr>
             <w:rStyle w:val="Hyperlink"/>
@@ -580,7 +580,7 @@
       <w:r>
         <w:t xml:space="preserve">Autolink URL: </w:t>
       </w:r>
-      <w:hyperlink xmlns:r="http://schemas.openxmlformats.org/officeDocument/2006/relationships" w:history="true" r:id="Rb30888093d8f4307">
+      <w:hyperlink xmlns:r="http://schemas.openxmlformats.org/officeDocument/2006/relationships" w:history="true" r:id="R05177f7ad4f241e7">
         <w:r>
           <w:rPr>
             <w:rStyle w:val="Hyperlink"/>
@@ -601,7 +601,7 @@
       <w:r>
         <w:t xml:space="preserve">Autolink email: </w:t>
       </w:r>
-      <w:hyperlink xmlns:r="http://schemas.openxmlformats.org/officeDocument/2006/relationships" w:history="true" r:id="Rf8eac17d610a4a6b">
+      <w:hyperlink xmlns:r="http://schemas.openxmlformats.org/officeDocument/2006/relationships" w:history="true" r:id="R65125090ee704f07">
         <w:r>
           <w:rPr>
             <w:rStyle w:val="Hyperlink"/>
@@ -700,7 +700,7 @@
       <w:r>
         <w:t xml:space="preserve">, and </w:t>
       </w:r>
-      <w:hyperlink xmlns:r="http://schemas.openxmlformats.org/officeDocument/2006/relationships" w:history="true" r:id="R8648e73dd1a54ac2">
+      <w:hyperlink xmlns:r="http://schemas.openxmlformats.org/officeDocument/2006/relationships" w:history="true" r:id="R736a2a05be3c4d5b">
         <w:r>
           <w:rPr>
             <w:rStyle w:val="Hyperlink"/>
@@ -1093,7 +1093,7 @@
       <w:r>
         <w:t xml:space="preserve">Continuation paragraph with </w:t>
       </w:r>
-      <w:hyperlink xmlns:r="http://schemas.openxmlformats.org/officeDocument/2006/relationships" w:history="true" r:id="R1a4ac129797f4cf3">
+      <w:hyperlink xmlns:r="http://schemas.openxmlformats.org/officeDocument/2006/relationships" w:history="true" r:id="Rbaa1171cd7924491">
         <w:r>
           <w:rPr>
             <w:rStyle w:val="Hyperlink"/>
@@ -1591,7 +1591,7 @@
       <w:r>
         <w:t xml:space="preserve">, and </w:t>
       </w:r>
-      <w:hyperlink xmlns:r="http://schemas.openxmlformats.org/officeDocument/2006/relationships" w:history="true" r:id="Rc6a8913e63da4d20">
+      <w:hyperlink xmlns:r="http://schemas.openxmlformats.org/officeDocument/2006/relationships" w:history="true" r:id="Rc4d76089bc0647dc">
         <w:r>
           <w:rPr>
             <w:rStyle w:val="Hyperlink"/>
@@ -1979,7 +1979,7 @@
                     <pic:cNvPicPr/>
                   </pic:nvPicPr>
                   <pic:blipFill>
-                    <a:blip xmlns:r="http://schemas.openxmlformats.org/officeDocument/2006/relationships" r:embed="Rc1579a2acb0b43de"/>
+                    <a:blip xmlns:r="http://schemas.openxmlformats.org/officeDocument/2006/relationships" r:embed="Re963c769d68b4766"/>
                     <a:stretch>
                       <a:fillRect/>
                     </a:stretch>
@@ -2039,7 +2039,7 @@
                     <pic:cNvPicPr/>
                   </pic:nvPicPr>
                   <pic:blipFill>
-                    <a:blip xmlns:r="http://schemas.openxmlformats.org/officeDocument/2006/relationships" r:embed="R9be9de2094ad4ed8"/>
+                    <a:blip xmlns:r="http://schemas.openxmlformats.org/officeDocument/2006/relationships" r:embed="Rddbbc346e2524452"/>
                     <a:stretch>
                       <a:fillRect/>
                     </a:stretch>
@@ -2099,7 +2099,7 @@
                     <pic:cNvPicPr/>
                   </pic:nvPicPr>
                   <pic:blipFill>
-                    <a:blip xmlns:r="http://schemas.openxmlformats.org/officeDocument/2006/relationships" r:embed="R6ab0f2b0d913404f"/>
+                    <a:blip xmlns:r="http://schemas.openxmlformats.org/officeDocument/2006/relationships" r:embed="R5b807ae8ef5a44ff"/>
                     <a:stretch>
                       <a:fillRect/>
                     </a:stretch>
@@ -2150,7 +2150,7 @@
                     <pic:cNvPicPr/>
                   </pic:nvPicPr>
                   <pic:blipFill>
-                    <a:blip xmlns:r="http://schemas.openxmlformats.org/officeDocument/2006/relationships" r:embed="Rb8edf4d74b434309"/>
+                    <a:blip xmlns:r="http://schemas.openxmlformats.org/officeDocument/2006/relationships" r:embed="R70f22cbc94ff439f"/>
                     <a:stretch>
                       <a:fillRect/>
                     </a:stretch>
@@ -2201,7 +2201,7 @@
                     <pic:cNvPicPr/>
                   </pic:nvPicPr>
                   <pic:blipFill>
-                    <a:blip xmlns:r="http://schemas.openxmlformats.org/officeDocument/2006/relationships" r:embed="R3c6f4531475747c3"/>
+                    <a:blip xmlns:r="http://schemas.openxmlformats.org/officeDocument/2006/relationships" r:embed="R9cb55d5a58844688"/>
                     <a:stretch>
                       <a:fillRect/>
                     </a:stretch>
@@ -2252,7 +2252,7 @@
                     <pic:cNvPicPr/>
                   </pic:nvPicPr>
                   <pic:blipFill>
-                    <a:blip xmlns:r="http://schemas.openxmlformats.org/officeDocument/2006/relationships" r:embed="R300e1860a1e34d09"/>
+                    <a:blip xmlns:r="http://schemas.openxmlformats.org/officeDocument/2006/relationships" r:embed="Rdccac8aac14c4403"/>
                     <a:stretch>
                       <a:fillRect/>
                     </a:stretch>
@@ -2303,7 +2303,7 @@
                     <pic:cNvPicPr/>
                   </pic:nvPicPr>
                   <pic:blipFill>
-                    <a:blip xmlns:r="http://schemas.openxmlformats.org/officeDocument/2006/relationships" r:embed="R4d2cde7330da41b2"/>
+                    <a:blip xmlns:r="http://schemas.openxmlformats.org/officeDocument/2006/relationships" r:embed="R0c1ff3e2979e4e68"/>
                     <a:stretch>
                       <a:fillRect/>
                     </a:stretch>
@@ -2354,7 +2354,7 @@
                     <pic:cNvPicPr/>
                   </pic:nvPicPr>
                   <pic:blipFill>
-                    <a:blip xmlns:r="http://schemas.openxmlformats.org/officeDocument/2006/relationships" r:embed="Rc320cda32a55406d"/>
+                    <a:blip xmlns:r="http://schemas.openxmlformats.org/officeDocument/2006/relationships" r:embed="R1009b8ceb4ef4ae5"/>
                     <a:stretch>
                       <a:fillRect/>
                     </a:stretch>
@@ -2430,7 +2430,7 @@
                     <pic:cNvPicPr/>
                   </pic:nvPicPr>
                   <pic:blipFill>
-                    <a:blip xmlns:r="http://schemas.openxmlformats.org/officeDocument/2006/relationships" r:embed="R3c791ba617c84337"/>
+                    <a:blip xmlns:r="http://schemas.openxmlformats.org/officeDocument/2006/relationships" r:embed="R9248fddedfd44c5c"/>
                     <a:stretch>
                       <a:fillRect/>
                     </a:stretch>
@@ -2481,7 +2481,7 @@
                     <pic:cNvPicPr/>
                   </pic:nvPicPr>
                   <pic:blipFill>
-                    <a:blip xmlns:r="http://schemas.openxmlformats.org/officeDocument/2006/relationships" r:embed="R08593be4df6e495a"/>
+                    <a:blip xmlns:r="http://schemas.openxmlformats.org/officeDocument/2006/relationships" r:embed="Rb3bbe8a5512e45a0"/>
                     <a:stretch>
                       <a:fillRect/>
                     </a:stretch>
@@ -2532,7 +2532,7 @@
                     <pic:cNvPicPr/>
                   </pic:nvPicPr>
                   <pic:blipFill>
-                    <a:blip xmlns:r="http://schemas.openxmlformats.org/officeDocument/2006/relationships" r:embed="R8bfe8f2ba9ed4414"/>
+                    <a:blip xmlns:r="http://schemas.openxmlformats.org/officeDocument/2006/relationships" r:embed="R6d057ba175e744be"/>
                     <a:stretch>
                       <a:fillRect/>
                     </a:stretch>
@@ -2583,7 +2583,7 @@
                     <pic:cNvPicPr/>
                   </pic:nvPicPr>
                   <pic:blipFill>
-                    <a:blip xmlns:r="http://schemas.openxmlformats.org/officeDocument/2006/relationships" r:embed="Rb89fdd0972374956"/>
+                    <a:blip xmlns:r="http://schemas.openxmlformats.org/officeDocument/2006/relationships" r:embed="R849466d8eb8b4543"/>
                     <a:stretch>
                       <a:fillRect/>
                     </a:stretch>
@@ -2659,7 +2659,7 @@
                     <pic:cNvPicPr/>
                   </pic:nvPicPr>
                   <pic:blipFill>
-                    <a:blip xmlns:r="http://schemas.openxmlformats.org/officeDocument/2006/relationships" r:embed="Rb89d4e161674462a"/>
+                    <a:blip xmlns:r="http://schemas.openxmlformats.org/officeDocument/2006/relationships" r:embed="Rcd4f0752d95546f8"/>
                     <a:stretch>
                       <a:fillRect/>
                     </a:stretch>
@@ -2710,7 +2710,7 @@
                     <pic:cNvPicPr/>
                   </pic:nvPicPr>
                   <pic:blipFill>
-                    <a:blip xmlns:r="http://schemas.openxmlformats.org/officeDocument/2006/relationships" r:embed="Rad17ffd9cde24ef5"/>
+                    <a:blip xmlns:r="http://schemas.openxmlformats.org/officeDocument/2006/relationships" r:embed="Ra52e399b885f4e9f"/>
                     <a:stretch>
                       <a:fillRect/>
                     </a:stretch>
@@ -2761,7 +2761,7 @@
                     <pic:cNvPicPr/>
                   </pic:nvPicPr>
                   <pic:blipFill>
-                    <a:blip xmlns:r="http://schemas.openxmlformats.org/officeDocument/2006/relationships" r:embed="R15e0333151d3423c"/>
+                    <a:blip xmlns:r="http://schemas.openxmlformats.org/officeDocument/2006/relationships" r:embed="R3bda93fd50ba4959"/>
                     <a:stretch>
                       <a:fillRect/>
                     </a:stretch>
@@ -2812,7 +2812,7 @@
                     <pic:cNvPicPr/>
                   </pic:nvPicPr>
                   <pic:blipFill>
-                    <a:blip xmlns:r="http://schemas.openxmlformats.org/officeDocument/2006/relationships" r:embed="R845766db21994606"/>
+                    <a:blip xmlns:r="http://schemas.openxmlformats.org/officeDocument/2006/relationships" r:embed="Rc2296627daad4cd3"/>
                     <a:stretch>
                       <a:fillRect/>
                     </a:stretch>
@@ -2863,7 +2863,7 @@
                     <pic:cNvPicPr/>
                   </pic:nvPicPr>
                   <pic:blipFill>
-                    <a:blip xmlns:r="http://schemas.openxmlformats.org/officeDocument/2006/relationships" r:embed="Rb2b55d7a70ae4163"/>
+                    <a:blip xmlns:r="http://schemas.openxmlformats.org/officeDocument/2006/relationships" r:embed="Rb342cdc291664fea"/>
                     <a:stretch>
                       <a:fillRect/>
                     </a:stretch>
@@ -2914,7 +2914,7 @@
                     <pic:cNvPicPr/>
                   </pic:nvPicPr>
                   <pic:blipFill>
-                    <a:blip xmlns:r="http://schemas.openxmlformats.org/officeDocument/2006/relationships" r:embed="R01a9b381251b4434"/>
+                    <a:blip xmlns:r="http://schemas.openxmlformats.org/officeDocument/2006/relationships" r:embed="Rb5f9ea627f654425"/>
                     <a:stretch>
                       <a:fillRect/>
                     </a:stretch>
@@ -2965,7 +2965,7 @@
                     <pic:cNvPicPr/>
                   </pic:nvPicPr>
                   <pic:blipFill>
-                    <a:blip xmlns:r="http://schemas.openxmlformats.org/officeDocument/2006/relationships" r:embed="R401ceac1ab0248fd"/>
+                    <a:blip xmlns:r="http://schemas.openxmlformats.org/officeDocument/2006/relationships" r:embed="R7866e4bf60a648be"/>
                     <a:stretch>
                       <a:fillRect/>
                     </a:stretch>
@@ -3016,7 +3016,7 @@
                     <pic:cNvPicPr/>
                   </pic:nvPicPr>
                   <pic:blipFill>
-                    <a:blip xmlns:r="http://schemas.openxmlformats.org/officeDocument/2006/relationships" r:embed="Rdcdd35401255414e"/>
+                    <a:blip xmlns:r="http://schemas.openxmlformats.org/officeDocument/2006/relationships" r:embed="Rb6f84b1b57be4271"/>
                     <a:stretch>
                       <a:fillRect/>
                     </a:stretch>
@@ -3067,7 +3067,7 @@
                     <pic:cNvPicPr/>
                   </pic:nvPicPr>
                   <pic:blipFill>
-                    <a:blip xmlns:r="http://schemas.openxmlformats.org/officeDocument/2006/relationships" r:embed="Rb9aeefb73ef84cc4"/>
+                    <a:blip xmlns:r="http://schemas.openxmlformats.org/officeDocument/2006/relationships" r:embed="R3dfd9685ed694e7e"/>
                     <a:stretch>
                       <a:fillRect/>
                     </a:stretch>
@@ -3118,7 +3118,7 @@
                     <pic:cNvPicPr/>
                   </pic:nvPicPr>
                   <pic:blipFill>
-                    <a:blip xmlns:r="http://schemas.openxmlformats.org/officeDocument/2006/relationships" r:embed="R7cf151f727a84a68"/>
+                    <a:blip xmlns:r="http://schemas.openxmlformats.org/officeDocument/2006/relationships" r:embed="R96df0557e3df4ffb"/>
                     <a:stretch>
                       <a:fillRect/>
                     </a:stretch>
@@ -3169,7 +3169,7 @@
                     <pic:cNvPicPr/>
                   </pic:nvPicPr>
                   <pic:blipFill>
-                    <a:blip xmlns:r="http://schemas.openxmlformats.org/officeDocument/2006/relationships" r:embed="R1c7c106be2a446ab"/>
+                    <a:blip xmlns:r="http://schemas.openxmlformats.org/officeDocument/2006/relationships" r:embed="Rc0a71f2075f24ebe"/>
                     <a:stretch>
                       <a:fillRect/>
                     </a:stretch>
@@ -3220,7 +3220,7 @@
                     <pic:cNvPicPr/>
                   </pic:nvPicPr>
                   <pic:blipFill>
-                    <a:blip xmlns:r="http://schemas.openxmlformats.org/officeDocument/2006/relationships" r:embed="Rc05734901b384b4e"/>
+                    <a:blip xmlns:r="http://schemas.openxmlformats.org/officeDocument/2006/relationships" r:embed="Rb5f825fa096e43a9"/>
                     <a:stretch>
                       <a:fillRect/>
                     </a:stretch>
@@ -3271,7 +3271,7 @@
                     <pic:cNvPicPr/>
                   </pic:nvPicPr>
                   <pic:blipFill>
-                    <a:blip xmlns:r="http://schemas.openxmlformats.org/officeDocument/2006/relationships" r:embed="R39eef0b18c1046b0"/>
+                    <a:blip xmlns:r="http://schemas.openxmlformats.org/officeDocument/2006/relationships" r:embed="R53aa508281114c00"/>
                     <a:stretch>
                       <a:fillRect/>
                     </a:stretch>
@@ -3322,7 +3322,7 @@
                     <pic:cNvPicPr/>
                   </pic:nvPicPr>
                   <pic:blipFill>
-                    <a:blip xmlns:r="http://schemas.openxmlformats.org/officeDocument/2006/relationships" r:embed="Rc84668300cf94a14"/>
+                    <a:blip xmlns:r="http://schemas.openxmlformats.org/officeDocument/2006/relationships" r:embed="R49729b2c12a84b38"/>
                     <a:stretch>
                       <a:fillRect/>
                     </a:stretch>
@@ -3419,7 +3419,7 @@
                     <pic:cNvPicPr/>
                   </pic:nvPicPr>
                   <pic:blipFill>
-                    <a:blip xmlns:r="http://schemas.openxmlformats.org/officeDocument/2006/relationships" r:embed="R0f273be58332450b"/>
+                    <a:blip xmlns:r="http://schemas.openxmlformats.org/officeDocument/2006/relationships" r:embed="Ra0b62365ef1c4ee3"/>
                     <a:stretch>
                       <a:fillRect/>
                     </a:stretch>
@@ -3462,7 +3462,7 @@
                     <pic:cNvPicPr/>
                   </pic:nvPicPr>
                   <pic:blipFill>
-                    <a:blip xmlns:r="http://schemas.openxmlformats.org/officeDocument/2006/relationships" r:embed="R9bebc3535da34dca"/>
+                    <a:blip xmlns:r="http://schemas.openxmlformats.org/officeDocument/2006/relationships" r:embed="R6a08446d12594cad"/>
                     <a:stretch>
                       <a:fillRect/>
                     </a:stretch>
@@ -3505,7 +3505,7 @@
                     <pic:cNvPicPr/>
                   </pic:nvPicPr>
                   <pic:blipFill>
-                    <a:blip xmlns:r="http://schemas.openxmlformats.org/officeDocument/2006/relationships" r:embed="R92947ac29dc64756"/>
+                    <a:blip xmlns:r="http://schemas.openxmlformats.org/officeDocument/2006/relationships" r:embed="R9caea032894b43f2"/>
                     <a:stretch>
                       <a:fillRect/>
                     </a:stretch>
@@ -3548,7 +3548,7 @@
                     <pic:cNvPicPr/>
                   </pic:nvPicPr>
                   <pic:blipFill>
-                    <a:blip xmlns:r="http://schemas.openxmlformats.org/officeDocument/2006/relationships" r:embed="R35c5c512678941ad"/>
+                    <a:blip xmlns:r="http://schemas.openxmlformats.org/officeDocument/2006/relationships" r:embed="R2cea38fadea147a9"/>
                     <a:stretch>
                       <a:fillRect/>
                     </a:stretch>
@@ -3933,7 +3933,7 @@
                     <pic:cNvPicPr/>
                   </pic:nvPicPr>
                   <pic:blipFill>
-                    <a:blip xmlns:r="http://schemas.openxmlformats.org/officeDocument/2006/relationships" r:embed="R0405c03e18184ca9"/>
+                    <a:blip xmlns:r="http://schemas.openxmlformats.org/officeDocument/2006/relationships" r:embed="R4ac1beef4f1b47d6"/>
                     <a:stretch>
                       <a:fillRect/>
                     </a:stretch>
@@ -4125,7 +4125,7 @@
                     <pic:cNvPicPr/>
                   </pic:nvPicPr>
                   <pic:blipFill>
-                    <a:blip xmlns:r="http://schemas.openxmlformats.org/officeDocument/2006/relationships" r:embed="Rd683b8e5c377496c"/>
+                    <a:blip xmlns:r="http://schemas.openxmlformats.org/officeDocument/2006/relationships" r:embed="R5817aeead1c8483a"/>
                     <a:stretch>
                       <a:fillRect/>
                     </a:stretch>
@@ -4176,7 +4176,7 @@
                     <pic:cNvPicPr/>
                   </pic:nvPicPr>
                   <pic:blipFill>
-                    <a:blip xmlns:r="http://schemas.openxmlformats.org/officeDocument/2006/relationships" r:embed="Re880a6f17396429c"/>
+                    <a:blip xmlns:r="http://schemas.openxmlformats.org/officeDocument/2006/relationships" r:embed="R8b1c75875c6f4466"/>
                     <a:stretch>
                       <a:fillRect/>
                     </a:stretch>
@@ -4227,7 +4227,7 @@
                     <pic:cNvPicPr/>
                   </pic:nvPicPr>
                   <pic:blipFill>
-                    <a:blip xmlns:r="http://schemas.openxmlformats.org/officeDocument/2006/relationships" r:embed="Rb9ade4f624f64882"/>
+                    <a:blip xmlns:r="http://schemas.openxmlformats.org/officeDocument/2006/relationships" r:embed="R5346b56c53dc4ff2"/>
                     <a:stretch>
                       <a:fillRect/>
                     </a:stretch>
@@ -4278,7 +4278,7 @@
                     <pic:cNvPicPr/>
                   </pic:nvPicPr>
                   <pic:blipFill>
-                    <a:blip xmlns:r="http://schemas.openxmlformats.org/officeDocument/2006/relationships" r:embed="Re99440c240844810"/>
+                    <a:blip xmlns:r="http://schemas.openxmlformats.org/officeDocument/2006/relationships" r:embed="Ra1afaea2460b4787"/>
                     <a:stretch>
                       <a:fillRect/>
                     </a:stretch>
@@ -4657,7 +4657,7 @@
                     <pic:cNvPicPr/>
                   </pic:nvPicPr>
                   <pic:blipFill>
-                    <a:blip xmlns:r="http://schemas.openxmlformats.org/officeDocument/2006/relationships" r:embed="R67eb8b0013d74036"/>
+                    <a:blip xmlns:r="http://schemas.openxmlformats.org/officeDocument/2006/relationships" r:embed="R2f4839ba6fdf4cb8"/>
                     <a:stretch>
                       <a:fillRect/>
                     </a:stretch>
@@ -5338,7 +5338,7 @@
             <w:r>
               <w:t xml:space="preserve">Cell with </w:t>
             </w:r>
-            <w:hyperlink xmlns:r="http://schemas.openxmlformats.org/officeDocument/2006/relationships" w:history="true" r:id="R97aae288fa9b4146">
+            <w:hyperlink xmlns:r="http://schemas.openxmlformats.org/officeDocument/2006/relationships" w:history="true" r:id="Ra99152f48ae34d96">
               <w:r>
                 <w:rPr>
                   <w:rStyle w:val="Hyperlink"/>
@@ -5624,7 +5624,7 @@
                           <pic:cNvPicPr/>
                         </pic:nvPicPr>
                         <pic:blipFill>
-                          <a:blip xmlns:r="http://schemas.openxmlformats.org/officeDocument/2006/relationships" r:embed="Rceea4564da544924"/>
+                          <a:blip xmlns:r="http://schemas.openxmlformats.org/officeDocument/2006/relationships" r:embed="R37e6c8a4e4294950"/>
                           <a:stretch>
                             <a:fillRect/>
                           </a:stretch>
@@ -5724,7 +5724,7 @@
                     <pic:cNvPicPr/>
                   </pic:nvPicPr>
                   <pic:blipFill>
-                    <a:blip xmlns:r="http://schemas.openxmlformats.org/officeDocument/2006/relationships" r:embed="R73058b5fc8f14c62"/>
+                    <a:blip xmlns:r="http://schemas.openxmlformats.org/officeDocument/2006/relationships" r:embed="Rce78f5aeaebf4059"/>
                     <a:stretch>
                       <a:fillRect/>
                     </a:stretch>
@@ -5774,7 +5774,7 @@
                     <pic:cNvPicPr/>
                   </pic:nvPicPr>
                   <pic:blipFill>
-                    <a:blip xmlns:r="http://schemas.openxmlformats.org/officeDocument/2006/relationships" r:embed="R41bfc16b897646bf"/>
+                    <a:blip xmlns:r="http://schemas.openxmlformats.org/officeDocument/2006/relationships" r:embed="Rcac46a8f3698479f"/>
                     <a:stretch>
                       <a:fillRect/>
                     </a:stretch>
@@ -5824,7 +5824,7 @@
                     <pic:cNvPicPr/>
                   </pic:nvPicPr>
                   <pic:blipFill>
-                    <a:blip xmlns:r="http://schemas.openxmlformats.org/officeDocument/2006/relationships" r:embed="Rc3db4b519634430e"/>
+                    <a:blip xmlns:r="http://schemas.openxmlformats.org/officeDocument/2006/relationships" r:embed="R2de777a26932406e"/>
                     <a:stretch>
                       <a:fillRect/>
                     </a:stretch>

</xml_diff>

<commit_message>
fix(er): apply matrix minimum straight segments and label Y
For scenario 2 matrix edges, enforce minimum straight exit/entry segments before curveBasis smoothing and keep labels vertically on the line (horizontal centring only).

Made-with: Cursor
</commit_message>
<xml_diff>
--- a/test.docx
+++ b/test.docx
@@ -236,7 +236,7 @@
       <w:r>
         <w:t xml:space="preserve">, and </w:t>
       </w:r>
-      <w:hyperlink xmlns:r="http://schemas.openxmlformats.org/officeDocument/2006/relationships" w:history="true" r:id="R046d340626394f2b">
+      <w:hyperlink xmlns:r="http://schemas.openxmlformats.org/officeDocument/2006/relationships" w:history="true" r:id="R26861b63a09943ba">
         <w:r>
           <w:rPr>
             <w:rStyle w:val="Hyperlink"/>
@@ -475,7 +475,7 @@
       <w:r>
         <w:t xml:space="preserve">Direct link: </w:t>
       </w:r>
-      <w:hyperlink xmlns:r="http://schemas.openxmlformats.org/officeDocument/2006/relationships" w:history="true" r:id="R3bc3f07743814b88">
+      <w:hyperlink xmlns:r="http://schemas.openxmlformats.org/officeDocument/2006/relationships" w:history="true" r:id="R2ce130c5b6614d9d">
         <w:r>
           <w:rPr>
             <w:rStyle w:val="Hyperlink"/>
@@ -496,7 +496,7 @@
       <w:r>
         <w:t xml:space="preserve">Direct link with title: </w:t>
       </w:r>
-      <w:hyperlink xmlns:r="http://schemas.openxmlformats.org/officeDocument/2006/relationships" w:history="true" r:id="R1e93e3e1b8fa4479">
+      <w:hyperlink xmlns:r="http://schemas.openxmlformats.org/officeDocument/2006/relationships" w:history="true" r:id="R95af861af203426f">
         <w:r>
           <w:rPr>
             <w:rStyle w:val="Hyperlink"/>
@@ -517,7 +517,7 @@
       <w:r>
         <w:t xml:space="preserve">Reference-style link: </w:t>
       </w:r>
-      <w:hyperlink xmlns:r="http://schemas.openxmlformats.org/officeDocument/2006/relationships" w:history="true" r:id="R8d59c353f1084901">
+      <w:hyperlink xmlns:r="http://schemas.openxmlformats.org/officeDocument/2006/relationships" w:history="true" r:id="Raaf7988af4aa4c0c">
         <w:r>
           <w:rPr>
             <w:rStyle w:val="Hyperlink"/>
@@ -538,7 +538,7 @@
       <w:r>
         <w:t xml:space="preserve">Collapsed reference link: </w:t>
       </w:r>
-      <w:hyperlink xmlns:r="http://schemas.openxmlformats.org/officeDocument/2006/relationships" w:history="true" r:id="R68870b84163c433e">
+      <w:hyperlink xmlns:r="http://schemas.openxmlformats.org/officeDocument/2006/relationships" w:history="true" r:id="R5d8c22344f0a4ea8">
         <w:r>
           <w:rPr>
             <w:rStyle w:val="Hyperlink"/>
@@ -559,7 +559,7 @@
       <w:r>
         <w:t xml:space="preserve">Repeated reference link: </w:t>
       </w:r>
-      <w:hyperlink xmlns:r="http://schemas.openxmlformats.org/officeDocument/2006/relationships" w:history="true" r:id="Rf005f6b3cf66470f">
+      <w:hyperlink xmlns:r="http://schemas.openxmlformats.org/officeDocument/2006/relationships" w:history="true" r:id="Rac8d6de0e53642c5">
         <w:r>
           <w:rPr>
             <w:rStyle w:val="Hyperlink"/>
@@ -580,7 +580,7 @@
       <w:r>
         <w:t xml:space="preserve">Autolink URL: </w:t>
       </w:r>
-      <w:hyperlink xmlns:r="http://schemas.openxmlformats.org/officeDocument/2006/relationships" w:history="true" r:id="R05177f7ad4f241e7">
+      <w:hyperlink xmlns:r="http://schemas.openxmlformats.org/officeDocument/2006/relationships" w:history="true" r:id="R9c472442b88b4668">
         <w:r>
           <w:rPr>
             <w:rStyle w:val="Hyperlink"/>
@@ -601,7 +601,7 @@
       <w:r>
         <w:t xml:space="preserve">Autolink email: </w:t>
       </w:r>
-      <w:hyperlink xmlns:r="http://schemas.openxmlformats.org/officeDocument/2006/relationships" w:history="true" r:id="R65125090ee704f07">
+      <w:hyperlink xmlns:r="http://schemas.openxmlformats.org/officeDocument/2006/relationships" w:history="true" r:id="R933bd9c3ade0438f">
         <w:r>
           <w:rPr>
             <w:rStyle w:val="Hyperlink"/>
@@ -700,7 +700,7 @@
       <w:r>
         <w:t xml:space="preserve">, and </w:t>
       </w:r>
-      <w:hyperlink xmlns:r="http://schemas.openxmlformats.org/officeDocument/2006/relationships" w:history="true" r:id="R736a2a05be3c4d5b">
+      <w:hyperlink xmlns:r="http://schemas.openxmlformats.org/officeDocument/2006/relationships" w:history="true" r:id="Rab35412836dc4d5b">
         <w:r>
           <w:rPr>
             <w:rStyle w:val="Hyperlink"/>
@@ -1093,7 +1093,7 @@
       <w:r>
         <w:t xml:space="preserve">Continuation paragraph with </w:t>
       </w:r>
-      <w:hyperlink xmlns:r="http://schemas.openxmlformats.org/officeDocument/2006/relationships" w:history="true" r:id="Rbaa1171cd7924491">
+      <w:hyperlink xmlns:r="http://schemas.openxmlformats.org/officeDocument/2006/relationships" w:history="true" r:id="R5517d96dd17043ae">
         <w:r>
           <w:rPr>
             <w:rStyle w:val="Hyperlink"/>
@@ -1591,7 +1591,7 @@
       <w:r>
         <w:t xml:space="preserve">, and </w:t>
       </w:r>
-      <w:hyperlink xmlns:r="http://schemas.openxmlformats.org/officeDocument/2006/relationships" w:history="true" r:id="Rc4d76089bc0647dc">
+      <w:hyperlink xmlns:r="http://schemas.openxmlformats.org/officeDocument/2006/relationships" w:history="true" r:id="Rd7a04d1faed84543">
         <w:r>
           <w:rPr>
             <w:rStyle w:val="Hyperlink"/>
@@ -1979,7 +1979,7 @@
                     <pic:cNvPicPr/>
                   </pic:nvPicPr>
                   <pic:blipFill>
-                    <a:blip xmlns:r="http://schemas.openxmlformats.org/officeDocument/2006/relationships" r:embed="Re963c769d68b4766"/>
+                    <a:blip xmlns:r="http://schemas.openxmlformats.org/officeDocument/2006/relationships" r:embed="R426ff56e21e94e5b"/>
                     <a:stretch>
                       <a:fillRect/>
                     </a:stretch>
@@ -2039,7 +2039,7 @@
                     <pic:cNvPicPr/>
                   </pic:nvPicPr>
                   <pic:blipFill>
-                    <a:blip xmlns:r="http://schemas.openxmlformats.org/officeDocument/2006/relationships" r:embed="Rddbbc346e2524452"/>
+                    <a:blip xmlns:r="http://schemas.openxmlformats.org/officeDocument/2006/relationships" r:embed="R2255a4e47fcd49c6"/>
                     <a:stretch>
                       <a:fillRect/>
                     </a:stretch>
@@ -2099,7 +2099,7 @@
                     <pic:cNvPicPr/>
                   </pic:nvPicPr>
                   <pic:blipFill>
-                    <a:blip xmlns:r="http://schemas.openxmlformats.org/officeDocument/2006/relationships" r:embed="R5b807ae8ef5a44ff"/>
+                    <a:blip xmlns:r="http://schemas.openxmlformats.org/officeDocument/2006/relationships" r:embed="Rc89721bcac134a95"/>
                     <a:stretch>
                       <a:fillRect/>
                     </a:stretch>
@@ -2150,7 +2150,7 @@
                     <pic:cNvPicPr/>
                   </pic:nvPicPr>
                   <pic:blipFill>
-                    <a:blip xmlns:r="http://schemas.openxmlformats.org/officeDocument/2006/relationships" r:embed="R70f22cbc94ff439f"/>
+                    <a:blip xmlns:r="http://schemas.openxmlformats.org/officeDocument/2006/relationships" r:embed="Re8e89b8fa8624233"/>
                     <a:stretch>
                       <a:fillRect/>
                     </a:stretch>
@@ -2201,7 +2201,7 @@
                     <pic:cNvPicPr/>
                   </pic:nvPicPr>
                   <pic:blipFill>
-                    <a:blip xmlns:r="http://schemas.openxmlformats.org/officeDocument/2006/relationships" r:embed="R9cb55d5a58844688"/>
+                    <a:blip xmlns:r="http://schemas.openxmlformats.org/officeDocument/2006/relationships" r:embed="R21a51e58c5af4260"/>
                     <a:stretch>
                       <a:fillRect/>
                     </a:stretch>
@@ -2252,7 +2252,7 @@
                     <pic:cNvPicPr/>
                   </pic:nvPicPr>
                   <pic:blipFill>
-                    <a:blip xmlns:r="http://schemas.openxmlformats.org/officeDocument/2006/relationships" r:embed="Rdccac8aac14c4403"/>
+                    <a:blip xmlns:r="http://schemas.openxmlformats.org/officeDocument/2006/relationships" r:embed="Re83c27074d9148da"/>
                     <a:stretch>
                       <a:fillRect/>
                     </a:stretch>
@@ -2303,7 +2303,7 @@
                     <pic:cNvPicPr/>
                   </pic:nvPicPr>
                   <pic:blipFill>
-                    <a:blip xmlns:r="http://schemas.openxmlformats.org/officeDocument/2006/relationships" r:embed="R0c1ff3e2979e4e68"/>
+                    <a:blip xmlns:r="http://schemas.openxmlformats.org/officeDocument/2006/relationships" r:embed="R5833ee66c15d4649"/>
                     <a:stretch>
                       <a:fillRect/>
                     </a:stretch>
@@ -2354,7 +2354,7 @@
                     <pic:cNvPicPr/>
                   </pic:nvPicPr>
                   <pic:blipFill>
-                    <a:blip xmlns:r="http://schemas.openxmlformats.org/officeDocument/2006/relationships" r:embed="R1009b8ceb4ef4ae5"/>
+                    <a:blip xmlns:r="http://schemas.openxmlformats.org/officeDocument/2006/relationships" r:embed="Rfb7b3488ed3f4915"/>
                     <a:stretch>
                       <a:fillRect/>
                     </a:stretch>
@@ -2430,7 +2430,7 @@
                     <pic:cNvPicPr/>
                   </pic:nvPicPr>
                   <pic:blipFill>
-                    <a:blip xmlns:r="http://schemas.openxmlformats.org/officeDocument/2006/relationships" r:embed="R9248fddedfd44c5c"/>
+                    <a:blip xmlns:r="http://schemas.openxmlformats.org/officeDocument/2006/relationships" r:embed="Rdf09060327d74eae"/>
                     <a:stretch>
                       <a:fillRect/>
                     </a:stretch>
@@ -2481,7 +2481,7 @@
                     <pic:cNvPicPr/>
                   </pic:nvPicPr>
                   <pic:blipFill>
-                    <a:blip xmlns:r="http://schemas.openxmlformats.org/officeDocument/2006/relationships" r:embed="Rb3bbe8a5512e45a0"/>
+                    <a:blip xmlns:r="http://schemas.openxmlformats.org/officeDocument/2006/relationships" r:embed="R5b65ea18d2914a95"/>
                     <a:stretch>
                       <a:fillRect/>
                     </a:stretch>
@@ -2532,7 +2532,7 @@
                     <pic:cNvPicPr/>
                   </pic:nvPicPr>
                   <pic:blipFill>
-                    <a:blip xmlns:r="http://schemas.openxmlformats.org/officeDocument/2006/relationships" r:embed="R6d057ba175e744be"/>
+                    <a:blip xmlns:r="http://schemas.openxmlformats.org/officeDocument/2006/relationships" r:embed="R07c3c2793bcf4557"/>
                     <a:stretch>
                       <a:fillRect/>
                     </a:stretch>
@@ -2583,7 +2583,7 @@
                     <pic:cNvPicPr/>
                   </pic:nvPicPr>
                   <pic:blipFill>
-                    <a:blip xmlns:r="http://schemas.openxmlformats.org/officeDocument/2006/relationships" r:embed="R849466d8eb8b4543"/>
+                    <a:blip xmlns:r="http://schemas.openxmlformats.org/officeDocument/2006/relationships" r:embed="R63c5393a00fb43d7"/>
                     <a:stretch>
                       <a:fillRect/>
                     </a:stretch>
@@ -2659,7 +2659,7 @@
                     <pic:cNvPicPr/>
                   </pic:nvPicPr>
                   <pic:blipFill>
-                    <a:blip xmlns:r="http://schemas.openxmlformats.org/officeDocument/2006/relationships" r:embed="Rcd4f0752d95546f8"/>
+                    <a:blip xmlns:r="http://schemas.openxmlformats.org/officeDocument/2006/relationships" r:embed="R83af4e9065d64953"/>
                     <a:stretch>
                       <a:fillRect/>
                     </a:stretch>
@@ -2710,7 +2710,7 @@
                     <pic:cNvPicPr/>
                   </pic:nvPicPr>
                   <pic:blipFill>
-                    <a:blip xmlns:r="http://schemas.openxmlformats.org/officeDocument/2006/relationships" r:embed="Ra52e399b885f4e9f"/>
+                    <a:blip xmlns:r="http://schemas.openxmlformats.org/officeDocument/2006/relationships" r:embed="Rc806c6b30a574eb9"/>
                     <a:stretch>
                       <a:fillRect/>
                     </a:stretch>
@@ -2761,7 +2761,7 @@
                     <pic:cNvPicPr/>
                   </pic:nvPicPr>
                   <pic:blipFill>
-                    <a:blip xmlns:r="http://schemas.openxmlformats.org/officeDocument/2006/relationships" r:embed="R3bda93fd50ba4959"/>
+                    <a:blip xmlns:r="http://schemas.openxmlformats.org/officeDocument/2006/relationships" r:embed="R1a70749f0ddb4751"/>
                     <a:stretch>
                       <a:fillRect/>
                     </a:stretch>
@@ -2812,7 +2812,7 @@
                     <pic:cNvPicPr/>
                   </pic:nvPicPr>
                   <pic:blipFill>
-                    <a:blip xmlns:r="http://schemas.openxmlformats.org/officeDocument/2006/relationships" r:embed="Rc2296627daad4cd3"/>
+                    <a:blip xmlns:r="http://schemas.openxmlformats.org/officeDocument/2006/relationships" r:embed="R6746a0db4f86482e"/>
                     <a:stretch>
                       <a:fillRect/>
                     </a:stretch>
@@ -2863,7 +2863,7 @@
                     <pic:cNvPicPr/>
                   </pic:nvPicPr>
                   <pic:blipFill>
-                    <a:blip xmlns:r="http://schemas.openxmlformats.org/officeDocument/2006/relationships" r:embed="Rb342cdc291664fea"/>
+                    <a:blip xmlns:r="http://schemas.openxmlformats.org/officeDocument/2006/relationships" r:embed="R5f273899a6ce43cd"/>
                     <a:stretch>
                       <a:fillRect/>
                     </a:stretch>
@@ -2914,7 +2914,7 @@
                     <pic:cNvPicPr/>
                   </pic:nvPicPr>
                   <pic:blipFill>
-                    <a:blip xmlns:r="http://schemas.openxmlformats.org/officeDocument/2006/relationships" r:embed="Rb5f9ea627f654425"/>
+                    <a:blip xmlns:r="http://schemas.openxmlformats.org/officeDocument/2006/relationships" r:embed="Rdf94174d54394c66"/>
                     <a:stretch>
                       <a:fillRect/>
                     </a:stretch>
@@ -2965,7 +2965,7 @@
                     <pic:cNvPicPr/>
                   </pic:nvPicPr>
                   <pic:blipFill>
-                    <a:blip xmlns:r="http://schemas.openxmlformats.org/officeDocument/2006/relationships" r:embed="R7866e4bf60a648be"/>
+                    <a:blip xmlns:r="http://schemas.openxmlformats.org/officeDocument/2006/relationships" r:embed="R6b64dfdc69d045a5"/>
                     <a:stretch>
                       <a:fillRect/>
                     </a:stretch>
@@ -3016,7 +3016,7 @@
                     <pic:cNvPicPr/>
                   </pic:nvPicPr>
                   <pic:blipFill>
-                    <a:blip xmlns:r="http://schemas.openxmlformats.org/officeDocument/2006/relationships" r:embed="Rb6f84b1b57be4271"/>
+                    <a:blip xmlns:r="http://schemas.openxmlformats.org/officeDocument/2006/relationships" r:embed="Rbde62ed24b714c7c"/>
                     <a:stretch>
                       <a:fillRect/>
                     </a:stretch>
@@ -3067,7 +3067,7 @@
                     <pic:cNvPicPr/>
                   </pic:nvPicPr>
                   <pic:blipFill>
-                    <a:blip xmlns:r="http://schemas.openxmlformats.org/officeDocument/2006/relationships" r:embed="R3dfd9685ed694e7e"/>
+                    <a:blip xmlns:r="http://schemas.openxmlformats.org/officeDocument/2006/relationships" r:embed="Ra580e35ddebf4c49"/>
                     <a:stretch>
                       <a:fillRect/>
                     </a:stretch>
@@ -3118,7 +3118,7 @@
                     <pic:cNvPicPr/>
                   </pic:nvPicPr>
                   <pic:blipFill>
-                    <a:blip xmlns:r="http://schemas.openxmlformats.org/officeDocument/2006/relationships" r:embed="R96df0557e3df4ffb"/>
+                    <a:blip xmlns:r="http://schemas.openxmlformats.org/officeDocument/2006/relationships" r:embed="Rac0525015f25421e"/>
                     <a:stretch>
                       <a:fillRect/>
                     </a:stretch>
@@ -3169,7 +3169,7 @@
                     <pic:cNvPicPr/>
                   </pic:nvPicPr>
                   <pic:blipFill>
-                    <a:blip xmlns:r="http://schemas.openxmlformats.org/officeDocument/2006/relationships" r:embed="Rc0a71f2075f24ebe"/>
+                    <a:blip xmlns:r="http://schemas.openxmlformats.org/officeDocument/2006/relationships" r:embed="R61ba4c8e03ff4281"/>
                     <a:stretch>
                       <a:fillRect/>
                     </a:stretch>
@@ -3220,7 +3220,7 @@
                     <pic:cNvPicPr/>
                   </pic:nvPicPr>
                   <pic:blipFill>
-                    <a:blip xmlns:r="http://schemas.openxmlformats.org/officeDocument/2006/relationships" r:embed="Rb5f825fa096e43a9"/>
+                    <a:blip xmlns:r="http://schemas.openxmlformats.org/officeDocument/2006/relationships" r:embed="R249f821ecca24c9b"/>
                     <a:stretch>
                       <a:fillRect/>
                     </a:stretch>
@@ -3271,7 +3271,7 @@
                     <pic:cNvPicPr/>
                   </pic:nvPicPr>
                   <pic:blipFill>
-                    <a:blip xmlns:r="http://schemas.openxmlformats.org/officeDocument/2006/relationships" r:embed="R53aa508281114c00"/>
+                    <a:blip xmlns:r="http://schemas.openxmlformats.org/officeDocument/2006/relationships" r:embed="R7b29c77f33364b08"/>
                     <a:stretch>
                       <a:fillRect/>
                     </a:stretch>
@@ -3322,7 +3322,7 @@
                     <pic:cNvPicPr/>
                   </pic:nvPicPr>
                   <pic:blipFill>
-                    <a:blip xmlns:r="http://schemas.openxmlformats.org/officeDocument/2006/relationships" r:embed="R49729b2c12a84b38"/>
+                    <a:blip xmlns:r="http://schemas.openxmlformats.org/officeDocument/2006/relationships" r:embed="R44a68ac371a641ba"/>
                     <a:stretch>
                       <a:fillRect/>
                     </a:stretch>
@@ -3419,7 +3419,7 @@
                     <pic:cNvPicPr/>
                   </pic:nvPicPr>
                   <pic:blipFill>
-                    <a:blip xmlns:r="http://schemas.openxmlformats.org/officeDocument/2006/relationships" r:embed="Ra0b62365ef1c4ee3"/>
+                    <a:blip xmlns:r="http://schemas.openxmlformats.org/officeDocument/2006/relationships" r:embed="R3bb4f22e62824dfb"/>
                     <a:stretch>
                       <a:fillRect/>
                     </a:stretch>
@@ -3462,7 +3462,7 @@
                     <pic:cNvPicPr/>
                   </pic:nvPicPr>
                   <pic:blipFill>
-                    <a:blip xmlns:r="http://schemas.openxmlformats.org/officeDocument/2006/relationships" r:embed="R6a08446d12594cad"/>
+                    <a:blip xmlns:r="http://schemas.openxmlformats.org/officeDocument/2006/relationships" r:embed="Ra1ef38dcf14a4aef"/>
                     <a:stretch>
                       <a:fillRect/>
                     </a:stretch>
@@ -3505,7 +3505,7 @@
                     <pic:cNvPicPr/>
                   </pic:nvPicPr>
                   <pic:blipFill>
-                    <a:blip xmlns:r="http://schemas.openxmlformats.org/officeDocument/2006/relationships" r:embed="R9caea032894b43f2"/>
+                    <a:blip xmlns:r="http://schemas.openxmlformats.org/officeDocument/2006/relationships" r:embed="R89017d6897934c32"/>
                     <a:stretch>
                       <a:fillRect/>
                     </a:stretch>
@@ -3548,7 +3548,7 @@
                     <pic:cNvPicPr/>
                   </pic:nvPicPr>
                   <pic:blipFill>
-                    <a:blip xmlns:r="http://schemas.openxmlformats.org/officeDocument/2006/relationships" r:embed="R2cea38fadea147a9"/>
+                    <a:blip xmlns:r="http://schemas.openxmlformats.org/officeDocument/2006/relationships" r:embed="Raa4c4685ff5c4d8e"/>
                     <a:stretch>
                       <a:fillRect/>
                     </a:stretch>
@@ -3933,7 +3933,7 @@
                     <pic:cNvPicPr/>
                   </pic:nvPicPr>
                   <pic:blipFill>
-                    <a:blip xmlns:r="http://schemas.openxmlformats.org/officeDocument/2006/relationships" r:embed="R4ac1beef4f1b47d6"/>
+                    <a:blip xmlns:r="http://schemas.openxmlformats.org/officeDocument/2006/relationships" r:embed="R4af28609934d469c"/>
                     <a:stretch>
                       <a:fillRect/>
                     </a:stretch>
@@ -4125,7 +4125,7 @@
                     <pic:cNvPicPr/>
                   </pic:nvPicPr>
                   <pic:blipFill>
-                    <a:blip xmlns:r="http://schemas.openxmlformats.org/officeDocument/2006/relationships" r:embed="R5817aeead1c8483a"/>
+                    <a:blip xmlns:r="http://schemas.openxmlformats.org/officeDocument/2006/relationships" r:embed="Rec07e5b5bb9e4ed6"/>
                     <a:stretch>
                       <a:fillRect/>
                     </a:stretch>
@@ -4176,7 +4176,7 @@
                     <pic:cNvPicPr/>
                   </pic:nvPicPr>
                   <pic:blipFill>
-                    <a:blip xmlns:r="http://schemas.openxmlformats.org/officeDocument/2006/relationships" r:embed="R8b1c75875c6f4466"/>
+                    <a:blip xmlns:r="http://schemas.openxmlformats.org/officeDocument/2006/relationships" r:embed="R42556c079741441c"/>
                     <a:stretch>
                       <a:fillRect/>
                     </a:stretch>
@@ -4227,7 +4227,7 @@
                     <pic:cNvPicPr/>
                   </pic:nvPicPr>
                   <pic:blipFill>
-                    <a:blip xmlns:r="http://schemas.openxmlformats.org/officeDocument/2006/relationships" r:embed="R5346b56c53dc4ff2"/>
+                    <a:blip xmlns:r="http://schemas.openxmlformats.org/officeDocument/2006/relationships" r:embed="R003630989fb24478"/>
                     <a:stretch>
                       <a:fillRect/>
                     </a:stretch>
@@ -4278,7 +4278,7 @@
                     <pic:cNvPicPr/>
                   </pic:nvPicPr>
                   <pic:blipFill>
-                    <a:blip xmlns:r="http://schemas.openxmlformats.org/officeDocument/2006/relationships" r:embed="Ra1afaea2460b4787"/>
+                    <a:blip xmlns:r="http://schemas.openxmlformats.org/officeDocument/2006/relationships" r:embed="R93edc1ead11e49ca"/>
                     <a:stretch>
                       <a:fillRect/>
                     </a:stretch>
@@ -4657,7 +4657,7 @@
                     <pic:cNvPicPr/>
                   </pic:nvPicPr>
                   <pic:blipFill>
-                    <a:blip xmlns:r="http://schemas.openxmlformats.org/officeDocument/2006/relationships" r:embed="R2f4839ba6fdf4cb8"/>
+                    <a:blip xmlns:r="http://schemas.openxmlformats.org/officeDocument/2006/relationships" r:embed="R9b2cc214ed4b4306"/>
                     <a:stretch>
                       <a:fillRect/>
                     </a:stretch>
@@ -5338,7 +5338,7 @@
             <w:r>
               <w:t xml:space="preserve">Cell with </w:t>
             </w:r>
-            <w:hyperlink xmlns:r="http://schemas.openxmlformats.org/officeDocument/2006/relationships" w:history="true" r:id="Ra99152f48ae34d96">
+            <w:hyperlink xmlns:r="http://schemas.openxmlformats.org/officeDocument/2006/relationships" w:history="true" r:id="Rbea2e930860c4a01">
               <w:r>
                 <w:rPr>
                   <w:rStyle w:val="Hyperlink"/>
@@ -5624,7 +5624,7 @@
                           <pic:cNvPicPr/>
                         </pic:nvPicPr>
                         <pic:blipFill>
-                          <a:blip xmlns:r="http://schemas.openxmlformats.org/officeDocument/2006/relationships" r:embed="R37e6c8a4e4294950"/>
+                          <a:blip xmlns:r="http://schemas.openxmlformats.org/officeDocument/2006/relationships" r:embed="R83de69b64bb74684"/>
                           <a:stretch>
                             <a:fillRect/>
                           </a:stretch>
@@ -5724,7 +5724,7 @@
                     <pic:cNvPicPr/>
                   </pic:nvPicPr>
                   <pic:blipFill>
-                    <a:blip xmlns:r="http://schemas.openxmlformats.org/officeDocument/2006/relationships" r:embed="Rce78f5aeaebf4059"/>
+                    <a:blip xmlns:r="http://schemas.openxmlformats.org/officeDocument/2006/relationships" r:embed="Rc4fce830473546fc"/>
                     <a:stretch>
                       <a:fillRect/>
                     </a:stretch>
@@ -5774,7 +5774,7 @@
                     <pic:cNvPicPr/>
                   </pic:nvPicPr>
                   <pic:blipFill>
-                    <a:blip xmlns:r="http://schemas.openxmlformats.org/officeDocument/2006/relationships" r:embed="Rcac46a8f3698479f"/>
+                    <a:blip xmlns:r="http://schemas.openxmlformats.org/officeDocument/2006/relationships" r:embed="R8dfb5e5b53bb4646"/>
                     <a:stretch>
                       <a:fillRect/>
                     </a:stretch>
@@ -5824,7 +5824,7 @@
                     <pic:cNvPicPr/>
                   </pic:nvPicPr>
                   <pic:blipFill>
-                    <a:blip xmlns:r="http://schemas.openxmlformats.org/officeDocument/2006/relationships" r:embed="R2de777a26932406e"/>
+                    <a:blip xmlns:r="http://schemas.openxmlformats.org/officeDocument/2006/relationships" r:embed="R04f2a244389641f7"/>
                     <a:stretch>
                       <a:fillRect/>
                     </a:stretch>

</xml_diff>

<commit_message>
fix(er): enforce matrix minimum straights on both axes
For scenario 2 matrix edges, enforce minimum straight exit/entry segments along the predominant axis (horizontal or vertical) before curveBasis smoothing.

Made-with: Cursor
</commit_message>
<xml_diff>
--- a/test.docx
+++ b/test.docx
@@ -236,7 +236,7 @@
       <w:r>
         <w:t xml:space="preserve">, and </w:t>
       </w:r>
-      <w:hyperlink xmlns:r="http://schemas.openxmlformats.org/officeDocument/2006/relationships" w:history="true" r:id="R26861b63a09943ba">
+      <w:hyperlink xmlns:r="http://schemas.openxmlformats.org/officeDocument/2006/relationships" w:history="true" r:id="R5090cc0d0051473f">
         <w:r>
           <w:rPr>
             <w:rStyle w:val="Hyperlink"/>
@@ -475,7 +475,7 @@
       <w:r>
         <w:t xml:space="preserve">Direct link: </w:t>
       </w:r>
-      <w:hyperlink xmlns:r="http://schemas.openxmlformats.org/officeDocument/2006/relationships" w:history="true" r:id="R2ce130c5b6614d9d">
+      <w:hyperlink xmlns:r="http://schemas.openxmlformats.org/officeDocument/2006/relationships" w:history="true" r:id="Rcffcee6c635b4121">
         <w:r>
           <w:rPr>
             <w:rStyle w:val="Hyperlink"/>
@@ -496,7 +496,7 @@
       <w:r>
         <w:t xml:space="preserve">Direct link with title: </w:t>
       </w:r>
-      <w:hyperlink xmlns:r="http://schemas.openxmlformats.org/officeDocument/2006/relationships" w:history="true" r:id="R95af861af203426f">
+      <w:hyperlink xmlns:r="http://schemas.openxmlformats.org/officeDocument/2006/relationships" w:history="true" r:id="R651e3c54d05a4acd">
         <w:r>
           <w:rPr>
             <w:rStyle w:val="Hyperlink"/>
@@ -517,7 +517,7 @@
       <w:r>
         <w:t xml:space="preserve">Reference-style link: </w:t>
       </w:r>
-      <w:hyperlink xmlns:r="http://schemas.openxmlformats.org/officeDocument/2006/relationships" w:history="true" r:id="Raaf7988af4aa4c0c">
+      <w:hyperlink xmlns:r="http://schemas.openxmlformats.org/officeDocument/2006/relationships" w:history="true" r:id="Rf191822b1c2a4f03">
         <w:r>
           <w:rPr>
             <w:rStyle w:val="Hyperlink"/>
@@ -538,7 +538,7 @@
       <w:r>
         <w:t xml:space="preserve">Collapsed reference link: </w:t>
       </w:r>
-      <w:hyperlink xmlns:r="http://schemas.openxmlformats.org/officeDocument/2006/relationships" w:history="true" r:id="R5d8c22344f0a4ea8">
+      <w:hyperlink xmlns:r="http://schemas.openxmlformats.org/officeDocument/2006/relationships" w:history="true" r:id="R7c46f981e39541cd">
         <w:r>
           <w:rPr>
             <w:rStyle w:val="Hyperlink"/>
@@ -559,7 +559,7 @@
       <w:r>
         <w:t xml:space="preserve">Repeated reference link: </w:t>
       </w:r>
-      <w:hyperlink xmlns:r="http://schemas.openxmlformats.org/officeDocument/2006/relationships" w:history="true" r:id="Rac8d6de0e53642c5">
+      <w:hyperlink xmlns:r="http://schemas.openxmlformats.org/officeDocument/2006/relationships" w:history="true" r:id="R511b88d382864c87">
         <w:r>
           <w:rPr>
             <w:rStyle w:val="Hyperlink"/>
@@ -580,7 +580,7 @@
       <w:r>
         <w:t xml:space="preserve">Autolink URL: </w:t>
       </w:r>
-      <w:hyperlink xmlns:r="http://schemas.openxmlformats.org/officeDocument/2006/relationships" w:history="true" r:id="R9c472442b88b4668">
+      <w:hyperlink xmlns:r="http://schemas.openxmlformats.org/officeDocument/2006/relationships" w:history="true" r:id="R8e668f4e167a4908">
         <w:r>
           <w:rPr>
             <w:rStyle w:val="Hyperlink"/>
@@ -601,7 +601,7 @@
       <w:r>
         <w:t xml:space="preserve">Autolink email: </w:t>
       </w:r>
-      <w:hyperlink xmlns:r="http://schemas.openxmlformats.org/officeDocument/2006/relationships" w:history="true" r:id="R933bd9c3ade0438f">
+      <w:hyperlink xmlns:r="http://schemas.openxmlformats.org/officeDocument/2006/relationships" w:history="true" r:id="R765c0a53911b4ce4">
         <w:r>
           <w:rPr>
             <w:rStyle w:val="Hyperlink"/>
@@ -700,7 +700,7 @@
       <w:r>
         <w:t xml:space="preserve">, and </w:t>
       </w:r>
-      <w:hyperlink xmlns:r="http://schemas.openxmlformats.org/officeDocument/2006/relationships" w:history="true" r:id="Rab35412836dc4d5b">
+      <w:hyperlink xmlns:r="http://schemas.openxmlformats.org/officeDocument/2006/relationships" w:history="true" r:id="R5f8e3802d4064180">
         <w:r>
           <w:rPr>
             <w:rStyle w:val="Hyperlink"/>
@@ -1093,7 +1093,7 @@
       <w:r>
         <w:t xml:space="preserve">Continuation paragraph with </w:t>
       </w:r>
-      <w:hyperlink xmlns:r="http://schemas.openxmlformats.org/officeDocument/2006/relationships" w:history="true" r:id="R5517d96dd17043ae">
+      <w:hyperlink xmlns:r="http://schemas.openxmlformats.org/officeDocument/2006/relationships" w:history="true" r:id="R4fa02526dfab4c71">
         <w:r>
           <w:rPr>
             <w:rStyle w:val="Hyperlink"/>
@@ -1591,7 +1591,7 @@
       <w:r>
         <w:t xml:space="preserve">, and </w:t>
       </w:r>
-      <w:hyperlink xmlns:r="http://schemas.openxmlformats.org/officeDocument/2006/relationships" w:history="true" r:id="Rd7a04d1faed84543">
+      <w:hyperlink xmlns:r="http://schemas.openxmlformats.org/officeDocument/2006/relationships" w:history="true" r:id="Rcfba1d124f6e4e79">
         <w:r>
           <w:rPr>
             <w:rStyle w:val="Hyperlink"/>
@@ -1979,7 +1979,7 @@
                     <pic:cNvPicPr/>
                   </pic:nvPicPr>
                   <pic:blipFill>
-                    <a:blip xmlns:r="http://schemas.openxmlformats.org/officeDocument/2006/relationships" r:embed="R426ff56e21e94e5b"/>
+                    <a:blip xmlns:r="http://schemas.openxmlformats.org/officeDocument/2006/relationships" r:embed="R16fd271baaa94b4a"/>
                     <a:stretch>
                       <a:fillRect/>
                     </a:stretch>
@@ -2039,7 +2039,7 @@
                     <pic:cNvPicPr/>
                   </pic:nvPicPr>
                   <pic:blipFill>
-                    <a:blip xmlns:r="http://schemas.openxmlformats.org/officeDocument/2006/relationships" r:embed="R2255a4e47fcd49c6"/>
+                    <a:blip xmlns:r="http://schemas.openxmlformats.org/officeDocument/2006/relationships" r:embed="Rd27ff982a4924760"/>
                     <a:stretch>
                       <a:fillRect/>
                     </a:stretch>
@@ -2099,7 +2099,7 @@
                     <pic:cNvPicPr/>
                   </pic:nvPicPr>
                   <pic:blipFill>
-                    <a:blip xmlns:r="http://schemas.openxmlformats.org/officeDocument/2006/relationships" r:embed="Rc89721bcac134a95"/>
+                    <a:blip xmlns:r="http://schemas.openxmlformats.org/officeDocument/2006/relationships" r:embed="Rd75f88989d574c38"/>
                     <a:stretch>
                       <a:fillRect/>
                     </a:stretch>
@@ -2150,7 +2150,7 @@
                     <pic:cNvPicPr/>
                   </pic:nvPicPr>
                   <pic:blipFill>
-                    <a:blip xmlns:r="http://schemas.openxmlformats.org/officeDocument/2006/relationships" r:embed="Re8e89b8fa8624233"/>
+                    <a:blip xmlns:r="http://schemas.openxmlformats.org/officeDocument/2006/relationships" r:embed="Rb950abd3f04848b1"/>
                     <a:stretch>
                       <a:fillRect/>
                     </a:stretch>
@@ -2201,7 +2201,7 @@
                     <pic:cNvPicPr/>
                   </pic:nvPicPr>
                   <pic:blipFill>
-                    <a:blip xmlns:r="http://schemas.openxmlformats.org/officeDocument/2006/relationships" r:embed="R21a51e58c5af4260"/>
+                    <a:blip xmlns:r="http://schemas.openxmlformats.org/officeDocument/2006/relationships" r:embed="Rb45a55961c404297"/>
                     <a:stretch>
                       <a:fillRect/>
                     </a:stretch>
@@ -2252,7 +2252,7 @@
                     <pic:cNvPicPr/>
                   </pic:nvPicPr>
                   <pic:blipFill>
-                    <a:blip xmlns:r="http://schemas.openxmlformats.org/officeDocument/2006/relationships" r:embed="Re83c27074d9148da"/>
+                    <a:blip xmlns:r="http://schemas.openxmlformats.org/officeDocument/2006/relationships" r:embed="R5ccff5cbc0fb4f83"/>
                     <a:stretch>
                       <a:fillRect/>
                     </a:stretch>
@@ -2303,7 +2303,7 @@
                     <pic:cNvPicPr/>
                   </pic:nvPicPr>
                   <pic:blipFill>
-                    <a:blip xmlns:r="http://schemas.openxmlformats.org/officeDocument/2006/relationships" r:embed="R5833ee66c15d4649"/>
+                    <a:blip xmlns:r="http://schemas.openxmlformats.org/officeDocument/2006/relationships" r:embed="Raa2746ee0ce24356"/>
                     <a:stretch>
                       <a:fillRect/>
                     </a:stretch>
@@ -2354,7 +2354,7 @@
                     <pic:cNvPicPr/>
                   </pic:nvPicPr>
                   <pic:blipFill>
-                    <a:blip xmlns:r="http://schemas.openxmlformats.org/officeDocument/2006/relationships" r:embed="Rfb7b3488ed3f4915"/>
+                    <a:blip xmlns:r="http://schemas.openxmlformats.org/officeDocument/2006/relationships" r:embed="Rfc9fb8ce9fa7465d"/>
                     <a:stretch>
                       <a:fillRect/>
                     </a:stretch>
@@ -2430,7 +2430,7 @@
                     <pic:cNvPicPr/>
                   </pic:nvPicPr>
                   <pic:blipFill>
-                    <a:blip xmlns:r="http://schemas.openxmlformats.org/officeDocument/2006/relationships" r:embed="Rdf09060327d74eae"/>
+                    <a:blip xmlns:r="http://schemas.openxmlformats.org/officeDocument/2006/relationships" r:embed="R589a30273b9345aa"/>
                     <a:stretch>
                       <a:fillRect/>
                     </a:stretch>
@@ -2481,7 +2481,7 @@
                     <pic:cNvPicPr/>
                   </pic:nvPicPr>
                   <pic:blipFill>
-                    <a:blip xmlns:r="http://schemas.openxmlformats.org/officeDocument/2006/relationships" r:embed="R5b65ea18d2914a95"/>
+                    <a:blip xmlns:r="http://schemas.openxmlformats.org/officeDocument/2006/relationships" r:embed="R2a1c994120c24a7b"/>
                     <a:stretch>
                       <a:fillRect/>
                     </a:stretch>
@@ -2532,7 +2532,7 @@
                     <pic:cNvPicPr/>
                   </pic:nvPicPr>
                   <pic:blipFill>
-                    <a:blip xmlns:r="http://schemas.openxmlformats.org/officeDocument/2006/relationships" r:embed="R07c3c2793bcf4557"/>
+                    <a:blip xmlns:r="http://schemas.openxmlformats.org/officeDocument/2006/relationships" r:embed="R15b3ff00acdc40c0"/>
                     <a:stretch>
                       <a:fillRect/>
                     </a:stretch>
@@ -2583,7 +2583,7 @@
                     <pic:cNvPicPr/>
                   </pic:nvPicPr>
                   <pic:blipFill>
-                    <a:blip xmlns:r="http://schemas.openxmlformats.org/officeDocument/2006/relationships" r:embed="R63c5393a00fb43d7"/>
+                    <a:blip xmlns:r="http://schemas.openxmlformats.org/officeDocument/2006/relationships" r:embed="Rd79158861d6e4396"/>
                     <a:stretch>
                       <a:fillRect/>
                     </a:stretch>
@@ -2659,7 +2659,7 @@
                     <pic:cNvPicPr/>
                   </pic:nvPicPr>
                   <pic:blipFill>
-                    <a:blip xmlns:r="http://schemas.openxmlformats.org/officeDocument/2006/relationships" r:embed="R83af4e9065d64953"/>
+                    <a:blip xmlns:r="http://schemas.openxmlformats.org/officeDocument/2006/relationships" r:embed="Rd1df19b03d504651"/>
                     <a:stretch>
                       <a:fillRect/>
                     </a:stretch>
@@ -2710,7 +2710,7 @@
                     <pic:cNvPicPr/>
                   </pic:nvPicPr>
                   <pic:blipFill>
-                    <a:blip xmlns:r="http://schemas.openxmlformats.org/officeDocument/2006/relationships" r:embed="Rc806c6b30a574eb9"/>
+                    <a:blip xmlns:r="http://schemas.openxmlformats.org/officeDocument/2006/relationships" r:embed="R782ef6d5b513430a"/>
                     <a:stretch>
                       <a:fillRect/>
                     </a:stretch>
@@ -2761,7 +2761,7 @@
                     <pic:cNvPicPr/>
                   </pic:nvPicPr>
                   <pic:blipFill>
-                    <a:blip xmlns:r="http://schemas.openxmlformats.org/officeDocument/2006/relationships" r:embed="R1a70749f0ddb4751"/>
+                    <a:blip xmlns:r="http://schemas.openxmlformats.org/officeDocument/2006/relationships" r:embed="Rb3f45a59cc8f4e4b"/>
                     <a:stretch>
                       <a:fillRect/>
                     </a:stretch>
@@ -2812,7 +2812,7 @@
                     <pic:cNvPicPr/>
                   </pic:nvPicPr>
                   <pic:blipFill>
-                    <a:blip xmlns:r="http://schemas.openxmlformats.org/officeDocument/2006/relationships" r:embed="R6746a0db4f86482e"/>
+                    <a:blip xmlns:r="http://schemas.openxmlformats.org/officeDocument/2006/relationships" r:embed="R897308db0e704476"/>
                     <a:stretch>
                       <a:fillRect/>
                     </a:stretch>
@@ -2863,7 +2863,7 @@
                     <pic:cNvPicPr/>
                   </pic:nvPicPr>
                   <pic:blipFill>
-                    <a:blip xmlns:r="http://schemas.openxmlformats.org/officeDocument/2006/relationships" r:embed="R5f273899a6ce43cd"/>
+                    <a:blip xmlns:r="http://schemas.openxmlformats.org/officeDocument/2006/relationships" r:embed="R7a0d7957d8724a72"/>
                     <a:stretch>
                       <a:fillRect/>
                     </a:stretch>
@@ -2914,7 +2914,7 @@
                     <pic:cNvPicPr/>
                   </pic:nvPicPr>
                   <pic:blipFill>
-                    <a:blip xmlns:r="http://schemas.openxmlformats.org/officeDocument/2006/relationships" r:embed="Rdf94174d54394c66"/>
+                    <a:blip xmlns:r="http://schemas.openxmlformats.org/officeDocument/2006/relationships" r:embed="Red5fd022f57048d7"/>
                     <a:stretch>
                       <a:fillRect/>
                     </a:stretch>
@@ -2965,7 +2965,7 @@
                     <pic:cNvPicPr/>
                   </pic:nvPicPr>
                   <pic:blipFill>
-                    <a:blip xmlns:r="http://schemas.openxmlformats.org/officeDocument/2006/relationships" r:embed="R6b64dfdc69d045a5"/>
+                    <a:blip xmlns:r="http://schemas.openxmlformats.org/officeDocument/2006/relationships" r:embed="Refbad2efe3554a4b"/>
                     <a:stretch>
                       <a:fillRect/>
                     </a:stretch>
@@ -3016,7 +3016,7 @@
                     <pic:cNvPicPr/>
                   </pic:nvPicPr>
                   <pic:blipFill>
-                    <a:blip xmlns:r="http://schemas.openxmlformats.org/officeDocument/2006/relationships" r:embed="Rbde62ed24b714c7c"/>
+                    <a:blip xmlns:r="http://schemas.openxmlformats.org/officeDocument/2006/relationships" r:embed="R96374bb5872f4817"/>
                     <a:stretch>
                       <a:fillRect/>
                     </a:stretch>
@@ -3067,7 +3067,7 @@
                     <pic:cNvPicPr/>
                   </pic:nvPicPr>
                   <pic:blipFill>
-                    <a:blip xmlns:r="http://schemas.openxmlformats.org/officeDocument/2006/relationships" r:embed="Ra580e35ddebf4c49"/>
+                    <a:blip xmlns:r="http://schemas.openxmlformats.org/officeDocument/2006/relationships" r:embed="Re9ea1d13db9f4804"/>
                     <a:stretch>
                       <a:fillRect/>
                     </a:stretch>
@@ -3118,7 +3118,7 @@
                     <pic:cNvPicPr/>
                   </pic:nvPicPr>
                   <pic:blipFill>
-                    <a:blip xmlns:r="http://schemas.openxmlformats.org/officeDocument/2006/relationships" r:embed="Rac0525015f25421e"/>
+                    <a:blip xmlns:r="http://schemas.openxmlformats.org/officeDocument/2006/relationships" r:embed="R5268b30da1044cdb"/>
                     <a:stretch>
                       <a:fillRect/>
                     </a:stretch>
@@ -3169,7 +3169,7 @@
                     <pic:cNvPicPr/>
                   </pic:nvPicPr>
                   <pic:blipFill>
-                    <a:blip xmlns:r="http://schemas.openxmlformats.org/officeDocument/2006/relationships" r:embed="R61ba4c8e03ff4281"/>
+                    <a:blip xmlns:r="http://schemas.openxmlformats.org/officeDocument/2006/relationships" r:embed="R2def1659af7f4a25"/>
                     <a:stretch>
                       <a:fillRect/>
                     </a:stretch>
@@ -3220,7 +3220,7 @@
                     <pic:cNvPicPr/>
                   </pic:nvPicPr>
                   <pic:blipFill>
-                    <a:blip xmlns:r="http://schemas.openxmlformats.org/officeDocument/2006/relationships" r:embed="R249f821ecca24c9b"/>
+                    <a:blip xmlns:r="http://schemas.openxmlformats.org/officeDocument/2006/relationships" r:embed="R4c48d0ca41d14894"/>
                     <a:stretch>
                       <a:fillRect/>
                     </a:stretch>
@@ -3271,7 +3271,7 @@
                     <pic:cNvPicPr/>
                   </pic:nvPicPr>
                   <pic:blipFill>
-                    <a:blip xmlns:r="http://schemas.openxmlformats.org/officeDocument/2006/relationships" r:embed="R7b29c77f33364b08"/>
+                    <a:blip xmlns:r="http://schemas.openxmlformats.org/officeDocument/2006/relationships" r:embed="R9128e9e717db4887"/>
                     <a:stretch>
                       <a:fillRect/>
                     </a:stretch>
@@ -3322,7 +3322,7 @@
                     <pic:cNvPicPr/>
                   </pic:nvPicPr>
                   <pic:blipFill>
-                    <a:blip xmlns:r="http://schemas.openxmlformats.org/officeDocument/2006/relationships" r:embed="R44a68ac371a641ba"/>
+                    <a:blip xmlns:r="http://schemas.openxmlformats.org/officeDocument/2006/relationships" r:embed="R8bd1f5e37ca04e7b"/>
                     <a:stretch>
                       <a:fillRect/>
                     </a:stretch>
@@ -3419,7 +3419,7 @@
                     <pic:cNvPicPr/>
                   </pic:nvPicPr>
                   <pic:blipFill>
-                    <a:blip xmlns:r="http://schemas.openxmlformats.org/officeDocument/2006/relationships" r:embed="R3bb4f22e62824dfb"/>
+                    <a:blip xmlns:r="http://schemas.openxmlformats.org/officeDocument/2006/relationships" r:embed="R67f63577880c43d4"/>
                     <a:stretch>
                       <a:fillRect/>
                     </a:stretch>
@@ -3462,7 +3462,7 @@
                     <pic:cNvPicPr/>
                   </pic:nvPicPr>
                   <pic:blipFill>
-                    <a:blip xmlns:r="http://schemas.openxmlformats.org/officeDocument/2006/relationships" r:embed="Ra1ef38dcf14a4aef"/>
+                    <a:blip xmlns:r="http://schemas.openxmlformats.org/officeDocument/2006/relationships" r:embed="Raf98eecd228a456b"/>
                     <a:stretch>
                       <a:fillRect/>
                     </a:stretch>
@@ -3505,7 +3505,7 @@
                     <pic:cNvPicPr/>
                   </pic:nvPicPr>
                   <pic:blipFill>
-                    <a:blip xmlns:r="http://schemas.openxmlformats.org/officeDocument/2006/relationships" r:embed="R89017d6897934c32"/>
+                    <a:blip xmlns:r="http://schemas.openxmlformats.org/officeDocument/2006/relationships" r:embed="R52700498be884a5b"/>
                     <a:stretch>
                       <a:fillRect/>
                     </a:stretch>
@@ -3548,7 +3548,7 @@
                     <pic:cNvPicPr/>
                   </pic:nvPicPr>
                   <pic:blipFill>
-                    <a:blip xmlns:r="http://schemas.openxmlformats.org/officeDocument/2006/relationships" r:embed="Raa4c4685ff5c4d8e"/>
+                    <a:blip xmlns:r="http://schemas.openxmlformats.org/officeDocument/2006/relationships" r:embed="R9c9b98aafde64ac8"/>
                     <a:stretch>
                       <a:fillRect/>
                     </a:stretch>
@@ -3933,7 +3933,7 @@
                     <pic:cNvPicPr/>
                   </pic:nvPicPr>
                   <pic:blipFill>
-                    <a:blip xmlns:r="http://schemas.openxmlformats.org/officeDocument/2006/relationships" r:embed="R4af28609934d469c"/>
+                    <a:blip xmlns:r="http://schemas.openxmlformats.org/officeDocument/2006/relationships" r:embed="Rd154574b95814b8f"/>
                     <a:stretch>
                       <a:fillRect/>
                     </a:stretch>
@@ -4125,7 +4125,7 @@
                     <pic:cNvPicPr/>
                   </pic:nvPicPr>
                   <pic:blipFill>
-                    <a:blip xmlns:r="http://schemas.openxmlformats.org/officeDocument/2006/relationships" r:embed="Rec07e5b5bb9e4ed6"/>
+                    <a:blip xmlns:r="http://schemas.openxmlformats.org/officeDocument/2006/relationships" r:embed="R38be7ea2a7634236"/>
                     <a:stretch>
                       <a:fillRect/>
                     </a:stretch>
@@ -4176,7 +4176,7 @@
                     <pic:cNvPicPr/>
                   </pic:nvPicPr>
                   <pic:blipFill>
-                    <a:blip xmlns:r="http://schemas.openxmlformats.org/officeDocument/2006/relationships" r:embed="R42556c079741441c"/>
+                    <a:blip xmlns:r="http://schemas.openxmlformats.org/officeDocument/2006/relationships" r:embed="R95853f4e12ce4d19"/>
                     <a:stretch>
                       <a:fillRect/>
                     </a:stretch>
@@ -4227,7 +4227,7 @@
                     <pic:cNvPicPr/>
                   </pic:nvPicPr>
                   <pic:blipFill>
-                    <a:blip xmlns:r="http://schemas.openxmlformats.org/officeDocument/2006/relationships" r:embed="R003630989fb24478"/>
+                    <a:blip xmlns:r="http://schemas.openxmlformats.org/officeDocument/2006/relationships" r:embed="R9a694ebac8ae4067"/>
                     <a:stretch>
                       <a:fillRect/>
                     </a:stretch>
@@ -4278,7 +4278,7 @@
                     <pic:cNvPicPr/>
                   </pic:nvPicPr>
                   <pic:blipFill>
-                    <a:blip xmlns:r="http://schemas.openxmlformats.org/officeDocument/2006/relationships" r:embed="R93edc1ead11e49ca"/>
+                    <a:blip xmlns:r="http://schemas.openxmlformats.org/officeDocument/2006/relationships" r:embed="R50c1e33e45fd4a78"/>
                     <a:stretch>
                       <a:fillRect/>
                     </a:stretch>
@@ -4657,7 +4657,7 @@
                     <pic:cNvPicPr/>
                   </pic:nvPicPr>
                   <pic:blipFill>
-                    <a:blip xmlns:r="http://schemas.openxmlformats.org/officeDocument/2006/relationships" r:embed="R9b2cc214ed4b4306"/>
+                    <a:blip xmlns:r="http://schemas.openxmlformats.org/officeDocument/2006/relationships" r:embed="Rf1275406b8bf449f"/>
                     <a:stretch>
                       <a:fillRect/>
                     </a:stretch>
@@ -5338,7 +5338,7 @@
             <w:r>
               <w:t xml:space="preserve">Cell with </w:t>
             </w:r>
-            <w:hyperlink xmlns:r="http://schemas.openxmlformats.org/officeDocument/2006/relationships" w:history="true" r:id="Rbea2e930860c4a01">
+            <w:hyperlink xmlns:r="http://schemas.openxmlformats.org/officeDocument/2006/relationships" w:history="true" r:id="Re1146b8bcb1f42ea">
               <w:r>
                 <w:rPr>
                   <w:rStyle w:val="Hyperlink"/>
@@ -5624,7 +5624,7 @@
                           <pic:cNvPicPr/>
                         </pic:nvPicPr>
                         <pic:blipFill>
-                          <a:blip xmlns:r="http://schemas.openxmlformats.org/officeDocument/2006/relationships" r:embed="R83de69b64bb74684"/>
+                          <a:blip xmlns:r="http://schemas.openxmlformats.org/officeDocument/2006/relationships" r:embed="R312b454d0b494eda"/>
                           <a:stretch>
                             <a:fillRect/>
                           </a:stretch>
@@ -5724,7 +5724,7 @@
                     <pic:cNvPicPr/>
                   </pic:nvPicPr>
                   <pic:blipFill>
-                    <a:blip xmlns:r="http://schemas.openxmlformats.org/officeDocument/2006/relationships" r:embed="Rc4fce830473546fc"/>
+                    <a:blip xmlns:r="http://schemas.openxmlformats.org/officeDocument/2006/relationships" r:embed="R4f9ca46e7f214011"/>
                     <a:stretch>
                       <a:fillRect/>
                     </a:stretch>
@@ -5774,7 +5774,7 @@
                     <pic:cNvPicPr/>
                   </pic:nvPicPr>
                   <pic:blipFill>
-                    <a:blip xmlns:r="http://schemas.openxmlformats.org/officeDocument/2006/relationships" r:embed="R8dfb5e5b53bb4646"/>
+                    <a:blip xmlns:r="http://schemas.openxmlformats.org/officeDocument/2006/relationships" r:embed="Rf23a8e829c6e4d34"/>
                     <a:stretch>
                       <a:fillRect/>
                     </a:stretch>
@@ -5824,7 +5824,7 @@
                     <pic:cNvPicPr/>
                   </pic:nvPicPr>
                   <pic:blipFill>
-                    <a:blip xmlns:r="http://schemas.openxmlformats.org/officeDocument/2006/relationships" r:embed="R04f2a244389641f7"/>
+                    <a:blip xmlns:r="http://schemas.openxmlformats.org/officeDocument/2006/relationships" r:embed="R2d712eef457a46bc"/>
                     <a:stretch>
                       <a:fillRect/>
                     </a:stretch>

</xml_diff>

<commit_message>
fix(er): enforce minimum straights per port side
For scenario 2 matrix edges, enforce minimum straight exit/entry segments based on the actual port side (left/right => horizontal, top/bottom => vertical) rather than overall Dx/Dy.

Made-with: Cursor
</commit_message>
<xml_diff>
--- a/test.docx
+++ b/test.docx
@@ -236,7 +236,7 @@
       <w:r>
         <w:t xml:space="preserve">, and </w:t>
       </w:r>
-      <w:hyperlink xmlns:r="http://schemas.openxmlformats.org/officeDocument/2006/relationships" w:history="true" r:id="R5090cc0d0051473f">
+      <w:hyperlink xmlns:r="http://schemas.openxmlformats.org/officeDocument/2006/relationships" w:history="true" r:id="R0c182f3b60864e07">
         <w:r>
           <w:rPr>
             <w:rStyle w:val="Hyperlink"/>
@@ -475,7 +475,7 @@
       <w:r>
         <w:t xml:space="preserve">Direct link: </w:t>
       </w:r>
-      <w:hyperlink xmlns:r="http://schemas.openxmlformats.org/officeDocument/2006/relationships" w:history="true" r:id="Rcffcee6c635b4121">
+      <w:hyperlink xmlns:r="http://schemas.openxmlformats.org/officeDocument/2006/relationships" w:history="true" r:id="R7f92f990bb3443d5">
         <w:r>
           <w:rPr>
             <w:rStyle w:val="Hyperlink"/>
@@ -496,7 +496,7 @@
       <w:r>
         <w:t xml:space="preserve">Direct link with title: </w:t>
       </w:r>
-      <w:hyperlink xmlns:r="http://schemas.openxmlformats.org/officeDocument/2006/relationships" w:history="true" r:id="R651e3c54d05a4acd">
+      <w:hyperlink xmlns:r="http://schemas.openxmlformats.org/officeDocument/2006/relationships" w:history="true" r:id="R998f21270fd24019">
         <w:r>
           <w:rPr>
             <w:rStyle w:val="Hyperlink"/>
@@ -517,7 +517,7 @@
       <w:r>
         <w:t xml:space="preserve">Reference-style link: </w:t>
       </w:r>
-      <w:hyperlink xmlns:r="http://schemas.openxmlformats.org/officeDocument/2006/relationships" w:history="true" r:id="Rf191822b1c2a4f03">
+      <w:hyperlink xmlns:r="http://schemas.openxmlformats.org/officeDocument/2006/relationships" w:history="true" r:id="R88c59f318e764361">
         <w:r>
           <w:rPr>
             <w:rStyle w:val="Hyperlink"/>
@@ -538,7 +538,7 @@
       <w:r>
         <w:t xml:space="preserve">Collapsed reference link: </w:t>
       </w:r>
-      <w:hyperlink xmlns:r="http://schemas.openxmlformats.org/officeDocument/2006/relationships" w:history="true" r:id="R7c46f981e39541cd">
+      <w:hyperlink xmlns:r="http://schemas.openxmlformats.org/officeDocument/2006/relationships" w:history="true" r:id="R9fab884f0ef64016">
         <w:r>
           <w:rPr>
             <w:rStyle w:val="Hyperlink"/>
@@ -559,7 +559,7 @@
       <w:r>
         <w:t xml:space="preserve">Repeated reference link: </w:t>
       </w:r>
-      <w:hyperlink xmlns:r="http://schemas.openxmlformats.org/officeDocument/2006/relationships" w:history="true" r:id="R511b88d382864c87">
+      <w:hyperlink xmlns:r="http://schemas.openxmlformats.org/officeDocument/2006/relationships" w:history="true" r:id="R17a0bc846d364158">
         <w:r>
           <w:rPr>
             <w:rStyle w:val="Hyperlink"/>
@@ -580,7 +580,7 @@
       <w:r>
         <w:t xml:space="preserve">Autolink URL: </w:t>
       </w:r>
-      <w:hyperlink xmlns:r="http://schemas.openxmlformats.org/officeDocument/2006/relationships" w:history="true" r:id="R8e668f4e167a4908">
+      <w:hyperlink xmlns:r="http://schemas.openxmlformats.org/officeDocument/2006/relationships" w:history="true" r:id="R51f8b66420234127">
         <w:r>
           <w:rPr>
             <w:rStyle w:val="Hyperlink"/>
@@ -601,7 +601,7 @@
       <w:r>
         <w:t xml:space="preserve">Autolink email: </w:t>
       </w:r>
-      <w:hyperlink xmlns:r="http://schemas.openxmlformats.org/officeDocument/2006/relationships" w:history="true" r:id="R765c0a53911b4ce4">
+      <w:hyperlink xmlns:r="http://schemas.openxmlformats.org/officeDocument/2006/relationships" w:history="true" r:id="Rbda0da3ab09f449b">
         <w:r>
           <w:rPr>
             <w:rStyle w:val="Hyperlink"/>
@@ -700,7 +700,7 @@
       <w:r>
         <w:t xml:space="preserve">, and </w:t>
       </w:r>
-      <w:hyperlink xmlns:r="http://schemas.openxmlformats.org/officeDocument/2006/relationships" w:history="true" r:id="R5f8e3802d4064180">
+      <w:hyperlink xmlns:r="http://schemas.openxmlformats.org/officeDocument/2006/relationships" w:history="true" r:id="R823ecdcb601141a3">
         <w:r>
           <w:rPr>
             <w:rStyle w:val="Hyperlink"/>
@@ -1093,7 +1093,7 @@
       <w:r>
         <w:t xml:space="preserve">Continuation paragraph with </w:t>
       </w:r>
-      <w:hyperlink xmlns:r="http://schemas.openxmlformats.org/officeDocument/2006/relationships" w:history="true" r:id="R4fa02526dfab4c71">
+      <w:hyperlink xmlns:r="http://schemas.openxmlformats.org/officeDocument/2006/relationships" w:history="true" r:id="R613f4b2f3db14a9f">
         <w:r>
           <w:rPr>
             <w:rStyle w:val="Hyperlink"/>
@@ -1591,7 +1591,7 @@
       <w:r>
         <w:t xml:space="preserve">, and </w:t>
       </w:r>
-      <w:hyperlink xmlns:r="http://schemas.openxmlformats.org/officeDocument/2006/relationships" w:history="true" r:id="Rcfba1d124f6e4e79">
+      <w:hyperlink xmlns:r="http://schemas.openxmlformats.org/officeDocument/2006/relationships" w:history="true" r:id="R84a80115e83b4d71">
         <w:r>
           <w:rPr>
             <w:rStyle w:val="Hyperlink"/>
@@ -1979,7 +1979,7 @@
                     <pic:cNvPicPr/>
                   </pic:nvPicPr>
                   <pic:blipFill>
-                    <a:blip xmlns:r="http://schemas.openxmlformats.org/officeDocument/2006/relationships" r:embed="R16fd271baaa94b4a"/>
+                    <a:blip xmlns:r="http://schemas.openxmlformats.org/officeDocument/2006/relationships" r:embed="Rc2e2fd4ef1b8480d"/>
                     <a:stretch>
                       <a:fillRect/>
                     </a:stretch>
@@ -2039,7 +2039,7 @@
                     <pic:cNvPicPr/>
                   </pic:nvPicPr>
                   <pic:blipFill>
-                    <a:blip xmlns:r="http://schemas.openxmlformats.org/officeDocument/2006/relationships" r:embed="Rd27ff982a4924760"/>
+                    <a:blip xmlns:r="http://schemas.openxmlformats.org/officeDocument/2006/relationships" r:embed="R2c63ff023cac4055"/>
                     <a:stretch>
                       <a:fillRect/>
                     </a:stretch>
@@ -2099,7 +2099,7 @@
                     <pic:cNvPicPr/>
                   </pic:nvPicPr>
                   <pic:blipFill>
-                    <a:blip xmlns:r="http://schemas.openxmlformats.org/officeDocument/2006/relationships" r:embed="Rd75f88989d574c38"/>
+                    <a:blip xmlns:r="http://schemas.openxmlformats.org/officeDocument/2006/relationships" r:embed="Rd00334e268344dbe"/>
                     <a:stretch>
                       <a:fillRect/>
                     </a:stretch>
@@ -2150,7 +2150,7 @@
                     <pic:cNvPicPr/>
                   </pic:nvPicPr>
                   <pic:blipFill>
-                    <a:blip xmlns:r="http://schemas.openxmlformats.org/officeDocument/2006/relationships" r:embed="Rb950abd3f04848b1"/>
+                    <a:blip xmlns:r="http://schemas.openxmlformats.org/officeDocument/2006/relationships" r:embed="Rfd3a2ee90b164a86"/>
                     <a:stretch>
                       <a:fillRect/>
                     </a:stretch>
@@ -2201,7 +2201,7 @@
                     <pic:cNvPicPr/>
                   </pic:nvPicPr>
                   <pic:blipFill>
-                    <a:blip xmlns:r="http://schemas.openxmlformats.org/officeDocument/2006/relationships" r:embed="Rb45a55961c404297"/>
+                    <a:blip xmlns:r="http://schemas.openxmlformats.org/officeDocument/2006/relationships" r:embed="Rec6081ce6a1a450c"/>
                     <a:stretch>
                       <a:fillRect/>
                     </a:stretch>
@@ -2252,7 +2252,7 @@
                     <pic:cNvPicPr/>
                   </pic:nvPicPr>
                   <pic:blipFill>
-                    <a:blip xmlns:r="http://schemas.openxmlformats.org/officeDocument/2006/relationships" r:embed="R5ccff5cbc0fb4f83"/>
+                    <a:blip xmlns:r="http://schemas.openxmlformats.org/officeDocument/2006/relationships" r:embed="R96782daedb024039"/>
                     <a:stretch>
                       <a:fillRect/>
                     </a:stretch>
@@ -2303,7 +2303,7 @@
                     <pic:cNvPicPr/>
                   </pic:nvPicPr>
                   <pic:blipFill>
-                    <a:blip xmlns:r="http://schemas.openxmlformats.org/officeDocument/2006/relationships" r:embed="Raa2746ee0ce24356"/>
+                    <a:blip xmlns:r="http://schemas.openxmlformats.org/officeDocument/2006/relationships" r:embed="R67a50af111494e36"/>
                     <a:stretch>
                       <a:fillRect/>
                     </a:stretch>
@@ -2354,7 +2354,7 @@
                     <pic:cNvPicPr/>
                   </pic:nvPicPr>
                   <pic:blipFill>
-                    <a:blip xmlns:r="http://schemas.openxmlformats.org/officeDocument/2006/relationships" r:embed="Rfc9fb8ce9fa7465d"/>
+                    <a:blip xmlns:r="http://schemas.openxmlformats.org/officeDocument/2006/relationships" r:embed="Rb9ebfd89f3d14565"/>
                     <a:stretch>
                       <a:fillRect/>
                     </a:stretch>
@@ -2430,7 +2430,7 @@
                     <pic:cNvPicPr/>
                   </pic:nvPicPr>
                   <pic:blipFill>
-                    <a:blip xmlns:r="http://schemas.openxmlformats.org/officeDocument/2006/relationships" r:embed="R589a30273b9345aa"/>
+                    <a:blip xmlns:r="http://schemas.openxmlformats.org/officeDocument/2006/relationships" r:embed="R496b827ea596471d"/>
                     <a:stretch>
                       <a:fillRect/>
                     </a:stretch>
@@ -2481,7 +2481,7 @@
                     <pic:cNvPicPr/>
                   </pic:nvPicPr>
                   <pic:blipFill>
-                    <a:blip xmlns:r="http://schemas.openxmlformats.org/officeDocument/2006/relationships" r:embed="R2a1c994120c24a7b"/>
+                    <a:blip xmlns:r="http://schemas.openxmlformats.org/officeDocument/2006/relationships" r:embed="R453e6e6d86544e31"/>
                     <a:stretch>
                       <a:fillRect/>
                     </a:stretch>
@@ -2532,7 +2532,7 @@
                     <pic:cNvPicPr/>
                   </pic:nvPicPr>
                   <pic:blipFill>
-                    <a:blip xmlns:r="http://schemas.openxmlformats.org/officeDocument/2006/relationships" r:embed="R15b3ff00acdc40c0"/>
+                    <a:blip xmlns:r="http://schemas.openxmlformats.org/officeDocument/2006/relationships" r:embed="R946010e4be0a4259"/>
                     <a:stretch>
                       <a:fillRect/>
                     </a:stretch>
@@ -2583,7 +2583,7 @@
                     <pic:cNvPicPr/>
                   </pic:nvPicPr>
                   <pic:blipFill>
-                    <a:blip xmlns:r="http://schemas.openxmlformats.org/officeDocument/2006/relationships" r:embed="Rd79158861d6e4396"/>
+                    <a:blip xmlns:r="http://schemas.openxmlformats.org/officeDocument/2006/relationships" r:embed="Rc01918615b114651"/>
                     <a:stretch>
                       <a:fillRect/>
                     </a:stretch>
@@ -2659,7 +2659,7 @@
                     <pic:cNvPicPr/>
                   </pic:nvPicPr>
                   <pic:blipFill>
-                    <a:blip xmlns:r="http://schemas.openxmlformats.org/officeDocument/2006/relationships" r:embed="Rd1df19b03d504651"/>
+                    <a:blip xmlns:r="http://schemas.openxmlformats.org/officeDocument/2006/relationships" r:embed="R643eef8d4ec749be"/>
                     <a:stretch>
                       <a:fillRect/>
                     </a:stretch>
@@ -2710,7 +2710,7 @@
                     <pic:cNvPicPr/>
                   </pic:nvPicPr>
                   <pic:blipFill>
-                    <a:blip xmlns:r="http://schemas.openxmlformats.org/officeDocument/2006/relationships" r:embed="R782ef6d5b513430a"/>
+                    <a:blip xmlns:r="http://schemas.openxmlformats.org/officeDocument/2006/relationships" r:embed="R501b0872fcd54c58"/>
                     <a:stretch>
                       <a:fillRect/>
                     </a:stretch>
@@ -2761,7 +2761,7 @@
                     <pic:cNvPicPr/>
                   </pic:nvPicPr>
                   <pic:blipFill>
-                    <a:blip xmlns:r="http://schemas.openxmlformats.org/officeDocument/2006/relationships" r:embed="Rb3f45a59cc8f4e4b"/>
+                    <a:blip xmlns:r="http://schemas.openxmlformats.org/officeDocument/2006/relationships" r:embed="R11007f35da0f46fa"/>
                     <a:stretch>
                       <a:fillRect/>
                     </a:stretch>
@@ -2812,7 +2812,7 @@
                     <pic:cNvPicPr/>
                   </pic:nvPicPr>
                   <pic:blipFill>
-                    <a:blip xmlns:r="http://schemas.openxmlformats.org/officeDocument/2006/relationships" r:embed="R897308db0e704476"/>
+                    <a:blip xmlns:r="http://schemas.openxmlformats.org/officeDocument/2006/relationships" r:embed="Ra47937e4c88947eb"/>
                     <a:stretch>
                       <a:fillRect/>
                     </a:stretch>
@@ -2863,7 +2863,7 @@
                     <pic:cNvPicPr/>
                   </pic:nvPicPr>
                   <pic:blipFill>
-                    <a:blip xmlns:r="http://schemas.openxmlformats.org/officeDocument/2006/relationships" r:embed="R7a0d7957d8724a72"/>
+                    <a:blip xmlns:r="http://schemas.openxmlformats.org/officeDocument/2006/relationships" r:embed="R230be6a570ab4c6a"/>
                     <a:stretch>
                       <a:fillRect/>
                     </a:stretch>
@@ -2914,7 +2914,7 @@
                     <pic:cNvPicPr/>
                   </pic:nvPicPr>
                   <pic:blipFill>
-                    <a:blip xmlns:r="http://schemas.openxmlformats.org/officeDocument/2006/relationships" r:embed="Red5fd022f57048d7"/>
+                    <a:blip xmlns:r="http://schemas.openxmlformats.org/officeDocument/2006/relationships" r:embed="R4d0ab97dca354c32"/>
                     <a:stretch>
                       <a:fillRect/>
                     </a:stretch>
@@ -2965,7 +2965,7 @@
                     <pic:cNvPicPr/>
                   </pic:nvPicPr>
                   <pic:blipFill>
-                    <a:blip xmlns:r="http://schemas.openxmlformats.org/officeDocument/2006/relationships" r:embed="Refbad2efe3554a4b"/>
+                    <a:blip xmlns:r="http://schemas.openxmlformats.org/officeDocument/2006/relationships" r:embed="Rf385b673be0444dd"/>
                     <a:stretch>
                       <a:fillRect/>
                     </a:stretch>
@@ -3016,7 +3016,7 @@
                     <pic:cNvPicPr/>
                   </pic:nvPicPr>
                   <pic:blipFill>
-                    <a:blip xmlns:r="http://schemas.openxmlformats.org/officeDocument/2006/relationships" r:embed="R96374bb5872f4817"/>
+                    <a:blip xmlns:r="http://schemas.openxmlformats.org/officeDocument/2006/relationships" r:embed="R999f4d8463c14f43"/>
                     <a:stretch>
                       <a:fillRect/>
                     </a:stretch>
@@ -3067,7 +3067,7 @@
                     <pic:cNvPicPr/>
                   </pic:nvPicPr>
                   <pic:blipFill>
-                    <a:blip xmlns:r="http://schemas.openxmlformats.org/officeDocument/2006/relationships" r:embed="Re9ea1d13db9f4804"/>
+                    <a:blip xmlns:r="http://schemas.openxmlformats.org/officeDocument/2006/relationships" r:embed="R89d8db2c4b994144"/>
                     <a:stretch>
                       <a:fillRect/>
                     </a:stretch>
@@ -3118,7 +3118,7 @@
                     <pic:cNvPicPr/>
                   </pic:nvPicPr>
                   <pic:blipFill>
-                    <a:blip xmlns:r="http://schemas.openxmlformats.org/officeDocument/2006/relationships" r:embed="R5268b30da1044cdb"/>
+                    <a:blip xmlns:r="http://schemas.openxmlformats.org/officeDocument/2006/relationships" r:embed="Red75d35297264eeb"/>
                     <a:stretch>
                       <a:fillRect/>
                     </a:stretch>
@@ -3169,7 +3169,7 @@
                     <pic:cNvPicPr/>
                   </pic:nvPicPr>
                   <pic:blipFill>
-                    <a:blip xmlns:r="http://schemas.openxmlformats.org/officeDocument/2006/relationships" r:embed="R2def1659af7f4a25"/>
+                    <a:blip xmlns:r="http://schemas.openxmlformats.org/officeDocument/2006/relationships" r:embed="Rab02b043b5ae4c1f"/>
                     <a:stretch>
                       <a:fillRect/>
                     </a:stretch>
@@ -3220,7 +3220,7 @@
                     <pic:cNvPicPr/>
                   </pic:nvPicPr>
                   <pic:blipFill>
-                    <a:blip xmlns:r="http://schemas.openxmlformats.org/officeDocument/2006/relationships" r:embed="R4c48d0ca41d14894"/>
+                    <a:blip xmlns:r="http://schemas.openxmlformats.org/officeDocument/2006/relationships" r:embed="R87fe474d54094625"/>
                     <a:stretch>
                       <a:fillRect/>
                     </a:stretch>
@@ -3271,7 +3271,7 @@
                     <pic:cNvPicPr/>
                   </pic:nvPicPr>
                   <pic:blipFill>
-                    <a:blip xmlns:r="http://schemas.openxmlformats.org/officeDocument/2006/relationships" r:embed="R9128e9e717db4887"/>
+                    <a:blip xmlns:r="http://schemas.openxmlformats.org/officeDocument/2006/relationships" r:embed="R6dd97fe51bce4b74"/>
                     <a:stretch>
                       <a:fillRect/>
                     </a:stretch>
@@ -3322,7 +3322,7 @@
                     <pic:cNvPicPr/>
                   </pic:nvPicPr>
                   <pic:blipFill>
-                    <a:blip xmlns:r="http://schemas.openxmlformats.org/officeDocument/2006/relationships" r:embed="R8bd1f5e37ca04e7b"/>
+                    <a:blip xmlns:r="http://schemas.openxmlformats.org/officeDocument/2006/relationships" r:embed="R669c530375cb4f87"/>
                     <a:stretch>
                       <a:fillRect/>
                     </a:stretch>
@@ -3419,7 +3419,7 @@
                     <pic:cNvPicPr/>
                   </pic:nvPicPr>
                   <pic:blipFill>
-                    <a:blip xmlns:r="http://schemas.openxmlformats.org/officeDocument/2006/relationships" r:embed="R67f63577880c43d4"/>
+                    <a:blip xmlns:r="http://schemas.openxmlformats.org/officeDocument/2006/relationships" r:embed="R0393686a2b9a4276"/>
                     <a:stretch>
                       <a:fillRect/>
                     </a:stretch>
@@ -3462,7 +3462,7 @@
                     <pic:cNvPicPr/>
                   </pic:nvPicPr>
                   <pic:blipFill>
-                    <a:blip xmlns:r="http://schemas.openxmlformats.org/officeDocument/2006/relationships" r:embed="Raf98eecd228a456b"/>
+                    <a:blip xmlns:r="http://schemas.openxmlformats.org/officeDocument/2006/relationships" r:embed="Ra126ad6a7c1a4fd1"/>
                     <a:stretch>
                       <a:fillRect/>
                     </a:stretch>
@@ -3505,7 +3505,7 @@
                     <pic:cNvPicPr/>
                   </pic:nvPicPr>
                   <pic:blipFill>
-                    <a:blip xmlns:r="http://schemas.openxmlformats.org/officeDocument/2006/relationships" r:embed="R52700498be884a5b"/>
+                    <a:blip xmlns:r="http://schemas.openxmlformats.org/officeDocument/2006/relationships" r:embed="R99d692cb4f114745"/>
                     <a:stretch>
                       <a:fillRect/>
                     </a:stretch>
@@ -3548,7 +3548,7 @@
                     <pic:cNvPicPr/>
                   </pic:nvPicPr>
                   <pic:blipFill>
-                    <a:blip xmlns:r="http://schemas.openxmlformats.org/officeDocument/2006/relationships" r:embed="R9c9b98aafde64ac8"/>
+                    <a:blip xmlns:r="http://schemas.openxmlformats.org/officeDocument/2006/relationships" r:embed="R07ae16e0de9b4320"/>
                     <a:stretch>
                       <a:fillRect/>
                     </a:stretch>
@@ -3933,7 +3933,7 @@
                     <pic:cNvPicPr/>
                   </pic:nvPicPr>
                   <pic:blipFill>
-                    <a:blip xmlns:r="http://schemas.openxmlformats.org/officeDocument/2006/relationships" r:embed="Rd154574b95814b8f"/>
+                    <a:blip xmlns:r="http://schemas.openxmlformats.org/officeDocument/2006/relationships" r:embed="R11f0a6b431034904"/>
                     <a:stretch>
                       <a:fillRect/>
                     </a:stretch>
@@ -4125,7 +4125,7 @@
                     <pic:cNvPicPr/>
                   </pic:nvPicPr>
                   <pic:blipFill>
-                    <a:blip xmlns:r="http://schemas.openxmlformats.org/officeDocument/2006/relationships" r:embed="R38be7ea2a7634236"/>
+                    <a:blip xmlns:r="http://schemas.openxmlformats.org/officeDocument/2006/relationships" r:embed="R62665950455c4f1e"/>
                     <a:stretch>
                       <a:fillRect/>
                     </a:stretch>
@@ -4176,7 +4176,7 @@
                     <pic:cNvPicPr/>
                   </pic:nvPicPr>
                   <pic:blipFill>
-                    <a:blip xmlns:r="http://schemas.openxmlformats.org/officeDocument/2006/relationships" r:embed="R95853f4e12ce4d19"/>
+                    <a:blip xmlns:r="http://schemas.openxmlformats.org/officeDocument/2006/relationships" r:embed="R3506d99b55734cae"/>
                     <a:stretch>
                       <a:fillRect/>
                     </a:stretch>
@@ -4227,7 +4227,7 @@
                     <pic:cNvPicPr/>
                   </pic:nvPicPr>
                   <pic:blipFill>
-                    <a:blip xmlns:r="http://schemas.openxmlformats.org/officeDocument/2006/relationships" r:embed="R9a694ebac8ae4067"/>
+                    <a:blip xmlns:r="http://schemas.openxmlformats.org/officeDocument/2006/relationships" r:embed="R337d45c57df3425d"/>
                     <a:stretch>
                       <a:fillRect/>
                     </a:stretch>
@@ -4278,7 +4278,7 @@
                     <pic:cNvPicPr/>
                   </pic:nvPicPr>
                   <pic:blipFill>
-                    <a:blip xmlns:r="http://schemas.openxmlformats.org/officeDocument/2006/relationships" r:embed="R50c1e33e45fd4a78"/>
+                    <a:blip xmlns:r="http://schemas.openxmlformats.org/officeDocument/2006/relationships" r:embed="R7bb05d2a22a247a3"/>
                     <a:stretch>
                       <a:fillRect/>
                     </a:stretch>
@@ -4657,7 +4657,7 @@
                     <pic:cNvPicPr/>
                   </pic:nvPicPr>
                   <pic:blipFill>
-                    <a:blip xmlns:r="http://schemas.openxmlformats.org/officeDocument/2006/relationships" r:embed="Rf1275406b8bf449f"/>
+                    <a:blip xmlns:r="http://schemas.openxmlformats.org/officeDocument/2006/relationships" r:embed="R32324faf613d486b"/>
                     <a:stretch>
                       <a:fillRect/>
                     </a:stretch>
@@ -5338,7 +5338,7 @@
             <w:r>
               <w:t xml:space="preserve">Cell with </w:t>
             </w:r>
-            <w:hyperlink xmlns:r="http://schemas.openxmlformats.org/officeDocument/2006/relationships" w:history="true" r:id="Re1146b8bcb1f42ea">
+            <w:hyperlink xmlns:r="http://schemas.openxmlformats.org/officeDocument/2006/relationships" w:history="true" r:id="Rbc97354d7ffc4d0a">
               <w:r>
                 <w:rPr>
                   <w:rStyle w:val="Hyperlink"/>
@@ -5624,7 +5624,7 @@
                           <pic:cNvPicPr/>
                         </pic:nvPicPr>
                         <pic:blipFill>
-                          <a:blip xmlns:r="http://schemas.openxmlformats.org/officeDocument/2006/relationships" r:embed="R312b454d0b494eda"/>
+                          <a:blip xmlns:r="http://schemas.openxmlformats.org/officeDocument/2006/relationships" r:embed="R10ca7aed3c534422"/>
                           <a:stretch>
                             <a:fillRect/>
                           </a:stretch>
@@ -5724,7 +5724,7 @@
                     <pic:cNvPicPr/>
                   </pic:nvPicPr>
                   <pic:blipFill>
-                    <a:blip xmlns:r="http://schemas.openxmlformats.org/officeDocument/2006/relationships" r:embed="R4f9ca46e7f214011"/>
+                    <a:blip xmlns:r="http://schemas.openxmlformats.org/officeDocument/2006/relationships" r:embed="R7ca134d37a304695"/>
                     <a:stretch>
                       <a:fillRect/>
                     </a:stretch>
@@ -5774,7 +5774,7 @@
                     <pic:cNvPicPr/>
                   </pic:nvPicPr>
                   <pic:blipFill>
-                    <a:blip xmlns:r="http://schemas.openxmlformats.org/officeDocument/2006/relationships" r:embed="Rf23a8e829c6e4d34"/>
+                    <a:blip xmlns:r="http://schemas.openxmlformats.org/officeDocument/2006/relationships" r:embed="Re501e7bc33b14bdc"/>
                     <a:stretch>
                       <a:fillRect/>
                     </a:stretch>
@@ -5824,7 +5824,7 @@
                     <pic:cNvPicPr/>
                   </pic:nvPicPr>
                   <pic:blipFill>
-                    <a:blip xmlns:r="http://schemas.openxmlformats.org/officeDocument/2006/relationships" r:embed="R2d712eef457a46bc"/>
+                    <a:blip xmlns:r="http://schemas.openxmlformats.org/officeDocument/2006/relationships" r:embed="R0833693d11184068"/>
                     <a:stretch>
                       <a:fillRect/>
                     </a:stretch>

</xml_diff>

<commit_message>
fix(er): make matrix minimum straights literal path segments
For scenario 2 matrix edges, emit line->cubic->line paths so minimum straight exit/entry lengths are preserved visually (curveBasis smoothing was rounding them away).

Made-with: Cursor
</commit_message>
<xml_diff>
--- a/test.docx
+++ b/test.docx
@@ -236,7 +236,7 @@
       <w:r>
         <w:t xml:space="preserve">, and </w:t>
       </w:r>
-      <w:hyperlink xmlns:r="http://schemas.openxmlformats.org/officeDocument/2006/relationships" w:history="true" r:id="R0c182f3b60864e07">
+      <w:hyperlink xmlns:r="http://schemas.openxmlformats.org/officeDocument/2006/relationships" w:history="true" r:id="R6df3b22d2be744ee">
         <w:r>
           <w:rPr>
             <w:rStyle w:val="Hyperlink"/>
@@ -475,7 +475,7 @@
       <w:r>
         <w:t xml:space="preserve">Direct link: </w:t>
       </w:r>
-      <w:hyperlink xmlns:r="http://schemas.openxmlformats.org/officeDocument/2006/relationships" w:history="true" r:id="R7f92f990bb3443d5">
+      <w:hyperlink xmlns:r="http://schemas.openxmlformats.org/officeDocument/2006/relationships" w:history="true" r:id="R6841d34734554bdc">
         <w:r>
           <w:rPr>
             <w:rStyle w:val="Hyperlink"/>
@@ -496,7 +496,7 @@
       <w:r>
         <w:t xml:space="preserve">Direct link with title: </w:t>
       </w:r>
-      <w:hyperlink xmlns:r="http://schemas.openxmlformats.org/officeDocument/2006/relationships" w:history="true" r:id="R998f21270fd24019">
+      <w:hyperlink xmlns:r="http://schemas.openxmlformats.org/officeDocument/2006/relationships" w:history="true" r:id="R02823abe443345d4">
         <w:r>
           <w:rPr>
             <w:rStyle w:val="Hyperlink"/>
@@ -517,7 +517,7 @@
       <w:r>
         <w:t xml:space="preserve">Reference-style link: </w:t>
       </w:r>
-      <w:hyperlink xmlns:r="http://schemas.openxmlformats.org/officeDocument/2006/relationships" w:history="true" r:id="R88c59f318e764361">
+      <w:hyperlink xmlns:r="http://schemas.openxmlformats.org/officeDocument/2006/relationships" w:history="true" r:id="Ra6e9ce5f94414428">
         <w:r>
           <w:rPr>
             <w:rStyle w:val="Hyperlink"/>
@@ -538,7 +538,7 @@
       <w:r>
         <w:t xml:space="preserve">Collapsed reference link: </w:t>
       </w:r>
-      <w:hyperlink xmlns:r="http://schemas.openxmlformats.org/officeDocument/2006/relationships" w:history="true" r:id="R9fab884f0ef64016">
+      <w:hyperlink xmlns:r="http://schemas.openxmlformats.org/officeDocument/2006/relationships" w:history="true" r:id="R7b6853d8cd90470a">
         <w:r>
           <w:rPr>
             <w:rStyle w:val="Hyperlink"/>
@@ -559,7 +559,7 @@
       <w:r>
         <w:t xml:space="preserve">Repeated reference link: </w:t>
       </w:r>
-      <w:hyperlink xmlns:r="http://schemas.openxmlformats.org/officeDocument/2006/relationships" w:history="true" r:id="R17a0bc846d364158">
+      <w:hyperlink xmlns:r="http://schemas.openxmlformats.org/officeDocument/2006/relationships" w:history="true" r:id="R428576a2bef24c94">
         <w:r>
           <w:rPr>
             <w:rStyle w:val="Hyperlink"/>
@@ -580,7 +580,7 @@
       <w:r>
         <w:t xml:space="preserve">Autolink URL: </w:t>
       </w:r>
-      <w:hyperlink xmlns:r="http://schemas.openxmlformats.org/officeDocument/2006/relationships" w:history="true" r:id="R51f8b66420234127">
+      <w:hyperlink xmlns:r="http://schemas.openxmlformats.org/officeDocument/2006/relationships" w:history="true" r:id="R7c5f324314464194">
         <w:r>
           <w:rPr>
             <w:rStyle w:val="Hyperlink"/>
@@ -601,7 +601,7 @@
       <w:r>
         <w:t xml:space="preserve">Autolink email: </w:t>
       </w:r>
-      <w:hyperlink xmlns:r="http://schemas.openxmlformats.org/officeDocument/2006/relationships" w:history="true" r:id="Rbda0da3ab09f449b">
+      <w:hyperlink xmlns:r="http://schemas.openxmlformats.org/officeDocument/2006/relationships" w:history="true" r:id="R069b2481c9104c17">
         <w:r>
           <w:rPr>
             <w:rStyle w:val="Hyperlink"/>
@@ -700,7 +700,7 @@
       <w:r>
         <w:t xml:space="preserve">, and </w:t>
       </w:r>
-      <w:hyperlink xmlns:r="http://schemas.openxmlformats.org/officeDocument/2006/relationships" w:history="true" r:id="R823ecdcb601141a3">
+      <w:hyperlink xmlns:r="http://schemas.openxmlformats.org/officeDocument/2006/relationships" w:history="true" r:id="Rdf3d017192a341dc">
         <w:r>
           <w:rPr>
             <w:rStyle w:val="Hyperlink"/>
@@ -1093,7 +1093,7 @@
       <w:r>
         <w:t xml:space="preserve">Continuation paragraph with </w:t>
       </w:r>
-      <w:hyperlink xmlns:r="http://schemas.openxmlformats.org/officeDocument/2006/relationships" w:history="true" r:id="R613f4b2f3db14a9f">
+      <w:hyperlink xmlns:r="http://schemas.openxmlformats.org/officeDocument/2006/relationships" w:history="true" r:id="R36ef1bb3a28b47c2">
         <w:r>
           <w:rPr>
             <w:rStyle w:val="Hyperlink"/>
@@ -1591,7 +1591,7 @@
       <w:r>
         <w:t xml:space="preserve">, and </w:t>
       </w:r>
-      <w:hyperlink xmlns:r="http://schemas.openxmlformats.org/officeDocument/2006/relationships" w:history="true" r:id="R84a80115e83b4d71">
+      <w:hyperlink xmlns:r="http://schemas.openxmlformats.org/officeDocument/2006/relationships" w:history="true" r:id="Rc8086b7155424cfd">
         <w:r>
           <w:rPr>
             <w:rStyle w:val="Hyperlink"/>
@@ -1979,7 +1979,7 @@
                     <pic:cNvPicPr/>
                   </pic:nvPicPr>
                   <pic:blipFill>
-                    <a:blip xmlns:r="http://schemas.openxmlformats.org/officeDocument/2006/relationships" r:embed="Rc2e2fd4ef1b8480d"/>
+                    <a:blip xmlns:r="http://schemas.openxmlformats.org/officeDocument/2006/relationships" r:embed="Rf64000582cfa4061"/>
                     <a:stretch>
                       <a:fillRect/>
                     </a:stretch>
@@ -2039,7 +2039,7 @@
                     <pic:cNvPicPr/>
                   </pic:nvPicPr>
                   <pic:blipFill>
-                    <a:blip xmlns:r="http://schemas.openxmlformats.org/officeDocument/2006/relationships" r:embed="R2c63ff023cac4055"/>
+                    <a:blip xmlns:r="http://schemas.openxmlformats.org/officeDocument/2006/relationships" r:embed="Rd832aadee5ff4931"/>
                     <a:stretch>
                       <a:fillRect/>
                     </a:stretch>
@@ -2099,7 +2099,7 @@
                     <pic:cNvPicPr/>
                   </pic:nvPicPr>
                   <pic:blipFill>
-                    <a:blip xmlns:r="http://schemas.openxmlformats.org/officeDocument/2006/relationships" r:embed="Rd00334e268344dbe"/>
+                    <a:blip xmlns:r="http://schemas.openxmlformats.org/officeDocument/2006/relationships" r:embed="R51589abac05e4801"/>
                     <a:stretch>
                       <a:fillRect/>
                     </a:stretch>
@@ -2150,7 +2150,7 @@
                     <pic:cNvPicPr/>
                   </pic:nvPicPr>
                   <pic:blipFill>
-                    <a:blip xmlns:r="http://schemas.openxmlformats.org/officeDocument/2006/relationships" r:embed="Rfd3a2ee90b164a86"/>
+                    <a:blip xmlns:r="http://schemas.openxmlformats.org/officeDocument/2006/relationships" r:embed="R3459d6ff86fd4301"/>
                     <a:stretch>
                       <a:fillRect/>
                     </a:stretch>
@@ -2201,7 +2201,7 @@
                     <pic:cNvPicPr/>
                   </pic:nvPicPr>
                   <pic:blipFill>
-                    <a:blip xmlns:r="http://schemas.openxmlformats.org/officeDocument/2006/relationships" r:embed="Rec6081ce6a1a450c"/>
+                    <a:blip xmlns:r="http://schemas.openxmlformats.org/officeDocument/2006/relationships" r:embed="Rafe2613f87bb4855"/>
                     <a:stretch>
                       <a:fillRect/>
                     </a:stretch>
@@ -2252,7 +2252,7 @@
                     <pic:cNvPicPr/>
                   </pic:nvPicPr>
                   <pic:blipFill>
-                    <a:blip xmlns:r="http://schemas.openxmlformats.org/officeDocument/2006/relationships" r:embed="R96782daedb024039"/>
+                    <a:blip xmlns:r="http://schemas.openxmlformats.org/officeDocument/2006/relationships" r:embed="Rea784e4acce14155"/>
                     <a:stretch>
                       <a:fillRect/>
                     </a:stretch>
@@ -2303,7 +2303,7 @@
                     <pic:cNvPicPr/>
                   </pic:nvPicPr>
                   <pic:blipFill>
-                    <a:blip xmlns:r="http://schemas.openxmlformats.org/officeDocument/2006/relationships" r:embed="R67a50af111494e36"/>
+                    <a:blip xmlns:r="http://schemas.openxmlformats.org/officeDocument/2006/relationships" r:embed="R3beb33e3742c4e1e"/>
                     <a:stretch>
                       <a:fillRect/>
                     </a:stretch>
@@ -2354,7 +2354,7 @@
                     <pic:cNvPicPr/>
                   </pic:nvPicPr>
                   <pic:blipFill>
-                    <a:blip xmlns:r="http://schemas.openxmlformats.org/officeDocument/2006/relationships" r:embed="Rb9ebfd89f3d14565"/>
+                    <a:blip xmlns:r="http://schemas.openxmlformats.org/officeDocument/2006/relationships" r:embed="Rbe5296edab514474"/>
                     <a:stretch>
                       <a:fillRect/>
                     </a:stretch>
@@ -2430,7 +2430,7 @@
                     <pic:cNvPicPr/>
                   </pic:nvPicPr>
                   <pic:blipFill>
-                    <a:blip xmlns:r="http://schemas.openxmlformats.org/officeDocument/2006/relationships" r:embed="R496b827ea596471d"/>
+                    <a:blip xmlns:r="http://schemas.openxmlformats.org/officeDocument/2006/relationships" r:embed="R91403e57d8b64f69"/>
                     <a:stretch>
                       <a:fillRect/>
                     </a:stretch>
@@ -2481,7 +2481,7 @@
                     <pic:cNvPicPr/>
                   </pic:nvPicPr>
                   <pic:blipFill>
-                    <a:blip xmlns:r="http://schemas.openxmlformats.org/officeDocument/2006/relationships" r:embed="R453e6e6d86544e31"/>
+                    <a:blip xmlns:r="http://schemas.openxmlformats.org/officeDocument/2006/relationships" r:embed="Rd34091ada1184964"/>
                     <a:stretch>
                       <a:fillRect/>
                     </a:stretch>
@@ -2532,7 +2532,7 @@
                     <pic:cNvPicPr/>
                   </pic:nvPicPr>
                   <pic:blipFill>
-                    <a:blip xmlns:r="http://schemas.openxmlformats.org/officeDocument/2006/relationships" r:embed="R946010e4be0a4259"/>
+                    <a:blip xmlns:r="http://schemas.openxmlformats.org/officeDocument/2006/relationships" r:embed="Rf49098606d324049"/>
                     <a:stretch>
                       <a:fillRect/>
                     </a:stretch>
@@ -2583,7 +2583,7 @@
                     <pic:cNvPicPr/>
                   </pic:nvPicPr>
                   <pic:blipFill>
-                    <a:blip xmlns:r="http://schemas.openxmlformats.org/officeDocument/2006/relationships" r:embed="Rc01918615b114651"/>
+                    <a:blip xmlns:r="http://schemas.openxmlformats.org/officeDocument/2006/relationships" r:embed="R8beee7b1992341ea"/>
                     <a:stretch>
                       <a:fillRect/>
                     </a:stretch>
@@ -2659,7 +2659,7 @@
                     <pic:cNvPicPr/>
                   </pic:nvPicPr>
                   <pic:blipFill>
-                    <a:blip xmlns:r="http://schemas.openxmlformats.org/officeDocument/2006/relationships" r:embed="R643eef8d4ec749be"/>
+                    <a:blip xmlns:r="http://schemas.openxmlformats.org/officeDocument/2006/relationships" r:embed="Rf1206ed2ae094626"/>
                     <a:stretch>
                       <a:fillRect/>
                     </a:stretch>
@@ -2710,7 +2710,7 @@
                     <pic:cNvPicPr/>
                   </pic:nvPicPr>
                   <pic:blipFill>
-                    <a:blip xmlns:r="http://schemas.openxmlformats.org/officeDocument/2006/relationships" r:embed="R501b0872fcd54c58"/>
+                    <a:blip xmlns:r="http://schemas.openxmlformats.org/officeDocument/2006/relationships" r:embed="R4784f42fb2a5457e"/>
                     <a:stretch>
                       <a:fillRect/>
                     </a:stretch>
@@ -2761,7 +2761,7 @@
                     <pic:cNvPicPr/>
                   </pic:nvPicPr>
                   <pic:blipFill>
-                    <a:blip xmlns:r="http://schemas.openxmlformats.org/officeDocument/2006/relationships" r:embed="R11007f35da0f46fa"/>
+                    <a:blip xmlns:r="http://schemas.openxmlformats.org/officeDocument/2006/relationships" r:embed="Rffb017338437491d"/>
                     <a:stretch>
                       <a:fillRect/>
                     </a:stretch>
@@ -2812,7 +2812,7 @@
                     <pic:cNvPicPr/>
                   </pic:nvPicPr>
                   <pic:blipFill>
-                    <a:blip xmlns:r="http://schemas.openxmlformats.org/officeDocument/2006/relationships" r:embed="Ra47937e4c88947eb"/>
+                    <a:blip xmlns:r="http://schemas.openxmlformats.org/officeDocument/2006/relationships" r:embed="R43239d9c473e4fd5"/>
                     <a:stretch>
                       <a:fillRect/>
                     </a:stretch>
@@ -2863,7 +2863,7 @@
                     <pic:cNvPicPr/>
                   </pic:nvPicPr>
                   <pic:blipFill>
-                    <a:blip xmlns:r="http://schemas.openxmlformats.org/officeDocument/2006/relationships" r:embed="R230be6a570ab4c6a"/>
+                    <a:blip xmlns:r="http://schemas.openxmlformats.org/officeDocument/2006/relationships" r:embed="Rad7f985c529f4360"/>
                     <a:stretch>
                       <a:fillRect/>
                     </a:stretch>
@@ -2914,7 +2914,7 @@
                     <pic:cNvPicPr/>
                   </pic:nvPicPr>
                   <pic:blipFill>
-                    <a:blip xmlns:r="http://schemas.openxmlformats.org/officeDocument/2006/relationships" r:embed="R4d0ab97dca354c32"/>
+                    <a:blip xmlns:r="http://schemas.openxmlformats.org/officeDocument/2006/relationships" r:embed="Rd06895420b7b47cb"/>
                     <a:stretch>
                       <a:fillRect/>
                     </a:stretch>
@@ -2965,7 +2965,7 @@
                     <pic:cNvPicPr/>
                   </pic:nvPicPr>
                   <pic:blipFill>
-                    <a:blip xmlns:r="http://schemas.openxmlformats.org/officeDocument/2006/relationships" r:embed="Rf385b673be0444dd"/>
+                    <a:blip xmlns:r="http://schemas.openxmlformats.org/officeDocument/2006/relationships" r:embed="Rd1ad3528f94f4e3d"/>
                     <a:stretch>
                       <a:fillRect/>
                     </a:stretch>
@@ -3016,7 +3016,7 @@
                     <pic:cNvPicPr/>
                   </pic:nvPicPr>
                   <pic:blipFill>
-                    <a:blip xmlns:r="http://schemas.openxmlformats.org/officeDocument/2006/relationships" r:embed="R999f4d8463c14f43"/>
+                    <a:blip xmlns:r="http://schemas.openxmlformats.org/officeDocument/2006/relationships" r:embed="Rb92dafbe666749b1"/>
                     <a:stretch>
                       <a:fillRect/>
                     </a:stretch>
@@ -3067,7 +3067,7 @@
                     <pic:cNvPicPr/>
                   </pic:nvPicPr>
                   <pic:blipFill>
-                    <a:blip xmlns:r="http://schemas.openxmlformats.org/officeDocument/2006/relationships" r:embed="R89d8db2c4b994144"/>
+                    <a:blip xmlns:r="http://schemas.openxmlformats.org/officeDocument/2006/relationships" r:embed="Rfe8273072c614426"/>
                     <a:stretch>
                       <a:fillRect/>
                     </a:stretch>
@@ -3118,7 +3118,7 @@
                     <pic:cNvPicPr/>
                   </pic:nvPicPr>
                   <pic:blipFill>
-                    <a:blip xmlns:r="http://schemas.openxmlformats.org/officeDocument/2006/relationships" r:embed="Red75d35297264eeb"/>
+                    <a:blip xmlns:r="http://schemas.openxmlformats.org/officeDocument/2006/relationships" r:embed="R6eb46e7217da4f62"/>
                     <a:stretch>
                       <a:fillRect/>
                     </a:stretch>
@@ -3169,7 +3169,7 @@
                     <pic:cNvPicPr/>
                   </pic:nvPicPr>
                   <pic:blipFill>
-                    <a:blip xmlns:r="http://schemas.openxmlformats.org/officeDocument/2006/relationships" r:embed="Rab02b043b5ae4c1f"/>
+                    <a:blip xmlns:r="http://schemas.openxmlformats.org/officeDocument/2006/relationships" r:embed="R21af0b3a87594a86"/>
                     <a:stretch>
                       <a:fillRect/>
                     </a:stretch>
@@ -3220,7 +3220,7 @@
                     <pic:cNvPicPr/>
                   </pic:nvPicPr>
                   <pic:blipFill>
-                    <a:blip xmlns:r="http://schemas.openxmlformats.org/officeDocument/2006/relationships" r:embed="R87fe474d54094625"/>
+                    <a:blip xmlns:r="http://schemas.openxmlformats.org/officeDocument/2006/relationships" r:embed="R1502e28ccb4f4b3b"/>
                     <a:stretch>
                       <a:fillRect/>
                     </a:stretch>
@@ -3271,7 +3271,7 @@
                     <pic:cNvPicPr/>
                   </pic:nvPicPr>
                   <pic:blipFill>
-                    <a:blip xmlns:r="http://schemas.openxmlformats.org/officeDocument/2006/relationships" r:embed="R6dd97fe51bce4b74"/>
+                    <a:blip xmlns:r="http://schemas.openxmlformats.org/officeDocument/2006/relationships" r:embed="R55232d60f7344a07"/>
                     <a:stretch>
                       <a:fillRect/>
                     </a:stretch>
@@ -3322,7 +3322,7 @@
                     <pic:cNvPicPr/>
                   </pic:nvPicPr>
                   <pic:blipFill>
-                    <a:blip xmlns:r="http://schemas.openxmlformats.org/officeDocument/2006/relationships" r:embed="R669c530375cb4f87"/>
+                    <a:blip xmlns:r="http://schemas.openxmlformats.org/officeDocument/2006/relationships" r:embed="R25e921539f204920"/>
                     <a:stretch>
                       <a:fillRect/>
                     </a:stretch>
@@ -3419,7 +3419,7 @@
                     <pic:cNvPicPr/>
                   </pic:nvPicPr>
                   <pic:blipFill>
-                    <a:blip xmlns:r="http://schemas.openxmlformats.org/officeDocument/2006/relationships" r:embed="R0393686a2b9a4276"/>
+                    <a:blip xmlns:r="http://schemas.openxmlformats.org/officeDocument/2006/relationships" r:embed="Rcb7e88a9ecbc4153"/>
                     <a:stretch>
                       <a:fillRect/>
                     </a:stretch>
@@ -3462,7 +3462,7 @@
                     <pic:cNvPicPr/>
                   </pic:nvPicPr>
                   <pic:blipFill>
-                    <a:blip xmlns:r="http://schemas.openxmlformats.org/officeDocument/2006/relationships" r:embed="Ra126ad6a7c1a4fd1"/>
+                    <a:blip xmlns:r="http://schemas.openxmlformats.org/officeDocument/2006/relationships" r:embed="R9e024c929afc413c"/>
                     <a:stretch>
                       <a:fillRect/>
                     </a:stretch>
@@ -3505,7 +3505,7 @@
                     <pic:cNvPicPr/>
                   </pic:nvPicPr>
                   <pic:blipFill>
-                    <a:blip xmlns:r="http://schemas.openxmlformats.org/officeDocument/2006/relationships" r:embed="R99d692cb4f114745"/>
+                    <a:blip xmlns:r="http://schemas.openxmlformats.org/officeDocument/2006/relationships" r:embed="Rb58248e900e54609"/>
                     <a:stretch>
                       <a:fillRect/>
                     </a:stretch>
@@ -3548,7 +3548,7 @@
                     <pic:cNvPicPr/>
                   </pic:nvPicPr>
                   <pic:blipFill>
-                    <a:blip xmlns:r="http://schemas.openxmlformats.org/officeDocument/2006/relationships" r:embed="R07ae16e0de9b4320"/>
+                    <a:blip xmlns:r="http://schemas.openxmlformats.org/officeDocument/2006/relationships" r:embed="R82ca2ea7cd674f27"/>
                     <a:stretch>
                       <a:fillRect/>
                     </a:stretch>
@@ -3933,7 +3933,7 @@
                     <pic:cNvPicPr/>
                   </pic:nvPicPr>
                   <pic:blipFill>
-                    <a:blip xmlns:r="http://schemas.openxmlformats.org/officeDocument/2006/relationships" r:embed="R11f0a6b431034904"/>
+                    <a:blip xmlns:r="http://schemas.openxmlformats.org/officeDocument/2006/relationships" r:embed="R8069566776cc40e7"/>
                     <a:stretch>
                       <a:fillRect/>
                     </a:stretch>
@@ -4125,7 +4125,7 @@
                     <pic:cNvPicPr/>
                   </pic:nvPicPr>
                   <pic:blipFill>
-                    <a:blip xmlns:r="http://schemas.openxmlformats.org/officeDocument/2006/relationships" r:embed="R62665950455c4f1e"/>
+                    <a:blip xmlns:r="http://schemas.openxmlformats.org/officeDocument/2006/relationships" r:embed="R8e57868837964567"/>
                     <a:stretch>
                       <a:fillRect/>
                     </a:stretch>
@@ -4176,7 +4176,7 @@
                     <pic:cNvPicPr/>
                   </pic:nvPicPr>
                   <pic:blipFill>
-                    <a:blip xmlns:r="http://schemas.openxmlformats.org/officeDocument/2006/relationships" r:embed="R3506d99b55734cae"/>
+                    <a:blip xmlns:r="http://schemas.openxmlformats.org/officeDocument/2006/relationships" r:embed="Rc14fe68f8e004d19"/>
                     <a:stretch>
                       <a:fillRect/>
                     </a:stretch>
@@ -4227,7 +4227,7 @@
                     <pic:cNvPicPr/>
                   </pic:nvPicPr>
                   <pic:blipFill>
-                    <a:blip xmlns:r="http://schemas.openxmlformats.org/officeDocument/2006/relationships" r:embed="R337d45c57df3425d"/>
+                    <a:blip xmlns:r="http://schemas.openxmlformats.org/officeDocument/2006/relationships" r:embed="R89c2541760d04da8"/>
                     <a:stretch>
                       <a:fillRect/>
                     </a:stretch>
@@ -4278,7 +4278,7 @@
                     <pic:cNvPicPr/>
                   </pic:nvPicPr>
                   <pic:blipFill>
-                    <a:blip xmlns:r="http://schemas.openxmlformats.org/officeDocument/2006/relationships" r:embed="R7bb05d2a22a247a3"/>
+                    <a:blip xmlns:r="http://schemas.openxmlformats.org/officeDocument/2006/relationships" r:embed="Re80d320f29464b36"/>
                     <a:stretch>
                       <a:fillRect/>
                     </a:stretch>
@@ -4657,7 +4657,7 @@
                     <pic:cNvPicPr/>
                   </pic:nvPicPr>
                   <pic:blipFill>
-                    <a:blip xmlns:r="http://schemas.openxmlformats.org/officeDocument/2006/relationships" r:embed="R32324faf613d486b"/>
+                    <a:blip xmlns:r="http://schemas.openxmlformats.org/officeDocument/2006/relationships" r:embed="Rcd7617a136eb428b"/>
                     <a:stretch>
                       <a:fillRect/>
                     </a:stretch>
@@ -5338,7 +5338,7 @@
             <w:r>
               <w:t xml:space="preserve">Cell with </w:t>
             </w:r>
-            <w:hyperlink xmlns:r="http://schemas.openxmlformats.org/officeDocument/2006/relationships" w:history="true" r:id="Rbc97354d7ffc4d0a">
+            <w:hyperlink xmlns:r="http://schemas.openxmlformats.org/officeDocument/2006/relationships" w:history="true" r:id="Raa60536b69904af0">
               <w:r>
                 <w:rPr>
                   <w:rStyle w:val="Hyperlink"/>
@@ -5624,7 +5624,7 @@
                           <pic:cNvPicPr/>
                         </pic:nvPicPr>
                         <pic:blipFill>
-                          <a:blip xmlns:r="http://schemas.openxmlformats.org/officeDocument/2006/relationships" r:embed="R10ca7aed3c534422"/>
+                          <a:blip xmlns:r="http://schemas.openxmlformats.org/officeDocument/2006/relationships" r:embed="Rfc816f8936ce4bf8"/>
                           <a:stretch>
                             <a:fillRect/>
                           </a:stretch>
@@ -5724,7 +5724,7 @@
                     <pic:cNvPicPr/>
                   </pic:nvPicPr>
                   <pic:blipFill>
-                    <a:blip xmlns:r="http://schemas.openxmlformats.org/officeDocument/2006/relationships" r:embed="R7ca134d37a304695"/>
+                    <a:blip xmlns:r="http://schemas.openxmlformats.org/officeDocument/2006/relationships" r:embed="R463a0b433eca4e49"/>
                     <a:stretch>
                       <a:fillRect/>
                     </a:stretch>
@@ -5774,7 +5774,7 @@
                     <pic:cNvPicPr/>
                   </pic:nvPicPr>
                   <pic:blipFill>
-                    <a:blip xmlns:r="http://schemas.openxmlformats.org/officeDocument/2006/relationships" r:embed="Re501e7bc33b14bdc"/>
+                    <a:blip xmlns:r="http://schemas.openxmlformats.org/officeDocument/2006/relationships" r:embed="R3454217182c24408"/>
                     <a:stretch>
                       <a:fillRect/>
                     </a:stretch>
@@ -5824,7 +5824,7 @@
                     <pic:cNvPicPr/>
                   </pic:nvPicPr>
                   <pic:blipFill>
-                    <a:blip xmlns:r="http://schemas.openxmlformats.org/officeDocument/2006/relationships" r:embed="R0833693d11184068"/>
+                    <a:blip xmlns:r="http://schemas.openxmlformats.org/officeDocument/2006/relationships" r:embed="R3d13598f26274bab"/>
                     <a:stretch>
                       <a:fillRect/>
                     </a:stretch>

</xml_diff>

<commit_message>
fix(er): force literal min-straight path for matrix edges
Always render scenario 2 matrix relationships with line->cubic->line geometry so minimum straight exit/entry lengths are preserved; remove unused clearance constant.

Made-with: Cursor
</commit_message>
<xml_diff>
--- a/test.docx
+++ b/test.docx
@@ -236,7 +236,7 @@
       <w:r>
         <w:t xml:space="preserve">, and </w:t>
       </w:r>
-      <w:hyperlink xmlns:r="http://schemas.openxmlformats.org/officeDocument/2006/relationships" w:history="true" r:id="R6df3b22d2be744ee">
+      <w:hyperlink xmlns:r="http://schemas.openxmlformats.org/officeDocument/2006/relationships" w:history="true" r:id="R417425a9a45b49dc">
         <w:r>
           <w:rPr>
             <w:rStyle w:val="Hyperlink"/>
@@ -475,7 +475,7 @@
       <w:r>
         <w:t xml:space="preserve">Direct link: </w:t>
       </w:r>
-      <w:hyperlink xmlns:r="http://schemas.openxmlformats.org/officeDocument/2006/relationships" w:history="true" r:id="R6841d34734554bdc">
+      <w:hyperlink xmlns:r="http://schemas.openxmlformats.org/officeDocument/2006/relationships" w:history="true" r:id="Rfcdd3dcef8bd4344">
         <w:r>
           <w:rPr>
             <w:rStyle w:val="Hyperlink"/>
@@ -496,7 +496,7 @@
       <w:r>
         <w:t xml:space="preserve">Direct link with title: </w:t>
       </w:r>
-      <w:hyperlink xmlns:r="http://schemas.openxmlformats.org/officeDocument/2006/relationships" w:history="true" r:id="R02823abe443345d4">
+      <w:hyperlink xmlns:r="http://schemas.openxmlformats.org/officeDocument/2006/relationships" w:history="true" r:id="R878b37e1c4d34afd">
         <w:r>
           <w:rPr>
             <w:rStyle w:val="Hyperlink"/>
@@ -517,7 +517,7 @@
       <w:r>
         <w:t xml:space="preserve">Reference-style link: </w:t>
       </w:r>
-      <w:hyperlink xmlns:r="http://schemas.openxmlformats.org/officeDocument/2006/relationships" w:history="true" r:id="Ra6e9ce5f94414428">
+      <w:hyperlink xmlns:r="http://schemas.openxmlformats.org/officeDocument/2006/relationships" w:history="true" r:id="R07ab8affd75e4abb">
         <w:r>
           <w:rPr>
             <w:rStyle w:val="Hyperlink"/>
@@ -538,7 +538,7 @@
       <w:r>
         <w:t xml:space="preserve">Collapsed reference link: </w:t>
       </w:r>
-      <w:hyperlink xmlns:r="http://schemas.openxmlformats.org/officeDocument/2006/relationships" w:history="true" r:id="R7b6853d8cd90470a">
+      <w:hyperlink xmlns:r="http://schemas.openxmlformats.org/officeDocument/2006/relationships" w:history="true" r:id="Rc9a4e016792c47c8">
         <w:r>
           <w:rPr>
             <w:rStyle w:val="Hyperlink"/>
@@ -559,7 +559,7 @@
       <w:r>
         <w:t xml:space="preserve">Repeated reference link: </w:t>
       </w:r>
-      <w:hyperlink xmlns:r="http://schemas.openxmlformats.org/officeDocument/2006/relationships" w:history="true" r:id="R428576a2bef24c94">
+      <w:hyperlink xmlns:r="http://schemas.openxmlformats.org/officeDocument/2006/relationships" w:history="true" r:id="R157bc83d3ad64c24">
         <w:r>
           <w:rPr>
             <w:rStyle w:val="Hyperlink"/>
@@ -580,7 +580,7 @@
       <w:r>
         <w:t xml:space="preserve">Autolink URL: </w:t>
       </w:r>
-      <w:hyperlink xmlns:r="http://schemas.openxmlformats.org/officeDocument/2006/relationships" w:history="true" r:id="R7c5f324314464194">
+      <w:hyperlink xmlns:r="http://schemas.openxmlformats.org/officeDocument/2006/relationships" w:history="true" r:id="R67e243da7ecd497c">
         <w:r>
           <w:rPr>
             <w:rStyle w:val="Hyperlink"/>
@@ -601,7 +601,7 @@
       <w:r>
         <w:t xml:space="preserve">Autolink email: </w:t>
       </w:r>
-      <w:hyperlink xmlns:r="http://schemas.openxmlformats.org/officeDocument/2006/relationships" w:history="true" r:id="R069b2481c9104c17">
+      <w:hyperlink xmlns:r="http://schemas.openxmlformats.org/officeDocument/2006/relationships" w:history="true" r:id="Rc6d5646121564821">
         <w:r>
           <w:rPr>
             <w:rStyle w:val="Hyperlink"/>
@@ -700,7 +700,7 @@
       <w:r>
         <w:t xml:space="preserve">, and </w:t>
       </w:r>
-      <w:hyperlink xmlns:r="http://schemas.openxmlformats.org/officeDocument/2006/relationships" w:history="true" r:id="Rdf3d017192a341dc">
+      <w:hyperlink xmlns:r="http://schemas.openxmlformats.org/officeDocument/2006/relationships" w:history="true" r:id="R4365cfa74bdc4ef9">
         <w:r>
           <w:rPr>
             <w:rStyle w:val="Hyperlink"/>
@@ -1093,7 +1093,7 @@
       <w:r>
         <w:t xml:space="preserve">Continuation paragraph with </w:t>
       </w:r>
-      <w:hyperlink xmlns:r="http://schemas.openxmlformats.org/officeDocument/2006/relationships" w:history="true" r:id="R36ef1bb3a28b47c2">
+      <w:hyperlink xmlns:r="http://schemas.openxmlformats.org/officeDocument/2006/relationships" w:history="true" r:id="R3892b19cfa2d4ac4">
         <w:r>
           <w:rPr>
             <w:rStyle w:val="Hyperlink"/>
@@ -1591,7 +1591,7 @@
       <w:r>
         <w:t xml:space="preserve">, and </w:t>
       </w:r>
-      <w:hyperlink xmlns:r="http://schemas.openxmlformats.org/officeDocument/2006/relationships" w:history="true" r:id="Rc8086b7155424cfd">
+      <w:hyperlink xmlns:r="http://schemas.openxmlformats.org/officeDocument/2006/relationships" w:history="true" r:id="Rc64068c53baf4409">
         <w:r>
           <w:rPr>
             <w:rStyle w:val="Hyperlink"/>
@@ -1979,7 +1979,7 @@
                     <pic:cNvPicPr/>
                   </pic:nvPicPr>
                   <pic:blipFill>
-                    <a:blip xmlns:r="http://schemas.openxmlformats.org/officeDocument/2006/relationships" r:embed="Rf64000582cfa4061"/>
+                    <a:blip xmlns:r="http://schemas.openxmlformats.org/officeDocument/2006/relationships" r:embed="Rdd6dd02094d94531"/>
                     <a:stretch>
                       <a:fillRect/>
                     </a:stretch>
@@ -2039,7 +2039,7 @@
                     <pic:cNvPicPr/>
                   </pic:nvPicPr>
                   <pic:blipFill>
-                    <a:blip xmlns:r="http://schemas.openxmlformats.org/officeDocument/2006/relationships" r:embed="Rd832aadee5ff4931"/>
+                    <a:blip xmlns:r="http://schemas.openxmlformats.org/officeDocument/2006/relationships" r:embed="Rb19138893ad64d3f"/>
                     <a:stretch>
                       <a:fillRect/>
                     </a:stretch>
@@ -2099,7 +2099,7 @@
                     <pic:cNvPicPr/>
                   </pic:nvPicPr>
                   <pic:blipFill>
-                    <a:blip xmlns:r="http://schemas.openxmlformats.org/officeDocument/2006/relationships" r:embed="R51589abac05e4801"/>
+                    <a:blip xmlns:r="http://schemas.openxmlformats.org/officeDocument/2006/relationships" r:embed="R87ab6d93f08c4b0f"/>
                     <a:stretch>
                       <a:fillRect/>
                     </a:stretch>
@@ -2150,7 +2150,7 @@
                     <pic:cNvPicPr/>
                   </pic:nvPicPr>
                   <pic:blipFill>
-                    <a:blip xmlns:r="http://schemas.openxmlformats.org/officeDocument/2006/relationships" r:embed="R3459d6ff86fd4301"/>
+                    <a:blip xmlns:r="http://schemas.openxmlformats.org/officeDocument/2006/relationships" r:embed="R99025042124a4861"/>
                     <a:stretch>
                       <a:fillRect/>
                     </a:stretch>
@@ -2201,7 +2201,7 @@
                     <pic:cNvPicPr/>
                   </pic:nvPicPr>
                   <pic:blipFill>
-                    <a:blip xmlns:r="http://schemas.openxmlformats.org/officeDocument/2006/relationships" r:embed="Rafe2613f87bb4855"/>
+                    <a:blip xmlns:r="http://schemas.openxmlformats.org/officeDocument/2006/relationships" r:embed="R9869792822a44942"/>
                     <a:stretch>
                       <a:fillRect/>
                     </a:stretch>
@@ -2252,7 +2252,7 @@
                     <pic:cNvPicPr/>
                   </pic:nvPicPr>
                   <pic:blipFill>
-                    <a:blip xmlns:r="http://schemas.openxmlformats.org/officeDocument/2006/relationships" r:embed="Rea784e4acce14155"/>
+                    <a:blip xmlns:r="http://schemas.openxmlformats.org/officeDocument/2006/relationships" r:embed="R5c9a134e18b74b17"/>
                     <a:stretch>
                       <a:fillRect/>
                     </a:stretch>
@@ -2303,7 +2303,7 @@
                     <pic:cNvPicPr/>
                   </pic:nvPicPr>
                   <pic:blipFill>
-                    <a:blip xmlns:r="http://schemas.openxmlformats.org/officeDocument/2006/relationships" r:embed="R3beb33e3742c4e1e"/>
+                    <a:blip xmlns:r="http://schemas.openxmlformats.org/officeDocument/2006/relationships" r:embed="Re6761e352889442c"/>
                     <a:stretch>
                       <a:fillRect/>
                     </a:stretch>
@@ -2354,7 +2354,7 @@
                     <pic:cNvPicPr/>
                   </pic:nvPicPr>
                   <pic:blipFill>
-                    <a:blip xmlns:r="http://schemas.openxmlformats.org/officeDocument/2006/relationships" r:embed="Rbe5296edab514474"/>
+                    <a:blip xmlns:r="http://schemas.openxmlformats.org/officeDocument/2006/relationships" r:embed="R6e58aa00dac547e4"/>
                     <a:stretch>
                       <a:fillRect/>
                     </a:stretch>
@@ -2430,7 +2430,7 @@
                     <pic:cNvPicPr/>
                   </pic:nvPicPr>
                   <pic:blipFill>
-                    <a:blip xmlns:r="http://schemas.openxmlformats.org/officeDocument/2006/relationships" r:embed="R91403e57d8b64f69"/>
+                    <a:blip xmlns:r="http://schemas.openxmlformats.org/officeDocument/2006/relationships" r:embed="R3fb9916570014f09"/>
                     <a:stretch>
                       <a:fillRect/>
                     </a:stretch>
@@ -2481,7 +2481,7 @@
                     <pic:cNvPicPr/>
                   </pic:nvPicPr>
                   <pic:blipFill>
-                    <a:blip xmlns:r="http://schemas.openxmlformats.org/officeDocument/2006/relationships" r:embed="Rd34091ada1184964"/>
+                    <a:blip xmlns:r="http://schemas.openxmlformats.org/officeDocument/2006/relationships" r:embed="Rc91615ab6c4f4987"/>
                     <a:stretch>
                       <a:fillRect/>
                     </a:stretch>
@@ -2532,7 +2532,7 @@
                     <pic:cNvPicPr/>
                   </pic:nvPicPr>
                   <pic:blipFill>
-                    <a:blip xmlns:r="http://schemas.openxmlformats.org/officeDocument/2006/relationships" r:embed="Rf49098606d324049"/>
+                    <a:blip xmlns:r="http://schemas.openxmlformats.org/officeDocument/2006/relationships" r:embed="R1201700fc3804046"/>
                     <a:stretch>
                       <a:fillRect/>
                     </a:stretch>
@@ -2583,7 +2583,7 @@
                     <pic:cNvPicPr/>
                   </pic:nvPicPr>
                   <pic:blipFill>
-                    <a:blip xmlns:r="http://schemas.openxmlformats.org/officeDocument/2006/relationships" r:embed="R8beee7b1992341ea"/>
+                    <a:blip xmlns:r="http://schemas.openxmlformats.org/officeDocument/2006/relationships" r:embed="Re3da1eccca6b4116"/>
                     <a:stretch>
                       <a:fillRect/>
                     </a:stretch>
@@ -2659,7 +2659,7 @@
                     <pic:cNvPicPr/>
                   </pic:nvPicPr>
                   <pic:blipFill>
-                    <a:blip xmlns:r="http://schemas.openxmlformats.org/officeDocument/2006/relationships" r:embed="Rf1206ed2ae094626"/>
+                    <a:blip xmlns:r="http://schemas.openxmlformats.org/officeDocument/2006/relationships" r:embed="Rfa9e5286707241bf"/>
                     <a:stretch>
                       <a:fillRect/>
                     </a:stretch>
@@ -2710,7 +2710,7 @@
                     <pic:cNvPicPr/>
                   </pic:nvPicPr>
                   <pic:blipFill>
-                    <a:blip xmlns:r="http://schemas.openxmlformats.org/officeDocument/2006/relationships" r:embed="R4784f42fb2a5457e"/>
+                    <a:blip xmlns:r="http://schemas.openxmlformats.org/officeDocument/2006/relationships" r:embed="R000817c7f1134a8f"/>
                     <a:stretch>
                       <a:fillRect/>
                     </a:stretch>
@@ -2761,7 +2761,7 @@
                     <pic:cNvPicPr/>
                   </pic:nvPicPr>
                   <pic:blipFill>
-                    <a:blip xmlns:r="http://schemas.openxmlformats.org/officeDocument/2006/relationships" r:embed="Rffb017338437491d"/>
+                    <a:blip xmlns:r="http://schemas.openxmlformats.org/officeDocument/2006/relationships" r:embed="R5dd2cbdbc9a249d7"/>
                     <a:stretch>
                       <a:fillRect/>
                     </a:stretch>
@@ -2812,7 +2812,7 @@
                     <pic:cNvPicPr/>
                   </pic:nvPicPr>
                   <pic:blipFill>
-                    <a:blip xmlns:r="http://schemas.openxmlformats.org/officeDocument/2006/relationships" r:embed="R43239d9c473e4fd5"/>
+                    <a:blip xmlns:r="http://schemas.openxmlformats.org/officeDocument/2006/relationships" r:embed="Rff3fd28f681d4c94"/>
                     <a:stretch>
                       <a:fillRect/>
                     </a:stretch>
@@ -2863,7 +2863,7 @@
                     <pic:cNvPicPr/>
                   </pic:nvPicPr>
                   <pic:blipFill>
-                    <a:blip xmlns:r="http://schemas.openxmlformats.org/officeDocument/2006/relationships" r:embed="Rad7f985c529f4360"/>
+                    <a:blip xmlns:r="http://schemas.openxmlformats.org/officeDocument/2006/relationships" r:embed="Rdb023e50f2c1468b"/>
                     <a:stretch>
                       <a:fillRect/>
                     </a:stretch>
@@ -2914,7 +2914,7 @@
                     <pic:cNvPicPr/>
                   </pic:nvPicPr>
                   <pic:blipFill>
-                    <a:blip xmlns:r="http://schemas.openxmlformats.org/officeDocument/2006/relationships" r:embed="Rd06895420b7b47cb"/>
+                    <a:blip xmlns:r="http://schemas.openxmlformats.org/officeDocument/2006/relationships" r:embed="R8b908edd043948e5"/>
                     <a:stretch>
                       <a:fillRect/>
                     </a:stretch>
@@ -2965,7 +2965,7 @@
                     <pic:cNvPicPr/>
                   </pic:nvPicPr>
                   <pic:blipFill>
-                    <a:blip xmlns:r="http://schemas.openxmlformats.org/officeDocument/2006/relationships" r:embed="Rd1ad3528f94f4e3d"/>
+                    <a:blip xmlns:r="http://schemas.openxmlformats.org/officeDocument/2006/relationships" r:embed="R3f9aae6436a546fe"/>
                     <a:stretch>
                       <a:fillRect/>
                     </a:stretch>
@@ -3016,7 +3016,7 @@
                     <pic:cNvPicPr/>
                   </pic:nvPicPr>
                   <pic:blipFill>
-                    <a:blip xmlns:r="http://schemas.openxmlformats.org/officeDocument/2006/relationships" r:embed="Rb92dafbe666749b1"/>
+                    <a:blip xmlns:r="http://schemas.openxmlformats.org/officeDocument/2006/relationships" r:embed="R84f145ec044b4799"/>
                     <a:stretch>
                       <a:fillRect/>
                     </a:stretch>
@@ -3067,7 +3067,7 @@
                     <pic:cNvPicPr/>
                   </pic:nvPicPr>
                   <pic:blipFill>
-                    <a:blip xmlns:r="http://schemas.openxmlformats.org/officeDocument/2006/relationships" r:embed="Rfe8273072c614426"/>
+                    <a:blip xmlns:r="http://schemas.openxmlformats.org/officeDocument/2006/relationships" r:embed="R3e79dcfd6da846df"/>
                     <a:stretch>
                       <a:fillRect/>
                     </a:stretch>
@@ -3118,7 +3118,7 @@
                     <pic:cNvPicPr/>
                   </pic:nvPicPr>
                   <pic:blipFill>
-                    <a:blip xmlns:r="http://schemas.openxmlformats.org/officeDocument/2006/relationships" r:embed="R6eb46e7217da4f62"/>
+                    <a:blip xmlns:r="http://schemas.openxmlformats.org/officeDocument/2006/relationships" r:embed="R55b40e0fe129415d"/>
                     <a:stretch>
                       <a:fillRect/>
                     </a:stretch>
@@ -3169,7 +3169,7 @@
                     <pic:cNvPicPr/>
                   </pic:nvPicPr>
                   <pic:blipFill>
-                    <a:blip xmlns:r="http://schemas.openxmlformats.org/officeDocument/2006/relationships" r:embed="R21af0b3a87594a86"/>
+                    <a:blip xmlns:r="http://schemas.openxmlformats.org/officeDocument/2006/relationships" r:embed="R520f742f363745ba"/>
                     <a:stretch>
                       <a:fillRect/>
                     </a:stretch>
@@ -3220,7 +3220,7 @@
                     <pic:cNvPicPr/>
                   </pic:nvPicPr>
                   <pic:blipFill>
-                    <a:blip xmlns:r="http://schemas.openxmlformats.org/officeDocument/2006/relationships" r:embed="R1502e28ccb4f4b3b"/>
+                    <a:blip xmlns:r="http://schemas.openxmlformats.org/officeDocument/2006/relationships" r:embed="Ra372ae3799b74f31"/>
                     <a:stretch>
                       <a:fillRect/>
                     </a:stretch>
@@ -3271,7 +3271,7 @@
                     <pic:cNvPicPr/>
                   </pic:nvPicPr>
                   <pic:blipFill>
-                    <a:blip xmlns:r="http://schemas.openxmlformats.org/officeDocument/2006/relationships" r:embed="R55232d60f7344a07"/>
+                    <a:blip xmlns:r="http://schemas.openxmlformats.org/officeDocument/2006/relationships" r:embed="R3acc25ad17904b04"/>
                     <a:stretch>
                       <a:fillRect/>
                     </a:stretch>
@@ -3322,7 +3322,7 @@
                     <pic:cNvPicPr/>
                   </pic:nvPicPr>
                   <pic:blipFill>
-                    <a:blip xmlns:r="http://schemas.openxmlformats.org/officeDocument/2006/relationships" r:embed="R25e921539f204920"/>
+                    <a:blip xmlns:r="http://schemas.openxmlformats.org/officeDocument/2006/relationships" r:embed="R753860c393054838"/>
                     <a:stretch>
                       <a:fillRect/>
                     </a:stretch>
@@ -3419,7 +3419,7 @@
                     <pic:cNvPicPr/>
                   </pic:nvPicPr>
                   <pic:blipFill>
-                    <a:blip xmlns:r="http://schemas.openxmlformats.org/officeDocument/2006/relationships" r:embed="Rcb7e88a9ecbc4153"/>
+                    <a:blip xmlns:r="http://schemas.openxmlformats.org/officeDocument/2006/relationships" r:embed="R1676742182ad43b6"/>
                     <a:stretch>
                       <a:fillRect/>
                     </a:stretch>
@@ -3462,7 +3462,7 @@
                     <pic:cNvPicPr/>
                   </pic:nvPicPr>
                   <pic:blipFill>
-                    <a:blip xmlns:r="http://schemas.openxmlformats.org/officeDocument/2006/relationships" r:embed="R9e024c929afc413c"/>
+                    <a:blip xmlns:r="http://schemas.openxmlformats.org/officeDocument/2006/relationships" r:embed="Rc566bef0b5a14f05"/>
                     <a:stretch>
                       <a:fillRect/>
                     </a:stretch>
@@ -3505,7 +3505,7 @@
                     <pic:cNvPicPr/>
                   </pic:nvPicPr>
                   <pic:blipFill>
-                    <a:blip xmlns:r="http://schemas.openxmlformats.org/officeDocument/2006/relationships" r:embed="Rb58248e900e54609"/>
+                    <a:blip xmlns:r="http://schemas.openxmlformats.org/officeDocument/2006/relationships" r:embed="Ra1df259ae47f42ad"/>
                     <a:stretch>
                       <a:fillRect/>
                     </a:stretch>
@@ -3548,7 +3548,7 @@
                     <pic:cNvPicPr/>
                   </pic:nvPicPr>
                   <pic:blipFill>
-                    <a:blip xmlns:r="http://schemas.openxmlformats.org/officeDocument/2006/relationships" r:embed="R82ca2ea7cd674f27"/>
+                    <a:blip xmlns:r="http://schemas.openxmlformats.org/officeDocument/2006/relationships" r:embed="Re379ca59540f4880"/>
                     <a:stretch>
                       <a:fillRect/>
                     </a:stretch>
@@ -3933,7 +3933,7 @@
                     <pic:cNvPicPr/>
                   </pic:nvPicPr>
                   <pic:blipFill>
-                    <a:blip xmlns:r="http://schemas.openxmlformats.org/officeDocument/2006/relationships" r:embed="R8069566776cc40e7"/>
+                    <a:blip xmlns:r="http://schemas.openxmlformats.org/officeDocument/2006/relationships" r:embed="R9aa4fd4de1224f68"/>
                     <a:stretch>
                       <a:fillRect/>
                     </a:stretch>
@@ -4125,7 +4125,7 @@
                     <pic:cNvPicPr/>
                   </pic:nvPicPr>
                   <pic:blipFill>
-                    <a:blip xmlns:r="http://schemas.openxmlformats.org/officeDocument/2006/relationships" r:embed="R8e57868837964567"/>
+                    <a:blip xmlns:r="http://schemas.openxmlformats.org/officeDocument/2006/relationships" r:embed="R2a5f1e158cc34fd4"/>
                     <a:stretch>
                       <a:fillRect/>
                     </a:stretch>
@@ -4176,7 +4176,7 @@
                     <pic:cNvPicPr/>
                   </pic:nvPicPr>
                   <pic:blipFill>
-                    <a:blip xmlns:r="http://schemas.openxmlformats.org/officeDocument/2006/relationships" r:embed="Rc14fe68f8e004d19"/>
+                    <a:blip xmlns:r="http://schemas.openxmlformats.org/officeDocument/2006/relationships" r:embed="R354ea6c5d62a4074"/>
                     <a:stretch>
                       <a:fillRect/>
                     </a:stretch>
@@ -4227,7 +4227,7 @@
                     <pic:cNvPicPr/>
                   </pic:nvPicPr>
                   <pic:blipFill>
-                    <a:blip xmlns:r="http://schemas.openxmlformats.org/officeDocument/2006/relationships" r:embed="R89c2541760d04da8"/>
+                    <a:blip xmlns:r="http://schemas.openxmlformats.org/officeDocument/2006/relationships" r:embed="Re42c72c3eff647fd"/>
                     <a:stretch>
                       <a:fillRect/>
                     </a:stretch>
@@ -4278,7 +4278,7 @@
                     <pic:cNvPicPr/>
                   </pic:nvPicPr>
                   <pic:blipFill>
-                    <a:blip xmlns:r="http://schemas.openxmlformats.org/officeDocument/2006/relationships" r:embed="Re80d320f29464b36"/>
+                    <a:blip xmlns:r="http://schemas.openxmlformats.org/officeDocument/2006/relationships" r:embed="R7a0270ac036a4c0d"/>
                     <a:stretch>
                       <a:fillRect/>
                     </a:stretch>
@@ -4657,7 +4657,7 @@
                     <pic:cNvPicPr/>
                   </pic:nvPicPr>
                   <pic:blipFill>
-                    <a:blip xmlns:r="http://schemas.openxmlformats.org/officeDocument/2006/relationships" r:embed="Rcd7617a136eb428b"/>
+                    <a:blip xmlns:r="http://schemas.openxmlformats.org/officeDocument/2006/relationships" r:embed="R954bd7f04b1b49ad"/>
                     <a:stretch>
                       <a:fillRect/>
                     </a:stretch>
@@ -5338,7 +5338,7 @@
             <w:r>
               <w:t xml:space="preserve">Cell with </w:t>
             </w:r>
-            <w:hyperlink xmlns:r="http://schemas.openxmlformats.org/officeDocument/2006/relationships" w:history="true" r:id="Raa60536b69904af0">
+            <w:hyperlink xmlns:r="http://schemas.openxmlformats.org/officeDocument/2006/relationships" w:history="true" r:id="Rdf779b593825485a">
               <w:r>
                 <w:rPr>
                   <w:rStyle w:val="Hyperlink"/>
@@ -5624,7 +5624,7 @@
                           <pic:cNvPicPr/>
                         </pic:nvPicPr>
                         <pic:blipFill>
-                          <a:blip xmlns:r="http://schemas.openxmlformats.org/officeDocument/2006/relationships" r:embed="Rfc816f8936ce4bf8"/>
+                          <a:blip xmlns:r="http://schemas.openxmlformats.org/officeDocument/2006/relationships" r:embed="R7ad7c8260c4e4e4d"/>
                           <a:stretch>
                             <a:fillRect/>
                           </a:stretch>
@@ -5724,7 +5724,7 @@
                     <pic:cNvPicPr/>
                   </pic:nvPicPr>
                   <pic:blipFill>
-                    <a:blip xmlns:r="http://schemas.openxmlformats.org/officeDocument/2006/relationships" r:embed="R463a0b433eca4e49"/>
+                    <a:blip xmlns:r="http://schemas.openxmlformats.org/officeDocument/2006/relationships" r:embed="Ra13aee50eff54b38"/>
                     <a:stretch>
                       <a:fillRect/>
                     </a:stretch>
@@ -5774,7 +5774,7 @@
                     <pic:cNvPicPr/>
                   </pic:nvPicPr>
                   <pic:blipFill>
-                    <a:blip xmlns:r="http://schemas.openxmlformats.org/officeDocument/2006/relationships" r:embed="R3454217182c24408"/>
+                    <a:blip xmlns:r="http://schemas.openxmlformats.org/officeDocument/2006/relationships" r:embed="Red7ec86b17fa4ca2"/>
                     <a:stretch>
                       <a:fillRect/>
                     </a:stretch>
@@ -5824,7 +5824,7 @@
                     <pic:cNvPicPr/>
                   </pic:nvPicPr>
                   <pic:blipFill>
-                    <a:blip xmlns:r="http://schemas.openxmlformats.org/officeDocument/2006/relationships" r:embed="R3d13598f26274bab"/>
+                    <a:blip xmlns:r="http://schemas.openxmlformats.org/officeDocument/2006/relationships" r:embed="Ra6748a61a5844c6e"/>
                     <a:stretch>
                       <a:fillRect/>
                     </a:stretch>

</xml_diff>

<commit_message>
fix(er): set matrix label centres to Mermaid positions
For scenario 2 matrix edges, place label centres at (target node X, midpoint of node centre Ys) to match Mermaid’s deterministic edgeLabel placement.

Made-with: Cursor
</commit_message>
<xml_diff>
--- a/test.docx
+++ b/test.docx
@@ -236,7 +236,7 @@
       <w:r>
         <w:t xml:space="preserve">, and </w:t>
       </w:r>
-      <w:hyperlink xmlns:r="http://schemas.openxmlformats.org/officeDocument/2006/relationships" w:history="true" r:id="R417425a9a45b49dc">
+      <w:hyperlink xmlns:r="http://schemas.openxmlformats.org/officeDocument/2006/relationships" w:history="true" r:id="Rfb0e7cb8576e4ec8">
         <w:r>
           <w:rPr>
             <w:rStyle w:val="Hyperlink"/>
@@ -475,7 +475,7 @@
       <w:r>
         <w:t xml:space="preserve">Direct link: </w:t>
       </w:r>
-      <w:hyperlink xmlns:r="http://schemas.openxmlformats.org/officeDocument/2006/relationships" w:history="true" r:id="Rfcdd3dcef8bd4344">
+      <w:hyperlink xmlns:r="http://schemas.openxmlformats.org/officeDocument/2006/relationships" w:history="true" r:id="R91a89d3d34144c6c">
         <w:r>
           <w:rPr>
             <w:rStyle w:val="Hyperlink"/>
@@ -496,7 +496,7 @@
       <w:r>
         <w:t xml:space="preserve">Direct link with title: </w:t>
       </w:r>
-      <w:hyperlink xmlns:r="http://schemas.openxmlformats.org/officeDocument/2006/relationships" w:history="true" r:id="R878b37e1c4d34afd">
+      <w:hyperlink xmlns:r="http://schemas.openxmlformats.org/officeDocument/2006/relationships" w:history="true" r:id="Rcdeb4d0dbc674045">
         <w:r>
           <w:rPr>
             <w:rStyle w:val="Hyperlink"/>
@@ -517,7 +517,7 @@
       <w:r>
         <w:t xml:space="preserve">Reference-style link: </w:t>
       </w:r>
-      <w:hyperlink xmlns:r="http://schemas.openxmlformats.org/officeDocument/2006/relationships" w:history="true" r:id="R07ab8affd75e4abb">
+      <w:hyperlink xmlns:r="http://schemas.openxmlformats.org/officeDocument/2006/relationships" w:history="true" r:id="R1db0b25490c440c3">
         <w:r>
           <w:rPr>
             <w:rStyle w:val="Hyperlink"/>
@@ -538,7 +538,7 @@
       <w:r>
         <w:t xml:space="preserve">Collapsed reference link: </w:t>
       </w:r>
-      <w:hyperlink xmlns:r="http://schemas.openxmlformats.org/officeDocument/2006/relationships" w:history="true" r:id="Rc9a4e016792c47c8">
+      <w:hyperlink xmlns:r="http://schemas.openxmlformats.org/officeDocument/2006/relationships" w:history="true" r:id="Rec1d47633dbd4475">
         <w:r>
           <w:rPr>
             <w:rStyle w:val="Hyperlink"/>
@@ -559,7 +559,7 @@
       <w:r>
         <w:t xml:space="preserve">Repeated reference link: </w:t>
       </w:r>
-      <w:hyperlink xmlns:r="http://schemas.openxmlformats.org/officeDocument/2006/relationships" w:history="true" r:id="R157bc83d3ad64c24">
+      <w:hyperlink xmlns:r="http://schemas.openxmlformats.org/officeDocument/2006/relationships" w:history="true" r:id="R66959e697e4b4a70">
         <w:r>
           <w:rPr>
             <w:rStyle w:val="Hyperlink"/>
@@ -580,7 +580,7 @@
       <w:r>
         <w:t xml:space="preserve">Autolink URL: </w:t>
       </w:r>
-      <w:hyperlink xmlns:r="http://schemas.openxmlformats.org/officeDocument/2006/relationships" w:history="true" r:id="R67e243da7ecd497c">
+      <w:hyperlink xmlns:r="http://schemas.openxmlformats.org/officeDocument/2006/relationships" w:history="true" r:id="R6c731d4478ac4c5d">
         <w:r>
           <w:rPr>
             <w:rStyle w:val="Hyperlink"/>
@@ -601,7 +601,7 @@
       <w:r>
         <w:t xml:space="preserve">Autolink email: </w:t>
       </w:r>
-      <w:hyperlink xmlns:r="http://schemas.openxmlformats.org/officeDocument/2006/relationships" w:history="true" r:id="Rc6d5646121564821">
+      <w:hyperlink xmlns:r="http://schemas.openxmlformats.org/officeDocument/2006/relationships" w:history="true" r:id="R53e3de8c22524b51">
         <w:r>
           <w:rPr>
             <w:rStyle w:val="Hyperlink"/>
@@ -700,7 +700,7 @@
       <w:r>
         <w:t xml:space="preserve">, and </w:t>
       </w:r>
-      <w:hyperlink xmlns:r="http://schemas.openxmlformats.org/officeDocument/2006/relationships" w:history="true" r:id="R4365cfa74bdc4ef9">
+      <w:hyperlink xmlns:r="http://schemas.openxmlformats.org/officeDocument/2006/relationships" w:history="true" r:id="Rbeadb8e71ebe4166">
         <w:r>
           <w:rPr>
             <w:rStyle w:val="Hyperlink"/>
@@ -1093,7 +1093,7 @@
       <w:r>
         <w:t xml:space="preserve">Continuation paragraph with </w:t>
       </w:r>
-      <w:hyperlink xmlns:r="http://schemas.openxmlformats.org/officeDocument/2006/relationships" w:history="true" r:id="R3892b19cfa2d4ac4">
+      <w:hyperlink xmlns:r="http://schemas.openxmlformats.org/officeDocument/2006/relationships" w:history="true" r:id="R2c1de64f4a5c4291">
         <w:r>
           <w:rPr>
             <w:rStyle w:val="Hyperlink"/>
@@ -1591,7 +1591,7 @@
       <w:r>
         <w:t xml:space="preserve">, and </w:t>
       </w:r>
-      <w:hyperlink xmlns:r="http://schemas.openxmlformats.org/officeDocument/2006/relationships" w:history="true" r:id="Rc64068c53baf4409">
+      <w:hyperlink xmlns:r="http://schemas.openxmlformats.org/officeDocument/2006/relationships" w:history="true" r:id="R8e50d78188564490">
         <w:r>
           <w:rPr>
             <w:rStyle w:val="Hyperlink"/>
@@ -1979,7 +1979,7 @@
                     <pic:cNvPicPr/>
                   </pic:nvPicPr>
                   <pic:blipFill>
-                    <a:blip xmlns:r="http://schemas.openxmlformats.org/officeDocument/2006/relationships" r:embed="Rdd6dd02094d94531"/>
+                    <a:blip xmlns:r="http://schemas.openxmlformats.org/officeDocument/2006/relationships" r:embed="Rf4afaef352fc48dc"/>
                     <a:stretch>
                       <a:fillRect/>
                     </a:stretch>
@@ -2039,7 +2039,7 @@
                     <pic:cNvPicPr/>
                   </pic:nvPicPr>
                   <pic:blipFill>
-                    <a:blip xmlns:r="http://schemas.openxmlformats.org/officeDocument/2006/relationships" r:embed="Rb19138893ad64d3f"/>
+                    <a:blip xmlns:r="http://schemas.openxmlformats.org/officeDocument/2006/relationships" r:embed="R1065164af9924a40"/>
                     <a:stretch>
                       <a:fillRect/>
                     </a:stretch>
@@ -2099,7 +2099,7 @@
                     <pic:cNvPicPr/>
                   </pic:nvPicPr>
                   <pic:blipFill>
-                    <a:blip xmlns:r="http://schemas.openxmlformats.org/officeDocument/2006/relationships" r:embed="R87ab6d93f08c4b0f"/>
+                    <a:blip xmlns:r="http://schemas.openxmlformats.org/officeDocument/2006/relationships" r:embed="R104c512860fb47a8"/>
                     <a:stretch>
                       <a:fillRect/>
                     </a:stretch>
@@ -2150,7 +2150,7 @@
                     <pic:cNvPicPr/>
                   </pic:nvPicPr>
                   <pic:blipFill>
-                    <a:blip xmlns:r="http://schemas.openxmlformats.org/officeDocument/2006/relationships" r:embed="R99025042124a4861"/>
+                    <a:blip xmlns:r="http://schemas.openxmlformats.org/officeDocument/2006/relationships" r:embed="R05c23d3abe4c4195"/>
                     <a:stretch>
                       <a:fillRect/>
                     </a:stretch>
@@ -2201,7 +2201,7 @@
                     <pic:cNvPicPr/>
                   </pic:nvPicPr>
                   <pic:blipFill>
-                    <a:blip xmlns:r="http://schemas.openxmlformats.org/officeDocument/2006/relationships" r:embed="R9869792822a44942"/>
+                    <a:blip xmlns:r="http://schemas.openxmlformats.org/officeDocument/2006/relationships" r:embed="Rd69ebcf299854536"/>
                     <a:stretch>
                       <a:fillRect/>
                     </a:stretch>
@@ -2252,7 +2252,7 @@
                     <pic:cNvPicPr/>
                   </pic:nvPicPr>
                   <pic:blipFill>
-                    <a:blip xmlns:r="http://schemas.openxmlformats.org/officeDocument/2006/relationships" r:embed="R5c9a134e18b74b17"/>
+                    <a:blip xmlns:r="http://schemas.openxmlformats.org/officeDocument/2006/relationships" r:embed="R3d04011a1a0d46ac"/>
                     <a:stretch>
                       <a:fillRect/>
                     </a:stretch>
@@ -2303,7 +2303,7 @@
                     <pic:cNvPicPr/>
                   </pic:nvPicPr>
                   <pic:blipFill>
-                    <a:blip xmlns:r="http://schemas.openxmlformats.org/officeDocument/2006/relationships" r:embed="Re6761e352889442c"/>
+                    <a:blip xmlns:r="http://schemas.openxmlformats.org/officeDocument/2006/relationships" r:embed="Rfc2f357f78f940d2"/>
                     <a:stretch>
                       <a:fillRect/>
                     </a:stretch>
@@ -2354,7 +2354,7 @@
                     <pic:cNvPicPr/>
                   </pic:nvPicPr>
                   <pic:blipFill>
-                    <a:blip xmlns:r="http://schemas.openxmlformats.org/officeDocument/2006/relationships" r:embed="R6e58aa00dac547e4"/>
+                    <a:blip xmlns:r="http://schemas.openxmlformats.org/officeDocument/2006/relationships" r:embed="Rc1f29836eded4b34"/>
                     <a:stretch>
                       <a:fillRect/>
                     </a:stretch>
@@ -2430,7 +2430,7 @@
                     <pic:cNvPicPr/>
                   </pic:nvPicPr>
                   <pic:blipFill>
-                    <a:blip xmlns:r="http://schemas.openxmlformats.org/officeDocument/2006/relationships" r:embed="R3fb9916570014f09"/>
+                    <a:blip xmlns:r="http://schemas.openxmlformats.org/officeDocument/2006/relationships" r:embed="R69375f85075146b6"/>
                     <a:stretch>
                       <a:fillRect/>
                     </a:stretch>
@@ -2481,7 +2481,7 @@
                     <pic:cNvPicPr/>
                   </pic:nvPicPr>
                   <pic:blipFill>
-                    <a:blip xmlns:r="http://schemas.openxmlformats.org/officeDocument/2006/relationships" r:embed="Rc91615ab6c4f4987"/>
+                    <a:blip xmlns:r="http://schemas.openxmlformats.org/officeDocument/2006/relationships" r:embed="R4dab715c089b4df1"/>
                     <a:stretch>
                       <a:fillRect/>
                     </a:stretch>
@@ -2532,7 +2532,7 @@
                     <pic:cNvPicPr/>
                   </pic:nvPicPr>
                   <pic:blipFill>
-                    <a:blip xmlns:r="http://schemas.openxmlformats.org/officeDocument/2006/relationships" r:embed="R1201700fc3804046"/>
+                    <a:blip xmlns:r="http://schemas.openxmlformats.org/officeDocument/2006/relationships" r:embed="Ra17aecf8ffe94b41"/>
                     <a:stretch>
                       <a:fillRect/>
                     </a:stretch>
@@ -2583,7 +2583,7 @@
                     <pic:cNvPicPr/>
                   </pic:nvPicPr>
                   <pic:blipFill>
-                    <a:blip xmlns:r="http://schemas.openxmlformats.org/officeDocument/2006/relationships" r:embed="Re3da1eccca6b4116"/>
+                    <a:blip xmlns:r="http://schemas.openxmlformats.org/officeDocument/2006/relationships" r:embed="Rbcbfbce15ee54474"/>
                     <a:stretch>
                       <a:fillRect/>
                     </a:stretch>
@@ -2659,7 +2659,7 @@
                     <pic:cNvPicPr/>
                   </pic:nvPicPr>
                   <pic:blipFill>
-                    <a:blip xmlns:r="http://schemas.openxmlformats.org/officeDocument/2006/relationships" r:embed="Rfa9e5286707241bf"/>
+                    <a:blip xmlns:r="http://schemas.openxmlformats.org/officeDocument/2006/relationships" r:embed="R18c4ba849f9847d4"/>
                     <a:stretch>
                       <a:fillRect/>
                     </a:stretch>
@@ -2710,7 +2710,7 @@
                     <pic:cNvPicPr/>
                   </pic:nvPicPr>
                   <pic:blipFill>
-                    <a:blip xmlns:r="http://schemas.openxmlformats.org/officeDocument/2006/relationships" r:embed="R000817c7f1134a8f"/>
+                    <a:blip xmlns:r="http://schemas.openxmlformats.org/officeDocument/2006/relationships" r:embed="Rfa56bab32ff74f18"/>
                     <a:stretch>
                       <a:fillRect/>
                     </a:stretch>
@@ -2761,7 +2761,7 @@
                     <pic:cNvPicPr/>
                   </pic:nvPicPr>
                   <pic:blipFill>
-                    <a:blip xmlns:r="http://schemas.openxmlformats.org/officeDocument/2006/relationships" r:embed="R5dd2cbdbc9a249d7"/>
+                    <a:blip xmlns:r="http://schemas.openxmlformats.org/officeDocument/2006/relationships" r:embed="Ra754e9da33774250"/>
                     <a:stretch>
                       <a:fillRect/>
                     </a:stretch>
@@ -2812,7 +2812,7 @@
                     <pic:cNvPicPr/>
                   </pic:nvPicPr>
                   <pic:blipFill>
-                    <a:blip xmlns:r="http://schemas.openxmlformats.org/officeDocument/2006/relationships" r:embed="Rff3fd28f681d4c94"/>
+                    <a:blip xmlns:r="http://schemas.openxmlformats.org/officeDocument/2006/relationships" r:embed="Re83b39bad15d46a8"/>
                     <a:stretch>
                       <a:fillRect/>
                     </a:stretch>
@@ -2863,7 +2863,7 @@
                     <pic:cNvPicPr/>
                   </pic:nvPicPr>
                   <pic:blipFill>
-                    <a:blip xmlns:r="http://schemas.openxmlformats.org/officeDocument/2006/relationships" r:embed="Rdb023e50f2c1468b"/>
+                    <a:blip xmlns:r="http://schemas.openxmlformats.org/officeDocument/2006/relationships" r:embed="R369a9cdae31a4c27"/>
                     <a:stretch>
                       <a:fillRect/>
                     </a:stretch>
@@ -2914,7 +2914,7 @@
                     <pic:cNvPicPr/>
                   </pic:nvPicPr>
                   <pic:blipFill>
-                    <a:blip xmlns:r="http://schemas.openxmlformats.org/officeDocument/2006/relationships" r:embed="R8b908edd043948e5"/>
+                    <a:blip xmlns:r="http://schemas.openxmlformats.org/officeDocument/2006/relationships" r:embed="Rf41a959318954686"/>
                     <a:stretch>
                       <a:fillRect/>
                     </a:stretch>
@@ -2965,7 +2965,7 @@
                     <pic:cNvPicPr/>
                   </pic:nvPicPr>
                   <pic:blipFill>
-                    <a:blip xmlns:r="http://schemas.openxmlformats.org/officeDocument/2006/relationships" r:embed="R3f9aae6436a546fe"/>
+                    <a:blip xmlns:r="http://schemas.openxmlformats.org/officeDocument/2006/relationships" r:embed="R2e530fa3639241c7"/>
                     <a:stretch>
                       <a:fillRect/>
                     </a:stretch>
@@ -3016,7 +3016,7 @@
                     <pic:cNvPicPr/>
                   </pic:nvPicPr>
                   <pic:blipFill>
-                    <a:blip xmlns:r="http://schemas.openxmlformats.org/officeDocument/2006/relationships" r:embed="R84f145ec044b4799"/>
+                    <a:blip xmlns:r="http://schemas.openxmlformats.org/officeDocument/2006/relationships" r:embed="R8bfec45c2f554e65"/>
                     <a:stretch>
                       <a:fillRect/>
                     </a:stretch>
@@ -3067,7 +3067,7 @@
                     <pic:cNvPicPr/>
                   </pic:nvPicPr>
                   <pic:blipFill>
-                    <a:blip xmlns:r="http://schemas.openxmlformats.org/officeDocument/2006/relationships" r:embed="R3e79dcfd6da846df"/>
+                    <a:blip xmlns:r="http://schemas.openxmlformats.org/officeDocument/2006/relationships" r:embed="Rbbaf442a5e5a45cf"/>
                     <a:stretch>
                       <a:fillRect/>
                     </a:stretch>
@@ -3118,7 +3118,7 @@
                     <pic:cNvPicPr/>
                   </pic:nvPicPr>
                   <pic:blipFill>
-                    <a:blip xmlns:r="http://schemas.openxmlformats.org/officeDocument/2006/relationships" r:embed="R55b40e0fe129415d"/>
+                    <a:blip xmlns:r="http://schemas.openxmlformats.org/officeDocument/2006/relationships" r:embed="R636a3c2ec3634740"/>
                     <a:stretch>
                       <a:fillRect/>
                     </a:stretch>
@@ -3169,7 +3169,7 @@
                     <pic:cNvPicPr/>
                   </pic:nvPicPr>
                   <pic:blipFill>
-                    <a:blip xmlns:r="http://schemas.openxmlformats.org/officeDocument/2006/relationships" r:embed="R520f742f363745ba"/>
+                    <a:blip xmlns:r="http://schemas.openxmlformats.org/officeDocument/2006/relationships" r:embed="R6bca54b3b05b4d49"/>
                     <a:stretch>
                       <a:fillRect/>
                     </a:stretch>
@@ -3220,7 +3220,7 @@
                     <pic:cNvPicPr/>
                   </pic:nvPicPr>
                   <pic:blipFill>
-                    <a:blip xmlns:r="http://schemas.openxmlformats.org/officeDocument/2006/relationships" r:embed="Ra372ae3799b74f31"/>
+                    <a:blip xmlns:r="http://schemas.openxmlformats.org/officeDocument/2006/relationships" r:embed="Rf790adbd983148a4"/>
                     <a:stretch>
                       <a:fillRect/>
                     </a:stretch>
@@ -3271,7 +3271,7 @@
                     <pic:cNvPicPr/>
                   </pic:nvPicPr>
                   <pic:blipFill>
-                    <a:blip xmlns:r="http://schemas.openxmlformats.org/officeDocument/2006/relationships" r:embed="R3acc25ad17904b04"/>
+                    <a:blip xmlns:r="http://schemas.openxmlformats.org/officeDocument/2006/relationships" r:embed="Rb83f53b05fc64d55"/>
                     <a:stretch>
                       <a:fillRect/>
                     </a:stretch>
@@ -3322,7 +3322,7 @@
                     <pic:cNvPicPr/>
                   </pic:nvPicPr>
                   <pic:blipFill>
-                    <a:blip xmlns:r="http://schemas.openxmlformats.org/officeDocument/2006/relationships" r:embed="R753860c393054838"/>
+                    <a:blip xmlns:r="http://schemas.openxmlformats.org/officeDocument/2006/relationships" r:embed="R4243e8c60c0b4c68"/>
                     <a:stretch>
                       <a:fillRect/>
                     </a:stretch>
@@ -3419,7 +3419,7 @@
                     <pic:cNvPicPr/>
                   </pic:nvPicPr>
                   <pic:blipFill>
-                    <a:blip xmlns:r="http://schemas.openxmlformats.org/officeDocument/2006/relationships" r:embed="R1676742182ad43b6"/>
+                    <a:blip xmlns:r="http://schemas.openxmlformats.org/officeDocument/2006/relationships" r:embed="R6e96e7d9f03f4c7b"/>
                     <a:stretch>
                       <a:fillRect/>
                     </a:stretch>
@@ -3462,7 +3462,7 @@
                     <pic:cNvPicPr/>
                   </pic:nvPicPr>
                   <pic:blipFill>
-                    <a:blip xmlns:r="http://schemas.openxmlformats.org/officeDocument/2006/relationships" r:embed="Rc566bef0b5a14f05"/>
+                    <a:blip xmlns:r="http://schemas.openxmlformats.org/officeDocument/2006/relationships" r:embed="R73c80e61966b4934"/>
                     <a:stretch>
                       <a:fillRect/>
                     </a:stretch>
@@ -3505,7 +3505,7 @@
                     <pic:cNvPicPr/>
                   </pic:nvPicPr>
                   <pic:blipFill>
-                    <a:blip xmlns:r="http://schemas.openxmlformats.org/officeDocument/2006/relationships" r:embed="Ra1df259ae47f42ad"/>
+                    <a:blip xmlns:r="http://schemas.openxmlformats.org/officeDocument/2006/relationships" r:embed="Rcb656c5aee9942f0"/>
                     <a:stretch>
                       <a:fillRect/>
                     </a:stretch>
@@ -3548,7 +3548,7 @@
                     <pic:cNvPicPr/>
                   </pic:nvPicPr>
                   <pic:blipFill>
-                    <a:blip xmlns:r="http://schemas.openxmlformats.org/officeDocument/2006/relationships" r:embed="Re379ca59540f4880"/>
+                    <a:blip xmlns:r="http://schemas.openxmlformats.org/officeDocument/2006/relationships" r:embed="Rd5580b64f784404a"/>
                     <a:stretch>
                       <a:fillRect/>
                     </a:stretch>
@@ -3933,7 +3933,7 @@
                     <pic:cNvPicPr/>
                   </pic:nvPicPr>
                   <pic:blipFill>
-                    <a:blip xmlns:r="http://schemas.openxmlformats.org/officeDocument/2006/relationships" r:embed="R9aa4fd4de1224f68"/>
+                    <a:blip xmlns:r="http://schemas.openxmlformats.org/officeDocument/2006/relationships" r:embed="R25b8eb5950b1456b"/>
                     <a:stretch>
                       <a:fillRect/>
                     </a:stretch>
@@ -4125,7 +4125,7 @@
                     <pic:cNvPicPr/>
                   </pic:nvPicPr>
                   <pic:blipFill>
-                    <a:blip xmlns:r="http://schemas.openxmlformats.org/officeDocument/2006/relationships" r:embed="R2a5f1e158cc34fd4"/>
+                    <a:blip xmlns:r="http://schemas.openxmlformats.org/officeDocument/2006/relationships" r:embed="R5ae832b8c7f246da"/>
                     <a:stretch>
                       <a:fillRect/>
                     </a:stretch>
@@ -4176,7 +4176,7 @@
                     <pic:cNvPicPr/>
                   </pic:nvPicPr>
                   <pic:blipFill>
-                    <a:blip xmlns:r="http://schemas.openxmlformats.org/officeDocument/2006/relationships" r:embed="R354ea6c5d62a4074"/>
+                    <a:blip xmlns:r="http://schemas.openxmlformats.org/officeDocument/2006/relationships" r:embed="R7f8d7d24f2f841dc"/>
                     <a:stretch>
                       <a:fillRect/>
                     </a:stretch>
@@ -4227,7 +4227,7 @@
                     <pic:cNvPicPr/>
                   </pic:nvPicPr>
                   <pic:blipFill>
-                    <a:blip xmlns:r="http://schemas.openxmlformats.org/officeDocument/2006/relationships" r:embed="Re42c72c3eff647fd"/>
+                    <a:blip xmlns:r="http://schemas.openxmlformats.org/officeDocument/2006/relationships" r:embed="R33abaff343444cbf"/>
                     <a:stretch>
                       <a:fillRect/>
                     </a:stretch>
@@ -4278,7 +4278,7 @@
                     <pic:cNvPicPr/>
                   </pic:nvPicPr>
                   <pic:blipFill>
-                    <a:blip xmlns:r="http://schemas.openxmlformats.org/officeDocument/2006/relationships" r:embed="R7a0270ac036a4c0d"/>
+                    <a:blip xmlns:r="http://schemas.openxmlformats.org/officeDocument/2006/relationships" r:embed="Ra7a2e5c35f0048fd"/>
                     <a:stretch>
                       <a:fillRect/>
                     </a:stretch>
@@ -4657,7 +4657,7 @@
                     <pic:cNvPicPr/>
                   </pic:nvPicPr>
                   <pic:blipFill>
-                    <a:blip xmlns:r="http://schemas.openxmlformats.org/officeDocument/2006/relationships" r:embed="R954bd7f04b1b49ad"/>
+                    <a:blip xmlns:r="http://schemas.openxmlformats.org/officeDocument/2006/relationships" r:embed="Ra265750257744ab4"/>
                     <a:stretch>
                       <a:fillRect/>
                     </a:stretch>
@@ -5338,7 +5338,7 @@
             <w:r>
               <w:t xml:space="preserve">Cell with </w:t>
             </w:r>
-            <w:hyperlink xmlns:r="http://schemas.openxmlformats.org/officeDocument/2006/relationships" w:history="true" r:id="Rdf779b593825485a">
+            <w:hyperlink xmlns:r="http://schemas.openxmlformats.org/officeDocument/2006/relationships" w:history="true" r:id="R419ba9286ccc4cfd">
               <w:r>
                 <w:rPr>
                   <w:rStyle w:val="Hyperlink"/>
@@ -5624,7 +5624,7 @@
                           <pic:cNvPicPr/>
                         </pic:nvPicPr>
                         <pic:blipFill>
-                          <a:blip xmlns:r="http://schemas.openxmlformats.org/officeDocument/2006/relationships" r:embed="R7ad7c8260c4e4e4d"/>
+                          <a:blip xmlns:r="http://schemas.openxmlformats.org/officeDocument/2006/relationships" r:embed="Rae489bb916ec4aa7"/>
                           <a:stretch>
                             <a:fillRect/>
                           </a:stretch>
@@ -5724,7 +5724,7 @@
                     <pic:cNvPicPr/>
                   </pic:nvPicPr>
                   <pic:blipFill>
-                    <a:blip xmlns:r="http://schemas.openxmlformats.org/officeDocument/2006/relationships" r:embed="Ra13aee50eff54b38"/>
+                    <a:blip xmlns:r="http://schemas.openxmlformats.org/officeDocument/2006/relationships" r:embed="Reb5b16721def4c9f"/>
                     <a:stretch>
                       <a:fillRect/>
                     </a:stretch>
@@ -5774,7 +5774,7 @@
                     <pic:cNvPicPr/>
                   </pic:nvPicPr>
                   <pic:blipFill>
-                    <a:blip xmlns:r="http://schemas.openxmlformats.org/officeDocument/2006/relationships" r:embed="Red7ec86b17fa4ca2"/>
+                    <a:blip xmlns:r="http://schemas.openxmlformats.org/officeDocument/2006/relationships" r:embed="R8a66ec42e93d4388"/>
                     <a:stretch>
                       <a:fillRect/>
                     </a:stretch>
@@ -5824,7 +5824,7 @@
                     <pic:cNvPicPr/>
                   </pic:nvPicPr>
                   <pic:blipFill>
-                    <a:blip xmlns:r="http://schemas.openxmlformats.org/officeDocument/2006/relationships" r:embed="Ra6748a61a5844c6e"/>
+                    <a:blip xmlns:r="http://schemas.openxmlformats.org/officeDocument/2006/relationships" r:embed="Re9cc7431355a4ecf"/>
                     <a:stretch>
                       <a:fillRect/>
                     </a:stretch>

</xml_diff>

<commit_message>
fix(er): treat dotted cardinality labels as matrix
Apply matrix-only routing and label-centre placement to the ONE_ONLY_A dotted relationships (||..||, ||..o|, ||..|{, ||..o{) by recognising '..' matrix labels.

Made-with: Cursor
</commit_message>
<xml_diff>
--- a/test.docx
+++ b/test.docx
@@ -236,7 +236,7 @@
       <w:r>
         <w:t xml:space="preserve">, and </w:t>
       </w:r>
-      <w:hyperlink xmlns:r="http://schemas.openxmlformats.org/officeDocument/2006/relationships" w:history="true" r:id="Rfb0e7cb8576e4ec8">
+      <w:hyperlink xmlns:r="http://schemas.openxmlformats.org/officeDocument/2006/relationships" w:history="true" r:id="Ra61677c78c03419d">
         <w:r>
           <w:rPr>
             <w:rStyle w:val="Hyperlink"/>
@@ -475,7 +475,7 @@
       <w:r>
         <w:t xml:space="preserve">Direct link: </w:t>
       </w:r>
-      <w:hyperlink xmlns:r="http://schemas.openxmlformats.org/officeDocument/2006/relationships" w:history="true" r:id="R91a89d3d34144c6c">
+      <w:hyperlink xmlns:r="http://schemas.openxmlformats.org/officeDocument/2006/relationships" w:history="true" r:id="R5fe857a7fe2040b6">
         <w:r>
           <w:rPr>
             <w:rStyle w:val="Hyperlink"/>
@@ -496,7 +496,7 @@
       <w:r>
         <w:t xml:space="preserve">Direct link with title: </w:t>
       </w:r>
-      <w:hyperlink xmlns:r="http://schemas.openxmlformats.org/officeDocument/2006/relationships" w:history="true" r:id="Rcdeb4d0dbc674045">
+      <w:hyperlink xmlns:r="http://schemas.openxmlformats.org/officeDocument/2006/relationships" w:history="true" r:id="R68156bf3bd454e7c">
         <w:r>
           <w:rPr>
             <w:rStyle w:val="Hyperlink"/>
@@ -517,7 +517,7 @@
       <w:r>
         <w:t xml:space="preserve">Reference-style link: </w:t>
       </w:r>
-      <w:hyperlink xmlns:r="http://schemas.openxmlformats.org/officeDocument/2006/relationships" w:history="true" r:id="R1db0b25490c440c3">
+      <w:hyperlink xmlns:r="http://schemas.openxmlformats.org/officeDocument/2006/relationships" w:history="true" r:id="R0ea2a83bd8ec4ca8">
         <w:r>
           <w:rPr>
             <w:rStyle w:val="Hyperlink"/>
@@ -538,7 +538,7 @@
       <w:r>
         <w:t xml:space="preserve">Collapsed reference link: </w:t>
       </w:r>
-      <w:hyperlink xmlns:r="http://schemas.openxmlformats.org/officeDocument/2006/relationships" w:history="true" r:id="Rec1d47633dbd4475">
+      <w:hyperlink xmlns:r="http://schemas.openxmlformats.org/officeDocument/2006/relationships" w:history="true" r:id="R81c0ffb1272542ca">
         <w:r>
           <w:rPr>
             <w:rStyle w:val="Hyperlink"/>
@@ -559,7 +559,7 @@
       <w:r>
         <w:t xml:space="preserve">Repeated reference link: </w:t>
       </w:r>
-      <w:hyperlink xmlns:r="http://schemas.openxmlformats.org/officeDocument/2006/relationships" w:history="true" r:id="R66959e697e4b4a70">
+      <w:hyperlink xmlns:r="http://schemas.openxmlformats.org/officeDocument/2006/relationships" w:history="true" r:id="R1d943823efcd4938">
         <w:r>
           <w:rPr>
             <w:rStyle w:val="Hyperlink"/>
@@ -580,7 +580,7 @@
       <w:r>
         <w:t xml:space="preserve">Autolink URL: </w:t>
       </w:r>
-      <w:hyperlink xmlns:r="http://schemas.openxmlformats.org/officeDocument/2006/relationships" w:history="true" r:id="R6c731d4478ac4c5d">
+      <w:hyperlink xmlns:r="http://schemas.openxmlformats.org/officeDocument/2006/relationships" w:history="true" r:id="R2028f28f2d3b49ca">
         <w:r>
           <w:rPr>
             <w:rStyle w:val="Hyperlink"/>
@@ -601,7 +601,7 @@
       <w:r>
         <w:t xml:space="preserve">Autolink email: </w:t>
       </w:r>
-      <w:hyperlink xmlns:r="http://schemas.openxmlformats.org/officeDocument/2006/relationships" w:history="true" r:id="R53e3de8c22524b51">
+      <w:hyperlink xmlns:r="http://schemas.openxmlformats.org/officeDocument/2006/relationships" w:history="true" r:id="R307f37e1a1984520">
         <w:r>
           <w:rPr>
             <w:rStyle w:val="Hyperlink"/>
@@ -700,7 +700,7 @@
       <w:r>
         <w:t xml:space="preserve">, and </w:t>
       </w:r>
-      <w:hyperlink xmlns:r="http://schemas.openxmlformats.org/officeDocument/2006/relationships" w:history="true" r:id="Rbeadb8e71ebe4166">
+      <w:hyperlink xmlns:r="http://schemas.openxmlformats.org/officeDocument/2006/relationships" w:history="true" r:id="R300822781cc442dd">
         <w:r>
           <w:rPr>
             <w:rStyle w:val="Hyperlink"/>
@@ -1093,7 +1093,7 @@
       <w:r>
         <w:t xml:space="preserve">Continuation paragraph with </w:t>
       </w:r>
-      <w:hyperlink xmlns:r="http://schemas.openxmlformats.org/officeDocument/2006/relationships" w:history="true" r:id="R2c1de64f4a5c4291">
+      <w:hyperlink xmlns:r="http://schemas.openxmlformats.org/officeDocument/2006/relationships" w:history="true" r:id="R9e6001da60574894">
         <w:r>
           <w:rPr>
             <w:rStyle w:val="Hyperlink"/>
@@ -1591,7 +1591,7 @@
       <w:r>
         <w:t xml:space="preserve">, and </w:t>
       </w:r>
-      <w:hyperlink xmlns:r="http://schemas.openxmlformats.org/officeDocument/2006/relationships" w:history="true" r:id="R8e50d78188564490">
+      <w:hyperlink xmlns:r="http://schemas.openxmlformats.org/officeDocument/2006/relationships" w:history="true" r:id="R82e4228480f346a3">
         <w:r>
           <w:rPr>
             <w:rStyle w:val="Hyperlink"/>
@@ -1979,7 +1979,7 @@
                     <pic:cNvPicPr/>
                   </pic:nvPicPr>
                   <pic:blipFill>
-                    <a:blip xmlns:r="http://schemas.openxmlformats.org/officeDocument/2006/relationships" r:embed="Rf4afaef352fc48dc"/>
+                    <a:blip xmlns:r="http://schemas.openxmlformats.org/officeDocument/2006/relationships" r:embed="Rfc16896889794158"/>
                     <a:stretch>
                       <a:fillRect/>
                     </a:stretch>
@@ -2039,7 +2039,7 @@
                     <pic:cNvPicPr/>
                   </pic:nvPicPr>
                   <pic:blipFill>
-                    <a:blip xmlns:r="http://schemas.openxmlformats.org/officeDocument/2006/relationships" r:embed="R1065164af9924a40"/>
+                    <a:blip xmlns:r="http://schemas.openxmlformats.org/officeDocument/2006/relationships" r:embed="Rf9261e5ed9e24c81"/>
                     <a:stretch>
                       <a:fillRect/>
                     </a:stretch>
@@ -2099,7 +2099,7 @@
                     <pic:cNvPicPr/>
                   </pic:nvPicPr>
                   <pic:blipFill>
-                    <a:blip xmlns:r="http://schemas.openxmlformats.org/officeDocument/2006/relationships" r:embed="R104c512860fb47a8"/>
+                    <a:blip xmlns:r="http://schemas.openxmlformats.org/officeDocument/2006/relationships" r:embed="Rf6c8e5de66ec472e"/>
                     <a:stretch>
                       <a:fillRect/>
                     </a:stretch>
@@ -2150,7 +2150,7 @@
                     <pic:cNvPicPr/>
                   </pic:nvPicPr>
                   <pic:blipFill>
-                    <a:blip xmlns:r="http://schemas.openxmlformats.org/officeDocument/2006/relationships" r:embed="R05c23d3abe4c4195"/>
+                    <a:blip xmlns:r="http://schemas.openxmlformats.org/officeDocument/2006/relationships" r:embed="Re7ca93fd76c34733"/>
                     <a:stretch>
                       <a:fillRect/>
                     </a:stretch>
@@ -2201,7 +2201,7 @@
                     <pic:cNvPicPr/>
                   </pic:nvPicPr>
                   <pic:blipFill>
-                    <a:blip xmlns:r="http://schemas.openxmlformats.org/officeDocument/2006/relationships" r:embed="Rd69ebcf299854536"/>
+                    <a:blip xmlns:r="http://schemas.openxmlformats.org/officeDocument/2006/relationships" r:embed="Re5a490a3b6a84794"/>
                     <a:stretch>
                       <a:fillRect/>
                     </a:stretch>
@@ -2252,7 +2252,7 @@
                     <pic:cNvPicPr/>
                   </pic:nvPicPr>
                   <pic:blipFill>
-                    <a:blip xmlns:r="http://schemas.openxmlformats.org/officeDocument/2006/relationships" r:embed="R3d04011a1a0d46ac"/>
+                    <a:blip xmlns:r="http://schemas.openxmlformats.org/officeDocument/2006/relationships" r:embed="R073a097837f44209"/>
                     <a:stretch>
                       <a:fillRect/>
                     </a:stretch>
@@ -2303,7 +2303,7 @@
                     <pic:cNvPicPr/>
                   </pic:nvPicPr>
                   <pic:blipFill>
-                    <a:blip xmlns:r="http://schemas.openxmlformats.org/officeDocument/2006/relationships" r:embed="Rfc2f357f78f940d2"/>
+                    <a:blip xmlns:r="http://schemas.openxmlformats.org/officeDocument/2006/relationships" r:embed="Rd57691087cc946fc"/>
                     <a:stretch>
                       <a:fillRect/>
                     </a:stretch>
@@ -2354,7 +2354,7 @@
                     <pic:cNvPicPr/>
                   </pic:nvPicPr>
                   <pic:blipFill>
-                    <a:blip xmlns:r="http://schemas.openxmlformats.org/officeDocument/2006/relationships" r:embed="Rc1f29836eded4b34"/>
+                    <a:blip xmlns:r="http://schemas.openxmlformats.org/officeDocument/2006/relationships" r:embed="Rdaba85ddd7674201"/>
                     <a:stretch>
                       <a:fillRect/>
                     </a:stretch>
@@ -2430,7 +2430,7 @@
                     <pic:cNvPicPr/>
                   </pic:nvPicPr>
                   <pic:blipFill>
-                    <a:blip xmlns:r="http://schemas.openxmlformats.org/officeDocument/2006/relationships" r:embed="R69375f85075146b6"/>
+                    <a:blip xmlns:r="http://schemas.openxmlformats.org/officeDocument/2006/relationships" r:embed="R5fefcf2ff6e94936"/>
                     <a:stretch>
                       <a:fillRect/>
                     </a:stretch>
@@ -2481,7 +2481,7 @@
                     <pic:cNvPicPr/>
                   </pic:nvPicPr>
                   <pic:blipFill>
-                    <a:blip xmlns:r="http://schemas.openxmlformats.org/officeDocument/2006/relationships" r:embed="R4dab715c089b4df1"/>
+                    <a:blip xmlns:r="http://schemas.openxmlformats.org/officeDocument/2006/relationships" r:embed="R73c8e3a81d294917"/>
                     <a:stretch>
                       <a:fillRect/>
                     </a:stretch>
@@ -2532,7 +2532,7 @@
                     <pic:cNvPicPr/>
                   </pic:nvPicPr>
                   <pic:blipFill>
-                    <a:blip xmlns:r="http://schemas.openxmlformats.org/officeDocument/2006/relationships" r:embed="Ra17aecf8ffe94b41"/>
+                    <a:blip xmlns:r="http://schemas.openxmlformats.org/officeDocument/2006/relationships" r:embed="R2d38db718e2445de"/>
                     <a:stretch>
                       <a:fillRect/>
                     </a:stretch>
@@ -2583,7 +2583,7 @@
                     <pic:cNvPicPr/>
                   </pic:nvPicPr>
                   <pic:blipFill>
-                    <a:blip xmlns:r="http://schemas.openxmlformats.org/officeDocument/2006/relationships" r:embed="Rbcbfbce15ee54474"/>
+                    <a:blip xmlns:r="http://schemas.openxmlformats.org/officeDocument/2006/relationships" r:embed="Rda63b0cb60d2423a"/>
                     <a:stretch>
                       <a:fillRect/>
                     </a:stretch>
@@ -2659,7 +2659,7 @@
                     <pic:cNvPicPr/>
                   </pic:nvPicPr>
                   <pic:blipFill>
-                    <a:blip xmlns:r="http://schemas.openxmlformats.org/officeDocument/2006/relationships" r:embed="R18c4ba849f9847d4"/>
+                    <a:blip xmlns:r="http://schemas.openxmlformats.org/officeDocument/2006/relationships" r:embed="Rc20743bc06794310"/>
                     <a:stretch>
                       <a:fillRect/>
                     </a:stretch>
@@ -2710,7 +2710,7 @@
                     <pic:cNvPicPr/>
                   </pic:nvPicPr>
                   <pic:blipFill>
-                    <a:blip xmlns:r="http://schemas.openxmlformats.org/officeDocument/2006/relationships" r:embed="Rfa56bab32ff74f18"/>
+                    <a:blip xmlns:r="http://schemas.openxmlformats.org/officeDocument/2006/relationships" r:embed="R49fc0b83fee34e00"/>
                     <a:stretch>
                       <a:fillRect/>
                     </a:stretch>
@@ -2761,7 +2761,7 @@
                     <pic:cNvPicPr/>
                   </pic:nvPicPr>
                   <pic:blipFill>
-                    <a:blip xmlns:r="http://schemas.openxmlformats.org/officeDocument/2006/relationships" r:embed="Ra754e9da33774250"/>
+                    <a:blip xmlns:r="http://schemas.openxmlformats.org/officeDocument/2006/relationships" r:embed="Rbaca7a24485e4b6a"/>
                     <a:stretch>
                       <a:fillRect/>
                     </a:stretch>
@@ -2812,7 +2812,7 @@
                     <pic:cNvPicPr/>
                   </pic:nvPicPr>
                   <pic:blipFill>
-                    <a:blip xmlns:r="http://schemas.openxmlformats.org/officeDocument/2006/relationships" r:embed="Re83b39bad15d46a8"/>
+                    <a:blip xmlns:r="http://schemas.openxmlformats.org/officeDocument/2006/relationships" r:embed="Rb2a52e595da5495f"/>
                     <a:stretch>
                       <a:fillRect/>
                     </a:stretch>
@@ -2863,7 +2863,7 @@
                     <pic:cNvPicPr/>
                   </pic:nvPicPr>
                   <pic:blipFill>
-                    <a:blip xmlns:r="http://schemas.openxmlformats.org/officeDocument/2006/relationships" r:embed="R369a9cdae31a4c27"/>
+                    <a:blip xmlns:r="http://schemas.openxmlformats.org/officeDocument/2006/relationships" r:embed="R4f21f02e2e7a4e86"/>
                     <a:stretch>
                       <a:fillRect/>
                     </a:stretch>
@@ -2914,7 +2914,7 @@
                     <pic:cNvPicPr/>
                   </pic:nvPicPr>
                   <pic:blipFill>
-                    <a:blip xmlns:r="http://schemas.openxmlformats.org/officeDocument/2006/relationships" r:embed="Rf41a959318954686"/>
+                    <a:blip xmlns:r="http://schemas.openxmlformats.org/officeDocument/2006/relationships" r:embed="R96a3d57795a94869"/>
                     <a:stretch>
                       <a:fillRect/>
                     </a:stretch>
@@ -2965,7 +2965,7 @@
                     <pic:cNvPicPr/>
                   </pic:nvPicPr>
                   <pic:blipFill>
-                    <a:blip xmlns:r="http://schemas.openxmlformats.org/officeDocument/2006/relationships" r:embed="R2e530fa3639241c7"/>
+                    <a:blip xmlns:r="http://schemas.openxmlformats.org/officeDocument/2006/relationships" r:embed="R1a0663137e894d27"/>
                     <a:stretch>
                       <a:fillRect/>
                     </a:stretch>
@@ -3016,7 +3016,7 @@
                     <pic:cNvPicPr/>
                   </pic:nvPicPr>
                   <pic:blipFill>
-                    <a:blip xmlns:r="http://schemas.openxmlformats.org/officeDocument/2006/relationships" r:embed="R8bfec45c2f554e65"/>
+                    <a:blip xmlns:r="http://schemas.openxmlformats.org/officeDocument/2006/relationships" r:embed="R50e7aba8e4bb4738"/>
                     <a:stretch>
                       <a:fillRect/>
                     </a:stretch>
@@ -3067,7 +3067,7 @@
                     <pic:cNvPicPr/>
                   </pic:nvPicPr>
                   <pic:blipFill>
-                    <a:blip xmlns:r="http://schemas.openxmlformats.org/officeDocument/2006/relationships" r:embed="Rbbaf442a5e5a45cf"/>
+                    <a:blip xmlns:r="http://schemas.openxmlformats.org/officeDocument/2006/relationships" r:embed="R1a93111bfa7d4680"/>
                     <a:stretch>
                       <a:fillRect/>
                     </a:stretch>
@@ -3118,7 +3118,7 @@
                     <pic:cNvPicPr/>
                   </pic:nvPicPr>
                   <pic:blipFill>
-                    <a:blip xmlns:r="http://schemas.openxmlformats.org/officeDocument/2006/relationships" r:embed="R636a3c2ec3634740"/>
+                    <a:blip xmlns:r="http://schemas.openxmlformats.org/officeDocument/2006/relationships" r:embed="Rd5232058d5a84416"/>
                     <a:stretch>
                       <a:fillRect/>
                     </a:stretch>
@@ -3169,7 +3169,7 @@
                     <pic:cNvPicPr/>
                   </pic:nvPicPr>
                   <pic:blipFill>
-                    <a:blip xmlns:r="http://schemas.openxmlformats.org/officeDocument/2006/relationships" r:embed="R6bca54b3b05b4d49"/>
+                    <a:blip xmlns:r="http://schemas.openxmlformats.org/officeDocument/2006/relationships" r:embed="Rc61d89a8980b4b71"/>
                     <a:stretch>
                       <a:fillRect/>
                     </a:stretch>
@@ -3220,7 +3220,7 @@
                     <pic:cNvPicPr/>
                   </pic:nvPicPr>
                   <pic:blipFill>
-                    <a:blip xmlns:r="http://schemas.openxmlformats.org/officeDocument/2006/relationships" r:embed="Rf790adbd983148a4"/>
+                    <a:blip xmlns:r="http://schemas.openxmlformats.org/officeDocument/2006/relationships" r:embed="R68cd1790efb14119"/>
                     <a:stretch>
                       <a:fillRect/>
                     </a:stretch>
@@ -3271,7 +3271,7 @@
                     <pic:cNvPicPr/>
                   </pic:nvPicPr>
                   <pic:blipFill>
-                    <a:blip xmlns:r="http://schemas.openxmlformats.org/officeDocument/2006/relationships" r:embed="Rb83f53b05fc64d55"/>
+                    <a:blip xmlns:r="http://schemas.openxmlformats.org/officeDocument/2006/relationships" r:embed="Rd9baa261a907436c"/>
                     <a:stretch>
                       <a:fillRect/>
                     </a:stretch>
@@ -3322,7 +3322,7 @@
                     <pic:cNvPicPr/>
                   </pic:nvPicPr>
                   <pic:blipFill>
-                    <a:blip xmlns:r="http://schemas.openxmlformats.org/officeDocument/2006/relationships" r:embed="R4243e8c60c0b4c68"/>
+                    <a:blip xmlns:r="http://schemas.openxmlformats.org/officeDocument/2006/relationships" r:embed="R9e725d5437c14168"/>
                     <a:stretch>
                       <a:fillRect/>
                     </a:stretch>
@@ -3419,7 +3419,7 @@
                     <pic:cNvPicPr/>
                   </pic:nvPicPr>
                   <pic:blipFill>
-                    <a:blip xmlns:r="http://schemas.openxmlformats.org/officeDocument/2006/relationships" r:embed="R6e96e7d9f03f4c7b"/>
+                    <a:blip xmlns:r="http://schemas.openxmlformats.org/officeDocument/2006/relationships" r:embed="R8d865f0a953b47a2"/>
                     <a:stretch>
                       <a:fillRect/>
                     </a:stretch>
@@ -3462,7 +3462,7 @@
                     <pic:cNvPicPr/>
                   </pic:nvPicPr>
                   <pic:blipFill>
-                    <a:blip xmlns:r="http://schemas.openxmlformats.org/officeDocument/2006/relationships" r:embed="R73c80e61966b4934"/>
+                    <a:blip xmlns:r="http://schemas.openxmlformats.org/officeDocument/2006/relationships" r:embed="R6d60eca1d593448d"/>
                     <a:stretch>
                       <a:fillRect/>
                     </a:stretch>
@@ -3505,7 +3505,7 @@
                     <pic:cNvPicPr/>
                   </pic:nvPicPr>
                   <pic:blipFill>
-                    <a:blip xmlns:r="http://schemas.openxmlformats.org/officeDocument/2006/relationships" r:embed="Rcb656c5aee9942f0"/>
+                    <a:blip xmlns:r="http://schemas.openxmlformats.org/officeDocument/2006/relationships" r:embed="Rcd607477a0de46cb"/>
                     <a:stretch>
                       <a:fillRect/>
                     </a:stretch>
@@ -3548,7 +3548,7 @@
                     <pic:cNvPicPr/>
                   </pic:nvPicPr>
                   <pic:blipFill>
-                    <a:blip xmlns:r="http://schemas.openxmlformats.org/officeDocument/2006/relationships" r:embed="Rd5580b64f784404a"/>
+                    <a:blip xmlns:r="http://schemas.openxmlformats.org/officeDocument/2006/relationships" r:embed="R363590994cb84095"/>
                     <a:stretch>
                       <a:fillRect/>
                     </a:stretch>
@@ -3933,7 +3933,7 @@
                     <pic:cNvPicPr/>
                   </pic:nvPicPr>
                   <pic:blipFill>
-                    <a:blip xmlns:r="http://schemas.openxmlformats.org/officeDocument/2006/relationships" r:embed="R25b8eb5950b1456b"/>
+                    <a:blip xmlns:r="http://schemas.openxmlformats.org/officeDocument/2006/relationships" r:embed="R1b404dcaa8a145f9"/>
                     <a:stretch>
                       <a:fillRect/>
                     </a:stretch>
@@ -4125,7 +4125,7 @@
                     <pic:cNvPicPr/>
                   </pic:nvPicPr>
                   <pic:blipFill>
-                    <a:blip xmlns:r="http://schemas.openxmlformats.org/officeDocument/2006/relationships" r:embed="R5ae832b8c7f246da"/>
+                    <a:blip xmlns:r="http://schemas.openxmlformats.org/officeDocument/2006/relationships" r:embed="Rd29502df9a1d4a53"/>
                     <a:stretch>
                       <a:fillRect/>
                     </a:stretch>
@@ -4176,7 +4176,7 @@
                     <pic:cNvPicPr/>
                   </pic:nvPicPr>
                   <pic:blipFill>
-                    <a:blip xmlns:r="http://schemas.openxmlformats.org/officeDocument/2006/relationships" r:embed="R7f8d7d24f2f841dc"/>
+                    <a:blip xmlns:r="http://schemas.openxmlformats.org/officeDocument/2006/relationships" r:embed="R435ba3252f864562"/>
                     <a:stretch>
                       <a:fillRect/>
                     </a:stretch>
@@ -4227,7 +4227,7 @@
                     <pic:cNvPicPr/>
                   </pic:nvPicPr>
                   <pic:blipFill>
-                    <a:blip xmlns:r="http://schemas.openxmlformats.org/officeDocument/2006/relationships" r:embed="R33abaff343444cbf"/>
+                    <a:blip xmlns:r="http://schemas.openxmlformats.org/officeDocument/2006/relationships" r:embed="Rf77274e0dd834f17"/>
                     <a:stretch>
                       <a:fillRect/>
                     </a:stretch>
@@ -4278,7 +4278,7 @@
                     <pic:cNvPicPr/>
                   </pic:nvPicPr>
                   <pic:blipFill>
-                    <a:blip xmlns:r="http://schemas.openxmlformats.org/officeDocument/2006/relationships" r:embed="Ra7a2e5c35f0048fd"/>
+                    <a:blip xmlns:r="http://schemas.openxmlformats.org/officeDocument/2006/relationships" r:embed="R567c904b9ba946e2"/>
                     <a:stretch>
                       <a:fillRect/>
                     </a:stretch>
@@ -4657,7 +4657,7 @@
                     <pic:cNvPicPr/>
                   </pic:nvPicPr>
                   <pic:blipFill>
-                    <a:blip xmlns:r="http://schemas.openxmlformats.org/officeDocument/2006/relationships" r:embed="Ra265750257744ab4"/>
+                    <a:blip xmlns:r="http://schemas.openxmlformats.org/officeDocument/2006/relationships" r:embed="R0dfcf5ba8c374eaa"/>
                     <a:stretch>
                       <a:fillRect/>
                     </a:stretch>
@@ -5338,7 +5338,7 @@
             <w:r>
               <w:t xml:space="preserve">Cell with </w:t>
             </w:r>
-            <w:hyperlink xmlns:r="http://schemas.openxmlformats.org/officeDocument/2006/relationships" w:history="true" r:id="R419ba9286ccc4cfd">
+            <w:hyperlink xmlns:r="http://schemas.openxmlformats.org/officeDocument/2006/relationships" w:history="true" r:id="R2ed0ca383b1d460a">
               <w:r>
                 <w:rPr>
                   <w:rStyle w:val="Hyperlink"/>
@@ -5624,7 +5624,7 @@
                           <pic:cNvPicPr/>
                         </pic:nvPicPr>
                         <pic:blipFill>
-                          <a:blip xmlns:r="http://schemas.openxmlformats.org/officeDocument/2006/relationships" r:embed="Rae489bb916ec4aa7"/>
+                          <a:blip xmlns:r="http://schemas.openxmlformats.org/officeDocument/2006/relationships" r:embed="R90eaeae0593f4ef6"/>
                           <a:stretch>
                             <a:fillRect/>
                           </a:stretch>
@@ -5724,7 +5724,7 @@
                     <pic:cNvPicPr/>
                   </pic:nvPicPr>
                   <pic:blipFill>
-                    <a:blip xmlns:r="http://schemas.openxmlformats.org/officeDocument/2006/relationships" r:embed="Reb5b16721def4c9f"/>
+                    <a:blip xmlns:r="http://schemas.openxmlformats.org/officeDocument/2006/relationships" r:embed="Rf3a920b0141a43d0"/>
                     <a:stretch>
                       <a:fillRect/>
                     </a:stretch>
@@ -5774,7 +5774,7 @@
                     <pic:cNvPicPr/>
                   </pic:nvPicPr>
                   <pic:blipFill>
-                    <a:blip xmlns:r="http://schemas.openxmlformats.org/officeDocument/2006/relationships" r:embed="R8a66ec42e93d4388"/>
+                    <a:blip xmlns:r="http://schemas.openxmlformats.org/officeDocument/2006/relationships" r:embed="Rd9d7fbbbe11a4c11"/>
                     <a:stretch>
                       <a:fillRect/>
                     </a:stretch>
@@ -5824,7 +5824,7 @@
                     <pic:cNvPicPr/>
                   </pic:nvPicPr>
                   <pic:blipFill>
-                    <a:blip xmlns:r="http://schemas.openxmlformats.org/officeDocument/2006/relationships" r:embed="Re9cc7431355a4ecf"/>
+                    <a:blip xmlns:r="http://schemas.openxmlformats.org/officeDocument/2006/relationships" r:embed="R922e1a6c77b544fb"/>
                     <a:stretch>
                       <a:fillRect/>
                     </a:stretch>

</xml_diff>

<commit_message>
chore(baseline): update test.docx gold standard
Capture the current regenerated test.docx as the new rollback baseline.
Subgraph rendering is acceptable but still not final.

Made-with: Cursor
</commit_message>
<xml_diff>
--- a/test.docx
+++ b/test.docx
@@ -236,7 +236,7 @@
       <w:r>
         <w:t xml:space="preserve">, and </w:t>
       </w:r>
-      <w:hyperlink xmlns:r="http://schemas.openxmlformats.org/officeDocument/2006/relationships" w:history="true" r:id="Ra61677c78c03419d">
+      <w:hyperlink xmlns:r="http://schemas.openxmlformats.org/officeDocument/2006/relationships" w:history="true" r:id="R8450d48ed3064f8c">
         <w:r>
           <w:rPr>
             <w:rStyle w:val="Hyperlink"/>
@@ -475,7 +475,7 @@
       <w:r>
         <w:t xml:space="preserve">Direct link: </w:t>
       </w:r>
-      <w:hyperlink xmlns:r="http://schemas.openxmlformats.org/officeDocument/2006/relationships" w:history="true" r:id="R5fe857a7fe2040b6">
+      <w:hyperlink xmlns:r="http://schemas.openxmlformats.org/officeDocument/2006/relationships" w:history="true" r:id="Rd1716d0cd61e4d51">
         <w:r>
           <w:rPr>
             <w:rStyle w:val="Hyperlink"/>
@@ -496,7 +496,7 @@
       <w:r>
         <w:t xml:space="preserve">Direct link with title: </w:t>
       </w:r>
-      <w:hyperlink xmlns:r="http://schemas.openxmlformats.org/officeDocument/2006/relationships" w:history="true" r:id="R68156bf3bd454e7c">
+      <w:hyperlink xmlns:r="http://schemas.openxmlformats.org/officeDocument/2006/relationships" w:history="true" r:id="R31e39f2d377d4cb8">
         <w:r>
           <w:rPr>
             <w:rStyle w:val="Hyperlink"/>
@@ -517,7 +517,7 @@
       <w:r>
         <w:t xml:space="preserve">Reference-style link: </w:t>
       </w:r>
-      <w:hyperlink xmlns:r="http://schemas.openxmlformats.org/officeDocument/2006/relationships" w:history="true" r:id="R0ea2a83bd8ec4ca8">
+      <w:hyperlink xmlns:r="http://schemas.openxmlformats.org/officeDocument/2006/relationships" w:history="true" r:id="Rc5e93aea62c0416a">
         <w:r>
           <w:rPr>
             <w:rStyle w:val="Hyperlink"/>
@@ -538,7 +538,7 @@
       <w:r>
         <w:t xml:space="preserve">Collapsed reference link: </w:t>
       </w:r>
-      <w:hyperlink xmlns:r="http://schemas.openxmlformats.org/officeDocument/2006/relationships" w:history="true" r:id="R81c0ffb1272542ca">
+      <w:hyperlink xmlns:r="http://schemas.openxmlformats.org/officeDocument/2006/relationships" w:history="true" r:id="Rfbd718a13ac54c5a">
         <w:r>
           <w:rPr>
             <w:rStyle w:val="Hyperlink"/>
@@ -559,7 +559,7 @@
       <w:r>
         <w:t xml:space="preserve">Repeated reference link: </w:t>
       </w:r>
-      <w:hyperlink xmlns:r="http://schemas.openxmlformats.org/officeDocument/2006/relationships" w:history="true" r:id="R1d943823efcd4938">
+      <w:hyperlink xmlns:r="http://schemas.openxmlformats.org/officeDocument/2006/relationships" w:history="true" r:id="Re8c41fa258c94ed2">
         <w:r>
           <w:rPr>
             <w:rStyle w:val="Hyperlink"/>
@@ -580,7 +580,7 @@
       <w:r>
         <w:t xml:space="preserve">Autolink URL: </w:t>
       </w:r>
-      <w:hyperlink xmlns:r="http://schemas.openxmlformats.org/officeDocument/2006/relationships" w:history="true" r:id="R2028f28f2d3b49ca">
+      <w:hyperlink xmlns:r="http://schemas.openxmlformats.org/officeDocument/2006/relationships" w:history="true" r:id="R7422b3bd9e704f3b">
         <w:r>
           <w:rPr>
             <w:rStyle w:val="Hyperlink"/>
@@ -601,7 +601,7 @@
       <w:r>
         <w:t xml:space="preserve">Autolink email: </w:t>
       </w:r>
-      <w:hyperlink xmlns:r="http://schemas.openxmlformats.org/officeDocument/2006/relationships" w:history="true" r:id="R307f37e1a1984520">
+      <w:hyperlink xmlns:r="http://schemas.openxmlformats.org/officeDocument/2006/relationships" w:history="true" r:id="R208348d39ea84e36">
         <w:r>
           <w:rPr>
             <w:rStyle w:val="Hyperlink"/>
@@ -700,7 +700,7 @@
       <w:r>
         <w:t xml:space="preserve">, and </w:t>
       </w:r>
-      <w:hyperlink xmlns:r="http://schemas.openxmlformats.org/officeDocument/2006/relationships" w:history="true" r:id="R300822781cc442dd">
+      <w:hyperlink xmlns:r="http://schemas.openxmlformats.org/officeDocument/2006/relationships" w:history="true" r:id="R5f0ad8a2d8764fa9">
         <w:r>
           <w:rPr>
             <w:rStyle w:val="Hyperlink"/>
@@ -1093,7 +1093,7 @@
       <w:r>
         <w:t xml:space="preserve">Continuation paragraph with </w:t>
       </w:r>
-      <w:hyperlink xmlns:r="http://schemas.openxmlformats.org/officeDocument/2006/relationships" w:history="true" r:id="R9e6001da60574894">
+      <w:hyperlink xmlns:r="http://schemas.openxmlformats.org/officeDocument/2006/relationships" w:history="true" r:id="R67dc0d27ec0942ca">
         <w:r>
           <w:rPr>
             <w:rStyle w:val="Hyperlink"/>
@@ -1591,7 +1591,7 @@
       <w:r>
         <w:t xml:space="preserve">, and </w:t>
       </w:r>
-      <w:hyperlink xmlns:r="http://schemas.openxmlformats.org/officeDocument/2006/relationships" w:history="true" r:id="R82e4228480f346a3">
+      <w:hyperlink xmlns:r="http://schemas.openxmlformats.org/officeDocument/2006/relationships" w:history="true" r:id="R8072b3938fd94071">
         <w:r>
           <w:rPr>
             <w:rStyle w:val="Hyperlink"/>
@@ -1965,7 +1965,7 @@
       <w:r>
         <w:drawing>
           <wp:inline xmlns:wp="http://schemas.openxmlformats.org/drawingml/2006/wordprocessingDrawing" distT="0" distB="0" distL="0" distR="0">
-            <wp:extent cx="4324350" cy="3895725"/>
+            <wp:extent cx="4324350" cy="3752850"/>
             <wp:effectExtent l="0" t="0" r="0" b="0"/>
             <wp:docPr id="1" name="Mermaid diagram 1" descr="Mermaid diagram"/>
             <wp:cNvGraphicFramePr>
@@ -1979,7 +1979,7 @@
                     <pic:cNvPicPr/>
                   </pic:nvPicPr>
                   <pic:blipFill>
-                    <a:blip xmlns:r="http://schemas.openxmlformats.org/officeDocument/2006/relationships" r:embed="Rfc16896889794158"/>
+                    <a:blip xmlns:r="http://schemas.openxmlformats.org/officeDocument/2006/relationships" r:embed="R4fd7279e951a40b9"/>
                     <a:stretch>
                       <a:fillRect/>
                     </a:stretch>
@@ -1987,7 +1987,7 @@
                   <pic:spPr>
                     <a:xfrm>
                       <a:off x="0" y="0"/>
-                      <a:ext cx="4324350" cy="3895725"/>
+                      <a:ext cx="4324350" cy="3752850"/>
                     </a:xfrm>
                     <a:prstGeom prst="rect">
                       <a:avLst/>
@@ -2025,7 +2025,7 @@
       <w:r>
         <w:drawing>
           <wp:inline xmlns:wp="http://schemas.openxmlformats.org/drawingml/2006/wordprocessingDrawing" distT="0" distB="0" distL="0" distR="0">
-            <wp:extent cx="5220000" cy="731926"/>
+            <wp:extent cx="5220000" cy="767399"/>
             <wp:effectExtent l="0" t="0" r="0" b="0"/>
             <wp:docPr id="2" name="Mermaid diagram 2" descr="Mermaid diagram"/>
             <wp:cNvGraphicFramePr>
@@ -2039,7 +2039,7 @@
                     <pic:cNvPicPr/>
                   </pic:nvPicPr>
                   <pic:blipFill>
-                    <a:blip xmlns:r="http://schemas.openxmlformats.org/officeDocument/2006/relationships" r:embed="Rf9261e5ed9e24c81"/>
+                    <a:blip xmlns:r="http://schemas.openxmlformats.org/officeDocument/2006/relationships" r:embed="Re585234123e54e06"/>
                     <a:stretch>
                       <a:fillRect/>
                     </a:stretch>
@@ -2047,7 +2047,7 @@
                   <pic:spPr>
                     <a:xfrm>
                       <a:off x="0" y="0"/>
-                      <a:ext cx="5220000" cy="731926"/>
+                      <a:ext cx="5220000" cy="767399"/>
                     </a:xfrm>
                     <a:prstGeom prst="rect">
                       <a:avLst/>
@@ -2085,7 +2085,7 @@
       <w:r>
         <w:drawing>
           <wp:inline xmlns:wp="http://schemas.openxmlformats.org/drawingml/2006/wordprocessingDrawing" distT="0" distB="0" distL="0" distR="0">
-            <wp:extent cx="1948120" cy="6480000"/>
+            <wp:extent cx="1918692" cy="6480000"/>
             <wp:effectExtent l="0" t="0" r="0" b="0"/>
             <wp:docPr id="3" name="Mermaid diagram 3" descr="Mermaid diagram"/>
             <wp:cNvGraphicFramePr>
@@ -2099,7 +2099,7 @@
                     <pic:cNvPicPr/>
                   </pic:nvPicPr>
                   <pic:blipFill>
-                    <a:blip xmlns:r="http://schemas.openxmlformats.org/officeDocument/2006/relationships" r:embed="Rf6c8e5de66ec472e"/>
+                    <a:blip xmlns:r="http://schemas.openxmlformats.org/officeDocument/2006/relationships" r:embed="Re4a18673c2244e58"/>
                     <a:stretch>
                       <a:fillRect/>
                     </a:stretch>
@@ -2107,7 +2107,7 @@
                   <pic:spPr>
                     <a:xfrm>
                       <a:off x="0" y="0"/>
-                      <a:ext cx="1948120" cy="6480000"/>
+                      <a:ext cx="1918692" cy="6480000"/>
                     </a:xfrm>
                     <a:prstGeom prst="rect">
                       <a:avLst/>
@@ -2150,7 +2150,7 @@
                     <pic:cNvPicPr/>
                   </pic:nvPicPr>
                   <pic:blipFill>
-                    <a:blip xmlns:r="http://schemas.openxmlformats.org/officeDocument/2006/relationships" r:embed="Re7ca93fd76c34733"/>
+                    <a:blip xmlns:r="http://schemas.openxmlformats.org/officeDocument/2006/relationships" r:embed="Rcc4475e3361f46e0"/>
                     <a:stretch>
                       <a:fillRect/>
                     </a:stretch>
@@ -2201,7 +2201,7 @@
                     <pic:cNvPicPr/>
                   </pic:nvPicPr>
                   <pic:blipFill>
-                    <a:blip xmlns:r="http://schemas.openxmlformats.org/officeDocument/2006/relationships" r:embed="Re5a490a3b6a84794"/>
+                    <a:blip xmlns:r="http://schemas.openxmlformats.org/officeDocument/2006/relationships" r:embed="Rce933808118e4576"/>
                     <a:stretch>
                       <a:fillRect/>
                     </a:stretch>
@@ -2252,7 +2252,7 @@
                     <pic:cNvPicPr/>
                   </pic:nvPicPr>
                   <pic:blipFill>
-                    <a:blip xmlns:r="http://schemas.openxmlformats.org/officeDocument/2006/relationships" r:embed="R073a097837f44209"/>
+                    <a:blip xmlns:r="http://schemas.openxmlformats.org/officeDocument/2006/relationships" r:embed="R8ee245771cd34595"/>
                     <a:stretch>
                       <a:fillRect/>
                     </a:stretch>
@@ -2303,7 +2303,7 @@
                     <pic:cNvPicPr/>
                   </pic:nvPicPr>
                   <pic:blipFill>
-                    <a:blip xmlns:r="http://schemas.openxmlformats.org/officeDocument/2006/relationships" r:embed="Rd57691087cc946fc"/>
+                    <a:blip xmlns:r="http://schemas.openxmlformats.org/officeDocument/2006/relationships" r:embed="R729035a4c89d44a5"/>
                     <a:stretch>
                       <a:fillRect/>
                     </a:stretch>
@@ -2354,7 +2354,7 @@
                     <pic:cNvPicPr/>
                   </pic:nvPicPr>
                   <pic:blipFill>
-                    <a:blip xmlns:r="http://schemas.openxmlformats.org/officeDocument/2006/relationships" r:embed="Rdaba85ddd7674201"/>
+                    <a:blip xmlns:r="http://schemas.openxmlformats.org/officeDocument/2006/relationships" r:embed="R499437e3edb34882"/>
                     <a:stretch>
                       <a:fillRect/>
                     </a:stretch>
@@ -2430,7 +2430,7 @@
                     <pic:cNvPicPr/>
                   </pic:nvPicPr>
                   <pic:blipFill>
-                    <a:blip xmlns:r="http://schemas.openxmlformats.org/officeDocument/2006/relationships" r:embed="R5fefcf2ff6e94936"/>
+                    <a:blip xmlns:r="http://schemas.openxmlformats.org/officeDocument/2006/relationships" r:embed="R148c324636a14834"/>
                     <a:stretch>
                       <a:fillRect/>
                     </a:stretch>
@@ -2481,7 +2481,7 @@
                     <pic:cNvPicPr/>
                   </pic:nvPicPr>
                   <pic:blipFill>
-                    <a:blip xmlns:r="http://schemas.openxmlformats.org/officeDocument/2006/relationships" r:embed="R73c8e3a81d294917"/>
+                    <a:blip xmlns:r="http://schemas.openxmlformats.org/officeDocument/2006/relationships" r:embed="R2f47f3f4801b4eb1"/>
                     <a:stretch>
                       <a:fillRect/>
                     </a:stretch>
@@ -2532,7 +2532,7 @@
                     <pic:cNvPicPr/>
                   </pic:nvPicPr>
                   <pic:blipFill>
-                    <a:blip xmlns:r="http://schemas.openxmlformats.org/officeDocument/2006/relationships" r:embed="R2d38db718e2445de"/>
+                    <a:blip xmlns:r="http://schemas.openxmlformats.org/officeDocument/2006/relationships" r:embed="R673e499b78394baa"/>
                     <a:stretch>
                       <a:fillRect/>
                     </a:stretch>
@@ -2583,7 +2583,7 @@
                     <pic:cNvPicPr/>
                   </pic:nvPicPr>
                   <pic:blipFill>
-                    <a:blip xmlns:r="http://schemas.openxmlformats.org/officeDocument/2006/relationships" r:embed="Rda63b0cb60d2423a"/>
+                    <a:blip xmlns:r="http://schemas.openxmlformats.org/officeDocument/2006/relationships" r:embed="R8a906b80da6f419a"/>
                     <a:stretch>
                       <a:fillRect/>
                     </a:stretch>
@@ -2659,7 +2659,7 @@
                     <pic:cNvPicPr/>
                   </pic:nvPicPr>
                   <pic:blipFill>
-                    <a:blip xmlns:r="http://schemas.openxmlformats.org/officeDocument/2006/relationships" r:embed="Rc20743bc06794310"/>
+                    <a:blip xmlns:r="http://schemas.openxmlformats.org/officeDocument/2006/relationships" r:embed="R29cd7ce612ca4057"/>
                     <a:stretch>
                       <a:fillRect/>
                     </a:stretch>
@@ -2710,7 +2710,7 @@
                     <pic:cNvPicPr/>
                   </pic:nvPicPr>
                   <pic:blipFill>
-                    <a:blip xmlns:r="http://schemas.openxmlformats.org/officeDocument/2006/relationships" r:embed="R49fc0b83fee34e00"/>
+                    <a:blip xmlns:r="http://schemas.openxmlformats.org/officeDocument/2006/relationships" r:embed="Radb71d2850d04e83"/>
                     <a:stretch>
                       <a:fillRect/>
                     </a:stretch>
@@ -2761,7 +2761,7 @@
                     <pic:cNvPicPr/>
                   </pic:nvPicPr>
                   <pic:blipFill>
-                    <a:blip xmlns:r="http://schemas.openxmlformats.org/officeDocument/2006/relationships" r:embed="Rbaca7a24485e4b6a"/>
+                    <a:blip xmlns:r="http://schemas.openxmlformats.org/officeDocument/2006/relationships" r:embed="R651e4c30fef24b86"/>
                     <a:stretch>
                       <a:fillRect/>
                     </a:stretch>
@@ -2812,7 +2812,7 @@
                     <pic:cNvPicPr/>
                   </pic:nvPicPr>
                   <pic:blipFill>
-                    <a:blip xmlns:r="http://schemas.openxmlformats.org/officeDocument/2006/relationships" r:embed="Rb2a52e595da5495f"/>
+                    <a:blip xmlns:r="http://schemas.openxmlformats.org/officeDocument/2006/relationships" r:embed="Rb2a83153424c4cbf"/>
                     <a:stretch>
                       <a:fillRect/>
                     </a:stretch>
@@ -2849,7 +2849,7 @@
       <w:r>
         <w:drawing>
           <wp:inline xmlns:wp="http://schemas.openxmlformats.org/drawingml/2006/wordprocessingDrawing" distT="0" distB="0" distL="0" distR="0">
-            <wp:extent cx="3714750" cy="1905000"/>
+            <wp:extent cx="5220000" cy="1104165"/>
             <wp:effectExtent l="0" t="0" r="0" b="0"/>
             <wp:docPr id="17" name="Mermaid diagram 17" descr="Mermaid diagram"/>
             <wp:cNvGraphicFramePr>
@@ -2863,7 +2863,7 @@
                     <pic:cNvPicPr/>
                   </pic:nvPicPr>
                   <pic:blipFill>
-                    <a:blip xmlns:r="http://schemas.openxmlformats.org/officeDocument/2006/relationships" r:embed="R4f21f02e2e7a4e86"/>
+                    <a:blip xmlns:r="http://schemas.openxmlformats.org/officeDocument/2006/relationships" r:embed="R4b9aa7150c8f4a28"/>
                     <a:stretch>
                       <a:fillRect/>
                     </a:stretch>
@@ -2871,7 +2871,7 @@
                   <pic:spPr>
                     <a:xfrm>
                       <a:off x="0" y="0"/>
-                      <a:ext cx="3714750" cy="1905000"/>
+                      <a:ext cx="5220000" cy="1104165"/>
                     </a:xfrm>
                     <a:prstGeom prst="rect">
                       <a:avLst/>
@@ -2889,7 +2889,7 @@
         <w:pStyle w:val="Normal"/>
       </w:pPr>
       <w:r>
-        <w:t xml:space="preserve">Pie chart:</w:t>
+        <w:t xml:space="preserve">Gantt chart: longer period + more milestones (YYYY-MM-DD)</w:t>
       </w:r>
     </w:p>
     <w:p>
@@ -2900,7 +2900,7 @@
       <w:r>
         <w:drawing>
           <wp:inline xmlns:wp="http://schemas.openxmlformats.org/drawingml/2006/wordprocessingDrawing" distT="0" distB="0" distL="0" distR="0">
-            <wp:extent cx="5220000" cy="3825733"/>
+            <wp:extent cx="5220000" cy="1045561"/>
             <wp:effectExtent l="0" t="0" r="0" b="0"/>
             <wp:docPr id="18" name="Mermaid diagram 18" descr="Mermaid diagram"/>
             <wp:cNvGraphicFramePr>
@@ -2914,7 +2914,447 @@
                     <pic:cNvPicPr/>
                   </pic:nvPicPr>
                   <pic:blipFill>
-                    <a:blip xmlns:r="http://schemas.openxmlformats.org/officeDocument/2006/relationships" r:embed="R96a3d57795a94869"/>
+                    <a:blip xmlns:r="http://schemas.openxmlformats.org/officeDocument/2006/relationships" r:embed="Rfb56476aa2e74366"/>
+                    <a:stretch>
+                      <a:fillRect/>
+                    </a:stretch>
+                  </pic:blipFill>
+                  <pic:spPr>
+                    <a:xfrm>
+                      <a:off x="0" y="0"/>
+                      <a:ext cx="5220000" cy="1045561"/>
+                    </a:xfrm>
+                    <a:prstGeom prst="rect">
+                      <a:avLst/>
+                    </a:prstGeom>
+                  </pic:spPr>
+                </pic:pic>
+              </a:graphicData>
+            </a:graphic>
+          </wp:inline>
+        </w:drawing>
+      </w:r>
+    </w:p>
+    <w:p>
+      <w:pPr>
+        <w:pStyle w:val="Normal"/>
+      </w:pPr>
+      <w:r>
+        <w:t xml:space="preserve">Gantt chart: alternate input date format (DD-MM-YYYY)</w:t>
+      </w:r>
+    </w:p>
+    <w:p>
+      <w:pPr>
+        <w:pStyle w:val="Normal"/>
+        <w:jc w:val="center"/>
+      </w:pPr>
+      <w:r>
+        <w:drawing>
+          <wp:inline xmlns:wp="http://schemas.openxmlformats.org/drawingml/2006/wordprocessingDrawing" distT="0" distB="0" distL="0" distR="0">
+            <wp:extent cx="5220000" cy="795583"/>
+            <wp:effectExtent l="0" t="0" r="0" b="0"/>
+            <wp:docPr id="19" name="Mermaid diagram 19" descr="Mermaid diagram"/>
+            <wp:cNvGraphicFramePr>
+              <a:graphicFrameLocks xmlns:a="http://schemas.openxmlformats.org/drawingml/2006/main" noChangeAspect="1"/>
+            </wp:cNvGraphicFramePr>
+            <a:graphic xmlns:a="http://schemas.openxmlformats.org/drawingml/2006/main">
+              <a:graphicData uri="http://schemas.openxmlformats.org/drawingml/2006/picture">
+                <pic:pic xmlns:pic="http://schemas.openxmlformats.org/drawingml/2006/picture">
+                  <pic:nvPicPr>
+                    <pic:cNvPr id="0" name="Mermaid diagram.svg" descr="Mermaid diagram"/>
+                    <pic:cNvPicPr/>
+                  </pic:nvPicPr>
+                  <pic:blipFill>
+                    <a:blip xmlns:r="http://schemas.openxmlformats.org/officeDocument/2006/relationships" r:embed="R3b0f1f2d22854791"/>
+                    <a:stretch>
+                      <a:fillRect/>
+                    </a:stretch>
+                  </pic:blipFill>
+                  <pic:spPr>
+                    <a:xfrm>
+                      <a:off x="0" y="0"/>
+                      <a:ext cx="5220000" cy="795583"/>
+                    </a:xfrm>
+                    <a:prstGeom prst="rect">
+                      <a:avLst/>
+                    </a:prstGeom>
+                  </pic:spPr>
+                </pic:pic>
+              </a:graphicData>
+            </a:graphic>
+          </wp:inline>
+        </w:drawing>
+      </w:r>
+    </w:p>
+    <w:p>
+      <w:pPr>
+        <w:pStyle w:val="Normal"/>
+      </w:pPr>
+      <w:r>
+        <w:t xml:space="preserve">Gantt chart: alternate input date format (MM-DD-YYYY)</w:t>
+      </w:r>
+    </w:p>
+    <w:p>
+      <w:pPr>
+        <w:pStyle w:val="Normal"/>
+        <w:jc w:val="center"/>
+      </w:pPr>
+      <w:r>
+        <w:drawing>
+          <wp:inline xmlns:wp="http://schemas.openxmlformats.org/drawingml/2006/wordprocessingDrawing" distT="0" distB="0" distL="0" distR="0">
+            <wp:extent cx="5220000" cy="795583"/>
+            <wp:effectExtent l="0" t="0" r="0" b="0"/>
+            <wp:docPr id="20" name="Mermaid diagram 20" descr="Mermaid diagram"/>
+            <wp:cNvGraphicFramePr>
+              <a:graphicFrameLocks xmlns:a="http://schemas.openxmlformats.org/drawingml/2006/main" noChangeAspect="1"/>
+            </wp:cNvGraphicFramePr>
+            <a:graphic xmlns:a="http://schemas.openxmlformats.org/drawingml/2006/main">
+              <a:graphicData uri="http://schemas.openxmlformats.org/drawingml/2006/picture">
+                <pic:pic xmlns:pic="http://schemas.openxmlformats.org/drawingml/2006/picture">
+                  <pic:nvPicPr>
+                    <pic:cNvPr id="0" name="Mermaid diagram.svg" descr="Mermaid diagram"/>
+                    <pic:cNvPicPr/>
+                  </pic:nvPicPr>
+                  <pic:blipFill>
+                    <a:blip xmlns:r="http://schemas.openxmlformats.org/officeDocument/2006/relationships" r:embed="Rabe7f421fca34210"/>
+                    <a:stretch>
+                      <a:fillRect/>
+                    </a:stretch>
+                  </pic:blipFill>
+                  <pic:spPr>
+                    <a:xfrm>
+                      <a:off x="0" y="0"/>
+                      <a:ext cx="5220000" cy="795583"/>
+                    </a:xfrm>
+                    <a:prstGeom prst="rect">
+                      <a:avLst/>
+                    </a:prstGeom>
+                  </pic:spPr>
+                </pic:pic>
+              </a:graphicData>
+            </a:graphic>
+          </wp:inline>
+        </w:drawing>
+      </w:r>
+    </w:p>
+    <w:p>
+      <w:pPr>
+        <w:pStyle w:val="Normal"/>
+      </w:pPr>
+      <w:r>
+        <w:t xml:space="preserve">Gantt chart: axisFormat probe (%m)</w:t>
+      </w:r>
+    </w:p>
+    <w:p>
+      <w:pPr>
+        <w:pStyle w:val="Normal"/>
+        <w:jc w:val="center"/>
+      </w:pPr>
+      <w:r>
+        <w:drawing>
+          <wp:inline xmlns:wp="http://schemas.openxmlformats.org/drawingml/2006/wordprocessingDrawing" distT="0" distB="0" distL="0" distR="0">
+            <wp:extent cx="5220000" cy="746803"/>
+            <wp:effectExtent l="0" t="0" r="0" b="0"/>
+            <wp:docPr id="21" name="Mermaid diagram 21" descr="Mermaid diagram"/>
+            <wp:cNvGraphicFramePr>
+              <a:graphicFrameLocks xmlns:a="http://schemas.openxmlformats.org/drawingml/2006/main" noChangeAspect="1"/>
+            </wp:cNvGraphicFramePr>
+            <a:graphic xmlns:a="http://schemas.openxmlformats.org/drawingml/2006/main">
+              <a:graphicData uri="http://schemas.openxmlformats.org/drawingml/2006/picture">
+                <pic:pic xmlns:pic="http://schemas.openxmlformats.org/drawingml/2006/picture">
+                  <pic:nvPicPr>
+                    <pic:cNvPr id="0" name="Mermaid diagram.svg" descr="Mermaid diagram"/>
+                    <pic:cNvPicPr/>
+                  </pic:nvPicPr>
+                  <pic:blipFill>
+                    <a:blip xmlns:r="http://schemas.openxmlformats.org/officeDocument/2006/relationships" r:embed="R68d3692f5235437a"/>
+                    <a:stretch>
+                      <a:fillRect/>
+                    </a:stretch>
+                  </pic:blipFill>
+                  <pic:spPr>
+                    <a:xfrm>
+                      <a:off x="0" y="0"/>
+                      <a:ext cx="5220000" cy="746803"/>
+                    </a:xfrm>
+                    <a:prstGeom prst="rect">
+                      <a:avLst/>
+                    </a:prstGeom>
+                  </pic:spPr>
+                </pic:pic>
+              </a:graphicData>
+            </a:graphic>
+          </wp:inline>
+        </w:drawing>
+      </w:r>
+    </w:p>
+    <w:p>
+      <w:pPr>
+        <w:pStyle w:val="Normal"/>
+      </w:pPr>
+      <w:r>
+        <w:t xml:space="preserve">Gantt chart: axisFormat probe (%y)</w:t>
+      </w:r>
+    </w:p>
+    <w:p>
+      <w:pPr>
+        <w:pStyle w:val="Normal"/>
+        <w:jc w:val="center"/>
+      </w:pPr>
+      <w:r>
+        <w:drawing>
+          <wp:inline xmlns:wp="http://schemas.openxmlformats.org/drawingml/2006/wordprocessingDrawing" distT="0" distB="0" distL="0" distR="0">
+            <wp:extent cx="5220000" cy="741391"/>
+            <wp:effectExtent l="0" t="0" r="0" b="0"/>
+            <wp:docPr id="22" name="Mermaid diagram 22" descr="Mermaid diagram"/>
+            <wp:cNvGraphicFramePr>
+              <a:graphicFrameLocks xmlns:a="http://schemas.openxmlformats.org/drawingml/2006/main" noChangeAspect="1"/>
+            </wp:cNvGraphicFramePr>
+            <a:graphic xmlns:a="http://schemas.openxmlformats.org/drawingml/2006/main">
+              <a:graphicData uri="http://schemas.openxmlformats.org/drawingml/2006/picture">
+                <pic:pic xmlns:pic="http://schemas.openxmlformats.org/drawingml/2006/picture">
+                  <pic:nvPicPr>
+                    <pic:cNvPr id="0" name="Mermaid diagram.svg" descr="Mermaid diagram"/>
+                    <pic:cNvPicPr/>
+                  </pic:nvPicPr>
+                  <pic:blipFill>
+                    <a:blip xmlns:r="http://schemas.openxmlformats.org/officeDocument/2006/relationships" r:embed="Rcb073fe2c4504682"/>
+                    <a:stretch>
+                      <a:fillRect/>
+                    </a:stretch>
+                  </pic:blipFill>
+                  <pic:spPr>
+                    <a:xfrm>
+                      <a:off x="0" y="0"/>
+                      <a:ext cx="5220000" cy="741391"/>
+                    </a:xfrm>
+                    <a:prstGeom prst="rect">
+                      <a:avLst/>
+                    </a:prstGeom>
+                  </pic:spPr>
+                </pic:pic>
+              </a:graphicData>
+            </a:graphic>
+          </wp:inline>
+        </w:drawing>
+      </w:r>
+    </w:p>
+    <w:p>
+      <w:pPr>
+        <w:pStyle w:val="Normal"/>
+      </w:pPr>
+      <w:r>
+        <w:t xml:space="preserve">Additional Mermaid Gantt directives (supported upstream, not yet supported by Naiad’s Gantt parser):</w:t>
+      </w:r>
+    </w:p>
+    <w:p>
+      <w:pPr>
+        <w:pStyle w:val="Normal"/>
+        <w:numPr>
+          <w:ilvl w:val="0"/>
+          <w:numId w:val="30"/>
+        </w:numPr>
+      </w:pPr>
+      <w:r>
+        <w:rPr>
+          <w:rStyle w:val="MdInlineCode"/>
+        </w:rPr>
+        <w:t xml:space="preserve">topAxis</w:t>
+      </w:r>
+      <w:r>
+        <w:t xml:space="preserve"> (currently triggers </w:t>
+      </w:r>
+      <w:r>
+        <w:rPr>
+          <w:rStyle w:val="MdInlineCode"/>
+        </w:rPr>
+        <w:t xml:space="preserve">TopAxis is not a function</w:t>
+      </w:r>
+      <w:r>
+        <w:t xml:space="preserve"> in </w:t>
+      </w:r>
+      <w:r>
+        <w:rPr>
+          <w:rStyle w:val="MdInlineCode"/>
+        </w:rPr>
+        <w:t xml:space="preserve">mermaid.live</w:t>
+      </w:r>
+      <w:r>
+        <w:t xml:space="preserve"> — omit for now)</w:t>
+      </w:r>
+    </w:p>
+    <w:p>
+      <w:pPr>
+        <w:pStyle w:val="Normal"/>
+        <w:numPr>
+          <w:ilvl w:val="0"/>
+          <w:numId w:val="30"/>
+        </w:numPr>
+      </w:pPr>
+      <w:r>
+        <w:rPr>
+          <w:rStyle w:val="MdInlineCode"/>
+        </w:rPr>
+        <w:t xml:space="preserve">tickInterval 1day</w:t>
+      </w:r>
+      <w:r>
+        <w:t xml:space="preserve"> (or </w:t>
+      </w:r>
+      <w:r>
+        <w:rPr>
+          <w:rStyle w:val="MdInlineCode"/>
+        </w:rPr>
+        <w:t xml:space="preserve">1week</w:t>
+      </w:r>
+      <w:r>
+        <w:t xml:space="preserve">, </w:t>
+      </w:r>
+      <w:r>
+        <w:rPr>
+          <w:rStyle w:val="MdInlineCode"/>
+        </w:rPr>
+        <w:t xml:space="preserve">1month</w:t>
+      </w:r>
+      <w:r>
+        <w:t xml:space="preserve">, etc)</w:t>
+      </w:r>
+    </w:p>
+    <w:p>
+      <w:pPr>
+        <w:pStyle w:val="Normal"/>
+        <w:numPr>
+          <w:ilvl w:val="0"/>
+          <w:numId w:val="30"/>
+        </w:numPr>
+      </w:pPr>
+      <w:r>
+        <w:rPr>
+          <w:rStyle w:val="MdInlineCode"/>
+        </w:rPr>
+        <w:t xml:space="preserve">weekday monday</w:t>
+      </w:r>
+      <w:r>
+        <w:t xml:space="preserve"> (tick interval alignment)</w:t>
+      </w:r>
+    </w:p>
+    <w:p>
+      <w:pPr>
+        <w:pStyle w:val="Normal"/>
+        <w:numPr>
+          <w:ilvl w:val="0"/>
+          <w:numId w:val="30"/>
+        </w:numPr>
+      </w:pPr>
+      <w:r>
+        <w:rPr>
+          <w:rStyle w:val="MdInlineCode"/>
+        </w:rPr>
+        <w:t xml:space="preserve">weekend friday</w:t>
+      </w:r>
+      <w:r>
+        <w:t xml:space="preserve"> (weekend start day)</w:t>
+      </w:r>
+    </w:p>
+    <w:p>
+      <w:pPr>
+        <w:pStyle w:val="Normal"/>
+        <w:numPr>
+          <w:ilvl w:val="0"/>
+          <w:numId w:val="30"/>
+        </w:numPr>
+      </w:pPr>
+      <w:r>
+        <w:rPr>
+          <w:rStyle w:val="MdInlineCode"/>
+        </w:rPr>
+        <w:t xml:space="preserve">inclusiveEndDates</w:t>
+      </w:r>
+    </w:p>
+    <w:p>
+      <w:pPr>
+        <w:pStyle w:val="Normal"/>
+        <w:numPr>
+          <w:ilvl w:val="0"/>
+          <w:numId w:val="30"/>
+        </w:numPr>
+      </w:pPr>
+      <w:r>
+        <w:rPr>
+          <w:rStyle w:val="MdInlineCode"/>
+        </w:rPr>
+        <w:t xml:space="preserve">includes 2026-04-04</w:t>
+      </w:r>
+    </w:p>
+    <w:p>
+      <w:pPr>
+        <w:pStyle w:val="Normal"/>
+        <w:numPr>
+          <w:ilvl w:val="0"/>
+          <w:numId w:val="30"/>
+        </w:numPr>
+      </w:pPr>
+      <w:r>
+        <w:rPr>
+          <w:rStyle w:val="MdInlineCode"/>
+        </w:rPr>
+        <w:t xml:space="preserve">todayMarker off</w:t>
+      </w:r>
+      <w:r>
+        <w:t xml:space="preserve"> or </w:t>
+      </w:r>
+      <w:r>
+        <w:rPr>
+          <w:rStyle w:val="MdInlineCode"/>
+        </w:rPr>
+        <w:t xml:space="preserve">todayMarker stroke: red, stroke-width: 2px</w:t>
+      </w:r>
+    </w:p>
+    <w:p>
+      <w:pPr>
+        <w:pStyle w:val="Normal"/>
+        <w:numPr>
+          <w:ilvl w:val="0"/>
+          <w:numId w:val="30"/>
+        </w:numPr>
+      </w:pPr>
+      <w:r>
+        <w:rPr>
+          <w:rStyle w:val="MdInlineCode"/>
+        </w:rPr>
+        <w:t xml:space="preserve">click &lt;taskId&gt; href "https://example.com"</w:t>
+      </w:r>
+    </w:p>
+    <w:p>
+      <w:pPr>
+        <w:pStyle w:val="Normal"/>
+      </w:pPr>
+      <w:r>
+        <w:t xml:space="preserve">Pie chart:</w:t>
+      </w:r>
+    </w:p>
+    <w:p>
+      <w:pPr>
+        <w:pStyle w:val="Normal"/>
+        <w:jc w:val="center"/>
+      </w:pPr>
+      <w:r>
+        <w:drawing>
+          <wp:inline xmlns:wp="http://schemas.openxmlformats.org/drawingml/2006/wordprocessingDrawing" distT="0" distB="0" distL="0" distR="0">
+            <wp:extent cx="5220000" cy="3825733"/>
+            <wp:effectExtent l="0" t="0" r="0" b="0"/>
+            <wp:docPr id="23" name="Mermaid diagram 23" descr="Mermaid diagram"/>
+            <wp:cNvGraphicFramePr>
+              <a:graphicFrameLocks xmlns:a="http://schemas.openxmlformats.org/drawingml/2006/main" noChangeAspect="1"/>
+            </wp:cNvGraphicFramePr>
+            <a:graphic xmlns:a="http://schemas.openxmlformats.org/drawingml/2006/main">
+              <a:graphicData uri="http://schemas.openxmlformats.org/drawingml/2006/picture">
+                <pic:pic xmlns:pic="http://schemas.openxmlformats.org/drawingml/2006/picture">
+                  <pic:nvPicPr>
+                    <pic:cNvPr id="0" name="Mermaid diagram.svg" descr="Mermaid diagram"/>
+                    <pic:cNvPicPr/>
+                  </pic:nvPicPr>
+                  <pic:blipFill>
+                    <a:blip xmlns:r="http://schemas.openxmlformats.org/officeDocument/2006/relationships" r:embed="Rb92cdce2cbb5476e"/>
                     <a:stretch>
                       <a:fillRect/>
                     </a:stretch>
@@ -2953,7 +3393,7 @@
           <wp:inline xmlns:wp="http://schemas.openxmlformats.org/drawingml/2006/wordprocessingDrawing" distT="0" distB="0" distL="0" distR="0">
             <wp:extent cx="2857500" cy="1333500"/>
             <wp:effectExtent l="0" t="0" r="0" b="0"/>
-            <wp:docPr id="19" name="Mermaid diagram 19" descr="Mermaid diagram"/>
+            <wp:docPr id="24" name="Mermaid diagram 24" descr="Mermaid diagram"/>
             <wp:cNvGraphicFramePr>
               <a:graphicFrameLocks xmlns:a="http://schemas.openxmlformats.org/drawingml/2006/main" noChangeAspect="1"/>
             </wp:cNvGraphicFramePr>
@@ -2965,7 +3405,7 @@
                     <pic:cNvPicPr/>
                   </pic:nvPicPr>
                   <pic:blipFill>
-                    <a:blip xmlns:r="http://schemas.openxmlformats.org/officeDocument/2006/relationships" r:embed="R1a0663137e894d27"/>
+                    <a:blip xmlns:r="http://schemas.openxmlformats.org/officeDocument/2006/relationships" r:embed="R653288aa2796479e"/>
                     <a:stretch>
                       <a:fillRect/>
                     </a:stretch>
@@ -3004,7 +3444,7 @@
           <wp:inline xmlns:wp="http://schemas.openxmlformats.org/drawingml/2006/wordprocessingDrawing" distT="0" distB="0" distL="0" distR="0">
             <wp:extent cx="4629150" cy="2333625"/>
             <wp:effectExtent l="0" t="0" r="0" b="0"/>
-            <wp:docPr id="20" name="Mermaid diagram 20" descr="Mermaid diagram"/>
+            <wp:docPr id="25" name="Mermaid diagram 25" descr="Mermaid diagram"/>
             <wp:cNvGraphicFramePr>
               <a:graphicFrameLocks xmlns:a="http://schemas.openxmlformats.org/drawingml/2006/main" noChangeAspect="1"/>
             </wp:cNvGraphicFramePr>
@@ -3016,7 +3456,7 @@
                     <pic:cNvPicPr/>
                   </pic:nvPicPr>
                   <pic:blipFill>
-                    <a:blip xmlns:r="http://schemas.openxmlformats.org/officeDocument/2006/relationships" r:embed="R50e7aba8e4bb4738"/>
+                    <a:blip xmlns:r="http://schemas.openxmlformats.org/officeDocument/2006/relationships" r:embed="Rf1ea8560d7f847c2"/>
                     <a:stretch>
                       <a:fillRect/>
                     </a:stretch>
@@ -3055,7 +3495,7 @@
           <wp:inline xmlns:wp="http://schemas.openxmlformats.org/drawingml/2006/wordprocessingDrawing" distT="0" distB="0" distL="0" distR="0">
             <wp:extent cx="4000500" cy="2333625"/>
             <wp:effectExtent l="0" t="0" r="0" b="0"/>
-            <wp:docPr id="21" name="Mermaid diagram 21" descr="Mermaid diagram"/>
+            <wp:docPr id="26" name="Mermaid diagram 26" descr="Mermaid diagram"/>
             <wp:cNvGraphicFramePr>
               <a:graphicFrameLocks xmlns:a="http://schemas.openxmlformats.org/drawingml/2006/main" noChangeAspect="1"/>
             </wp:cNvGraphicFramePr>
@@ -3067,7 +3507,7 @@
                     <pic:cNvPicPr/>
                   </pic:nvPicPr>
                   <pic:blipFill>
-                    <a:blip xmlns:r="http://schemas.openxmlformats.org/officeDocument/2006/relationships" r:embed="R1a93111bfa7d4680"/>
+                    <a:blip xmlns:r="http://schemas.openxmlformats.org/officeDocument/2006/relationships" r:embed="Rc0b8cc71af21407a"/>
                     <a:stretch>
                       <a:fillRect/>
                     </a:stretch>
@@ -3106,7 +3546,7 @@
           <wp:inline xmlns:wp="http://schemas.openxmlformats.org/drawingml/2006/wordprocessingDrawing" distT="0" distB="0" distL="0" distR="0">
             <wp:extent cx="3810000" cy="3190875"/>
             <wp:effectExtent l="0" t="0" r="0" b="0"/>
-            <wp:docPr id="22" name="Mermaid diagram 22" descr="Mermaid diagram"/>
+            <wp:docPr id="27" name="Mermaid diagram 27" descr="Mermaid diagram"/>
             <wp:cNvGraphicFramePr>
               <a:graphicFrameLocks xmlns:a="http://schemas.openxmlformats.org/drawingml/2006/main" noChangeAspect="1"/>
             </wp:cNvGraphicFramePr>
@@ -3118,7 +3558,7 @@
                     <pic:cNvPicPr/>
                   </pic:nvPicPr>
                   <pic:blipFill>
-                    <a:blip xmlns:r="http://schemas.openxmlformats.org/officeDocument/2006/relationships" r:embed="Rd5232058d5a84416"/>
+                    <a:blip xmlns:r="http://schemas.openxmlformats.org/officeDocument/2006/relationships" r:embed="Rccdde621e63f4afa"/>
                     <a:stretch>
                       <a:fillRect/>
                     </a:stretch>
@@ -3157,7 +3597,7 @@
           <wp:inline xmlns:wp="http://schemas.openxmlformats.org/drawingml/2006/wordprocessingDrawing" distT="0" distB="0" distL="0" distR="0">
             <wp:extent cx="5220000" cy="5084416"/>
             <wp:effectExtent l="0" t="0" r="0" b="0"/>
-            <wp:docPr id="23" name="Mermaid diagram 23" descr="Mermaid diagram"/>
+            <wp:docPr id="28" name="Mermaid diagram 28" descr="Mermaid diagram"/>
             <wp:cNvGraphicFramePr>
               <a:graphicFrameLocks xmlns:a="http://schemas.openxmlformats.org/drawingml/2006/main" noChangeAspect="1"/>
             </wp:cNvGraphicFramePr>
@@ -3169,7 +3609,7 @@
                     <pic:cNvPicPr/>
                   </pic:nvPicPr>
                   <pic:blipFill>
-                    <a:blip xmlns:r="http://schemas.openxmlformats.org/officeDocument/2006/relationships" r:embed="Rc61d89a8980b4b71"/>
+                    <a:blip xmlns:r="http://schemas.openxmlformats.org/officeDocument/2006/relationships" r:embed="R7c1901760c41451f"/>
                     <a:stretch>
                       <a:fillRect/>
                     </a:stretch>
@@ -3208,7 +3648,7 @@
           <wp:inline xmlns:wp="http://schemas.openxmlformats.org/drawingml/2006/wordprocessingDrawing" distT="0" distB="0" distL="0" distR="0">
             <wp:extent cx="4953000" cy="1714500"/>
             <wp:effectExtent l="0" t="0" r="0" b="0"/>
-            <wp:docPr id="24" name="Mermaid diagram 24" descr="Mermaid diagram"/>
+            <wp:docPr id="29" name="Mermaid diagram 29" descr="Mermaid diagram"/>
             <wp:cNvGraphicFramePr>
               <a:graphicFrameLocks xmlns:a="http://schemas.openxmlformats.org/drawingml/2006/main" noChangeAspect="1"/>
             </wp:cNvGraphicFramePr>
@@ -3220,7 +3660,7 @@
                     <pic:cNvPicPr/>
                   </pic:nvPicPr>
                   <pic:blipFill>
-                    <a:blip xmlns:r="http://schemas.openxmlformats.org/officeDocument/2006/relationships" r:embed="R68cd1790efb14119"/>
+                    <a:blip xmlns:r="http://schemas.openxmlformats.org/officeDocument/2006/relationships" r:embed="R874af557bb074aab"/>
                     <a:stretch>
                       <a:fillRect/>
                     </a:stretch>
@@ -3259,7 +3699,7 @@
           <wp:inline xmlns:wp="http://schemas.openxmlformats.org/drawingml/2006/wordprocessingDrawing" distT="0" distB="0" distL="0" distR="0">
             <wp:extent cx="4191000" cy="4191000"/>
             <wp:effectExtent l="0" t="0" r="0" b="0"/>
-            <wp:docPr id="25" name="Mermaid diagram 25" descr="Mermaid diagram"/>
+            <wp:docPr id="30" name="Mermaid diagram 30" descr="Mermaid diagram"/>
             <wp:cNvGraphicFramePr>
               <a:graphicFrameLocks xmlns:a="http://schemas.openxmlformats.org/drawingml/2006/main" noChangeAspect="1"/>
             </wp:cNvGraphicFramePr>
@@ -3271,7 +3711,7 @@
                     <pic:cNvPicPr/>
                   </pic:nvPicPr>
                   <pic:blipFill>
-                    <a:blip xmlns:r="http://schemas.openxmlformats.org/officeDocument/2006/relationships" r:embed="Rd9baa261a907436c"/>
+                    <a:blip xmlns:r="http://schemas.openxmlformats.org/officeDocument/2006/relationships" r:embed="Ra00aff845e7e4f5a"/>
                     <a:stretch>
                       <a:fillRect/>
                     </a:stretch>
@@ -3310,7 +3750,7 @@
           <wp:inline xmlns:wp="http://schemas.openxmlformats.org/drawingml/2006/wordprocessingDrawing" distT="0" distB="0" distL="0" distR="0">
             <wp:extent cx="5220000" cy="474545"/>
             <wp:effectExtent l="0" t="0" r="0" b="0"/>
-            <wp:docPr id="26" name="Mermaid diagram 26" descr="Mermaid diagram"/>
+            <wp:docPr id="31" name="Mermaid diagram 31" descr="Mermaid diagram"/>
             <wp:cNvGraphicFramePr>
               <a:graphicFrameLocks xmlns:a="http://schemas.openxmlformats.org/drawingml/2006/main" noChangeAspect="1"/>
             </wp:cNvGraphicFramePr>
@@ -3322,7 +3762,7 @@
                     <pic:cNvPicPr/>
                   </pic:nvPicPr>
                   <pic:blipFill>
-                    <a:blip xmlns:r="http://schemas.openxmlformats.org/officeDocument/2006/relationships" r:embed="R9e725d5437c14168"/>
+                    <a:blip xmlns:r="http://schemas.openxmlformats.org/officeDocument/2006/relationships" r:embed="R4167584922b24e10"/>
                     <a:stretch>
                       <a:fillRect/>
                     </a:stretch>
@@ -3407,7 +3847,7 @@
           <wp:inline xmlns:wp="http://schemas.openxmlformats.org/drawingml/2006/wordprocessingDrawing" distT="0" distB="0" distL="0" distR="0">
             <wp:extent cx="4191000" cy="4191000"/>
             <wp:effectExtent l="0" t="0" r="0" b="0"/>
-            <wp:docPr id="27" name="Mermaid diagram 27" descr="Mermaid diagram"/>
+            <wp:docPr id="32" name="Mermaid diagram 32" descr="Mermaid diagram"/>
             <wp:cNvGraphicFramePr>
               <a:graphicFrameLocks xmlns:a="http://schemas.openxmlformats.org/drawingml/2006/main" noChangeAspect="1"/>
             </wp:cNvGraphicFramePr>
@@ -3419,7 +3859,7 @@
                     <pic:cNvPicPr/>
                   </pic:nvPicPr>
                   <pic:blipFill>
-                    <a:blip xmlns:r="http://schemas.openxmlformats.org/officeDocument/2006/relationships" r:embed="R8d865f0a953b47a2"/>
+                    <a:blip xmlns:r="http://schemas.openxmlformats.org/officeDocument/2006/relationships" r:embed="R5f8a5da7a34645af"/>
                     <a:stretch>
                       <a:fillRect/>
                     </a:stretch>
@@ -3450,7 +3890,7 @@
           <wp:inline xmlns:wp="http://schemas.openxmlformats.org/drawingml/2006/wordprocessingDrawing" distT="0" distB="0" distL="0" distR="0">
             <wp:extent cx="4191000" cy="4857750"/>
             <wp:effectExtent l="0" t="0" r="0" b="0"/>
-            <wp:docPr id="28" name="Mermaid diagram 28" descr="Mermaid diagram"/>
+            <wp:docPr id="33" name="Mermaid diagram 33" descr="Mermaid diagram"/>
             <wp:cNvGraphicFramePr>
               <a:graphicFrameLocks xmlns:a="http://schemas.openxmlformats.org/drawingml/2006/main" noChangeAspect="1"/>
             </wp:cNvGraphicFramePr>
@@ -3462,7 +3902,7 @@
                     <pic:cNvPicPr/>
                   </pic:nvPicPr>
                   <pic:blipFill>
-                    <a:blip xmlns:r="http://schemas.openxmlformats.org/officeDocument/2006/relationships" r:embed="R6d60eca1d593448d"/>
+                    <a:blip xmlns:r="http://schemas.openxmlformats.org/officeDocument/2006/relationships" r:embed="R6eeeb9acf8864eeb"/>
                     <a:stretch>
                       <a:fillRect/>
                     </a:stretch>
@@ -3493,7 +3933,7 @@
           <wp:inline xmlns:wp="http://schemas.openxmlformats.org/drawingml/2006/wordprocessingDrawing" distT="0" distB="0" distL="0" distR="0">
             <wp:extent cx="4191000" cy="3333750"/>
             <wp:effectExtent l="0" t="0" r="0" b="0"/>
-            <wp:docPr id="29" name="Mermaid diagram 29" descr="Mermaid diagram"/>
+            <wp:docPr id="34" name="Mermaid diagram 34" descr="Mermaid diagram"/>
             <wp:cNvGraphicFramePr>
               <a:graphicFrameLocks xmlns:a="http://schemas.openxmlformats.org/drawingml/2006/main" noChangeAspect="1"/>
             </wp:cNvGraphicFramePr>
@@ -3505,7 +3945,7 @@
                     <pic:cNvPicPr/>
                   </pic:nvPicPr>
                   <pic:blipFill>
-                    <a:blip xmlns:r="http://schemas.openxmlformats.org/officeDocument/2006/relationships" r:embed="Rcd607477a0de46cb"/>
+                    <a:blip xmlns:r="http://schemas.openxmlformats.org/officeDocument/2006/relationships" r:embed="R6448ca5199c148a1"/>
                     <a:stretch>
                       <a:fillRect/>
                     </a:stretch>
@@ -3536,7 +3976,7 @@
           <wp:inline xmlns:wp="http://schemas.openxmlformats.org/drawingml/2006/wordprocessingDrawing" distT="0" distB="0" distL="0" distR="0">
             <wp:extent cx="4476750" cy="4000500"/>
             <wp:effectExtent l="0" t="0" r="0" b="0"/>
-            <wp:docPr id="30" name="Mermaid diagram 30" descr="Mermaid diagram"/>
+            <wp:docPr id="35" name="Mermaid diagram 35" descr="Mermaid diagram"/>
             <wp:cNvGraphicFramePr>
               <a:graphicFrameLocks xmlns:a="http://schemas.openxmlformats.org/drawingml/2006/main" noChangeAspect="1"/>
             </wp:cNvGraphicFramePr>
@@ -3548,7 +3988,7 @@
                     <pic:cNvPicPr/>
                   </pic:nvPicPr>
                   <pic:blipFill>
-                    <a:blip xmlns:r="http://schemas.openxmlformats.org/officeDocument/2006/relationships" r:embed="R363590994cb84095"/>
+                    <a:blip xmlns:r="http://schemas.openxmlformats.org/officeDocument/2006/relationships" r:embed="R7b35111da18c4cb5"/>
                     <a:stretch>
                       <a:fillRect/>
                     </a:stretch>
@@ -3627,301 +4067,11 @@
         <w:jc w:val="center"/>
       </w:pPr>
       <w:r>
-        <w:rPr>
-          <w:b/>
-        </w:rPr>
-        <w:t xml:space="preserve">[Mermaid diagram not rendered] </w:t>
-      </w:r>
-      <w:r>
-        <w:t xml:space="preserve">Mermaid render failed: Failed to parse flowchart: Parse error.
-    unexpected d
-    expected "%%", "
-", or "
-"
-    at line 3, col 9</w:t>
-      </w:r>
-      <w:r>
-        <w:br/>
-      </w:r>
-      <w:r>
-        <w:rPr>
-          <w:rFonts w:ascii="Consolas" w:hAnsi="Consolas"/>
-          <w:noProof/>
-        </w:rPr>
-        <w:t xml:space="preserve">%%{init: {"flowchart": {"htmlLabels": false}} }%%</w:t>
-        <w:br/>
-        <w:t xml:space="preserve">flowchart TB</w:t>
-        <w:br/>
-        <w:t xml:space="preserve">    subgraph Region_A["Region A (subgraph)"]</w:t>
-        <w:br/>
-        <w:t xml:space="preserve">        direction LR</w:t>
-        <w:br/>
-        <w:t xml:space="preserve">        A1["Start\n(two lines)"] --&gt;|"labelled edge"| A2["Process"]</w:t>
-        <w:br/>
-        <w:t xml:space="preserve">        A2 -. dotted .-&gt; A3{"Decision?"}</w:t>
-        <w:br/>
-        <w:t xml:space="preserve">        A3 --&gt;|Yes| A4["Yes path"]</w:t>
-        <w:br/>
-        <w:t xml:space="preserve">        A3 --&gt;|No| A5["No path"]</w:t>
-        <w:br/>
-        <w:t xml:space="preserve">    end</w:t>
-        <w:br/>
-        <w:t xml:space="preserve"/>
-        <w:br/>
-        <w:t xml:space="preserve">    subgraph Region_B["Region B"]</w:t>
-        <w:br/>
-        <w:t xml:space="preserve">        direction TB</w:t>
-        <w:br/>
-        <w:t xml:space="preserve">        B1["Left"] --- B2["Right"]</w:t>
-        <w:br/>
-        <w:t xml:space="preserve">        B2 ==&gt; B3["Thick"]</w:t>
-        <w:br/>
-        <w:t xml:space="preserve">    end</w:t>
-        <w:br/>
-        <w:t xml:space="preserve"/>
-        <w:br/>
-        <w:t xml:space="preserve">    Region_A --&gt;|"cross-region link"| Region_B</w:t>
-        <w:br/>
-        <w:t xml:space="preserve"/>
-        <w:br/>
-        <w:t xml:space="preserve">    classDef Critical fill:#ffdddd,stroke:#cc0000,stroke-width:2px,color:#000000;</w:t>
-        <w:br/>
-        <w:t xml:space="preserve">    classDef Calm fill:#ddffdd,stroke:#00aa00,stroke-width:2px;</w:t>
-        <w:br/>
-        <w:t xml:space="preserve">    class A1,A3 Critical;</w:t>
-        <w:br/>
-        <w:t xml:space="preserve">    class B1,B2,B3 Calm;</w:t>
-        <w:br/>
-        <w:t xml:space="preserve"/>
-        <w:br/>
-        <w:t xml:space="preserve">    style Region_A fill:#f3f3ff,stroke:#9370db,stroke-width:1px</w:t>
-        <w:br/>
-        <w:t xml:space="preserve">    linkStyle 0 stroke:#333333,stroke-width:2px</w:t>
-        <w:br/>
-        <w:t xml:space="preserve">    linkStyle 1 stroke:#333333,stroke-dasharray:3 3</w:t>
-      </w:r>
-    </w:p>
-    <w:p>
-      <w:pPr>
-        <w:pStyle w:val="Normal"/>
-      </w:pPr>
-      <w:r>
-        <w:t xml:space="preserve">Sequence diagram: notes + autonumber (exercise text placement):</w:t>
-      </w:r>
-    </w:p>
-    <w:p>
-      <w:pPr>
-        <w:pStyle w:val="Normal"/>
-      </w:pPr>
-      <w:r>
-        <w:t xml:space="preserve">sequenceDiagram</w:t>
-      </w:r>
-      <w:r>
-        <w:br/>
-      </w:r>
-      <w:r>
-        <w:t xml:space="preserve">autonumber</w:t>
-      </w:r>
-      <w:r>
-        <w:br/>
-      </w:r>
-      <w:r>
-        <w:t xml:space="preserve">participant User</w:t>
-      </w:r>
-      <w:r>
-        <w:br/>
-      </w:r>
-      <w:r>
-        <w:t xml:space="preserve">participant Converter</w:t>
-      </w:r>
-      <w:r>
-        <w:br/>
-      </w:r>
-      <w:r>
-        <w:t xml:space="preserve">participant Naiad</w:t>
-      </w:r>
-      <w:r>
-        <w:br/>
-      </w:r>
-      <w:r>
-        <w:t xml:space="preserve">Note over User,Converter: DOCX path uses Naiad (C#), preview uses Mermaid.js</w:t>
-      </w:r>
-      <w:r>
-        <w:br/>
-      </w:r>
-      <w:r>
-        <w:t xml:space="preserve">User-&gt;&gt;Converter: Open Markdown</w:t>
-      </w:r>
-      <w:r>
-        <w:br/>
-      </w:r>
-      <w:r>
-        <w:t xml:space="preserve">Converter-&gt;&gt;Naiad: Render Mermaid source</w:t>
-      </w:r>
-      <w:r>
-        <w:br/>
-      </w:r>
-      <w:r>
-        <w:t xml:space="preserve">Naiad--&gt;&gt;Converter: SVG</w:t>
-      </w:r>
-      <w:r>
-        <w:br/>
-      </w:r>
-      <w:r>
-        <w:t xml:space="preserve">Converter--&gt;&gt;User: DOCX with diagram</w:t>
-      </w:r>
-    </w:p>
-    <w:p>
-      <w:pPr>
-        <w:pStyle w:val="Normal"/>
-      </w:pPr>
-      <w:r>
-        <w:t xml:space="preserve">Requirement diagram: multiple requirements + relationship:</w:t>
-      </w:r>
-    </w:p>
-    <w:p>
-      <w:pPr>
-        <w:pStyle w:val="Normal"/>
-        <w:jc w:val="center"/>
-      </w:pPr>
-      <w:r>
-        <w:rPr>
-          <w:b/>
-        </w:rPr>
-        <w:t xml:space="preserve">[Mermaid diagram not rendered] </w:t>
-      </w:r>
-      <w:r>
-        <w:t xml:space="preserve">Mermaid render failed: Failed to parse requirement diagram: Parse error.
-    unexpected }
-    expected end of input, "element", "-", "%%", "
-", or "
-"
-    at line 7, col 5</w:t>
-      </w:r>
-      <w:r>
-        <w:br/>
-      </w:r>
-      <w:r>
-        <w:rPr>
-          <w:rFonts w:ascii="Consolas" w:hAnsi="Consolas"/>
-          <w:noProof/>
-        </w:rPr>
-        <w:t xml:space="preserve">requirementDiagram</w:t>
-        <w:br/>
-        <w:t xml:space="preserve">    requirement render_mermaid {</w:t>
-        <w:br/>
-        <w:t xml:space="preserve">        id: 1</w:t>
-        <w:br/>
-        <w:t xml:space="preserve">        text: Mermaid diagrams render as SVG in DOCX</w:t>
-        <w:br/>
-        <w:t xml:space="preserve">        risk: medium</w:t>
-        <w:br/>
-        <w:t xml:space="preserve">        verifymethod: test</w:t>
-        <w:br/>
-        <w:t xml:space="preserve">    }</w:t>
-        <w:br/>
-        <w:t xml:space="preserve">    requirement parity {</w:t>
-        <w:br/>
-        <w:t xml:space="preserve">        id: 2</w:t>
-        <w:br/>
-        <w:t xml:space="preserve">        text: Word output matches VS Code Mermaid preview defaults</w:t>
-        <w:br/>
-        <w:t xml:space="preserve">        risk: high</w:t>
-        <w:br/>
-        <w:t xml:space="preserve">        verifymethod: inspection</w:t>
-        <w:br/>
-        <w:t xml:space="preserve">    }</w:t>
-        <w:br/>
-        <w:t xml:space="preserve">    render_mermaid - satisfies -&gt; parity</w:t>
-      </w:r>
-    </w:p>
-    <w:p>
-      <w:pPr>
-        <w:pStyle w:val="Normal"/>
-      </w:pPr>
-      <w:r>
-        <w:t xml:space="preserve">State diagram v2: composite states + forks/joins + notes:</w:t>
-      </w:r>
-    </w:p>
-    <w:p>
-      <w:pPr>
-        <w:pStyle w:val="Normal"/>
-        <w:jc w:val="center"/>
-      </w:pPr>
-      <w:r>
-        <w:rPr>
-          <w:b/>
-        </w:rPr>
-        <w:t xml:space="preserve">[Mermaid diagram not rendered] </w:t>
-      </w:r>
-      <w:r>
-        <w:t xml:space="preserve">Mermaid render failed: Failed to parse state diagram: Parse error.
-    unexpected n
-    expected "%%", "
-", or "
-"
-    at line 3, col 5</w:t>
-      </w:r>
-      <w:r>
-        <w:br/>
-      </w:r>
-      <w:r>
-        <w:rPr>
-          <w:rFonts w:ascii="Consolas" w:hAnsi="Consolas"/>
-          <w:noProof/>
-        </w:rPr>
-        <w:t xml:space="preserve">stateDiagram-v2</w:t>
-        <w:br/>
-        <w:t xml:space="preserve">    [*] --&gt; Idle</w:t>
-        <w:br/>
-        <w:t xml:space="preserve">    note right of Idle</w:t>
-        <w:br/>
-        <w:t xml:space="preserve">      Waiting for input</w:t>
-        <w:br/>
-        <w:t xml:space="preserve">    end note</w:t>
-        <w:br/>
-        <w:t xml:space="preserve"/>
-        <w:br/>
-        <w:t xml:space="preserve">    Idle --&gt; Active</w:t>
-        <w:br/>
-        <w:t xml:space="preserve"/>
-        <w:br/>
-        <w:t xml:space="preserve">    state Active {</w:t>
-        <w:br/>
-        <w:t xml:space="preserve">        [*] --&gt; Step1</w:t>
-        <w:br/>
-        <w:t xml:space="preserve">        Step1 --&gt; Step2</w:t>
-        <w:br/>
-        <w:t xml:space="preserve">        Step2 --&gt; [*]</w:t>
-        <w:br/>
-        <w:t xml:space="preserve">    }</w:t>
-        <w:br/>
-        <w:t xml:space="preserve"/>
-        <w:br/>
-        <w:t xml:space="preserve">    Active --&gt; Done</w:t>
-        <w:br/>
-        <w:t xml:space="preserve">    Done --&gt; [*]</w:t>
-      </w:r>
-    </w:p>
-    <w:p>
-      <w:pPr>
-        <w:pStyle w:val="Normal"/>
-      </w:pPr>
-      <w:r>
-        <w:t xml:space="preserve">Class diagram: interfaces, generics, and different relationship types:</w:t>
-      </w:r>
-    </w:p>
-    <w:p>
-      <w:pPr>
-        <w:pStyle w:val="Normal"/>
-        <w:jc w:val="center"/>
-      </w:pPr>
-      <w:r>
         <w:drawing>
           <wp:inline xmlns:wp="http://schemas.openxmlformats.org/drawingml/2006/wordprocessingDrawing" distT="0" distB="0" distL="0" distR="0">
-            <wp:extent cx="2943225" cy="1333500"/>
+            <wp:extent cx="5220000" cy="4629198"/>
             <wp:effectExtent l="0" t="0" r="0" b="0"/>
-            <wp:docPr id="31" name="Mermaid diagram 31" descr="Mermaid diagram"/>
+            <wp:docPr id="36" name="Mermaid diagram 36" descr="Mermaid diagram"/>
             <wp:cNvGraphicFramePr>
               <a:graphicFrameLocks xmlns:a="http://schemas.openxmlformats.org/drawingml/2006/main" noChangeAspect="1"/>
             </wp:cNvGraphicFramePr>
@@ -3933,7 +4083,260 @@
                     <pic:cNvPicPr/>
                   </pic:nvPicPr>
                   <pic:blipFill>
-                    <a:blip xmlns:r="http://schemas.openxmlformats.org/officeDocument/2006/relationships" r:embed="R1b404dcaa8a145f9"/>
+                    <a:blip xmlns:r="http://schemas.openxmlformats.org/officeDocument/2006/relationships" r:embed="Rac75d5c5fe984fc3"/>
+                    <a:stretch>
+                      <a:fillRect/>
+                    </a:stretch>
+                  </pic:blipFill>
+                  <pic:spPr>
+                    <a:xfrm>
+                      <a:off x="0" y="0"/>
+                      <a:ext cx="5220000" cy="4629198"/>
+                    </a:xfrm>
+                    <a:prstGeom prst="rect">
+                      <a:avLst/>
+                    </a:prstGeom>
+                  </pic:spPr>
+                </pic:pic>
+              </a:graphicData>
+            </a:graphic>
+          </wp:inline>
+        </w:drawing>
+      </w:r>
+    </w:p>
+    <w:p>
+      <w:pPr>
+        <w:pStyle w:val="Normal"/>
+      </w:pPr>
+      <w:r>
+        <w:t xml:space="preserve">Sequence diagram: notes + autonumber (exercise text placement):</w:t>
+      </w:r>
+    </w:p>
+    <w:p>
+      <w:pPr>
+        <w:pStyle w:val="Normal"/>
+      </w:pPr>
+      <w:r>
+        <w:t xml:space="preserve">sequenceDiagram</w:t>
+      </w:r>
+      <w:r>
+        <w:br/>
+      </w:r>
+      <w:r>
+        <w:t xml:space="preserve">autonumber</w:t>
+      </w:r>
+      <w:r>
+        <w:br/>
+      </w:r>
+      <w:r>
+        <w:t xml:space="preserve">participant User</w:t>
+      </w:r>
+      <w:r>
+        <w:br/>
+      </w:r>
+      <w:r>
+        <w:t xml:space="preserve">participant Converter</w:t>
+      </w:r>
+      <w:r>
+        <w:br/>
+      </w:r>
+      <w:r>
+        <w:t xml:space="preserve">participant Naiad</w:t>
+      </w:r>
+      <w:r>
+        <w:br/>
+      </w:r>
+      <w:r>
+        <w:t xml:space="preserve">Note over User,Converter: DOCX path uses Naiad (C#), preview uses Mermaid.js</w:t>
+      </w:r>
+      <w:r>
+        <w:br/>
+      </w:r>
+      <w:r>
+        <w:t xml:space="preserve">User-&gt;&gt;Converter: Open Markdown</w:t>
+      </w:r>
+      <w:r>
+        <w:br/>
+      </w:r>
+      <w:r>
+        <w:t xml:space="preserve">Converter-&gt;&gt;Naiad: Render Mermaid source</w:t>
+      </w:r>
+      <w:r>
+        <w:br/>
+      </w:r>
+      <w:r>
+        <w:t xml:space="preserve">Naiad--&gt;&gt;Converter: SVG</w:t>
+      </w:r>
+      <w:r>
+        <w:br/>
+      </w:r>
+      <w:r>
+        <w:t xml:space="preserve">Converter--&gt;&gt;User: DOCX with diagram</w:t>
+      </w:r>
+    </w:p>
+    <w:p>
+      <w:pPr>
+        <w:pStyle w:val="Normal"/>
+      </w:pPr>
+      <w:r>
+        <w:t xml:space="preserve">Requirement diagram: multiple requirements + relationship:</w:t>
+      </w:r>
+    </w:p>
+    <w:p>
+      <w:pPr>
+        <w:pStyle w:val="Normal"/>
+        <w:jc w:val="center"/>
+      </w:pPr>
+      <w:r>
+        <w:rPr>
+          <w:b/>
+        </w:rPr>
+        <w:t xml:space="preserve">[Mermaid diagram not rendered] </w:t>
+      </w:r>
+      <w:r>
+        <w:t xml:space="preserve">Mermaid render failed: Failed to parse requirement diagram: Parse error.
+    unexpected }
+    expected end of input, "element", "-", "%%", "
+", or "
+"
+    at line 7, col 5</w:t>
+      </w:r>
+      <w:r>
+        <w:br/>
+      </w:r>
+      <w:r>
+        <w:rPr>
+          <w:rFonts w:ascii="Consolas" w:hAnsi="Consolas"/>
+          <w:noProof/>
+        </w:rPr>
+        <w:t xml:space="preserve">requirementDiagram</w:t>
+        <w:br/>
+        <w:t xml:space="preserve">    requirement render_mermaid {</w:t>
+        <w:br/>
+        <w:t xml:space="preserve">        id: 1</w:t>
+        <w:br/>
+        <w:t xml:space="preserve">        text: Mermaid diagrams render as SVG in DOCX</w:t>
+        <w:br/>
+        <w:t xml:space="preserve">        risk: medium</w:t>
+        <w:br/>
+        <w:t xml:space="preserve">        verifymethod: test</w:t>
+        <w:br/>
+        <w:t xml:space="preserve">    }</w:t>
+        <w:br/>
+        <w:t xml:space="preserve">    requirement parity {</w:t>
+        <w:br/>
+        <w:t xml:space="preserve">        id: 2</w:t>
+        <w:br/>
+        <w:t xml:space="preserve">        text: Word output matches VS Code Mermaid preview defaults</w:t>
+        <w:br/>
+        <w:t xml:space="preserve">        risk: high</w:t>
+        <w:br/>
+        <w:t xml:space="preserve">        verifymethod: inspection</w:t>
+        <w:br/>
+        <w:t xml:space="preserve">    }</w:t>
+        <w:br/>
+        <w:t xml:space="preserve">    render_mermaid - satisfies -&gt; parity</w:t>
+      </w:r>
+    </w:p>
+    <w:p>
+      <w:pPr>
+        <w:pStyle w:val="Normal"/>
+      </w:pPr>
+      <w:r>
+        <w:t xml:space="preserve">State diagram v2: composite states + forks/joins + notes:</w:t>
+      </w:r>
+    </w:p>
+    <w:p>
+      <w:pPr>
+        <w:pStyle w:val="Normal"/>
+        <w:jc w:val="center"/>
+      </w:pPr>
+      <w:r>
+        <w:rPr>
+          <w:b/>
+        </w:rPr>
+        <w:t xml:space="preserve">[Mermaid diagram not rendered] </w:t>
+      </w:r>
+      <w:r>
+        <w:t xml:space="preserve">Mermaid render failed: Failed to parse state diagram: Parse error.
+    unexpected n
+    expected "%%", "
+", or "
+"
+    at line 3, col 5</w:t>
+      </w:r>
+      <w:r>
+        <w:br/>
+      </w:r>
+      <w:r>
+        <w:rPr>
+          <w:rFonts w:ascii="Consolas" w:hAnsi="Consolas"/>
+          <w:noProof/>
+        </w:rPr>
+        <w:t xml:space="preserve">stateDiagram-v2</w:t>
+        <w:br/>
+        <w:t xml:space="preserve">    [*] --&gt; Idle</w:t>
+        <w:br/>
+        <w:t xml:space="preserve">    note right of Idle</w:t>
+        <w:br/>
+        <w:t xml:space="preserve">      Waiting for input</w:t>
+        <w:br/>
+        <w:t xml:space="preserve">    end note</w:t>
+        <w:br/>
+        <w:t xml:space="preserve"/>
+        <w:br/>
+        <w:t xml:space="preserve">    Idle --&gt; Active</w:t>
+        <w:br/>
+        <w:t xml:space="preserve"/>
+        <w:br/>
+        <w:t xml:space="preserve">    state Active {</w:t>
+        <w:br/>
+        <w:t xml:space="preserve">        [*] --&gt; Step1</w:t>
+        <w:br/>
+        <w:t xml:space="preserve">        Step1 --&gt; Step2</w:t>
+        <w:br/>
+        <w:t xml:space="preserve">        Step2 --&gt; [*]</w:t>
+        <w:br/>
+        <w:t xml:space="preserve">    }</w:t>
+        <w:br/>
+        <w:t xml:space="preserve"/>
+        <w:br/>
+        <w:t xml:space="preserve">    Active --&gt; Done</w:t>
+        <w:br/>
+        <w:t xml:space="preserve">    Done --&gt; [*]</w:t>
+      </w:r>
+    </w:p>
+    <w:p>
+      <w:pPr>
+        <w:pStyle w:val="Normal"/>
+      </w:pPr>
+      <w:r>
+        <w:t xml:space="preserve">Class diagram: interfaces, generics, and different relationship types:</w:t>
+      </w:r>
+    </w:p>
+    <w:p>
+      <w:pPr>
+        <w:pStyle w:val="Normal"/>
+        <w:jc w:val="center"/>
+      </w:pPr>
+      <w:r>
+        <w:drawing>
+          <wp:inline xmlns:wp="http://schemas.openxmlformats.org/drawingml/2006/wordprocessingDrawing" distT="0" distB="0" distL="0" distR="0">
+            <wp:extent cx="2943225" cy="1333500"/>
+            <wp:effectExtent l="0" t="0" r="0" b="0"/>
+            <wp:docPr id="37" name="Mermaid diagram 37" descr="Mermaid diagram"/>
+            <wp:cNvGraphicFramePr>
+              <a:graphicFrameLocks xmlns:a="http://schemas.openxmlformats.org/drawingml/2006/main" noChangeAspect="1"/>
+            </wp:cNvGraphicFramePr>
+            <a:graphic xmlns:a="http://schemas.openxmlformats.org/drawingml/2006/main">
+              <a:graphicData uri="http://schemas.openxmlformats.org/drawingml/2006/picture">
+                <pic:pic xmlns:pic="http://schemas.openxmlformats.org/drawingml/2006/picture">
+                  <pic:nvPicPr>
+                    <pic:cNvPr id="0" name="Mermaid diagram.svg" descr="Mermaid diagram"/>
+                    <pic:cNvPicPr/>
+                  </pic:nvPicPr>
+                  <pic:blipFill>
+                    <a:blip xmlns:r="http://schemas.openxmlformats.org/officeDocument/2006/relationships" r:embed="Rabf7becbba81457e"/>
                     <a:stretch>
                       <a:fillRect/>
                     </a:stretch>
@@ -4113,7 +4516,7 @@
           <wp:inline xmlns:wp="http://schemas.openxmlformats.org/drawingml/2006/wordprocessingDrawing" distT="0" distB="0" distL="0" distR="0">
             <wp:extent cx="3810000" cy="952500"/>
             <wp:effectExtent l="0" t="0" r="0" b="0"/>
-            <wp:docPr id="32" name="Mermaid diagram 32" descr="Mermaid diagram"/>
+            <wp:docPr id="38" name="Mermaid diagram 38" descr="Mermaid diagram"/>
             <wp:cNvGraphicFramePr>
               <a:graphicFrameLocks xmlns:a="http://schemas.openxmlformats.org/drawingml/2006/main" noChangeAspect="1"/>
             </wp:cNvGraphicFramePr>
@@ -4125,7 +4528,7 @@
                     <pic:cNvPicPr/>
                   </pic:nvPicPr>
                   <pic:blipFill>
-                    <a:blip xmlns:r="http://schemas.openxmlformats.org/officeDocument/2006/relationships" r:embed="Rd29502df9a1d4a53"/>
+                    <a:blip xmlns:r="http://schemas.openxmlformats.org/officeDocument/2006/relationships" r:embed="R30251a9601364f1b"/>
                     <a:stretch>
                       <a:fillRect/>
                     </a:stretch>
@@ -4164,7 +4567,7 @@
           <wp:inline xmlns:wp="http://schemas.openxmlformats.org/drawingml/2006/wordprocessingDrawing" distT="0" distB="0" distL="0" distR="0">
             <wp:extent cx="3810000" cy="4000500"/>
             <wp:effectExtent l="0" t="0" r="0" b="0"/>
-            <wp:docPr id="33" name="Mermaid diagram 33" descr="Mermaid diagram"/>
+            <wp:docPr id="39" name="Mermaid diagram 39" descr="Mermaid diagram"/>
             <wp:cNvGraphicFramePr>
               <a:graphicFrameLocks xmlns:a="http://schemas.openxmlformats.org/drawingml/2006/main" noChangeAspect="1"/>
             </wp:cNvGraphicFramePr>
@@ -4176,7 +4579,7 @@
                     <pic:cNvPicPr/>
                   </pic:nvPicPr>
                   <pic:blipFill>
-                    <a:blip xmlns:r="http://schemas.openxmlformats.org/officeDocument/2006/relationships" r:embed="R435ba3252f864562"/>
+                    <a:blip xmlns:r="http://schemas.openxmlformats.org/officeDocument/2006/relationships" r:embed="Rfb5dd89d37f44af7"/>
                     <a:stretch>
                       <a:fillRect/>
                     </a:stretch>
@@ -4215,7 +4618,7 @@
           <wp:inline xmlns:wp="http://schemas.openxmlformats.org/drawingml/2006/wordprocessingDrawing" distT="0" distB="0" distL="0" distR="0">
             <wp:extent cx="5220000" cy="1888085"/>
             <wp:effectExtent l="0" t="0" r="0" b="0"/>
-            <wp:docPr id="34" name="Mermaid diagram 34" descr="Mermaid diagram"/>
+            <wp:docPr id="40" name="Mermaid diagram 40" descr="Mermaid diagram"/>
             <wp:cNvGraphicFramePr>
               <a:graphicFrameLocks xmlns:a="http://schemas.openxmlformats.org/drawingml/2006/main" noChangeAspect="1"/>
             </wp:cNvGraphicFramePr>
@@ -4227,7 +4630,7 @@
                     <pic:cNvPicPr/>
                   </pic:nvPicPr>
                   <pic:blipFill>
-                    <a:blip xmlns:r="http://schemas.openxmlformats.org/officeDocument/2006/relationships" r:embed="Rf77274e0dd834f17"/>
+                    <a:blip xmlns:r="http://schemas.openxmlformats.org/officeDocument/2006/relationships" r:embed="Reebaa433314c4dae"/>
                     <a:stretch>
                       <a:fillRect/>
                     </a:stretch>
@@ -4266,7 +4669,7 @@
           <wp:inline xmlns:wp="http://schemas.openxmlformats.org/drawingml/2006/wordprocessingDrawing" distT="0" distB="0" distL="0" distR="0">
             <wp:extent cx="5220000" cy="767647"/>
             <wp:effectExtent l="0" t="0" r="0" b="0"/>
-            <wp:docPr id="35" name="Mermaid diagram 35" descr="Mermaid diagram"/>
+            <wp:docPr id="41" name="Mermaid diagram 41" descr="Mermaid diagram"/>
             <wp:cNvGraphicFramePr>
               <a:graphicFrameLocks xmlns:a="http://schemas.openxmlformats.org/drawingml/2006/main" noChangeAspect="1"/>
             </wp:cNvGraphicFramePr>
@@ -4278,7 +4681,7 @@
                     <pic:cNvPicPr/>
                   </pic:nvPicPr>
                   <pic:blipFill>
-                    <a:blip xmlns:r="http://schemas.openxmlformats.org/officeDocument/2006/relationships" r:embed="R567c904b9ba946e2"/>
+                    <a:blip xmlns:r="http://schemas.openxmlformats.org/officeDocument/2006/relationships" r:embed="Rf061076278d44465"/>
                     <a:stretch>
                       <a:fillRect/>
                     </a:stretch>
@@ -4645,7 +5048,7 @@
           <wp:inline xmlns:wp="http://schemas.openxmlformats.org/drawingml/2006/wordprocessingDrawing" distT="0" distB="0" distL="0" distR="0">
             <wp:extent cx="4457700" cy="5581650"/>
             <wp:effectExtent l="0" t="0" r="0" b="0"/>
-            <wp:docPr id="36" name="Mermaid diagram 36" descr="Mermaid diagram"/>
+            <wp:docPr id="42" name="Mermaid diagram 42" descr="Mermaid diagram"/>
             <wp:cNvGraphicFramePr>
               <a:graphicFrameLocks xmlns:a="http://schemas.openxmlformats.org/drawingml/2006/main" noChangeAspect="1"/>
             </wp:cNvGraphicFramePr>
@@ -4657,7 +5060,7 @@
                     <pic:cNvPicPr/>
                   </pic:nvPicPr>
                   <pic:blipFill>
-                    <a:blip xmlns:r="http://schemas.openxmlformats.org/officeDocument/2006/relationships" r:embed="R0dfcf5ba8c374eaa"/>
+                    <a:blip xmlns:r="http://schemas.openxmlformats.org/officeDocument/2006/relationships" r:embed="R21d459f540d34911"/>
                     <a:stretch>
                       <a:fillRect/>
                     </a:stretch>
@@ -5338,7 +5741,7 @@
             <w:r>
               <w:t xml:space="preserve">Cell with </w:t>
             </w:r>
-            <w:hyperlink xmlns:r="http://schemas.openxmlformats.org/officeDocument/2006/relationships" w:history="true" r:id="R2ed0ca383b1d460a">
+            <w:hyperlink xmlns:r="http://schemas.openxmlformats.org/officeDocument/2006/relationships" w:history="true" r:id="R91aade6f95404af9">
               <w:r>
                 <w:rPr>
                   <w:rStyle w:val="Hyperlink"/>
@@ -5612,7 +6015,7 @@
                 <wp:inline xmlns:wp="http://schemas.openxmlformats.org/drawingml/2006/wordprocessingDrawing" distT="0" distB="0" distL="0" distR="0">
                   <wp:extent cx="1485900" cy="1409700"/>
                   <wp:effectExtent l="0" t="0" r="0" b="0"/>
-                  <wp:docPr id="37" name="Picture 37" descr="Company logo"/>
+                  <wp:docPr id="43" name="Picture 43" descr="Company logo"/>
                   <wp:cNvGraphicFramePr>
                     <a:graphicFrameLocks xmlns:a="http://schemas.openxmlformats.org/drawingml/2006/main" noChangeAspect="1"/>
                   </wp:cNvGraphicFramePr>
@@ -5624,7 +6027,7 @@
                           <pic:cNvPicPr/>
                         </pic:nvPicPr>
                         <pic:blipFill>
-                          <a:blip xmlns:r="http://schemas.openxmlformats.org/officeDocument/2006/relationships" r:embed="R90eaeae0593f4ef6"/>
+                          <a:blip xmlns:r="http://schemas.openxmlformats.org/officeDocument/2006/relationships" r:embed="R4eb3c9dfc80d48ed"/>
                           <a:stretch>
                             <a:fillRect/>
                           </a:stretch>
@@ -5712,7 +6115,7 @@
           <wp:inline xmlns:wp="http://schemas.openxmlformats.org/drawingml/2006/wordprocessingDrawing" distT="0" distB="0" distL="0" distR="0">
             <wp:extent cx="1485900" cy="1409700"/>
             <wp:effectExtent l="0" t="0" r="0" b="0"/>
-            <wp:docPr id="38" name="Picture 38" descr="Company logo"/>
+            <wp:docPr id="44" name="Picture 44" descr="Company logo"/>
             <wp:cNvGraphicFramePr>
               <a:graphicFrameLocks xmlns:a="http://schemas.openxmlformats.org/drawingml/2006/main" noChangeAspect="1"/>
             </wp:cNvGraphicFramePr>
@@ -5724,7 +6127,7 @@
                     <pic:cNvPicPr/>
                   </pic:nvPicPr>
                   <pic:blipFill>
-                    <a:blip xmlns:r="http://schemas.openxmlformats.org/officeDocument/2006/relationships" r:embed="Rf3a920b0141a43d0"/>
+                    <a:blip xmlns:r="http://schemas.openxmlformats.org/officeDocument/2006/relationships" r:embed="R410587569aa04814"/>
                     <a:stretch>
                       <a:fillRect/>
                     </a:stretch>
@@ -5762,7 +6165,7 @@
           <wp:inline xmlns:wp="http://schemas.openxmlformats.org/drawingml/2006/wordprocessingDrawing" distT="0" distB="0" distL="0" distR="0">
             <wp:extent cx="1485900" cy="1409700"/>
             <wp:effectExtent l="0" t="0" r="0" b="0"/>
-            <wp:docPr id="39" name="Picture 39" descr="Company logo with title"/>
+            <wp:docPr id="45" name="Picture 45" descr="Company logo with title"/>
             <wp:cNvGraphicFramePr>
               <a:graphicFrameLocks xmlns:a="http://schemas.openxmlformats.org/drawingml/2006/main" noChangeAspect="1"/>
             </wp:cNvGraphicFramePr>
@@ -5774,7 +6177,7 @@
                     <pic:cNvPicPr/>
                   </pic:nvPicPr>
                   <pic:blipFill>
-                    <a:blip xmlns:r="http://schemas.openxmlformats.org/officeDocument/2006/relationships" r:embed="Rd9d7fbbbe11a4c11"/>
+                    <a:blip xmlns:r="http://schemas.openxmlformats.org/officeDocument/2006/relationships" r:embed="Rac05cb49871e433a"/>
                     <a:stretch>
                       <a:fillRect/>
                     </a:stretch>
@@ -5812,7 +6215,7 @@
           <wp:inline xmlns:wp="http://schemas.openxmlformats.org/drawingml/2006/wordprocessingDrawing" distT="0" distB="0" distL="0" distR="0">
             <wp:extent cx="1485900" cy="1409700"/>
             <wp:effectExtent l="0" t="0" r="0" b="0"/>
-            <wp:docPr id="40" name="Picture 40" descr="Reference logo"/>
+            <wp:docPr id="46" name="Picture 46" descr="Reference logo"/>
             <wp:cNvGraphicFramePr>
               <a:graphicFrameLocks xmlns:a="http://schemas.openxmlformats.org/drawingml/2006/main" noChangeAspect="1"/>
             </wp:cNvGraphicFramePr>
@@ -5824,7 +6227,7 @@
                     <pic:cNvPicPr/>
                   </pic:nvPicPr>
                   <pic:blipFill>
-                    <a:blip xmlns:r="http://schemas.openxmlformats.org/officeDocument/2006/relationships" r:embed="R922e1a6c77b544fb"/>
+                    <a:blip xmlns:r="http://schemas.openxmlformats.org/officeDocument/2006/relationships" r:embed="R21295e9a56c04c71"/>
                     <a:stretch>
                       <a:fillRect/>
                     </a:stretch>
@@ -6020,7 +6423,7 @@
         <w:pStyle w:val="IntenseQuote"/>
         <w:numPr>
           <w:ilvl w:val="0"/>
-          <w:numId w:val="30"/>
+          <w:numId w:val="31"/>
         </w:numPr>
       </w:pPr>
       <w:r>
@@ -6028,29 +6431,6 @@
       </w:r>
       <w:r>
         <w:t xml:space="preserve"> Quoted unchecked task</w:t>
-      </w:r>
-    </w:p>
-    <w:p>
-      <w:pPr>
-        <w:pStyle w:val="IntenseQuote"/>
-        <w:numPr>
-          <w:ilvl w:val="0"/>
-          <w:numId w:val="30"/>
-        </w:numPr>
-      </w:pPr>
-      <w:r>
-        <w:t xml:space="preserve">[x]</w:t>
-      </w:r>
-      <w:r>
-        <w:t xml:space="preserve"> Quoted checked task</w:t>
-      </w:r>
-    </w:p>
-    <w:p>
-      <w:pPr>
-        <w:pStyle w:val="Normal"/>
-      </w:pPr>
-      <w:r>
-        <w:t xml:space="preserve">Blockquote containing nested ordered content:</w:t>
       </w:r>
     </w:p>
     <w:p>
@@ -6062,19 +6442,18 @@
         </w:numPr>
       </w:pPr>
       <w:r>
-        <w:t xml:space="preserve">First quoted step</w:t>
-      </w:r>
-    </w:p>
-    <w:p>
-      <w:pPr>
-        <w:pStyle w:val="Normal"/>
-        <w:numPr>
-          <w:ilvl w:val="1"/>
-          <w:numId w:val="32"/>
-        </w:numPr>
-      </w:pPr>
-      <w:r>
-        <w:t xml:space="preserve">Sub bullet in quote</w:t>
+        <w:t xml:space="preserve">[x]</w:t>
+      </w:r>
+      <w:r>
+        <w:t xml:space="preserve"> Quoted checked task</w:t>
+      </w:r>
+    </w:p>
+    <w:p>
+      <w:pPr>
+        <w:pStyle w:val="Normal"/>
+      </w:pPr>
+      <w:r>
+        <w:t xml:space="preserve">Blockquote containing nested ordered content:</w:t>
       </w:r>
     </w:p>
     <w:p>
@@ -6082,27 +6461,51 @@
         <w:pStyle w:val="IntenseQuote"/>
         <w:numPr>
           <w:ilvl w:val="0"/>
-          <w:numId w:val="31"/>
+          <w:numId w:val="32"/>
         </w:numPr>
       </w:pPr>
       <w:r>
-        <w:t xml:space="preserve">Second quoted step</w:t>
-      </w:r>
-    </w:p>
-    <w:p>
-      <w:pPr>
-        <w:pStyle w:val="Normal"/>
-      </w:pPr>
-      <w:r>
-        <w:t xml:space="preserve">Ordered item with continuation and nested bullet:</w:t>
-      </w:r>
-    </w:p>
-    <w:p>
-      <w:pPr>
-        <w:pStyle w:val="Normal"/>
+        <w:t xml:space="preserve">First quoted step</w:t>
+      </w:r>
+    </w:p>
+    <w:p>
+      <w:pPr>
+        <w:pStyle w:val="Normal"/>
+        <w:numPr>
+          <w:ilvl w:val="1"/>
+          <w:numId w:val="33"/>
+        </w:numPr>
+      </w:pPr>
+      <w:r>
+        <w:t xml:space="preserve">Sub bullet in quote</w:t>
+      </w:r>
+    </w:p>
+    <w:p>
+      <w:pPr>
+        <w:pStyle w:val="IntenseQuote"/>
         <w:numPr>
           <w:ilvl w:val="0"/>
-          <w:numId w:val="33"/>
+          <w:numId w:val="32"/>
+        </w:numPr>
+      </w:pPr>
+      <w:r>
+        <w:t xml:space="preserve">Second quoted step</w:t>
+      </w:r>
+    </w:p>
+    <w:p>
+      <w:pPr>
+        <w:pStyle w:val="Normal"/>
+      </w:pPr>
+      <w:r>
+        <w:t xml:space="preserve">Ordered item with continuation and nested bullet:</w:t>
+      </w:r>
+    </w:p>
+    <w:p>
+      <w:pPr>
+        <w:pStyle w:val="Normal"/>
+        <w:numPr>
+          <w:ilvl w:val="0"/>
+          <w:numId w:val="34"/>
         </w:numPr>
       </w:pPr>
       <w:r>
@@ -6123,7 +6526,7 @@
         <w:pStyle w:val="Normal"/>
         <w:numPr>
           <w:ilvl w:val="1"/>
-          <w:numId w:val="34"/>
+          <w:numId w:val="35"/>
         </w:numPr>
       </w:pPr>
       <w:r>
@@ -6135,7 +6538,7 @@
         <w:pStyle w:val="Normal"/>
         <w:numPr>
           <w:ilvl w:val="0"/>
-          <w:numId w:val="33"/>
+          <w:numId w:val="34"/>
         </w:numPr>
       </w:pPr>
       <w:r>
@@ -9160,75 +9563,102 @@
     <w:tmpl w:val="0000101F"/>
     <w:lvl w:ilvl="0">
       <w:start w:val="1"/>
-      <w:numFmt w:val="decimal"/>
-      <w:lvlText w:val="%1."/>
+      <w:numFmt w:val="bullet"/>
+      <w:lvlText w:val=""/>
       <w:pPr>
         <w:ind w:left="720" w:hanging="360"/>
       </w:pPr>
+      <w:rPr>
+        <w:rFonts w:ascii="Symbol" w:hAnsi="Symbol"/>
+      </w:rPr>
     </w:lvl>
     <w:lvl w:ilvl="1">
       <w:start w:val="1"/>
-      <w:numFmt w:val="decimal"/>
-      <w:lvlText w:val="%2."/>
+      <w:numFmt w:val="bullet"/>
+      <w:lvlText w:val=""/>
       <w:pPr>
         <w:ind w:left="1080" w:hanging="360"/>
       </w:pPr>
+      <w:rPr>
+        <w:rFonts w:ascii="Symbol" w:hAnsi="Symbol"/>
+      </w:rPr>
     </w:lvl>
     <w:lvl w:ilvl="2">
       <w:start w:val="1"/>
-      <w:numFmt w:val="decimal"/>
-      <w:lvlText w:val="%3."/>
+      <w:numFmt w:val="bullet"/>
+      <w:lvlText w:val=""/>
       <w:pPr>
         <w:ind w:left="1440" w:hanging="360"/>
       </w:pPr>
+      <w:rPr>
+        <w:rFonts w:ascii="Symbol" w:hAnsi="Symbol"/>
+      </w:rPr>
     </w:lvl>
     <w:lvl w:ilvl="3">
       <w:start w:val="1"/>
-      <w:numFmt w:val="decimal"/>
-      <w:lvlText w:val="%4."/>
+      <w:numFmt w:val="bullet"/>
+      <w:lvlText w:val=""/>
       <w:pPr>
         <w:ind w:left="1800" w:hanging="360"/>
       </w:pPr>
+      <w:rPr>
+        <w:rFonts w:ascii="Symbol" w:hAnsi="Symbol"/>
+      </w:rPr>
     </w:lvl>
     <w:lvl w:ilvl="4">
       <w:start w:val="1"/>
-      <w:numFmt w:val="decimal"/>
-      <w:lvlText w:val="%5."/>
+      <w:numFmt w:val="bullet"/>
+      <w:lvlText w:val=""/>
       <w:pPr>
         <w:ind w:left="2160" w:hanging="360"/>
       </w:pPr>
+      <w:rPr>
+        <w:rFonts w:ascii="Symbol" w:hAnsi="Symbol"/>
+      </w:rPr>
     </w:lvl>
     <w:lvl w:ilvl="5">
       <w:start w:val="1"/>
-      <w:numFmt w:val="decimal"/>
-      <w:lvlText w:val="%6."/>
+      <w:numFmt w:val="bullet"/>
+      <w:lvlText w:val=""/>
       <w:pPr>
         <w:ind w:left="2520" w:hanging="360"/>
       </w:pPr>
+      <w:rPr>
+        <w:rFonts w:ascii="Symbol" w:hAnsi="Symbol"/>
+      </w:rPr>
     </w:lvl>
     <w:lvl w:ilvl="6">
       <w:start w:val="1"/>
-      <w:numFmt w:val="decimal"/>
-      <w:lvlText w:val="%7."/>
+      <w:numFmt w:val="bullet"/>
+      <w:lvlText w:val=""/>
       <w:pPr>
         <w:ind w:left="2880" w:hanging="360"/>
       </w:pPr>
+      <w:rPr>
+        <w:rFonts w:ascii="Symbol" w:hAnsi="Symbol"/>
+      </w:rPr>
     </w:lvl>
     <w:lvl w:ilvl="7">
       <w:start w:val="1"/>
-      <w:numFmt w:val="decimal"/>
-      <w:lvlText w:val="%8."/>
+      <w:numFmt w:val="bullet"/>
+      <w:lvlText w:val=""/>
       <w:pPr>
         <w:ind w:left="3240" w:hanging="360"/>
       </w:pPr>
+      <w:rPr>
+        <w:rFonts w:ascii="Symbol" w:hAnsi="Symbol"/>
+      </w:rPr>
     </w:lvl>
     <w:lvl w:ilvl="8">
       <w:start w:val="1"/>
-      <w:numFmt w:val="decimal"/>
-      <w:lvlText w:val="%9."/>
+      <w:numFmt w:val="bullet"/>
+      <w:lvlText w:val=""/>
       <w:pPr>
         <w:ind w:left="3600" w:hanging="360"/>
       </w:pPr>
+      <w:rPr>
+        <w:rFonts w:ascii="Symbol" w:hAnsi="Symbol"/>
+      </w:rPr>
     </w:lvl>
   </w:abstractNum>
   <w:abstractNum w:abstractNumId="32">
@@ -9237,102 +9667,75 @@
     <w:tmpl w:val="00001020"/>
     <w:lvl w:ilvl="0">
       <w:start w:val="1"/>
-      <w:numFmt w:val="bullet"/>
-      <w:lvlText w:val=""/>
+      <w:numFmt w:val="decimal"/>
+      <w:lvlText w:val="%1."/>
       <w:pPr>
         <w:ind w:left="720" w:hanging="360"/>
       </w:pPr>
-      <w:rPr>
-        <w:rFonts w:ascii="Symbol" w:hAnsi="Symbol"/>
-      </w:rPr>
     </w:lvl>
     <w:lvl w:ilvl="1">
       <w:start w:val="1"/>
-      <w:numFmt w:val="bullet"/>
-      <w:lvlText w:val=""/>
+      <w:numFmt w:val="decimal"/>
+      <w:lvlText w:val="%2."/>
       <w:pPr>
         <w:ind w:left="1080" w:hanging="360"/>
       </w:pPr>
-      <w:rPr>
-        <w:rFonts w:ascii="Symbol" w:hAnsi="Symbol"/>
-      </w:rPr>
     </w:lvl>
     <w:lvl w:ilvl="2">
       <w:start w:val="1"/>
-      <w:numFmt w:val="bullet"/>
-      <w:lvlText w:val=""/>
+      <w:numFmt w:val="decimal"/>
+      <w:lvlText w:val="%3."/>
       <w:pPr>
         <w:ind w:left="1440" w:hanging="360"/>
       </w:pPr>
-      <w:rPr>
-        <w:rFonts w:ascii="Symbol" w:hAnsi="Symbol"/>
-      </w:rPr>
     </w:lvl>
     <w:lvl w:ilvl="3">
       <w:start w:val="1"/>
-      <w:numFmt w:val="bullet"/>
-      <w:lvlText w:val=""/>
+      <w:numFmt w:val="decimal"/>
+      <w:lvlText w:val="%4."/>
       <w:pPr>
         <w:ind w:left="1800" w:hanging="360"/>
       </w:pPr>
-      <w:rPr>
-        <w:rFonts w:ascii="Symbol" w:hAnsi="Symbol"/>
-      </w:rPr>
     </w:lvl>
     <w:lvl w:ilvl="4">
       <w:start w:val="1"/>
-      <w:numFmt w:val="bullet"/>
-      <w:lvlText w:val=""/>
+      <w:numFmt w:val="decimal"/>
+      <w:lvlText w:val="%5."/>
       <w:pPr>
         <w:ind w:left="2160" w:hanging="360"/>
       </w:pPr>
-      <w:rPr>
-        <w:rFonts w:ascii="Symbol" w:hAnsi="Symbol"/>
-      </w:rPr>
     </w:lvl>
     <w:lvl w:ilvl="5">
       <w:start w:val="1"/>
-      <w:numFmt w:val="bullet"/>
-      <w:lvlText w:val=""/>
+      <w:numFmt w:val="decimal"/>
+      <w:lvlText w:val="%6."/>
       <w:pPr>
         <w:ind w:left="2520" w:hanging="360"/>
       </w:pPr>
-      <w:rPr>
-        <w:rFonts w:ascii="Symbol" w:hAnsi="Symbol"/>
-      </w:rPr>
     </w:lvl>
     <w:lvl w:ilvl="6">
       <w:start w:val="1"/>
-      <w:numFmt w:val="bullet"/>
-      <w:lvlText w:val=""/>
+      <w:numFmt w:val="decimal"/>
+      <w:lvlText w:val="%7."/>
       <w:pPr>
         <w:ind w:left="2880" w:hanging="360"/>
       </w:pPr>
-      <w:rPr>
-        <w:rFonts w:ascii="Symbol" w:hAnsi="Symbol"/>
-      </w:rPr>
     </w:lvl>
     <w:lvl w:ilvl="7">
       <w:start w:val="1"/>
-      <w:numFmt w:val="bullet"/>
-      <w:lvlText w:val=""/>
+      <w:numFmt w:val="decimal"/>
+      <w:lvlText w:val="%8."/>
       <w:pPr>
         <w:ind w:left="3240" w:hanging="360"/>
       </w:pPr>
-      <w:rPr>
-        <w:rFonts w:ascii="Symbol" w:hAnsi="Symbol"/>
-      </w:rPr>
     </w:lvl>
     <w:lvl w:ilvl="8">
       <w:start w:val="1"/>
-      <w:numFmt w:val="bullet"/>
-      <w:lvlText w:val=""/>
+      <w:numFmt w:val="decimal"/>
+      <w:lvlText w:val="%9."/>
       <w:pPr>
         <w:ind w:left="3600" w:hanging="360"/>
       </w:pPr>
-      <w:rPr>
-        <w:rFonts w:ascii="Symbol" w:hAnsi="Symbol"/>
-      </w:rPr>
     </w:lvl>
   </w:abstractNum>
   <w:abstractNum w:abstractNumId="33">
@@ -9341,81 +9744,185 @@
     <w:tmpl w:val="00001021"/>
     <w:lvl w:ilvl="0">
       <w:start w:val="1"/>
-      <w:numFmt w:val="decimal"/>
-      <w:lvlText w:val="%1."/>
+      <w:numFmt w:val="bullet"/>
+      <w:lvlText w:val=""/>
       <w:pPr>
         <w:ind w:left="720" w:hanging="360"/>
       </w:pPr>
+      <w:rPr>
+        <w:rFonts w:ascii="Symbol" w:hAnsi="Symbol"/>
+      </w:rPr>
     </w:lvl>
     <w:lvl w:ilvl="1">
       <w:start w:val="1"/>
-      <w:numFmt w:val="decimal"/>
-      <w:lvlText w:val="%2."/>
+      <w:numFmt w:val="bullet"/>
+      <w:lvlText w:val=""/>
       <w:pPr>
         <w:ind w:left="1080" w:hanging="360"/>
       </w:pPr>
+      <w:rPr>
+        <w:rFonts w:ascii="Symbol" w:hAnsi="Symbol"/>
+      </w:rPr>
     </w:lvl>
     <w:lvl w:ilvl="2">
       <w:start w:val="1"/>
-      <w:numFmt w:val="decimal"/>
-      <w:lvlText w:val="%3."/>
+      <w:numFmt w:val="bullet"/>
+      <w:lvlText w:val=""/>
       <w:pPr>
         <w:ind w:left="1440" w:hanging="360"/>
       </w:pPr>
+      <w:rPr>
+        <w:rFonts w:ascii="Symbol" w:hAnsi="Symbol"/>
+      </w:rPr>
     </w:lvl>
     <w:lvl w:ilvl="3">
       <w:start w:val="1"/>
-      <w:numFmt w:val="decimal"/>
-      <w:lvlText w:val="%4."/>
+      <w:numFmt w:val="bullet"/>
+      <w:lvlText w:val=""/>
       <w:pPr>
         <w:ind w:left="1800" w:hanging="360"/>
       </w:pPr>
+      <w:rPr>
+        <w:rFonts w:ascii="Symbol" w:hAnsi="Symbol"/>
+      </w:rPr>
     </w:lvl>
     <w:lvl w:ilvl="4">
       <w:start w:val="1"/>
-      <w:numFmt w:val="decimal"/>
-      <w:lvlText w:val="%5."/>
+      <w:numFmt w:val="bullet"/>
+      <w:lvlText w:val=""/>
       <w:pPr>
         <w:ind w:left="2160" w:hanging="360"/>
       </w:pPr>
+      <w:rPr>
+        <w:rFonts w:ascii="Symbol" w:hAnsi="Symbol"/>
+      </w:rPr>
     </w:lvl>
     <w:lvl w:ilvl="5">
       <w:start w:val="1"/>
-      <w:numFmt w:val="decimal"/>
-      <w:lvlText w:val="%6."/>
+      <w:numFmt w:val="bullet"/>
+      <w:lvlText w:val=""/>
       <w:pPr>
         <w:ind w:left="2520" w:hanging="360"/>
       </w:pPr>
+      <w:rPr>
+        <w:rFonts w:ascii="Symbol" w:hAnsi="Symbol"/>
+      </w:rPr>
     </w:lvl>
     <w:lvl w:ilvl="6">
       <w:start w:val="1"/>
-      <w:numFmt w:val="decimal"/>
-      <w:lvlText w:val="%7."/>
+      <w:numFmt w:val="bullet"/>
+      <w:lvlText w:val=""/>
       <w:pPr>
         <w:ind w:left="2880" w:hanging="360"/>
       </w:pPr>
+      <w:rPr>
+        <w:rFonts w:ascii="Symbol" w:hAnsi="Symbol"/>
+      </w:rPr>
     </w:lvl>
     <w:lvl w:ilvl="7">
       <w:start w:val="1"/>
-      <w:numFmt w:val="decimal"/>
-      <w:lvlText w:val="%8."/>
+      <w:numFmt w:val="bullet"/>
+      <w:lvlText w:val=""/>
       <w:pPr>
         <w:ind w:left="3240" w:hanging="360"/>
       </w:pPr>
+      <w:rPr>
+        <w:rFonts w:ascii="Symbol" w:hAnsi="Symbol"/>
+      </w:rPr>
     </w:lvl>
     <w:lvl w:ilvl="8">
       <w:start w:val="1"/>
-      <w:numFmt w:val="decimal"/>
-      <w:lvlText w:val="%9."/>
+      <w:numFmt w:val="bullet"/>
+      <w:lvlText w:val=""/>
       <w:pPr>
         <w:ind w:left="3600" w:hanging="360"/>
       </w:pPr>
+      <w:rPr>
+        <w:rFonts w:ascii="Symbol" w:hAnsi="Symbol"/>
+      </w:rPr>
     </w:lvl>
   </w:abstractNum>
   <w:abstractNum w:abstractNumId="34">
     <w:nsid w:val="00000022"/>
     <w:multiLevelType w:val="multilevel"/>
     <w:tmpl w:val="00001022"/>
+    <w:lvl w:ilvl="0">
+      <w:start w:val="1"/>
+      <w:numFmt w:val="decimal"/>
+      <w:lvlText w:val="%1."/>
+      <w:pPr>
+        <w:ind w:left="720" w:hanging="360"/>
+      </w:pPr>
+    </w:lvl>
+    <w:lvl w:ilvl="1">
+      <w:start w:val="1"/>
+      <w:numFmt w:val="decimal"/>
+      <w:lvlText w:val="%2."/>
+      <w:pPr>
+        <w:ind w:left="1080" w:hanging="360"/>
+      </w:pPr>
+    </w:lvl>
+    <w:lvl w:ilvl="2">
+      <w:start w:val="1"/>
+      <w:numFmt w:val="decimal"/>
+      <w:lvlText w:val="%3."/>
+      <w:pPr>
+        <w:ind w:left="1440" w:hanging="360"/>
+      </w:pPr>
+    </w:lvl>
+    <w:lvl w:ilvl="3">
+      <w:start w:val="1"/>
+      <w:numFmt w:val="decimal"/>
+      <w:lvlText w:val="%4."/>
+      <w:pPr>
+        <w:ind w:left="1800" w:hanging="360"/>
+      </w:pPr>
+    </w:lvl>
+    <w:lvl w:ilvl="4">
+      <w:start w:val="1"/>
+      <w:numFmt w:val="decimal"/>
+      <w:lvlText w:val="%5."/>
+      <w:pPr>
+        <w:ind w:left="2160" w:hanging="360"/>
+      </w:pPr>
+    </w:lvl>
+    <w:lvl w:ilvl="5">
+      <w:start w:val="1"/>
+      <w:numFmt w:val="decimal"/>
+      <w:lvlText w:val="%6."/>
+      <w:pPr>
+        <w:ind w:left="2520" w:hanging="360"/>
+      </w:pPr>
+    </w:lvl>
+    <w:lvl w:ilvl="6">
+      <w:start w:val="1"/>
+      <w:numFmt w:val="decimal"/>
+      <w:lvlText w:val="%7."/>
+      <w:pPr>
+        <w:ind w:left="2880" w:hanging="360"/>
+      </w:pPr>
+    </w:lvl>
+    <w:lvl w:ilvl="7">
+      <w:start w:val="1"/>
+      <w:numFmt w:val="decimal"/>
+      <w:lvlText w:val="%8."/>
+      <w:pPr>
+        <w:ind w:left="3240" w:hanging="360"/>
+      </w:pPr>
+    </w:lvl>
+    <w:lvl w:ilvl="8">
+      <w:start w:val="1"/>
+      <w:numFmt w:val="decimal"/>
+      <w:lvlText w:val="%9."/>
+      <w:pPr>
+        <w:ind w:left="3600" w:hanging="360"/>
+      </w:pPr>
+    </w:lvl>
+  </w:abstractNum>
+  <w:abstractNum w:abstractNumId="35">
+    <w:nsid w:val="00000023"/>
+    <w:multiLevelType w:val="multilevel"/>
+    <w:tmpl w:val="00001023"/>
     <w:lvl w:ilvl="0">
       <w:start w:val="1"/>
       <w:numFmt w:val="bullet"/>
@@ -9617,6 +10124,9 @@
   </w:num>
   <w:num w:numId="34">
     <w:abstractNumId w:val="34"/>
+  </w:num>
+  <w:num w:numId="35">
+    <w:abstractNumId w:val="35"/>
   </w:num>
 </w:numbering>
 </file>

</xml_diff>

<commit_message>
fix(flowchart): ERD-like cubic for decision branches
- Render decision Yes/No outgoing links using a single cubic Bezier path (Word-first parity)
- Keep curveBasis for general flowchart edges
- Document the intentional divergence in Mermaid_Specification.md

Made-with: Cursor
</commit_message>
<xml_diff>
--- a/test.docx
+++ b/test.docx
@@ -236,7 +236,7 @@
       <w:r>
         <w:t xml:space="preserve">, and </w:t>
       </w:r>
-      <w:hyperlink xmlns:r="http://schemas.openxmlformats.org/officeDocument/2006/relationships" w:history="true" r:id="R8450d48ed3064f8c">
+      <w:hyperlink xmlns:r="http://schemas.openxmlformats.org/officeDocument/2006/relationships" w:history="true" r:id="R529c630f7b3f4aa7">
         <w:r>
           <w:rPr>
             <w:rStyle w:val="Hyperlink"/>
@@ -475,7 +475,7 @@
       <w:r>
         <w:t xml:space="preserve">Direct link: </w:t>
       </w:r>
-      <w:hyperlink xmlns:r="http://schemas.openxmlformats.org/officeDocument/2006/relationships" w:history="true" r:id="Rd1716d0cd61e4d51">
+      <w:hyperlink xmlns:r="http://schemas.openxmlformats.org/officeDocument/2006/relationships" w:history="true" r:id="R5480c97ab61b4ee1">
         <w:r>
           <w:rPr>
             <w:rStyle w:val="Hyperlink"/>
@@ -496,7 +496,7 @@
       <w:r>
         <w:t xml:space="preserve">Direct link with title: </w:t>
       </w:r>
-      <w:hyperlink xmlns:r="http://schemas.openxmlformats.org/officeDocument/2006/relationships" w:history="true" r:id="R31e39f2d377d4cb8">
+      <w:hyperlink xmlns:r="http://schemas.openxmlformats.org/officeDocument/2006/relationships" w:history="true" r:id="R2c350f1d156b465d">
         <w:r>
           <w:rPr>
             <w:rStyle w:val="Hyperlink"/>
@@ -517,7 +517,7 @@
       <w:r>
         <w:t xml:space="preserve">Reference-style link: </w:t>
       </w:r>
-      <w:hyperlink xmlns:r="http://schemas.openxmlformats.org/officeDocument/2006/relationships" w:history="true" r:id="Rc5e93aea62c0416a">
+      <w:hyperlink xmlns:r="http://schemas.openxmlformats.org/officeDocument/2006/relationships" w:history="true" r:id="Rcf3c000a810a4e32">
         <w:r>
           <w:rPr>
             <w:rStyle w:val="Hyperlink"/>
@@ -538,7 +538,7 @@
       <w:r>
         <w:t xml:space="preserve">Collapsed reference link: </w:t>
       </w:r>
-      <w:hyperlink xmlns:r="http://schemas.openxmlformats.org/officeDocument/2006/relationships" w:history="true" r:id="Rfbd718a13ac54c5a">
+      <w:hyperlink xmlns:r="http://schemas.openxmlformats.org/officeDocument/2006/relationships" w:history="true" r:id="R79f014d90aef41a6">
         <w:r>
           <w:rPr>
             <w:rStyle w:val="Hyperlink"/>
@@ -559,7 +559,7 @@
       <w:r>
         <w:t xml:space="preserve">Repeated reference link: </w:t>
       </w:r>
-      <w:hyperlink xmlns:r="http://schemas.openxmlformats.org/officeDocument/2006/relationships" w:history="true" r:id="Re8c41fa258c94ed2">
+      <w:hyperlink xmlns:r="http://schemas.openxmlformats.org/officeDocument/2006/relationships" w:history="true" r:id="Rb97ded11eccc4b17">
         <w:r>
           <w:rPr>
             <w:rStyle w:val="Hyperlink"/>
@@ -580,7 +580,7 @@
       <w:r>
         <w:t xml:space="preserve">Autolink URL: </w:t>
       </w:r>
-      <w:hyperlink xmlns:r="http://schemas.openxmlformats.org/officeDocument/2006/relationships" w:history="true" r:id="R7422b3bd9e704f3b">
+      <w:hyperlink xmlns:r="http://schemas.openxmlformats.org/officeDocument/2006/relationships" w:history="true" r:id="R9d38c2bb5e694ee7">
         <w:r>
           <w:rPr>
             <w:rStyle w:val="Hyperlink"/>
@@ -601,7 +601,7 @@
       <w:r>
         <w:t xml:space="preserve">Autolink email: </w:t>
       </w:r>
-      <w:hyperlink xmlns:r="http://schemas.openxmlformats.org/officeDocument/2006/relationships" w:history="true" r:id="R208348d39ea84e36">
+      <w:hyperlink xmlns:r="http://schemas.openxmlformats.org/officeDocument/2006/relationships" w:history="true" r:id="Rd4cd52bd5e0a4887">
         <w:r>
           <w:rPr>
             <w:rStyle w:val="Hyperlink"/>
@@ -700,7 +700,7 @@
       <w:r>
         <w:t xml:space="preserve">, and </w:t>
       </w:r>
-      <w:hyperlink xmlns:r="http://schemas.openxmlformats.org/officeDocument/2006/relationships" w:history="true" r:id="R5f0ad8a2d8764fa9">
+      <w:hyperlink xmlns:r="http://schemas.openxmlformats.org/officeDocument/2006/relationships" w:history="true" r:id="R0534c6a7eb4e4748">
         <w:r>
           <w:rPr>
             <w:rStyle w:val="Hyperlink"/>
@@ -1093,7 +1093,7 @@
       <w:r>
         <w:t xml:space="preserve">Continuation paragraph with </w:t>
       </w:r>
-      <w:hyperlink xmlns:r="http://schemas.openxmlformats.org/officeDocument/2006/relationships" w:history="true" r:id="R67dc0d27ec0942ca">
+      <w:hyperlink xmlns:r="http://schemas.openxmlformats.org/officeDocument/2006/relationships" w:history="true" r:id="Rc1daf3a1aaa34911">
         <w:r>
           <w:rPr>
             <w:rStyle w:val="Hyperlink"/>
@@ -1591,7 +1591,7 @@
       <w:r>
         <w:t xml:space="preserve">, and </w:t>
       </w:r>
-      <w:hyperlink xmlns:r="http://schemas.openxmlformats.org/officeDocument/2006/relationships" w:history="true" r:id="R8072b3938fd94071">
+      <w:hyperlink xmlns:r="http://schemas.openxmlformats.org/officeDocument/2006/relationships" w:history="true" r:id="R165f64032c954f48">
         <w:r>
           <w:rPr>
             <w:rStyle w:val="Hyperlink"/>
@@ -1965,7 +1965,7 @@
       <w:r>
         <w:drawing>
           <wp:inline xmlns:wp="http://schemas.openxmlformats.org/drawingml/2006/wordprocessingDrawing" distT="0" distB="0" distL="0" distR="0">
-            <wp:extent cx="4324350" cy="3752850"/>
+            <wp:extent cx="5220000" cy="5945249"/>
             <wp:effectExtent l="0" t="0" r="0" b="0"/>
             <wp:docPr id="1" name="Mermaid diagram 1" descr="Mermaid diagram"/>
             <wp:cNvGraphicFramePr>
@@ -1979,7 +1979,7 @@
                     <pic:cNvPicPr/>
                   </pic:nvPicPr>
                   <pic:blipFill>
-                    <a:blip xmlns:r="http://schemas.openxmlformats.org/officeDocument/2006/relationships" r:embed="R4fd7279e951a40b9"/>
+                    <a:blip xmlns:r="http://schemas.openxmlformats.org/officeDocument/2006/relationships" r:embed="Rc42c79d51e1844be"/>
                     <a:stretch>
                       <a:fillRect/>
                     </a:stretch>
@@ -1987,7 +1987,7 @@
                   <pic:spPr>
                     <a:xfrm>
                       <a:off x="0" y="0"/>
-                      <a:ext cx="4324350" cy="3752850"/>
+                      <a:ext cx="5220000" cy="5945249"/>
                     </a:xfrm>
                     <a:prstGeom prst="rect">
                       <a:avLst/>
@@ -2025,7 +2025,7 @@
       <w:r>
         <w:drawing>
           <wp:inline xmlns:wp="http://schemas.openxmlformats.org/drawingml/2006/wordprocessingDrawing" distT="0" distB="0" distL="0" distR="0">
-            <wp:extent cx="5220000" cy="767399"/>
+            <wp:extent cx="5220000" cy="402901"/>
             <wp:effectExtent l="0" t="0" r="0" b="0"/>
             <wp:docPr id="2" name="Mermaid diagram 2" descr="Mermaid diagram"/>
             <wp:cNvGraphicFramePr>
@@ -2039,7 +2039,7 @@
                     <pic:cNvPicPr/>
                   </pic:nvPicPr>
                   <pic:blipFill>
-                    <a:blip xmlns:r="http://schemas.openxmlformats.org/officeDocument/2006/relationships" r:embed="Re585234123e54e06"/>
+                    <a:blip xmlns:r="http://schemas.openxmlformats.org/officeDocument/2006/relationships" r:embed="R3cbe1c354ec64cb2"/>
                     <a:stretch>
                       <a:fillRect/>
                     </a:stretch>
@@ -2047,7 +2047,7 @@
                   <pic:spPr>
                     <a:xfrm>
                       <a:off x="0" y="0"/>
-                      <a:ext cx="5220000" cy="767399"/>
+                      <a:ext cx="5220000" cy="402901"/>
                     </a:xfrm>
                     <a:prstGeom prst="rect">
                       <a:avLst/>
@@ -2085,7 +2085,7 @@
       <w:r>
         <w:drawing>
           <wp:inline xmlns:wp="http://schemas.openxmlformats.org/drawingml/2006/wordprocessingDrawing" distT="0" distB="0" distL="0" distR="0">
-            <wp:extent cx="1918692" cy="6480000"/>
+            <wp:extent cx="1421649" cy="6480000"/>
             <wp:effectExtent l="0" t="0" r="0" b="0"/>
             <wp:docPr id="3" name="Mermaid diagram 3" descr="Mermaid diagram"/>
             <wp:cNvGraphicFramePr>
@@ -2099,7 +2099,7 @@
                     <pic:cNvPicPr/>
                   </pic:nvPicPr>
                   <pic:blipFill>
-                    <a:blip xmlns:r="http://schemas.openxmlformats.org/officeDocument/2006/relationships" r:embed="Re4a18673c2244e58"/>
+                    <a:blip xmlns:r="http://schemas.openxmlformats.org/officeDocument/2006/relationships" r:embed="R67a1739d9c97471e"/>
                     <a:stretch>
                       <a:fillRect/>
                     </a:stretch>
@@ -2107,7 +2107,7 @@
                   <pic:spPr>
                     <a:xfrm>
                       <a:off x="0" y="0"/>
-                      <a:ext cx="1918692" cy="6480000"/>
+                      <a:ext cx="1421649" cy="6480000"/>
                     </a:xfrm>
                     <a:prstGeom prst="rect">
                       <a:avLst/>
@@ -2150,7 +2150,7 @@
                     <pic:cNvPicPr/>
                   </pic:nvPicPr>
                   <pic:blipFill>
-                    <a:blip xmlns:r="http://schemas.openxmlformats.org/officeDocument/2006/relationships" r:embed="Rcc4475e3361f46e0"/>
+                    <a:blip xmlns:r="http://schemas.openxmlformats.org/officeDocument/2006/relationships" r:embed="R487daef946064edb"/>
                     <a:stretch>
                       <a:fillRect/>
                     </a:stretch>
@@ -2201,7 +2201,7 @@
                     <pic:cNvPicPr/>
                   </pic:nvPicPr>
                   <pic:blipFill>
-                    <a:blip xmlns:r="http://schemas.openxmlformats.org/officeDocument/2006/relationships" r:embed="Rce933808118e4576"/>
+                    <a:blip xmlns:r="http://schemas.openxmlformats.org/officeDocument/2006/relationships" r:embed="Rb681bb84fb9c408b"/>
                     <a:stretch>
                       <a:fillRect/>
                     </a:stretch>
@@ -2252,7 +2252,7 @@
                     <pic:cNvPicPr/>
                   </pic:nvPicPr>
                   <pic:blipFill>
-                    <a:blip xmlns:r="http://schemas.openxmlformats.org/officeDocument/2006/relationships" r:embed="R8ee245771cd34595"/>
+                    <a:blip xmlns:r="http://schemas.openxmlformats.org/officeDocument/2006/relationships" r:embed="R8e1320e229a24db9"/>
                     <a:stretch>
                       <a:fillRect/>
                     </a:stretch>
@@ -2303,7 +2303,7 @@
                     <pic:cNvPicPr/>
                   </pic:nvPicPr>
                   <pic:blipFill>
-                    <a:blip xmlns:r="http://schemas.openxmlformats.org/officeDocument/2006/relationships" r:embed="R729035a4c89d44a5"/>
+                    <a:blip xmlns:r="http://schemas.openxmlformats.org/officeDocument/2006/relationships" r:embed="R3b30a6ff708547b2"/>
                     <a:stretch>
                       <a:fillRect/>
                     </a:stretch>
@@ -2354,7 +2354,7 @@
                     <pic:cNvPicPr/>
                   </pic:nvPicPr>
                   <pic:blipFill>
-                    <a:blip xmlns:r="http://schemas.openxmlformats.org/officeDocument/2006/relationships" r:embed="R499437e3edb34882"/>
+                    <a:blip xmlns:r="http://schemas.openxmlformats.org/officeDocument/2006/relationships" r:embed="Ra8d58d368f374c66"/>
                     <a:stretch>
                       <a:fillRect/>
                     </a:stretch>
@@ -2430,7 +2430,7 @@
                     <pic:cNvPicPr/>
                   </pic:nvPicPr>
                   <pic:blipFill>
-                    <a:blip xmlns:r="http://schemas.openxmlformats.org/officeDocument/2006/relationships" r:embed="R148c324636a14834"/>
+                    <a:blip xmlns:r="http://schemas.openxmlformats.org/officeDocument/2006/relationships" r:embed="Raccae0c563e74b53"/>
                     <a:stretch>
                       <a:fillRect/>
                     </a:stretch>
@@ -2481,7 +2481,7 @@
                     <pic:cNvPicPr/>
                   </pic:nvPicPr>
                   <pic:blipFill>
-                    <a:blip xmlns:r="http://schemas.openxmlformats.org/officeDocument/2006/relationships" r:embed="R2f47f3f4801b4eb1"/>
+                    <a:blip xmlns:r="http://schemas.openxmlformats.org/officeDocument/2006/relationships" r:embed="R4cd8021e02ea47af"/>
                     <a:stretch>
                       <a:fillRect/>
                     </a:stretch>
@@ -2532,7 +2532,7 @@
                     <pic:cNvPicPr/>
                   </pic:nvPicPr>
                   <pic:blipFill>
-                    <a:blip xmlns:r="http://schemas.openxmlformats.org/officeDocument/2006/relationships" r:embed="R673e499b78394baa"/>
+                    <a:blip xmlns:r="http://schemas.openxmlformats.org/officeDocument/2006/relationships" r:embed="R2d1377e0a1834cc7"/>
                     <a:stretch>
                       <a:fillRect/>
                     </a:stretch>
@@ -2583,7 +2583,7 @@
                     <pic:cNvPicPr/>
                   </pic:nvPicPr>
                   <pic:blipFill>
-                    <a:blip xmlns:r="http://schemas.openxmlformats.org/officeDocument/2006/relationships" r:embed="R8a906b80da6f419a"/>
+                    <a:blip xmlns:r="http://schemas.openxmlformats.org/officeDocument/2006/relationships" r:embed="Rb7415326ec2248d9"/>
                     <a:stretch>
                       <a:fillRect/>
                     </a:stretch>
@@ -2659,7 +2659,7 @@
                     <pic:cNvPicPr/>
                   </pic:nvPicPr>
                   <pic:blipFill>
-                    <a:blip xmlns:r="http://schemas.openxmlformats.org/officeDocument/2006/relationships" r:embed="R29cd7ce612ca4057"/>
+                    <a:blip xmlns:r="http://schemas.openxmlformats.org/officeDocument/2006/relationships" r:embed="R55efaa67aae54159"/>
                     <a:stretch>
                       <a:fillRect/>
                     </a:stretch>
@@ -2710,7 +2710,7 @@
                     <pic:cNvPicPr/>
                   </pic:nvPicPr>
                   <pic:blipFill>
-                    <a:blip xmlns:r="http://schemas.openxmlformats.org/officeDocument/2006/relationships" r:embed="Radb71d2850d04e83"/>
+                    <a:blip xmlns:r="http://schemas.openxmlformats.org/officeDocument/2006/relationships" r:embed="R44c0de7e39ad409d"/>
                     <a:stretch>
                       <a:fillRect/>
                     </a:stretch>
@@ -2761,7 +2761,7 @@
                     <pic:cNvPicPr/>
                   </pic:nvPicPr>
                   <pic:blipFill>
-                    <a:blip xmlns:r="http://schemas.openxmlformats.org/officeDocument/2006/relationships" r:embed="R651e4c30fef24b86"/>
+                    <a:blip xmlns:r="http://schemas.openxmlformats.org/officeDocument/2006/relationships" r:embed="Rb5ea2b434c7746b5"/>
                     <a:stretch>
                       <a:fillRect/>
                     </a:stretch>
@@ -2812,7 +2812,7 @@
                     <pic:cNvPicPr/>
                   </pic:nvPicPr>
                   <pic:blipFill>
-                    <a:blip xmlns:r="http://schemas.openxmlformats.org/officeDocument/2006/relationships" r:embed="Rb2a83153424c4cbf"/>
+                    <a:blip xmlns:r="http://schemas.openxmlformats.org/officeDocument/2006/relationships" r:embed="R0060c9e1ee1746ca"/>
                     <a:stretch>
                       <a:fillRect/>
                     </a:stretch>
@@ -2863,7 +2863,7 @@
                     <pic:cNvPicPr/>
                   </pic:nvPicPr>
                   <pic:blipFill>
-                    <a:blip xmlns:r="http://schemas.openxmlformats.org/officeDocument/2006/relationships" r:embed="R4b9aa7150c8f4a28"/>
+                    <a:blip xmlns:r="http://schemas.openxmlformats.org/officeDocument/2006/relationships" r:embed="R48f7ac4ffda84975"/>
                     <a:stretch>
                       <a:fillRect/>
                     </a:stretch>
@@ -2914,7 +2914,7 @@
                     <pic:cNvPicPr/>
                   </pic:nvPicPr>
                   <pic:blipFill>
-                    <a:blip xmlns:r="http://schemas.openxmlformats.org/officeDocument/2006/relationships" r:embed="Rfb56476aa2e74366"/>
+                    <a:blip xmlns:r="http://schemas.openxmlformats.org/officeDocument/2006/relationships" r:embed="Re1a50b75c603446c"/>
                     <a:stretch>
                       <a:fillRect/>
                     </a:stretch>
@@ -2965,7 +2965,7 @@
                     <pic:cNvPicPr/>
                   </pic:nvPicPr>
                   <pic:blipFill>
-                    <a:blip xmlns:r="http://schemas.openxmlformats.org/officeDocument/2006/relationships" r:embed="R3b0f1f2d22854791"/>
+                    <a:blip xmlns:r="http://schemas.openxmlformats.org/officeDocument/2006/relationships" r:embed="Rb8278e7577844ceb"/>
                     <a:stretch>
                       <a:fillRect/>
                     </a:stretch>
@@ -3016,7 +3016,7 @@
                     <pic:cNvPicPr/>
                   </pic:nvPicPr>
                   <pic:blipFill>
-                    <a:blip xmlns:r="http://schemas.openxmlformats.org/officeDocument/2006/relationships" r:embed="Rabe7f421fca34210"/>
+                    <a:blip xmlns:r="http://schemas.openxmlformats.org/officeDocument/2006/relationships" r:embed="R25a611a832404c2d"/>
                     <a:stretch>
                       <a:fillRect/>
                     </a:stretch>
@@ -3067,7 +3067,7 @@
                     <pic:cNvPicPr/>
                   </pic:nvPicPr>
                   <pic:blipFill>
-                    <a:blip xmlns:r="http://schemas.openxmlformats.org/officeDocument/2006/relationships" r:embed="R68d3692f5235437a"/>
+                    <a:blip xmlns:r="http://schemas.openxmlformats.org/officeDocument/2006/relationships" r:embed="R7b095e55abb443d8"/>
                     <a:stretch>
                       <a:fillRect/>
                     </a:stretch>
@@ -3118,7 +3118,7 @@
                     <pic:cNvPicPr/>
                   </pic:nvPicPr>
                   <pic:blipFill>
-                    <a:blip xmlns:r="http://schemas.openxmlformats.org/officeDocument/2006/relationships" r:embed="Rcb073fe2c4504682"/>
+                    <a:blip xmlns:r="http://schemas.openxmlformats.org/officeDocument/2006/relationships" r:embed="R98152fb7445148f6"/>
                     <a:stretch>
                       <a:fillRect/>
                     </a:stretch>
@@ -3354,7 +3354,7 @@
                     <pic:cNvPicPr/>
                   </pic:nvPicPr>
                   <pic:blipFill>
-                    <a:blip xmlns:r="http://schemas.openxmlformats.org/officeDocument/2006/relationships" r:embed="Rb92cdce2cbb5476e"/>
+                    <a:blip xmlns:r="http://schemas.openxmlformats.org/officeDocument/2006/relationships" r:embed="R518df87420204151"/>
                     <a:stretch>
                       <a:fillRect/>
                     </a:stretch>
@@ -3405,7 +3405,7 @@
                     <pic:cNvPicPr/>
                   </pic:nvPicPr>
                   <pic:blipFill>
-                    <a:blip xmlns:r="http://schemas.openxmlformats.org/officeDocument/2006/relationships" r:embed="R653288aa2796479e"/>
+                    <a:blip xmlns:r="http://schemas.openxmlformats.org/officeDocument/2006/relationships" r:embed="Rebfa89e5f8a04129"/>
                     <a:stretch>
                       <a:fillRect/>
                     </a:stretch>
@@ -3456,7 +3456,7 @@
                     <pic:cNvPicPr/>
                   </pic:nvPicPr>
                   <pic:blipFill>
-                    <a:blip xmlns:r="http://schemas.openxmlformats.org/officeDocument/2006/relationships" r:embed="Rf1ea8560d7f847c2"/>
+                    <a:blip xmlns:r="http://schemas.openxmlformats.org/officeDocument/2006/relationships" r:embed="R8a0d342174b34d85"/>
                     <a:stretch>
                       <a:fillRect/>
                     </a:stretch>
@@ -3507,7 +3507,7 @@
                     <pic:cNvPicPr/>
                   </pic:nvPicPr>
                   <pic:blipFill>
-                    <a:blip xmlns:r="http://schemas.openxmlformats.org/officeDocument/2006/relationships" r:embed="Rc0b8cc71af21407a"/>
+                    <a:blip xmlns:r="http://schemas.openxmlformats.org/officeDocument/2006/relationships" r:embed="Rf30dce54d98a4f79"/>
                     <a:stretch>
                       <a:fillRect/>
                     </a:stretch>
@@ -3558,7 +3558,7 @@
                     <pic:cNvPicPr/>
                   </pic:nvPicPr>
                   <pic:blipFill>
-                    <a:blip xmlns:r="http://schemas.openxmlformats.org/officeDocument/2006/relationships" r:embed="Rccdde621e63f4afa"/>
+                    <a:blip xmlns:r="http://schemas.openxmlformats.org/officeDocument/2006/relationships" r:embed="Rf1dab35cc24548ea"/>
                     <a:stretch>
                       <a:fillRect/>
                     </a:stretch>
@@ -3609,7 +3609,7 @@
                     <pic:cNvPicPr/>
                   </pic:nvPicPr>
                   <pic:blipFill>
-                    <a:blip xmlns:r="http://schemas.openxmlformats.org/officeDocument/2006/relationships" r:embed="R7c1901760c41451f"/>
+                    <a:blip xmlns:r="http://schemas.openxmlformats.org/officeDocument/2006/relationships" r:embed="Re4187afe93504a82"/>
                     <a:stretch>
                       <a:fillRect/>
                     </a:stretch>
@@ -3660,7 +3660,7 @@
                     <pic:cNvPicPr/>
                   </pic:nvPicPr>
                   <pic:blipFill>
-                    <a:blip xmlns:r="http://schemas.openxmlformats.org/officeDocument/2006/relationships" r:embed="R874af557bb074aab"/>
+                    <a:blip xmlns:r="http://schemas.openxmlformats.org/officeDocument/2006/relationships" r:embed="R5386eb99913f44a8"/>
                     <a:stretch>
                       <a:fillRect/>
                     </a:stretch>
@@ -3711,7 +3711,7 @@
                     <pic:cNvPicPr/>
                   </pic:nvPicPr>
                   <pic:blipFill>
-                    <a:blip xmlns:r="http://schemas.openxmlformats.org/officeDocument/2006/relationships" r:embed="Ra00aff845e7e4f5a"/>
+                    <a:blip xmlns:r="http://schemas.openxmlformats.org/officeDocument/2006/relationships" r:embed="Re866dc8c8f8843b1"/>
                     <a:stretch>
                       <a:fillRect/>
                     </a:stretch>
@@ -3762,7 +3762,7 @@
                     <pic:cNvPicPr/>
                   </pic:nvPicPr>
                   <pic:blipFill>
-                    <a:blip xmlns:r="http://schemas.openxmlformats.org/officeDocument/2006/relationships" r:embed="R4167584922b24e10"/>
+                    <a:blip xmlns:r="http://schemas.openxmlformats.org/officeDocument/2006/relationships" r:embed="Raf34638696de41e1"/>
                     <a:stretch>
                       <a:fillRect/>
                     </a:stretch>
@@ -3859,7 +3859,7 @@
                     <pic:cNvPicPr/>
                   </pic:nvPicPr>
                   <pic:blipFill>
-                    <a:blip xmlns:r="http://schemas.openxmlformats.org/officeDocument/2006/relationships" r:embed="R5f8a5da7a34645af"/>
+                    <a:blip xmlns:r="http://schemas.openxmlformats.org/officeDocument/2006/relationships" r:embed="Rbe28129889de47dd"/>
                     <a:stretch>
                       <a:fillRect/>
                     </a:stretch>
@@ -3902,7 +3902,7 @@
                     <pic:cNvPicPr/>
                   </pic:nvPicPr>
                   <pic:blipFill>
-                    <a:blip xmlns:r="http://schemas.openxmlformats.org/officeDocument/2006/relationships" r:embed="R6eeeb9acf8864eeb"/>
+                    <a:blip xmlns:r="http://schemas.openxmlformats.org/officeDocument/2006/relationships" r:embed="Re5a8e8a643e14415"/>
                     <a:stretch>
                       <a:fillRect/>
                     </a:stretch>
@@ -3945,7 +3945,7 @@
                     <pic:cNvPicPr/>
                   </pic:nvPicPr>
                   <pic:blipFill>
-                    <a:blip xmlns:r="http://schemas.openxmlformats.org/officeDocument/2006/relationships" r:embed="R6448ca5199c148a1"/>
+                    <a:blip xmlns:r="http://schemas.openxmlformats.org/officeDocument/2006/relationships" r:embed="Rf248f39b77094f85"/>
                     <a:stretch>
                       <a:fillRect/>
                     </a:stretch>
@@ -3988,7 +3988,7 @@
                     <pic:cNvPicPr/>
                   </pic:nvPicPr>
                   <pic:blipFill>
-                    <a:blip xmlns:r="http://schemas.openxmlformats.org/officeDocument/2006/relationships" r:embed="R7b35111da18c4cb5"/>
+                    <a:blip xmlns:r="http://schemas.openxmlformats.org/officeDocument/2006/relationships" r:embed="R88fce0edd555472f"/>
                     <a:stretch>
                       <a:fillRect/>
                     </a:stretch>
@@ -4069,7 +4069,7 @@
       <w:r>
         <w:drawing>
           <wp:inline xmlns:wp="http://schemas.openxmlformats.org/drawingml/2006/wordprocessingDrawing" distT="0" distB="0" distL="0" distR="0">
-            <wp:extent cx="5220000" cy="4629198"/>
+            <wp:extent cx="5220000" cy="5120621"/>
             <wp:effectExtent l="0" t="0" r="0" b="0"/>
             <wp:docPr id="36" name="Mermaid diagram 36" descr="Mermaid diagram"/>
             <wp:cNvGraphicFramePr>
@@ -4083,7 +4083,7 @@
                     <pic:cNvPicPr/>
                   </pic:nvPicPr>
                   <pic:blipFill>
-                    <a:blip xmlns:r="http://schemas.openxmlformats.org/officeDocument/2006/relationships" r:embed="Rac75d5c5fe984fc3"/>
+                    <a:blip xmlns:r="http://schemas.openxmlformats.org/officeDocument/2006/relationships" r:embed="R240f91a219d34b23"/>
                     <a:stretch>
                       <a:fillRect/>
                     </a:stretch>
@@ -4091,7 +4091,7 @@
                   <pic:spPr>
                     <a:xfrm>
                       <a:off x="0" y="0"/>
-                      <a:ext cx="5220000" cy="4629198"/>
+                      <a:ext cx="5220000" cy="5120621"/>
                     </a:xfrm>
                     <a:prstGeom prst="rect">
                       <a:avLst/>
@@ -4336,7 +4336,7 @@
                     <pic:cNvPicPr/>
                   </pic:nvPicPr>
                   <pic:blipFill>
-                    <a:blip xmlns:r="http://schemas.openxmlformats.org/officeDocument/2006/relationships" r:embed="Rabf7becbba81457e"/>
+                    <a:blip xmlns:r="http://schemas.openxmlformats.org/officeDocument/2006/relationships" r:embed="R3823a98428e641d6"/>
                     <a:stretch>
                       <a:fillRect/>
                     </a:stretch>
@@ -4528,7 +4528,7 @@
                     <pic:cNvPicPr/>
                   </pic:nvPicPr>
                   <pic:blipFill>
-                    <a:blip xmlns:r="http://schemas.openxmlformats.org/officeDocument/2006/relationships" r:embed="R30251a9601364f1b"/>
+                    <a:blip xmlns:r="http://schemas.openxmlformats.org/officeDocument/2006/relationships" r:embed="R0b7ce6066c8c4ee3"/>
                     <a:stretch>
                       <a:fillRect/>
                     </a:stretch>
@@ -4579,7 +4579,7 @@
                     <pic:cNvPicPr/>
                   </pic:nvPicPr>
                   <pic:blipFill>
-                    <a:blip xmlns:r="http://schemas.openxmlformats.org/officeDocument/2006/relationships" r:embed="Rfb5dd89d37f44af7"/>
+                    <a:blip xmlns:r="http://schemas.openxmlformats.org/officeDocument/2006/relationships" r:embed="Re0f7e077b0e543dd"/>
                     <a:stretch>
                       <a:fillRect/>
                     </a:stretch>
@@ -4630,7 +4630,7 @@
                     <pic:cNvPicPr/>
                   </pic:nvPicPr>
                   <pic:blipFill>
-                    <a:blip xmlns:r="http://schemas.openxmlformats.org/officeDocument/2006/relationships" r:embed="Reebaa433314c4dae"/>
+                    <a:blip xmlns:r="http://schemas.openxmlformats.org/officeDocument/2006/relationships" r:embed="R973fb0e0d7014f69"/>
                     <a:stretch>
                       <a:fillRect/>
                     </a:stretch>
@@ -4681,7 +4681,7 @@
                     <pic:cNvPicPr/>
                   </pic:nvPicPr>
                   <pic:blipFill>
-                    <a:blip xmlns:r="http://schemas.openxmlformats.org/officeDocument/2006/relationships" r:embed="Rf061076278d44465"/>
+                    <a:blip xmlns:r="http://schemas.openxmlformats.org/officeDocument/2006/relationships" r:embed="Rfa9b2dbe463d403e"/>
                     <a:stretch>
                       <a:fillRect/>
                     </a:stretch>
@@ -5060,7 +5060,7 @@
                     <pic:cNvPicPr/>
                   </pic:nvPicPr>
                   <pic:blipFill>
-                    <a:blip xmlns:r="http://schemas.openxmlformats.org/officeDocument/2006/relationships" r:embed="R21d459f540d34911"/>
+                    <a:blip xmlns:r="http://schemas.openxmlformats.org/officeDocument/2006/relationships" r:embed="Re308e64c36684746"/>
                     <a:stretch>
                       <a:fillRect/>
                     </a:stretch>
@@ -5741,7 +5741,7 @@
             <w:r>
               <w:t xml:space="preserve">Cell with </w:t>
             </w:r>
-            <w:hyperlink xmlns:r="http://schemas.openxmlformats.org/officeDocument/2006/relationships" w:history="true" r:id="R91aade6f95404af9">
+            <w:hyperlink xmlns:r="http://schemas.openxmlformats.org/officeDocument/2006/relationships" w:history="true" r:id="R18e6ca2f1a0843bf">
               <w:r>
                 <w:rPr>
                   <w:rStyle w:val="Hyperlink"/>
@@ -6027,7 +6027,7 @@
                           <pic:cNvPicPr/>
                         </pic:nvPicPr>
                         <pic:blipFill>
-                          <a:blip xmlns:r="http://schemas.openxmlformats.org/officeDocument/2006/relationships" r:embed="R4eb3c9dfc80d48ed"/>
+                          <a:blip xmlns:r="http://schemas.openxmlformats.org/officeDocument/2006/relationships" r:embed="R662bc188d27f4a9a"/>
                           <a:stretch>
                             <a:fillRect/>
                           </a:stretch>
@@ -6127,7 +6127,7 @@
                     <pic:cNvPicPr/>
                   </pic:nvPicPr>
                   <pic:blipFill>
-                    <a:blip xmlns:r="http://schemas.openxmlformats.org/officeDocument/2006/relationships" r:embed="R410587569aa04814"/>
+                    <a:blip xmlns:r="http://schemas.openxmlformats.org/officeDocument/2006/relationships" r:embed="R36bef92f2f7d4375"/>
                     <a:stretch>
                       <a:fillRect/>
                     </a:stretch>
@@ -6177,7 +6177,7 @@
                     <pic:cNvPicPr/>
                   </pic:nvPicPr>
                   <pic:blipFill>
-                    <a:blip xmlns:r="http://schemas.openxmlformats.org/officeDocument/2006/relationships" r:embed="Rac05cb49871e433a"/>
+                    <a:blip xmlns:r="http://schemas.openxmlformats.org/officeDocument/2006/relationships" r:embed="R96aa0b66a6304a7a"/>
                     <a:stretch>
                       <a:fillRect/>
                     </a:stretch>
@@ -6227,7 +6227,7 @@
                     <pic:cNvPicPr/>
                   </pic:nvPicPr>
                   <pic:blipFill>
-                    <a:blip xmlns:r="http://schemas.openxmlformats.org/officeDocument/2006/relationships" r:embed="R21295e9a56c04c71"/>
+                    <a:blip xmlns:r="http://schemas.openxmlformats.org/officeDocument/2006/relationships" r:embed="R16b23f214fe44ad4"/>
                     <a:stretch>
                       <a:fillRect/>
                     </a:stretch>

</xml_diff>

<commit_message>
fix(flowchart): flip decision branch cubic tangents
Decision Yes/No branch edges now curve immediately away from the diamond and straighten into the target.

Made-with: Cursor
</commit_message>
<xml_diff>
--- a/test.docx
+++ b/test.docx
@@ -236,7 +236,7 @@
       <w:r>
         <w:t xml:space="preserve">, and </w:t>
       </w:r>
-      <w:hyperlink xmlns:r="http://schemas.openxmlformats.org/officeDocument/2006/relationships" w:history="true" r:id="R529c630f7b3f4aa7">
+      <w:hyperlink xmlns:r="http://schemas.openxmlformats.org/officeDocument/2006/relationships" w:history="true" r:id="R9c0a5d47d8e34803">
         <w:r>
           <w:rPr>
             <w:rStyle w:val="Hyperlink"/>
@@ -475,7 +475,7 @@
       <w:r>
         <w:t xml:space="preserve">Direct link: </w:t>
       </w:r>
-      <w:hyperlink xmlns:r="http://schemas.openxmlformats.org/officeDocument/2006/relationships" w:history="true" r:id="R5480c97ab61b4ee1">
+      <w:hyperlink xmlns:r="http://schemas.openxmlformats.org/officeDocument/2006/relationships" w:history="true" r:id="R53dada29b3d04a07">
         <w:r>
           <w:rPr>
             <w:rStyle w:val="Hyperlink"/>
@@ -496,7 +496,7 @@
       <w:r>
         <w:t xml:space="preserve">Direct link with title: </w:t>
       </w:r>
-      <w:hyperlink xmlns:r="http://schemas.openxmlformats.org/officeDocument/2006/relationships" w:history="true" r:id="R2c350f1d156b465d">
+      <w:hyperlink xmlns:r="http://schemas.openxmlformats.org/officeDocument/2006/relationships" w:history="true" r:id="R80b0a12d475d4742">
         <w:r>
           <w:rPr>
             <w:rStyle w:val="Hyperlink"/>
@@ -517,7 +517,7 @@
       <w:r>
         <w:t xml:space="preserve">Reference-style link: </w:t>
       </w:r>
-      <w:hyperlink xmlns:r="http://schemas.openxmlformats.org/officeDocument/2006/relationships" w:history="true" r:id="Rcf3c000a810a4e32">
+      <w:hyperlink xmlns:r="http://schemas.openxmlformats.org/officeDocument/2006/relationships" w:history="true" r:id="Rfcd978e36aec404f">
         <w:r>
           <w:rPr>
             <w:rStyle w:val="Hyperlink"/>
@@ -538,7 +538,7 @@
       <w:r>
         <w:t xml:space="preserve">Collapsed reference link: </w:t>
       </w:r>
-      <w:hyperlink xmlns:r="http://schemas.openxmlformats.org/officeDocument/2006/relationships" w:history="true" r:id="R79f014d90aef41a6">
+      <w:hyperlink xmlns:r="http://schemas.openxmlformats.org/officeDocument/2006/relationships" w:history="true" r:id="Red577206f1f84526">
         <w:r>
           <w:rPr>
             <w:rStyle w:val="Hyperlink"/>
@@ -559,7 +559,7 @@
       <w:r>
         <w:t xml:space="preserve">Repeated reference link: </w:t>
       </w:r>
-      <w:hyperlink xmlns:r="http://schemas.openxmlformats.org/officeDocument/2006/relationships" w:history="true" r:id="Rb97ded11eccc4b17">
+      <w:hyperlink xmlns:r="http://schemas.openxmlformats.org/officeDocument/2006/relationships" w:history="true" r:id="Ra7a9d7182c034d9a">
         <w:r>
           <w:rPr>
             <w:rStyle w:val="Hyperlink"/>
@@ -580,7 +580,7 @@
       <w:r>
         <w:t xml:space="preserve">Autolink URL: </w:t>
       </w:r>
-      <w:hyperlink xmlns:r="http://schemas.openxmlformats.org/officeDocument/2006/relationships" w:history="true" r:id="R9d38c2bb5e694ee7">
+      <w:hyperlink xmlns:r="http://schemas.openxmlformats.org/officeDocument/2006/relationships" w:history="true" r:id="Rd2e478b76ae24388">
         <w:r>
           <w:rPr>
             <w:rStyle w:val="Hyperlink"/>
@@ -601,7 +601,7 @@
       <w:r>
         <w:t xml:space="preserve">Autolink email: </w:t>
       </w:r>
-      <w:hyperlink xmlns:r="http://schemas.openxmlformats.org/officeDocument/2006/relationships" w:history="true" r:id="Rd4cd52bd5e0a4887">
+      <w:hyperlink xmlns:r="http://schemas.openxmlformats.org/officeDocument/2006/relationships" w:history="true" r:id="Rbe827cc05ca04a3c">
         <w:r>
           <w:rPr>
             <w:rStyle w:val="Hyperlink"/>
@@ -700,7 +700,7 @@
       <w:r>
         <w:t xml:space="preserve">, and </w:t>
       </w:r>
-      <w:hyperlink xmlns:r="http://schemas.openxmlformats.org/officeDocument/2006/relationships" w:history="true" r:id="R0534c6a7eb4e4748">
+      <w:hyperlink xmlns:r="http://schemas.openxmlformats.org/officeDocument/2006/relationships" w:history="true" r:id="R7880001d8eed44bc">
         <w:r>
           <w:rPr>
             <w:rStyle w:val="Hyperlink"/>
@@ -1093,7 +1093,7 @@
       <w:r>
         <w:t xml:space="preserve">Continuation paragraph with </w:t>
       </w:r>
-      <w:hyperlink xmlns:r="http://schemas.openxmlformats.org/officeDocument/2006/relationships" w:history="true" r:id="Rc1daf3a1aaa34911">
+      <w:hyperlink xmlns:r="http://schemas.openxmlformats.org/officeDocument/2006/relationships" w:history="true" r:id="R055319c2d8a84446">
         <w:r>
           <w:rPr>
             <w:rStyle w:val="Hyperlink"/>
@@ -1591,7 +1591,7 @@
       <w:r>
         <w:t xml:space="preserve">, and </w:t>
       </w:r>
-      <w:hyperlink xmlns:r="http://schemas.openxmlformats.org/officeDocument/2006/relationships" w:history="true" r:id="R165f64032c954f48">
+      <w:hyperlink xmlns:r="http://schemas.openxmlformats.org/officeDocument/2006/relationships" w:history="true" r:id="R57cb3aacd91441fe">
         <w:r>
           <w:rPr>
             <w:rStyle w:val="Hyperlink"/>
@@ -1979,7 +1979,7 @@
                     <pic:cNvPicPr/>
                   </pic:nvPicPr>
                   <pic:blipFill>
-                    <a:blip xmlns:r="http://schemas.openxmlformats.org/officeDocument/2006/relationships" r:embed="Rc42c79d51e1844be"/>
+                    <a:blip xmlns:r="http://schemas.openxmlformats.org/officeDocument/2006/relationships" r:embed="Rb14d6109571b4a7f"/>
                     <a:stretch>
                       <a:fillRect/>
                     </a:stretch>
@@ -2039,7 +2039,7 @@
                     <pic:cNvPicPr/>
                   </pic:nvPicPr>
                   <pic:blipFill>
-                    <a:blip xmlns:r="http://schemas.openxmlformats.org/officeDocument/2006/relationships" r:embed="R3cbe1c354ec64cb2"/>
+                    <a:blip xmlns:r="http://schemas.openxmlformats.org/officeDocument/2006/relationships" r:embed="R01a3f7ef0b884a3c"/>
                     <a:stretch>
                       <a:fillRect/>
                     </a:stretch>
@@ -2099,7 +2099,7 @@
                     <pic:cNvPicPr/>
                   </pic:nvPicPr>
                   <pic:blipFill>
-                    <a:blip xmlns:r="http://schemas.openxmlformats.org/officeDocument/2006/relationships" r:embed="R67a1739d9c97471e"/>
+                    <a:blip xmlns:r="http://schemas.openxmlformats.org/officeDocument/2006/relationships" r:embed="R24fbde18f6f14cc9"/>
                     <a:stretch>
                       <a:fillRect/>
                     </a:stretch>
@@ -2150,7 +2150,7 @@
                     <pic:cNvPicPr/>
                   </pic:nvPicPr>
                   <pic:blipFill>
-                    <a:blip xmlns:r="http://schemas.openxmlformats.org/officeDocument/2006/relationships" r:embed="R487daef946064edb"/>
+                    <a:blip xmlns:r="http://schemas.openxmlformats.org/officeDocument/2006/relationships" r:embed="R9b9851e53a7b4bd4"/>
                     <a:stretch>
                       <a:fillRect/>
                     </a:stretch>
@@ -2201,7 +2201,7 @@
                     <pic:cNvPicPr/>
                   </pic:nvPicPr>
                   <pic:blipFill>
-                    <a:blip xmlns:r="http://schemas.openxmlformats.org/officeDocument/2006/relationships" r:embed="Rb681bb84fb9c408b"/>
+                    <a:blip xmlns:r="http://schemas.openxmlformats.org/officeDocument/2006/relationships" r:embed="Ra8b9aeb035ad4350"/>
                     <a:stretch>
                       <a:fillRect/>
                     </a:stretch>
@@ -2252,7 +2252,7 @@
                     <pic:cNvPicPr/>
                   </pic:nvPicPr>
                   <pic:blipFill>
-                    <a:blip xmlns:r="http://schemas.openxmlformats.org/officeDocument/2006/relationships" r:embed="R8e1320e229a24db9"/>
+                    <a:blip xmlns:r="http://schemas.openxmlformats.org/officeDocument/2006/relationships" r:embed="R8663b5c46e0c4a06"/>
                     <a:stretch>
                       <a:fillRect/>
                     </a:stretch>
@@ -2303,7 +2303,7 @@
                     <pic:cNvPicPr/>
                   </pic:nvPicPr>
                   <pic:blipFill>
-                    <a:blip xmlns:r="http://schemas.openxmlformats.org/officeDocument/2006/relationships" r:embed="R3b30a6ff708547b2"/>
+                    <a:blip xmlns:r="http://schemas.openxmlformats.org/officeDocument/2006/relationships" r:embed="Rd8c3c21209924812"/>
                     <a:stretch>
                       <a:fillRect/>
                     </a:stretch>
@@ -2354,7 +2354,7 @@
                     <pic:cNvPicPr/>
                   </pic:nvPicPr>
                   <pic:blipFill>
-                    <a:blip xmlns:r="http://schemas.openxmlformats.org/officeDocument/2006/relationships" r:embed="Ra8d58d368f374c66"/>
+                    <a:blip xmlns:r="http://schemas.openxmlformats.org/officeDocument/2006/relationships" r:embed="R1a9581f80ba34ad7"/>
                     <a:stretch>
                       <a:fillRect/>
                     </a:stretch>
@@ -2430,7 +2430,7 @@
                     <pic:cNvPicPr/>
                   </pic:nvPicPr>
                   <pic:blipFill>
-                    <a:blip xmlns:r="http://schemas.openxmlformats.org/officeDocument/2006/relationships" r:embed="Raccae0c563e74b53"/>
+                    <a:blip xmlns:r="http://schemas.openxmlformats.org/officeDocument/2006/relationships" r:embed="Rca5f232782d74d93"/>
                     <a:stretch>
                       <a:fillRect/>
                     </a:stretch>
@@ -2481,7 +2481,7 @@
                     <pic:cNvPicPr/>
                   </pic:nvPicPr>
                   <pic:blipFill>
-                    <a:blip xmlns:r="http://schemas.openxmlformats.org/officeDocument/2006/relationships" r:embed="R4cd8021e02ea47af"/>
+                    <a:blip xmlns:r="http://schemas.openxmlformats.org/officeDocument/2006/relationships" r:embed="R95c504a736b84b08"/>
                     <a:stretch>
                       <a:fillRect/>
                     </a:stretch>
@@ -2532,7 +2532,7 @@
                     <pic:cNvPicPr/>
                   </pic:nvPicPr>
                   <pic:blipFill>
-                    <a:blip xmlns:r="http://schemas.openxmlformats.org/officeDocument/2006/relationships" r:embed="R2d1377e0a1834cc7"/>
+                    <a:blip xmlns:r="http://schemas.openxmlformats.org/officeDocument/2006/relationships" r:embed="Rda710f090fe24eba"/>
                     <a:stretch>
                       <a:fillRect/>
                     </a:stretch>
@@ -2583,7 +2583,7 @@
                     <pic:cNvPicPr/>
                   </pic:nvPicPr>
                   <pic:blipFill>
-                    <a:blip xmlns:r="http://schemas.openxmlformats.org/officeDocument/2006/relationships" r:embed="Rb7415326ec2248d9"/>
+                    <a:blip xmlns:r="http://schemas.openxmlformats.org/officeDocument/2006/relationships" r:embed="R88a599a8f1424ebe"/>
                     <a:stretch>
                       <a:fillRect/>
                     </a:stretch>
@@ -2659,7 +2659,7 @@
                     <pic:cNvPicPr/>
                   </pic:nvPicPr>
                   <pic:blipFill>
-                    <a:blip xmlns:r="http://schemas.openxmlformats.org/officeDocument/2006/relationships" r:embed="R55efaa67aae54159"/>
+                    <a:blip xmlns:r="http://schemas.openxmlformats.org/officeDocument/2006/relationships" r:embed="R9c3286e9faf64afc"/>
                     <a:stretch>
                       <a:fillRect/>
                     </a:stretch>
@@ -2710,7 +2710,7 @@
                     <pic:cNvPicPr/>
                   </pic:nvPicPr>
                   <pic:blipFill>
-                    <a:blip xmlns:r="http://schemas.openxmlformats.org/officeDocument/2006/relationships" r:embed="R44c0de7e39ad409d"/>
+                    <a:blip xmlns:r="http://schemas.openxmlformats.org/officeDocument/2006/relationships" r:embed="Re33293ebad8046f2"/>
                     <a:stretch>
                       <a:fillRect/>
                     </a:stretch>
@@ -2761,7 +2761,7 @@
                     <pic:cNvPicPr/>
                   </pic:nvPicPr>
                   <pic:blipFill>
-                    <a:blip xmlns:r="http://schemas.openxmlformats.org/officeDocument/2006/relationships" r:embed="Rb5ea2b434c7746b5"/>
+                    <a:blip xmlns:r="http://schemas.openxmlformats.org/officeDocument/2006/relationships" r:embed="Rd1cd99fb17bb4ebc"/>
                     <a:stretch>
                       <a:fillRect/>
                     </a:stretch>
@@ -2812,7 +2812,7 @@
                     <pic:cNvPicPr/>
                   </pic:nvPicPr>
                   <pic:blipFill>
-                    <a:blip xmlns:r="http://schemas.openxmlformats.org/officeDocument/2006/relationships" r:embed="R0060c9e1ee1746ca"/>
+                    <a:blip xmlns:r="http://schemas.openxmlformats.org/officeDocument/2006/relationships" r:embed="R8352695a73444a08"/>
                     <a:stretch>
                       <a:fillRect/>
                     </a:stretch>
@@ -2863,7 +2863,7 @@
                     <pic:cNvPicPr/>
                   </pic:nvPicPr>
                   <pic:blipFill>
-                    <a:blip xmlns:r="http://schemas.openxmlformats.org/officeDocument/2006/relationships" r:embed="R48f7ac4ffda84975"/>
+                    <a:blip xmlns:r="http://schemas.openxmlformats.org/officeDocument/2006/relationships" r:embed="Rcb8dde5fa1e84114"/>
                     <a:stretch>
                       <a:fillRect/>
                     </a:stretch>
@@ -2914,7 +2914,7 @@
                     <pic:cNvPicPr/>
                   </pic:nvPicPr>
                   <pic:blipFill>
-                    <a:blip xmlns:r="http://schemas.openxmlformats.org/officeDocument/2006/relationships" r:embed="Re1a50b75c603446c"/>
+                    <a:blip xmlns:r="http://schemas.openxmlformats.org/officeDocument/2006/relationships" r:embed="Rd8bb6a2cf521456d"/>
                     <a:stretch>
                       <a:fillRect/>
                     </a:stretch>
@@ -2965,7 +2965,7 @@
                     <pic:cNvPicPr/>
                   </pic:nvPicPr>
                   <pic:blipFill>
-                    <a:blip xmlns:r="http://schemas.openxmlformats.org/officeDocument/2006/relationships" r:embed="Rb8278e7577844ceb"/>
+                    <a:blip xmlns:r="http://schemas.openxmlformats.org/officeDocument/2006/relationships" r:embed="R68d921bffb714ef3"/>
                     <a:stretch>
                       <a:fillRect/>
                     </a:stretch>
@@ -3016,7 +3016,7 @@
                     <pic:cNvPicPr/>
                   </pic:nvPicPr>
                   <pic:blipFill>
-                    <a:blip xmlns:r="http://schemas.openxmlformats.org/officeDocument/2006/relationships" r:embed="R25a611a832404c2d"/>
+                    <a:blip xmlns:r="http://schemas.openxmlformats.org/officeDocument/2006/relationships" r:embed="R6e7a02956f894215"/>
                     <a:stretch>
                       <a:fillRect/>
                     </a:stretch>
@@ -3067,7 +3067,7 @@
                     <pic:cNvPicPr/>
                   </pic:nvPicPr>
                   <pic:blipFill>
-                    <a:blip xmlns:r="http://schemas.openxmlformats.org/officeDocument/2006/relationships" r:embed="R7b095e55abb443d8"/>
+                    <a:blip xmlns:r="http://schemas.openxmlformats.org/officeDocument/2006/relationships" r:embed="Rb773d5b4ad9f41d9"/>
                     <a:stretch>
                       <a:fillRect/>
                     </a:stretch>
@@ -3118,7 +3118,7 @@
                     <pic:cNvPicPr/>
                   </pic:nvPicPr>
                   <pic:blipFill>
-                    <a:blip xmlns:r="http://schemas.openxmlformats.org/officeDocument/2006/relationships" r:embed="R98152fb7445148f6"/>
+                    <a:blip xmlns:r="http://schemas.openxmlformats.org/officeDocument/2006/relationships" r:embed="Rf3a1704389104d4c"/>
                     <a:stretch>
                       <a:fillRect/>
                     </a:stretch>
@@ -3354,7 +3354,7 @@
                     <pic:cNvPicPr/>
                   </pic:nvPicPr>
                   <pic:blipFill>
-                    <a:blip xmlns:r="http://schemas.openxmlformats.org/officeDocument/2006/relationships" r:embed="R518df87420204151"/>
+                    <a:blip xmlns:r="http://schemas.openxmlformats.org/officeDocument/2006/relationships" r:embed="Rfad6ca7b5b1f42e8"/>
                     <a:stretch>
                       <a:fillRect/>
                     </a:stretch>
@@ -3405,7 +3405,7 @@
                     <pic:cNvPicPr/>
                   </pic:nvPicPr>
                   <pic:blipFill>
-                    <a:blip xmlns:r="http://schemas.openxmlformats.org/officeDocument/2006/relationships" r:embed="Rebfa89e5f8a04129"/>
+                    <a:blip xmlns:r="http://schemas.openxmlformats.org/officeDocument/2006/relationships" r:embed="R2fb9158ec8c24b9c"/>
                     <a:stretch>
                       <a:fillRect/>
                     </a:stretch>
@@ -3456,7 +3456,7 @@
                     <pic:cNvPicPr/>
                   </pic:nvPicPr>
                   <pic:blipFill>
-                    <a:blip xmlns:r="http://schemas.openxmlformats.org/officeDocument/2006/relationships" r:embed="R8a0d342174b34d85"/>
+                    <a:blip xmlns:r="http://schemas.openxmlformats.org/officeDocument/2006/relationships" r:embed="R924ece9b0a6b4776"/>
                     <a:stretch>
                       <a:fillRect/>
                     </a:stretch>
@@ -3507,7 +3507,7 @@
                     <pic:cNvPicPr/>
                   </pic:nvPicPr>
                   <pic:blipFill>
-                    <a:blip xmlns:r="http://schemas.openxmlformats.org/officeDocument/2006/relationships" r:embed="Rf30dce54d98a4f79"/>
+                    <a:blip xmlns:r="http://schemas.openxmlformats.org/officeDocument/2006/relationships" r:embed="R7ed847cdb8a74678"/>
                     <a:stretch>
                       <a:fillRect/>
                     </a:stretch>
@@ -3558,7 +3558,7 @@
                     <pic:cNvPicPr/>
                   </pic:nvPicPr>
                   <pic:blipFill>
-                    <a:blip xmlns:r="http://schemas.openxmlformats.org/officeDocument/2006/relationships" r:embed="Rf1dab35cc24548ea"/>
+                    <a:blip xmlns:r="http://schemas.openxmlformats.org/officeDocument/2006/relationships" r:embed="Re5ec9cb5555043ed"/>
                     <a:stretch>
                       <a:fillRect/>
                     </a:stretch>
@@ -3609,7 +3609,7 @@
                     <pic:cNvPicPr/>
                   </pic:nvPicPr>
                   <pic:blipFill>
-                    <a:blip xmlns:r="http://schemas.openxmlformats.org/officeDocument/2006/relationships" r:embed="Re4187afe93504a82"/>
+                    <a:blip xmlns:r="http://schemas.openxmlformats.org/officeDocument/2006/relationships" r:embed="Rff1cb10141ea4dab"/>
                     <a:stretch>
                       <a:fillRect/>
                     </a:stretch>
@@ -3660,7 +3660,7 @@
                     <pic:cNvPicPr/>
                   </pic:nvPicPr>
                   <pic:blipFill>
-                    <a:blip xmlns:r="http://schemas.openxmlformats.org/officeDocument/2006/relationships" r:embed="R5386eb99913f44a8"/>
+                    <a:blip xmlns:r="http://schemas.openxmlformats.org/officeDocument/2006/relationships" r:embed="R0a90024534ab47ab"/>
                     <a:stretch>
                       <a:fillRect/>
                     </a:stretch>
@@ -3711,7 +3711,7 @@
                     <pic:cNvPicPr/>
                   </pic:nvPicPr>
                   <pic:blipFill>
-                    <a:blip xmlns:r="http://schemas.openxmlformats.org/officeDocument/2006/relationships" r:embed="Re866dc8c8f8843b1"/>
+                    <a:blip xmlns:r="http://schemas.openxmlformats.org/officeDocument/2006/relationships" r:embed="Rb6f52aef02954190"/>
                     <a:stretch>
                       <a:fillRect/>
                     </a:stretch>
@@ -3762,7 +3762,7 @@
                     <pic:cNvPicPr/>
                   </pic:nvPicPr>
                   <pic:blipFill>
-                    <a:blip xmlns:r="http://schemas.openxmlformats.org/officeDocument/2006/relationships" r:embed="Raf34638696de41e1"/>
+                    <a:blip xmlns:r="http://schemas.openxmlformats.org/officeDocument/2006/relationships" r:embed="Rc7700e4fa30a4317"/>
                     <a:stretch>
                       <a:fillRect/>
                     </a:stretch>
@@ -3859,7 +3859,7 @@
                     <pic:cNvPicPr/>
                   </pic:nvPicPr>
                   <pic:blipFill>
-                    <a:blip xmlns:r="http://schemas.openxmlformats.org/officeDocument/2006/relationships" r:embed="Rbe28129889de47dd"/>
+                    <a:blip xmlns:r="http://schemas.openxmlformats.org/officeDocument/2006/relationships" r:embed="R4ca6b2cbf134442b"/>
                     <a:stretch>
                       <a:fillRect/>
                     </a:stretch>
@@ -3902,7 +3902,7 @@
                     <pic:cNvPicPr/>
                   </pic:nvPicPr>
                   <pic:blipFill>
-                    <a:blip xmlns:r="http://schemas.openxmlformats.org/officeDocument/2006/relationships" r:embed="Re5a8e8a643e14415"/>
+                    <a:blip xmlns:r="http://schemas.openxmlformats.org/officeDocument/2006/relationships" r:embed="R5b407bb9d7e94e20"/>
                     <a:stretch>
                       <a:fillRect/>
                     </a:stretch>
@@ -3945,7 +3945,7 @@
                     <pic:cNvPicPr/>
                   </pic:nvPicPr>
                   <pic:blipFill>
-                    <a:blip xmlns:r="http://schemas.openxmlformats.org/officeDocument/2006/relationships" r:embed="Rf248f39b77094f85"/>
+                    <a:blip xmlns:r="http://schemas.openxmlformats.org/officeDocument/2006/relationships" r:embed="Rb806cf88295c4327"/>
                     <a:stretch>
                       <a:fillRect/>
                     </a:stretch>
@@ -3988,7 +3988,7 @@
                     <pic:cNvPicPr/>
                   </pic:nvPicPr>
                   <pic:blipFill>
-                    <a:blip xmlns:r="http://schemas.openxmlformats.org/officeDocument/2006/relationships" r:embed="R88fce0edd555472f"/>
+                    <a:blip xmlns:r="http://schemas.openxmlformats.org/officeDocument/2006/relationships" r:embed="R24f68fadc37a414e"/>
                     <a:stretch>
                       <a:fillRect/>
                     </a:stretch>
@@ -4083,7 +4083,7 @@
                     <pic:cNvPicPr/>
                   </pic:nvPicPr>
                   <pic:blipFill>
-                    <a:blip xmlns:r="http://schemas.openxmlformats.org/officeDocument/2006/relationships" r:embed="R240f91a219d34b23"/>
+                    <a:blip xmlns:r="http://schemas.openxmlformats.org/officeDocument/2006/relationships" r:embed="Rbc1587afec3d4d31"/>
                     <a:stretch>
                       <a:fillRect/>
                     </a:stretch>
@@ -4336,7 +4336,7 @@
                     <pic:cNvPicPr/>
                   </pic:nvPicPr>
                   <pic:blipFill>
-                    <a:blip xmlns:r="http://schemas.openxmlformats.org/officeDocument/2006/relationships" r:embed="R3823a98428e641d6"/>
+                    <a:blip xmlns:r="http://schemas.openxmlformats.org/officeDocument/2006/relationships" r:embed="Ra28e3d83c02e4a9f"/>
                     <a:stretch>
                       <a:fillRect/>
                     </a:stretch>
@@ -4528,7 +4528,7 @@
                     <pic:cNvPicPr/>
                   </pic:nvPicPr>
                   <pic:blipFill>
-                    <a:blip xmlns:r="http://schemas.openxmlformats.org/officeDocument/2006/relationships" r:embed="R0b7ce6066c8c4ee3"/>
+                    <a:blip xmlns:r="http://schemas.openxmlformats.org/officeDocument/2006/relationships" r:embed="R84a783ed3afa4ce5"/>
                     <a:stretch>
                       <a:fillRect/>
                     </a:stretch>
@@ -4579,7 +4579,7 @@
                     <pic:cNvPicPr/>
                   </pic:nvPicPr>
                   <pic:blipFill>
-                    <a:blip xmlns:r="http://schemas.openxmlformats.org/officeDocument/2006/relationships" r:embed="Re0f7e077b0e543dd"/>
+                    <a:blip xmlns:r="http://schemas.openxmlformats.org/officeDocument/2006/relationships" r:embed="R0c536693c75c49cc"/>
                     <a:stretch>
                       <a:fillRect/>
                     </a:stretch>
@@ -4630,7 +4630,7 @@
                     <pic:cNvPicPr/>
                   </pic:nvPicPr>
                   <pic:blipFill>
-                    <a:blip xmlns:r="http://schemas.openxmlformats.org/officeDocument/2006/relationships" r:embed="R973fb0e0d7014f69"/>
+                    <a:blip xmlns:r="http://schemas.openxmlformats.org/officeDocument/2006/relationships" r:embed="Ra23ec2d8f7f24012"/>
                     <a:stretch>
                       <a:fillRect/>
                     </a:stretch>
@@ -4681,7 +4681,7 @@
                     <pic:cNvPicPr/>
                   </pic:nvPicPr>
                   <pic:blipFill>
-                    <a:blip xmlns:r="http://schemas.openxmlformats.org/officeDocument/2006/relationships" r:embed="Rfa9b2dbe463d403e"/>
+                    <a:blip xmlns:r="http://schemas.openxmlformats.org/officeDocument/2006/relationships" r:embed="R202ee7b4c5e64798"/>
                     <a:stretch>
                       <a:fillRect/>
                     </a:stretch>
@@ -5060,7 +5060,7 @@
                     <pic:cNvPicPr/>
                   </pic:nvPicPr>
                   <pic:blipFill>
-                    <a:blip xmlns:r="http://schemas.openxmlformats.org/officeDocument/2006/relationships" r:embed="Re308e64c36684746"/>
+                    <a:blip xmlns:r="http://schemas.openxmlformats.org/officeDocument/2006/relationships" r:embed="R7ea5da886e9c480f"/>
                     <a:stretch>
                       <a:fillRect/>
                     </a:stretch>
@@ -5741,7 +5741,7 @@
             <w:r>
               <w:t xml:space="preserve">Cell with </w:t>
             </w:r>
-            <w:hyperlink xmlns:r="http://schemas.openxmlformats.org/officeDocument/2006/relationships" w:history="true" r:id="R18e6ca2f1a0843bf">
+            <w:hyperlink xmlns:r="http://schemas.openxmlformats.org/officeDocument/2006/relationships" w:history="true" r:id="R3e4916fa37ad47c9">
               <w:r>
                 <w:rPr>
                   <w:rStyle w:val="Hyperlink"/>
@@ -6027,7 +6027,7 @@
                           <pic:cNvPicPr/>
                         </pic:nvPicPr>
                         <pic:blipFill>
-                          <a:blip xmlns:r="http://schemas.openxmlformats.org/officeDocument/2006/relationships" r:embed="R662bc188d27f4a9a"/>
+                          <a:blip xmlns:r="http://schemas.openxmlformats.org/officeDocument/2006/relationships" r:embed="Rd82c7537f6b049da"/>
                           <a:stretch>
                             <a:fillRect/>
                           </a:stretch>
@@ -6127,7 +6127,7 @@
                     <pic:cNvPicPr/>
                   </pic:nvPicPr>
                   <pic:blipFill>
-                    <a:blip xmlns:r="http://schemas.openxmlformats.org/officeDocument/2006/relationships" r:embed="R36bef92f2f7d4375"/>
+                    <a:blip xmlns:r="http://schemas.openxmlformats.org/officeDocument/2006/relationships" r:embed="R9ebc4afdc5d94143"/>
                     <a:stretch>
                       <a:fillRect/>
                     </a:stretch>
@@ -6177,7 +6177,7 @@
                     <pic:cNvPicPr/>
                   </pic:nvPicPr>
                   <pic:blipFill>
-                    <a:blip xmlns:r="http://schemas.openxmlformats.org/officeDocument/2006/relationships" r:embed="R96aa0b66a6304a7a"/>
+                    <a:blip xmlns:r="http://schemas.openxmlformats.org/officeDocument/2006/relationships" r:embed="Rfca63aff539e4bff"/>
                     <a:stretch>
                       <a:fillRect/>
                     </a:stretch>
@@ -6227,7 +6227,7 @@
                     <pic:cNvPicPr/>
                   </pic:nvPicPr>
                   <pic:blipFill>
-                    <a:blip xmlns:r="http://schemas.openxmlformats.org/officeDocument/2006/relationships" r:embed="R16b23f214fe44ad4"/>
+                    <a:blip xmlns:r="http://schemas.openxmlformats.org/officeDocument/2006/relationships" r:embed="Rc3baae6b05014429"/>
                     <a:stretch>
                       <a:fillRect/>
                     </a:stretch>

</xml_diff>

<commit_message>
fix(flowchart): snap decision branch targets to side-centre
When a decision Yes/No branch targets a node with a single incoming edge, attach to the midpoint of the side facing the source.

Made-with: Cursor
</commit_message>
<xml_diff>
--- a/test.docx
+++ b/test.docx
@@ -236,7 +236,7 @@
       <w:r>
         <w:t xml:space="preserve">, and </w:t>
       </w:r>
-      <w:hyperlink xmlns:r="http://schemas.openxmlformats.org/officeDocument/2006/relationships" w:history="true" r:id="R9c0a5d47d8e34803">
+      <w:hyperlink xmlns:r="http://schemas.openxmlformats.org/officeDocument/2006/relationships" w:history="true" r:id="Rfdd2520119ba4ab3">
         <w:r>
           <w:rPr>
             <w:rStyle w:val="Hyperlink"/>
@@ -475,7 +475,7 @@
       <w:r>
         <w:t xml:space="preserve">Direct link: </w:t>
       </w:r>
-      <w:hyperlink xmlns:r="http://schemas.openxmlformats.org/officeDocument/2006/relationships" w:history="true" r:id="R53dada29b3d04a07">
+      <w:hyperlink xmlns:r="http://schemas.openxmlformats.org/officeDocument/2006/relationships" w:history="true" r:id="Rfc07240ff5fd4005">
         <w:r>
           <w:rPr>
             <w:rStyle w:val="Hyperlink"/>
@@ -496,7 +496,7 @@
       <w:r>
         <w:t xml:space="preserve">Direct link with title: </w:t>
       </w:r>
-      <w:hyperlink xmlns:r="http://schemas.openxmlformats.org/officeDocument/2006/relationships" w:history="true" r:id="R80b0a12d475d4742">
+      <w:hyperlink xmlns:r="http://schemas.openxmlformats.org/officeDocument/2006/relationships" w:history="true" r:id="R2b757d6ec0d144ee">
         <w:r>
           <w:rPr>
             <w:rStyle w:val="Hyperlink"/>
@@ -517,7 +517,7 @@
       <w:r>
         <w:t xml:space="preserve">Reference-style link: </w:t>
       </w:r>
-      <w:hyperlink xmlns:r="http://schemas.openxmlformats.org/officeDocument/2006/relationships" w:history="true" r:id="Rfcd978e36aec404f">
+      <w:hyperlink xmlns:r="http://schemas.openxmlformats.org/officeDocument/2006/relationships" w:history="true" r:id="R00b5f497b2e34141">
         <w:r>
           <w:rPr>
             <w:rStyle w:val="Hyperlink"/>
@@ -538,7 +538,7 @@
       <w:r>
         <w:t xml:space="preserve">Collapsed reference link: </w:t>
       </w:r>
-      <w:hyperlink xmlns:r="http://schemas.openxmlformats.org/officeDocument/2006/relationships" w:history="true" r:id="Red577206f1f84526">
+      <w:hyperlink xmlns:r="http://schemas.openxmlformats.org/officeDocument/2006/relationships" w:history="true" r:id="R882b3201df8b4d89">
         <w:r>
           <w:rPr>
             <w:rStyle w:val="Hyperlink"/>
@@ -559,7 +559,7 @@
       <w:r>
         <w:t xml:space="preserve">Repeated reference link: </w:t>
       </w:r>
-      <w:hyperlink xmlns:r="http://schemas.openxmlformats.org/officeDocument/2006/relationships" w:history="true" r:id="Ra7a9d7182c034d9a">
+      <w:hyperlink xmlns:r="http://schemas.openxmlformats.org/officeDocument/2006/relationships" w:history="true" r:id="R9c3fe8dffc854b1b">
         <w:r>
           <w:rPr>
             <w:rStyle w:val="Hyperlink"/>
@@ -580,7 +580,7 @@
       <w:r>
         <w:t xml:space="preserve">Autolink URL: </w:t>
       </w:r>
-      <w:hyperlink xmlns:r="http://schemas.openxmlformats.org/officeDocument/2006/relationships" w:history="true" r:id="Rd2e478b76ae24388">
+      <w:hyperlink xmlns:r="http://schemas.openxmlformats.org/officeDocument/2006/relationships" w:history="true" r:id="R86fb490ca03f4ae5">
         <w:r>
           <w:rPr>
             <w:rStyle w:val="Hyperlink"/>
@@ -601,7 +601,7 @@
       <w:r>
         <w:t xml:space="preserve">Autolink email: </w:t>
       </w:r>
-      <w:hyperlink xmlns:r="http://schemas.openxmlformats.org/officeDocument/2006/relationships" w:history="true" r:id="Rbe827cc05ca04a3c">
+      <w:hyperlink xmlns:r="http://schemas.openxmlformats.org/officeDocument/2006/relationships" w:history="true" r:id="R0a9442784fc34820">
         <w:r>
           <w:rPr>
             <w:rStyle w:val="Hyperlink"/>
@@ -700,7 +700,7 @@
       <w:r>
         <w:t xml:space="preserve">, and </w:t>
       </w:r>
-      <w:hyperlink xmlns:r="http://schemas.openxmlformats.org/officeDocument/2006/relationships" w:history="true" r:id="R7880001d8eed44bc">
+      <w:hyperlink xmlns:r="http://schemas.openxmlformats.org/officeDocument/2006/relationships" w:history="true" r:id="Rc7375e62fb2c4e18">
         <w:r>
           <w:rPr>
             <w:rStyle w:val="Hyperlink"/>
@@ -1093,7 +1093,7 @@
       <w:r>
         <w:t xml:space="preserve">Continuation paragraph with </w:t>
       </w:r>
-      <w:hyperlink xmlns:r="http://schemas.openxmlformats.org/officeDocument/2006/relationships" w:history="true" r:id="R055319c2d8a84446">
+      <w:hyperlink xmlns:r="http://schemas.openxmlformats.org/officeDocument/2006/relationships" w:history="true" r:id="Rd4c91211eae743a4">
         <w:r>
           <w:rPr>
             <w:rStyle w:val="Hyperlink"/>
@@ -1591,7 +1591,7 @@
       <w:r>
         <w:t xml:space="preserve">, and </w:t>
       </w:r>
-      <w:hyperlink xmlns:r="http://schemas.openxmlformats.org/officeDocument/2006/relationships" w:history="true" r:id="R57cb3aacd91441fe">
+      <w:hyperlink xmlns:r="http://schemas.openxmlformats.org/officeDocument/2006/relationships" w:history="true" r:id="R0cff63efbf344dfb">
         <w:r>
           <w:rPr>
             <w:rStyle w:val="Hyperlink"/>
@@ -1979,7 +1979,7 @@
                     <pic:cNvPicPr/>
                   </pic:nvPicPr>
                   <pic:blipFill>
-                    <a:blip xmlns:r="http://schemas.openxmlformats.org/officeDocument/2006/relationships" r:embed="Rb14d6109571b4a7f"/>
+                    <a:blip xmlns:r="http://schemas.openxmlformats.org/officeDocument/2006/relationships" r:embed="Rcc7585ce4e75491e"/>
                     <a:stretch>
                       <a:fillRect/>
                     </a:stretch>
@@ -2039,7 +2039,7 @@
                     <pic:cNvPicPr/>
                   </pic:nvPicPr>
                   <pic:blipFill>
-                    <a:blip xmlns:r="http://schemas.openxmlformats.org/officeDocument/2006/relationships" r:embed="R01a3f7ef0b884a3c"/>
+                    <a:blip xmlns:r="http://schemas.openxmlformats.org/officeDocument/2006/relationships" r:embed="R8f02d35961b14d7b"/>
                     <a:stretch>
                       <a:fillRect/>
                     </a:stretch>
@@ -2099,7 +2099,7 @@
                     <pic:cNvPicPr/>
                   </pic:nvPicPr>
                   <pic:blipFill>
-                    <a:blip xmlns:r="http://schemas.openxmlformats.org/officeDocument/2006/relationships" r:embed="R24fbde18f6f14cc9"/>
+                    <a:blip xmlns:r="http://schemas.openxmlformats.org/officeDocument/2006/relationships" r:embed="R48780b0aacc84f24"/>
                     <a:stretch>
                       <a:fillRect/>
                     </a:stretch>
@@ -2150,7 +2150,7 @@
                     <pic:cNvPicPr/>
                   </pic:nvPicPr>
                   <pic:blipFill>
-                    <a:blip xmlns:r="http://schemas.openxmlformats.org/officeDocument/2006/relationships" r:embed="R9b9851e53a7b4bd4"/>
+                    <a:blip xmlns:r="http://schemas.openxmlformats.org/officeDocument/2006/relationships" r:embed="R40dc9dde36504566"/>
                     <a:stretch>
                       <a:fillRect/>
                     </a:stretch>
@@ -2201,7 +2201,7 @@
                     <pic:cNvPicPr/>
                   </pic:nvPicPr>
                   <pic:blipFill>
-                    <a:blip xmlns:r="http://schemas.openxmlformats.org/officeDocument/2006/relationships" r:embed="Ra8b9aeb035ad4350"/>
+                    <a:blip xmlns:r="http://schemas.openxmlformats.org/officeDocument/2006/relationships" r:embed="Rcc60b8ee052142d4"/>
                     <a:stretch>
                       <a:fillRect/>
                     </a:stretch>
@@ -2252,7 +2252,7 @@
                     <pic:cNvPicPr/>
                   </pic:nvPicPr>
                   <pic:blipFill>
-                    <a:blip xmlns:r="http://schemas.openxmlformats.org/officeDocument/2006/relationships" r:embed="R8663b5c46e0c4a06"/>
+                    <a:blip xmlns:r="http://schemas.openxmlformats.org/officeDocument/2006/relationships" r:embed="R8a533cc793844f71"/>
                     <a:stretch>
                       <a:fillRect/>
                     </a:stretch>
@@ -2303,7 +2303,7 @@
                     <pic:cNvPicPr/>
                   </pic:nvPicPr>
                   <pic:blipFill>
-                    <a:blip xmlns:r="http://schemas.openxmlformats.org/officeDocument/2006/relationships" r:embed="Rd8c3c21209924812"/>
+                    <a:blip xmlns:r="http://schemas.openxmlformats.org/officeDocument/2006/relationships" r:embed="R9a390a8610ee458f"/>
                     <a:stretch>
                       <a:fillRect/>
                     </a:stretch>
@@ -2354,7 +2354,7 @@
                     <pic:cNvPicPr/>
                   </pic:nvPicPr>
                   <pic:blipFill>
-                    <a:blip xmlns:r="http://schemas.openxmlformats.org/officeDocument/2006/relationships" r:embed="R1a9581f80ba34ad7"/>
+                    <a:blip xmlns:r="http://schemas.openxmlformats.org/officeDocument/2006/relationships" r:embed="R734f562b15e84a87"/>
                     <a:stretch>
                       <a:fillRect/>
                     </a:stretch>
@@ -2430,7 +2430,7 @@
                     <pic:cNvPicPr/>
                   </pic:nvPicPr>
                   <pic:blipFill>
-                    <a:blip xmlns:r="http://schemas.openxmlformats.org/officeDocument/2006/relationships" r:embed="Rca5f232782d74d93"/>
+                    <a:blip xmlns:r="http://schemas.openxmlformats.org/officeDocument/2006/relationships" r:embed="Rba9fbefbea9449d6"/>
                     <a:stretch>
                       <a:fillRect/>
                     </a:stretch>
@@ -2481,7 +2481,7 @@
                     <pic:cNvPicPr/>
                   </pic:nvPicPr>
                   <pic:blipFill>
-                    <a:blip xmlns:r="http://schemas.openxmlformats.org/officeDocument/2006/relationships" r:embed="R95c504a736b84b08"/>
+                    <a:blip xmlns:r="http://schemas.openxmlformats.org/officeDocument/2006/relationships" r:embed="Rb43bf8e0ac7241fe"/>
                     <a:stretch>
                       <a:fillRect/>
                     </a:stretch>
@@ -2532,7 +2532,7 @@
                     <pic:cNvPicPr/>
                   </pic:nvPicPr>
                   <pic:blipFill>
-                    <a:blip xmlns:r="http://schemas.openxmlformats.org/officeDocument/2006/relationships" r:embed="Rda710f090fe24eba"/>
+                    <a:blip xmlns:r="http://schemas.openxmlformats.org/officeDocument/2006/relationships" r:embed="R690e1ca1af204b20"/>
                     <a:stretch>
                       <a:fillRect/>
                     </a:stretch>
@@ -2583,7 +2583,7 @@
                     <pic:cNvPicPr/>
                   </pic:nvPicPr>
                   <pic:blipFill>
-                    <a:blip xmlns:r="http://schemas.openxmlformats.org/officeDocument/2006/relationships" r:embed="R88a599a8f1424ebe"/>
+                    <a:blip xmlns:r="http://schemas.openxmlformats.org/officeDocument/2006/relationships" r:embed="R92c49eb85a534100"/>
                     <a:stretch>
                       <a:fillRect/>
                     </a:stretch>
@@ -2659,7 +2659,7 @@
                     <pic:cNvPicPr/>
                   </pic:nvPicPr>
                   <pic:blipFill>
-                    <a:blip xmlns:r="http://schemas.openxmlformats.org/officeDocument/2006/relationships" r:embed="R9c3286e9faf64afc"/>
+                    <a:blip xmlns:r="http://schemas.openxmlformats.org/officeDocument/2006/relationships" r:embed="Rb6bafdd16d18479b"/>
                     <a:stretch>
                       <a:fillRect/>
                     </a:stretch>
@@ -2710,7 +2710,7 @@
                     <pic:cNvPicPr/>
                   </pic:nvPicPr>
                   <pic:blipFill>
-                    <a:blip xmlns:r="http://schemas.openxmlformats.org/officeDocument/2006/relationships" r:embed="Re33293ebad8046f2"/>
+                    <a:blip xmlns:r="http://schemas.openxmlformats.org/officeDocument/2006/relationships" r:embed="R682d8174d7d1462e"/>
                     <a:stretch>
                       <a:fillRect/>
                     </a:stretch>
@@ -2761,7 +2761,7 @@
                     <pic:cNvPicPr/>
                   </pic:nvPicPr>
                   <pic:blipFill>
-                    <a:blip xmlns:r="http://schemas.openxmlformats.org/officeDocument/2006/relationships" r:embed="Rd1cd99fb17bb4ebc"/>
+                    <a:blip xmlns:r="http://schemas.openxmlformats.org/officeDocument/2006/relationships" r:embed="R6d20c2366bd8484e"/>
                     <a:stretch>
                       <a:fillRect/>
                     </a:stretch>
@@ -2812,7 +2812,7 @@
                     <pic:cNvPicPr/>
                   </pic:nvPicPr>
                   <pic:blipFill>
-                    <a:blip xmlns:r="http://schemas.openxmlformats.org/officeDocument/2006/relationships" r:embed="R8352695a73444a08"/>
+                    <a:blip xmlns:r="http://schemas.openxmlformats.org/officeDocument/2006/relationships" r:embed="Rb8305fc2875841b0"/>
                     <a:stretch>
                       <a:fillRect/>
                     </a:stretch>
@@ -2863,7 +2863,7 @@
                     <pic:cNvPicPr/>
                   </pic:nvPicPr>
                   <pic:blipFill>
-                    <a:blip xmlns:r="http://schemas.openxmlformats.org/officeDocument/2006/relationships" r:embed="Rcb8dde5fa1e84114"/>
+                    <a:blip xmlns:r="http://schemas.openxmlformats.org/officeDocument/2006/relationships" r:embed="R7e65c17a00cb4aee"/>
                     <a:stretch>
                       <a:fillRect/>
                     </a:stretch>
@@ -2914,7 +2914,7 @@
                     <pic:cNvPicPr/>
                   </pic:nvPicPr>
                   <pic:blipFill>
-                    <a:blip xmlns:r="http://schemas.openxmlformats.org/officeDocument/2006/relationships" r:embed="Rd8bb6a2cf521456d"/>
+                    <a:blip xmlns:r="http://schemas.openxmlformats.org/officeDocument/2006/relationships" r:embed="R16e42014c0104bc5"/>
                     <a:stretch>
                       <a:fillRect/>
                     </a:stretch>
@@ -2965,7 +2965,7 @@
                     <pic:cNvPicPr/>
                   </pic:nvPicPr>
                   <pic:blipFill>
-                    <a:blip xmlns:r="http://schemas.openxmlformats.org/officeDocument/2006/relationships" r:embed="R68d921bffb714ef3"/>
+                    <a:blip xmlns:r="http://schemas.openxmlformats.org/officeDocument/2006/relationships" r:embed="Re096dd9bf2364e13"/>
                     <a:stretch>
                       <a:fillRect/>
                     </a:stretch>
@@ -3016,7 +3016,7 @@
                     <pic:cNvPicPr/>
                   </pic:nvPicPr>
                   <pic:blipFill>
-                    <a:blip xmlns:r="http://schemas.openxmlformats.org/officeDocument/2006/relationships" r:embed="R6e7a02956f894215"/>
+                    <a:blip xmlns:r="http://schemas.openxmlformats.org/officeDocument/2006/relationships" r:embed="R391427043385430e"/>
                     <a:stretch>
                       <a:fillRect/>
                     </a:stretch>
@@ -3067,7 +3067,7 @@
                     <pic:cNvPicPr/>
                   </pic:nvPicPr>
                   <pic:blipFill>
-                    <a:blip xmlns:r="http://schemas.openxmlformats.org/officeDocument/2006/relationships" r:embed="Rb773d5b4ad9f41d9"/>
+                    <a:blip xmlns:r="http://schemas.openxmlformats.org/officeDocument/2006/relationships" r:embed="Ra861231e2f8a47b4"/>
                     <a:stretch>
                       <a:fillRect/>
                     </a:stretch>
@@ -3118,7 +3118,7 @@
                     <pic:cNvPicPr/>
                   </pic:nvPicPr>
                   <pic:blipFill>
-                    <a:blip xmlns:r="http://schemas.openxmlformats.org/officeDocument/2006/relationships" r:embed="Rf3a1704389104d4c"/>
+                    <a:blip xmlns:r="http://schemas.openxmlformats.org/officeDocument/2006/relationships" r:embed="Rfae02d0380804fbc"/>
                     <a:stretch>
                       <a:fillRect/>
                     </a:stretch>
@@ -3354,7 +3354,7 @@
                     <pic:cNvPicPr/>
                   </pic:nvPicPr>
                   <pic:blipFill>
-                    <a:blip xmlns:r="http://schemas.openxmlformats.org/officeDocument/2006/relationships" r:embed="Rfad6ca7b5b1f42e8"/>
+                    <a:blip xmlns:r="http://schemas.openxmlformats.org/officeDocument/2006/relationships" r:embed="R74dd1182071d4267"/>
                     <a:stretch>
                       <a:fillRect/>
                     </a:stretch>
@@ -3405,7 +3405,7 @@
                     <pic:cNvPicPr/>
                   </pic:nvPicPr>
                   <pic:blipFill>
-                    <a:blip xmlns:r="http://schemas.openxmlformats.org/officeDocument/2006/relationships" r:embed="R2fb9158ec8c24b9c"/>
+                    <a:blip xmlns:r="http://schemas.openxmlformats.org/officeDocument/2006/relationships" r:embed="Rfbb16b076db6476c"/>
                     <a:stretch>
                       <a:fillRect/>
                     </a:stretch>
@@ -3456,7 +3456,7 @@
                     <pic:cNvPicPr/>
                   </pic:nvPicPr>
                   <pic:blipFill>
-                    <a:blip xmlns:r="http://schemas.openxmlformats.org/officeDocument/2006/relationships" r:embed="R924ece9b0a6b4776"/>
+                    <a:blip xmlns:r="http://schemas.openxmlformats.org/officeDocument/2006/relationships" r:embed="R4d29a34308a74c11"/>
                     <a:stretch>
                       <a:fillRect/>
                     </a:stretch>
@@ -3507,7 +3507,7 @@
                     <pic:cNvPicPr/>
                   </pic:nvPicPr>
                   <pic:blipFill>
-                    <a:blip xmlns:r="http://schemas.openxmlformats.org/officeDocument/2006/relationships" r:embed="R7ed847cdb8a74678"/>
+                    <a:blip xmlns:r="http://schemas.openxmlformats.org/officeDocument/2006/relationships" r:embed="R50d869b636d4459a"/>
                     <a:stretch>
                       <a:fillRect/>
                     </a:stretch>
@@ -3558,7 +3558,7 @@
                     <pic:cNvPicPr/>
                   </pic:nvPicPr>
                   <pic:blipFill>
-                    <a:blip xmlns:r="http://schemas.openxmlformats.org/officeDocument/2006/relationships" r:embed="Re5ec9cb5555043ed"/>
+                    <a:blip xmlns:r="http://schemas.openxmlformats.org/officeDocument/2006/relationships" r:embed="R15d16a6ee99947ad"/>
                     <a:stretch>
                       <a:fillRect/>
                     </a:stretch>
@@ -3609,7 +3609,7 @@
                     <pic:cNvPicPr/>
                   </pic:nvPicPr>
                   <pic:blipFill>
-                    <a:blip xmlns:r="http://schemas.openxmlformats.org/officeDocument/2006/relationships" r:embed="Rff1cb10141ea4dab"/>
+                    <a:blip xmlns:r="http://schemas.openxmlformats.org/officeDocument/2006/relationships" r:embed="R603e8aee9c16423f"/>
                     <a:stretch>
                       <a:fillRect/>
                     </a:stretch>
@@ -3660,7 +3660,7 @@
                     <pic:cNvPicPr/>
                   </pic:nvPicPr>
                   <pic:blipFill>
-                    <a:blip xmlns:r="http://schemas.openxmlformats.org/officeDocument/2006/relationships" r:embed="R0a90024534ab47ab"/>
+                    <a:blip xmlns:r="http://schemas.openxmlformats.org/officeDocument/2006/relationships" r:embed="Ra7f82c8eb8e24b9c"/>
                     <a:stretch>
                       <a:fillRect/>
                     </a:stretch>
@@ -3711,7 +3711,7 @@
                     <pic:cNvPicPr/>
                   </pic:nvPicPr>
                   <pic:blipFill>
-                    <a:blip xmlns:r="http://schemas.openxmlformats.org/officeDocument/2006/relationships" r:embed="Rb6f52aef02954190"/>
+                    <a:blip xmlns:r="http://schemas.openxmlformats.org/officeDocument/2006/relationships" r:embed="Rae6e0dd3b40047d1"/>
                     <a:stretch>
                       <a:fillRect/>
                     </a:stretch>
@@ -3762,7 +3762,7 @@
                     <pic:cNvPicPr/>
                   </pic:nvPicPr>
                   <pic:blipFill>
-                    <a:blip xmlns:r="http://schemas.openxmlformats.org/officeDocument/2006/relationships" r:embed="Rc7700e4fa30a4317"/>
+                    <a:blip xmlns:r="http://schemas.openxmlformats.org/officeDocument/2006/relationships" r:embed="R753625967f8a454d"/>
                     <a:stretch>
                       <a:fillRect/>
                     </a:stretch>
@@ -3859,7 +3859,7 @@
                     <pic:cNvPicPr/>
                   </pic:nvPicPr>
                   <pic:blipFill>
-                    <a:blip xmlns:r="http://schemas.openxmlformats.org/officeDocument/2006/relationships" r:embed="R4ca6b2cbf134442b"/>
+                    <a:blip xmlns:r="http://schemas.openxmlformats.org/officeDocument/2006/relationships" r:embed="R7a19620bb9534d12"/>
                     <a:stretch>
                       <a:fillRect/>
                     </a:stretch>
@@ -3902,7 +3902,7 @@
                     <pic:cNvPicPr/>
                   </pic:nvPicPr>
                   <pic:blipFill>
-                    <a:blip xmlns:r="http://schemas.openxmlformats.org/officeDocument/2006/relationships" r:embed="R5b407bb9d7e94e20"/>
+                    <a:blip xmlns:r="http://schemas.openxmlformats.org/officeDocument/2006/relationships" r:embed="R840608e295064cd8"/>
                     <a:stretch>
                       <a:fillRect/>
                     </a:stretch>
@@ -3945,7 +3945,7 @@
                     <pic:cNvPicPr/>
                   </pic:nvPicPr>
                   <pic:blipFill>
-                    <a:blip xmlns:r="http://schemas.openxmlformats.org/officeDocument/2006/relationships" r:embed="Rb806cf88295c4327"/>
+                    <a:blip xmlns:r="http://schemas.openxmlformats.org/officeDocument/2006/relationships" r:embed="R2fcd8a2e40ed4d3e"/>
                     <a:stretch>
                       <a:fillRect/>
                     </a:stretch>
@@ -3988,7 +3988,7 @@
                     <pic:cNvPicPr/>
                   </pic:nvPicPr>
                   <pic:blipFill>
-                    <a:blip xmlns:r="http://schemas.openxmlformats.org/officeDocument/2006/relationships" r:embed="R24f68fadc37a414e"/>
+                    <a:blip xmlns:r="http://schemas.openxmlformats.org/officeDocument/2006/relationships" r:embed="R8340dc0718044791"/>
                     <a:stretch>
                       <a:fillRect/>
                     </a:stretch>
@@ -4083,7 +4083,7 @@
                     <pic:cNvPicPr/>
                   </pic:nvPicPr>
                   <pic:blipFill>
-                    <a:blip xmlns:r="http://schemas.openxmlformats.org/officeDocument/2006/relationships" r:embed="Rbc1587afec3d4d31"/>
+                    <a:blip xmlns:r="http://schemas.openxmlformats.org/officeDocument/2006/relationships" r:embed="R2308c0c174fe4887"/>
                     <a:stretch>
                       <a:fillRect/>
                     </a:stretch>
@@ -4336,7 +4336,7 @@
                     <pic:cNvPicPr/>
                   </pic:nvPicPr>
                   <pic:blipFill>
-                    <a:blip xmlns:r="http://schemas.openxmlformats.org/officeDocument/2006/relationships" r:embed="Ra28e3d83c02e4a9f"/>
+                    <a:blip xmlns:r="http://schemas.openxmlformats.org/officeDocument/2006/relationships" r:embed="R6c20f74de17f4d3f"/>
                     <a:stretch>
                       <a:fillRect/>
                     </a:stretch>
@@ -4528,7 +4528,7 @@
                     <pic:cNvPicPr/>
                   </pic:nvPicPr>
                   <pic:blipFill>
-                    <a:blip xmlns:r="http://schemas.openxmlformats.org/officeDocument/2006/relationships" r:embed="R84a783ed3afa4ce5"/>
+                    <a:blip xmlns:r="http://schemas.openxmlformats.org/officeDocument/2006/relationships" r:embed="Rb9fd6add49b64406"/>
                     <a:stretch>
                       <a:fillRect/>
                     </a:stretch>
@@ -4579,7 +4579,7 @@
                     <pic:cNvPicPr/>
                   </pic:nvPicPr>
                   <pic:blipFill>
-                    <a:blip xmlns:r="http://schemas.openxmlformats.org/officeDocument/2006/relationships" r:embed="R0c536693c75c49cc"/>
+                    <a:blip xmlns:r="http://schemas.openxmlformats.org/officeDocument/2006/relationships" r:embed="Rd1fb38283a1a4352"/>
                     <a:stretch>
                       <a:fillRect/>
                     </a:stretch>
@@ -4630,7 +4630,7 @@
                     <pic:cNvPicPr/>
                   </pic:nvPicPr>
                   <pic:blipFill>
-                    <a:blip xmlns:r="http://schemas.openxmlformats.org/officeDocument/2006/relationships" r:embed="Ra23ec2d8f7f24012"/>
+                    <a:blip xmlns:r="http://schemas.openxmlformats.org/officeDocument/2006/relationships" r:embed="R800b6c3f6c894a05"/>
                     <a:stretch>
                       <a:fillRect/>
                     </a:stretch>
@@ -4681,7 +4681,7 @@
                     <pic:cNvPicPr/>
                   </pic:nvPicPr>
                   <pic:blipFill>
-                    <a:blip xmlns:r="http://schemas.openxmlformats.org/officeDocument/2006/relationships" r:embed="R202ee7b4c5e64798"/>
+                    <a:blip xmlns:r="http://schemas.openxmlformats.org/officeDocument/2006/relationships" r:embed="R8b4f8715ba0c415c"/>
                     <a:stretch>
                       <a:fillRect/>
                     </a:stretch>
@@ -5060,7 +5060,7 @@
                     <pic:cNvPicPr/>
                   </pic:nvPicPr>
                   <pic:blipFill>
-                    <a:blip xmlns:r="http://schemas.openxmlformats.org/officeDocument/2006/relationships" r:embed="R7ea5da886e9c480f"/>
+                    <a:blip xmlns:r="http://schemas.openxmlformats.org/officeDocument/2006/relationships" r:embed="R8d5cd43f0fed4d44"/>
                     <a:stretch>
                       <a:fillRect/>
                     </a:stretch>
@@ -5741,7 +5741,7 @@
             <w:r>
               <w:t xml:space="preserve">Cell with </w:t>
             </w:r>
-            <w:hyperlink xmlns:r="http://schemas.openxmlformats.org/officeDocument/2006/relationships" w:history="true" r:id="R3e4916fa37ad47c9">
+            <w:hyperlink xmlns:r="http://schemas.openxmlformats.org/officeDocument/2006/relationships" w:history="true" r:id="R8683127b57a54665">
               <w:r>
                 <w:rPr>
                   <w:rStyle w:val="Hyperlink"/>
@@ -6027,7 +6027,7 @@
                           <pic:cNvPicPr/>
                         </pic:nvPicPr>
                         <pic:blipFill>
-                          <a:blip xmlns:r="http://schemas.openxmlformats.org/officeDocument/2006/relationships" r:embed="Rd82c7537f6b049da"/>
+                          <a:blip xmlns:r="http://schemas.openxmlformats.org/officeDocument/2006/relationships" r:embed="Re782c7b550d04966"/>
                           <a:stretch>
                             <a:fillRect/>
                           </a:stretch>
@@ -6127,7 +6127,7 @@
                     <pic:cNvPicPr/>
                   </pic:nvPicPr>
                   <pic:blipFill>
-                    <a:blip xmlns:r="http://schemas.openxmlformats.org/officeDocument/2006/relationships" r:embed="R9ebc4afdc5d94143"/>
+                    <a:blip xmlns:r="http://schemas.openxmlformats.org/officeDocument/2006/relationships" r:embed="R03656a3cde774d34"/>
                     <a:stretch>
                       <a:fillRect/>
                     </a:stretch>
@@ -6177,7 +6177,7 @@
                     <pic:cNvPicPr/>
                   </pic:nvPicPr>
                   <pic:blipFill>
-                    <a:blip xmlns:r="http://schemas.openxmlformats.org/officeDocument/2006/relationships" r:embed="Rfca63aff539e4bff"/>
+                    <a:blip xmlns:r="http://schemas.openxmlformats.org/officeDocument/2006/relationships" r:embed="R2af9b46cf16c49f1"/>
                     <a:stretch>
                       <a:fillRect/>
                     </a:stretch>
@@ -6227,7 +6227,7 @@
                     <pic:cNvPicPr/>
                   </pic:nvPicPr>
                   <pic:blipFill>
-                    <a:blip xmlns:r="http://schemas.openxmlformats.org/officeDocument/2006/relationships" r:embed="Rc3baae6b05014429"/>
+                    <a:blip xmlns:r="http://schemas.openxmlformats.org/officeDocument/2006/relationships" r:embed="R8c667219c18d41fb"/>
                     <a:stretch>
                       <a:fillRect/>
                     </a:stretch>

</xml_diff>

<commit_message>
fix(flowchart): add straight stubs on decision branches
Decision Yes/No branch links now include short straight segments at both ends (matching other flowchart edges) before/after the cubic.

Made-with: Cursor
</commit_message>
<xml_diff>
--- a/test.docx
+++ b/test.docx
@@ -236,7 +236,7 @@
       <w:r>
         <w:t xml:space="preserve">, and </w:t>
       </w:r>
-      <w:hyperlink xmlns:r="http://schemas.openxmlformats.org/officeDocument/2006/relationships" w:history="true" r:id="Rfdd2520119ba4ab3">
+      <w:hyperlink xmlns:r="http://schemas.openxmlformats.org/officeDocument/2006/relationships" w:history="true" r:id="R66ca03ce5c6a4364">
         <w:r>
           <w:rPr>
             <w:rStyle w:val="Hyperlink"/>
@@ -475,7 +475,7 @@
       <w:r>
         <w:t xml:space="preserve">Direct link: </w:t>
       </w:r>
-      <w:hyperlink xmlns:r="http://schemas.openxmlformats.org/officeDocument/2006/relationships" w:history="true" r:id="Rfc07240ff5fd4005">
+      <w:hyperlink xmlns:r="http://schemas.openxmlformats.org/officeDocument/2006/relationships" w:history="true" r:id="Rb8e0a41d784042c4">
         <w:r>
           <w:rPr>
             <w:rStyle w:val="Hyperlink"/>
@@ -496,7 +496,7 @@
       <w:r>
         <w:t xml:space="preserve">Direct link with title: </w:t>
       </w:r>
-      <w:hyperlink xmlns:r="http://schemas.openxmlformats.org/officeDocument/2006/relationships" w:history="true" r:id="R2b757d6ec0d144ee">
+      <w:hyperlink xmlns:r="http://schemas.openxmlformats.org/officeDocument/2006/relationships" w:history="true" r:id="R4f1b72dc165c4c6b">
         <w:r>
           <w:rPr>
             <w:rStyle w:val="Hyperlink"/>
@@ -517,7 +517,7 @@
       <w:r>
         <w:t xml:space="preserve">Reference-style link: </w:t>
       </w:r>
-      <w:hyperlink xmlns:r="http://schemas.openxmlformats.org/officeDocument/2006/relationships" w:history="true" r:id="R00b5f497b2e34141">
+      <w:hyperlink xmlns:r="http://schemas.openxmlformats.org/officeDocument/2006/relationships" w:history="true" r:id="R174b8fc8e6d34b71">
         <w:r>
           <w:rPr>
             <w:rStyle w:val="Hyperlink"/>
@@ -538,7 +538,7 @@
       <w:r>
         <w:t xml:space="preserve">Collapsed reference link: </w:t>
       </w:r>
-      <w:hyperlink xmlns:r="http://schemas.openxmlformats.org/officeDocument/2006/relationships" w:history="true" r:id="R882b3201df8b4d89">
+      <w:hyperlink xmlns:r="http://schemas.openxmlformats.org/officeDocument/2006/relationships" w:history="true" r:id="R9b929c0183584aac">
         <w:r>
           <w:rPr>
             <w:rStyle w:val="Hyperlink"/>
@@ -559,7 +559,7 @@
       <w:r>
         <w:t xml:space="preserve">Repeated reference link: </w:t>
       </w:r>
-      <w:hyperlink xmlns:r="http://schemas.openxmlformats.org/officeDocument/2006/relationships" w:history="true" r:id="R9c3fe8dffc854b1b">
+      <w:hyperlink xmlns:r="http://schemas.openxmlformats.org/officeDocument/2006/relationships" w:history="true" r:id="R4e8c8b41b1a54c7c">
         <w:r>
           <w:rPr>
             <w:rStyle w:val="Hyperlink"/>
@@ -580,7 +580,7 @@
       <w:r>
         <w:t xml:space="preserve">Autolink URL: </w:t>
       </w:r>
-      <w:hyperlink xmlns:r="http://schemas.openxmlformats.org/officeDocument/2006/relationships" w:history="true" r:id="R86fb490ca03f4ae5">
+      <w:hyperlink xmlns:r="http://schemas.openxmlformats.org/officeDocument/2006/relationships" w:history="true" r:id="Rc7c06aaf0b164ecb">
         <w:r>
           <w:rPr>
             <w:rStyle w:val="Hyperlink"/>
@@ -601,7 +601,7 @@
       <w:r>
         <w:t xml:space="preserve">Autolink email: </w:t>
       </w:r>
-      <w:hyperlink xmlns:r="http://schemas.openxmlformats.org/officeDocument/2006/relationships" w:history="true" r:id="R0a9442784fc34820">
+      <w:hyperlink xmlns:r="http://schemas.openxmlformats.org/officeDocument/2006/relationships" w:history="true" r:id="Rbcb58549c97d4a23">
         <w:r>
           <w:rPr>
             <w:rStyle w:val="Hyperlink"/>
@@ -700,7 +700,7 @@
       <w:r>
         <w:t xml:space="preserve">, and </w:t>
       </w:r>
-      <w:hyperlink xmlns:r="http://schemas.openxmlformats.org/officeDocument/2006/relationships" w:history="true" r:id="Rc7375e62fb2c4e18">
+      <w:hyperlink xmlns:r="http://schemas.openxmlformats.org/officeDocument/2006/relationships" w:history="true" r:id="R269554b009844190">
         <w:r>
           <w:rPr>
             <w:rStyle w:val="Hyperlink"/>
@@ -1093,7 +1093,7 @@
       <w:r>
         <w:t xml:space="preserve">Continuation paragraph with </w:t>
       </w:r>
-      <w:hyperlink xmlns:r="http://schemas.openxmlformats.org/officeDocument/2006/relationships" w:history="true" r:id="Rd4c91211eae743a4">
+      <w:hyperlink xmlns:r="http://schemas.openxmlformats.org/officeDocument/2006/relationships" w:history="true" r:id="R5764fac652184bee">
         <w:r>
           <w:rPr>
             <w:rStyle w:val="Hyperlink"/>
@@ -1591,7 +1591,7 @@
       <w:r>
         <w:t xml:space="preserve">, and </w:t>
       </w:r>
-      <w:hyperlink xmlns:r="http://schemas.openxmlformats.org/officeDocument/2006/relationships" w:history="true" r:id="R0cff63efbf344dfb">
+      <w:hyperlink xmlns:r="http://schemas.openxmlformats.org/officeDocument/2006/relationships" w:history="true" r:id="R2d5cba0f364c4f54">
         <w:r>
           <w:rPr>
             <w:rStyle w:val="Hyperlink"/>
@@ -1979,7 +1979,7 @@
                     <pic:cNvPicPr/>
                   </pic:nvPicPr>
                   <pic:blipFill>
-                    <a:blip xmlns:r="http://schemas.openxmlformats.org/officeDocument/2006/relationships" r:embed="Rcc7585ce4e75491e"/>
+                    <a:blip xmlns:r="http://schemas.openxmlformats.org/officeDocument/2006/relationships" r:embed="R0fbc90905c364f26"/>
                     <a:stretch>
                       <a:fillRect/>
                     </a:stretch>
@@ -2039,7 +2039,7 @@
                     <pic:cNvPicPr/>
                   </pic:nvPicPr>
                   <pic:blipFill>
-                    <a:blip xmlns:r="http://schemas.openxmlformats.org/officeDocument/2006/relationships" r:embed="R8f02d35961b14d7b"/>
+                    <a:blip xmlns:r="http://schemas.openxmlformats.org/officeDocument/2006/relationships" r:embed="R5f86dc47a08544c1"/>
                     <a:stretch>
                       <a:fillRect/>
                     </a:stretch>
@@ -2099,7 +2099,7 @@
                     <pic:cNvPicPr/>
                   </pic:nvPicPr>
                   <pic:blipFill>
-                    <a:blip xmlns:r="http://schemas.openxmlformats.org/officeDocument/2006/relationships" r:embed="R48780b0aacc84f24"/>
+                    <a:blip xmlns:r="http://schemas.openxmlformats.org/officeDocument/2006/relationships" r:embed="Rc073d53a9b4644e6"/>
                     <a:stretch>
                       <a:fillRect/>
                     </a:stretch>
@@ -2150,7 +2150,7 @@
                     <pic:cNvPicPr/>
                   </pic:nvPicPr>
                   <pic:blipFill>
-                    <a:blip xmlns:r="http://schemas.openxmlformats.org/officeDocument/2006/relationships" r:embed="R40dc9dde36504566"/>
+                    <a:blip xmlns:r="http://schemas.openxmlformats.org/officeDocument/2006/relationships" r:embed="R9e373c53408f4ddb"/>
                     <a:stretch>
                       <a:fillRect/>
                     </a:stretch>
@@ -2201,7 +2201,7 @@
                     <pic:cNvPicPr/>
                   </pic:nvPicPr>
                   <pic:blipFill>
-                    <a:blip xmlns:r="http://schemas.openxmlformats.org/officeDocument/2006/relationships" r:embed="Rcc60b8ee052142d4"/>
+                    <a:blip xmlns:r="http://schemas.openxmlformats.org/officeDocument/2006/relationships" r:embed="R0572dcff7a1a4630"/>
                     <a:stretch>
                       <a:fillRect/>
                     </a:stretch>
@@ -2252,7 +2252,7 @@
                     <pic:cNvPicPr/>
                   </pic:nvPicPr>
                   <pic:blipFill>
-                    <a:blip xmlns:r="http://schemas.openxmlformats.org/officeDocument/2006/relationships" r:embed="R8a533cc793844f71"/>
+                    <a:blip xmlns:r="http://schemas.openxmlformats.org/officeDocument/2006/relationships" r:embed="R95abcd5fedae4b28"/>
                     <a:stretch>
                       <a:fillRect/>
                     </a:stretch>
@@ -2303,7 +2303,7 @@
                     <pic:cNvPicPr/>
                   </pic:nvPicPr>
                   <pic:blipFill>
-                    <a:blip xmlns:r="http://schemas.openxmlformats.org/officeDocument/2006/relationships" r:embed="R9a390a8610ee458f"/>
+                    <a:blip xmlns:r="http://schemas.openxmlformats.org/officeDocument/2006/relationships" r:embed="Raa634cc5466240b2"/>
                     <a:stretch>
                       <a:fillRect/>
                     </a:stretch>
@@ -2354,7 +2354,7 @@
                     <pic:cNvPicPr/>
                   </pic:nvPicPr>
                   <pic:blipFill>
-                    <a:blip xmlns:r="http://schemas.openxmlformats.org/officeDocument/2006/relationships" r:embed="R734f562b15e84a87"/>
+                    <a:blip xmlns:r="http://schemas.openxmlformats.org/officeDocument/2006/relationships" r:embed="R5fd089bedd2241b1"/>
                     <a:stretch>
                       <a:fillRect/>
                     </a:stretch>
@@ -2430,7 +2430,7 @@
                     <pic:cNvPicPr/>
                   </pic:nvPicPr>
                   <pic:blipFill>
-                    <a:blip xmlns:r="http://schemas.openxmlformats.org/officeDocument/2006/relationships" r:embed="Rba9fbefbea9449d6"/>
+                    <a:blip xmlns:r="http://schemas.openxmlformats.org/officeDocument/2006/relationships" r:embed="R61124d61dd2d4773"/>
                     <a:stretch>
                       <a:fillRect/>
                     </a:stretch>
@@ -2481,7 +2481,7 @@
                     <pic:cNvPicPr/>
                   </pic:nvPicPr>
                   <pic:blipFill>
-                    <a:blip xmlns:r="http://schemas.openxmlformats.org/officeDocument/2006/relationships" r:embed="Rb43bf8e0ac7241fe"/>
+                    <a:blip xmlns:r="http://schemas.openxmlformats.org/officeDocument/2006/relationships" r:embed="R3cd91efd817c4cd1"/>
                     <a:stretch>
                       <a:fillRect/>
                     </a:stretch>
@@ -2532,7 +2532,7 @@
                     <pic:cNvPicPr/>
                   </pic:nvPicPr>
                   <pic:blipFill>
-                    <a:blip xmlns:r="http://schemas.openxmlformats.org/officeDocument/2006/relationships" r:embed="R690e1ca1af204b20"/>
+                    <a:blip xmlns:r="http://schemas.openxmlformats.org/officeDocument/2006/relationships" r:embed="R72dea2d6c572422c"/>
                     <a:stretch>
                       <a:fillRect/>
                     </a:stretch>
@@ -2583,7 +2583,7 @@
                     <pic:cNvPicPr/>
                   </pic:nvPicPr>
                   <pic:blipFill>
-                    <a:blip xmlns:r="http://schemas.openxmlformats.org/officeDocument/2006/relationships" r:embed="R92c49eb85a534100"/>
+                    <a:blip xmlns:r="http://schemas.openxmlformats.org/officeDocument/2006/relationships" r:embed="R8b60601b3eba406e"/>
                     <a:stretch>
                       <a:fillRect/>
                     </a:stretch>
@@ -2659,7 +2659,7 @@
                     <pic:cNvPicPr/>
                   </pic:nvPicPr>
                   <pic:blipFill>
-                    <a:blip xmlns:r="http://schemas.openxmlformats.org/officeDocument/2006/relationships" r:embed="Rb6bafdd16d18479b"/>
+                    <a:blip xmlns:r="http://schemas.openxmlformats.org/officeDocument/2006/relationships" r:embed="R4f1478fdd4024c2c"/>
                     <a:stretch>
                       <a:fillRect/>
                     </a:stretch>
@@ -2710,7 +2710,7 @@
                     <pic:cNvPicPr/>
                   </pic:nvPicPr>
                   <pic:blipFill>
-                    <a:blip xmlns:r="http://schemas.openxmlformats.org/officeDocument/2006/relationships" r:embed="R682d8174d7d1462e"/>
+                    <a:blip xmlns:r="http://schemas.openxmlformats.org/officeDocument/2006/relationships" r:embed="R34286d15b73a445f"/>
                     <a:stretch>
                       <a:fillRect/>
                     </a:stretch>
@@ -2761,7 +2761,7 @@
                     <pic:cNvPicPr/>
                   </pic:nvPicPr>
                   <pic:blipFill>
-                    <a:blip xmlns:r="http://schemas.openxmlformats.org/officeDocument/2006/relationships" r:embed="R6d20c2366bd8484e"/>
+                    <a:blip xmlns:r="http://schemas.openxmlformats.org/officeDocument/2006/relationships" r:embed="Rce1deabb65e14684"/>
                     <a:stretch>
                       <a:fillRect/>
                     </a:stretch>
@@ -2812,7 +2812,7 @@
                     <pic:cNvPicPr/>
                   </pic:nvPicPr>
                   <pic:blipFill>
-                    <a:blip xmlns:r="http://schemas.openxmlformats.org/officeDocument/2006/relationships" r:embed="Rb8305fc2875841b0"/>
+                    <a:blip xmlns:r="http://schemas.openxmlformats.org/officeDocument/2006/relationships" r:embed="R59d1f57add5e411e"/>
                     <a:stretch>
                       <a:fillRect/>
                     </a:stretch>
@@ -2863,7 +2863,7 @@
                     <pic:cNvPicPr/>
                   </pic:nvPicPr>
                   <pic:blipFill>
-                    <a:blip xmlns:r="http://schemas.openxmlformats.org/officeDocument/2006/relationships" r:embed="R7e65c17a00cb4aee"/>
+                    <a:blip xmlns:r="http://schemas.openxmlformats.org/officeDocument/2006/relationships" r:embed="R635ae601b2654e32"/>
                     <a:stretch>
                       <a:fillRect/>
                     </a:stretch>
@@ -2914,7 +2914,7 @@
                     <pic:cNvPicPr/>
                   </pic:nvPicPr>
                   <pic:blipFill>
-                    <a:blip xmlns:r="http://schemas.openxmlformats.org/officeDocument/2006/relationships" r:embed="R16e42014c0104bc5"/>
+                    <a:blip xmlns:r="http://schemas.openxmlformats.org/officeDocument/2006/relationships" r:embed="R4d00478d5ddf4a09"/>
                     <a:stretch>
                       <a:fillRect/>
                     </a:stretch>
@@ -2965,7 +2965,7 @@
                     <pic:cNvPicPr/>
                   </pic:nvPicPr>
                   <pic:blipFill>
-                    <a:blip xmlns:r="http://schemas.openxmlformats.org/officeDocument/2006/relationships" r:embed="Re096dd9bf2364e13"/>
+                    <a:blip xmlns:r="http://schemas.openxmlformats.org/officeDocument/2006/relationships" r:embed="R1d28d44356444d0f"/>
                     <a:stretch>
                       <a:fillRect/>
                     </a:stretch>
@@ -3016,7 +3016,7 @@
                     <pic:cNvPicPr/>
                   </pic:nvPicPr>
                   <pic:blipFill>
-                    <a:blip xmlns:r="http://schemas.openxmlformats.org/officeDocument/2006/relationships" r:embed="R391427043385430e"/>
+                    <a:blip xmlns:r="http://schemas.openxmlformats.org/officeDocument/2006/relationships" r:embed="Rd37c966f237041f7"/>
                     <a:stretch>
                       <a:fillRect/>
                     </a:stretch>
@@ -3067,7 +3067,7 @@
                     <pic:cNvPicPr/>
                   </pic:nvPicPr>
                   <pic:blipFill>
-                    <a:blip xmlns:r="http://schemas.openxmlformats.org/officeDocument/2006/relationships" r:embed="Ra861231e2f8a47b4"/>
+                    <a:blip xmlns:r="http://schemas.openxmlformats.org/officeDocument/2006/relationships" r:embed="Re644647362944b33"/>
                     <a:stretch>
                       <a:fillRect/>
                     </a:stretch>
@@ -3118,7 +3118,7 @@
                     <pic:cNvPicPr/>
                   </pic:nvPicPr>
                   <pic:blipFill>
-                    <a:blip xmlns:r="http://schemas.openxmlformats.org/officeDocument/2006/relationships" r:embed="Rfae02d0380804fbc"/>
+                    <a:blip xmlns:r="http://schemas.openxmlformats.org/officeDocument/2006/relationships" r:embed="Rc5b1df908cca429c"/>
                     <a:stretch>
                       <a:fillRect/>
                     </a:stretch>
@@ -3354,7 +3354,7 @@
                     <pic:cNvPicPr/>
                   </pic:nvPicPr>
                   <pic:blipFill>
-                    <a:blip xmlns:r="http://schemas.openxmlformats.org/officeDocument/2006/relationships" r:embed="R74dd1182071d4267"/>
+                    <a:blip xmlns:r="http://schemas.openxmlformats.org/officeDocument/2006/relationships" r:embed="Ra9642eb572d3475a"/>
                     <a:stretch>
                       <a:fillRect/>
                     </a:stretch>
@@ -3405,7 +3405,7 @@
                     <pic:cNvPicPr/>
                   </pic:nvPicPr>
                   <pic:blipFill>
-                    <a:blip xmlns:r="http://schemas.openxmlformats.org/officeDocument/2006/relationships" r:embed="Rfbb16b076db6476c"/>
+                    <a:blip xmlns:r="http://schemas.openxmlformats.org/officeDocument/2006/relationships" r:embed="Rdce8a870d2bf4b29"/>
                     <a:stretch>
                       <a:fillRect/>
                     </a:stretch>
@@ -3456,7 +3456,7 @@
                     <pic:cNvPicPr/>
                   </pic:nvPicPr>
                   <pic:blipFill>
-                    <a:blip xmlns:r="http://schemas.openxmlformats.org/officeDocument/2006/relationships" r:embed="R4d29a34308a74c11"/>
+                    <a:blip xmlns:r="http://schemas.openxmlformats.org/officeDocument/2006/relationships" r:embed="Rfff3c3e27b2f4d28"/>
                     <a:stretch>
                       <a:fillRect/>
                     </a:stretch>
@@ -3507,7 +3507,7 @@
                     <pic:cNvPicPr/>
                   </pic:nvPicPr>
                   <pic:blipFill>
-                    <a:blip xmlns:r="http://schemas.openxmlformats.org/officeDocument/2006/relationships" r:embed="R50d869b636d4459a"/>
+                    <a:blip xmlns:r="http://schemas.openxmlformats.org/officeDocument/2006/relationships" r:embed="Rcb7ee7cce802494c"/>
                     <a:stretch>
                       <a:fillRect/>
                     </a:stretch>
@@ -3558,7 +3558,7 @@
                     <pic:cNvPicPr/>
                   </pic:nvPicPr>
                   <pic:blipFill>
-                    <a:blip xmlns:r="http://schemas.openxmlformats.org/officeDocument/2006/relationships" r:embed="R15d16a6ee99947ad"/>
+                    <a:blip xmlns:r="http://schemas.openxmlformats.org/officeDocument/2006/relationships" r:embed="Rf550d0b0fa574ce1"/>
                     <a:stretch>
                       <a:fillRect/>
                     </a:stretch>
@@ -3609,7 +3609,7 @@
                     <pic:cNvPicPr/>
                   </pic:nvPicPr>
                   <pic:blipFill>
-                    <a:blip xmlns:r="http://schemas.openxmlformats.org/officeDocument/2006/relationships" r:embed="R603e8aee9c16423f"/>
+                    <a:blip xmlns:r="http://schemas.openxmlformats.org/officeDocument/2006/relationships" r:embed="R189334838e354fdf"/>
                     <a:stretch>
                       <a:fillRect/>
                     </a:stretch>
@@ -3660,7 +3660,7 @@
                     <pic:cNvPicPr/>
                   </pic:nvPicPr>
                   <pic:blipFill>
-                    <a:blip xmlns:r="http://schemas.openxmlformats.org/officeDocument/2006/relationships" r:embed="Ra7f82c8eb8e24b9c"/>
+                    <a:blip xmlns:r="http://schemas.openxmlformats.org/officeDocument/2006/relationships" r:embed="Rb225ba5d987d42f7"/>
                     <a:stretch>
                       <a:fillRect/>
                     </a:stretch>
@@ -3711,7 +3711,7 @@
                     <pic:cNvPicPr/>
                   </pic:nvPicPr>
                   <pic:blipFill>
-                    <a:blip xmlns:r="http://schemas.openxmlformats.org/officeDocument/2006/relationships" r:embed="Rae6e0dd3b40047d1"/>
+                    <a:blip xmlns:r="http://schemas.openxmlformats.org/officeDocument/2006/relationships" r:embed="Raee5c327ac0b4443"/>
                     <a:stretch>
                       <a:fillRect/>
                     </a:stretch>
@@ -3762,7 +3762,7 @@
                     <pic:cNvPicPr/>
                   </pic:nvPicPr>
                   <pic:blipFill>
-                    <a:blip xmlns:r="http://schemas.openxmlformats.org/officeDocument/2006/relationships" r:embed="R753625967f8a454d"/>
+                    <a:blip xmlns:r="http://schemas.openxmlformats.org/officeDocument/2006/relationships" r:embed="R705cf6f0620a40e0"/>
                     <a:stretch>
                       <a:fillRect/>
                     </a:stretch>
@@ -3859,7 +3859,7 @@
                     <pic:cNvPicPr/>
                   </pic:nvPicPr>
                   <pic:blipFill>
-                    <a:blip xmlns:r="http://schemas.openxmlformats.org/officeDocument/2006/relationships" r:embed="R7a19620bb9534d12"/>
+                    <a:blip xmlns:r="http://schemas.openxmlformats.org/officeDocument/2006/relationships" r:embed="R54d51386f82f4bf9"/>
                     <a:stretch>
                       <a:fillRect/>
                     </a:stretch>
@@ -3902,7 +3902,7 @@
                     <pic:cNvPicPr/>
                   </pic:nvPicPr>
                   <pic:blipFill>
-                    <a:blip xmlns:r="http://schemas.openxmlformats.org/officeDocument/2006/relationships" r:embed="R840608e295064cd8"/>
+                    <a:blip xmlns:r="http://schemas.openxmlformats.org/officeDocument/2006/relationships" r:embed="Rcd89200086bc45ca"/>
                     <a:stretch>
                       <a:fillRect/>
                     </a:stretch>
@@ -3945,7 +3945,7 @@
                     <pic:cNvPicPr/>
                   </pic:nvPicPr>
                   <pic:blipFill>
-                    <a:blip xmlns:r="http://schemas.openxmlformats.org/officeDocument/2006/relationships" r:embed="R2fcd8a2e40ed4d3e"/>
+                    <a:blip xmlns:r="http://schemas.openxmlformats.org/officeDocument/2006/relationships" r:embed="Rc58a29ca236d4f64"/>
                     <a:stretch>
                       <a:fillRect/>
                     </a:stretch>
@@ -3988,7 +3988,7 @@
                     <pic:cNvPicPr/>
                   </pic:nvPicPr>
                   <pic:blipFill>
-                    <a:blip xmlns:r="http://schemas.openxmlformats.org/officeDocument/2006/relationships" r:embed="R8340dc0718044791"/>
+                    <a:blip xmlns:r="http://schemas.openxmlformats.org/officeDocument/2006/relationships" r:embed="R9882ad2aff2b432a"/>
                     <a:stretch>
                       <a:fillRect/>
                     </a:stretch>
@@ -4083,7 +4083,7 @@
                     <pic:cNvPicPr/>
                   </pic:nvPicPr>
                   <pic:blipFill>
-                    <a:blip xmlns:r="http://schemas.openxmlformats.org/officeDocument/2006/relationships" r:embed="R2308c0c174fe4887"/>
+                    <a:blip xmlns:r="http://schemas.openxmlformats.org/officeDocument/2006/relationships" r:embed="Raae1d0c1af6a4643"/>
                     <a:stretch>
                       <a:fillRect/>
                     </a:stretch>
@@ -4336,7 +4336,7 @@
                     <pic:cNvPicPr/>
                   </pic:nvPicPr>
                   <pic:blipFill>
-                    <a:blip xmlns:r="http://schemas.openxmlformats.org/officeDocument/2006/relationships" r:embed="R6c20f74de17f4d3f"/>
+                    <a:blip xmlns:r="http://schemas.openxmlformats.org/officeDocument/2006/relationships" r:embed="R9f5ed2ded4e040bc"/>
                     <a:stretch>
                       <a:fillRect/>
                     </a:stretch>
@@ -4528,7 +4528,7 @@
                     <pic:cNvPicPr/>
                   </pic:nvPicPr>
                   <pic:blipFill>
-                    <a:blip xmlns:r="http://schemas.openxmlformats.org/officeDocument/2006/relationships" r:embed="Rb9fd6add49b64406"/>
+                    <a:blip xmlns:r="http://schemas.openxmlformats.org/officeDocument/2006/relationships" r:embed="Rbfa187909df5439f"/>
                     <a:stretch>
                       <a:fillRect/>
                     </a:stretch>
@@ -4579,7 +4579,7 @@
                     <pic:cNvPicPr/>
                   </pic:nvPicPr>
                   <pic:blipFill>
-                    <a:blip xmlns:r="http://schemas.openxmlformats.org/officeDocument/2006/relationships" r:embed="Rd1fb38283a1a4352"/>
+                    <a:blip xmlns:r="http://schemas.openxmlformats.org/officeDocument/2006/relationships" r:embed="R6a26971470ed4ba8"/>
                     <a:stretch>
                       <a:fillRect/>
                     </a:stretch>
@@ -4630,7 +4630,7 @@
                     <pic:cNvPicPr/>
                   </pic:nvPicPr>
                   <pic:blipFill>
-                    <a:blip xmlns:r="http://schemas.openxmlformats.org/officeDocument/2006/relationships" r:embed="R800b6c3f6c894a05"/>
+                    <a:blip xmlns:r="http://schemas.openxmlformats.org/officeDocument/2006/relationships" r:embed="R0cc63ca565bf4376"/>
                     <a:stretch>
                       <a:fillRect/>
                     </a:stretch>
@@ -4681,7 +4681,7 @@
                     <pic:cNvPicPr/>
                   </pic:nvPicPr>
                   <pic:blipFill>
-                    <a:blip xmlns:r="http://schemas.openxmlformats.org/officeDocument/2006/relationships" r:embed="R8b4f8715ba0c415c"/>
+                    <a:blip xmlns:r="http://schemas.openxmlformats.org/officeDocument/2006/relationships" r:embed="R8723ed02198641a6"/>
                     <a:stretch>
                       <a:fillRect/>
                     </a:stretch>
@@ -5060,7 +5060,7 @@
                     <pic:cNvPicPr/>
                   </pic:nvPicPr>
                   <pic:blipFill>
-                    <a:blip xmlns:r="http://schemas.openxmlformats.org/officeDocument/2006/relationships" r:embed="R8d5cd43f0fed4d44"/>
+                    <a:blip xmlns:r="http://schemas.openxmlformats.org/officeDocument/2006/relationships" r:embed="R6100a107b67a459e"/>
                     <a:stretch>
                       <a:fillRect/>
                     </a:stretch>
@@ -5741,7 +5741,7 @@
             <w:r>
               <w:t xml:space="preserve">Cell with </w:t>
             </w:r>
-            <w:hyperlink xmlns:r="http://schemas.openxmlformats.org/officeDocument/2006/relationships" w:history="true" r:id="R8683127b57a54665">
+            <w:hyperlink xmlns:r="http://schemas.openxmlformats.org/officeDocument/2006/relationships" w:history="true" r:id="Rf513fce787d940c5">
               <w:r>
                 <w:rPr>
                   <w:rStyle w:val="Hyperlink"/>
@@ -6027,7 +6027,7 @@
                           <pic:cNvPicPr/>
                         </pic:nvPicPr>
                         <pic:blipFill>
-                          <a:blip xmlns:r="http://schemas.openxmlformats.org/officeDocument/2006/relationships" r:embed="Re782c7b550d04966"/>
+                          <a:blip xmlns:r="http://schemas.openxmlformats.org/officeDocument/2006/relationships" r:embed="R90eedbdfe6d741fe"/>
                           <a:stretch>
                             <a:fillRect/>
                           </a:stretch>
@@ -6127,7 +6127,7 @@
                     <pic:cNvPicPr/>
                   </pic:nvPicPr>
                   <pic:blipFill>
-                    <a:blip xmlns:r="http://schemas.openxmlformats.org/officeDocument/2006/relationships" r:embed="R03656a3cde774d34"/>
+                    <a:blip xmlns:r="http://schemas.openxmlformats.org/officeDocument/2006/relationships" r:embed="R61265764b5ba4f86"/>
                     <a:stretch>
                       <a:fillRect/>
                     </a:stretch>
@@ -6177,7 +6177,7 @@
                     <pic:cNvPicPr/>
                   </pic:nvPicPr>
                   <pic:blipFill>
-                    <a:blip xmlns:r="http://schemas.openxmlformats.org/officeDocument/2006/relationships" r:embed="R2af9b46cf16c49f1"/>
+                    <a:blip xmlns:r="http://schemas.openxmlformats.org/officeDocument/2006/relationships" r:embed="R7780b89aba124422"/>
                     <a:stretch>
                       <a:fillRect/>
                     </a:stretch>
@@ -6227,7 +6227,7 @@
                     <pic:cNvPicPr/>
                   </pic:nvPicPr>
                   <pic:blipFill>
-                    <a:blip xmlns:r="http://schemas.openxmlformats.org/officeDocument/2006/relationships" r:embed="R8c667219c18d41fb"/>
+                    <a:blip xmlns:r="http://schemas.openxmlformats.org/officeDocument/2006/relationships" r:embed="R7739aae9c4474bd9"/>
                     <a:stretch>
                       <a:fillRect/>
                     </a:stretch>

</xml_diff>

<commit_message>
fix(flowchart): make decision stubs perpendicular
Decision Yes/No branches now leave/arrive with short straight segments aligned to the node boundary normal at the attach point (perpendicular to the edge).

Made-with: Cursor
</commit_message>
<xml_diff>
--- a/test.docx
+++ b/test.docx
@@ -236,7 +236,7 @@
       <w:r>
         <w:t xml:space="preserve">, and </w:t>
       </w:r>
-      <w:hyperlink xmlns:r="http://schemas.openxmlformats.org/officeDocument/2006/relationships" w:history="true" r:id="R66ca03ce5c6a4364">
+      <w:hyperlink xmlns:r="http://schemas.openxmlformats.org/officeDocument/2006/relationships" w:history="true" r:id="Rde535290996649d5">
         <w:r>
           <w:rPr>
             <w:rStyle w:val="Hyperlink"/>
@@ -475,7 +475,7 @@
       <w:r>
         <w:t xml:space="preserve">Direct link: </w:t>
       </w:r>
-      <w:hyperlink xmlns:r="http://schemas.openxmlformats.org/officeDocument/2006/relationships" w:history="true" r:id="Rb8e0a41d784042c4">
+      <w:hyperlink xmlns:r="http://schemas.openxmlformats.org/officeDocument/2006/relationships" w:history="true" r:id="R682394c071ad49d8">
         <w:r>
           <w:rPr>
             <w:rStyle w:val="Hyperlink"/>
@@ -496,7 +496,7 @@
       <w:r>
         <w:t xml:space="preserve">Direct link with title: </w:t>
       </w:r>
-      <w:hyperlink xmlns:r="http://schemas.openxmlformats.org/officeDocument/2006/relationships" w:history="true" r:id="R4f1b72dc165c4c6b">
+      <w:hyperlink xmlns:r="http://schemas.openxmlformats.org/officeDocument/2006/relationships" w:history="true" r:id="Rafe85e54392c4d0d">
         <w:r>
           <w:rPr>
             <w:rStyle w:val="Hyperlink"/>
@@ -517,7 +517,7 @@
       <w:r>
         <w:t xml:space="preserve">Reference-style link: </w:t>
       </w:r>
-      <w:hyperlink xmlns:r="http://schemas.openxmlformats.org/officeDocument/2006/relationships" w:history="true" r:id="R174b8fc8e6d34b71">
+      <w:hyperlink xmlns:r="http://schemas.openxmlformats.org/officeDocument/2006/relationships" w:history="true" r:id="R84cbe28733df4e0a">
         <w:r>
           <w:rPr>
             <w:rStyle w:val="Hyperlink"/>
@@ -538,7 +538,7 @@
       <w:r>
         <w:t xml:space="preserve">Collapsed reference link: </w:t>
       </w:r>
-      <w:hyperlink xmlns:r="http://schemas.openxmlformats.org/officeDocument/2006/relationships" w:history="true" r:id="R9b929c0183584aac">
+      <w:hyperlink xmlns:r="http://schemas.openxmlformats.org/officeDocument/2006/relationships" w:history="true" r:id="Ree26a723178a46fb">
         <w:r>
           <w:rPr>
             <w:rStyle w:val="Hyperlink"/>
@@ -559,7 +559,7 @@
       <w:r>
         <w:t xml:space="preserve">Repeated reference link: </w:t>
       </w:r>
-      <w:hyperlink xmlns:r="http://schemas.openxmlformats.org/officeDocument/2006/relationships" w:history="true" r:id="R4e8c8b41b1a54c7c">
+      <w:hyperlink xmlns:r="http://schemas.openxmlformats.org/officeDocument/2006/relationships" w:history="true" r:id="Rfade83b38af24435">
         <w:r>
           <w:rPr>
             <w:rStyle w:val="Hyperlink"/>
@@ -580,7 +580,7 @@
       <w:r>
         <w:t xml:space="preserve">Autolink URL: </w:t>
       </w:r>
-      <w:hyperlink xmlns:r="http://schemas.openxmlformats.org/officeDocument/2006/relationships" w:history="true" r:id="Rc7c06aaf0b164ecb">
+      <w:hyperlink xmlns:r="http://schemas.openxmlformats.org/officeDocument/2006/relationships" w:history="true" r:id="R8cd5052c77174ea6">
         <w:r>
           <w:rPr>
             <w:rStyle w:val="Hyperlink"/>
@@ -601,7 +601,7 @@
       <w:r>
         <w:t xml:space="preserve">Autolink email: </w:t>
       </w:r>
-      <w:hyperlink xmlns:r="http://schemas.openxmlformats.org/officeDocument/2006/relationships" w:history="true" r:id="Rbcb58549c97d4a23">
+      <w:hyperlink xmlns:r="http://schemas.openxmlformats.org/officeDocument/2006/relationships" w:history="true" r:id="R6e6a73076ebf49dc">
         <w:r>
           <w:rPr>
             <w:rStyle w:val="Hyperlink"/>
@@ -700,7 +700,7 @@
       <w:r>
         <w:t xml:space="preserve">, and </w:t>
       </w:r>
-      <w:hyperlink xmlns:r="http://schemas.openxmlformats.org/officeDocument/2006/relationships" w:history="true" r:id="R269554b009844190">
+      <w:hyperlink xmlns:r="http://schemas.openxmlformats.org/officeDocument/2006/relationships" w:history="true" r:id="R5381b4318f4a4d31">
         <w:r>
           <w:rPr>
             <w:rStyle w:val="Hyperlink"/>
@@ -1093,7 +1093,7 @@
       <w:r>
         <w:t xml:space="preserve">Continuation paragraph with </w:t>
       </w:r>
-      <w:hyperlink xmlns:r="http://schemas.openxmlformats.org/officeDocument/2006/relationships" w:history="true" r:id="R5764fac652184bee">
+      <w:hyperlink xmlns:r="http://schemas.openxmlformats.org/officeDocument/2006/relationships" w:history="true" r:id="Ree48a2347aee4de0">
         <w:r>
           <w:rPr>
             <w:rStyle w:val="Hyperlink"/>
@@ -1591,7 +1591,7 @@
       <w:r>
         <w:t xml:space="preserve">, and </w:t>
       </w:r>
-      <w:hyperlink xmlns:r="http://schemas.openxmlformats.org/officeDocument/2006/relationships" w:history="true" r:id="R2d5cba0f364c4f54">
+      <w:hyperlink xmlns:r="http://schemas.openxmlformats.org/officeDocument/2006/relationships" w:history="true" r:id="Rbe80ce583b7c4e56">
         <w:r>
           <w:rPr>
             <w:rStyle w:val="Hyperlink"/>
@@ -1979,7 +1979,7 @@
                     <pic:cNvPicPr/>
                   </pic:nvPicPr>
                   <pic:blipFill>
-                    <a:blip xmlns:r="http://schemas.openxmlformats.org/officeDocument/2006/relationships" r:embed="R0fbc90905c364f26"/>
+                    <a:blip xmlns:r="http://schemas.openxmlformats.org/officeDocument/2006/relationships" r:embed="Rcd6d9fd124cc4582"/>
                     <a:stretch>
                       <a:fillRect/>
                     </a:stretch>
@@ -2039,7 +2039,7 @@
                     <pic:cNvPicPr/>
                   </pic:nvPicPr>
                   <pic:blipFill>
-                    <a:blip xmlns:r="http://schemas.openxmlformats.org/officeDocument/2006/relationships" r:embed="R5f86dc47a08544c1"/>
+                    <a:blip xmlns:r="http://schemas.openxmlformats.org/officeDocument/2006/relationships" r:embed="Rde8195390f5a481c"/>
                     <a:stretch>
                       <a:fillRect/>
                     </a:stretch>
@@ -2099,7 +2099,7 @@
                     <pic:cNvPicPr/>
                   </pic:nvPicPr>
                   <pic:blipFill>
-                    <a:blip xmlns:r="http://schemas.openxmlformats.org/officeDocument/2006/relationships" r:embed="Rc073d53a9b4644e6"/>
+                    <a:blip xmlns:r="http://schemas.openxmlformats.org/officeDocument/2006/relationships" r:embed="R9da6a4ef747c4fd6"/>
                     <a:stretch>
                       <a:fillRect/>
                     </a:stretch>
@@ -2150,7 +2150,7 @@
                     <pic:cNvPicPr/>
                   </pic:nvPicPr>
                   <pic:blipFill>
-                    <a:blip xmlns:r="http://schemas.openxmlformats.org/officeDocument/2006/relationships" r:embed="R9e373c53408f4ddb"/>
+                    <a:blip xmlns:r="http://schemas.openxmlformats.org/officeDocument/2006/relationships" r:embed="Ra17892ca67274c8d"/>
                     <a:stretch>
                       <a:fillRect/>
                     </a:stretch>
@@ -2201,7 +2201,7 @@
                     <pic:cNvPicPr/>
                   </pic:nvPicPr>
                   <pic:blipFill>
-                    <a:blip xmlns:r="http://schemas.openxmlformats.org/officeDocument/2006/relationships" r:embed="R0572dcff7a1a4630"/>
+                    <a:blip xmlns:r="http://schemas.openxmlformats.org/officeDocument/2006/relationships" r:embed="R3b5de36d37c44434"/>
                     <a:stretch>
                       <a:fillRect/>
                     </a:stretch>
@@ -2252,7 +2252,7 @@
                     <pic:cNvPicPr/>
                   </pic:nvPicPr>
                   <pic:blipFill>
-                    <a:blip xmlns:r="http://schemas.openxmlformats.org/officeDocument/2006/relationships" r:embed="R95abcd5fedae4b28"/>
+                    <a:blip xmlns:r="http://schemas.openxmlformats.org/officeDocument/2006/relationships" r:embed="R9e95e12179c14caa"/>
                     <a:stretch>
                       <a:fillRect/>
                     </a:stretch>
@@ -2303,7 +2303,7 @@
                     <pic:cNvPicPr/>
                   </pic:nvPicPr>
                   <pic:blipFill>
-                    <a:blip xmlns:r="http://schemas.openxmlformats.org/officeDocument/2006/relationships" r:embed="Raa634cc5466240b2"/>
+                    <a:blip xmlns:r="http://schemas.openxmlformats.org/officeDocument/2006/relationships" r:embed="Rf2d0f05494a14c48"/>
                     <a:stretch>
                       <a:fillRect/>
                     </a:stretch>
@@ -2354,7 +2354,7 @@
                     <pic:cNvPicPr/>
                   </pic:nvPicPr>
                   <pic:blipFill>
-                    <a:blip xmlns:r="http://schemas.openxmlformats.org/officeDocument/2006/relationships" r:embed="R5fd089bedd2241b1"/>
+                    <a:blip xmlns:r="http://schemas.openxmlformats.org/officeDocument/2006/relationships" r:embed="R31559bb4939a4685"/>
                     <a:stretch>
                       <a:fillRect/>
                     </a:stretch>
@@ -2430,7 +2430,7 @@
                     <pic:cNvPicPr/>
                   </pic:nvPicPr>
                   <pic:blipFill>
-                    <a:blip xmlns:r="http://schemas.openxmlformats.org/officeDocument/2006/relationships" r:embed="R61124d61dd2d4773"/>
+                    <a:blip xmlns:r="http://schemas.openxmlformats.org/officeDocument/2006/relationships" r:embed="Ra60b1c4734894b4c"/>
                     <a:stretch>
                       <a:fillRect/>
                     </a:stretch>
@@ -2481,7 +2481,7 @@
                     <pic:cNvPicPr/>
                   </pic:nvPicPr>
                   <pic:blipFill>
-                    <a:blip xmlns:r="http://schemas.openxmlformats.org/officeDocument/2006/relationships" r:embed="R3cd91efd817c4cd1"/>
+                    <a:blip xmlns:r="http://schemas.openxmlformats.org/officeDocument/2006/relationships" r:embed="R6a4920e2569a4ae5"/>
                     <a:stretch>
                       <a:fillRect/>
                     </a:stretch>
@@ -2532,7 +2532,7 @@
                     <pic:cNvPicPr/>
                   </pic:nvPicPr>
                   <pic:blipFill>
-                    <a:blip xmlns:r="http://schemas.openxmlformats.org/officeDocument/2006/relationships" r:embed="R72dea2d6c572422c"/>
+                    <a:blip xmlns:r="http://schemas.openxmlformats.org/officeDocument/2006/relationships" r:embed="R92a1a98e99f24a13"/>
                     <a:stretch>
                       <a:fillRect/>
                     </a:stretch>
@@ -2583,7 +2583,7 @@
                     <pic:cNvPicPr/>
                   </pic:nvPicPr>
                   <pic:blipFill>
-                    <a:blip xmlns:r="http://schemas.openxmlformats.org/officeDocument/2006/relationships" r:embed="R8b60601b3eba406e"/>
+                    <a:blip xmlns:r="http://schemas.openxmlformats.org/officeDocument/2006/relationships" r:embed="R042949c05d774801"/>
                     <a:stretch>
                       <a:fillRect/>
                     </a:stretch>
@@ -2659,7 +2659,7 @@
                     <pic:cNvPicPr/>
                   </pic:nvPicPr>
                   <pic:blipFill>
-                    <a:blip xmlns:r="http://schemas.openxmlformats.org/officeDocument/2006/relationships" r:embed="R4f1478fdd4024c2c"/>
+                    <a:blip xmlns:r="http://schemas.openxmlformats.org/officeDocument/2006/relationships" r:embed="R6f3d9b35db234370"/>
                     <a:stretch>
                       <a:fillRect/>
                     </a:stretch>
@@ -2710,7 +2710,7 @@
                     <pic:cNvPicPr/>
                   </pic:nvPicPr>
                   <pic:blipFill>
-                    <a:blip xmlns:r="http://schemas.openxmlformats.org/officeDocument/2006/relationships" r:embed="R34286d15b73a445f"/>
+                    <a:blip xmlns:r="http://schemas.openxmlformats.org/officeDocument/2006/relationships" r:embed="Rc7771a7341ab4609"/>
                     <a:stretch>
                       <a:fillRect/>
                     </a:stretch>
@@ -2761,7 +2761,7 @@
                     <pic:cNvPicPr/>
                   </pic:nvPicPr>
                   <pic:blipFill>
-                    <a:blip xmlns:r="http://schemas.openxmlformats.org/officeDocument/2006/relationships" r:embed="Rce1deabb65e14684"/>
+                    <a:blip xmlns:r="http://schemas.openxmlformats.org/officeDocument/2006/relationships" r:embed="R624c37e23c984936"/>
                     <a:stretch>
                       <a:fillRect/>
                     </a:stretch>
@@ -2812,7 +2812,7 @@
                     <pic:cNvPicPr/>
                   </pic:nvPicPr>
                   <pic:blipFill>
-                    <a:blip xmlns:r="http://schemas.openxmlformats.org/officeDocument/2006/relationships" r:embed="R59d1f57add5e411e"/>
+                    <a:blip xmlns:r="http://schemas.openxmlformats.org/officeDocument/2006/relationships" r:embed="R304c889e9ac64d37"/>
                     <a:stretch>
                       <a:fillRect/>
                     </a:stretch>
@@ -2863,7 +2863,7 @@
                     <pic:cNvPicPr/>
                   </pic:nvPicPr>
                   <pic:blipFill>
-                    <a:blip xmlns:r="http://schemas.openxmlformats.org/officeDocument/2006/relationships" r:embed="R635ae601b2654e32"/>
+                    <a:blip xmlns:r="http://schemas.openxmlformats.org/officeDocument/2006/relationships" r:embed="Refc0dc1b40ae4237"/>
                     <a:stretch>
                       <a:fillRect/>
                     </a:stretch>
@@ -2914,7 +2914,7 @@
                     <pic:cNvPicPr/>
                   </pic:nvPicPr>
                   <pic:blipFill>
-                    <a:blip xmlns:r="http://schemas.openxmlformats.org/officeDocument/2006/relationships" r:embed="R4d00478d5ddf4a09"/>
+                    <a:blip xmlns:r="http://schemas.openxmlformats.org/officeDocument/2006/relationships" r:embed="R908d337169e94370"/>
                     <a:stretch>
                       <a:fillRect/>
                     </a:stretch>
@@ -2965,7 +2965,7 @@
                     <pic:cNvPicPr/>
                   </pic:nvPicPr>
                   <pic:blipFill>
-                    <a:blip xmlns:r="http://schemas.openxmlformats.org/officeDocument/2006/relationships" r:embed="R1d28d44356444d0f"/>
+                    <a:blip xmlns:r="http://schemas.openxmlformats.org/officeDocument/2006/relationships" r:embed="Re31d3681d93f44d2"/>
                     <a:stretch>
                       <a:fillRect/>
                     </a:stretch>
@@ -3016,7 +3016,7 @@
                     <pic:cNvPicPr/>
                   </pic:nvPicPr>
                   <pic:blipFill>
-                    <a:blip xmlns:r="http://schemas.openxmlformats.org/officeDocument/2006/relationships" r:embed="Rd37c966f237041f7"/>
+                    <a:blip xmlns:r="http://schemas.openxmlformats.org/officeDocument/2006/relationships" r:embed="R8d39971e28b5494a"/>
                     <a:stretch>
                       <a:fillRect/>
                     </a:stretch>
@@ -3067,7 +3067,7 @@
                     <pic:cNvPicPr/>
                   </pic:nvPicPr>
                   <pic:blipFill>
-                    <a:blip xmlns:r="http://schemas.openxmlformats.org/officeDocument/2006/relationships" r:embed="Re644647362944b33"/>
+                    <a:blip xmlns:r="http://schemas.openxmlformats.org/officeDocument/2006/relationships" r:embed="R4b9f58c462f24a78"/>
                     <a:stretch>
                       <a:fillRect/>
                     </a:stretch>
@@ -3118,7 +3118,7 @@
                     <pic:cNvPicPr/>
                   </pic:nvPicPr>
                   <pic:blipFill>
-                    <a:blip xmlns:r="http://schemas.openxmlformats.org/officeDocument/2006/relationships" r:embed="Rc5b1df908cca429c"/>
+                    <a:blip xmlns:r="http://schemas.openxmlformats.org/officeDocument/2006/relationships" r:embed="Rb9f3982cf6104805"/>
                     <a:stretch>
                       <a:fillRect/>
                     </a:stretch>
@@ -3354,7 +3354,7 @@
                     <pic:cNvPicPr/>
                   </pic:nvPicPr>
                   <pic:blipFill>
-                    <a:blip xmlns:r="http://schemas.openxmlformats.org/officeDocument/2006/relationships" r:embed="Ra9642eb572d3475a"/>
+                    <a:blip xmlns:r="http://schemas.openxmlformats.org/officeDocument/2006/relationships" r:embed="Rb715685cb6ee4035"/>
                     <a:stretch>
                       <a:fillRect/>
                     </a:stretch>
@@ -3405,7 +3405,7 @@
                     <pic:cNvPicPr/>
                   </pic:nvPicPr>
                   <pic:blipFill>
-                    <a:blip xmlns:r="http://schemas.openxmlformats.org/officeDocument/2006/relationships" r:embed="Rdce8a870d2bf4b29"/>
+                    <a:blip xmlns:r="http://schemas.openxmlformats.org/officeDocument/2006/relationships" r:embed="R75d8f6309d054b4c"/>
                     <a:stretch>
                       <a:fillRect/>
                     </a:stretch>
@@ -3456,7 +3456,7 @@
                     <pic:cNvPicPr/>
                   </pic:nvPicPr>
                   <pic:blipFill>
-                    <a:blip xmlns:r="http://schemas.openxmlformats.org/officeDocument/2006/relationships" r:embed="Rfff3c3e27b2f4d28"/>
+                    <a:blip xmlns:r="http://schemas.openxmlformats.org/officeDocument/2006/relationships" r:embed="Re5d23bf703624fc8"/>
                     <a:stretch>
                       <a:fillRect/>
                     </a:stretch>
@@ -3507,7 +3507,7 @@
                     <pic:cNvPicPr/>
                   </pic:nvPicPr>
                   <pic:blipFill>
-                    <a:blip xmlns:r="http://schemas.openxmlformats.org/officeDocument/2006/relationships" r:embed="Rcb7ee7cce802494c"/>
+                    <a:blip xmlns:r="http://schemas.openxmlformats.org/officeDocument/2006/relationships" r:embed="R2f8c9fcb4d814973"/>
                     <a:stretch>
                       <a:fillRect/>
                     </a:stretch>
@@ -3558,7 +3558,7 @@
                     <pic:cNvPicPr/>
                   </pic:nvPicPr>
                   <pic:blipFill>
-                    <a:blip xmlns:r="http://schemas.openxmlformats.org/officeDocument/2006/relationships" r:embed="Rf550d0b0fa574ce1"/>
+                    <a:blip xmlns:r="http://schemas.openxmlformats.org/officeDocument/2006/relationships" r:embed="Re4dae197ebe8442e"/>
                     <a:stretch>
                       <a:fillRect/>
                     </a:stretch>
@@ -3609,7 +3609,7 @@
                     <pic:cNvPicPr/>
                   </pic:nvPicPr>
                   <pic:blipFill>
-                    <a:blip xmlns:r="http://schemas.openxmlformats.org/officeDocument/2006/relationships" r:embed="R189334838e354fdf"/>
+                    <a:blip xmlns:r="http://schemas.openxmlformats.org/officeDocument/2006/relationships" r:embed="R2aa559ddc0d6438b"/>
                     <a:stretch>
                       <a:fillRect/>
                     </a:stretch>
@@ -3660,7 +3660,7 @@
                     <pic:cNvPicPr/>
                   </pic:nvPicPr>
                   <pic:blipFill>
-                    <a:blip xmlns:r="http://schemas.openxmlformats.org/officeDocument/2006/relationships" r:embed="Rb225ba5d987d42f7"/>
+                    <a:blip xmlns:r="http://schemas.openxmlformats.org/officeDocument/2006/relationships" r:embed="Rdc58ebb03606430c"/>
                     <a:stretch>
                       <a:fillRect/>
                     </a:stretch>
@@ -3711,7 +3711,7 @@
                     <pic:cNvPicPr/>
                   </pic:nvPicPr>
                   <pic:blipFill>
-                    <a:blip xmlns:r="http://schemas.openxmlformats.org/officeDocument/2006/relationships" r:embed="Raee5c327ac0b4443"/>
+                    <a:blip xmlns:r="http://schemas.openxmlformats.org/officeDocument/2006/relationships" r:embed="R27552a17885b4489"/>
                     <a:stretch>
                       <a:fillRect/>
                     </a:stretch>
@@ -3762,7 +3762,7 @@
                     <pic:cNvPicPr/>
                   </pic:nvPicPr>
                   <pic:blipFill>
-                    <a:blip xmlns:r="http://schemas.openxmlformats.org/officeDocument/2006/relationships" r:embed="R705cf6f0620a40e0"/>
+                    <a:blip xmlns:r="http://schemas.openxmlformats.org/officeDocument/2006/relationships" r:embed="R76608e99250f40ee"/>
                     <a:stretch>
                       <a:fillRect/>
                     </a:stretch>
@@ -3859,7 +3859,7 @@
                     <pic:cNvPicPr/>
                   </pic:nvPicPr>
                   <pic:blipFill>
-                    <a:blip xmlns:r="http://schemas.openxmlformats.org/officeDocument/2006/relationships" r:embed="R54d51386f82f4bf9"/>
+                    <a:blip xmlns:r="http://schemas.openxmlformats.org/officeDocument/2006/relationships" r:embed="Ree098968d60a4fea"/>
                     <a:stretch>
                       <a:fillRect/>
                     </a:stretch>
@@ -3902,7 +3902,7 @@
                     <pic:cNvPicPr/>
                   </pic:nvPicPr>
                   <pic:blipFill>
-                    <a:blip xmlns:r="http://schemas.openxmlformats.org/officeDocument/2006/relationships" r:embed="Rcd89200086bc45ca"/>
+                    <a:blip xmlns:r="http://schemas.openxmlformats.org/officeDocument/2006/relationships" r:embed="Rd58058d81a1a44cb"/>
                     <a:stretch>
                       <a:fillRect/>
                     </a:stretch>
@@ -3945,7 +3945,7 @@
                     <pic:cNvPicPr/>
                   </pic:nvPicPr>
                   <pic:blipFill>
-                    <a:blip xmlns:r="http://schemas.openxmlformats.org/officeDocument/2006/relationships" r:embed="Rc58a29ca236d4f64"/>
+                    <a:blip xmlns:r="http://schemas.openxmlformats.org/officeDocument/2006/relationships" r:embed="R8447ae93a71b47b0"/>
                     <a:stretch>
                       <a:fillRect/>
                     </a:stretch>
@@ -3988,7 +3988,7 @@
                     <pic:cNvPicPr/>
                   </pic:nvPicPr>
                   <pic:blipFill>
-                    <a:blip xmlns:r="http://schemas.openxmlformats.org/officeDocument/2006/relationships" r:embed="R9882ad2aff2b432a"/>
+                    <a:blip xmlns:r="http://schemas.openxmlformats.org/officeDocument/2006/relationships" r:embed="R43b8886961cc4138"/>
                     <a:stretch>
                       <a:fillRect/>
                     </a:stretch>
@@ -4083,7 +4083,7 @@
                     <pic:cNvPicPr/>
                   </pic:nvPicPr>
                   <pic:blipFill>
-                    <a:blip xmlns:r="http://schemas.openxmlformats.org/officeDocument/2006/relationships" r:embed="Raae1d0c1af6a4643"/>
+                    <a:blip xmlns:r="http://schemas.openxmlformats.org/officeDocument/2006/relationships" r:embed="R281afe1f0a724feb"/>
                     <a:stretch>
                       <a:fillRect/>
                     </a:stretch>
@@ -4336,7 +4336,7 @@
                     <pic:cNvPicPr/>
                   </pic:nvPicPr>
                   <pic:blipFill>
-                    <a:blip xmlns:r="http://schemas.openxmlformats.org/officeDocument/2006/relationships" r:embed="R9f5ed2ded4e040bc"/>
+                    <a:blip xmlns:r="http://schemas.openxmlformats.org/officeDocument/2006/relationships" r:embed="Re6af4cae9c324b0b"/>
                     <a:stretch>
                       <a:fillRect/>
                     </a:stretch>
@@ -4528,7 +4528,7 @@
                     <pic:cNvPicPr/>
                   </pic:nvPicPr>
                   <pic:blipFill>
-                    <a:blip xmlns:r="http://schemas.openxmlformats.org/officeDocument/2006/relationships" r:embed="Rbfa187909df5439f"/>
+                    <a:blip xmlns:r="http://schemas.openxmlformats.org/officeDocument/2006/relationships" r:embed="Rd37b3c66d0e043bd"/>
                     <a:stretch>
                       <a:fillRect/>
                     </a:stretch>
@@ -4579,7 +4579,7 @@
                     <pic:cNvPicPr/>
                   </pic:nvPicPr>
                   <pic:blipFill>
-                    <a:blip xmlns:r="http://schemas.openxmlformats.org/officeDocument/2006/relationships" r:embed="R6a26971470ed4ba8"/>
+                    <a:blip xmlns:r="http://schemas.openxmlformats.org/officeDocument/2006/relationships" r:embed="R7cdbe93e22a945f6"/>
                     <a:stretch>
                       <a:fillRect/>
                     </a:stretch>
@@ -4630,7 +4630,7 @@
                     <pic:cNvPicPr/>
                   </pic:nvPicPr>
                   <pic:blipFill>
-                    <a:blip xmlns:r="http://schemas.openxmlformats.org/officeDocument/2006/relationships" r:embed="R0cc63ca565bf4376"/>
+                    <a:blip xmlns:r="http://schemas.openxmlformats.org/officeDocument/2006/relationships" r:embed="R079a61c461214206"/>
                     <a:stretch>
                       <a:fillRect/>
                     </a:stretch>
@@ -4681,7 +4681,7 @@
                     <pic:cNvPicPr/>
                   </pic:nvPicPr>
                   <pic:blipFill>
-                    <a:blip xmlns:r="http://schemas.openxmlformats.org/officeDocument/2006/relationships" r:embed="R8723ed02198641a6"/>
+                    <a:blip xmlns:r="http://schemas.openxmlformats.org/officeDocument/2006/relationships" r:embed="Reed0c9a6534848f9"/>
                     <a:stretch>
                       <a:fillRect/>
                     </a:stretch>
@@ -5060,7 +5060,7 @@
                     <pic:cNvPicPr/>
                   </pic:nvPicPr>
                   <pic:blipFill>
-                    <a:blip xmlns:r="http://schemas.openxmlformats.org/officeDocument/2006/relationships" r:embed="R6100a107b67a459e"/>
+                    <a:blip xmlns:r="http://schemas.openxmlformats.org/officeDocument/2006/relationships" r:embed="Rff983c79915849ce"/>
                     <a:stretch>
                       <a:fillRect/>
                     </a:stretch>
@@ -5741,7 +5741,7 @@
             <w:r>
               <w:t xml:space="preserve">Cell with </w:t>
             </w:r>
-            <w:hyperlink xmlns:r="http://schemas.openxmlformats.org/officeDocument/2006/relationships" w:history="true" r:id="Rf513fce787d940c5">
+            <w:hyperlink xmlns:r="http://schemas.openxmlformats.org/officeDocument/2006/relationships" w:history="true" r:id="R581967cb99aa4008">
               <w:r>
                 <w:rPr>
                   <w:rStyle w:val="Hyperlink"/>
@@ -6027,7 +6027,7 @@
                           <pic:cNvPicPr/>
                         </pic:nvPicPr>
                         <pic:blipFill>
-                          <a:blip xmlns:r="http://schemas.openxmlformats.org/officeDocument/2006/relationships" r:embed="R90eedbdfe6d741fe"/>
+                          <a:blip xmlns:r="http://schemas.openxmlformats.org/officeDocument/2006/relationships" r:embed="R34d94f66fc5349b1"/>
                           <a:stretch>
                             <a:fillRect/>
                           </a:stretch>
@@ -6127,7 +6127,7 @@
                     <pic:cNvPicPr/>
                   </pic:nvPicPr>
                   <pic:blipFill>
-                    <a:blip xmlns:r="http://schemas.openxmlformats.org/officeDocument/2006/relationships" r:embed="R61265764b5ba4f86"/>
+                    <a:blip xmlns:r="http://schemas.openxmlformats.org/officeDocument/2006/relationships" r:embed="Re1d97d575e024efd"/>
                     <a:stretch>
                       <a:fillRect/>
                     </a:stretch>
@@ -6177,7 +6177,7 @@
                     <pic:cNvPicPr/>
                   </pic:nvPicPr>
                   <pic:blipFill>
-                    <a:blip xmlns:r="http://schemas.openxmlformats.org/officeDocument/2006/relationships" r:embed="R7780b89aba124422"/>
+                    <a:blip xmlns:r="http://schemas.openxmlformats.org/officeDocument/2006/relationships" r:embed="R7cce3304421d4f55"/>
                     <a:stretch>
                       <a:fillRect/>
                     </a:stretch>
@@ -6227,7 +6227,7 @@
                     <pic:cNvPicPr/>
                   </pic:nvPicPr>
                   <pic:blipFill>
-                    <a:blip xmlns:r="http://schemas.openxmlformats.org/officeDocument/2006/relationships" r:embed="R7739aae9c4474bd9"/>
+                    <a:blip xmlns:r="http://schemas.openxmlformats.org/officeDocument/2006/relationships" r:embed="R7081530a72714b02"/>
                     <a:stretch>
                       <a:fillRect/>
                     </a:stretch>

</xml_diff>

<commit_message>
fix(flowchart): correct decision branch arrow orientation
Ensure the final segment into the target port points into the node so marker-end orient=auto rotates arrowheads correctly.

Made-with: Cursor
</commit_message>
<xml_diff>
--- a/test.docx
+++ b/test.docx
@@ -236,7 +236,7 @@
       <w:r>
         <w:t xml:space="preserve">, and </w:t>
       </w:r>
-      <w:hyperlink xmlns:r="http://schemas.openxmlformats.org/officeDocument/2006/relationships" w:history="true" r:id="Rde535290996649d5">
+      <w:hyperlink xmlns:r="http://schemas.openxmlformats.org/officeDocument/2006/relationships" w:history="true" r:id="R798bb71d6eda44ad">
         <w:r>
           <w:rPr>
             <w:rStyle w:val="Hyperlink"/>
@@ -475,7 +475,7 @@
       <w:r>
         <w:t xml:space="preserve">Direct link: </w:t>
       </w:r>
-      <w:hyperlink xmlns:r="http://schemas.openxmlformats.org/officeDocument/2006/relationships" w:history="true" r:id="R682394c071ad49d8">
+      <w:hyperlink xmlns:r="http://schemas.openxmlformats.org/officeDocument/2006/relationships" w:history="true" r:id="R0da8d56c47bb499f">
         <w:r>
           <w:rPr>
             <w:rStyle w:val="Hyperlink"/>
@@ -496,7 +496,7 @@
       <w:r>
         <w:t xml:space="preserve">Direct link with title: </w:t>
       </w:r>
-      <w:hyperlink xmlns:r="http://schemas.openxmlformats.org/officeDocument/2006/relationships" w:history="true" r:id="Rafe85e54392c4d0d">
+      <w:hyperlink xmlns:r="http://schemas.openxmlformats.org/officeDocument/2006/relationships" w:history="true" r:id="Rc1a67d79890444b3">
         <w:r>
           <w:rPr>
             <w:rStyle w:val="Hyperlink"/>
@@ -517,7 +517,7 @@
       <w:r>
         <w:t xml:space="preserve">Reference-style link: </w:t>
       </w:r>
-      <w:hyperlink xmlns:r="http://schemas.openxmlformats.org/officeDocument/2006/relationships" w:history="true" r:id="R84cbe28733df4e0a">
+      <w:hyperlink xmlns:r="http://schemas.openxmlformats.org/officeDocument/2006/relationships" w:history="true" r:id="R23b2e0fe1f4141b9">
         <w:r>
           <w:rPr>
             <w:rStyle w:val="Hyperlink"/>
@@ -538,7 +538,7 @@
       <w:r>
         <w:t xml:space="preserve">Collapsed reference link: </w:t>
       </w:r>
-      <w:hyperlink xmlns:r="http://schemas.openxmlformats.org/officeDocument/2006/relationships" w:history="true" r:id="Ree26a723178a46fb">
+      <w:hyperlink xmlns:r="http://schemas.openxmlformats.org/officeDocument/2006/relationships" w:history="true" r:id="R16f4e80312694937">
         <w:r>
           <w:rPr>
             <w:rStyle w:val="Hyperlink"/>
@@ -559,7 +559,7 @@
       <w:r>
         <w:t xml:space="preserve">Repeated reference link: </w:t>
       </w:r>
-      <w:hyperlink xmlns:r="http://schemas.openxmlformats.org/officeDocument/2006/relationships" w:history="true" r:id="Rfade83b38af24435">
+      <w:hyperlink xmlns:r="http://schemas.openxmlformats.org/officeDocument/2006/relationships" w:history="true" r:id="R351ffc3f2368435f">
         <w:r>
           <w:rPr>
             <w:rStyle w:val="Hyperlink"/>
@@ -580,7 +580,7 @@
       <w:r>
         <w:t xml:space="preserve">Autolink URL: </w:t>
       </w:r>
-      <w:hyperlink xmlns:r="http://schemas.openxmlformats.org/officeDocument/2006/relationships" w:history="true" r:id="R8cd5052c77174ea6">
+      <w:hyperlink xmlns:r="http://schemas.openxmlformats.org/officeDocument/2006/relationships" w:history="true" r:id="R9ee7e48e97844661">
         <w:r>
           <w:rPr>
             <w:rStyle w:val="Hyperlink"/>
@@ -601,7 +601,7 @@
       <w:r>
         <w:t xml:space="preserve">Autolink email: </w:t>
       </w:r>
-      <w:hyperlink xmlns:r="http://schemas.openxmlformats.org/officeDocument/2006/relationships" w:history="true" r:id="R6e6a73076ebf49dc">
+      <w:hyperlink xmlns:r="http://schemas.openxmlformats.org/officeDocument/2006/relationships" w:history="true" r:id="R8664afff0f374b23">
         <w:r>
           <w:rPr>
             <w:rStyle w:val="Hyperlink"/>
@@ -700,7 +700,7 @@
       <w:r>
         <w:t xml:space="preserve">, and </w:t>
       </w:r>
-      <w:hyperlink xmlns:r="http://schemas.openxmlformats.org/officeDocument/2006/relationships" w:history="true" r:id="R5381b4318f4a4d31">
+      <w:hyperlink xmlns:r="http://schemas.openxmlformats.org/officeDocument/2006/relationships" w:history="true" r:id="Raf055e932e934d44">
         <w:r>
           <w:rPr>
             <w:rStyle w:val="Hyperlink"/>
@@ -1093,7 +1093,7 @@
       <w:r>
         <w:t xml:space="preserve">Continuation paragraph with </w:t>
       </w:r>
-      <w:hyperlink xmlns:r="http://schemas.openxmlformats.org/officeDocument/2006/relationships" w:history="true" r:id="Ree48a2347aee4de0">
+      <w:hyperlink xmlns:r="http://schemas.openxmlformats.org/officeDocument/2006/relationships" w:history="true" r:id="Rce2cb34d7bd24b16">
         <w:r>
           <w:rPr>
             <w:rStyle w:val="Hyperlink"/>
@@ -1591,7 +1591,7 @@
       <w:r>
         <w:t xml:space="preserve">, and </w:t>
       </w:r>
-      <w:hyperlink xmlns:r="http://schemas.openxmlformats.org/officeDocument/2006/relationships" w:history="true" r:id="Rbe80ce583b7c4e56">
+      <w:hyperlink xmlns:r="http://schemas.openxmlformats.org/officeDocument/2006/relationships" w:history="true" r:id="Rb05ce3bf9d4e4406">
         <w:r>
           <w:rPr>
             <w:rStyle w:val="Hyperlink"/>
@@ -1979,7 +1979,7 @@
                     <pic:cNvPicPr/>
                   </pic:nvPicPr>
                   <pic:blipFill>
-                    <a:blip xmlns:r="http://schemas.openxmlformats.org/officeDocument/2006/relationships" r:embed="Rcd6d9fd124cc4582"/>
+                    <a:blip xmlns:r="http://schemas.openxmlformats.org/officeDocument/2006/relationships" r:embed="Rfcbfd137c7664a98"/>
                     <a:stretch>
                       <a:fillRect/>
                     </a:stretch>
@@ -2039,7 +2039,7 @@
                     <pic:cNvPicPr/>
                   </pic:nvPicPr>
                   <pic:blipFill>
-                    <a:blip xmlns:r="http://schemas.openxmlformats.org/officeDocument/2006/relationships" r:embed="Rde8195390f5a481c"/>
+                    <a:blip xmlns:r="http://schemas.openxmlformats.org/officeDocument/2006/relationships" r:embed="R0b688ef9abf1422b"/>
                     <a:stretch>
                       <a:fillRect/>
                     </a:stretch>
@@ -2099,7 +2099,7 @@
                     <pic:cNvPicPr/>
                   </pic:nvPicPr>
                   <pic:blipFill>
-                    <a:blip xmlns:r="http://schemas.openxmlformats.org/officeDocument/2006/relationships" r:embed="R9da6a4ef747c4fd6"/>
+                    <a:blip xmlns:r="http://schemas.openxmlformats.org/officeDocument/2006/relationships" r:embed="R83ab275af6a945ab"/>
                     <a:stretch>
                       <a:fillRect/>
                     </a:stretch>
@@ -2150,7 +2150,7 @@
                     <pic:cNvPicPr/>
                   </pic:nvPicPr>
                   <pic:blipFill>
-                    <a:blip xmlns:r="http://schemas.openxmlformats.org/officeDocument/2006/relationships" r:embed="Ra17892ca67274c8d"/>
+                    <a:blip xmlns:r="http://schemas.openxmlformats.org/officeDocument/2006/relationships" r:embed="R7c6bbe715d444b14"/>
                     <a:stretch>
                       <a:fillRect/>
                     </a:stretch>
@@ -2201,7 +2201,7 @@
                     <pic:cNvPicPr/>
                   </pic:nvPicPr>
                   <pic:blipFill>
-                    <a:blip xmlns:r="http://schemas.openxmlformats.org/officeDocument/2006/relationships" r:embed="R3b5de36d37c44434"/>
+                    <a:blip xmlns:r="http://schemas.openxmlformats.org/officeDocument/2006/relationships" r:embed="R799e2c74bef145cb"/>
                     <a:stretch>
                       <a:fillRect/>
                     </a:stretch>
@@ -2252,7 +2252,7 @@
                     <pic:cNvPicPr/>
                   </pic:nvPicPr>
                   <pic:blipFill>
-                    <a:blip xmlns:r="http://schemas.openxmlformats.org/officeDocument/2006/relationships" r:embed="R9e95e12179c14caa"/>
+                    <a:blip xmlns:r="http://schemas.openxmlformats.org/officeDocument/2006/relationships" r:embed="R8e29f7fced044b29"/>
                     <a:stretch>
                       <a:fillRect/>
                     </a:stretch>
@@ -2303,7 +2303,7 @@
                     <pic:cNvPicPr/>
                   </pic:nvPicPr>
                   <pic:blipFill>
-                    <a:blip xmlns:r="http://schemas.openxmlformats.org/officeDocument/2006/relationships" r:embed="Rf2d0f05494a14c48"/>
+                    <a:blip xmlns:r="http://schemas.openxmlformats.org/officeDocument/2006/relationships" r:embed="R8884c31a57f44bb7"/>
                     <a:stretch>
                       <a:fillRect/>
                     </a:stretch>
@@ -2354,7 +2354,7 @@
                     <pic:cNvPicPr/>
                   </pic:nvPicPr>
                   <pic:blipFill>
-                    <a:blip xmlns:r="http://schemas.openxmlformats.org/officeDocument/2006/relationships" r:embed="R31559bb4939a4685"/>
+                    <a:blip xmlns:r="http://schemas.openxmlformats.org/officeDocument/2006/relationships" r:embed="R70b48622486e488e"/>
                     <a:stretch>
                       <a:fillRect/>
                     </a:stretch>
@@ -2430,7 +2430,7 @@
                     <pic:cNvPicPr/>
                   </pic:nvPicPr>
                   <pic:blipFill>
-                    <a:blip xmlns:r="http://schemas.openxmlformats.org/officeDocument/2006/relationships" r:embed="Ra60b1c4734894b4c"/>
+                    <a:blip xmlns:r="http://schemas.openxmlformats.org/officeDocument/2006/relationships" r:embed="R9a1127046f204365"/>
                     <a:stretch>
                       <a:fillRect/>
                     </a:stretch>
@@ -2481,7 +2481,7 @@
                     <pic:cNvPicPr/>
                   </pic:nvPicPr>
                   <pic:blipFill>
-                    <a:blip xmlns:r="http://schemas.openxmlformats.org/officeDocument/2006/relationships" r:embed="R6a4920e2569a4ae5"/>
+                    <a:blip xmlns:r="http://schemas.openxmlformats.org/officeDocument/2006/relationships" r:embed="Rf6b9fdd69df2413c"/>
                     <a:stretch>
                       <a:fillRect/>
                     </a:stretch>
@@ -2532,7 +2532,7 @@
                     <pic:cNvPicPr/>
                   </pic:nvPicPr>
                   <pic:blipFill>
-                    <a:blip xmlns:r="http://schemas.openxmlformats.org/officeDocument/2006/relationships" r:embed="R92a1a98e99f24a13"/>
+                    <a:blip xmlns:r="http://schemas.openxmlformats.org/officeDocument/2006/relationships" r:embed="R79d0f2ffb52b4fd7"/>
                     <a:stretch>
                       <a:fillRect/>
                     </a:stretch>
@@ -2583,7 +2583,7 @@
                     <pic:cNvPicPr/>
                   </pic:nvPicPr>
                   <pic:blipFill>
-                    <a:blip xmlns:r="http://schemas.openxmlformats.org/officeDocument/2006/relationships" r:embed="R042949c05d774801"/>
+                    <a:blip xmlns:r="http://schemas.openxmlformats.org/officeDocument/2006/relationships" r:embed="R6c533e6a54ae4a1a"/>
                     <a:stretch>
                       <a:fillRect/>
                     </a:stretch>
@@ -2659,7 +2659,7 @@
                     <pic:cNvPicPr/>
                   </pic:nvPicPr>
                   <pic:blipFill>
-                    <a:blip xmlns:r="http://schemas.openxmlformats.org/officeDocument/2006/relationships" r:embed="R6f3d9b35db234370"/>
+                    <a:blip xmlns:r="http://schemas.openxmlformats.org/officeDocument/2006/relationships" r:embed="R174e535a1cbe4f01"/>
                     <a:stretch>
                       <a:fillRect/>
                     </a:stretch>
@@ -2710,7 +2710,7 @@
                     <pic:cNvPicPr/>
                   </pic:nvPicPr>
                   <pic:blipFill>
-                    <a:blip xmlns:r="http://schemas.openxmlformats.org/officeDocument/2006/relationships" r:embed="Rc7771a7341ab4609"/>
+                    <a:blip xmlns:r="http://schemas.openxmlformats.org/officeDocument/2006/relationships" r:embed="Rf5f1118ee1744cad"/>
                     <a:stretch>
                       <a:fillRect/>
                     </a:stretch>
@@ -2761,7 +2761,7 @@
                     <pic:cNvPicPr/>
                   </pic:nvPicPr>
                   <pic:blipFill>
-                    <a:blip xmlns:r="http://schemas.openxmlformats.org/officeDocument/2006/relationships" r:embed="R624c37e23c984936"/>
+                    <a:blip xmlns:r="http://schemas.openxmlformats.org/officeDocument/2006/relationships" r:embed="R3f3d4c69d2254dd3"/>
                     <a:stretch>
                       <a:fillRect/>
                     </a:stretch>
@@ -2812,7 +2812,7 @@
                     <pic:cNvPicPr/>
                   </pic:nvPicPr>
                   <pic:blipFill>
-                    <a:blip xmlns:r="http://schemas.openxmlformats.org/officeDocument/2006/relationships" r:embed="R304c889e9ac64d37"/>
+                    <a:blip xmlns:r="http://schemas.openxmlformats.org/officeDocument/2006/relationships" r:embed="Ra9f3aee4f7c1431e"/>
                     <a:stretch>
                       <a:fillRect/>
                     </a:stretch>
@@ -2863,7 +2863,7 @@
                     <pic:cNvPicPr/>
                   </pic:nvPicPr>
                   <pic:blipFill>
-                    <a:blip xmlns:r="http://schemas.openxmlformats.org/officeDocument/2006/relationships" r:embed="Refc0dc1b40ae4237"/>
+                    <a:blip xmlns:r="http://schemas.openxmlformats.org/officeDocument/2006/relationships" r:embed="Rf1c0154d39ab4a43"/>
                     <a:stretch>
                       <a:fillRect/>
                     </a:stretch>
@@ -2914,7 +2914,7 @@
                     <pic:cNvPicPr/>
                   </pic:nvPicPr>
                   <pic:blipFill>
-                    <a:blip xmlns:r="http://schemas.openxmlformats.org/officeDocument/2006/relationships" r:embed="R908d337169e94370"/>
+                    <a:blip xmlns:r="http://schemas.openxmlformats.org/officeDocument/2006/relationships" r:embed="R4222f9fc28c3493c"/>
                     <a:stretch>
                       <a:fillRect/>
                     </a:stretch>
@@ -2965,7 +2965,7 @@
                     <pic:cNvPicPr/>
                   </pic:nvPicPr>
                   <pic:blipFill>
-                    <a:blip xmlns:r="http://schemas.openxmlformats.org/officeDocument/2006/relationships" r:embed="Re31d3681d93f44d2"/>
+                    <a:blip xmlns:r="http://schemas.openxmlformats.org/officeDocument/2006/relationships" r:embed="R6e69565a856647d2"/>
                     <a:stretch>
                       <a:fillRect/>
                     </a:stretch>
@@ -3016,7 +3016,7 @@
                     <pic:cNvPicPr/>
                   </pic:nvPicPr>
                   <pic:blipFill>
-                    <a:blip xmlns:r="http://schemas.openxmlformats.org/officeDocument/2006/relationships" r:embed="R8d39971e28b5494a"/>
+                    <a:blip xmlns:r="http://schemas.openxmlformats.org/officeDocument/2006/relationships" r:embed="R7bfc976080c34e1c"/>
                     <a:stretch>
                       <a:fillRect/>
                     </a:stretch>
@@ -3067,7 +3067,7 @@
                     <pic:cNvPicPr/>
                   </pic:nvPicPr>
                   <pic:blipFill>
-                    <a:blip xmlns:r="http://schemas.openxmlformats.org/officeDocument/2006/relationships" r:embed="R4b9f58c462f24a78"/>
+                    <a:blip xmlns:r="http://schemas.openxmlformats.org/officeDocument/2006/relationships" r:embed="R175b456bd69f46ac"/>
                     <a:stretch>
                       <a:fillRect/>
                     </a:stretch>
@@ -3118,7 +3118,7 @@
                     <pic:cNvPicPr/>
                   </pic:nvPicPr>
                   <pic:blipFill>
-                    <a:blip xmlns:r="http://schemas.openxmlformats.org/officeDocument/2006/relationships" r:embed="Rb9f3982cf6104805"/>
+                    <a:blip xmlns:r="http://schemas.openxmlformats.org/officeDocument/2006/relationships" r:embed="Ra9a4df98d4494499"/>
                     <a:stretch>
                       <a:fillRect/>
                     </a:stretch>
@@ -3354,7 +3354,7 @@
                     <pic:cNvPicPr/>
                   </pic:nvPicPr>
                   <pic:blipFill>
-                    <a:blip xmlns:r="http://schemas.openxmlformats.org/officeDocument/2006/relationships" r:embed="Rb715685cb6ee4035"/>
+                    <a:blip xmlns:r="http://schemas.openxmlformats.org/officeDocument/2006/relationships" r:embed="R8943b36cab8a4caf"/>
                     <a:stretch>
                       <a:fillRect/>
                     </a:stretch>
@@ -3405,7 +3405,7 @@
                     <pic:cNvPicPr/>
                   </pic:nvPicPr>
                   <pic:blipFill>
-                    <a:blip xmlns:r="http://schemas.openxmlformats.org/officeDocument/2006/relationships" r:embed="R75d8f6309d054b4c"/>
+                    <a:blip xmlns:r="http://schemas.openxmlformats.org/officeDocument/2006/relationships" r:embed="R97728c53fe994834"/>
                     <a:stretch>
                       <a:fillRect/>
                     </a:stretch>
@@ -3456,7 +3456,7 @@
                     <pic:cNvPicPr/>
                   </pic:nvPicPr>
                   <pic:blipFill>
-                    <a:blip xmlns:r="http://schemas.openxmlformats.org/officeDocument/2006/relationships" r:embed="Re5d23bf703624fc8"/>
+                    <a:blip xmlns:r="http://schemas.openxmlformats.org/officeDocument/2006/relationships" r:embed="R268dcee14f26495b"/>
                     <a:stretch>
                       <a:fillRect/>
                     </a:stretch>
@@ -3507,7 +3507,7 @@
                     <pic:cNvPicPr/>
                   </pic:nvPicPr>
                   <pic:blipFill>
-                    <a:blip xmlns:r="http://schemas.openxmlformats.org/officeDocument/2006/relationships" r:embed="R2f8c9fcb4d814973"/>
+                    <a:blip xmlns:r="http://schemas.openxmlformats.org/officeDocument/2006/relationships" r:embed="R9d611dc491814f39"/>
                     <a:stretch>
                       <a:fillRect/>
                     </a:stretch>
@@ -3558,7 +3558,7 @@
                     <pic:cNvPicPr/>
                   </pic:nvPicPr>
                   <pic:blipFill>
-                    <a:blip xmlns:r="http://schemas.openxmlformats.org/officeDocument/2006/relationships" r:embed="Re4dae197ebe8442e"/>
+                    <a:blip xmlns:r="http://schemas.openxmlformats.org/officeDocument/2006/relationships" r:embed="R21c5756ce23a46c1"/>
                     <a:stretch>
                       <a:fillRect/>
                     </a:stretch>
@@ -3609,7 +3609,7 @@
                     <pic:cNvPicPr/>
                   </pic:nvPicPr>
                   <pic:blipFill>
-                    <a:blip xmlns:r="http://schemas.openxmlformats.org/officeDocument/2006/relationships" r:embed="R2aa559ddc0d6438b"/>
+                    <a:blip xmlns:r="http://schemas.openxmlformats.org/officeDocument/2006/relationships" r:embed="Rb540a0a932664dbd"/>
                     <a:stretch>
                       <a:fillRect/>
                     </a:stretch>
@@ -3660,7 +3660,7 @@
                     <pic:cNvPicPr/>
                   </pic:nvPicPr>
                   <pic:blipFill>
-                    <a:blip xmlns:r="http://schemas.openxmlformats.org/officeDocument/2006/relationships" r:embed="Rdc58ebb03606430c"/>
+                    <a:blip xmlns:r="http://schemas.openxmlformats.org/officeDocument/2006/relationships" r:embed="Redba84641fd14f4f"/>
                     <a:stretch>
                       <a:fillRect/>
                     </a:stretch>
@@ -3711,7 +3711,7 @@
                     <pic:cNvPicPr/>
                   </pic:nvPicPr>
                   <pic:blipFill>
-                    <a:blip xmlns:r="http://schemas.openxmlformats.org/officeDocument/2006/relationships" r:embed="R27552a17885b4489"/>
+                    <a:blip xmlns:r="http://schemas.openxmlformats.org/officeDocument/2006/relationships" r:embed="R8657878ca1654209"/>
                     <a:stretch>
                       <a:fillRect/>
                     </a:stretch>
@@ -3762,7 +3762,7 @@
                     <pic:cNvPicPr/>
                   </pic:nvPicPr>
                   <pic:blipFill>
-                    <a:blip xmlns:r="http://schemas.openxmlformats.org/officeDocument/2006/relationships" r:embed="R76608e99250f40ee"/>
+                    <a:blip xmlns:r="http://schemas.openxmlformats.org/officeDocument/2006/relationships" r:embed="Rd10e166e5d024d14"/>
                     <a:stretch>
                       <a:fillRect/>
                     </a:stretch>
@@ -3859,7 +3859,7 @@
                     <pic:cNvPicPr/>
                   </pic:nvPicPr>
                   <pic:blipFill>
-                    <a:blip xmlns:r="http://schemas.openxmlformats.org/officeDocument/2006/relationships" r:embed="Ree098968d60a4fea"/>
+                    <a:blip xmlns:r="http://schemas.openxmlformats.org/officeDocument/2006/relationships" r:embed="R63fb5d1d245b4cff"/>
                     <a:stretch>
                       <a:fillRect/>
                     </a:stretch>
@@ -3902,7 +3902,7 @@
                     <pic:cNvPicPr/>
                   </pic:nvPicPr>
                   <pic:blipFill>
-                    <a:blip xmlns:r="http://schemas.openxmlformats.org/officeDocument/2006/relationships" r:embed="Rd58058d81a1a44cb"/>
+                    <a:blip xmlns:r="http://schemas.openxmlformats.org/officeDocument/2006/relationships" r:embed="Re4d1445197724ead"/>
                     <a:stretch>
                       <a:fillRect/>
                     </a:stretch>
@@ -3945,7 +3945,7 @@
                     <pic:cNvPicPr/>
                   </pic:nvPicPr>
                   <pic:blipFill>
-                    <a:blip xmlns:r="http://schemas.openxmlformats.org/officeDocument/2006/relationships" r:embed="R8447ae93a71b47b0"/>
+                    <a:blip xmlns:r="http://schemas.openxmlformats.org/officeDocument/2006/relationships" r:embed="R6c75d3cf17124d30"/>
                     <a:stretch>
                       <a:fillRect/>
                     </a:stretch>
@@ -3988,7 +3988,7 @@
                     <pic:cNvPicPr/>
                   </pic:nvPicPr>
                   <pic:blipFill>
-                    <a:blip xmlns:r="http://schemas.openxmlformats.org/officeDocument/2006/relationships" r:embed="R43b8886961cc4138"/>
+                    <a:blip xmlns:r="http://schemas.openxmlformats.org/officeDocument/2006/relationships" r:embed="Raf94d10a21094d0b"/>
                     <a:stretch>
                       <a:fillRect/>
                     </a:stretch>
@@ -4083,7 +4083,7 @@
                     <pic:cNvPicPr/>
                   </pic:nvPicPr>
                   <pic:blipFill>
-                    <a:blip xmlns:r="http://schemas.openxmlformats.org/officeDocument/2006/relationships" r:embed="R281afe1f0a724feb"/>
+                    <a:blip xmlns:r="http://schemas.openxmlformats.org/officeDocument/2006/relationships" r:embed="R511be48aef814360"/>
                     <a:stretch>
                       <a:fillRect/>
                     </a:stretch>
@@ -4336,7 +4336,7 @@
                     <pic:cNvPicPr/>
                   </pic:nvPicPr>
                   <pic:blipFill>
-                    <a:blip xmlns:r="http://schemas.openxmlformats.org/officeDocument/2006/relationships" r:embed="Re6af4cae9c324b0b"/>
+                    <a:blip xmlns:r="http://schemas.openxmlformats.org/officeDocument/2006/relationships" r:embed="R5888c61d83814ae9"/>
                     <a:stretch>
                       <a:fillRect/>
                     </a:stretch>
@@ -4528,7 +4528,7 @@
                     <pic:cNvPicPr/>
                   </pic:nvPicPr>
                   <pic:blipFill>
-                    <a:blip xmlns:r="http://schemas.openxmlformats.org/officeDocument/2006/relationships" r:embed="Rd37b3c66d0e043bd"/>
+                    <a:blip xmlns:r="http://schemas.openxmlformats.org/officeDocument/2006/relationships" r:embed="R2b9553a5388e4c4e"/>
                     <a:stretch>
                       <a:fillRect/>
                     </a:stretch>
@@ -4579,7 +4579,7 @@
                     <pic:cNvPicPr/>
                   </pic:nvPicPr>
                   <pic:blipFill>
-                    <a:blip xmlns:r="http://schemas.openxmlformats.org/officeDocument/2006/relationships" r:embed="R7cdbe93e22a945f6"/>
+                    <a:blip xmlns:r="http://schemas.openxmlformats.org/officeDocument/2006/relationships" r:embed="R541f295eb5764d79"/>
                     <a:stretch>
                       <a:fillRect/>
                     </a:stretch>
@@ -4630,7 +4630,7 @@
                     <pic:cNvPicPr/>
                   </pic:nvPicPr>
                   <pic:blipFill>
-                    <a:blip xmlns:r="http://schemas.openxmlformats.org/officeDocument/2006/relationships" r:embed="R079a61c461214206"/>
+                    <a:blip xmlns:r="http://schemas.openxmlformats.org/officeDocument/2006/relationships" r:embed="R62352c75547c46ce"/>
                     <a:stretch>
                       <a:fillRect/>
                     </a:stretch>
@@ -4681,7 +4681,7 @@
                     <pic:cNvPicPr/>
                   </pic:nvPicPr>
                   <pic:blipFill>
-                    <a:blip xmlns:r="http://schemas.openxmlformats.org/officeDocument/2006/relationships" r:embed="Reed0c9a6534848f9"/>
+                    <a:blip xmlns:r="http://schemas.openxmlformats.org/officeDocument/2006/relationships" r:embed="R661be309f8bf4307"/>
                     <a:stretch>
                       <a:fillRect/>
                     </a:stretch>
@@ -5060,7 +5060,7 @@
                     <pic:cNvPicPr/>
                   </pic:nvPicPr>
                   <pic:blipFill>
-                    <a:blip xmlns:r="http://schemas.openxmlformats.org/officeDocument/2006/relationships" r:embed="Rff983c79915849ce"/>
+                    <a:blip xmlns:r="http://schemas.openxmlformats.org/officeDocument/2006/relationships" r:embed="R41ad1b46c2144a1c"/>
                     <a:stretch>
                       <a:fillRect/>
                     </a:stretch>
@@ -5741,7 +5741,7 @@
             <w:r>
               <w:t xml:space="preserve">Cell with </w:t>
             </w:r>
-            <w:hyperlink xmlns:r="http://schemas.openxmlformats.org/officeDocument/2006/relationships" w:history="true" r:id="R581967cb99aa4008">
+            <w:hyperlink xmlns:r="http://schemas.openxmlformats.org/officeDocument/2006/relationships" w:history="true" r:id="Rb1d7a3cb6bde4d5d">
               <w:r>
                 <w:rPr>
                   <w:rStyle w:val="Hyperlink"/>
@@ -6027,7 +6027,7 @@
                           <pic:cNvPicPr/>
                         </pic:nvPicPr>
                         <pic:blipFill>
-                          <a:blip xmlns:r="http://schemas.openxmlformats.org/officeDocument/2006/relationships" r:embed="R34d94f66fc5349b1"/>
+                          <a:blip xmlns:r="http://schemas.openxmlformats.org/officeDocument/2006/relationships" r:embed="Rd8fc8aed08af47e5"/>
                           <a:stretch>
                             <a:fillRect/>
                           </a:stretch>
@@ -6127,7 +6127,7 @@
                     <pic:cNvPicPr/>
                   </pic:nvPicPr>
                   <pic:blipFill>
-                    <a:blip xmlns:r="http://schemas.openxmlformats.org/officeDocument/2006/relationships" r:embed="Re1d97d575e024efd"/>
+                    <a:blip xmlns:r="http://schemas.openxmlformats.org/officeDocument/2006/relationships" r:embed="R44252b0987294356"/>
                     <a:stretch>
                       <a:fillRect/>
                     </a:stretch>
@@ -6177,7 +6177,7 @@
                     <pic:cNvPicPr/>
                   </pic:nvPicPr>
                   <pic:blipFill>
-                    <a:blip xmlns:r="http://schemas.openxmlformats.org/officeDocument/2006/relationships" r:embed="R7cce3304421d4f55"/>
+                    <a:blip xmlns:r="http://schemas.openxmlformats.org/officeDocument/2006/relationships" r:embed="Red92da36d5ff472f"/>
                     <a:stretch>
                       <a:fillRect/>
                     </a:stretch>
@@ -6227,7 +6227,7 @@
                     <pic:cNvPicPr/>
                   </pic:nvPicPr>
                   <pic:blipFill>
-                    <a:blip xmlns:r="http://schemas.openxmlformats.org/officeDocument/2006/relationships" r:embed="R7081530a72714b02"/>
+                    <a:blip xmlns:r="http://schemas.openxmlformats.org/officeDocument/2006/relationships" r:embed="R3d335ee9f7a64c7f"/>
                     <a:stretch>
                       <a:fillRect/>
                     </a:stretch>

</xml_diff>

<commit_message>
fix(flowchart): use vertical top/bottom ports for TD/BT
Bias vertical flowchart edge attachment to top/bottom faces (centre ports) even when nodes are laterally offset, matching the first flowchart fixture.

Made-with: Cursor
</commit_message>
<xml_diff>
--- a/test.docx
+++ b/test.docx
@@ -236,7 +236,7 @@
       <w:r>
         <w:t xml:space="preserve">, and </w:t>
       </w:r>
-      <w:hyperlink xmlns:r="http://schemas.openxmlformats.org/officeDocument/2006/relationships" w:history="true" r:id="R798bb71d6eda44ad">
+      <w:hyperlink xmlns:r="http://schemas.openxmlformats.org/officeDocument/2006/relationships" w:history="true" r:id="R3113ccbd8d084d28">
         <w:r>
           <w:rPr>
             <w:rStyle w:val="Hyperlink"/>
@@ -475,7 +475,7 @@
       <w:r>
         <w:t xml:space="preserve">Direct link: </w:t>
       </w:r>
-      <w:hyperlink xmlns:r="http://schemas.openxmlformats.org/officeDocument/2006/relationships" w:history="true" r:id="R0da8d56c47bb499f">
+      <w:hyperlink xmlns:r="http://schemas.openxmlformats.org/officeDocument/2006/relationships" w:history="true" r:id="R5a4794bc3910406b">
         <w:r>
           <w:rPr>
             <w:rStyle w:val="Hyperlink"/>
@@ -496,7 +496,7 @@
       <w:r>
         <w:t xml:space="preserve">Direct link with title: </w:t>
       </w:r>
-      <w:hyperlink xmlns:r="http://schemas.openxmlformats.org/officeDocument/2006/relationships" w:history="true" r:id="Rc1a67d79890444b3">
+      <w:hyperlink xmlns:r="http://schemas.openxmlformats.org/officeDocument/2006/relationships" w:history="true" r:id="Rfa2d4ba6c2a2473b">
         <w:r>
           <w:rPr>
             <w:rStyle w:val="Hyperlink"/>
@@ -517,7 +517,7 @@
       <w:r>
         <w:t xml:space="preserve">Reference-style link: </w:t>
       </w:r>
-      <w:hyperlink xmlns:r="http://schemas.openxmlformats.org/officeDocument/2006/relationships" w:history="true" r:id="R23b2e0fe1f4141b9">
+      <w:hyperlink xmlns:r="http://schemas.openxmlformats.org/officeDocument/2006/relationships" w:history="true" r:id="R93001ac5ac9b4c64">
         <w:r>
           <w:rPr>
             <w:rStyle w:val="Hyperlink"/>
@@ -538,7 +538,7 @@
       <w:r>
         <w:t xml:space="preserve">Collapsed reference link: </w:t>
       </w:r>
-      <w:hyperlink xmlns:r="http://schemas.openxmlformats.org/officeDocument/2006/relationships" w:history="true" r:id="R16f4e80312694937">
+      <w:hyperlink xmlns:r="http://schemas.openxmlformats.org/officeDocument/2006/relationships" w:history="true" r:id="R18bd9320dc6e4850">
         <w:r>
           <w:rPr>
             <w:rStyle w:val="Hyperlink"/>
@@ -559,7 +559,7 @@
       <w:r>
         <w:t xml:space="preserve">Repeated reference link: </w:t>
       </w:r>
-      <w:hyperlink xmlns:r="http://schemas.openxmlformats.org/officeDocument/2006/relationships" w:history="true" r:id="R351ffc3f2368435f">
+      <w:hyperlink xmlns:r="http://schemas.openxmlformats.org/officeDocument/2006/relationships" w:history="true" r:id="R7324817ed9844a38">
         <w:r>
           <w:rPr>
             <w:rStyle w:val="Hyperlink"/>
@@ -580,7 +580,7 @@
       <w:r>
         <w:t xml:space="preserve">Autolink URL: </w:t>
       </w:r>
-      <w:hyperlink xmlns:r="http://schemas.openxmlformats.org/officeDocument/2006/relationships" w:history="true" r:id="R9ee7e48e97844661">
+      <w:hyperlink xmlns:r="http://schemas.openxmlformats.org/officeDocument/2006/relationships" w:history="true" r:id="R1f66c2c648a547e7">
         <w:r>
           <w:rPr>
             <w:rStyle w:val="Hyperlink"/>
@@ -601,7 +601,7 @@
       <w:r>
         <w:t xml:space="preserve">Autolink email: </w:t>
       </w:r>
-      <w:hyperlink xmlns:r="http://schemas.openxmlformats.org/officeDocument/2006/relationships" w:history="true" r:id="R8664afff0f374b23">
+      <w:hyperlink xmlns:r="http://schemas.openxmlformats.org/officeDocument/2006/relationships" w:history="true" r:id="Rfb2a907cd4b14a9b">
         <w:r>
           <w:rPr>
             <w:rStyle w:val="Hyperlink"/>
@@ -700,7 +700,7 @@
       <w:r>
         <w:t xml:space="preserve">, and </w:t>
       </w:r>
-      <w:hyperlink xmlns:r="http://schemas.openxmlformats.org/officeDocument/2006/relationships" w:history="true" r:id="Raf055e932e934d44">
+      <w:hyperlink xmlns:r="http://schemas.openxmlformats.org/officeDocument/2006/relationships" w:history="true" r:id="R9e9889a635f947d5">
         <w:r>
           <w:rPr>
             <w:rStyle w:val="Hyperlink"/>
@@ -1093,7 +1093,7 @@
       <w:r>
         <w:t xml:space="preserve">Continuation paragraph with </w:t>
       </w:r>
-      <w:hyperlink xmlns:r="http://schemas.openxmlformats.org/officeDocument/2006/relationships" w:history="true" r:id="Rce2cb34d7bd24b16">
+      <w:hyperlink xmlns:r="http://schemas.openxmlformats.org/officeDocument/2006/relationships" w:history="true" r:id="R1d2ae69cc4024abe">
         <w:r>
           <w:rPr>
             <w:rStyle w:val="Hyperlink"/>
@@ -1591,7 +1591,7 @@
       <w:r>
         <w:t xml:space="preserve">, and </w:t>
       </w:r>
-      <w:hyperlink xmlns:r="http://schemas.openxmlformats.org/officeDocument/2006/relationships" w:history="true" r:id="Rb05ce3bf9d4e4406">
+      <w:hyperlink xmlns:r="http://schemas.openxmlformats.org/officeDocument/2006/relationships" w:history="true" r:id="Re0f3ef827a4e41fd">
         <w:r>
           <w:rPr>
             <w:rStyle w:val="Hyperlink"/>
@@ -1979,7 +1979,7 @@
                     <pic:cNvPicPr/>
                   </pic:nvPicPr>
                   <pic:blipFill>
-                    <a:blip xmlns:r="http://schemas.openxmlformats.org/officeDocument/2006/relationships" r:embed="Rfcbfd137c7664a98"/>
+                    <a:blip xmlns:r="http://schemas.openxmlformats.org/officeDocument/2006/relationships" r:embed="R207eef27767e4fb1"/>
                     <a:stretch>
                       <a:fillRect/>
                     </a:stretch>
@@ -2039,7 +2039,7 @@
                     <pic:cNvPicPr/>
                   </pic:nvPicPr>
                   <pic:blipFill>
-                    <a:blip xmlns:r="http://schemas.openxmlformats.org/officeDocument/2006/relationships" r:embed="R0b688ef9abf1422b"/>
+                    <a:blip xmlns:r="http://schemas.openxmlformats.org/officeDocument/2006/relationships" r:embed="R42674267ddb04176"/>
                     <a:stretch>
                       <a:fillRect/>
                     </a:stretch>
@@ -2099,7 +2099,7 @@
                     <pic:cNvPicPr/>
                   </pic:nvPicPr>
                   <pic:blipFill>
-                    <a:blip xmlns:r="http://schemas.openxmlformats.org/officeDocument/2006/relationships" r:embed="R83ab275af6a945ab"/>
+                    <a:blip xmlns:r="http://schemas.openxmlformats.org/officeDocument/2006/relationships" r:embed="R9df259bdf8594b9a"/>
                     <a:stretch>
                       <a:fillRect/>
                     </a:stretch>
@@ -2150,7 +2150,7 @@
                     <pic:cNvPicPr/>
                   </pic:nvPicPr>
                   <pic:blipFill>
-                    <a:blip xmlns:r="http://schemas.openxmlformats.org/officeDocument/2006/relationships" r:embed="R7c6bbe715d444b14"/>
+                    <a:blip xmlns:r="http://schemas.openxmlformats.org/officeDocument/2006/relationships" r:embed="Rd571cdafc52040ac"/>
                     <a:stretch>
                       <a:fillRect/>
                     </a:stretch>
@@ -2201,7 +2201,7 @@
                     <pic:cNvPicPr/>
                   </pic:nvPicPr>
                   <pic:blipFill>
-                    <a:blip xmlns:r="http://schemas.openxmlformats.org/officeDocument/2006/relationships" r:embed="R799e2c74bef145cb"/>
+                    <a:blip xmlns:r="http://schemas.openxmlformats.org/officeDocument/2006/relationships" r:embed="Rb399afd62ee64950"/>
                     <a:stretch>
                       <a:fillRect/>
                     </a:stretch>
@@ -2252,7 +2252,7 @@
                     <pic:cNvPicPr/>
                   </pic:nvPicPr>
                   <pic:blipFill>
-                    <a:blip xmlns:r="http://schemas.openxmlformats.org/officeDocument/2006/relationships" r:embed="R8e29f7fced044b29"/>
+                    <a:blip xmlns:r="http://schemas.openxmlformats.org/officeDocument/2006/relationships" r:embed="R1661401d27814025"/>
                     <a:stretch>
                       <a:fillRect/>
                     </a:stretch>
@@ -2303,7 +2303,7 @@
                     <pic:cNvPicPr/>
                   </pic:nvPicPr>
                   <pic:blipFill>
-                    <a:blip xmlns:r="http://schemas.openxmlformats.org/officeDocument/2006/relationships" r:embed="R8884c31a57f44bb7"/>
+                    <a:blip xmlns:r="http://schemas.openxmlformats.org/officeDocument/2006/relationships" r:embed="R8318ddba42754385"/>
                     <a:stretch>
                       <a:fillRect/>
                     </a:stretch>
@@ -2354,7 +2354,7 @@
                     <pic:cNvPicPr/>
                   </pic:nvPicPr>
                   <pic:blipFill>
-                    <a:blip xmlns:r="http://schemas.openxmlformats.org/officeDocument/2006/relationships" r:embed="R70b48622486e488e"/>
+                    <a:blip xmlns:r="http://schemas.openxmlformats.org/officeDocument/2006/relationships" r:embed="Rf38fff5488944309"/>
                     <a:stretch>
                       <a:fillRect/>
                     </a:stretch>
@@ -2430,7 +2430,7 @@
                     <pic:cNvPicPr/>
                   </pic:nvPicPr>
                   <pic:blipFill>
-                    <a:blip xmlns:r="http://schemas.openxmlformats.org/officeDocument/2006/relationships" r:embed="R9a1127046f204365"/>
+                    <a:blip xmlns:r="http://schemas.openxmlformats.org/officeDocument/2006/relationships" r:embed="R025c3af22e9c411b"/>
                     <a:stretch>
                       <a:fillRect/>
                     </a:stretch>
@@ -2481,7 +2481,7 @@
                     <pic:cNvPicPr/>
                   </pic:nvPicPr>
                   <pic:blipFill>
-                    <a:blip xmlns:r="http://schemas.openxmlformats.org/officeDocument/2006/relationships" r:embed="Rf6b9fdd69df2413c"/>
+                    <a:blip xmlns:r="http://schemas.openxmlformats.org/officeDocument/2006/relationships" r:embed="Rfd0ee7ded30f45c7"/>
                     <a:stretch>
                       <a:fillRect/>
                     </a:stretch>
@@ -2532,7 +2532,7 @@
                     <pic:cNvPicPr/>
                   </pic:nvPicPr>
                   <pic:blipFill>
-                    <a:blip xmlns:r="http://schemas.openxmlformats.org/officeDocument/2006/relationships" r:embed="R79d0f2ffb52b4fd7"/>
+                    <a:blip xmlns:r="http://schemas.openxmlformats.org/officeDocument/2006/relationships" r:embed="Re8223bd245ec45ed"/>
                     <a:stretch>
                       <a:fillRect/>
                     </a:stretch>
@@ -2583,7 +2583,7 @@
                     <pic:cNvPicPr/>
                   </pic:nvPicPr>
                   <pic:blipFill>
-                    <a:blip xmlns:r="http://schemas.openxmlformats.org/officeDocument/2006/relationships" r:embed="R6c533e6a54ae4a1a"/>
+                    <a:blip xmlns:r="http://schemas.openxmlformats.org/officeDocument/2006/relationships" r:embed="R14d417fd48a449b2"/>
                     <a:stretch>
                       <a:fillRect/>
                     </a:stretch>
@@ -2659,7 +2659,7 @@
                     <pic:cNvPicPr/>
                   </pic:nvPicPr>
                   <pic:blipFill>
-                    <a:blip xmlns:r="http://schemas.openxmlformats.org/officeDocument/2006/relationships" r:embed="R174e535a1cbe4f01"/>
+                    <a:blip xmlns:r="http://schemas.openxmlformats.org/officeDocument/2006/relationships" r:embed="R678234a390da4737"/>
                     <a:stretch>
                       <a:fillRect/>
                     </a:stretch>
@@ -2710,7 +2710,7 @@
                     <pic:cNvPicPr/>
                   </pic:nvPicPr>
                   <pic:blipFill>
-                    <a:blip xmlns:r="http://schemas.openxmlformats.org/officeDocument/2006/relationships" r:embed="Rf5f1118ee1744cad"/>
+                    <a:blip xmlns:r="http://schemas.openxmlformats.org/officeDocument/2006/relationships" r:embed="R1788cc59518745a3"/>
                     <a:stretch>
                       <a:fillRect/>
                     </a:stretch>
@@ -2761,7 +2761,7 @@
                     <pic:cNvPicPr/>
                   </pic:nvPicPr>
                   <pic:blipFill>
-                    <a:blip xmlns:r="http://schemas.openxmlformats.org/officeDocument/2006/relationships" r:embed="R3f3d4c69d2254dd3"/>
+                    <a:blip xmlns:r="http://schemas.openxmlformats.org/officeDocument/2006/relationships" r:embed="Rb1313457f92b4419"/>
                     <a:stretch>
                       <a:fillRect/>
                     </a:stretch>
@@ -2812,7 +2812,7 @@
                     <pic:cNvPicPr/>
                   </pic:nvPicPr>
                   <pic:blipFill>
-                    <a:blip xmlns:r="http://schemas.openxmlformats.org/officeDocument/2006/relationships" r:embed="Ra9f3aee4f7c1431e"/>
+                    <a:blip xmlns:r="http://schemas.openxmlformats.org/officeDocument/2006/relationships" r:embed="Ra2c152030fe14c3c"/>
                     <a:stretch>
                       <a:fillRect/>
                     </a:stretch>
@@ -2863,7 +2863,7 @@
                     <pic:cNvPicPr/>
                   </pic:nvPicPr>
                   <pic:blipFill>
-                    <a:blip xmlns:r="http://schemas.openxmlformats.org/officeDocument/2006/relationships" r:embed="Rf1c0154d39ab4a43"/>
+                    <a:blip xmlns:r="http://schemas.openxmlformats.org/officeDocument/2006/relationships" r:embed="Rea652ab54f1d4c8e"/>
                     <a:stretch>
                       <a:fillRect/>
                     </a:stretch>
@@ -2914,7 +2914,7 @@
                     <pic:cNvPicPr/>
                   </pic:nvPicPr>
                   <pic:blipFill>
-                    <a:blip xmlns:r="http://schemas.openxmlformats.org/officeDocument/2006/relationships" r:embed="R4222f9fc28c3493c"/>
+                    <a:blip xmlns:r="http://schemas.openxmlformats.org/officeDocument/2006/relationships" r:embed="R3913a6e24b9646a5"/>
                     <a:stretch>
                       <a:fillRect/>
                     </a:stretch>
@@ -2965,7 +2965,7 @@
                     <pic:cNvPicPr/>
                   </pic:nvPicPr>
                   <pic:blipFill>
-                    <a:blip xmlns:r="http://schemas.openxmlformats.org/officeDocument/2006/relationships" r:embed="R6e69565a856647d2"/>
+                    <a:blip xmlns:r="http://schemas.openxmlformats.org/officeDocument/2006/relationships" r:embed="R7d15ca36581c4e80"/>
                     <a:stretch>
                       <a:fillRect/>
                     </a:stretch>
@@ -3016,7 +3016,7 @@
                     <pic:cNvPicPr/>
                   </pic:nvPicPr>
                   <pic:blipFill>
-                    <a:blip xmlns:r="http://schemas.openxmlformats.org/officeDocument/2006/relationships" r:embed="R7bfc976080c34e1c"/>
+                    <a:blip xmlns:r="http://schemas.openxmlformats.org/officeDocument/2006/relationships" r:embed="R2409150c0467446e"/>
                     <a:stretch>
                       <a:fillRect/>
                     </a:stretch>
@@ -3067,7 +3067,7 @@
                     <pic:cNvPicPr/>
                   </pic:nvPicPr>
                   <pic:blipFill>
-                    <a:blip xmlns:r="http://schemas.openxmlformats.org/officeDocument/2006/relationships" r:embed="R175b456bd69f46ac"/>
+                    <a:blip xmlns:r="http://schemas.openxmlformats.org/officeDocument/2006/relationships" r:embed="Rfa02de1d7f7b4803"/>
                     <a:stretch>
                       <a:fillRect/>
                     </a:stretch>
@@ -3118,7 +3118,7 @@
                     <pic:cNvPicPr/>
                   </pic:nvPicPr>
                   <pic:blipFill>
-                    <a:blip xmlns:r="http://schemas.openxmlformats.org/officeDocument/2006/relationships" r:embed="Ra9a4df98d4494499"/>
+                    <a:blip xmlns:r="http://schemas.openxmlformats.org/officeDocument/2006/relationships" r:embed="R50590207b8b947c8"/>
                     <a:stretch>
                       <a:fillRect/>
                     </a:stretch>
@@ -3354,7 +3354,7 @@
                     <pic:cNvPicPr/>
                   </pic:nvPicPr>
                   <pic:blipFill>
-                    <a:blip xmlns:r="http://schemas.openxmlformats.org/officeDocument/2006/relationships" r:embed="R8943b36cab8a4caf"/>
+                    <a:blip xmlns:r="http://schemas.openxmlformats.org/officeDocument/2006/relationships" r:embed="R1bdc80ad12324b9f"/>
                     <a:stretch>
                       <a:fillRect/>
                     </a:stretch>
@@ -3405,7 +3405,7 @@
                     <pic:cNvPicPr/>
                   </pic:nvPicPr>
                   <pic:blipFill>
-                    <a:blip xmlns:r="http://schemas.openxmlformats.org/officeDocument/2006/relationships" r:embed="R97728c53fe994834"/>
+                    <a:blip xmlns:r="http://schemas.openxmlformats.org/officeDocument/2006/relationships" r:embed="Rcba9ade3143d4b78"/>
                     <a:stretch>
                       <a:fillRect/>
                     </a:stretch>
@@ -3456,7 +3456,7 @@
                     <pic:cNvPicPr/>
                   </pic:nvPicPr>
                   <pic:blipFill>
-                    <a:blip xmlns:r="http://schemas.openxmlformats.org/officeDocument/2006/relationships" r:embed="R268dcee14f26495b"/>
+                    <a:blip xmlns:r="http://schemas.openxmlformats.org/officeDocument/2006/relationships" r:embed="R7b46060f0d6b44cb"/>
                     <a:stretch>
                       <a:fillRect/>
                     </a:stretch>
@@ -3507,7 +3507,7 @@
                     <pic:cNvPicPr/>
                   </pic:nvPicPr>
                   <pic:blipFill>
-                    <a:blip xmlns:r="http://schemas.openxmlformats.org/officeDocument/2006/relationships" r:embed="R9d611dc491814f39"/>
+                    <a:blip xmlns:r="http://schemas.openxmlformats.org/officeDocument/2006/relationships" r:embed="Rd652f8b72ef74b1d"/>
                     <a:stretch>
                       <a:fillRect/>
                     </a:stretch>
@@ -3558,7 +3558,7 @@
                     <pic:cNvPicPr/>
                   </pic:nvPicPr>
                   <pic:blipFill>
-                    <a:blip xmlns:r="http://schemas.openxmlformats.org/officeDocument/2006/relationships" r:embed="R21c5756ce23a46c1"/>
+                    <a:blip xmlns:r="http://schemas.openxmlformats.org/officeDocument/2006/relationships" r:embed="R34c9192a366a41af"/>
                     <a:stretch>
                       <a:fillRect/>
                     </a:stretch>
@@ -3609,7 +3609,7 @@
                     <pic:cNvPicPr/>
                   </pic:nvPicPr>
                   <pic:blipFill>
-                    <a:blip xmlns:r="http://schemas.openxmlformats.org/officeDocument/2006/relationships" r:embed="Rb540a0a932664dbd"/>
+                    <a:blip xmlns:r="http://schemas.openxmlformats.org/officeDocument/2006/relationships" r:embed="Ra041a8f8820340c6"/>
                     <a:stretch>
                       <a:fillRect/>
                     </a:stretch>
@@ -3660,7 +3660,7 @@
                     <pic:cNvPicPr/>
                   </pic:nvPicPr>
                   <pic:blipFill>
-                    <a:blip xmlns:r="http://schemas.openxmlformats.org/officeDocument/2006/relationships" r:embed="Redba84641fd14f4f"/>
+                    <a:blip xmlns:r="http://schemas.openxmlformats.org/officeDocument/2006/relationships" r:embed="R7360fee6bb9f4c8b"/>
                     <a:stretch>
                       <a:fillRect/>
                     </a:stretch>
@@ -3711,7 +3711,7 @@
                     <pic:cNvPicPr/>
                   </pic:nvPicPr>
                   <pic:blipFill>
-                    <a:blip xmlns:r="http://schemas.openxmlformats.org/officeDocument/2006/relationships" r:embed="R8657878ca1654209"/>
+                    <a:blip xmlns:r="http://schemas.openxmlformats.org/officeDocument/2006/relationships" r:embed="Rb45213d0a567414a"/>
                     <a:stretch>
                       <a:fillRect/>
                     </a:stretch>
@@ -3762,7 +3762,7 @@
                     <pic:cNvPicPr/>
                   </pic:nvPicPr>
                   <pic:blipFill>
-                    <a:blip xmlns:r="http://schemas.openxmlformats.org/officeDocument/2006/relationships" r:embed="Rd10e166e5d024d14"/>
+                    <a:blip xmlns:r="http://schemas.openxmlformats.org/officeDocument/2006/relationships" r:embed="Rf579331f3a574eab"/>
                     <a:stretch>
                       <a:fillRect/>
                     </a:stretch>
@@ -3859,7 +3859,7 @@
                     <pic:cNvPicPr/>
                   </pic:nvPicPr>
                   <pic:blipFill>
-                    <a:blip xmlns:r="http://schemas.openxmlformats.org/officeDocument/2006/relationships" r:embed="R63fb5d1d245b4cff"/>
+                    <a:blip xmlns:r="http://schemas.openxmlformats.org/officeDocument/2006/relationships" r:embed="R1e9a81b2ab4547f3"/>
                     <a:stretch>
                       <a:fillRect/>
                     </a:stretch>
@@ -3902,7 +3902,7 @@
                     <pic:cNvPicPr/>
                   </pic:nvPicPr>
                   <pic:blipFill>
-                    <a:blip xmlns:r="http://schemas.openxmlformats.org/officeDocument/2006/relationships" r:embed="Re4d1445197724ead"/>
+                    <a:blip xmlns:r="http://schemas.openxmlformats.org/officeDocument/2006/relationships" r:embed="R05aae72c71f54842"/>
                     <a:stretch>
                       <a:fillRect/>
                     </a:stretch>
@@ -3945,7 +3945,7 @@
                     <pic:cNvPicPr/>
                   </pic:nvPicPr>
                   <pic:blipFill>
-                    <a:blip xmlns:r="http://schemas.openxmlformats.org/officeDocument/2006/relationships" r:embed="R6c75d3cf17124d30"/>
+                    <a:blip xmlns:r="http://schemas.openxmlformats.org/officeDocument/2006/relationships" r:embed="R4e163a09428b411f"/>
                     <a:stretch>
                       <a:fillRect/>
                     </a:stretch>
@@ -3988,7 +3988,7 @@
                     <pic:cNvPicPr/>
                   </pic:nvPicPr>
                   <pic:blipFill>
-                    <a:blip xmlns:r="http://schemas.openxmlformats.org/officeDocument/2006/relationships" r:embed="Raf94d10a21094d0b"/>
+                    <a:blip xmlns:r="http://schemas.openxmlformats.org/officeDocument/2006/relationships" r:embed="Rd9897a79d3ec4a45"/>
                     <a:stretch>
                       <a:fillRect/>
                     </a:stretch>
@@ -4083,7 +4083,7 @@
                     <pic:cNvPicPr/>
                   </pic:nvPicPr>
                   <pic:blipFill>
-                    <a:blip xmlns:r="http://schemas.openxmlformats.org/officeDocument/2006/relationships" r:embed="R511be48aef814360"/>
+                    <a:blip xmlns:r="http://schemas.openxmlformats.org/officeDocument/2006/relationships" r:embed="Re04f85810f554c8d"/>
                     <a:stretch>
                       <a:fillRect/>
                     </a:stretch>
@@ -4336,7 +4336,7 @@
                     <pic:cNvPicPr/>
                   </pic:nvPicPr>
                   <pic:blipFill>
-                    <a:blip xmlns:r="http://schemas.openxmlformats.org/officeDocument/2006/relationships" r:embed="R5888c61d83814ae9"/>
+                    <a:blip xmlns:r="http://schemas.openxmlformats.org/officeDocument/2006/relationships" r:embed="R517a9adb7e78498b"/>
                     <a:stretch>
                       <a:fillRect/>
                     </a:stretch>
@@ -4528,7 +4528,7 @@
                     <pic:cNvPicPr/>
                   </pic:nvPicPr>
                   <pic:blipFill>
-                    <a:blip xmlns:r="http://schemas.openxmlformats.org/officeDocument/2006/relationships" r:embed="R2b9553a5388e4c4e"/>
+                    <a:blip xmlns:r="http://schemas.openxmlformats.org/officeDocument/2006/relationships" r:embed="R8b0c52bc558248fa"/>
                     <a:stretch>
                       <a:fillRect/>
                     </a:stretch>
@@ -4579,7 +4579,7 @@
                     <pic:cNvPicPr/>
                   </pic:nvPicPr>
                   <pic:blipFill>
-                    <a:blip xmlns:r="http://schemas.openxmlformats.org/officeDocument/2006/relationships" r:embed="R541f295eb5764d79"/>
+                    <a:blip xmlns:r="http://schemas.openxmlformats.org/officeDocument/2006/relationships" r:embed="Rc6a9122eef164ad6"/>
                     <a:stretch>
                       <a:fillRect/>
                     </a:stretch>
@@ -4630,7 +4630,7 @@
                     <pic:cNvPicPr/>
                   </pic:nvPicPr>
                   <pic:blipFill>
-                    <a:blip xmlns:r="http://schemas.openxmlformats.org/officeDocument/2006/relationships" r:embed="R62352c75547c46ce"/>
+                    <a:blip xmlns:r="http://schemas.openxmlformats.org/officeDocument/2006/relationships" r:embed="Rc31a586c55bd4b5c"/>
                     <a:stretch>
                       <a:fillRect/>
                     </a:stretch>
@@ -4681,7 +4681,7 @@
                     <pic:cNvPicPr/>
                   </pic:nvPicPr>
                   <pic:blipFill>
-                    <a:blip xmlns:r="http://schemas.openxmlformats.org/officeDocument/2006/relationships" r:embed="R661be309f8bf4307"/>
+                    <a:blip xmlns:r="http://schemas.openxmlformats.org/officeDocument/2006/relationships" r:embed="Rc28c60c29c454343"/>
                     <a:stretch>
                       <a:fillRect/>
                     </a:stretch>
@@ -5060,7 +5060,7 @@
                     <pic:cNvPicPr/>
                   </pic:nvPicPr>
                   <pic:blipFill>
-                    <a:blip xmlns:r="http://schemas.openxmlformats.org/officeDocument/2006/relationships" r:embed="R41ad1b46c2144a1c"/>
+                    <a:blip xmlns:r="http://schemas.openxmlformats.org/officeDocument/2006/relationships" r:embed="R7634dbb99ef24992"/>
                     <a:stretch>
                       <a:fillRect/>
                     </a:stretch>
@@ -5741,7 +5741,7 @@
             <w:r>
               <w:t xml:space="preserve">Cell with </w:t>
             </w:r>
-            <w:hyperlink xmlns:r="http://schemas.openxmlformats.org/officeDocument/2006/relationships" w:history="true" r:id="Rb1d7a3cb6bde4d5d">
+            <w:hyperlink xmlns:r="http://schemas.openxmlformats.org/officeDocument/2006/relationships" w:history="true" r:id="Rd578f037bf68464e">
               <w:r>
                 <w:rPr>
                   <w:rStyle w:val="Hyperlink"/>
@@ -6027,7 +6027,7 @@
                           <pic:cNvPicPr/>
                         </pic:nvPicPr>
                         <pic:blipFill>
-                          <a:blip xmlns:r="http://schemas.openxmlformats.org/officeDocument/2006/relationships" r:embed="Rd8fc8aed08af47e5"/>
+                          <a:blip xmlns:r="http://schemas.openxmlformats.org/officeDocument/2006/relationships" r:embed="Re1611f87ff5c46e0"/>
                           <a:stretch>
                             <a:fillRect/>
                           </a:stretch>
@@ -6127,7 +6127,7 @@
                     <pic:cNvPicPr/>
                   </pic:nvPicPr>
                   <pic:blipFill>
-                    <a:blip xmlns:r="http://schemas.openxmlformats.org/officeDocument/2006/relationships" r:embed="R44252b0987294356"/>
+                    <a:blip xmlns:r="http://schemas.openxmlformats.org/officeDocument/2006/relationships" r:embed="R332a69b3f6804d62"/>
                     <a:stretch>
                       <a:fillRect/>
                     </a:stretch>
@@ -6177,7 +6177,7 @@
                     <pic:cNvPicPr/>
                   </pic:nvPicPr>
                   <pic:blipFill>
-                    <a:blip xmlns:r="http://schemas.openxmlformats.org/officeDocument/2006/relationships" r:embed="Red92da36d5ff472f"/>
+                    <a:blip xmlns:r="http://schemas.openxmlformats.org/officeDocument/2006/relationships" r:embed="R2122132e6b6c44e5"/>
                     <a:stretch>
                       <a:fillRect/>
                     </a:stretch>
@@ -6227,7 +6227,7 @@
                     <pic:cNvPicPr/>
                   </pic:nvPicPr>
                   <pic:blipFill>
-                    <a:blip xmlns:r="http://schemas.openxmlformats.org/officeDocument/2006/relationships" r:embed="R3d335ee9f7a64c7f"/>
+                    <a:blip xmlns:r="http://schemas.openxmlformats.org/officeDocument/2006/relationships" r:embed="Re9c4f3f890bf4b0e"/>
                     <a:stretch>
                       <a:fillRect/>
                     </a:stretch>

</xml_diff>

<commit_message>
fix(flowchart): apply ER-style slot ports for vertical TD/BT
Use the ER vertical slot allocation rules for flowchart TD/BT edge attachment, distributing ports across the facing edge for fan-out/fan-in.

Made-with: Cursor
</commit_message>
<xml_diff>
--- a/test.docx
+++ b/test.docx
@@ -236,7 +236,7 @@
       <w:r>
         <w:t xml:space="preserve">, and </w:t>
       </w:r>
-      <w:hyperlink xmlns:r="http://schemas.openxmlformats.org/officeDocument/2006/relationships" w:history="true" r:id="R3113ccbd8d084d28">
+      <w:hyperlink xmlns:r="http://schemas.openxmlformats.org/officeDocument/2006/relationships" w:history="true" r:id="Rda1dd3861df44c92">
         <w:r>
           <w:rPr>
             <w:rStyle w:val="Hyperlink"/>
@@ -475,7 +475,7 @@
       <w:r>
         <w:t xml:space="preserve">Direct link: </w:t>
       </w:r>
-      <w:hyperlink xmlns:r="http://schemas.openxmlformats.org/officeDocument/2006/relationships" w:history="true" r:id="R5a4794bc3910406b">
+      <w:hyperlink xmlns:r="http://schemas.openxmlformats.org/officeDocument/2006/relationships" w:history="true" r:id="Rbbc19ee38a674093">
         <w:r>
           <w:rPr>
             <w:rStyle w:val="Hyperlink"/>
@@ -496,7 +496,7 @@
       <w:r>
         <w:t xml:space="preserve">Direct link with title: </w:t>
       </w:r>
-      <w:hyperlink xmlns:r="http://schemas.openxmlformats.org/officeDocument/2006/relationships" w:history="true" r:id="Rfa2d4ba6c2a2473b">
+      <w:hyperlink xmlns:r="http://schemas.openxmlformats.org/officeDocument/2006/relationships" w:history="true" r:id="Rdb9b8e9787634a88">
         <w:r>
           <w:rPr>
             <w:rStyle w:val="Hyperlink"/>
@@ -517,7 +517,7 @@
       <w:r>
         <w:t xml:space="preserve">Reference-style link: </w:t>
       </w:r>
-      <w:hyperlink xmlns:r="http://schemas.openxmlformats.org/officeDocument/2006/relationships" w:history="true" r:id="R93001ac5ac9b4c64">
+      <w:hyperlink xmlns:r="http://schemas.openxmlformats.org/officeDocument/2006/relationships" w:history="true" r:id="R03ca7b12b6f3486d">
         <w:r>
           <w:rPr>
             <w:rStyle w:val="Hyperlink"/>
@@ -538,7 +538,7 @@
       <w:r>
         <w:t xml:space="preserve">Collapsed reference link: </w:t>
       </w:r>
-      <w:hyperlink xmlns:r="http://schemas.openxmlformats.org/officeDocument/2006/relationships" w:history="true" r:id="R18bd9320dc6e4850">
+      <w:hyperlink xmlns:r="http://schemas.openxmlformats.org/officeDocument/2006/relationships" w:history="true" r:id="R6536488888f84c0e">
         <w:r>
           <w:rPr>
             <w:rStyle w:val="Hyperlink"/>
@@ -559,7 +559,7 @@
       <w:r>
         <w:t xml:space="preserve">Repeated reference link: </w:t>
       </w:r>
-      <w:hyperlink xmlns:r="http://schemas.openxmlformats.org/officeDocument/2006/relationships" w:history="true" r:id="R7324817ed9844a38">
+      <w:hyperlink xmlns:r="http://schemas.openxmlformats.org/officeDocument/2006/relationships" w:history="true" r:id="Rf60d67507e6945b7">
         <w:r>
           <w:rPr>
             <w:rStyle w:val="Hyperlink"/>
@@ -580,7 +580,7 @@
       <w:r>
         <w:t xml:space="preserve">Autolink URL: </w:t>
       </w:r>
-      <w:hyperlink xmlns:r="http://schemas.openxmlformats.org/officeDocument/2006/relationships" w:history="true" r:id="R1f66c2c648a547e7">
+      <w:hyperlink xmlns:r="http://schemas.openxmlformats.org/officeDocument/2006/relationships" w:history="true" r:id="R23dcc9e7eadd487c">
         <w:r>
           <w:rPr>
             <w:rStyle w:val="Hyperlink"/>
@@ -601,7 +601,7 @@
       <w:r>
         <w:t xml:space="preserve">Autolink email: </w:t>
       </w:r>
-      <w:hyperlink xmlns:r="http://schemas.openxmlformats.org/officeDocument/2006/relationships" w:history="true" r:id="Rfb2a907cd4b14a9b">
+      <w:hyperlink xmlns:r="http://schemas.openxmlformats.org/officeDocument/2006/relationships" w:history="true" r:id="Recb93cd4992648f9">
         <w:r>
           <w:rPr>
             <w:rStyle w:val="Hyperlink"/>
@@ -700,7 +700,7 @@
       <w:r>
         <w:t xml:space="preserve">, and </w:t>
       </w:r>
-      <w:hyperlink xmlns:r="http://schemas.openxmlformats.org/officeDocument/2006/relationships" w:history="true" r:id="R9e9889a635f947d5">
+      <w:hyperlink xmlns:r="http://schemas.openxmlformats.org/officeDocument/2006/relationships" w:history="true" r:id="R0416de8afbb44ef7">
         <w:r>
           <w:rPr>
             <w:rStyle w:val="Hyperlink"/>
@@ -1093,7 +1093,7 @@
       <w:r>
         <w:t xml:space="preserve">Continuation paragraph with </w:t>
       </w:r>
-      <w:hyperlink xmlns:r="http://schemas.openxmlformats.org/officeDocument/2006/relationships" w:history="true" r:id="R1d2ae69cc4024abe">
+      <w:hyperlink xmlns:r="http://schemas.openxmlformats.org/officeDocument/2006/relationships" w:history="true" r:id="R0e20475a616342b9">
         <w:r>
           <w:rPr>
             <w:rStyle w:val="Hyperlink"/>
@@ -1591,7 +1591,7 @@
       <w:r>
         <w:t xml:space="preserve">, and </w:t>
       </w:r>
-      <w:hyperlink xmlns:r="http://schemas.openxmlformats.org/officeDocument/2006/relationships" w:history="true" r:id="Re0f3ef827a4e41fd">
+      <w:hyperlink xmlns:r="http://schemas.openxmlformats.org/officeDocument/2006/relationships" w:history="true" r:id="R16350560c8004ff2">
         <w:r>
           <w:rPr>
             <w:rStyle w:val="Hyperlink"/>
@@ -1979,7 +1979,7 @@
                     <pic:cNvPicPr/>
                   </pic:nvPicPr>
                   <pic:blipFill>
-                    <a:blip xmlns:r="http://schemas.openxmlformats.org/officeDocument/2006/relationships" r:embed="R207eef27767e4fb1"/>
+                    <a:blip xmlns:r="http://schemas.openxmlformats.org/officeDocument/2006/relationships" r:embed="R2d0f6cb3915a47bb"/>
                     <a:stretch>
                       <a:fillRect/>
                     </a:stretch>
@@ -2039,7 +2039,7 @@
                     <pic:cNvPicPr/>
                   </pic:nvPicPr>
                   <pic:blipFill>
-                    <a:blip xmlns:r="http://schemas.openxmlformats.org/officeDocument/2006/relationships" r:embed="R42674267ddb04176"/>
+                    <a:blip xmlns:r="http://schemas.openxmlformats.org/officeDocument/2006/relationships" r:embed="Red9f2c98033d4995"/>
                     <a:stretch>
                       <a:fillRect/>
                     </a:stretch>
@@ -2099,7 +2099,7 @@
                     <pic:cNvPicPr/>
                   </pic:nvPicPr>
                   <pic:blipFill>
-                    <a:blip xmlns:r="http://schemas.openxmlformats.org/officeDocument/2006/relationships" r:embed="R9df259bdf8594b9a"/>
+                    <a:blip xmlns:r="http://schemas.openxmlformats.org/officeDocument/2006/relationships" r:embed="R2412493b14a24143"/>
                     <a:stretch>
                       <a:fillRect/>
                     </a:stretch>
@@ -2150,7 +2150,7 @@
                     <pic:cNvPicPr/>
                   </pic:nvPicPr>
                   <pic:blipFill>
-                    <a:blip xmlns:r="http://schemas.openxmlformats.org/officeDocument/2006/relationships" r:embed="Rd571cdafc52040ac"/>
+                    <a:blip xmlns:r="http://schemas.openxmlformats.org/officeDocument/2006/relationships" r:embed="R6dc7f78b841e441e"/>
                     <a:stretch>
                       <a:fillRect/>
                     </a:stretch>
@@ -2201,7 +2201,7 @@
                     <pic:cNvPicPr/>
                   </pic:nvPicPr>
                   <pic:blipFill>
-                    <a:blip xmlns:r="http://schemas.openxmlformats.org/officeDocument/2006/relationships" r:embed="Rb399afd62ee64950"/>
+                    <a:blip xmlns:r="http://schemas.openxmlformats.org/officeDocument/2006/relationships" r:embed="R37c4064909074b0b"/>
                     <a:stretch>
                       <a:fillRect/>
                     </a:stretch>
@@ -2252,7 +2252,7 @@
                     <pic:cNvPicPr/>
                   </pic:nvPicPr>
                   <pic:blipFill>
-                    <a:blip xmlns:r="http://schemas.openxmlformats.org/officeDocument/2006/relationships" r:embed="R1661401d27814025"/>
+                    <a:blip xmlns:r="http://schemas.openxmlformats.org/officeDocument/2006/relationships" r:embed="R8367dc65a6644459"/>
                     <a:stretch>
                       <a:fillRect/>
                     </a:stretch>
@@ -2303,7 +2303,7 @@
                     <pic:cNvPicPr/>
                   </pic:nvPicPr>
                   <pic:blipFill>
-                    <a:blip xmlns:r="http://schemas.openxmlformats.org/officeDocument/2006/relationships" r:embed="R8318ddba42754385"/>
+                    <a:blip xmlns:r="http://schemas.openxmlformats.org/officeDocument/2006/relationships" r:embed="R210b66e0d9024147"/>
                     <a:stretch>
                       <a:fillRect/>
                     </a:stretch>
@@ -2354,7 +2354,7 @@
                     <pic:cNvPicPr/>
                   </pic:nvPicPr>
                   <pic:blipFill>
-                    <a:blip xmlns:r="http://schemas.openxmlformats.org/officeDocument/2006/relationships" r:embed="Rf38fff5488944309"/>
+                    <a:blip xmlns:r="http://schemas.openxmlformats.org/officeDocument/2006/relationships" r:embed="R8969f4965712427e"/>
                     <a:stretch>
                       <a:fillRect/>
                     </a:stretch>
@@ -2430,7 +2430,7 @@
                     <pic:cNvPicPr/>
                   </pic:nvPicPr>
                   <pic:blipFill>
-                    <a:blip xmlns:r="http://schemas.openxmlformats.org/officeDocument/2006/relationships" r:embed="R025c3af22e9c411b"/>
+                    <a:blip xmlns:r="http://schemas.openxmlformats.org/officeDocument/2006/relationships" r:embed="R8ceaf45e76e64ea6"/>
                     <a:stretch>
                       <a:fillRect/>
                     </a:stretch>
@@ -2481,7 +2481,7 @@
                     <pic:cNvPicPr/>
                   </pic:nvPicPr>
                   <pic:blipFill>
-                    <a:blip xmlns:r="http://schemas.openxmlformats.org/officeDocument/2006/relationships" r:embed="Rfd0ee7ded30f45c7"/>
+                    <a:blip xmlns:r="http://schemas.openxmlformats.org/officeDocument/2006/relationships" r:embed="R2d1d9f0ad8f841ed"/>
                     <a:stretch>
                       <a:fillRect/>
                     </a:stretch>
@@ -2532,7 +2532,7 @@
                     <pic:cNvPicPr/>
                   </pic:nvPicPr>
                   <pic:blipFill>
-                    <a:blip xmlns:r="http://schemas.openxmlformats.org/officeDocument/2006/relationships" r:embed="Re8223bd245ec45ed"/>
+                    <a:blip xmlns:r="http://schemas.openxmlformats.org/officeDocument/2006/relationships" r:embed="Rfdfd2ffdaa844de4"/>
                     <a:stretch>
                       <a:fillRect/>
                     </a:stretch>
@@ -2583,7 +2583,7 @@
                     <pic:cNvPicPr/>
                   </pic:nvPicPr>
                   <pic:blipFill>
-                    <a:blip xmlns:r="http://schemas.openxmlformats.org/officeDocument/2006/relationships" r:embed="R14d417fd48a449b2"/>
+                    <a:blip xmlns:r="http://schemas.openxmlformats.org/officeDocument/2006/relationships" r:embed="R7bc0931f772e40fd"/>
                     <a:stretch>
                       <a:fillRect/>
                     </a:stretch>
@@ -2659,7 +2659,7 @@
                     <pic:cNvPicPr/>
                   </pic:nvPicPr>
                   <pic:blipFill>
-                    <a:blip xmlns:r="http://schemas.openxmlformats.org/officeDocument/2006/relationships" r:embed="R678234a390da4737"/>
+                    <a:blip xmlns:r="http://schemas.openxmlformats.org/officeDocument/2006/relationships" r:embed="Rc6523464df8e4031"/>
                     <a:stretch>
                       <a:fillRect/>
                     </a:stretch>
@@ -2710,7 +2710,7 @@
                     <pic:cNvPicPr/>
                   </pic:nvPicPr>
                   <pic:blipFill>
-                    <a:blip xmlns:r="http://schemas.openxmlformats.org/officeDocument/2006/relationships" r:embed="R1788cc59518745a3"/>
+                    <a:blip xmlns:r="http://schemas.openxmlformats.org/officeDocument/2006/relationships" r:embed="R66cf5bf29e31459c"/>
                     <a:stretch>
                       <a:fillRect/>
                     </a:stretch>
@@ -2761,7 +2761,7 @@
                     <pic:cNvPicPr/>
                   </pic:nvPicPr>
                   <pic:blipFill>
-                    <a:blip xmlns:r="http://schemas.openxmlformats.org/officeDocument/2006/relationships" r:embed="Rb1313457f92b4419"/>
+                    <a:blip xmlns:r="http://schemas.openxmlformats.org/officeDocument/2006/relationships" r:embed="Rd5f55da6ae684bcf"/>
                     <a:stretch>
                       <a:fillRect/>
                     </a:stretch>
@@ -2812,7 +2812,7 @@
                     <pic:cNvPicPr/>
                   </pic:nvPicPr>
                   <pic:blipFill>
-                    <a:blip xmlns:r="http://schemas.openxmlformats.org/officeDocument/2006/relationships" r:embed="Ra2c152030fe14c3c"/>
+                    <a:blip xmlns:r="http://schemas.openxmlformats.org/officeDocument/2006/relationships" r:embed="R8183bc9088764b4d"/>
                     <a:stretch>
                       <a:fillRect/>
                     </a:stretch>
@@ -2863,7 +2863,7 @@
                     <pic:cNvPicPr/>
                   </pic:nvPicPr>
                   <pic:blipFill>
-                    <a:blip xmlns:r="http://schemas.openxmlformats.org/officeDocument/2006/relationships" r:embed="Rea652ab54f1d4c8e"/>
+                    <a:blip xmlns:r="http://schemas.openxmlformats.org/officeDocument/2006/relationships" r:embed="Rf98bcdc8e9364cce"/>
                     <a:stretch>
                       <a:fillRect/>
                     </a:stretch>
@@ -2914,7 +2914,7 @@
                     <pic:cNvPicPr/>
                   </pic:nvPicPr>
                   <pic:blipFill>
-                    <a:blip xmlns:r="http://schemas.openxmlformats.org/officeDocument/2006/relationships" r:embed="R3913a6e24b9646a5"/>
+                    <a:blip xmlns:r="http://schemas.openxmlformats.org/officeDocument/2006/relationships" r:embed="Rb53fd1ee1c9a47de"/>
                     <a:stretch>
                       <a:fillRect/>
                     </a:stretch>
@@ -2965,7 +2965,7 @@
                     <pic:cNvPicPr/>
                   </pic:nvPicPr>
                   <pic:blipFill>
-                    <a:blip xmlns:r="http://schemas.openxmlformats.org/officeDocument/2006/relationships" r:embed="R7d15ca36581c4e80"/>
+                    <a:blip xmlns:r="http://schemas.openxmlformats.org/officeDocument/2006/relationships" r:embed="R51f5c82a44eb447d"/>
                     <a:stretch>
                       <a:fillRect/>
                     </a:stretch>
@@ -3016,7 +3016,7 @@
                     <pic:cNvPicPr/>
                   </pic:nvPicPr>
                   <pic:blipFill>
-                    <a:blip xmlns:r="http://schemas.openxmlformats.org/officeDocument/2006/relationships" r:embed="R2409150c0467446e"/>
+                    <a:blip xmlns:r="http://schemas.openxmlformats.org/officeDocument/2006/relationships" r:embed="Rdcb501810a924975"/>
                     <a:stretch>
                       <a:fillRect/>
                     </a:stretch>
@@ -3067,7 +3067,7 @@
                     <pic:cNvPicPr/>
                   </pic:nvPicPr>
                   <pic:blipFill>
-                    <a:blip xmlns:r="http://schemas.openxmlformats.org/officeDocument/2006/relationships" r:embed="Rfa02de1d7f7b4803"/>
+                    <a:blip xmlns:r="http://schemas.openxmlformats.org/officeDocument/2006/relationships" r:embed="R1a12abc50de1432d"/>
                     <a:stretch>
                       <a:fillRect/>
                     </a:stretch>
@@ -3118,7 +3118,7 @@
                     <pic:cNvPicPr/>
                   </pic:nvPicPr>
                   <pic:blipFill>
-                    <a:blip xmlns:r="http://schemas.openxmlformats.org/officeDocument/2006/relationships" r:embed="R50590207b8b947c8"/>
+                    <a:blip xmlns:r="http://schemas.openxmlformats.org/officeDocument/2006/relationships" r:embed="R93586c978dba4501"/>
                     <a:stretch>
                       <a:fillRect/>
                     </a:stretch>
@@ -3354,7 +3354,7 @@
                     <pic:cNvPicPr/>
                   </pic:nvPicPr>
                   <pic:blipFill>
-                    <a:blip xmlns:r="http://schemas.openxmlformats.org/officeDocument/2006/relationships" r:embed="R1bdc80ad12324b9f"/>
+                    <a:blip xmlns:r="http://schemas.openxmlformats.org/officeDocument/2006/relationships" r:embed="R860c6c162b934128"/>
                     <a:stretch>
                       <a:fillRect/>
                     </a:stretch>
@@ -3405,7 +3405,7 @@
                     <pic:cNvPicPr/>
                   </pic:nvPicPr>
                   <pic:blipFill>
-                    <a:blip xmlns:r="http://schemas.openxmlformats.org/officeDocument/2006/relationships" r:embed="Rcba9ade3143d4b78"/>
+                    <a:blip xmlns:r="http://schemas.openxmlformats.org/officeDocument/2006/relationships" r:embed="R018f2602356c44f7"/>
                     <a:stretch>
                       <a:fillRect/>
                     </a:stretch>
@@ -3456,7 +3456,7 @@
                     <pic:cNvPicPr/>
                   </pic:nvPicPr>
                   <pic:blipFill>
-                    <a:blip xmlns:r="http://schemas.openxmlformats.org/officeDocument/2006/relationships" r:embed="R7b46060f0d6b44cb"/>
+                    <a:blip xmlns:r="http://schemas.openxmlformats.org/officeDocument/2006/relationships" r:embed="R0b100d1cb0954f0e"/>
                     <a:stretch>
                       <a:fillRect/>
                     </a:stretch>
@@ -3507,7 +3507,7 @@
                     <pic:cNvPicPr/>
                   </pic:nvPicPr>
                   <pic:blipFill>
-                    <a:blip xmlns:r="http://schemas.openxmlformats.org/officeDocument/2006/relationships" r:embed="Rd652f8b72ef74b1d"/>
+                    <a:blip xmlns:r="http://schemas.openxmlformats.org/officeDocument/2006/relationships" r:embed="Rfc8448c169e84082"/>
                     <a:stretch>
                       <a:fillRect/>
                     </a:stretch>
@@ -3558,7 +3558,7 @@
                     <pic:cNvPicPr/>
                   </pic:nvPicPr>
                   <pic:blipFill>
-                    <a:blip xmlns:r="http://schemas.openxmlformats.org/officeDocument/2006/relationships" r:embed="R34c9192a366a41af"/>
+                    <a:blip xmlns:r="http://schemas.openxmlformats.org/officeDocument/2006/relationships" r:embed="Ra805efc3d8b24d47"/>
                     <a:stretch>
                       <a:fillRect/>
                     </a:stretch>
@@ -3609,7 +3609,7 @@
                     <pic:cNvPicPr/>
                   </pic:nvPicPr>
                   <pic:blipFill>
-                    <a:blip xmlns:r="http://schemas.openxmlformats.org/officeDocument/2006/relationships" r:embed="Ra041a8f8820340c6"/>
+                    <a:blip xmlns:r="http://schemas.openxmlformats.org/officeDocument/2006/relationships" r:embed="Rd6c78960b242483e"/>
                     <a:stretch>
                       <a:fillRect/>
                     </a:stretch>
@@ -3660,7 +3660,7 @@
                     <pic:cNvPicPr/>
                   </pic:nvPicPr>
                   <pic:blipFill>
-                    <a:blip xmlns:r="http://schemas.openxmlformats.org/officeDocument/2006/relationships" r:embed="R7360fee6bb9f4c8b"/>
+                    <a:blip xmlns:r="http://schemas.openxmlformats.org/officeDocument/2006/relationships" r:embed="Rcb48031a42b94452"/>
                     <a:stretch>
                       <a:fillRect/>
                     </a:stretch>
@@ -3711,7 +3711,7 @@
                     <pic:cNvPicPr/>
                   </pic:nvPicPr>
                   <pic:blipFill>
-                    <a:blip xmlns:r="http://schemas.openxmlformats.org/officeDocument/2006/relationships" r:embed="Rb45213d0a567414a"/>
+                    <a:blip xmlns:r="http://schemas.openxmlformats.org/officeDocument/2006/relationships" r:embed="Rc26ad0aa452941bb"/>
                     <a:stretch>
                       <a:fillRect/>
                     </a:stretch>
@@ -3762,7 +3762,7 @@
                     <pic:cNvPicPr/>
                   </pic:nvPicPr>
                   <pic:blipFill>
-                    <a:blip xmlns:r="http://schemas.openxmlformats.org/officeDocument/2006/relationships" r:embed="Rf579331f3a574eab"/>
+                    <a:blip xmlns:r="http://schemas.openxmlformats.org/officeDocument/2006/relationships" r:embed="R0411be0620854fde"/>
                     <a:stretch>
                       <a:fillRect/>
                     </a:stretch>
@@ -3859,7 +3859,7 @@
                     <pic:cNvPicPr/>
                   </pic:nvPicPr>
                   <pic:blipFill>
-                    <a:blip xmlns:r="http://schemas.openxmlformats.org/officeDocument/2006/relationships" r:embed="R1e9a81b2ab4547f3"/>
+                    <a:blip xmlns:r="http://schemas.openxmlformats.org/officeDocument/2006/relationships" r:embed="R3f696c6a069b4035"/>
                     <a:stretch>
                       <a:fillRect/>
                     </a:stretch>
@@ -3902,7 +3902,7 @@
                     <pic:cNvPicPr/>
                   </pic:nvPicPr>
                   <pic:blipFill>
-                    <a:blip xmlns:r="http://schemas.openxmlformats.org/officeDocument/2006/relationships" r:embed="R05aae72c71f54842"/>
+                    <a:blip xmlns:r="http://schemas.openxmlformats.org/officeDocument/2006/relationships" r:embed="Rea40ca9d1954400b"/>
                     <a:stretch>
                       <a:fillRect/>
                     </a:stretch>
@@ -3945,7 +3945,7 @@
                     <pic:cNvPicPr/>
                   </pic:nvPicPr>
                   <pic:blipFill>
-                    <a:blip xmlns:r="http://schemas.openxmlformats.org/officeDocument/2006/relationships" r:embed="R4e163a09428b411f"/>
+                    <a:blip xmlns:r="http://schemas.openxmlformats.org/officeDocument/2006/relationships" r:embed="R5e5cfbb53f1a4f2b"/>
                     <a:stretch>
                       <a:fillRect/>
                     </a:stretch>
@@ -3988,7 +3988,7 @@
                     <pic:cNvPicPr/>
                   </pic:nvPicPr>
                   <pic:blipFill>
-                    <a:blip xmlns:r="http://schemas.openxmlformats.org/officeDocument/2006/relationships" r:embed="Rd9897a79d3ec4a45"/>
+                    <a:blip xmlns:r="http://schemas.openxmlformats.org/officeDocument/2006/relationships" r:embed="R2b3538a48a074c2b"/>
                     <a:stretch>
                       <a:fillRect/>
                     </a:stretch>
@@ -4083,7 +4083,7 @@
                     <pic:cNvPicPr/>
                   </pic:nvPicPr>
                   <pic:blipFill>
-                    <a:blip xmlns:r="http://schemas.openxmlformats.org/officeDocument/2006/relationships" r:embed="Re04f85810f554c8d"/>
+                    <a:blip xmlns:r="http://schemas.openxmlformats.org/officeDocument/2006/relationships" r:embed="R8c6fea68d1944a36"/>
                     <a:stretch>
                       <a:fillRect/>
                     </a:stretch>
@@ -4336,7 +4336,7 @@
                     <pic:cNvPicPr/>
                   </pic:nvPicPr>
                   <pic:blipFill>
-                    <a:blip xmlns:r="http://schemas.openxmlformats.org/officeDocument/2006/relationships" r:embed="R517a9adb7e78498b"/>
+                    <a:blip xmlns:r="http://schemas.openxmlformats.org/officeDocument/2006/relationships" r:embed="R10710a35fc5f4e00"/>
                     <a:stretch>
                       <a:fillRect/>
                     </a:stretch>
@@ -4528,7 +4528,7 @@
                     <pic:cNvPicPr/>
                   </pic:nvPicPr>
                   <pic:blipFill>
-                    <a:blip xmlns:r="http://schemas.openxmlformats.org/officeDocument/2006/relationships" r:embed="R8b0c52bc558248fa"/>
+                    <a:blip xmlns:r="http://schemas.openxmlformats.org/officeDocument/2006/relationships" r:embed="R12b0e8d9524b451d"/>
                     <a:stretch>
                       <a:fillRect/>
                     </a:stretch>
@@ -4579,7 +4579,7 @@
                     <pic:cNvPicPr/>
                   </pic:nvPicPr>
                   <pic:blipFill>
-                    <a:blip xmlns:r="http://schemas.openxmlformats.org/officeDocument/2006/relationships" r:embed="Rc6a9122eef164ad6"/>
+                    <a:blip xmlns:r="http://schemas.openxmlformats.org/officeDocument/2006/relationships" r:embed="R051c4dabe30a442f"/>
                     <a:stretch>
                       <a:fillRect/>
                     </a:stretch>
@@ -4630,7 +4630,7 @@
                     <pic:cNvPicPr/>
                   </pic:nvPicPr>
                   <pic:blipFill>
-                    <a:blip xmlns:r="http://schemas.openxmlformats.org/officeDocument/2006/relationships" r:embed="Rc31a586c55bd4b5c"/>
+                    <a:blip xmlns:r="http://schemas.openxmlformats.org/officeDocument/2006/relationships" r:embed="Rfc95d88ff7d34b1f"/>
                     <a:stretch>
                       <a:fillRect/>
                     </a:stretch>
@@ -4681,7 +4681,7 @@
                     <pic:cNvPicPr/>
                   </pic:nvPicPr>
                   <pic:blipFill>
-                    <a:blip xmlns:r="http://schemas.openxmlformats.org/officeDocument/2006/relationships" r:embed="Rc28c60c29c454343"/>
+                    <a:blip xmlns:r="http://schemas.openxmlformats.org/officeDocument/2006/relationships" r:embed="Rd1d8db58d0744f37"/>
                     <a:stretch>
                       <a:fillRect/>
                     </a:stretch>
@@ -5060,7 +5060,7 @@
                     <pic:cNvPicPr/>
                   </pic:nvPicPr>
                   <pic:blipFill>
-                    <a:blip xmlns:r="http://schemas.openxmlformats.org/officeDocument/2006/relationships" r:embed="R7634dbb99ef24992"/>
+                    <a:blip xmlns:r="http://schemas.openxmlformats.org/officeDocument/2006/relationships" r:embed="Rd65938af51d04281"/>
                     <a:stretch>
                       <a:fillRect/>
                     </a:stretch>
@@ -5741,7 +5741,7 @@
             <w:r>
               <w:t xml:space="preserve">Cell with </w:t>
             </w:r>
-            <w:hyperlink xmlns:r="http://schemas.openxmlformats.org/officeDocument/2006/relationships" w:history="true" r:id="Rd578f037bf68464e">
+            <w:hyperlink xmlns:r="http://schemas.openxmlformats.org/officeDocument/2006/relationships" w:history="true" r:id="R9e21883a4bcc47aa">
               <w:r>
                 <w:rPr>
                   <w:rStyle w:val="Hyperlink"/>
@@ -6027,7 +6027,7 @@
                           <pic:cNvPicPr/>
                         </pic:nvPicPr>
                         <pic:blipFill>
-                          <a:blip xmlns:r="http://schemas.openxmlformats.org/officeDocument/2006/relationships" r:embed="Re1611f87ff5c46e0"/>
+                          <a:blip xmlns:r="http://schemas.openxmlformats.org/officeDocument/2006/relationships" r:embed="Raab8c673bc484548"/>
                           <a:stretch>
                             <a:fillRect/>
                           </a:stretch>
@@ -6127,7 +6127,7 @@
                     <pic:cNvPicPr/>
                   </pic:nvPicPr>
                   <pic:blipFill>
-                    <a:blip xmlns:r="http://schemas.openxmlformats.org/officeDocument/2006/relationships" r:embed="R332a69b3f6804d62"/>
+                    <a:blip xmlns:r="http://schemas.openxmlformats.org/officeDocument/2006/relationships" r:embed="R429ee5949b184b31"/>
                     <a:stretch>
                       <a:fillRect/>
                     </a:stretch>
@@ -6177,7 +6177,7 @@
                     <pic:cNvPicPr/>
                   </pic:nvPicPr>
                   <pic:blipFill>
-                    <a:blip xmlns:r="http://schemas.openxmlformats.org/officeDocument/2006/relationships" r:embed="R2122132e6b6c44e5"/>
+                    <a:blip xmlns:r="http://schemas.openxmlformats.org/officeDocument/2006/relationships" r:embed="Rc245d0ff5cbd401f"/>
                     <a:stretch>
                       <a:fillRect/>
                     </a:stretch>
@@ -6227,7 +6227,7 @@
                     <pic:cNvPicPr/>
                   </pic:nvPicPr>
                   <pic:blipFill>
-                    <a:blip xmlns:r="http://schemas.openxmlformats.org/officeDocument/2006/relationships" r:embed="Re9c4f3f890bf4b0e"/>
+                    <a:blip xmlns:r="http://schemas.openxmlformats.org/officeDocument/2006/relationships" r:embed="R0a1faf692ecb4b21"/>
                     <a:stretch>
                       <a:fillRect/>
                     </a:stretch>

</xml_diff>

<commit_message>
fix(flowchart): 3-slot fan-out ports for vertical TD/BT
For vertical flowcharts, distribute parallel edges using (2N-1) slots on the facing edge and use slot centres 1,3,5... (e.g. 2 edges use 1st and 3rd).

Made-with: Cursor
</commit_message>
<xml_diff>
--- a/test.docx
+++ b/test.docx
@@ -236,7 +236,7 @@
       <w:r>
         <w:t xml:space="preserve">, and </w:t>
       </w:r>
-      <w:hyperlink xmlns:r="http://schemas.openxmlformats.org/officeDocument/2006/relationships" w:history="true" r:id="Rda1dd3861df44c92">
+      <w:hyperlink xmlns:r="http://schemas.openxmlformats.org/officeDocument/2006/relationships" w:history="true" r:id="R996d5a98e89a4a74">
         <w:r>
           <w:rPr>
             <w:rStyle w:val="Hyperlink"/>
@@ -475,7 +475,7 @@
       <w:r>
         <w:t xml:space="preserve">Direct link: </w:t>
       </w:r>
-      <w:hyperlink xmlns:r="http://schemas.openxmlformats.org/officeDocument/2006/relationships" w:history="true" r:id="Rbbc19ee38a674093">
+      <w:hyperlink xmlns:r="http://schemas.openxmlformats.org/officeDocument/2006/relationships" w:history="true" r:id="R56227a84a9684882">
         <w:r>
           <w:rPr>
             <w:rStyle w:val="Hyperlink"/>
@@ -496,7 +496,7 @@
       <w:r>
         <w:t xml:space="preserve">Direct link with title: </w:t>
       </w:r>
-      <w:hyperlink xmlns:r="http://schemas.openxmlformats.org/officeDocument/2006/relationships" w:history="true" r:id="Rdb9b8e9787634a88">
+      <w:hyperlink xmlns:r="http://schemas.openxmlformats.org/officeDocument/2006/relationships" w:history="true" r:id="Rba4ed4840b92454a">
         <w:r>
           <w:rPr>
             <w:rStyle w:val="Hyperlink"/>
@@ -517,7 +517,7 @@
       <w:r>
         <w:t xml:space="preserve">Reference-style link: </w:t>
       </w:r>
-      <w:hyperlink xmlns:r="http://schemas.openxmlformats.org/officeDocument/2006/relationships" w:history="true" r:id="R03ca7b12b6f3486d">
+      <w:hyperlink xmlns:r="http://schemas.openxmlformats.org/officeDocument/2006/relationships" w:history="true" r:id="R499b889d20bc4fb0">
         <w:r>
           <w:rPr>
             <w:rStyle w:val="Hyperlink"/>
@@ -538,7 +538,7 @@
       <w:r>
         <w:t xml:space="preserve">Collapsed reference link: </w:t>
       </w:r>
-      <w:hyperlink xmlns:r="http://schemas.openxmlformats.org/officeDocument/2006/relationships" w:history="true" r:id="R6536488888f84c0e">
+      <w:hyperlink xmlns:r="http://schemas.openxmlformats.org/officeDocument/2006/relationships" w:history="true" r:id="Ra2fa12b1edc941ab">
         <w:r>
           <w:rPr>
             <w:rStyle w:val="Hyperlink"/>
@@ -559,7 +559,7 @@
       <w:r>
         <w:t xml:space="preserve">Repeated reference link: </w:t>
       </w:r>
-      <w:hyperlink xmlns:r="http://schemas.openxmlformats.org/officeDocument/2006/relationships" w:history="true" r:id="Rf60d67507e6945b7">
+      <w:hyperlink xmlns:r="http://schemas.openxmlformats.org/officeDocument/2006/relationships" w:history="true" r:id="R001da81c850742b4">
         <w:r>
           <w:rPr>
             <w:rStyle w:val="Hyperlink"/>
@@ -580,7 +580,7 @@
       <w:r>
         <w:t xml:space="preserve">Autolink URL: </w:t>
       </w:r>
-      <w:hyperlink xmlns:r="http://schemas.openxmlformats.org/officeDocument/2006/relationships" w:history="true" r:id="R23dcc9e7eadd487c">
+      <w:hyperlink xmlns:r="http://schemas.openxmlformats.org/officeDocument/2006/relationships" w:history="true" r:id="Rf9ea80fe8e294c07">
         <w:r>
           <w:rPr>
             <w:rStyle w:val="Hyperlink"/>
@@ -601,7 +601,7 @@
       <w:r>
         <w:t xml:space="preserve">Autolink email: </w:t>
       </w:r>
-      <w:hyperlink xmlns:r="http://schemas.openxmlformats.org/officeDocument/2006/relationships" w:history="true" r:id="Recb93cd4992648f9">
+      <w:hyperlink xmlns:r="http://schemas.openxmlformats.org/officeDocument/2006/relationships" w:history="true" r:id="R3462dcb65e3e467f">
         <w:r>
           <w:rPr>
             <w:rStyle w:val="Hyperlink"/>
@@ -700,7 +700,7 @@
       <w:r>
         <w:t xml:space="preserve">, and </w:t>
       </w:r>
-      <w:hyperlink xmlns:r="http://schemas.openxmlformats.org/officeDocument/2006/relationships" w:history="true" r:id="R0416de8afbb44ef7">
+      <w:hyperlink xmlns:r="http://schemas.openxmlformats.org/officeDocument/2006/relationships" w:history="true" r:id="R0b4a36e1f42c4ce2">
         <w:r>
           <w:rPr>
             <w:rStyle w:val="Hyperlink"/>
@@ -1093,7 +1093,7 @@
       <w:r>
         <w:t xml:space="preserve">Continuation paragraph with </w:t>
       </w:r>
-      <w:hyperlink xmlns:r="http://schemas.openxmlformats.org/officeDocument/2006/relationships" w:history="true" r:id="R0e20475a616342b9">
+      <w:hyperlink xmlns:r="http://schemas.openxmlformats.org/officeDocument/2006/relationships" w:history="true" r:id="R0ee0f7b5746240e1">
         <w:r>
           <w:rPr>
             <w:rStyle w:val="Hyperlink"/>
@@ -1591,7 +1591,7 @@
       <w:r>
         <w:t xml:space="preserve">, and </w:t>
       </w:r>
-      <w:hyperlink xmlns:r="http://schemas.openxmlformats.org/officeDocument/2006/relationships" w:history="true" r:id="R16350560c8004ff2">
+      <w:hyperlink xmlns:r="http://schemas.openxmlformats.org/officeDocument/2006/relationships" w:history="true" r:id="R793f0b9e485f4e2d">
         <w:r>
           <w:rPr>
             <w:rStyle w:val="Hyperlink"/>
@@ -1979,7 +1979,7 @@
                     <pic:cNvPicPr/>
                   </pic:nvPicPr>
                   <pic:blipFill>
-                    <a:blip xmlns:r="http://schemas.openxmlformats.org/officeDocument/2006/relationships" r:embed="R2d0f6cb3915a47bb"/>
+                    <a:blip xmlns:r="http://schemas.openxmlformats.org/officeDocument/2006/relationships" r:embed="Reebe17fbf3a34e75"/>
                     <a:stretch>
                       <a:fillRect/>
                     </a:stretch>
@@ -2039,7 +2039,7 @@
                     <pic:cNvPicPr/>
                   </pic:nvPicPr>
                   <pic:blipFill>
-                    <a:blip xmlns:r="http://schemas.openxmlformats.org/officeDocument/2006/relationships" r:embed="Red9f2c98033d4995"/>
+                    <a:blip xmlns:r="http://schemas.openxmlformats.org/officeDocument/2006/relationships" r:embed="R011a432d0a914cb6"/>
                     <a:stretch>
                       <a:fillRect/>
                     </a:stretch>
@@ -2099,7 +2099,7 @@
                     <pic:cNvPicPr/>
                   </pic:nvPicPr>
                   <pic:blipFill>
-                    <a:blip xmlns:r="http://schemas.openxmlformats.org/officeDocument/2006/relationships" r:embed="R2412493b14a24143"/>
+                    <a:blip xmlns:r="http://schemas.openxmlformats.org/officeDocument/2006/relationships" r:embed="R903b6128a7a3428d"/>
                     <a:stretch>
                       <a:fillRect/>
                     </a:stretch>
@@ -2150,7 +2150,7 @@
                     <pic:cNvPicPr/>
                   </pic:nvPicPr>
                   <pic:blipFill>
-                    <a:blip xmlns:r="http://schemas.openxmlformats.org/officeDocument/2006/relationships" r:embed="R6dc7f78b841e441e"/>
+                    <a:blip xmlns:r="http://schemas.openxmlformats.org/officeDocument/2006/relationships" r:embed="Rf6abe47e62bb4547"/>
                     <a:stretch>
                       <a:fillRect/>
                     </a:stretch>
@@ -2201,7 +2201,7 @@
                     <pic:cNvPicPr/>
                   </pic:nvPicPr>
                   <pic:blipFill>
-                    <a:blip xmlns:r="http://schemas.openxmlformats.org/officeDocument/2006/relationships" r:embed="R37c4064909074b0b"/>
+                    <a:blip xmlns:r="http://schemas.openxmlformats.org/officeDocument/2006/relationships" r:embed="Rb71d96d341124951"/>
                     <a:stretch>
                       <a:fillRect/>
                     </a:stretch>
@@ -2252,7 +2252,7 @@
                     <pic:cNvPicPr/>
                   </pic:nvPicPr>
                   <pic:blipFill>
-                    <a:blip xmlns:r="http://schemas.openxmlformats.org/officeDocument/2006/relationships" r:embed="R8367dc65a6644459"/>
+                    <a:blip xmlns:r="http://schemas.openxmlformats.org/officeDocument/2006/relationships" r:embed="Rbfd0981403134446"/>
                     <a:stretch>
                       <a:fillRect/>
                     </a:stretch>
@@ -2303,7 +2303,7 @@
                     <pic:cNvPicPr/>
                   </pic:nvPicPr>
                   <pic:blipFill>
-                    <a:blip xmlns:r="http://schemas.openxmlformats.org/officeDocument/2006/relationships" r:embed="R210b66e0d9024147"/>
+                    <a:blip xmlns:r="http://schemas.openxmlformats.org/officeDocument/2006/relationships" r:embed="R7d2387b249aa4c90"/>
                     <a:stretch>
                       <a:fillRect/>
                     </a:stretch>
@@ -2354,7 +2354,7 @@
                     <pic:cNvPicPr/>
                   </pic:nvPicPr>
                   <pic:blipFill>
-                    <a:blip xmlns:r="http://schemas.openxmlformats.org/officeDocument/2006/relationships" r:embed="R8969f4965712427e"/>
+                    <a:blip xmlns:r="http://schemas.openxmlformats.org/officeDocument/2006/relationships" r:embed="R7e29ca0a18024fc4"/>
                     <a:stretch>
                       <a:fillRect/>
                     </a:stretch>
@@ -2430,7 +2430,7 @@
                     <pic:cNvPicPr/>
                   </pic:nvPicPr>
                   <pic:blipFill>
-                    <a:blip xmlns:r="http://schemas.openxmlformats.org/officeDocument/2006/relationships" r:embed="R8ceaf45e76e64ea6"/>
+                    <a:blip xmlns:r="http://schemas.openxmlformats.org/officeDocument/2006/relationships" r:embed="R693ffee3bc584d0b"/>
                     <a:stretch>
                       <a:fillRect/>
                     </a:stretch>
@@ -2481,7 +2481,7 @@
                     <pic:cNvPicPr/>
                   </pic:nvPicPr>
                   <pic:blipFill>
-                    <a:blip xmlns:r="http://schemas.openxmlformats.org/officeDocument/2006/relationships" r:embed="R2d1d9f0ad8f841ed"/>
+                    <a:blip xmlns:r="http://schemas.openxmlformats.org/officeDocument/2006/relationships" r:embed="Rdd4c4fd2a79b4f44"/>
                     <a:stretch>
                       <a:fillRect/>
                     </a:stretch>
@@ -2532,7 +2532,7 @@
                     <pic:cNvPicPr/>
                   </pic:nvPicPr>
                   <pic:blipFill>
-                    <a:blip xmlns:r="http://schemas.openxmlformats.org/officeDocument/2006/relationships" r:embed="Rfdfd2ffdaa844de4"/>
+                    <a:blip xmlns:r="http://schemas.openxmlformats.org/officeDocument/2006/relationships" r:embed="R71df1c49a99c42c9"/>
                     <a:stretch>
                       <a:fillRect/>
                     </a:stretch>
@@ -2583,7 +2583,7 @@
                     <pic:cNvPicPr/>
                   </pic:nvPicPr>
                   <pic:blipFill>
-                    <a:blip xmlns:r="http://schemas.openxmlformats.org/officeDocument/2006/relationships" r:embed="R7bc0931f772e40fd"/>
+                    <a:blip xmlns:r="http://schemas.openxmlformats.org/officeDocument/2006/relationships" r:embed="R2d23ca49974e46ef"/>
                     <a:stretch>
                       <a:fillRect/>
                     </a:stretch>
@@ -2659,7 +2659,7 @@
                     <pic:cNvPicPr/>
                   </pic:nvPicPr>
                   <pic:blipFill>
-                    <a:blip xmlns:r="http://schemas.openxmlformats.org/officeDocument/2006/relationships" r:embed="Rc6523464df8e4031"/>
+                    <a:blip xmlns:r="http://schemas.openxmlformats.org/officeDocument/2006/relationships" r:embed="R82e29956967c4b10"/>
                     <a:stretch>
                       <a:fillRect/>
                     </a:stretch>
@@ -2710,7 +2710,7 @@
                     <pic:cNvPicPr/>
                   </pic:nvPicPr>
                   <pic:blipFill>
-                    <a:blip xmlns:r="http://schemas.openxmlformats.org/officeDocument/2006/relationships" r:embed="R66cf5bf29e31459c"/>
+                    <a:blip xmlns:r="http://schemas.openxmlformats.org/officeDocument/2006/relationships" r:embed="R819b044e49b041a4"/>
                     <a:stretch>
                       <a:fillRect/>
                     </a:stretch>
@@ -2761,7 +2761,7 @@
                     <pic:cNvPicPr/>
                   </pic:nvPicPr>
                   <pic:blipFill>
-                    <a:blip xmlns:r="http://schemas.openxmlformats.org/officeDocument/2006/relationships" r:embed="Rd5f55da6ae684bcf"/>
+                    <a:blip xmlns:r="http://schemas.openxmlformats.org/officeDocument/2006/relationships" r:embed="R660bb78a1c3c4ff3"/>
                     <a:stretch>
                       <a:fillRect/>
                     </a:stretch>
@@ -2812,7 +2812,7 @@
                     <pic:cNvPicPr/>
                   </pic:nvPicPr>
                   <pic:blipFill>
-                    <a:blip xmlns:r="http://schemas.openxmlformats.org/officeDocument/2006/relationships" r:embed="R8183bc9088764b4d"/>
+                    <a:blip xmlns:r="http://schemas.openxmlformats.org/officeDocument/2006/relationships" r:embed="Rb0f218ec20164876"/>
                     <a:stretch>
                       <a:fillRect/>
                     </a:stretch>
@@ -2863,7 +2863,7 @@
                     <pic:cNvPicPr/>
                   </pic:nvPicPr>
                   <pic:blipFill>
-                    <a:blip xmlns:r="http://schemas.openxmlformats.org/officeDocument/2006/relationships" r:embed="Rf98bcdc8e9364cce"/>
+                    <a:blip xmlns:r="http://schemas.openxmlformats.org/officeDocument/2006/relationships" r:embed="Rb9f5eb6f7e2c4166"/>
                     <a:stretch>
                       <a:fillRect/>
                     </a:stretch>
@@ -2914,7 +2914,7 @@
                     <pic:cNvPicPr/>
                   </pic:nvPicPr>
                   <pic:blipFill>
-                    <a:blip xmlns:r="http://schemas.openxmlformats.org/officeDocument/2006/relationships" r:embed="Rb53fd1ee1c9a47de"/>
+                    <a:blip xmlns:r="http://schemas.openxmlformats.org/officeDocument/2006/relationships" r:embed="R74dbb2f3f62d4f2e"/>
                     <a:stretch>
                       <a:fillRect/>
                     </a:stretch>
@@ -2965,7 +2965,7 @@
                     <pic:cNvPicPr/>
                   </pic:nvPicPr>
                   <pic:blipFill>
-                    <a:blip xmlns:r="http://schemas.openxmlformats.org/officeDocument/2006/relationships" r:embed="R51f5c82a44eb447d"/>
+                    <a:blip xmlns:r="http://schemas.openxmlformats.org/officeDocument/2006/relationships" r:embed="R2929a27700664fac"/>
                     <a:stretch>
                       <a:fillRect/>
                     </a:stretch>
@@ -3016,7 +3016,7 @@
                     <pic:cNvPicPr/>
                   </pic:nvPicPr>
                   <pic:blipFill>
-                    <a:blip xmlns:r="http://schemas.openxmlformats.org/officeDocument/2006/relationships" r:embed="Rdcb501810a924975"/>
+                    <a:blip xmlns:r="http://schemas.openxmlformats.org/officeDocument/2006/relationships" r:embed="Rd363b75e0c1840d5"/>
                     <a:stretch>
                       <a:fillRect/>
                     </a:stretch>
@@ -3067,7 +3067,7 @@
                     <pic:cNvPicPr/>
                   </pic:nvPicPr>
                   <pic:blipFill>
-                    <a:blip xmlns:r="http://schemas.openxmlformats.org/officeDocument/2006/relationships" r:embed="R1a12abc50de1432d"/>
+                    <a:blip xmlns:r="http://schemas.openxmlformats.org/officeDocument/2006/relationships" r:embed="R922f4b2279174c45"/>
                     <a:stretch>
                       <a:fillRect/>
                     </a:stretch>
@@ -3118,7 +3118,7 @@
                     <pic:cNvPicPr/>
                   </pic:nvPicPr>
                   <pic:blipFill>
-                    <a:blip xmlns:r="http://schemas.openxmlformats.org/officeDocument/2006/relationships" r:embed="R93586c978dba4501"/>
+                    <a:blip xmlns:r="http://schemas.openxmlformats.org/officeDocument/2006/relationships" r:embed="R0f525540a14a420e"/>
                     <a:stretch>
                       <a:fillRect/>
                     </a:stretch>
@@ -3354,7 +3354,7 @@
                     <pic:cNvPicPr/>
                   </pic:nvPicPr>
                   <pic:blipFill>
-                    <a:blip xmlns:r="http://schemas.openxmlformats.org/officeDocument/2006/relationships" r:embed="R860c6c162b934128"/>
+                    <a:blip xmlns:r="http://schemas.openxmlformats.org/officeDocument/2006/relationships" r:embed="Rfda67b00918248f4"/>
                     <a:stretch>
                       <a:fillRect/>
                     </a:stretch>
@@ -3405,7 +3405,7 @@
                     <pic:cNvPicPr/>
                   </pic:nvPicPr>
                   <pic:blipFill>
-                    <a:blip xmlns:r="http://schemas.openxmlformats.org/officeDocument/2006/relationships" r:embed="R018f2602356c44f7"/>
+                    <a:blip xmlns:r="http://schemas.openxmlformats.org/officeDocument/2006/relationships" r:embed="R2fad1c63c0974a0f"/>
                     <a:stretch>
                       <a:fillRect/>
                     </a:stretch>
@@ -3456,7 +3456,7 @@
                     <pic:cNvPicPr/>
                   </pic:nvPicPr>
                   <pic:blipFill>
-                    <a:blip xmlns:r="http://schemas.openxmlformats.org/officeDocument/2006/relationships" r:embed="R0b100d1cb0954f0e"/>
+                    <a:blip xmlns:r="http://schemas.openxmlformats.org/officeDocument/2006/relationships" r:embed="R7571009036de49dd"/>
                     <a:stretch>
                       <a:fillRect/>
                     </a:stretch>
@@ -3507,7 +3507,7 @@
                     <pic:cNvPicPr/>
                   </pic:nvPicPr>
                   <pic:blipFill>
-                    <a:blip xmlns:r="http://schemas.openxmlformats.org/officeDocument/2006/relationships" r:embed="Rfc8448c169e84082"/>
+                    <a:blip xmlns:r="http://schemas.openxmlformats.org/officeDocument/2006/relationships" r:embed="R2a830e82119e4a99"/>
                     <a:stretch>
                       <a:fillRect/>
                     </a:stretch>
@@ -3558,7 +3558,7 @@
                     <pic:cNvPicPr/>
                   </pic:nvPicPr>
                   <pic:blipFill>
-                    <a:blip xmlns:r="http://schemas.openxmlformats.org/officeDocument/2006/relationships" r:embed="Ra805efc3d8b24d47"/>
+                    <a:blip xmlns:r="http://schemas.openxmlformats.org/officeDocument/2006/relationships" r:embed="Rbb939362edfc4989"/>
                     <a:stretch>
                       <a:fillRect/>
                     </a:stretch>
@@ -3609,7 +3609,7 @@
                     <pic:cNvPicPr/>
                   </pic:nvPicPr>
                   <pic:blipFill>
-                    <a:blip xmlns:r="http://schemas.openxmlformats.org/officeDocument/2006/relationships" r:embed="Rd6c78960b242483e"/>
+                    <a:blip xmlns:r="http://schemas.openxmlformats.org/officeDocument/2006/relationships" r:embed="Ra3fadac75a544a02"/>
                     <a:stretch>
                       <a:fillRect/>
                     </a:stretch>
@@ -3660,7 +3660,7 @@
                     <pic:cNvPicPr/>
                   </pic:nvPicPr>
                   <pic:blipFill>
-                    <a:blip xmlns:r="http://schemas.openxmlformats.org/officeDocument/2006/relationships" r:embed="Rcb48031a42b94452"/>
+                    <a:blip xmlns:r="http://schemas.openxmlformats.org/officeDocument/2006/relationships" r:embed="R6c9464c436c94e85"/>
                     <a:stretch>
                       <a:fillRect/>
                     </a:stretch>
@@ -3711,7 +3711,7 @@
                     <pic:cNvPicPr/>
                   </pic:nvPicPr>
                   <pic:blipFill>
-                    <a:blip xmlns:r="http://schemas.openxmlformats.org/officeDocument/2006/relationships" r:embed="Rc26ad0aa452941bb"/>
+                    <a:blip xmlns:r="http://schemas.openxmlformats.org/officeDocument/2006/relationships" r:embed="R1904b310b7db405b"/>
                     <a:stretch>
                       <a:fillRect/>
                     </a:stretch>
@@ -3762,7 +3762,7 @@
                     <pic:cNvPicPr/>
                   </pic:nvPicPr>
                   <pic:blipFill>
-                    <a:blip xmlns:r="http://schemas.openxmlformats.org/officeDocument/2006/relationships" r:embed="R0411be0620854fde"/>
+                    <a:blip xmlns:r="http://schemas.openxmlformats.org/officeDocument/2006/relationships" r:embed="R1b013c14798944f5"/>
                     <a:stretch>
                       <a:fillRect/>
                     </a:stretch>
@@ -3859,7 +3859,7 @@
                     <pic:cNvPicPr/>
                   </pic:nvPicPr>
                   <pic:blipFill>
-                    <a:blip xmlns:r="http://schemas.openxmlformats.org/officeDocument/2006/relationships" r:embed="R3f696c6a069b4035"/>
+                    <a:blip xmlns:r="http://schemas.openxmlformats.org/officeDocument/2006/relationships" r:embed="Re170ac8027b5428f"/>
                     <a:stretch>
                       <a:fillRect/>
                     </a:stretch>
@@ -3902,7 +3902,7 @@
                     <pic:cNvPicPr/>
                   </pic:nvPicPr>
                   <pic:blipFill>
-                    <a:blip xmlns:r="http://schemas.openxmlformats.org/officeDocument/2006/relationships" r:embed="Rea40ca9d1954400b"/>
+                    <a:blip xmlns:r="http://schemas.openxmlformats.org/officeDocument/2006/relationships" r:embed="R161dd7915eae4229"/>
                     <a:stretch>
                       <a:fillRect/>
                     </a:stretch>
@@ -3945,7 +3945,7 @@
                     <pic:cNvPicPr/>
                   </pic:nvPicPr>
                   <pic:blipFill>
-                    <a:blip xmlns:r="http://schemas.openxmlformats.org/officeDocument/2006/relationships" r:embed="R5e5cfbb53f1a4f2b"/>
+                    <a:blip xmlns:r="http://schemas.openxmlformats.org/officeDocument/2006/relationships" r:embed="Re594df034b6d4cd8"/>
                     <a:stretch>
                       <a:fillRect/>
                     </a:stretch>
@@ -3988,7 +3988,7 @@
                     <pic:cNvPicPr/>
                   </pic:nvPicPr>
                   <pic:blipFill>
-                    <a:blip xmlns:r="http://schemas.openxmlformats.org/officeDocument/2006/relationships" r:embed="R2b3538a48a074c2b"/>
+                    <a:blip xmlns:r="http://schemas.openxmlformats.org/officeDocument/2006/relationships" r:embed="R2d4f33480e014417"/>
                     <a:stretch>
                       <a:fillRect/>
                     </a:stretch>
@@ -4083,7 +4083,7 @@
                     <pic:cNvPicPr/>
                   </pic:nvPicPr>
                   <pic:blipFill>
-                    <a:blip xmlns:r="http://schemas.openxmlformats.org/officeDocument/2006/relationships" r:embed="R8c6fea68d1944a36"/>
+                    <a:blip xmlns:r="http://schemas.openxmlformats.org/officeDocument/2006/relationships" r:embed="R769e89f578f943d1"/>
                     <a:stretch>
                       <a:fillRect/>
                     </a:stretch>
@@ -4336,7 +4336,7 @@
                     <pic:cNvPicPr/>
                   </pic:nvPicPr>
                   <pic:blipFill>
-                    <a:blip xmlns:r="http://schemas.openxmlformats.org/officeDocument/2006/relationships" r:embed="R10710a35fc5f4e00"/>
+                    <a:blip xmlns:r="http://schemas.openxmlformats.org/officeDocument/2006/relationships" r:embed="R6a87abb791b54a8f"/>
                     <a:stretch>
                       <a:fillRect/>
                     </a:stretch>
@@ -4528,7 +4528,7 @@
                     <pic:cNvPicPr/>
                   </pic:nvPicPr>
                   <pic:blipFill>
-                    <a:blip xmlns:r="http://schemas.openxmlformats.org/officeDocument/2006/relationships" r:embed="R12b0e8d9524b451d"/>
+                    <a:blip xmlns:r="http://schemas.openxmlformats.org/officeDocument/2006/relationships" r:embed="R77d4f7d84029404c"/>
                     <a:stretch>
                       <a:fillRect/>
                     </a:stretch>
@@ -4579,7 +4579,7 @@
                     <pic:cNvPicPr/>
                   </pic:nvPicPr>
                   <pic:blipFill>
-                    <a:blip xmlns:r="http://schemas.openxmlformats.org/officeDocument/2006/relationships" r:embed="R051c4dabe30a442f"/>
+                    <a:blip xmlns:r="http://schemas.openxmlformats.org/officeDocument/2006/relationships" r:embed="Reb58168e01f64766"/>
                     <a:stretch>
                       <a:fillRect/>
                     </a:stretch>
@@ -4630,7 +4630,7 @@
                     <pic:cNvPicPr/>
                   </pic:nvPicPr>
                   <pic:blipFill>
-                    <a:blip xmlns:r="http://schemas.openxmlformats.org/officeDocument/2006/relationships" r:embed="Rfc95d88ff7d34b1f"/>
+                    <a:blip xmlns:r="http://schemas.openxmlformats.org/officeDocument/2006/relationships" r:embed="Rfc3fe10b8e5d4b88"/>
                     <a:stretch>
                       <a:fillRect/>
                     </a:stretch>
@@ -4681,7 +4681,7 @@
                     <pic:cNvPicPr/>
                   </pic:nvPicPr>
                   <pic:blipFill>
-                    <a:blip xmlns:r="http://schemas.openxmlformats.org/officeDocument/2006/relationships" r:embed="Rd1d8db58d0744f37"/>
+                    <a:blip xmlns:r="http://schemas.openxmlformats.org/officeDocument/2006/relationships" r:embed="R5e0bd16930f74610"/>
                     <a:stretch>
                       <a:fillRect/>
                     </a:stretch>
@@ -5060,7 +5060,7 @@
                     <pic:cNvPicPr/>
                   </pic:nvPicPr>
                   <pic:blipFill>
-                    <a:blip xmlns:r="http://schemas.openxmlformats.org/officeDocument/2006/relationships" r:embed="Rd65938af51d04281"/>
+                    <a:blip xmlns:r="http://schemas.openxmlformats.org/officeDocument/2006/relationships" r:embed="R5818a81f24b24dba"/>
                     <a:stretch>
                       <a:fillRect/>
                     </a:stretch>
@@ -5741,7 +5741,7 @@
             <w:r>
               <w:t xml:space="preserve">Cell with </w:t>
             </w:r>
-            <w:hyperlink xmlns:r="http://schemas.openxmlformats.org/officeDocument/2006/relationships" w:history="true" r:id="R9e21883a4bcc47aa">
+            <w:hyperlink xmlns:r="http://schemas.openxmlformats.org/officeDocument/2006/relationships" w:history="true" r:id="R2a1a81f371bd4a33">
               <w:r>
                 <w:rPr>
                   <w:rStyle w:val="Hyperlink"/>
@@ -6027,7 +6027,7 @@
                           <pic:cNvPicPr/>
                         </pic:nvPicPr>
                         <pic:blipFill>
-                          <a:blip xmlns:r="http://schemas.openxmlformats.org/officeDocument/2006/relationships" r:embed="Raab8c673bc484548"/>
+                          <a:blip xmlns:r="http://schemas.openxmlformats.org/officeDocument/2006/relationships" r:embed="R5bdbbaa13ab34170"/>
                           <a:stretch>
                             <a:fillRect/>
                           </a:stretch>
@@ -6127,7 +6127,7 @@
                     <pic:cNvPicPr/>
                   </pic:nvPicPr>
                   <pic:blipFill>
-                    <a:blip xmlns:r="http://schemas.openxmlformats.org/officeDocument/2006/relationships" r:embed="R429ee5949b184b31"/>
+                    <a:blip xmlns:r="http://schemas.openxmlformats.org/officeDocument/2006/relationships" r:embed="R02f67a35ad4443b4"/>
                     <a:stretch>
                       <a:fillRect/>
                     </a:stretch>
@@ -6177,7 +6177,7 @@
                     <pic:cNvPicPr/>
                   </pic:nvPicPr>
                   <pic:blipFill>
-                    <a:blip xmlns:r="http://schemas.openxmlformats.org/officeDocument/2006/relationships" r:embed="Rc245d0ff5cbd401f"/>
+                    <a:blip xmlns:r="http://schemas.openxmlformats.org/officeDocument/2006/relationships" r:embed="Rbc01700fe6314fde"/>
                     <a:stretch>
                       <a:fillRect/>
                     </a:stretch>
@@ -6227,7 +6227,7 @@
                     <pic:cNvPicPr/>
                   </pic:nvPicPr>
                   <pic:blipFill>
-                    <a:blip xmlns:r="http://schemas.openxmlformats.org/officeDocument/2006/relationships" r:embed="R0a1faf692ecb4b21"/>
+                    <a:blip xmlns:r="http://schemas.openxmlformats.org/officeDocument/2006/relationships" r:embed="Ra1af65c2a017468a"/>
                     <a:stretch>
                       <a:fillRect/>
                     </a:stretch>

</xml_diff>

<commit_message>
Document flowchart sizing rules and improve label-aware layout.
Record TS-traced flowchart node sizing, edge stroke, and edge-label rank-gap rules in Mermaid_Specification.md, and require upstream rules to land in per-diagram spec sections. Centralise edge stroke width/dash in MermaidEdgeStroke, add label-aware min rank span and straighter two-point/subgraph paths, and refresh test.docx.

Co-authored-by: Cursor <cursoragent@cursor.com>
</commit_message>
<xml_diff>
--- a/test.docx
+++ b/test.docx
@@ -236,7 +236,7 @@
       <w:r>
         <w:t xml:space="preserve">, and </w:t>
       </w:r>
-      <w:hyperlink xmlns:r="http://schemas.openxmlformats.org/officeDocument/2006/relationships" w:history="true" r:id="R4a10b45009a2466a">
+      <w:hyperlink xmlns:r="http://schemas.openxmlformats.org/officeDocument/2006/relationships" w:history="true" r:id="R7fe8f9c42b6a4c40">
         <w:r>
           <w:rPr>
             <w:rStyle w:val="Hyperlink"/>
@@ -475,7 +475,7 @@
       <w:r>
         <w:t xml:space="preserve">Direct link: </w:t>
       </w:r>
-      <w:hyperlink xmlns:r="http://schemas.openxmlformats.org/officeDocument/2006/relationships" w:history="true" r:id="R874089e5145b4ab9">
+      <w:hyperlink xmlns:r="http://schemas.openxmlformats.org/officeDocument/2006/relationships" w:history="true" r:id="R5eedc730b002420e">
         <w:r>
           <w:rPr>
             <w:rStyle w:val="Hyperlink"/>
@@ -496,7 +496,7 @@
       <w:r>
         <w:t xml:space="preserve">Direct link with title: </w:t>
       </w:r>
-      <w:hyperlink xmlns:r="http://schemas.openxmlformats.org/officeDocument/2006/relationships" w:history="true" r:id="Rc5c33cb177b0416b">
+      <w:hyperlink xmlns:r="http://schemas.openxmlformats.org/officeDocument/2006/relationships" w:history="true" r:id="Ra9cc000a78524671">
         <w:r>
           <w:rPr>
             <w:rStyle w:val="Hyperlink"/>
@@ -517,7 +517,7 @@
       <w:r>
         <w:t xml:space="preserve">Reference-style link: </w:t>
       </w:r>
-      <w:hyperlink xmlns:r="http://schemas.openxmlformats.org/officeDocument/2006/relationships" w:history="true" r:id="R5907f90ac3fd4591">
+      <w:hyperlink xmlns:r="http://schemas.openxmlformats.org/officeDocument/2006/relationships" w:history="true" r:id="R169b1d58cff7460c">
         <w:r>
           <w:rPr>
             <w:rStyle w:val="Hyperlink"/>
@@ -538,7 +538,7 @@
       <w:r>
         <w:t xml:space="preserve">Collapsed reference link: </w:t>
       </w:r>
-      <w:hyperlink xmlns:r="http://schemas.openxmlformats.org/officeDocument/2006/relationships" w:history="true" r:id="Rc64d603079054d43">
+      <w:hyperlink xmlns:r="http://schemas.openxmlformats.org/officeDocument/2006/relationships" w:history="true" r:id="Rd6324a4480854e1b">
         <w:r>
           <w:rPr>
             <w:rStyle w:val="Hyperlink"/>
@@ -559,7 +559,7 @@
       <w:r>
         <w:t xml:space="preserve">Repeated reference link: </w:t>
       </w:r>
-      <w:hyperlink xmlns:r="http://schemas.openxmlformats.org/officeDocument/2006/relationships" w:history="true" r:id="Re7c50411908e4d40">
+      <w:hyperlink xmlns:r="http://schemas.openxmlformats.org/officeDocument/2006/relationships" w:history="true" r:id="R9230b912faa74d89">
         <w:r>
           <w:rPr>
             <w:rStyle w:val="Hyperlink"/>
@@ -580,7 +580,7 @@
       <w:r>
         <w:t xml:space="preserve">Autolink URL: </w:t>
       </w:r>
-      <w:hyperlink xmlns:r="http://schemas.openxmlformats.org/officeDocument/2006/relationships" w:history="true" r:id="Rc9c7d3817fdf490f">
+      <w:hyperlink xmlns:r="http://schemas.openxmlformats.org/officeDocument/2006/relationships" w:history="true" r:id="R0a7fd3674dd440c4">
         <w:r>
           <w:rPr>
             <w:rStyle w:val="Hyperlink"/>
@@ -601,7 +601,7 @@
       <w:r>
         <w:t xml:space="preserve">Autolink email: </w:t>
       </w:r>
-      <w:hyperlink xmlns:r="http://schemas.openxmlformats.org/officeDocument/2006/relationships" w:history="true" r:id="R1816d2d1c50b4899">
+      <w:hyperlink xmlns:r="http://schemas.openxmlformats.org/officeDocument/2006/relationships" w:history="true" r:id="Rc86110372b9c4f87">
         <w:r>
           <w:rPr>
             <w:rStyle w:val="Hyperlink"/>
@@ -700,7 +700,7 @@
       <w:r>
         <w:t xml:space="preserve">, and </w:t>
       </w:r>
-      <w:hyperlink xmlns:r="http://schemas.openxmlformats.org/officeDocument/2006/relationships" w:history="true" r:id="R869eb05a114547bd">
+      <w:hyperlink xmlns:r="http://schemas.openxmlformats.org/officeDocument/2006/relationships" w:history="true" r:id="R911ab96e11bc440d">
         <w:r>
           <w:rPr>
             <w:rStyle w:val="Hyperlink"/>
@@ -1093,7 +1093,7 @@
       <w:r>
         <w:t xml:space="preserve">Continuation paragraph with </w:t>
       </w:r>
-      <w:hyperlink xmlns:r="http://schemas.openxmlformats.org/officeDocument/2006/relationships" w:history="true" r:id="R71cd22de61c54bdb">
+      <w:hyperlink xmlns:r="http://schemas.openxmlformats.org/officeDocument/2006/relationships" w:history="true" r:id="R05e0b1f9b0894509">
         <w:r>
           <w:rPr>
             <w:rStyle w:val="Hyperlink"/>
@@ -1591,7 +1591,7 @@
       <w:r>
         <w:t xml:space="preserve">, and </w:t>
       </w:r>
-      <w:hyperlink xmlns:r="http://schemas.openxmlformats.org/officeDocument/2006/relationships" w:history="true" r:id="Rb8934b949b6c4483">
+      <w:hyperlink xmlns:r="http://schemas.openxmlformats.org/officeDocument/2006/relationships" w:history="true" r:id="R246e1de230ad4d0c">
         <w:r>
           <w:rPr>
             <w:rStyle w:val="Hyperlink"/>
@@ -1965,7 +1965,7 @@
       <w:r>
         <w:drawing>
           <wp:inline xmlns:wp="http://schemas.openxmlformats.org/drawingml/2006/wordprocessingDrawing" distT="0" distB="0" distL="0" distR="0">
-            <wp:extent cx="4410075" cy="4095750"/>
+            <wp:extent cx="3419475" cy="3257550"/>
             <wp:effectExtent l="0" t="0" r="0" b="0"/>
             <wp:docPr id="1" name="Mermaid diagram 1" descr="Mermaid diagram"/>
             <wp:cNvGraphicFramePr>
@@ -1979,7 +1979,7 @@
                     <pic:cNvPicPr/>
                   </pic:nvPicPr>
                   <pic:blipFill>
-                    <a:blip xmlns:r="http://schemas.openxmlformats.org/officeDocument/2006/relationships" r:embed="Rd14f79cfce274919"/>
+                    <a:blip xmlns:r="http://schemas.openxmlformats.org/officeDocument/2006/relationships" r:embed="R2db12feefbcf4ec0"/>
                     <a:stretch>
                       <a:fillRect/>
                     </a:stretch>
@@ -1987,7 +1987,7 @@
                   <pic:spPr>
                     <a:xfrm>
                       <a:off x="0" y="0"/>
-                      <a:ext cx="4410075" cy="4095750"/>
+                      <a:ext cx="3419475" cy="3257550"/>
                     </a:xfrm>
                     <a:prstGeom prst="rect">
                       <a:avLst/>
@@ -2025,7 +2025,7 @@
       <w:r>
         <w:drawing>
           <wp:inline xmlns:wp="http://schemas.openxmlformats.org/drawingml/2006/wordprocessingDrawing" distT="0" distB="0" distL="0" distR="0">
-            <wp:extent cx="5220000" cy="646482"/>
+            <wp:extent cx="5220000" cy="682105"/>
             <wp:effectExtent l="0" t="0" r="0" b="0"/>
             <wp:docPr id="2" name="Mermaid diagram 2" descr="Mermaid diagram"/>
             <wp:cNvGraphicFramePr>
@@ -2039,7 +2039,7 @@
                     <pic:cNvPicPr/>
                   </pic:nvPicPr>
                   <pic:blipFill>
-                    <a:blip xmlns:r="http://schemas.openxmlformats.org/officeDocument/2006/relationships" r:embed="R139c840794a84469"/>
+                    <a:blip xmlns:r="http://schemas.openxmlformats.org/officeDocument/2006/relationships" r:embed="R72d77a6ea24e4a52"/>
                     <a:stretch>
                       <a:fillRect/>
                     </a:stretch>
@@ -2047,7 +2047,7 @@
                   <pic:spPr>
                     <a:xfrm>
                       <a:off x="0" y="0"/>
-                      <a:ext cx="5220000" cy="646482"/>
+                      <a:ext cx="5220000" cy="682105"/>
                     </a:xfrm>
                     <a:prstGeom prst="rect">
                       <a:avLst/>
@@ -2085,7 +2085,7 @@
       <w:r>
         <w:drawing>
           <wp:inline xmlns:wp="http://schemas.openxmlformats.org/drawingml/2006/wordprocessingDrawing" distT="0" distB="0" distL="0" distR="0">
-            <wp:extent cx="2337143" cy="6480000"/>
+            <wp:extent cx="2215695" cy="6480000"/>
             <wp:effectExtent l="0" t="0" r="0" b="0"/>
             <wp:docPr id="3" name="Mermaid diagram 3" descr="Mermaid diagram"/>
             <wp:cNvGraphicFramePr>
@@ -2099,7 +2099,7 @@
                     <pic:cNvPicPr/>
                   </pic:nvPicPr>
                   <pic:blipFill>
-                    <a:blip xmlns:r="http://schemas.openxmlformats.org/officeDocument/2006/relationships" r:embed="Radd3208b4ca741c4"/>
+                    <a:blip xmlns:r="http://schemas.openxmlformats.org/officeDocument/2006/relationships" r:embed="R361ccf8f48044fd7"/>
                     <a:stretch>
                       <a:fillRect/>
                     </a:stretch>
@@ -2107,7 +2107,7 @@
                   <pic:spPr>
                     <a:xfrm>
                       <a:off x="0" y="0"/>
-                      <a:ext cx="2337143" cy="6480000"/>
+                      <a:ext cx="2215695" cy="6480000"/>
                     </a:xfrm>
                     <a:prstGeom prst="rect">
                       <a:avLst/>
@@ -2150,7 +2150,7 @@
                     <pic:cNvPicPr/>
                   </pic:nvPicPr>
                   <pic:blipFill>
-                    <a:blip xmlns:r="http://schemas.openxmlformats.org/officeDocument/2006/relationships" r:embed="R1b74df6b4abf4c87"/>
+                    <a:blip xmlns:r="http://schemas.openxmlformats.org/officeDocument/2006/relationships" r:embed="R84de9526733247d3"/>
                     <a:stretch>
                       <a:fillRect/>
                     </a:stretch>
@@ -2201,7 +2201,7 @@
                     <pic:cNvPicPr/>
                   </pic:nvPicPr>
                   <pic:blipFill>
-                    <a:blip xmlns:r="http://schemas.openxmlformats.org/officeDocument/2006/relationships" r:embed="R0a4abc2551f94dce"/>
+                    <a:blip xmlns:r="http://schemas.openxmlformats.org/officeDocument/2006/relationships" r:embed="R686411f0ec6d4ff3"/>
                     <a:stretch>
                       <a:fillRect/>
                     </a:stretch>
@@ -2252,7 +2252,7 @@
                     <pic:cNvPicPr/>
                   </pic:nvPicPr>
                   <pic:blipFill>
-                    <a:blip xmlns:r="http://schemas.openxmlformats.org/officeDocument/2006/relationships" r:embed="R0f65378516144f48"/>
+                    <a:blip xmlns:r="http://schemas.openxmlformats.org/officeDocument/2006/relationships" r:embed="R60db6ad05ccd4bd4"/>
                     <a:stretch>
                       <a:fillRect/>
                     </a:stretch>
@@ -2303,7 +2303,7 @@
                     <pic:cNvPicPr/>
                   </pic:nvPicPr>
                   <pic:blipFill>
-                    <a:blip xmlns:r="http://schemas.openxmlformats.org/officeDocument/2006/relationships" r:embed="R2dfd675523f849e9"/>
+                    <a:blip xmlns:r="http://schemas.openxmlformats.org/officeDocument/2006/relationships" r:embed="R669fb7a871a74fd2"/>
                     <a:stretch>
                       <a:fillRect/>
                     </a:stretch>
@@ -2354,7 +2354,7 @@
                     <pic:cNvPicPr/>
                   </pic:nvPicPr>
                   <pic:blipFill>
-                    <a:blip xmlns:r="http://schemas.openxmlformats.org/officeDocument/2006/relationships" r:embed="R108140836ba945f4"/>
+                    <a:blip xmlns:r="http://schemas.openxmlformats.org/officeDocument/2006/relationships" r:embed="Rd49a5fbb01e94001"/>
                     <a:stretch>
                       <a:fillRect/>
                     </a:stretch>
@@ -2430,7 +2430,7 @@
                     <pic:cNvPicPr/>
                   </pic:nvPicPr>
                   <pic:blipFill>
-                    <a:blip xmlns:r="http://schemas.openxmlformats.org/officeDocument/2006/relationships" r:embed="R5eb8df5f93354fcc"/>
+                    <a:blip xmlns:r="http://schemas.openxmlformats.org/officeDocument/2006/relationships" r:embed="R7c0896a56069420c"/>
                     <a:stretch>
                       <a:fillRect/>
                     </a:stretch>
@@ -2481,7 +2481,7 @@
                     <pic:cNvPicPr/>
                   </pic:nvPicPr>
                   <pic:blipFill>
-                    <a:blip xmlns:r="http://schemas.openxmlformats.org/officeDocument/2006/relationships" r:embed="R8b616747f4b34da3"/>
+                    <a:blip xmlns:r="http://schemas.openxmlformats.org/officeDocument/2006/relationships" r:embed="Re2f2c8fcbc4c49f6"/>
                     <a:stretch>
                       <a:fillRect/>
                     </a:stretch>
@@ -2532,7 +2532,7 @@
                     <pic:cNvPicPr/>
                   </pic:nvPicPr>
                   <pic:blipFill>
-                    <a:blip xmlns:r="http://schemas.openxmlformats.org/officeDocument/2006/relationships" r:embed="Rcb0fcc5a7dcc4d16"/>
+                    <a:blip xmlns:r="http://schemas.openxmlformats.org/officeDocument/2006/relationships" r:embed="R7f8f864d198544f0"/>
                     <a:stretch>
                       <a:fillRect/>
                     </a:stretch>
@@ -2583,7 +2583,7 @@
                     <pic:cNvPicPr/>
                   </pic:nvPicPr>
                   <pic:blipFill>
-                    <a:blip xmlns:r="http://schemas.openxmlformats.org/officeDocument/2006/relationships" r:embed="Rbfde0d16256845b4"/>
+                    <a:blip xmlns:r="http://schemas.openxmlformats.org/officeDocument/2006/relationships" r:embed="Rc252178710e64253"/>
                     <a:stretch>
                       <a:fillRect/>
                     </a:stretch>
@@ -2634,7 +2634,7 @@
                     <pic:cNvPicPr/>
                   </pic:nvPicPr>
                   <pic:blipFill>
-                    <a:blip xmlns:r="http://schemas.openxmlformats.org/officeDocument/2006/relationships" r:embed="Rf4e52176ffd04ed8"/>
+                    <a:blip xmlns:r="http://schemas.openxmlformats.org/officeDocument/2006/relationships" r:embed="Rac2eeaaea60b4b00"/>
                     <a:stretch>
                       <a:fillRect/>
                     </a:stretch>
@@ -2685,7 +2685,7 @@
                     <pic:cNvPicPr/>
                   </pic:nvPicPr>
                   <pic:blipFill>
-                    <a:blip xmlns:r="http://schemas.openxmlformats.org/officeDocument/2006/relationships" r:embed="Rece6c98082fb4af4"/>
+                    <a:blip xmlns:r="http://schemas.openxmlformats.org/officeDocument/2006/relationships" r:embed="R0ac268f32c944c6f"/>
                     <a:stretch>
                       <a:fillRect/>
                     </a:stretch>
@@ -2736,7 +2736,7 @@
                     <pic:cNvPicPr/>
                   </pic:nvPicPr>
                   <pic:blipFill>
-                    <a:blip xmlns:r="http://schemas.openxmlformats.org/officeDocument/2006/relationships" r:embed="Rff600dbc2c124755"/>
+                    <a:blip xmlns:r="http://schemas.openxmlformats.org/officeDocument/2006/relationships" r:embed="Ra28f322014d148a4"/>
                     <a:stretch>
                       <a:fillRect/>
                     </a:stretch>
@@ -2812,7 +2812,7 @@
                     <pic:cNvPicPr/>
                   </pic:nvPicPr>
                   <pic:blipFill>
-                    <a:blip xmlns:r="http://schemas.openxmlformats.org/officeDocument/2006/relationships" r:embed="R1961076a0d8e4261"/>
+                    <a:blip xmlns:r="http://schemas.openxmlformats.org/officeDocument/2006/relationships" r:embed="Re99f9c26b1814593"/>
                     <a:stretch>
                       <a:fillRect/>
                     </a:stretch>
@@ -2863,7 +2863,7 @@
                     <pic:cNvPicPr/>
                   </pic:nvPicPr>
                   <pic:blipFill>
-                    <a:blip xmlns:r="http://schemas.openxmlformats.org/officeDocument/2006/relationships" r:embed="R2dd8f84f207c4c55"/>
+                    <a:blip xmlns:r="http://schemas.openxmlformats.org/officeDocument/2006/relationships" r:embed="Rec5c0157656747d8"/>
                     <a:stretch>
                       <a:fillRect/>
                     </a:stretch>
@@ -2914,7 +2914,7 @@
                     <pic:cNvPicPr/>
                   </pic:nvPicPr>
                   <pic:blipFill>
-                    <a:blip xmlns:r="http://schemas.openxmlformats.org/officeDocument/2006/relationships" r:embed="R0a5ad7a844dd454e"/>
+                    <a:blip xmlns:r="http://schemas.openxmlformats.org/officeDocument/2006/relationships" r:embed="R4ccdf6fa114e4e6c"/>
                     <a:stretch>
                       <a:fillRect/>
                     </a:stretch>
@@ -2965,7 +2965,7 @@
                     <pic:cNvPicPr/>
                   </pic:nvPicPr>
                   <pic:blipFill>
-                    <a:blip xmlns:r="http://schemas.openxmlformats.org/officeDocument/2006/relationships" r:embed="R5612a6bc8c204a92"/>
+                    <a:blip xmlns:r="http://schemas.openxmlformats.org/officeDocument/2006/relationships" r:embed="R335a12bad8234634"/>
                     <a:stretch>
                       <a:fillRect/>
                     </a:stretch>
@@ -3016,7 +3016,7 @@
                     <pic:cNvPicPr/>
                   </pic:nvPicPr>
                   <pic:blipFill>
-                    <a:blip xmlns:r="http://schemas.openxmlformats.org/officeDocument/2006/relationships" r:embed="Ra13526a3679c4051"/>
+                    <a:blip xmlns:r="http://schemas.openxmlformats.org/officeDocument/2006/relationships" r:embed="Rfa1f2b1f61954666"/>
                     <a:stretch>
                       <a:fillRect/>
                     </a:stretch>
@@ -3067,7 +3067,7 @@
                     <pic:cNvPicPr/>
                   </pic:nvPicPr>
                   <pic:blipFill>
-                    <a:blip xmlns:r="http://schemas.openxmlformats.org/officeDocument/2006/relationships" r:embed="R925996c8b0814b62"/>
+                    <a:blip xmlns:r="http://schemas.openxmlformats.org/officeDocument/2006/relationships" r:embed="R36deb243ed374b9f"/>
                     <a:stretch>
                       <a:fillRect/>
                     </a:stretch>
@@ -3118,7 +3118,7 @@
                     <pic:cNvPicPr/>
                   </pic:nvPicPr>
                   <pic:blipFill>
-                    <a:blip xmlns:r="http://schemas.openxmlformats.org/officeDocument/2006/relationships" r:embed="R9b24e384419b4c17"/>
+                    <a:blip xmlns:r="http://schemas.openxmlformats.org/officeDocument/2006/relationships" r:embed="Rfca6638c60014e42"/>
                     <a:stretch>
                       <a:fillRect/>
                     </a:stretch>
@@ -3169,7 +3169,7 @@
                     <pic:cNvPicPr/>
                   </pic:nvPicPr>
                   <pic:blipFill>
-                    <a:blip xmlns:r="http://schemas.openxmlformats.org/officeDocument/2006/relationships" r:embed="R5c72e721a3c14373"/>
+                    <a:blip xmlns:r="http://schemas.openxmlformats.org/officeDocument/2006/relationships" r:embed="Rf1fae14ae1c144b0"/>
                     <a:stretch>
                       <a:fillRect/>
                     </a:stretch>
@@ -3220,7 +3220,7 @@
                     <pic:cNvPicPr/>
                   </pic:nvPicPr>
                   <pic:blipFill>
-                    <a:blip xmlns:r="http://schemas.openxmlformats.org/officeDocument/2006/relationships" r:embed="R5c306cf6bde04b8a"/>
+                    <a:blip xmlns:r="http://schemas.openxmlformats.org/officeDocument/2006/relationships" r:embed="R9a74d70c47dc4c55"/>
                     <a:stretch>
                       <a:fillRect/>
                     </a:stretch>
@@ -3271,7 +3271,7 @@
                     <pic:cNvPicPr/>
                   </pic:nvPicPr>
                   <pic:blipFill>
-                    <a:blip xmlns:r="http://schemas.openxmlformats.org/officeDocument/2006/relationships" r:embed="Rec29e7daa93b47f4"/>
+                    <a:blip xmlns:r="http://schemas.openxmlformats.org/officeDocument/2006/relationships" r:embed="R9617aba4af584572"/>
                     <a:stretch>
                       <a:fillRect/>
                     </a:stretch>
@@ -3322,7 +3322,7 @@
                     <pic:cNvPicPr/>
                   </pic:nvPicPr>
                   <pic:blipFill>
-                    <a:blip xmlns:r="http://schemas.openxmlformats.org/officeDocument/2006/relationships" r:embed="Re4e8aa9620994391"/>
+                    <a:blip xmlns:r="http://schemas.openxmlformats.org/officeDocument/2006/relationships" r:embed="Rb4fbb864c0ee478d"/>
                     <a:stretch>
                       <a:fillRect/>
                     </a:stretch>
@@ -3373,7 +3373,7 @@
                     <pic:cNvPicPr/>
                   </pic:nvPicPr>
                   <pic:blipFill>
-                    <a:blip xmlns:r="http://schemas.openxmlformats.org/officeDocument/2006/relationships" r:embed="R6f0965af48274662"/>
+                    <a:blip xmlns:r="http://schemas.openxmlformats.org/officeDocument/2006/relationships" r:embed="R82de608864b343bd"/>
                     <a:stretch>
                       <a:fillRect/>
                     </a:stretch>
@@ -3424,7 +3424,7 @@
                     <pic:cNvPicPr/>
                   </pic:nvPicPr>
                   <pic:blipFill>
-                    <a:blip xmlns:r="http://schemas.openxmlformats.org/officeDocument/2006/relationships" r:embed="Rad4695c272ce4ed4"/>
+                    <a:blip xmlns:r="http://schemas.openxmlformats.org/officeDocument/2006/relationships" r:embed="R06b34a8b95a641d3"/>
                     <a:stretch>
                       <a:fillRect/>
                     </a:stretch>
@@ -3660,7 +3660,7 @@
                     <pic:cNvPicPr/>
                   </pic:nvPicPr>
                   <pic:blipFill>
-                    <a:blip xmlns:r="http://schemas.openxmlformats.org/officeDocument/2006/relationships" r:embed="R4177d5c6b16b4b42"/>
+                    <a:blip xmlns:r="http://schemas.openxmlformats.org/officeDocument/2006/relationships" r:embed="R06fe3ddd16d64328"/>
                     <a:stretch>
                       <a:fillRect/>
                     </a:stretch>
@@ -4141,7 +4141,7 @@
       <w:r>
         <w:drawing>
           <wp:inline xmlns:wp="http://schemas.openxmlformats.org/drawingml/2006/wordprocessingDrawing" distT="0" distB="0" distL="0" distR="0">
-            <wp:extent cx="5220000" cy="4381842"/>
+            <wp:extent cx="5220000" cy="4915279"/>
             <wp:effectExtent l="0" t="0" r="0" b="0"/>
             <wp:docPr id="30" name="Mermaid diagram 30" descr="Mermaid diagram"/>
             <wp:cNvGraphicFramePr>
@@ -4155,7 +4155,7 @@
                     <pic:cNvPicPr/>
                   </pic:nvPicPr>
                   <pic:blipFill>
-                    <a:blip xmlns:r="http://schemas.openxmlformats.org/officeDocument/2006/relationships" r:embed="R8498d6aac38e4bc4"/>
+                    <a:blip xmlns:r="http://schemas.openxmlformats.org/officeDocument/2006/relationships" r:embed="Re98a99a1186047f9"/>
                     <a:stretch>
                       <a:fillRect/>
                     </a:stretch>
@@ -4163,7 +4163,7 @@
                   <pic:spPr>
                     <a:xfrm>
                       <a:off x="0" y="0"/>
-                      <a:ext cx="5220000" cy="4381842"/>
+                      <a:ext cx="5220000" cy="4915279"/>
                     </a:xfrm>
                     <a:prstGeom prst="rect">
                       <a:avLst/>
@@ -4390,7 +4390,7 @@
                     <pic:cNvPicPr/>
                   </pic:nvPicPr>
                   <pic:blipFill>
-                    <a:blip xmlns:r="http://schemas.openxmlformats.org/officeDocument/2006/relationships" r:embed="Rd92503e1f4584c6d"/>
+                    <a:blip xmlns:r="http://schemas.openxmlformats.org/officeDocument/2006/relationships" r:embed="Reba33ceaeed2444c"/>
                     <a:stretch>
                       <a:fillRect/>
                     </a:stretch>
@@ -4910,7 +4910,7 @@
                     <pic:cNvPicPr/>
                   </pic:nvPicPr>
                   <pic:blipFill>
-                    <a:blip xmlns:r="http://schemas.openxmlformats.org/officeDocument/2006/relationships" r:embed="Rfc42c05dffd44956"/>
+                    <a:blip xmlns:r="http://schemas.openxmlformats.org/officeDocument/2006/relationships" r:embed="Rbfb618b4cdb94bc3"/>
                     <a:stretch>
                       <a:fillRect/>
                     </a:stretch>
@@ -5591,7 +5591,7 @@
             <w:r>
               <w:t xml:space="preserve">Cell with </w:t>
             </w:r>
-            <w:hyperlink xmlns:r="http://schemas.openxmlformats.org/officeDocument/2006/relationships" w:history="true" r:id="R36d476deec924874">
+            <w:hyperlink xmlns:r="http://schemas.openxmlformats.org/officeDocument/2006/relationships" w:history="true" r:id="Ra6cf4820056c441f">
               <w:r>
                 <w:rPr>
                   <w:rStyle w:val="Hyperlink"/>
@@ -5877,7 +5877,7 @@
                           <pic:cNvPicPr/>
                         </pic:nvPicPr>
                         <pic:blipFill>
-                          <a:blip xmlns:r="http://schemas.openxmlformats.org/officeDocument/2006/relationships" r:embed="Rca8cb727b5ac45cb"/>
+                          <a:blip xmlns:r="http://schemas.openxmlformats.org/officeDocument/2006/relationships" r:embed="Rac356ddc9cde4277"/>
                           <a:stretch>
                             <a:fillRect/>
                           </a:stretch>
@@ -5977,7 +5977,7 @@
                     <pic:cNvPicPr/>
                   </pic:nvPicPr>
                   <pic:blipFill>
-                    <a:blip xmlns:r="http://schemas.openxmlformats.org/officeDocument/2006/relationships" r:embed="R8b576bb0d0a44240"/>
+                    <a:blip xmlns:r="http://schemas.openxmlformats.org/officeDocument/2006/relationships" r:embed="R9af803bb0a4f491c"/>
                     <a:stretch>
                       <a:fillRect/>
                     </a:stretch>
@@ -6027,7 +6027,7 @@
                     <pic:cNvPicPr/>
                   </pic:nvPicPr>
                   <pic:blipFill>
-                    <a:blip xmlns:r="http://schemas.openxmlformats.org/officeDocument/2006/relationships" r:embed="Rffd4dfe124424538"/>
+                    <a:blip xmlns:r="http://schemas.openxmlformats.org/officeDocument/2006/relationships" r:embed="R08f5de67f7bc4304"/>
                     <a:stretch>
                       <a:fillRect/>
                     </a:stretch>
@@ -6077,7 +6077,7 @@
                     <pic:cNvPicPr/>
                   </pic:nvPicPr>
                   <pic:blipFill>
-                    <a:blip xmlns:r="http://schemas.openxmlformats.org/officeDocument/2006/relationships" r:embed="Ra2768f639dd640ce"/>
+                    <a:blip xmlns:r="http://schemas.openxmlformats.org/officeDocument/2006/relationships" r:embed="Rb158028686094e71"/>
                     <a:stretch>
                       <a:fillRect/>
                     </a:stretch>
@@ -6706,7 +6706,7 @@
       <w:r>
         <w:drawing>
           <wp:inline xmlns:wp="http://schemas.openxmlformats.org/drawingml/2006/wordprocessingDrawing" distT="0" distB="0" distL="0" distR="0">
-            <wp:extent cx="5220000" cy="3854503"/>
+            <wp:extent cx="4267200" cy="4038600"/>
             <wp:effectExtent l="0" t="0" r="0" b="0"/>
             <wp:docPr id="37" name="Mermaid diagram 37" descr="Mermaid diagram"/>
             <wp:cNvGraphicFramePr>
@@ -6720,7 +6720,7 @@
                     <pic:cNvPicPr/>
                   </pic:nvPicPr>
                   <pic:blipFill>
-                    <a:blip xmlns:r="http://schemas.openxmlformats.org/officeDocument/2006/relationships" r:embed="R2eeaabd8a64b4427"/>
+                    <a:blip xmlns:r="http://schemas.openxmlformats.org/officeDocument/2006/relationships" r:embed="R193acb93db344e5e"/>
                     <a:stretch>
                       <a:fillRect/>
                     </a:stretch>
@@ -6728,7 +6728,7 @@
                   <pic:spPr>
                     <a:xfrm>
                       <a:off x="0" y="0"/>
-                      <a:ext cx="5220000" cy="3854503"/>
+                      <a:ext cx="4267200" cy="4038600"/>
                     </a:xfrm>
                     <a:prstGeom prst="rect">
                       <a:avLst/>
@@ -6757,7 +6757,7 @@
       <w:r>
         <w:drawing>
           <wp:inline xmlns:wp="http://schemas.openxmlformats.org/drawingml/2006/wordprocessingDrawing" distT="0" distB="0" distL="0" distR="0">
-            <wp:extent cx="5220000" cy="2189210"/>
+            <wp:extent cx="5220000" cy="2648745"/>
             <wp:effectExtent l="0" t="0" r="0" b="0"/>
             <wp:docPr id="38" name="Mermaid diagram 38" descr="Mermaid diagram"/>
             <wp:cNvGraphicFramePr>
@@ -6771,7 +6771,7 @@
                     <pic:cNvPicPr/>
                   </pic:nvPicPr>
                   <pic:blipFill>
-                    <a:blip xmlns:r="http://schemas.openxmlformats.org/officeDocument/2006/relationships" r:embed="Rd668ef166d754f62"/>
+                    <a:blip xmlns:r="http://schemas.openxmlformats.org/officeDocument/2006/relationships" r:embed="Rbd8743781ecb4d9d"/>
                     <a:stretch>
                       <a:fillRect/>
                     </a:stretch>
@@ -6779,7 +6779,7 @@
                   <pic:spPr>
                     <a:xfrm>
                       <a:off x="0" y="0"/>
-                      <a:ext cx="5220000" cy="2189210"/>
+                      <a:ext cx="5220000" cy="2648745"/>
                     </a:xfrm>
                     <a:prstGeom prst="rect">
                       <a:avLst/>
@@ -6808,7 +6808,7 @@
       <w:r>
         <w:drawing>
           <wp:inline xmlns:wp="http://schemas.openxmlformats.org/drawingml/2006/wordprocessingDrawing" distT="0" distB="0" distL="0" distR="0">
-            <wp:extent cx="2270769" cy="6480000"/>
+            <wp:extent cx="1847850" cy="5429250"/>
             <wp:effectExtent l="0" t="0" r="0" b="0"/>
             <wp:docPr id="39" name="Mermaid diagram 39" descr="Mermaid diagram"/>
             <wp:cNvGraphicFramePr>
@@ -6822,7 +6822,7 @@
                     <pic:cNvPicPr/>
                   </pic:nvPicPr>
                   <pic:blipFill>
-                    <a:blip xmlns:r="http://schemas.openxmlformats.org/officeDocument/2006/relationships" r:embed="R5bc6b3773ebe4900"/>
+                    <a:blip xmlns:r="http://schemas.openxmlformats.org/officeDocument/2006/relationships" r:embed="Rf35c4fde9b6c4716"/>
                     <a:stretch>
                       <a:fillRect/>
                     </a:stretch>
@@ -6830,7 +6830,7 @@
                   <pic:spPr>
                     <a:xfrm>
                       <a:off x="0" y="0"/>
-                      <a:ext cx="2270769" cy="6480000"/>
+                      <a:ext cx="1847850" cy="5429250"/>
                     </a:xfrm>
                     <a:prstGeom prst="rect">
                       <a:avLst/>
@@ -6859,7 +6859,7 @@
       <w:r>
         <w:drawing>
           <wp:inline xmlns:wp="http://schemas.openxmlformats.org/drawingml/2006/wordprocessingDrawing" distT="0" distB="0" distL="0" distR="0">
-            <wp:extent cx="5220000" cy="1246418"/>
+            <wp:extent cx="5220000" cy="1323194"/>
             <wp:effectExtent l="0" t="0" r="0" b="0"/>
             <wp:docPr id="40" name="Mermaid diagram 40" descr="Mermaid diagram"/>
             <wp:cNvGraphicFramePr>
@@ -6873,7 +6873,7 @@
                     <pic:cNvPicPr/>
                   </pic:nvPicPr>
                   <pic:blipFill>
-                    <a:blip xmlns:r="http://schemas.openxmlformats.org/officeDocument/2006/relationships" r:embed="Rcdf7c378ee4241df"/>
+                    <a:blip xmlns:r="http://schemas.openxmlformats.org/officeDocument/2006/relationships" r:embed="Rdec2c318d306408a"/>
                     <a:stretch>
                       <a:fillRect/>
                     </a:stretch>
@@ -6881,7 +6881,7 @@
                   <pic:spPr>
                     <a:xfrm>
                       <a:off x="0" y="0"/>
-                      <a:ext cx="5220000" cy="1246418"/>
+                      <a:ext cx="5220000" cy="1323194"/>
                     </a:xfrm>
                     <a:prstGeom prst="rect">
                       <a:avLst/>
@@ -6910,7 +6910,7 @@
       <w:r>
         <w:drawing>
           <wp:inline xmlns:wp="http://schemas.openxmlformats.org/drawingml/2006/wordprocessingDrawing" distT="0" distB="0" distL="0" distR="0">
-            <wp:extent cx="1609503" cy="6480000"/>
+            <wp:extent cx="2125161" cy="6480000"/>
             <wp:effectExtent l="0" t="0" r="0" b="0"/>
             <wp:docPr id="41" name="Mermaid diagram 41" descr="Mermaid diagram"/>
             <wp:cNvGraphicFramePr>
@@ -6924,7 +6924,7 @@
                     <pic:cNvPicPr/>
                   </pic:nvPicPr>
                   <pic:blipFill>
-                    <a:blip xmlns:r="http://schemas.openxmlformats.org/officeDocument/2006/relationships" r:embed="Re2023034223b4737"/>
+                    <a:blip xmlns:r="http://schemas.openxmlformats.org/officeDocument/2006/relationships" r:embed="Ra047023a27dd4b21"/>
                     <a:stretch>
                       <a:fillRect/>
                     </a:stretch>
@@ -6932,7 +6932,7 @@
                   <pic:spPr>
                     <a:xfrm>
                       <a:off x="0" y="0"/>
-                      <a:ext cx="1609503" cy="6480000"/>
+                      <a:ext cx="2125161" cy="6480000"/>
                     </a:xfrm>
                     <a:prstGeom prst="rect">
                       <a:avLst/>
@@ -6975,7 +6975,7 @@
                     <pic:cNvPicPr/>
                   </pic:nvPicPr>
                   <pic:blipFill>
-                    <a:blip xmlns:r="http://schemas.openxmlformats.org/officeDocument/2006/relationships" r:embed="Rcce02b874bec4196"/>
+                    <a:blip xmlns:r="http://schemas.openxmlformats.org/officeDocument/2006/relationships" r:embed="R1f41a064c40a4c6c"/>
                     <a:stretch>
                       <a:fillRect/>
                     </a:stretch>
@@ -7012,7 +7012,7 @@
       <w:r>
         <w:drawing>
           <wp:inline xmlns:wp="http://schemas.openxmlformats.org/drawingml/2006/wordprocessingDrawing" distT="0" distB="0" distL="0" distR="0">
-            <wp:extent cx="5220000" cy="1010042"/>
+            <wp:extent cx="5220000" cy="1060497"/>
             <wp:effectExtent l="0" t="0" r="0" b="0"/>
             <wp:docPr id="43" name="Mermaid diagram 43" descr="Mermaid diagram"/>
             <wp:cNvGraphicFramePr>
@@ -7026,7 +7026,7 @@
                     <pic:cNvPicPr/>
                   </pic:nvPicPr>
                   <pic:blipFill>
-                    <a:blip xmlns:r="http://schemas.openxmlformats.org/officeDocument/2006/relationships" r:embed="R43195ecfe0ed4373"/>
+                    <a:blip xmlns:r="http://schemas.openxmlformats.org/officeDocument/2006/relationships" r:embed="Ra6a24f5330374e6e"/>
                     <a:stretch>
                       <a:fillRect/>
                     </a:stretch>
@@ -7034,7 +7034,7 @@
                   <pic:spPr>
                     <a:xfrm>
                       <a:off x="0" y="0"/>
-                      <a:ext cx="5220000" cy="1010042"/>
+                      <a:ext cx="5220000" cy="1060497"/>
                     </a:xfrm>
                     <a:prstGeom prst="rect">
                       <a:avLst/>
@@ -7063,7 +7063,7 @@
       <w:r>
         <w:drawing>
           <wp:inline xmlns:wp="http://schemas.openxmlformats.org/drawingml/2006/wordprocessingDrawing" distT="0" distB="0" distL="0" distR="0">
-            <wp:extent cx="5220000" cy="365633"/>
+            <wp:extent cx="5220000" cy="146128"/>
             <wp:effectExtent l="0" t="0" r="0" b="0"/>
             <wp:docPr id="44" name="Mermaid diagram 44" descr="Mermaid diagram"/>
             <wp:cNvGraphicFramePr>
@@ -7077,7 +7077,7 @@
                     <pic:cNvPicPr/>
                   </pic:nvPicPr>
                   <pic:blipFill>
-                    <a:blip xmlns:r="http://schemas.openxmlformats.org/officeDocument/2006/relationships" r:embed="R5da2a53d509645fe"/>
+                    <a:blip xmlns:r="http://schemas.openxmlformats.org/officeDocument/2006/relationships" r:embed="Rb9a220a2c06342ec"/>
                     <a:stretch>
                       <a:fillRect/>
                     </a:stretch>
@@ -7085,7 +7085,7 @@
                   <pic:spPr>
                     <a:xfrm>
                       <a:off x="0" y="0"/>
-                      <a:ext cx="5220000" cy="365633"/>
+                      <a:ext cx="5220000" cy="146128"/>
                     </a:xfrm>
                     <a:prstGeom prst="rect">
                       <a:avLst/>
@@ -7114,7 +7114,7 @@
       <w:r>
         <w:drawing>
           <wp:inline xmlns:wp="http://schemas.openxmlformats.org/drawingml/2006/wordprocessingDrawing" distT="0" distB="0" distL="0" distR="0">
-            <wp:extent cx="2562225" cy="3562350"/>
+            <wp:extent cx="2066925" cy="2933700"/>
             <wp:effectExtent l="0" t="0" r="0" b="0"/>
             <wp:docPr id="45" name="Mermaid diagram 45" descr="Mermaid diagram"/>
             <wp:cNvGraphicFramePr>
@@ -7128,7 +7128,7 @@
                     <pic:cNvPicPr/>
                   </pic:nvPicPr>
                   <pic:blipFill>
-                    <a:blip xmlns:r="http://schemas.openxmlformats.org/officeDocument/2006/relationships" r:embed="R9114d107459448cf"/>
+                    <a:blip xmlns:r="http://schemas.openxmlformats.org/officeDocument/2006/relationships" r:embed="R84ad113b085346f9"/>
                     <a:stretch>
                       <a:fillRect/>
                     </a:stretch>
@@ -7136,7 +7136,7 @@
                   <pic:spPr>
                     <a:xfrm>
                       <a:off x="0" y="0"/>
-                      <a:ext cx="2562225" cy="3562350"/>
+                      <a:ext cx="2066925" cy="2933700"/>
                     </a:xfrm>
                     <a:prstGeom prst="rect">
                       <a:avLst/>
@@ -7187,7 +7187,7 @@
                     <pic:cNvPicPr/>
                   </pic:nvPicPr>
                   <pic:blipFill>
-                    <a:blip xmlns:r="http://schemas.openxmlformats.org/officeDocument/2006/relationships" r:embed="R225a00df41aa4fd0"/>
+                    <a:blip xmlns:r="http://schemas.openxmlformats.org/officeDocument/2006/relationships" r:embed="R09b5a7512777443c"/>
                     <a:stretch>
                       <a:fillRect/>
                     </a:stretch>
@@ -7238,7 +7238,7 @@
                     <pic:cNvPicPr/>
                   </pic:nvPicPr>
                   <pic:blipFill>
-                    <a:blip xmlns:r="http://schemas.openxmlformats.org/officeDocument/2006/relationships" r:embed="R63d30b0af5b14e59"/>
+                    <a:blip xmlns:r="http://schemas.openxmlformats.org/officeDocument/2006/relationships" r:embed="R95fd94e4a77640af"/>
                     <a:stretch>
                       <a:fillRect/>
                     </a:stretch>
@@ -7289,7 +7289,7 @@
                     <pic:cNvPicPr/>
                   </pic:nvPicPr>
                   <pic:blipFill>
-                    <a:blip xmlns:r="http://schemas.openxmlformats.org/officeDocument/2006/relationships" r:embed="R301cfb3a37ed4d1d"/>
+                    <a:blip xmlns:r="http://schemas.openxmlformats.org/officeDocument/2006/relationships" r:embed="Rcc4d6f7983224d64"/>
                     <a:stretch>
                       <a:fillRect/>
                     </a:stretch>
@@ -7340,7 +7340,7 @@
                     <pic:cNvPicPr/>
                   </pic:nvPicPr>
                   <pic:blipFill>
-                    <a:blip xmlns:r="http://schemas.openxmlformats.org/officeDocument/2006/relationships" r:embed="R2509cba1e33f48a3"/>
+                    <a:blip xmlns:r="http://schemas.openxmlformats.org/officeDocument/2006/relationships" r:embed="Rd6ebf1cdcc6143e0"/>
                     <a:stretch>
                       <a:fillRect/>
                     </a:stretch>
@@ -7399,7 +7399,7 @@
                     <pic:cNvPicPr/>
                   </pic:nvPicPr>
                   <pic:blipFill>
-                    <a:blip xmlns:r="http://schemas.openxmlformats.org/officeDocument/2006/relationships" r:embed="R9c62bb53452b40a5"/>
+                    <a:blip xmlns:r="http://schemas.openxmlformats.org/officeDocument/2006/relationships" r:embed="R2c3879b52070473d"/>
                     <a:stretch>
                       <a:fillRect/>
                     </a:stretch>
@@ -7450,7 +7450,7 @@
                     <pic:cNvPicPr/>
                   </pic:nvPicPr>
                   <pic:blipFill>
-                    <a:blip xmlns:r="http://schemas.openxmlformats.org/officeDocument/2006/relationships" r:embed="Rad60441c91b14e51"/>
+                    <a:blip xmlns:r="http://schemas.openxmlformats.org/officeDocument/2006/relationships" r:embed="R4a3960ec6b7e48ae"/>
                     <a:stretch>
                       <a:fillRect/>
                     </a:stretch>
@@ -7493,9 +7493,72 @@
         <w:jc w:val="center"/>
       </w:pPr>
       <w:r>
+        <w:rPr>
+          <w:b/>
+        </w:rPr>
+        <w:t xml:space="preserve">[Mermaid diagram not rendered] </w:t>
+      </w:r>
+      <w:r>
+        <w:t xml:space="preserve">Mermaid render failed: Text overlap detected: "Translating" at (420.0,468.0,66.0x12.0) overlaps with "Translating" at (420.0,461.0,66.0x12.0)</w:t>
+      </w:r>
+      <w:r>
+        <w:br/>
+      </w:r>
+      <w:r>
+        <w:rPr>
+          <w:rFonts w:ascii="Consolas" w:hAnsi="Consolas"/>
+          <w:noProof/>
+        </w:rPr>
+        <w:t xml:space="preserve">stateDiagram-v2</w:t>
+        <w:br/>
+        <w:t xml:space="preserve">  [*] --&gt; Idle</w:t>
+        <w:br/>
+        <w:t xml:space="preserve">  Idle --&gt; Receiving : file arrives</w:t>
+        <w:br/>
+        <w:t xml:space="preserve">  Receiving --&gt; Validating : manifest read</w:t>
+        <w:br/>
+        <w:t xml:space="preserve">  Validating --&gt; Translating : ok</w:t>
+        <w:br/>
+        <w:t xml:space="preserve">  Validating --&gt; Rejected : invalid</w:t>
+        <w:br/>
+        <w:t xml:space="preserve"/>
+        <w:br/>
+        <w:t xml:space="preserve">  state Translating {</w:t>
+        <w:br/>
+        <w:t xml:space="preserve">    [*] --&gt; Map</w:t>
+        <w:br/>
+        <w:t xml:space="preserve">    Map --&gt; Convert</w:t>
+        <w:br/>
+        <w:t xml:space="preserve">    Convert --&gt; [*]</w:t>
+        <w:br/>
+        <w:t xml:space="preserve">  }</w:t>
+        <w:br/>
+        <w:t xml:space="preserve"/>
+        <w:br/>
+        <w:t xml:space="preserve">  Translating --&gt; Done</w:t>
+        <w:br/>
+        <w:t xml:space="preserve">  Rejected --&gt; [*]</w:t>
+        <w:br/>
+        <w:t xml:space="preserve">  Done --&gt; [*]</w:t>
+      </w:r>
+    </w:p>
+    <w:p>
+      <w:pPr>
+        <w:pStyle w:val="Normal"/>
+      </w:pPr>
+      <w:r>
+        <w:t xml:space="preserve">State: choice and guards.</w:t>
+      </w:r>
+    </w:p>
+    <w:p>
+      <w:pPr>
+        <w:pStyle w:val="Normal"/>
+        <w:jc w:val="center"/>
+      </w:pPr>
+      <w:r>
         <w:drawing>
           <wp:inline xmlns:wp="http://schemas.openxmlformats.org/drawingml/2006/wordprocessingDrawing" distT="0" distB="0" distL="0" distR="0">
-            <wp:extent cx="4711935" cy="6480000"/>
+            <wp:extent cx="3124200" cy="4648200"/>
             <wp:effectExtent l="0" t="0" r="0" b="0"/>
             <wp:docPr id="52" name="Mermaid diagram 52" descr="Mermaid diagram"/>
             <wp:cNvGraphicFramePr>
@@ -7509,58 +7572,7 @@
                     <pic:cNvPicPr/>
                   </pic:nvPicPr>
                   <pic:blipFill>
-                    <a:blip xmlns:r="http://schemas.openxmlformats.org/officeDocument/2006/relationships" r:embed="R523de81633114c0c"/>
-                    <a:stretch>
-                      <a:fillRect/>
-                    </a:stretch>
-                  </pic:blipFill>
-                  <pic:spPr>
-                    <a:xfrm>
-                      <a:off x="0" y="0"/>
-                      <a:ext cx="4711935" cy="6480000"/>
-                    </a:xfrm>
-                    <a:prstGeom prst="rect">
-                      <a:avLst/>
-                    </a:prstGeom>
-                  </pic:spPr>
-                </pic:pic>
-              </a:graphicData>
-            </a:graphic>
-          </wp:inline>
-        </w:drawing>
-      </w:r>
-    </w:p>
-    <w:p>
-      <w:pPr>
-        <w:pStyle w:val="Normal"/>
-      </w:pPr>
-      <w:r>
-        <w:t xml:space="preserve">State: choice and guards.</w:t>
-      </w:r>
-    </w:p>
-    <w:p>
-      <w:pPr>
-        <w:pStyle w:val="Normal"/>
-        <w:jc w:val="center"/>
-      </w:pPr>
-      <w:r>
-        <w:drawing>
-          <wp:inline xmlns:wp="http://schemas.openxmlformats.org/drawingml/2006/wordprocessingDrawing" distT="0" distB="0" distL="0" distR="0">
-            <wp:extent cx="3124200" cy="4648200"/>
-            <wp:effectExtent l="0" t="0" r="0" b="0"/>
-            <wp:docPr id="53" name="Mermaid diagram 53" descr="Mermaid diagram"/>
-            <wp:cNvGraphicFramePr>
-              <a:graphicFrameLocks xmlns:a="http://schemas.openxmlformats.org/drawingml/2006/main" noChangeAspect="1"/>
-            </wp:cNvGraphicFramePr>
-            <a:graphic xmlns:a="http://schemas.openxmlformats.org/drawingml/2006/main">
-              <a:graphicData uri="http://schemas.openxmlformats.org/drawingml/2006/picture">
-                <pic:pic xmlns:pic="http://schemas.openxmlformats.org/drawingml/2006/picture">
-                  <pic:nvPicPr>
-                    <pic:cNvPr id="0" name="Mermaid diagram.svg" descr="Mermaid diagram"/>
-                    <pic:cNvPicPr/>
-                  </pic:nvPicPr>
-                  <pic:blipFill>
-                    <a:blip xmlns:r="http://schemas.openxmlformats.org/officeDocument/2006/relationships" r:embed="R84b2908d66c3433a"/>
+                    <a:blip xmlns:r="http://schemas.openxmlformats.org/officeDocument/2006/relationships" r:embed="R55f5e792f5804d7e"/>
                     <a:stretch>
                       <a:fillRect/>
                     </a:stretch>
@@ -7607,7 +7619,7 @@
           <wp:inline xmlns:wp="http://schemas.openxmlformats.org/drawingml/2006/wordprocessingDrawing" distT="0" distB="0" distL="0" distR="0">
             <wp:extent cx="4800600" cy="5334000"/>
             <wp:effectExtent l="0" t="0" r="0" b="0"/>
-            <wp:docPr id="54" name="Mermaid diagram 54" descr="Mermaid diagram"/>
+            <wp:docPr id="53" name="Mermaid diagram 53" descr="Mermaid diagram"/>
             <wp:cNvGraphicFramePr>
               <a:graphicFrameLocks xmlns:a="http://schemas.openxmlformats.org/drawingml/2006/main" noChangeAspect="1"/>
             </wp:cNvGraphicFramePr>
@@ -7619,7 +7631,7 @@
                     <pic:cNvPicPr/>
                   </pic:nvPicPr>
                   <pic:blipFill>
-                    <a:blip xmlns:r="http://schemas.openxmlformats.org/officeDocument/2006/relationships" r:embed="Rb7f53028cd384cd6"/>
+                    <a:blip xmlns:r="http://schemas.openxmlformats.org/officeDocument/2006/relationships" r:embed="Rf10ee4f8ca064a2c"/>
                     <a:stretch>
                       <a:fillRect/>
                     </a:stretch>
@@ -7658,7 +7670,7 @@
           <wp:inline xmlns:wp="http://schemas.openxmlformats.org/drawingml/2006/wordprocessingDrawing" distT="0" distB="0" distL="0" distR="0">
             <wp:extent cx="5220000" cy="1867007"/>
             <wp:effectExtent l="0" t="0" r="0" b="0"/>
-            <wp:docPr id="55" name="Mermaid diagram 55" descr="Mermaid diagram"/>
+            <wp:docPr id="54" name="Mermaid diagram 54" descr="Mermaid diagram"/>
             <wp:cNvGraphicFramePr>
               <a:graphicFrameLocks xmlns:a="http://schemas.openxmlformats.org/drawingml/2006/main" noChangeAspect="1"/>
             </wp:cNvGraphicFramePr>
@@ -7670,7 +7682,7 @@
                     <pic:cNvPicPr/>
                   </pic:nvPicPr>
                   <pic:blipFill>
-                    <a:blip xmlns:r="http://schemas.openxmlformats.org/officeDocument/2006/relationships" r:embed="R2a3ff54dddc24f89"/>
+                    <a:blip xmlns:r="http://schemas.openxmlformats.org/officeDocument/2006/relationships" r:embed="Rde7f63bca2234be6"/>
                     <a:stretch>
                       <a:fillRect/>
                     </a:stretch>
@@ -7717,7 +7729,7 @@
           <wp:inline xmlns:wp="http://schemas.openxmlformats.org/drawingml/2006/wordprocessingDrawing" distT="0" distB="0" distL="0" distR="0">
             <wp:extent cx="5220000" cy="819700"/>
             <wp:effectExtent l="0" t="0" r="0" b="0"/>
-            <wp:docPr id="56" name="Mermaid diagram 56" descr="Mermaid diagram"/>
+            <wp:docPr id="55" name="Mermaid diagram 55" descr="Mermaid diagram"/>
             <wp:cNvGraphicFramePr>
               <a:graphicFrameLocks xmlns:a="http://schemas.openxmlformats.org/drawingml/2006/main" noChangeAspect="1"/>
             </wp:cNvGraphicFramePr>
@@ -7729,7 +7741,7 @@
                     <pic:cNvPicPr/>
                   </pic:nvPicPr>
                   <pic:blipFill>
-                    <a:blip xmlns:r="http://schemas.openxmlformats.org/officeDocument/2006/relationships" r:embed="Rbb093140561d4249"/>
+                    <a:blip xmlns:r="http://schemas.openxmlformats.org/officeDocument/2006/relationships" r:embed="Rab5b8a1f04214517"/>
                     <a:stretch>
                       <a:fillRect/>
                     </a:stretch>
@@ -7776,7 +7788,7 @@
           <wp:inline xmlns:wp="http://schemas.openxmlformats.org/drawingml/2006/wordprocessingDrawing" distT="0" distB="0" distL="0" distR="0">
             <wp:extent cx="5220000" cy="3825733"/>
             <wp:effectExtent l="0" t="0" r="0" b="0"/>
-            <wp:docPr id="57" name="Mermaid diagram 57" descr="Mermaid diagram"/>
+            <wp:docPr id="56" name="Mermaid diagram 56" descr="Mermaid diagram"/>
             <wp:cNvGraphicFramePr>
               <a:graphicFrameLocks xmlns:a="http://schemas.openxmlformats.org/drawingml/2006/main" noChangeAspect="1"/>
             </wp:cNvGraphicFramePr>
@@ -7788,7 +7800,7 @@
                     <pic:cNvPicPr/>
                   </pic:nvPicPr>
                   <pic:blipFill>
-                    <a:blip xmlns:r="http://schemas.openxmlformats.org/officeDocument/2006/relationships" r:embed="R68967eefaa904d02"/>
+                    <a:blip xmlns:r="http://schemas.openxmlformats.org/officeDocument/2006/relationships" r:embed="R2c3273345d314486"/>
                     <a:stretch>
                       <a:fillRect/>
                     </a:stretch>

</xml_diff>

<commit_message>
Improve compound flowchart layout and align minlen parsing with Mermaid.
Expand Dagre subgraph layout and flowchart edge routing, cap minlen from link stroke length, update shape paths and tests, document label entity codes in test.md, and remove tracked DOCX debug extracts and probe scripts.

Co-authored-by: Cursor <cursoragent@cursor.com>
</commit_message>
<xml_diff>
--- a/test.docx
+++ b/test.docx
@@ -236,7 +236,7 @@
       <w:r>
         <w:t xml:space="preserve">, and </w:t>
       </w:r>
-      <w:hyperlink xmlns:r="http://schemas.openxmlformats.org/officeDocument/2006/relationships" w:history="true" r:id="R7fe8f9c42b6a4c40">
+      <w:hyperlink xmlns:r="http://schemas.openxmlformats.org/officeDocument/2006/relationships" w:history="true" r:id="R274441adb841430b">
         <w:r>
           <w:rPr>
             <w:rStyle w:val="Hyperlink"/>
@@ -475,7 +475,7 @@
       <w:r>
         <w:t xml:space="preserve">Direct link: </w:t>
       </w:r>
-      <w:hyperlink xmlns:r="http://schemas.openxmlformats.org/officeDocument/2006/relationships" w:history="true" r:id="R5eedc730b002420e">
+      <w:hyperlink xmlns:r="http://schemas.openxmlformats.org/officeDocument/2006/relationships" w:history="true" r:id="R7dc51b91e1eb464f">
         <w:r>
           <w:rPr>
             <w:rStyle w:val="Hyperlink"/>
@@ -496,7 +496,7 @@
       <w:r>
         <w:t xml:space="preserve">Direct link with title: </w:t>
       </w:r>
-      <w:hyperlink xmlns:r="http://schemas.openxmlformats.org/officeDocument/2006/relationships" w:history="true" r:id="Ra9cc000a78524671">
+      <w:hyperlink xmlns:r="http://schemas.openxmlformats.org/officeDocument/2006/relationships" w:history="true" r:id="Rd737f67a693d4464">
         <w:r>
           <w:rPr>
             <w:rStyle w:val="Hyperlink"/>
@@ -517,7 +517,7 @@
       <w:r>
         <w:t xml:space="preserve">Reference-style link: </w:t>
       </w:r>
-      <w:hyperlink xmlns:r="http://schemas.openxmlformats.org/officeDocument/2006/relationships" w:history="true" r:id="R169b1d58cff7460c">
+      <w:hyperlink xmlns:r="http://schemas.openxmlformats.org/officeDocument/2006/relationships" w:history="true" r:id="R0878831eca0e49c3">
         <w:r>
           <w:rPr>
             <w:rStyle w:val="Hyperlink"/>
@@ -538,7 +538,7 @@
       <w:r>
         <w:t xml:space="preserve">Collapsed reference link: </w:t>
       </w:r>
-      <w:hyperlink xmlns:r="http://schemas.openxmlformats.org/officeDocument/2006/relationships" w:history="true" r:id="Rd6324a4480854e1b">
+      <w:hyperlink xmlns:r="http://schemas.openxmlformats.org/officeDocument/2006/relationships" w:history="true" r:id="Ra6be6c67414449c7">
         <w:r>
           <w:rPr>
             <w:rStyle w:val="Hyperlink"/>
@@ -559,7 +559,7 @@
       <w:r>
         <w:t xml:space="preserve">Repeated reference link: </w:t>
       </w:r>
-      <w:hyperlink xmlns:r="http://schemas.openxmlformats.org/officeDocument/2006/relationships" w:history="true" r:id="R9230b912faa74d89">
+      <w:hyperlink xmlns:r="http://schemas.openxmlformats.org/officeDocument/2006/relationships" w:history="true" r:id="Rf47ba151729f41ca">
         <w:r>
           <w:rPr>
             <w:rStyle w:val="Hyperlink"/>
@@ -580,7 +580,7 @@
       <w:r>
         <w:t xml:space="preserve">Autolink URL: </w:t>
       </w:r>
-      <w:hyperlink xmlns:r="http://schemas.openxmlformats.org/officeDocument/2006/relationships" w:history="true" r:id="R0a7fd3674dd440c4">
+      <w:hyperlink xmlns:r="http://schemas.openxmlformats.org/officeDocument/2006/relationships" w:history="true" r:id="R8c448e56ac444d7a">
         <w:r>
           <w:rPr>
             <w:rStyle w:val="Hyperlink"/>
@@ -601,7 +601,7 @@
       <w:r>
         <w:t xml:space="preserve">Autolink email: </w:t>
       </w:r>
-      <w:hyperlink xmlns:r="http://schemas.openxmlformats.org/officeDocument/2006/relationships" w:history="true" r:id="Rc86110372b9c4f87">
+      <w:hyperlink xmlns:r="http://schemas.openxmlformats.org/officeDocument/2006/relationships" w:history="true" r:id="R8be3e3b4f2d74dc4">
         <w:r>
           <w:rPr>
             <w:rStyle w:val="Hyperlink"/>
@@ -700,7 +700,7 @@
       <w:r>
         <w:t xml:space="preserve">, and </w:t>
       </w:r>
-      <w:hyperlink xmlns:r="http://schemas.openxmlformats.org/officeDocument/2006/relationships" w:history="true" r:id="R911ab96e11bc440d">
+      <w:hyperlink xmlns:r="http://schemas.openxmlformats.org/officeDocument/2006/relationships" w:history="true" r:id="R363920204c27452d">
         <w:r>
           <w:rPr>
             <w:rStyle w:val="Hyperlink"/>
@@ -1093,7 +1093,7 @@
       <w:r>
         <w:t xml:space="preserve">Continuation paragraph with </w:t>
       </w:r>
-      <w:hyperlink xmlns:r="http://schemas.openxmlformats.org/officeDocument/2006/relationships" w:history="true" r:id="R05e0b1f9b0894509">
+      <w:hyperlink xmlns:r="http://schemas.openxmlformats.org/officeDocument/2006/relationships" w:history="true" r:id="R348a64dc6a564c47">
         <w:r>
           <w:rPr>
             <w:rStyle w:val="Hyperlink"/>
@@ -1591,7 +1591,7 @@
       <w:r>
         <w:t xml:space="preserve">, and </w:t>
       </w:r>
-      <w:hyperlink xmlns:r="http://schemas.openxmlformats.org/officeDocument/2006/relationships" w:history="true" r:id="R246e1de230ad4d0c">
+      <w:hyperlink xmlns:r="http://schemas.openxmlformats.org/officeDocument/2006/relationships" w:history="true" r:id="R37ade1a1f055421e">
         <w:r>
           <w:rPr>
             <w:rStyle w:val="Hyperlink"/>
@@ -1979,7 +1979,7 @@
                     <pic:cNvPicPr/>
                   </pic:nvPicPr>
                   <pic:blipFill>
-                    <a:blip xmlns:r="http://schemas.openxmlformats.org/officeDocument/2006/relationships" r:embed="R2db12feefbcf4ec0"/>
+                    <a:blip xmlns:r="http://schemas.openxmlformats.org/officeDocument/2006/relationships" r:embed="R54a5bc10a463432b"/>
                     <a:stretch>
                       <a:fillRect/>
                     </a:stretch>
@@ -2039,7 +2039,7 @@
                     <pic:cNvPicPr/>
                   </pic:nvPicPr>
                   <pic:blipFill>
-                    <a:blip xmlns:r="http://schemas.openxmlformats.org/officeDocument/2006/relationships" r:embed="R72d77a6ea24e4a52"/>
+                    <a:blip xmlns:r="http://schemas.openxmlformats.org/officeDocument/2006/relationships" r:embed="R647ff2530c8146c5"/>
                     <a:stretch>
                       <a:fillRect/>
                     </a:stretch>
@@ -2099,7 +2099,7 @@
                     <pic:cNvPicPr/>
                   </pic:nvPicPr>
                   <pic:blipFill>
-                    <a:blip xmlns:r="http://schemas.openxmlformats.org/officeDocument/2006/relationships" r:embed="R361ccf8f48044fd7"/>
+                    <a:blip xmlns:r="http://schemas.openxmlformats.org/officeDocument/2006/relationships" r:embed="R432ceef73e624bb6"/>
                     <a:stretch>
                       <a:fillRect/>
                     </a:stretch>
@@ -2150,7 +2150,7 @@
                     <pic:cNvPicPr/>
                   </pic:nvPicPr>
                   <pic:blipFill>
-                    <a:blip xmlns:r="http://schemas.openxmlformats.org/officeDocument/2006/relationships" r:embed="R84de9526733247d3"/>
+                    <a:blip xmlns:r="http://schemas.openxmlformats.org/officeDocument/2006/relationships" r:embed="Rf85604de18284a1f"/>
                     <a:stretch>
                       <a:fillRect/>
                     </a:stretch>
@@ -2201,7 +2201,7 @@
                     <pic:cNvPicPr/>
                   </pic:nvPicPr>
                   <pic:blipFill>
-                    <a:blip xmlns:r="http://schemas.openxmlformats.org/officeDocument/2006/relationships" r:embed="R686411f0ec6d4ff3"/>
+                    <a:blip xmlns:r="http://schemas.openxmlformats.org/officeDocument/2006/relationships" r:embed="R3e7e0039faf54d27"/>
                     <a:stretch>
                       <a:fillRect/>
                     </a:stretch>
@@ -2252,7 +2252,7 @@
                     <pic:cNvPicPr/>
                   </pic:nvPicPr>
                   <pic:blipFill>
-                    <a:blip xmlns:r="http://schemas.openxmlformats.org/officeDocument/2006/relationships" r:embed="R60db6ad05ccd4bd4"/>
+                    <a:blip xmlns:r="http://schemas.openxmlformats.org/officeDocument/2006/relationships" r:embed="R9d911c40d5714e79"/>
                     <a:stretch>
                       <a:fillRect/>
                     </a:stretch>
@@ -2303,7 +2303,7 @@
                     <pic:cNvPicPr/>
                   </pic:nvPicPr>
                   <pic:blipFill>
-                    <a:blip xmlns:r="http://schemas.openxmlformats.org/officeDocument/2006/relationships" r:embed="R669fb7a871a74fd2"/>
+                    <a:blip xmlns:r="http://schemas.openxmlformats.org/officeDocument/2006/relationships" r:embed="Rd7e23ce6c44a4ea2"/>
                     <a:stretch>
                       <a:fillRect/>
                     </a:stretch>
@@ -2354,7 +2354,7 @@
                     <pic:cNvPicPr/>
                   </pic:nvPicPr>
                   <pic:blipFill>
-                    <a:blip xmlns:r="http://schemas.openxmlformats.org/officeDocument/2006/relationships" r:embed="Rd49a5fbb01e94001"/>
+                    <a:blip xmlns:r="http://schemas.openxmlformats.org/officeDocument/2006/relationships" r:embed="Re15442af3df741af"/>
                     <a:stretch>
                       <a:fillRect/>
                     </a:stretch>
@@ -2430,7 +2430,7 @@
                     <pic:cNvPicPr/>
                   </pic:nvPicPr>
                   <pic:blipFill>
-                    <a:blip xmlns:r="http://schemas.openxmlformats.org/officeDocument/2006/relationships" r:embed="R7c0896a56069420c"/>
+                    <a:blip xmlns:r="http://schemas.openxmlformats.org/officeDocument/2006/relationships" r:embed="R1ebc63d8431c4cef"/>
                     <a:stretch>
                       <a:fillRect/>
                     </a:stretch>
@@ -2481,7 +2481,7 @@
                     <pic:cNvPicPr/>
                   </pic:nvPicPr>
                   <pic:blipFill>
-                    <a:blip xmlns:r="http://schemas.openxmlformats.org/officeDocument/2006/relationships" r:embed="Re2f2c8fcbc4c49f6"/>
+                    <a:blip xmlns:r="http://schemas.openxmlformats.org/officeDocument/2006/relationships" r:embed="R7ad2e7e2a3b94bdb"/>
                     <a:stretch>
                       <a:fillRect/>
                     </a:stretch>
@@ -2532,7 +2532,7 @@
                     <pic:cNvPicPr/>
                   </pic:nvPicPr>
                   <pic:blipFill>
-                    <a:blip xmlns:r="http://schemas.openxmlformats.org/officeDocument/2006/relationships" r:embed="R7f8f864d198544f0"/>
+                    <a:blip xmlns:r="http://schemas.openxmlformats.org/officeDocument/2006/relationships" r:embed="Rc491adef03114fe5"/>
                     <a:stretch>
                       <a:fillRect/>
                     </a:stretch>
@@ -2583,7 +2583,7 @@
                     <pic:cNvPicPr/>
                   </pic:nvPicPr>
                   <pic:blipFill>
-                    <a:blip xmlns:r="http://schemas.openxmlformats.org/officeDocument/2006/relationships" r:embed="Rc252178710e64253"/>
+                    <a:blip xmlns:r="http://schemas.openxmlformats.org/officeDocument/2006/relationships" r:embed="R350ddaccc4fb458d"/>
                     <a:stretch>
                       <a:fillRect/>
                     </a:stretch>
@@ -2634,7 +2634,7 @@
                     <pic:cNvPicPr/>
                   </pic:nvPicPr>
                   <pic:blipFill>
-                    <a:blip xmlns:r="http://schemas.openxmlformats.org/officeDocument/2006/relationships" r:embed="Rac2eeaaea60b4b00"/>
+                    <a:blip xmlns:r="http://schemas.openxmlformats.org/officeDocument/2006/relationships" r:embed="R880fffb769f24701"/>
                     <a:stretch>
                       <a:fillRect/>
                     </a:stretch>
@@ -2685,7 +2685,7 @@
                     <pic:cNvPicPr/>
                   </pic:nvPicPr>
                   <pic:blipFill>
-                    <a:blip xmlns:r="http://schemas.openxmlformats.org/officeDocument/2006/relationships" r:embed="R0ac268f32c944c6f"/>
+                    <a:blip xmlns:r="http://schemas.openxmlformats.org/officeDocument/2006/relationships" r:embed="R6aa2219a2aff4b78"/>
                     <a:stretch>
                       <a:fillRect/>
                     </a:stretch>
@@ -2736,7 +2736,7 @@
                     <pic:cNvPicPr/>
                   </pic:nvPicPr>
                   <pic:blipFill>
-                    <a:blip xmlns:r="http://schemas.openxmlformats.org/officeDocument/2006/relationships" r:embed="Ra28f322014d148a4"/>
+                    <a:blip xmlns:r="http://schemas.openxmlformats.org/officeDocument/2006/relationships" r:embed="R6d65ad69f11a4e0d"/>
                     <a:stretch>
                       <a:fillRect/>
                     </a:stretch>
@@ -2812,7 +2812,7 @@
                     <pic:cNvPicPr/>
                   </pic:nvPicPr>
                   <pic:blipFill>
-                    <a:blip xmlns:r="http://schemas.openxmlformats.org/officeDocument/2006/relationships" r:embed="Re99f9c26b1814593"/>
+                    <a:blip xmlns:r="http://schemas.openxmlformats.org/officeDocument/2006/relationships" r:embed="R7eaf89d3787e4a7c"/>
                     <a:stretch>
                       <a:fillRect/>
                     </a:stretch>
@@ -2863,7 +2863,7 @@
                     <pic:cNvPicPr/>
                   </pic:nvPicPr>
                   <pic:blipFill>
-                    <a:blip xmlns:r="http://schemas.openxmlformats.org/officeDocument/2006/relationships" r:embed="Rec5c0157656747d8"/>
+                    <a:blip xmlns:r="http://schemas.openxmlformats.org/officeDocument/2006/relationships" r:embed="Rc058eb2d6ee04cb9"/>
                     <a:stretch>
                       <a:fillRect/>
                     </a:stretch>
@@ -2914,7 +2914,7 @@
                     <pic:cNvPicPr/>
                   </pic:nvPicPr>
                   <pic:blipFill>
-                    <a:blip xmlns:r="http://schemas.openxmlformats.org/officeDocument/2006/relationships" r:embed="R4ccdf6fa114e4e6c"/>
+                    <a:blip xmlns:r="http://schemas.openxmlformats.org/officeDocument/2006/relationships" r:embed="Rac0f6f98fa8a4aa6"/>
                     <a:stretch>
                       <a:fillRect/>
                     </a:stretch>
@@ -2965,7 +2965,7 @@
                     <pic:cNvPicPr/>
                   </pic:nvPicPr>
                   <pic:blipFill>
-                    <a:blip xmlns:r="http://schemas.openxmlformats.org/officeDocument/2006/relationships" r:embed="R335a12bad8234634"/>
+                    <a:blip xmlns:r="http://schemas.openxmlformats.org/officeDocument/2006/relationships" r:embed="R29e6b2dd402e49b4"/>
                     <a:stretch>
                       <a:fillRect/>
                     </a:stretch>
@@ -3016,7 +3016,7 @@
                     <pic:cNvPicPr/>
                   </pic:nvPicPr>
                   <pic:blipFill>
-                    <a:blip xmlns:r="http://schemas.openxmlformats.org/officeDocument/2006/relationships" r:embed="Rfa1f2b1f61954666"/>
+                    <a:blip xmlns:r="http://schemas.openxmlformats.org/officeDocument/2006/relationships" r:embed="Rdb1f550e782d477f"/>
                     <a:stretch>
                       <a:fillRect/>
                     </a:stretch>
@@ -3067,7 +3067,7 @@
                     <pic:cNvPicPr/>
                   </pic:nvPicPr>
                   <pic:blipFill>
-                    <a:blip xmlns:r="http://schemas.openxmlformats.org/officeDocument/2006/relationships" r:embed="R36deb243ed374b9f"/>
+                    <a:blip xmlns:r="http://schemas.openxmlformats.org/officeDocument/2006/relationships" r:embed="Rcdb503a3654e4a09"/>
                     <a:stretch>
                       <a:fillRect/>
                     </a:stretch>
@@ -3118,7 +3118,7 @@
                     <pic:cNvPicPr/>
                   </pic:nvPicPr>
                   <pic:blipFill>
-                    <a:blip xmlns:r="http://schemas.openxmlformats.org/officeDocument/2006/relationships" r:embed="Rfca6638c60014e42"/>
+                    <a:blip xmlns:r="http://schemas.openxmlformats.org/officeDocument/2006/relationships" r:embed="R3fc9ddf9decc43a0"/>
                     <a:stretch>
                       <a:fillRect/>
                     </a:stretch>
@@ -3169,7 +3169,7 @@
                     <pic:cNvPicPr/>
                   </pic:nvPicPr>
                   <pic:blipFill>
-                    <a:blip xmlns:r="http://schemas.openxmlformats.org/officeDocument/2006/relationships" r:embed="Rf1fae14ae1c144b0"/>
+                    <a:blip xmlns:r="http://schemas.openxmlformats.org/officeDocument/2006/relationships" r:embed="R83bc6bef2af04c85"/>
                     <a:stretch>
                       <a:fillRect/>
                     </a:stretch>
@@ -3220,7 +3220,7 @@
                     <pic:cNvPicPr/>
                   </pic:nvPicPr>
                   <pic:blipFill>
-                    <a:blip xmlns:r="http://schemas.openxmlformats.org/officeDocument/2006/relationships" r:embed="R9a74d70c47dc4c55"/>
+                    <a:blip xmlns:r="http://schemas.openxmlformats.org/officeDocument/2006/relationships" r:embed="R4d72e33f7d8143a8"/>
                     <a:stretch>
                       <a:fillRect/>
                     </a:stretch>
@@ -3271,7 +3271,7 @@
                     <pic:cNvPicPr/>
                   </pic:nvPicPr>
                   <pic:blipFill>
-                    <a:blip xmlns:r="http://schemas.openxmlformats.org/officeDocument/2006/relationships" r:embed="R9617aba4af584572"/>
+                    <a:blip xmlns:r="http://schemas.openxmlformats.org/officeDocument/2006/relationships" r:embed="Refae32f686504b7f"/>
                     <a:stretch>
                       <a:fillRect/>
                     </a:stretch>
@@ -3322,7 +3322,7 @@
                     <pic:cNvPicPr/>
                   </pic:nvPicPr>
                   <pic:blipFill>
-                    <a:blip xmlns:r="http://schemas.openxmlformats.org/officeDocument/2006/relationships" r:embed="Rb4fbb864c0ee478d"/>
+                    <a:blip xmlns:r="http://schemas.openxmlformats.org/officeDocument/2006/relationships" r:embed="Rd25bb11434f041e3"/>
                     <a:stretch>
                       <a:fillRect/>
                     </a:stretch>
@@ -3373,7 +3373,7 @@
                     <pic:cNvPicPr/>
                   </pic:nvPicPr>
                   <pic:blipFill>
-                    <a:blip xmlns:r="http://schemas.openxmlformats.org/officeDocument/2006/relationships" r:embed="R82de608864b343bd"/>
+                    <a:blip xmlns:r="http://schemas.openxmlformats.org/officeDocument/2006/relationships" r:embed="R79bbaa5af4e74228"/>
                     <a:stretch>
                       <a:fillRect/>
                     </a:stretch>
@@ -3424,7 +3424,7 @@
                     <pic:cNvPicPr/>
                   </pic:nvPicPr>
                   <pic:blipFill>
-                    <a:blip xmlns:r="http://schemas.openxmlformats.org/officeDocument/2006/relationships" r:embed="R06b34a8b95a641d3"/>
+                    <a:blip xmlns:r="http://schemas.openxmlformats.org/officeDocument/2006/relationships" r:embed="R83b0595d4deb491d"/>
                     <a:stretch>
                       <a:fillRect/>
                     </a:stretch>
@@ -3660,7 +3660,7 @@
                     <pic:cNvPicPr/>
                   </pic:nvPicPr>
                   <pic:blipFill>
-                    <a:blip xmlns:r="http://schemas.openxmlformats.org/officeDocument/2006/relationships" r:embed="R06fe3ddd16d64328"/>
+                    <a:blip xmlns:r="http://schemas.openxmlformats.org/officeDocument/2006/relationships" r:embed="Redde84c9d1ef42a7"/>
                     <a:stretch>
                       <a:fillRect/>
                     </a:stretch>
@@ -4141,7 +4141,7 @@
       <w:r>
         <w:drawing>
           <wp:inline xmlns:wp="http://schemas.openxmlformats.org/drawingml/2006/wordprocessingDrawing" distT="0" distB="0" distL="0" distR="0">
-            <wp:extent cx="5220000" cy="4915279"/>
+            <wp:extent cx="5220000" cy="5093301"/>
             <wp:effectExtent l="0" t="0" r="0" b="0"/>
             <wp:docPr id="30" name="Mermaid diagram 30" descr="Mermaid diagram"/>
             <wp:cNvGraphicFramePr>
@@ -4155,7 +4155,7 @@
                     <pic:cNvPicPr/>
                   </pic:nvPicPr>
                   <pic:blipFill>
-                    <a:blip xmlns:r="http://schemas.openxmlformats.org/officeDocument/2006/relationships" r:embed="Re98a99a1186047f9"/>
+                    <a:blip xmlns:r="http://schemas.openxmlformats.org/officeDocument/2006/relationships" r:embed="R8e17c3484fb04353"/>
                     <a:stretch>
                       <a:fillRect/>
                     </a:stretch>
@@ -4163,7 +4163,7 @@
                   <pic:spPr>
                     <a:xfrm>
                       <a:off x="0" y="0"/>
-                      <a:ext cx="5220000" cy="4915279"/>
+                      <a:ext cx="5220000" cy="5093301"/>
                     </a:xfrm>
                     <a:prstGeom prst="rect">
                       <a:avLst/>
@@ -4390,7 +4390,7 @@
                     <pic:cNvPicPr/>
                   </pic:nvPicPr>
                   <pic:blipFill>
-                    <a:blip xmlns:r="http://schemas.openxmlformats.org/officeDocument/2006/relationships" r:embed="Reba33ceaeed2444c"/>
+                    <a:blip xmlns:r="http://schemas.openxmlformats.org/officeDocument/2006/relationships" r:embed="R82d19110aad54cda"/>
                     <a:stretch>
                       <a:fillRect/>
                     </a:stretch>
@@ -4910,7 +4910,7 @@
                     <pic:cNvPicPr/>
                   </pic:nvPicPr>
                   <pic:blipFill>
-                    <a:blip xmlns:r="http://schemas.openxmlformats.org/officeDocument/2006/relationships" r:embed="Rbfb618b4cdb94bc3"/>
+                    <a:blip xmlns:r="http://schemas.openxmlformats.org/officeDocument/2006/relationships" r:embed="R56b0173f98bb4259"/>
                     <a:stretch>
                       <a:fillRect/>
                     </a:stretch>
@@ -5591,7 +5591,7 @@
             <w:r>
               <w:t xml:space="preserve">Cell with </w:t>
             </w:r>
-            <w:hyperlink xmlns:r="http://schemas.openxmlformats.org/officeDocument/2006/relationships" w:history="true" r:id="Ra6cf4820056c441f">
+            <w:hyperlink xmlns:r="http://schemas.openxmlformats.org/officeDocument/2006/relationships" w:history="true" r:id="Rd483362b9bb74ffc">
               <w:r>
                 <w:rPr>
                   <w:rStyle w:val="Hyperlink"/>
@@ -5877,7 +5877,7 @@
                           <pic:cNvPicPr/>
                         </pic:nvPicPr>
                         <pic:blipFill>
-                          <a:blip xmlns:r="http://schemas.openxmlformats.org/officeDocument/2006/relationships" r:embed="Rac356ddc9cde4277"/>
+                          <a:blip xmlns:r="http://schemas.openxmlformats.org/officeDocument/2006/relationships" r:embed="Re2e1d2736ea74337"/>
                           <a:stretch>
                             <a:fillRect/>
                           </a:stretch>
@@ -5977,7 +5977,7 @@
                     <pic:cNvPicPr/>
                   </pic:nvPicPr>
                   <pic:blipFill>
-                    <a:blip xmlns:r="http://schemas.openxmlformats.org/officeDocument/2006/relationships" r:embed="R9af803bb0a4f491c"/>
+                    <a:blip xmlns:r="http://schemas.openxmlformats.org/officeDocument/2006/relationships" r:embed="R2a83138d3df14cce"/>
                     <a:stretch>
                       <a:fillRect/>
                     </a:stretch>
@@ -6027,7 +6027,7 @@
                     <pic:cNvPicPr/>
                   </pic:nvPicPr>
                   <pic:blipFill>
-                    <a:blip xmlns:r="http://schemas.openxmlformats.org/officeDocument/2006/relationships" r:embed="R08f5de67f7bc4304"/>
+                    <a:blip xmlns:r="http://schemas.openxmlformats.org/officeDocument/2006/relationships" r:embed="R03e6f32827de4efb"/>
                     <a:stretch>
                       <a:fillRect/>
                     </a:stretch>
@@ -6077,7 +6077,7 @@
                     <pic:cNvPicPr/>
                   </pic:nvPicPr>
                   <pic:blipFill>
-                    <a:blip xmlns:r="http://schemas.openxmlformats.org/officeDocument/2006/relationships" r:embed="Rb158028686094e71"/>
+                    <a:blip xmlns:r="http://schemas.openxmlformats.org/officeDocument/2006/relationships" r:embed="R101b0db273e34a9e"/>
                     <a:stretch>
                       <a:fillRect/>
                     </a:stretch>
@@ -6706,7 +6706,7 @@
       <w:r>
         <w:drawing>
           <wp:inline xmlns:wp="http://schemas.openxmlformats.org/drawingml/2006/wordprocessingDrawing" distT="0" distB="0" distL="0" distR="0">
-            <wp:extent cx="4267200" cy="4038600"/>
+            <wp:extent cx="4267200" cy="4629150"/>
             <wp:effectExtent l="0" t="0" r="0" b="0"/>
             <wp:docPr id="37" name="Mermaid diagram 37" descr="Mermaid diagram"/>
             <wp:cNvGraphicFramePr>
@@ -6720,7 +6720,7 @@
                     <pic:cNvPicPr/>
                   </pic:nvPicPr>
                   <pic:blipFill>
-                    <a:blip xmlns:r="http://schemas.openxmlformats.org/officeDocument/2006/relationships" r:embed="R193acb93db344e5e"/>
+                    <a:blip xmlns:r="http://schemas.openxmlformats.org/officeDocument/2006/relationships" r:embed="R8c193b3bf2cc40fb"/>
                     <a:stretch>
                       <a:fillRect/>
                     </a:stretch>
@@ -6728,7 +6728,7 @@
                   <pic:spPr>
                     <a:xfrm>
                       <a:off x="0" y="0"/>
-                      <a:ext cx="4267200" cy="4038600"/>
+                      <a:ext cx="4267200" cy="4629150"/>
                     </a:xfrm>
                     <a:prstGeom prst="rect">
                       <a:avLst/>
@@ -6757,7 +6757,7 @@
       <w:r>
         <w:drawing>
           <wp:inline xmlns:wp="http://schemas.openxmlformats.org/drawingml/2006/wordprocessingDrawing" distT="0" distB="0" distL="0" distR="0">
-            <wp:extent cx="5220000" cy="2648745"/>
+            <wp:extent cx="5220000" cy="3085506"/>
             <wp:effectExtent l="0" t="0" r="0" b="0"/>
             <wp:docPr id="38" name="Mermaid diagram 38" descr="Mermaid diagram"/>
             <wp:cNvGraphicFramePr>
@@ -6771,7 +6771,7 @@
                     <pic:cNvPicPr/>
                   </pic:nvPicPr>
                   <pic:blipFill>
-                    <a:blip xmlns:r="http://schemas.openxmlformats.org/officeDocument/2006/relationships" r:embed="Rbd8743781ecb4d9d"/>
+                    <a:blip xmlns:r="http://schemas.openxmlformats.org/officeDocument/2006/relationships" r:embed="Rda82d8e67b464879"/>
                     <a:stretch>
                       <a:fillRect/>
                     </a:stretch>
@@ -6779,7 +6779,7 @@
                   <pic:spPr>
                     <a:xfrm>
                       <a:off x="0" y="0"/>
-                      <a:ext cx="5220000" cy="2648745"/>
+                      <a:ext cx="5220000" cy="3085506"/>
                     </a:xfrm>
                     <a:prstGeom prst="rect">
                       <a:avLst/>
@@ -6808,7 +6808,7 @@
       <w:r>
         <w:drawing>
           <wp:inline xmlns:wp="http://schemas.openxmlformats.org/drawingml/2006/wordprocessingDrawing" distT="0" distB="0" distL="0" distR="0">
-            <wp:extent cx="1847850" cy="5429250"/>
+            <wp:extent cx="2190750" cy="6200775"/>
             <wp:effectExtent l="0" t="0" r="0" b="0"/>
             <wp:docPr id="39" name="Mermaid diagram 39" descr="Mermaid diagram"/>
             <wp:cNvGraphicFramePr>
@@ -6822,7 +6822,7 @@
                     <pic:cNvPicPr/>
                   </pic:nvPicPr>
                   <pic:blipFill>
-                    <a:blip xmlns:r="http://schemas.openxmlformats.org/officeDocument/2006/relationships" r:embed="Rf35c4fde9b6c4716"/>
+                    <a:blip xmlns:r="http://schemas.openxmlformats.org/officeDocument/2006/relationships" r:embed="R4614325115dc4f22"/>
                     <a:stretch>
                       <a:fillRect/>
                     </a:stretch>
@@ -6830,7 +6830,7 @@
                   <pic:spPr>
                     <a:xfrm>
                       <a:off x="0" y="0"/>
-                      <a:ext cx="1847850" cy="5429250"/>
+                      <a:ext cx="2190750" cy="6200775"/>
                     </a:xfrm>
                     <a:prstGeom prst="rect">
                       <a:avLst/>
@@ -6873,7 +6873,7 @@
                     <pic:cNvPicPr/>
                   </pic:nvPicPr>
                   <pic:blipFill>
-                    <a:blip xmlns:r="http://schemas.openxmlformats.org/officeDocument/2006/relationships" r:embed="Rdec2c318d306408a"/>
+                    <a:blip xmlns:r="http://schemas.openxmlformats.org/officeDocument/2006/relationships" r:embed="Re9fee9b8ff094eb9"/>
                     <a:stretch>
                       <a:fillRect/>
                     </a:stretch>
@@ -6924,7 +6924,7 @@
                     <pic:cNvPicPr/>
                   </pic:nvPicPr>
                   <pic:blipFill>
-                    <a:blip xmlns:r="http://schemas.openxmlformats.org/officeDocument/2006/relationships" r:embed="Ra047023a27dd4b21"/>
+                    <a:blip xmlns:r="http://schemas.openxmlformats.org/officeDocument/2006/relationships" r:embed="R2b37f9627be940cd"/>
                     <a:stretch>
                       <a:fillRect/>
                     </a:stretch>
@@ -6975,7 +6975,7 @@
                     <pic:cNvPicPr/>
                   </pic:nvPicPr>
                   <pic:blipFill>
-                    <a:blip xmlns:r="http://schemas.openxmlformats.org/officeDocument/2006/relationships" r:embed="R1f41a064c40a4c6c"/>
+                    <a:blip xmlns:r="http://schemas.openxmlformats.org/officeDocument/2006/relationships" r:embed="R1a9637f84122490a"/>
                     <a:stretch>
                       <a:fillRect/>
                     </a:stretch>
@@ -7026,7 +7026,7 @@
                     <pic:cNvPicPr/>
                   </pic:nvPicPr>
                   <pic:blipFill>
-                    <a:blip xmlns:r="http://schemas.openxmlformats.org/officeDocument/2006/relationships" r:embed="Ra6a24f5330374e6e"/>
+                    <a:blip xmlns:r="http://schemas.openxmlformats.org/officeDocument/2006/relationships" r:embed="R7b0cc61e54b4489f"/>
                     <a:stretch>
                       <a:fillRect/>
                     </a:stretch>
@@ -7077,7 +7077,7 @@
                     <pic:cNvPicPr/>
                   </pic:nvPicPr>
                   <pic:blipFill>
-                    <a:blip xmlns:r="http://schemas.openxmlformats.org/officeDocument/2006/relationships" r:embed="Rb9a220a2c06342ec"/>
+                    <a:blip xmlns:r="http://schemas.openxmlformats.org/officeDocument/2006/relationships" r:embed="Rbd66c9b8019541fd"/>
                     <a:stretch>
                       <a:fillRect/>
                     </a:stretch>
@@ -7128,7 +7128,7 @@
                     <pic:cNvPicPr/>
                   </pic:nvPicPr>
                   <pic:blipFill>
-                    <a:blip xmlns:r="http://schemas.openxmlformats.org/officeDocument/2006/relationships" r:embed="R84ad113b085346f9"/>
+                    <a:blip xmlns:r="http://schemas.openxmlformats.org/officeDocument/2006/relationships" r:embed="Rb6bc9a7d369244c1"/>
                     <a:stretch>
                       <a:fillRect/>
                     </a:stretch>
@@ -7187,7 +7187,7 @@
                     <pic:cNvPicPr/>
                   </pic:nvPicPr>
                   <pic:blipFill>
-                    <a:blip xmlns:r="http://schemas.openxmlformats.org/officeDocument/2006/relationships" r:embed="R09b5a7512777443c"/>
+                    <a:blip xmlns:r="http://schemas.openxmlformats.org/officeDocument/2006/relationships" r:embed="R9829ae1c55f84131"/>
                     <a:stretch>
                       <a:fillRect/>
                     </a:stretch>
@@ -7238,7 +7238,7 @@
                     <pic:cNvPicPr/>
                   </pic:nvPicPr>
                   <pic:blipFill>
-                    <a:blip xmlns:r="http://schemas.openxmlformats.org/officeDocument/2006/relationships" r:embed="R95fd94e4a77640af"/>
+                    <a:blip xmlns:r="http://schemas.openxmlformats.org/officeDocument/2006/relationships" r:embed="R7564220d93ed4f7e"/>
                     <a:stretch>
                       <a:fillRect/>
                     </a:stretch>
@@ -7289,7 +7289,7 @@
                     <pic:cNvPicPr/>
                   </pic:nvPicPr>
                   <pic:blipFill>
-                    <a:blip xmlns:r="http://schemas.openxmlformats.org/officeDocument/2006/relationships" r:embed="Rcc4d6f7983224d64"/>
+                    <a:blip xmlns:r="http://schemas.openxmlformats.org/officeDocument/2006/relationships" r:embed="R6239ce8e93f94dad"/>
                     <a:stretch>
                       <a:fillRect/>
                     </a:stretch>
@@ -7340,7 +7340,7 @@
                     <pic:cNvPicPr/>
                   </pic:nvPicPr>
                   <pic:blipFill>
-                    <a:blip xmlns:r="http://schemas.openxmlformats.org/officeDocument/2006/relationships" r:embed="Rd6ebf1cdcc6143e0"/>
+                    <a:blip xmlns:r="http://schemas.openxmlformats.org/officeDocument/2006/relationships" r:embed="R9ba9c370e36a4514"/>
                     <a:stretch>
                       <a:fillRect/>
                     </a:stretch>
@@ -7399,7 +7399,7 @@
                     <pic:cNvPicPr/>
                   </pic:nvPicPr>
                   <pic:blipFill>
-                    <a:blip xmlns:r="http://schemas.openxmlformats.org/officeDocument/2006/relationships" r:embed="R2c3879b52070473d"/>
+                    <a:blip xmlns:r="http://schemas.openxmlformats.org/officeDocument/2006/relationships" r:embed="Rac1de0cd1cc94ff0"/>
                     <a:stretch>
                       <a:fillRect/>
                     </a:stretch>
@@ -7450,7 +7450,7 @@
                     <pic:cNvPicPr/>
                   </pic:nvPicPr>
                   <pic:blipFill>
-                    <a:blip xmlns:r="http://schemas.openxmlformats.org/officeDocument/2006/relationships" r:embed="R4a3960ec6b7e48ae"/>
+                    <a:blip xmlns:r="http://schemas.openxmlformats.org/officeDocument/2006/relationships" r:embed="Rfd0b0bdd4f6d4ccd"/>
                     <a:stretch>
                       <a:fillRect/>
                     </a:stretch>
@@ -7572,7 +7572,7 @@
                     <pic:cNvPicPr/>
                   </pic:nvPicPr>
                   <pic:blipFill>
-                    <a:blip xmlns:r="http://schemas.openxmlformats.org/officeDocument/2006/relationships" r:embed="R55f5e792f5804d7e"/>
+                    <a:blip xmlns:r="http://schemas.openxmlformats.org/officeDocument/2006/relationships" r:embed="R17e790724f9743af"/>
                     <a:stretch>
                       <a:fillRect/>
                     </a:stretch>
@@ -7631,7 +7631,7 @@
                     <pic:cNvPicPr/>
                   </pic:nvPicPr>
                   <pic:blipFill>
-                    <a:blip xmlns:r="http://schemas.openxmlformats.org/officeDocument/2006/relationships" r:embed="Rf10ee4f8ca064a2c"/>
+                    <a:blip xmlns:r="http://schemas.openxmlformats.org/officeDocument/2006/relationships" r:embed="R704c01f80bca433e"/>
                     <a:stretch>
                       <a:fillRect/>
                     </a:stretch>
@@ -7682,7 +7682,7 @@
                     <pic:cNvPicPr/>
                   </pic:nvPicPr>
                   <pic:blipFill>
-                    <a:blip xmlns:r="http://schemas.openxmlformats.org/officeDocument/2006/relationships" r:embed="Rde7f63bca2234be6"/>
+                    <a:blip xmlns:r="http://schemas.openxmlformats.org/officeDocument/2006/relationships" r:embed="R989baad5c6504e56"/>
                     <a:stretch>
                       <a:fillRect/>
                     </a:stretch>
@@ -7741,7 +7741,7 @@
                     <pic:cNvPicPr/>
                   </pic:nvPicPr>
                   <pic:blipFill>
-                    <a:blip xmlns:r="http://schemas.openxmlformats.org/officeDocument/2006/relationships" r:embed="Rab5b8a1f04214517"/>
+                    <a:blip xmlns:r="http://schemas.openxmlformats.org/officeDocument/2006/relationships" r:embed="Rc8433c5df1f24f57"/>
                     <a:stretch>
                       <a:fillRect/>
                     </a:stretch>
@@ -7800,7 +7800,7 @@
                     <pic:cNvPicPr/>
                   </pic:nvPicPr>
                   <pic:blipFill>
-                    <a:blip xmlns:r="http://schemas.openxmlformats.org/officeDocument/2006/relationships" r:embed="R2c3273345d314486"/>
+                    <a:blip xmlns:r="http://schemas.openxmlformats.org/officeDocument/2006/relationships" r:embed="R82225f29d1ba4cd8"/>
                     <a:stretch>
                       <a:fillRect/>
                     </a:stretch>

</xml_diff>